<commit_message>
Pick result figures and add legends for ATAC-seq modules
Each module's portal entry now names the output file to register as its
main result image, with Korean and English figure legends, and the
common notes give the pdftoppm command for PDF to PNG.

Co-Authored-By: Claude Opus 5.5 <noreply@anthropic.com>
</commit_message>
<xml_diff>
--- a/docs/ATAC-seq/modules/Portal_Content.docx
+++ b/docs/ATAC-seq/modules/Portal_Content.docx
@@ -46,7 +46,7 @@
           <w:sz w:val="18"/>
           <w:szCs w:val="18"/>
         </w:rPr>
-        <w:t xml:space="preserve">docs/ATAC-seq_Module_Registration.md</w:t>
+        <w:t xml:space="preserve">docs/ATAC-seq/modules/Registration.md</w:t>
       </w:r>
       <w:r>
         <w:rPr>
@@ -210,6 +210,31 @@
       </w:pPr>
       <w:r>
         <w:t xml:space="preserve">카테고리와 아이콘은 포탈 목록에서 고른다. 원고의 카테고리는 제안이다.</w:t>
+      </w:r>
+    </w:p>
+    <w:p>
+      <w:pPr>
+        <w:pStyle w:val="ListParagraph"/>
+        <w:numPr>
+          <w:ilvl w:val="0"/>
+          <w:numId w:val="2"/>
+        </w:numPr>
+        <w:spacing w:after="80"/>
+      </w:pPr>
+      <w:r>
+        <w:t xml:space="preserve">주요 결과 이미지는 실제 데이터로 실행한 결과에서 가져온다. PDF는 PNG로 바꿔 등록한다: </w:t>
+      </w:r>
+      <w:r>
+        <w:t xml:space="preserve">pdftoppm -png -r 200 -singlefile &lt;그림&gt;.pdf &lt;그림&gt;</w:t>
+      </w:r>
+      <w:r>
+        <w:t xml:space="preserve"> (여러 쪽이면 </w:t>
+      </w:r>
+      <w:r>
+        <w:t xml:space="preserve">-f &lt;쪽&gt; -l &lt;쪽&gt;</w:t>
+      </w:r>
+      <w:r>
+        <w:t xml:space="preserve">로 쪽을 고른다). 표는 화면 캡처해 등록한다.</w:t>
       </w:r>
     </w:p>
     <w:p>
@@ -1881,7 +1906,7 @@
           <w:sz w:val="18"/>
           <w:szCs w:val="18"/>
         </w:rPr>
-        <w:t xml:space="preserve">docs/figures/module_concepts/organellar_filter_concept.png</w:t>
+        <w:t xml:space="preserve">docs/ATAC-seq/modules/figures/module_concepts/organellar_filter_concept.png</w:t>
       </w:r>
     </w:p>
     <w:p>
@@ -2031,7 +2056,7 @@
           <w:sz w:val="24"/>
           <w:szCs w:val="24"/>
         </w:rPr>
-        <w:t xml:space="preserve">주요 결과 이미지 (제안)</w:t>
+        <w:t xml:space="preserve">주요 결과 이미지</w:t>
       </w:r>
     </w:p>
     <w:p>
@@ -2039,7 +2064,67 @@
         <w:spacing w:after="140"/>
       </w:pPr>
       <w:r>
-        <w:t xml:space="preserve">제거 전후 read 수 요약표(TSV)를 표 이미지로 캡처해 등록한다.</w:t>
+        <w:t xml:space="preserve">등록할 그림: 표 캡처 </w:t>
+      </w:r>
+      <w:r>
+        <w:t xml:space="preserve">04_summary/organellar_filter_summary.tsv</w:t>
+      </w:r>
+      <w:r>
+        <w:t xml:space="preserve"> (이 모듈은 그림을 만들지 않는다)</w:t>
+      </w:r>
+    </w:p>
+    <w:p>
+      <w:pPr>
+        <w:spacing w:after="140"/>
+      </w:pPr>
+      <w:r>
+        <w:rPr>
+          <w:b/>
+          <w:bCs/>
+        </w:rPr>
+        <w:t xml:space="preserve">레전드(국문)</w:t>
+      </w:r>
+    </w:p>
+    <w:p>
+      <w:pPr>
+        <w:spacing w:after="140"/>
+      </w:pPr>
+      <w:r>
+        <w:rPr>
+          <w:b/>
+          <w:bCs/>
+        </w:rPr>
+        <w:t xml:space="preserve">샘플별 소기관 contig 제거 요약.</w:t>
+      </w:r>
+      <w:r>
+        <w:t xml:space="preserve"> 샘플마다 입력 BAM의 전체 contig 수, 제거한 소기관 contig(미토콘드리아·엽록체) 수, 남긴 contig 수, 필터링된 BAM 경로와 처리 상태를 보여 준다. status가 모든 샘플에서 정상이면 다음 단계(ATAC_QC)에 쓸 BAM이 준비된 것이다.</w:t>
+      </w:r>
+    </w:p>
+    <w:p>
+      <w:pPr>
+        <w:spacing w:after="140"/>
+      </w:pPr>
+      <w:r>
+        <w:rPr>
+          <w:b/>
+          <w:bCs/>
+        </w:rPr>
+        <w:t xml:space="preserve">Legend (English)</w:t>
+      </w:r>
+    </w:p>
+    <w:p>
+      <w:pPr>
+        <w:spacing w:after="140"/>
+      </w:pPr>
+      <w:r>
+        <w:rPr>
+          <w:b/>
+          <w:bCs/>
+        </w:rPr>
+        <w:t xml:space="preserve">Organellar contig removal per sample.</w:t>
+      </w:r>
+      <w:r>
+        <w:t xml:space="preserve"> For each sample the table lists the number of contigs in the input BAM, the organellar (mitochondrial or plastid) contigs removed, the contigs kept, the filtered BAM path and the run status. A normal status for every sample means the BAMs are ready for ATAC_QC.</w:t>
       </w:r>
     </w:p>
     <w:p>
@@ -4581,7 +4666,7 @@
           <w:sz w:val="18"/>
           <w:szCs w:val="18"/>
         </w:rPr>
-        <w:t xml:space="preserve">docs/figures/module_concepts/ATAC_QC_concept.png</w:t>
+        <w:t xml:space="preserve">docs/ATAC-seq/modules/figures/module_concepts/ATAC_QC_concept.png</w:t>
       </w:r>
     </w:p>
     <w:p>
@@ -4731,7 +4816,7 @@
           <w:sz w:val="24"/>
           <w:szCs w:val="24"/>
         </w:rPr>
-        <w:t xml:space="preserve">주요 결과 이미지 (제안)</w:t>
+        <w:t xml:space="preserve">주요 결과 이미지</w:t>
       </w:r>
     </w:p>
     <w:p>
@@ -4739,16 +4824,73 @@
         <w:spacing w:after="140"/>
       </w:pPr>
       <w:r>
+        <w:t xml:space="preserve">등록할 그림: </w:t>
+      </w:r>
+      <w:r>
         <w:t xml:space="preserve">01_fragment_size/&lt;sample&gt;/&lt;sample&gt;.fragSizeDist.pdf</w:t>
       </w:r>
       <w:r>
-        <w:t xml:space="preserve">(fragment 크기 분포)와 </w:t>
+        <w:t xml:space="preserve">, </w:t>
       </w:r>
       <w:r>
         <w:t xml:space="preserve">07_tss_enrichment/&lt;sample&gt;.tss_enrichment.pdf</w:t>
       </w:r>
       <w:r>
-        <w:t xml:space="preserve">를 PNG로 변환해 등록한다.</w:t>
+        <w:t xml:space="preserve"> (대표 샘플 1개, 두 그림을 나란히)</w:t>
+      </w:r>
+    </w:p>
+    <w:p>
+      <w:pPr>
+        <w:spacing w:after="140"/>
+      </w:pPr>
+      <w:r>
+        <w:rPr>
+          <w:b/>
+          <w:bCs/>
+        </w:rPr>
+        <w:t xml:space="preserve">레전드(국문)</w:t>
+      </w:r>
+    </w:p>
+    <w:p>
+      <w:pPr>
+        <w:spacing w:after="140"/>
+      </w:pPr>
+      <w:r>
+        <w:rPr>
+          <w:b/>
+          <w:bCs/>
+        </w:rPr>
+        <w:t xml:space="preserve">ATAC-seq 라이브러리 품질: fragment 크기 분포와 TSS enrichment.</w:t>
+      </w:r>
+      <w:r>
+        <w:t xml:space="preserve"> (A) paired-end fragment 길이 분포. 100 bp 이하의 nucleosome-free 봉우리와 약 200 bp(mononucleosome), 약 400 bp(dinucleosome) 간격의 주기적인 봉우리가 보이면 Tn5 절단이 정상적으로 일어난 것이다. 작은 그림은 같은 분포를 로그 축으로 보여 준다. (B) TSS 주변(기본 ±1,000 bp)의 aggregate TSS score. TSS(0 bp)에서 신호가 뚜렷하게 높을수록 열린 염색질이 잘 포착된 것이며, 제목에 TSS enrichment score가 표시된다.</w:t>
+      </w:r>
+    </w:p>
+    <w:p>
+      <w:pPr>
+        <w:spacing w:after="140"/>
+      </w:pPr>
+      <w:r>
+        <w:rPr>
+          <w:b/>
+          <w:bCs/>
+        </w:rPr>
+        <w:t xml:space="preserve">Legend (English)</w:t>
+      </w:r>
+    </w:p>
+    <w:p>
+      <w:pPr>
+        <w:spacing w:after="140"/>
+      </w:pPr>
+      <w:r>
+        <w:rPr>
+          <w:b/>
+          <w:bCs/>
+        </w:rPr>
+        <w:t xml:space="preserve">ATAC-seq library quality: fragment size distribution and TSS enrichment.</w:t>
+      </w:r>
+      <w:r>
+        <w:t xml:space="preserve"> (A) Paired-end fragment length distribution. A nucleosome-free peak below 100 bp followed by periodic peaks near 200 bp (mononucleosome) and 400 bp (dinucleosome) indicates proper Tn5 cutting; the inset shows the same distribution on a log scale. (B) Aggregate TSS score around transcription start sites (±1,000 bp by default). A sharp rise at the TSS (0 bp) indicates good capture of open chromatin; the TSS enrichment score is shown in the title.</w:t>
       </w:r>
     </w:p>
     <w:p>
@@ -6912,7 +7054,7 @@
           <w:sz w:val="18"/>
           <w:szCs w:val="18"/>
         </w:rPr>
-        <w:t xml:space="preserve">docs/figures/module_concepts/ATAC_QC_plot_concept.png</w:t>
+        <w:t xml:space="preserve">docs/ATAC-seq/modules/figures/module_concepts/ATAC_QC_plot_concept.png</w:t>
       </w:r>
     </w:p>
     <w:p>
@@ -7062,7 +7204,7 @@
           <w:sz w:val="24"/>
           <w:szCs w:val="24"/>
         </w:rPr>
-        <w:t xml:space="preserve">주요 결과 이미지 (제안)</w:t>
+        <w:t xml:space="preserve">주요 결과 이미지</w:t>
       </w:r>
     </w:p>
     <w:p>
@@ -7070,10 +7212,67 @@
         <w:spacing w:after="140"/>
       </w:pPr>
       <w:r>
-        <w:t xml:space="preserve">01_tss_signal</w:t>
-      </w:r>
-      <w:r>
-        <w:t xml:space="preserve">의 NFR·mononucleosome heatmap과 profile PDF를 PNG로 변환해 등록한다.</w:t>
+        <w:t xml:space="preserve">등록할 그림: </w:t>
+      </w:r>
+      <w:r>
+        <w:t xml:space="preserve">01_tss_signal/&lt;sample&gt;.Heatmap_splitbam.pdf</w:t>
+      </w:r>
+      <w:r>
+        <w:t xml:space="preserve"> (대표 샘플 1개)</w:t>
+      </w:r>
+    </w:p>
+    <w:p>
+      <w:pPr>
+        <w:spacing w:after="140"/>
+      </w:pPr>
+      <w:r>
+        <w:rPr>
+          <w:b/>
+          <w:bCs/>
+        </w:rPr>
+        <w:t xml:space="preserve">레전드(국문)</w:t>
+      </w:r>
+    </w:p>
+    <w:p>
+      <w:pPr>
+        <w:spacing w:after="140"/>
+      </w:pPr>
+      <w:r>
+        <w:rPr>
+          <w:b/>
+          <w:bCs/>
+        </w:rPr>
+        <w:t xml:space="preserve">TSS 주변의 nucleosome-free 신호와 mononucleosome 신호.</w:t>
+      </w:r>
+      <w:r>
+        <w:t xml:space="preserve"> 각 행은 TSS 하나이고, 가로축은 TSS 중심 ±1,010 bp 구간이다. 왼쪽 패널은 nucleosome-free fragment, 오른쪽 패널은 mononucleosome fragment의 신호(log2)를 색으로 나타낸다. 정상적인 ATAC-seq에서는 nucleosome-free 신호가 TSS 바로 위에 모이고, mononucleosome 신호는 TSS 양옆(nucleosome 자리)에 나타난다.</w:t>
+      </w:r>
+    </w:p>
+    <w:p>
+      <w:pPr>
+        <w:spacing w:after="140"/>
+      </w:pPr>
+      <w:r>
+        <w:rPr>
+          <w:b/>
+          <w:bCs/>
+        </w:rPr>
+        <w:t xml:space="preserve">Legend (English)</w:t>
+      </w:r>
+    </w:p>
+    <w:p>
+      <w:pPr>
+        <w:spacing w:after="140"/>
+      </w:pPr>
+      <w:r>
+        <w:rPr>
+          <w:b/>
+          <w:bCs/>
+        </w:rPr>
+        <w:t xml:space="preserve">Nucleosome-free and mononucleosome signal around TSSs.</w:t>
+      </w:r>
+      <w:r>
+        <w:t xml:space="preserve"> Each row is one TSS and the x-axis spans ±1,010 bp around its centre. The left panel shows nucleosome-free fragment signal and the right panel mononucleosome fragment signal (log2, colour scale). In good ATAC-seq data the nucleosome-free signal concentrates at the TSS, while the mononucleosome signal flanks it where nucleosomes sit.</w:t>
       </w:r>
     </w:p>
     <w:p>
@@ -9231,7 +9430,7 @@
           <w:sz w:val="18"/>
           <w:szCs w:val="18"/>
         </w:rPr>
-        <w:t xml:space="preserve">docs/figures/module_concepts/MACS3_callpeak_ATAC_concept.png</w:t>
+        <w:t xml:space="preserve">docs/ATAC-seq/modules/figures/module_concepts/MACS3_callpeak_ATAC_concept.png</w:t>
       </w:r>
     </w:p>
     <w:p>
@@ -9381,7 +9580,7 @@
           <w:sz w:val="24"/>
           <w:szCs w:val="24"/>
         </w:rPr>
-        <w:t xml:space="preserve">주요 결과 이미지 (제안)</w:t>
+        <w:t xml:space="preserve">주요 결과 이미지</w:t>
       </w:r>
     </w:p>
     <w:p>
@@ -9389,7 +9588,67 @@
         <w:spacing w:after="140"/>
       </w:pPr>
       <w:r>
-        <w:t xml:space="preserve">frip_summary.tsv를 표 이미지로 캡처하거나, peak 수와 FRiP를 막대그래프로 만들어 등록한다.</w:t>
+        <w:t xml:space="preserve">등록할 그림: 표 캡처 </w:t>
+      </w:r>
+      <w:r>
+        <w:t xml:space="preserve">frip_summary.tsv</w:t>
+      </w:r>
+      <w:r>
+        <w:t xml:space="preserve"> (이 모듈은 그림을 만들지 않는다)</w:t>
+      </w:r>
+    </w:p>
+    <w:p>
+      <w:pPr>
+        <w:spacing w:after="140"/>
+      </w:pPr>
+      <w:r>
+        <w:rPr>
+          <w:b/>
+          <w:bCs/>
+        </w:rPr>
+        <w:t xml:space="preserve">레전드(국문)</w:t>
+      </w:r>
+    </w:p>
+    <w:p>
+      <w:pPr>
+        <w:spacing w:after="140"/>
+      </w:pPr>
+      <w:r>
+        <w:rPr>
+          <w:b/>
+          <w:bCs/>
+        </w:rPr>
+        <w:t xml:space="preserve">샘플별 peak 수와 FRiP.</w:t>
+      </w:r>
+      <w:r>
+        <w:t xml:space="preserve"> 샘플마다 MACS3로 찾은 peak 수(peaks), 전체 read 수(total_reads), peak 안에 들어간 read 수(reads_in_peaks), 그 비율(FRiP)을 보여 준다. FRiP는 신호 대 잡음의 지표로, ENCODE ATAC-seq 기준에서는 0.3 이상이 바람직하고 0.2 이상이면 허용한다.</w:t>
+      </w:r>
+    </w:p>
+    <w:p>
+      <w:pPr>
+        <w:spacing w:after="140"/>
+      </w:pPr>
+      <w:r>
+        <w:rPr>
+          <w:b/>
+          <w:bCs/>
+        </w:rPr>
+        <w:t xml:space="preserve">Legend (English)</w:t>
+      </w:r>
+    </w:p>
+    <w:p>
+      <w:pPr>
+        <w:spacing w:after="140"/>
+      </w:pPr>
+      <w:r>
+        <w:rPr>
+          <w:b/>
+          <w:bCs/>
+        </w:rPr>
+        <w:t xml:space="preserve">Peak count and FRiP per sample.</w:t>
+      </w:r>
+      <w:r>
+        <w:t xml:space="preserve"> For each sample the table lists the number of MACS3 peaks (peaks), total reads (total_reads), reads falling in peaks (reads_in_peaks) and their fraction (FRiP). FRiP is a signal-to-noise measure; the ENCODE ATAC-seq standard prefers 0.3 or higher and accepts 0.2 or higher.</w:t>
       </w:r>
     </w:p>
     <w:p>
@@ -11621,7 +11880,7 @@
           <w:sz w:val="18"/>
           <w:szCs w:val="18"/>
         </w:rPr>
-        <w:t xml:space="preserve">docs/figures/module_concepts/peak_annotation_concept.png</w:t>
+        <w:t xml:space="preserve">docs/ATAC-seq/modules/figures/module_concepts/peak_annotation_concept.png</w:t>
       </w:r>
     </w:p>
     <w:p>
@@ -11771,7 +12030,7 @@
           <w:sz w:val="24"/>
           <w:szCs w:val="24"/>
         </w:rPr>
-        <w:t xml:space="preserve">주요 결과 이미지 (제안)</w:t>
+        <w:t xml:space="preserve">주요 결과 이미지</w:t>
       </w:r>
     </w:p>
     <w:p>
@@ -11779,10 +12038,64 @@
         <w:spacing w:after="140"/>
       </w:pPr>
       <w:r>
-        <w:t xml:space="preserve">plots/</w:t>
-      </w:r>
-      <w:r>
-        <w:t xml:space="preserve">의 기능 영역 분포(annotation bar/pie)와 TSS 거리 분포 그림을 등록한다.</w:t>
+        <w:t xml:space="preserve">등록할 그림: </w:t>
+      </w:r>
+      <w:r>
+        <w:t xml:space="preserve">plots/annotation_summary_percent_barplot.pdf</w:t>
+      </w:r>
+    </w:p>
+    <w:p>
+      <w:pPr>
+        <w:spacing w:after="140"/>
+      </w:pPr>
+      <w:r>
+        <w:rPr>
+          <w:b/>
+          <w:bCs/>
+        </w:rPr>
+        <w:t xml:space="preserve">레전드(국문)</w:t>
+      </w:r>
+    </w:p>
+    <w:p>
+      <w:pPr>
+        <w:spacing w:after="140"/>
+      </w:pPr>
+      <w:r>
+        <w:rPr>
+          <w:b/>
+          <w:bCs/>
+        </w:rPr>
+        <w:t xml:space="preserve">샘플별 peak의 유전체 영역 분포.</w:t>
+      </w:r>
+      <w:r>
+        <w:t xml:space="preserve"> 막대 하나가 샘플 하나이며, peak가 promoter, UTR, exon, intron, distal intergenic 등 각 유전체 영역에 놓인 비율(%)을 색으로 나누어 보여 준다. ATAC-seq peak는 보통 promoter와 intron, distal intergenic에 많이 놓이며, 샘플 간 분포가 비슷한지로 데이터의 일관성을 확인할 수 있다.</w:t>
+      </w:r>
+    </w:p>
+    <w:p>
+      <w:pPr>
+        <w:spacing w:after="140"/>
+      </w:pPr>
+      <w:r>
+        <w:rPr>
+          <w:b/>
+          <w:bCs/>
+        </w:rPr>
+        <w:t xml:space="preserve">Legend (English)</w:t>
+      </w:r>
+    </w:p>
+    <w:p>
+      <w:pPr>
+        <w:spacing w:after="140"/>
+      </w:pPr>
+      <w:r>
+        <w:rPr>
+          <w:b/>
+          <w:bCs/>
+        </w:rPr>
+        <w:t xml:space="preserve">Genomic distribution of peaks per sample.</w:t>
+      </w:r>
+      <w:r>
+        <w:t xml:space="preserve"> Each bar is one sample, split by colour into the percentage of peaks in promoters, UTRs, exons, introns, distal intergenic regions and other features. ATAC-seq peaks are usually enriched in promoters, introns and distal intergenic regions; similar distributions across samples indicate consistent data.</w:t>
       </w:r>
     </w:p>
     <w:p>
@@ -14816,7 +15129,7 @@
           <w:sz w:val="18"/>
           <w:szCs w:val="18"/>
         </w:rPr>
-        <w:t xml:space="preserve">docs/figures/module_concepts/differential_accessibility_concept.png</w:t>
+        <w:t xml:space="preserve">docs/ATAC-seq/modules/figures/module_concepts/differential_accessibility_concept.png</w:t>
       </w:r>
     </w:p>
     <w:p>
@@ -14966,7 +15279,7 @@
           <w:sz w:val="24"/>
           <w:szCs w:val="24"/>
         </w:rPr>
-        <w:t xml:space="preserve">주요 결과 이미지 (제안)</w:t>
+        <w:t xml:space="preserve">주요 결과 이미지</w:t>
       </w:r>
     </w:p>
     <w:p>
@@ -14974,22 +15287,73 @@
         <w:spacing w:after="140"/>
       </w:pPr>
       <w:r>
+        <w:t xml:space="preserve">등록할 그림: </w:t>
+      </w:r>
+      <w:r>
+        <w:t xml:space="preserve">04_plots/PCA_plot.pdf</w:t>
+      </w:r>
+      <w:r>
+        <w:t xml:space="preserve">, </w:t>
+      </w:r>
+      <w:r>
         <w:t xml:space="preserve">04_plots/MD_plot.pdf</w:t>
       </w:r>
       <w:r>
-        <w:t xml:space="preserve">, </w:t>
-      </w:r>
-      <w:r>
-        <w:t xml:space="preserve">PCA_plot.pdf</w:t>
-      </w:r>
-      <w:r>
-        <w:t xml:space="preserve">, </w:t>
-      </w:r>
-      <w:r>
-        <w:t xml:space="preserve">sample_correlation_heatmap.pdf</w:t>
-      </w:r>
-      <w:r>
-        <w:t xml:space="preserve">를 PNG로 변환해 등록한다.</w:t>
+        <w:t xml:space="preserve"> (두 그림을 나란히)</w:t>
+      </w:r>
+    </w:p>
+    <w:p>
+      <w:pPr>
+        <w:spacing w:after="140"/>
+      </w:pPr>
+      <w:r>
+        <w:rPr>
+          <w:b/>
+          <w:bCs/>
+        </w:rPr>
+        <w:t xml:space="preserve">레전드(국문)</w:t>
+      </w:r>
+    </w:p>
+    <w:p>
+      <w:pPr>
+        <w:spacing w:after="140"/>
+      </w:pPr>
+      <w:r>
+        <w:rPr>
+          <w:b/>
+          <w:bCs/>
+        </w:rPr>
+        <w:t xml:space="preserve">샘플 간 차이와 조건 간 접근성 변화.</w:t>
+      </w:r>
+      <w:r>
+        <w:t xml:space="preserve"> (A) PCA. 변동이 큰 peak의 log CPM으로 샘플을 2차원에 놓은 그림으로, 점 하나가 샘플 하나이고 색은 조건이다. 같은 조건의 반복 샘플이 모이고 조건끼리 떨어져 있으면 조건 간 차이가 반복 간 차이보다 크다는 뜻이다. (B) MD plot. 점 하나가 peak 하나이며, 가로축은 평균 접근성(log CPM), 세로축은 조건 간 변화(log2 fold change)다. 유의하게 열린 peak와 닫힌 peak가 색으로 구분된다.</w:t>
+      </w:r>
+    </w:p>
+    <w:p>
+      <w:pPr>
+        <w:spacing w:after="140"/>
+      </w:pPr>
+      <w:r>
+        <w:rPr>
+          <w:b/>
+          <w:bCs/>
+        </w:rPr>
+        <w:t xml:space="preserve">Legend (English)</w:t>
+      </w:r>
+    </w:p>
+    <w:p>
+      <w:pPr>
+        <w:spacing w:after="140"/>
+      </w:pPr>
+      <w:r>
+        <w:rPr>
+          <w:b/>
+          <w:bCs/>
+        </w:rPr>
+        <w:t xml:space="preserve">Sample relationships and accessibility changes between conditions.</w:t>
+      </w:r>
+      <w:r>
+        <w:t xml:space="preserve"> (A) PCA of samples based on log CPM of the most variable peaks; each point is a sample coloured by condition. Replicates clustering together and conditions separating indicate that the condition effect exceeds replicate variation. (B) MD plot; each point is a peak, with mean accessibility (log CPM) on the x-axis and the change between conditions (log2 fold change) on the y-axis. Significantly gained and lost peaks are highlighted in colour.</w:t>
       </w:r>
     </w:p>
     <w:p>
@@ -18625,7 +18989,7 @@
           <w:sz w:val="18"/>
           <w:szCs w:val="18"/>
         </w:rPr>
-        <w:t xml:space="preserve">docs/figures/module_concepts/atac_motif_concept.png</w:t>
+        <w:t xml:space="preserve">docs/ATAC-seq/modules/figures/module_concepts/atac_motif_concept.png</w:t>
       </w:r>
     </w:p>
     <w:p>
@@ -18775,7 +19139,7 @@
           <w:sz w:val="24"/>
           <w:szCs w:val="24"/>
         </w:rPr>
-        <w:t xml:space="preserve">주요 결과 이미지 (제안)</w:t>
+        <w:t xml:space="preserve">주요 결과 이미지</w:t>
       </w:r>
     </w:p>
     <w:p>
@@ -18783,10 +19147,64 @@
         <w:spacing w:after="140"/>
       </w:pPr>
       <w:r>
-        <w:t xml:space="preserve">02_binned_enrichment</w:t>
-      </w:r>
-      <w:r>
-        <w:t xml:space="preserve">의 모티프 농축 heatmap(seqlogo 포함)을 등록한다.</w:t>
+        <w:t xml:space="preserve">등록할 그림: </w:t>
+      </w:r>
+      <w:r>
+        <w:t xml:space="preserve">02_binned_enrichment/binned_motif_heatmap.pdf</w:t>
+      </w:r>
+    </w:p>
+    <w:p>
+      <w:pPr>
+        <w:spacing w:after="140"/>
+      </w:pPr>
+      <w:r>
+        <w:rPr>
+          <w:b/>
+          <w:bCs/>
+        </w:rPr>
+        <w:t xml:space="preserve">레전드(국문)</w:t>
+      </w:r>
+    </w:p>
+    <w:p>
+      <w:pPr>
+        <w:spacing w:after="140"/>
+      </w:pPr>
+      <w:r>
+        <w:rPr>
+          <w:b/>
+          <w:bCs/>
+        </w:rPr>
+        <w:t xml:space="preserve">접근성 변화 구간별 모티프 농축.</w:t>
+      </w:r>
+      <w:r>
+        <w:t xml:space="preserve"> peak를 접근성 변화(log2 fold change) 크기에 따라 여러 구간(bin)으로 나누고, 구간마다 각 전사인자 모티프가 배경보다 얼마나 많은지를 색으로 보여 준다. 행은 유의하게 농축된 모티프이며, 서로 비슷한 모티프끼리 묶어 정렬했고 왼쪽에 서열 로고를 붙였다. 열린 쪽 구간에서만 진하게 나타나는 모티프는 조건 변화로 활성이 커진 전사인자의 후보다.</w:t>
+      </w:r>
+    </w:p>
+    <w:p>
+      <w:pPr>
+        <w:spacing w:after="140"/>
+      </w:pPr>
+      <w:r>
+        <w:rPr>
+          <w:b/>
+          <w:bCs/>
+        </w:rPr>
+        <w:t xml:space="preserve">Legend (English)</w:t>
+      </w:r>
+    </w:p>
+    <w:p>
+      <w:pPr>
+        <w:spacing w:after="140"/>
+      </w:pPr>
+      <w:r>
+        <w:rPr>
+          <w:b/>
+          <w:bCs/>
+        </w:rPr>
+        <w:t xml:space="preserve">Motif enrichment across bins of accessibility change.</w:t>
+      </w:r>
+      <w:r>
+        <w:t xml:space="preserve"> Peaks are grouped into bins by log2 fold change in accessibility, and the colour shows how strongly each transcription factor motif is enriched in each bin relative to background. Rows are significantly enriched motifs, clustered by motif similarity and shown with sequence logos. Motifs enriched only in the gained-accessibility bins point to transcription factors that become more active.</w:t>
       </w:r>
     </w:p>
     <w:p>
@@ -21434,7 +21852,7 @@
           <w:sz w:val="18"/>
           <w:szCs w:val="18"/>
         </w:rPr>
-        <w:t xml:space="preserve">docs/figures/module_concepts/tf_footprinting_concept.png</w:t>
+        <w:t xml:space="preserve">docs/ATAC-seq/modules/figures/module_concepts/tf_footprinting_concept.png</w:t>
       </w:r>
     </w:p>
     <w:p>
@@ -21584,7 +22002,7 @@
           <w:sz w:val="24"/>
           <w:szCs w:val="24"/>
         </w:rPr>
-        <w:t xml:space="preserve">주요 결과 이미지 (제안)</w:t>
+        <w:t xml:space="preserve">주요 결과 이미지</w:t>
       </w:r>
     </w:p>
     <w:p>
@@ -21592,10 +22010,67 @@
         <w:spacing w:after="140"/>
       </w:pPr>
       <w:r>
-        <w:t xml:space="preserve">04_BINDetect</w:t>
-      </w:r>
-      <w:r>
-        <w:t xml:space="preserve">의 volcano 그림(조건 간 결합 변화)을 등록한다.</w:t>
+        <w:t xml:space="preserve">등록할 그림: </w:t>
+      </w:r>
+      <w:r>
+        <w:t xml:space="preserve">04_BINDetect/bindetect_figures.pdf</w:t>
+      </w:r>
+      <w:r>
+        <w:t xml:space="preserve">의 volcano plot 쪽</w:t>
+      </w:r>
+    </w:p>
+    <w:p>
+      <w:pPr>
+        <w:spacing w:after="140"/>
+      </w:pPr>
+      <w:r>
+        <w:rPr>
+          <w:b/>
+          <w:bCs/>
+        </w:rPr>
+        <w:t xml:space="preserve">레전드(국문)</w:t>
+      </w:r>
+    </w:p>
+    <w:p>
+      <w:pPr>
+        <w:spacing w:after="140"/>
+      </w:pPr>
+      <w:r>
+        <w:rPr>
+          <w:b/>
+          <w:bCs/>
+        </w:rPr>
+        <w:t xml:space="preserve">조건 간 전사인자 결합 변화(BINDetect volcano plot).</w:t>
+      </w:r>
+      <w:r>
+        <w:t xml:space="preserve"> 점 하나가 전사인자(모티프) 하나다. 가로축은 두 조건 사이의 결합 점수 차이(differential binding score)로, 오른쪽은 두 번째 조건에서, 왼쪽은 첫 번째 조건에서 결합이 더 강하다는 뜻이다. 세로축은 그 차이의 유의성(−log10 p)이며, 유의하게 변한 전사인자는 색과 이름으로 표시된다.</w:t>
+      </w:r>
+    </w:p>
+    <w:p>
+      <w:pPr>
+        <w:spacing w:after="140"/>
+      </w:pPr>
+      <w:r>
+        <w:rPr>
+          <w:b/>
+          <w:bCs/>
+        </w:rPr>
+        <w:t xml:space="preserve">Legend (English)</w:t>
+      </w:r>
+    </w:p>
+    <w:p>
+      <w:pPr>
+        <w:spacing w:after="140"/>
+      </w:pPr>
+      <w:r>
+        <w:rPr>
+          <w:b/>
+          <w:bCs/>
+        </w:rPr>
+        <w:t xml:space="preserve">Differential transcription factor binding between conditions (BINDetect volcano plot).</w:t>
+      </w:r>
+      <w:r>
+        <w:t xml:space="preserve"> Each point is one transcription factor motif. The x-axis is the differential binding score between the two conditions (positive: stronger in the second condition; negative: stronger in the first), and the y-axis is its significance (−log10 p). Significantly changed factors are coloured and labelled.</w:t>
       </w:r>
     </w:p>
     <w:p>
@@ -25885,7 +26360,7 @@
           <w:sz w:val="18"/>
           <w:szCs w:val="18"/>
         </w:rPr>
-        <w:t xml:space="preserve">docs/figures/module_concepts/functional_enrichment_concept.png</w:t>
+        <w:t xml:space="preserve">docs/ATAC-seq/modules/figures/module_concepts/functional_enrichment_concept.png</w:t>
       </w:r>
     </w:p>
     <w:p>
@@ -26035,7 +26510,7 @@
           <w:sz w:val="24"/>
           <w:szCs w:val="24"/>
         </w:rPr>
-        <w:t xml:space="preserve">주요 결과 이미지 (제안)</w:t>
+        <w:t xml:space="preserve">주요 결과 이미지</w:t>
       </w:r>
     </w:p>
     <w:p>
@@ -26043,10 +26518,67 @@
         <w:spacing w:after="140"/>
       </w:pPr>
       <w:r>
-        <w:t xml:space="preserve">03_plots/&lt;목록&gt;.GO_BP.dotplot.pdf</w:t>
-      </w:r>
-      <w:r>
-        <w:t xml:space="preserve">를 PNG로 변환해 등록한다.</w:t>
+        <w:t xml:space="preserve">등록할 그림: </w:t>
+      </w:r>
+      <w:r>
+        <w:t xml:space="preserve">03_plots/&lt;list&gt;.GO_BP.dotplot.pdf</w:t>
+      </w:r>
+      <w:r>
+        <w:t xml:space="preserve"> (대표 목록 1개)</w:t>
+      </w:r>
+    </w:p>
+    <w:p>
+      <w:pPr>
+        <w:spacing w:after="140"/>
+      </w:pPr>
+      <w:r>
+        <w:rPr>
+          <w:b/>
+          <w:bCs/>
+        </w:rPr>
+        <w:t xml:space="preserve">레전드(국문)</w:t>
+      </w:r>
+    </w:p>
+    <w:p>
+      <w:pPr>
+        <w:spacing w:after="140"/>
+      </w:pPr>
+      <w:r>
+        <w:rPr>
+          <w:b/>
+          <w:bCs/>
+        </w:rPr>
+        <w:t xml:space="preserve">유전자 목록의 GO 생물학적 과정 농축.</w:t>
+      </w:r>
+      <w:r>
+        <w:t xml:space="preserve"> 행은 유의하게 농축된 GO term이다. 가로축은 목록 유전자 중 그 term에 속한 비율(GeneRatio), 점의 크기는 해당 유전자 수, 색은 보정된 p-value(p.adjust)다. peak 근처 유전자들이 어떤 생물학적 과정에 모여 있는지를 보여 준다.</w:t>
+      </w:r>
+    </w:p>
+    <w:p>
+      <w:pPr>
+        <w:spacing w:after="140"/>
+      </w:pPr>
+      <w:r>
+        <w:rPr>
+          <w:b/>
+          <w:bCs/>
+        </w:rPr>
+        <w:t xml:space="preserve">Legend (English)</w:t>
+      </w:r>
+    </w:p>
+    <w:p>
+      <w:pPr>
+        <w:spacing w:after="140"/>
+      </w:pPr>
+      <w:r>
+        <w:rPr>
+          <w:b/>
+          <w:bCs/>
+        </w:rPr>
+        <w:t xml:space="preserve">GO biological process enrichment of a gene list.</w:t>
+      </w:r>
+      <w:r>
+        <w:t xml:space="preserve"> Rows are significantly enriched GO terms. The x-axis is the fraction of list genes in each term (GeneRatio), point size is the gene count, and colour is the adjusted p-value (p.adjust). The plot shows which biological processes the genes near the peaks converge on.</w:t>
       </w:r>
     </w:p>
     <w:p>
@@ -28335,7 +28867,7 @@
           <w:sz w:val="18"/>
           <w:szCs w:val="18"/>
         </w:rPr>
-        <w:t xml:space="preserve">docs/figures/module_concepts/replicate_consistency_concept.png</w:t>
+        <w:t xml:space="preserve">docs/ATAC-seq/modules/figures/module_concepts/replicate_consistency_concept.png</w:t>
       </w:r>
     </w:p>
     <w:p>
@@ -28485,7 +29017,7 @@
           <w:sz w:val="24"/>
           <w:szCs w:val="24"/>
         </w:rPr>
-        <w:t xml:space="preserve">주요 결과 이미지 (제안)</w:t>
+        <w:t xml:space="preserve">주요 결과 이미지</w:t>
       </w:r>
     </w:p>
     <w:p>
@@ -28493,10 +29025,67 @@
         <w:spacing w:after="140"/>
       </w:pPr>
       <w:r>
-        <w:t xml:space="preserve">02_idr/&lt;조건&gt;/&lt;쌍&gt;.idr.txt.png</w:t>
-      </w:r>
-      <w:r>
-        <w:t xml:space="preserve">(IDR 산점도)를 등록한다.</w:t>
+        <w:t xml:space="preserve">등록할 그림: </w:t>
+      </w:r>
+      <w:r>
+        <w:t xml:space="preserve">02_idr/&lt;condition&gt;/&lt;repA&gt;_vs_&lt;repB&gt;.idr.png</w:t>
+      </w:r>
+      <w:r>
+        <w:t xml:space="preserve"> (대표 조건 1개)</w:t>
+      </w:r>
+    </w:p>
+    <w:p>
+      <w:pPr>
+        <w:spacing w:after="140"/>
+      </w:pPr>
+      <w:r>
+        <w:rPr>
+          <w:b/>
+          <w:bCs/>
+        </w:rPr>
+        <w:t xml:space="preserve">레전드(국문)</w:t>
+      </w:r>
+    </w:p>
+    <w:p>
+      <w:pPr>
+        <w:spacing w:after="140"/>
+      </w:pPr>
+      <w:r>
+        <w:rPr>
+          <w:b/>
+          <w:bCs/>
+        </w:rPr>
+        <w:t xml:space="preserve">반복 샘플 간 peak 재현성(IDR).</w:t>
+      </w:r>
+      <w:r>
+        <w:t xml:space="preserve"> 두 반복 샘플에서 찾은 peak를 짝지어 비교한 그림이다. 위쪽 패널은 두 반복의 peak 순위와 신호 세기를 서로 대응시킨 산점도로, 검은 점은 IDR 기준을 통과한 재현성 있는 peak, 빨간 점은 통과하지 못한 peak다. 아래쪽 패널은 peak 순위에 따른 IDR 값을 보여 준다. 강한 peak일수록 두 반복에서 함께 나타나고, 약한 peak로 갈수록 재현성이 떨어진다.</w:t>
+      </w:r>
+    </w:p>
+    <w:p>
+      <w:pPr>
+        <w:spacing w:after="140"/>
+      </w:pPr>
+      <w:r>
+        <w:rPr>
+          <w:b/>
+          <w:bCs/>
+        </w:rPr>
+        <w:t xml:space="preserve">Legend (English)</w:t>
+      </w:r>
+    </w:p>
+    <w:p>
+      <w:pPr>
+        <w:spacing w:after="140"/>
+      </w:pPr>
+      <w:r>
+        <w:rPr>
+          <w:b/>
+          <w:bCs/>
+        </w:rPr>
+        <w:t xml:space="preserve">Peak reproducibility between replicates (IDR).</w:t>
+      </w:r>
+      <w:r>
+        <w:t xml:space="preserve"> Peaks from two replicates are matched and compared. The upper panels plot the ranks and signal strengths of matched peaks against each other; black points pass the IDR threshold (reproducible) and red points do not. The lower panels show IDR values along the peak ranks. Strong peaks tend to appear in both replicates, and reproducibility falls off for weaker peaks.</w:t>
       </w:r>
     </w:p>
     <w:sectPr>

</xml_diff>

<commit_message>
Give full references for adapted paper figures
Concept figures adapted from Yan 2020, Ou 2018 and Bentsen 2020 now cite
authors, title, journal, DOI and the CC BY 4.0 license link. Licenses
were checked in Europe PMC, so the pending check note is removed.

Co-Authored-By: Claude Opus 5.5 <noreply@anthropic.com>
</commit_message>
<xml_diff>
--- a/docs/ATAC-seq/modules/Portal_Content.docx
+++ b/docs/ATAC-seq/modules/Portal_Content.docx
@@ -4771,7 +4771,17 @@
         <w:spacing w:after="80"/>
       </w:pPr>
       <w:r>
-        <w:t xml:space="preserve">출처: Adapted from Ou J. et al., BMC Genomics 19, 169 (2018), Fig. 1 (CC BY 4.0).</w:t>
+        <w:t xml:space="preserve">출처: Ou J, Liu H, Yu J, Kelliher MA, Castilla LH, Lawson ND, Zhu LJ. ATACseqQC: a Bioconductor package for post-alignment quality assessment of ATAC-seq data. </w:t>
+      </w:r>
+      <w:r>
+        <w:rPr>
+          <w:i/>
+          <w:iCs/>
+        </w:rPr>
+        <w:t xml:space="preserve">BMC Genomics</w:t>
+      </w:r>
+      <w:r>
+        <w:t xml:space="preserve"> 19, 169 (2018). https://doi.org/10.1186/s12864-018-4559-3, Fig. 1을 수정. CC BY 4.0 (https://creativecommons.org/licenses/by/4.0/).</w:t>
       </w:r>
     </w:p>
     <w:p>
@@ -7159,7 +7169,17 @@
         <w:spacing w:after="80"/>
       </w:pPr>
       <w:r>
-        <w:t xml:space="preserve">출처: Adapted from Ou J. et al., BMC Genomics 19, 169 (2018), Fig. 1 (CC BY 4.0).</w:t>
+        <w:t xml:space="preserve">출처: Ou J, Liu H, Yu J, Kelliher MA, Castilla LH, Lawson ND, Zhu LJ. ATACseqQC: a Bioconductor package for post-alignment quality assessment of ATAC-seq data. </w:t>
+      </w:r>
+      <w:r>
+        <w:rPr>
+          <w:i/>
+          <w:iCs/>
+        </w:rPr>
+        <w:t xml:space="preserve">BMC Genomics</w:t>
+      </w:r>
+      <w:r>
+        <w:t xml:space="preserve"> 19, 169 (2018). https://doi.org/10.1186/s12864-018-4559-3, Fig. 1을 수정. CC BY 4.0 (https://creativecommons.org/licenses/by/4.0/).</w:t>
       </w:r>
     </w:p>
     <w:p>
@@ -21957,7 +21977,17 @@
         <w:spacing w:after="80"/>
       </w:pPr>
       <w:r>
-        <w:t xml:space="preserve">출처: Adapted from Bentsen M. et al., Nat Commun 11, 4267 (2020), Fig. 1 (CC BY 4.0).</w:t>
+        <w:t xml:space="preserve">출처: Bentsen M, Goymann P, Schultheis H, Klee K, Petrova A, Wiegandt R, Fust A, Preussner J, Kuenne C, Braun T, Kim J, Looso M. ATAC-seq footprinting unravels kinetics of transcription factor binding during zygotic genome activation. </w:t>
+      </w:r>
+      <w:r>
+        <w:rPr>
+          <w:i/>
+          <w:iCs/>
+        </w:rPr>
+        <w:t xml:space="preserve">Nat Commun</w:t>
+      </w:r>
+      <w:r>
+        <w:t xml:space="preserve"> 11, 4267 (2020). https://doi.org/10.1038/s41467-020-18035-1, Fig. 1을 수정. CC BY 4.0 (https://creativecommons.org/licenses/by/4.0/).</w:t>
       </w:r>
     </w:p>
     <w:p>

</xml_diff>

<commit_message>
Add the portal content writing guide
Covers the files to produce, writing order, pipeline and module page
fields, function-based categories and icons, legends and full
references, result image selection, Word generation and a checklist.
The ATAC-seq content files now point to it, and the stale figure path
in the pipeline content is fixed.

Co-Authored-By: Claude Opus 5.5 <noreply@anthropic.com>
</commit_message>
<xml_diff>
--- a/docs/ATAC-seq/modules/Portal_Content.docx
+++ b/docs/ATAC-seq/modules/Portal_Content.docx
@@ -54,7 +54,23 @@
           <w:sz w:val="18"/>
           <w:szCs w:val="18"/>
         </w:rPr>
-        <w:t xml:space="preserve">와 같다.</w:t>
+        <w:t xml:space="preserve">와 같다. 작성 방법은 </w:t>
+      </w:r>
+      <w:r>
+        <w:rPr>
+          <w:color w:val="8A8F99"/>
+          <w:sz w:val="18"/>
+          <w:szCs w:val="18"/>
+        </w:rPr>
+        <w:t xml:space="preserve">docs/CLOSHA_Portal_Guide_v1.md</w:t>
+      </w:r>
+      <w:r>
+        <w:rPr>
+          <w:color w:val="8A8F99"/>
+          <w:sz w:val="18"/>
+          <w:szCs w:val="18"/>
+        </w:rPr>
+        <w:t xml:space="preserve">를 따른다.</w:t>
       </w:r>
     </w:p>
     <w:p>

</xml_diff>

<commit_message>
Save result images as both PNG and SVG
Result images go to modules/figures/module_results/ as PNG for the
portal and SVG as the source, converted from PDF with pdftocairo.
Images that are PNG from the start and table captures stay PNG only.

Co-Authored-By: Claude Opus 5.5 <noreply@anthropic.com>
</commit_message>
<xml_diff>
--- a/docs/ATAC-seq/modules/Portal_Content.docx
+++ b/docs/ATAC-seq/modules/Portal_Content.docx
@@ -238,19 +238,43 @@
         <w:spacing w:after="80"/>
       </w:pPr>
       <w:r>
-        <w:t xml:space="preserve">주요 결과 이미지는 실제 데이터로 실행한 결과에서 가져온다. PDF는 PNG로 바꿔 등록한다: </w:t>
-      </w:r>
-      <w:r>
-        <w:t xml:space="preserve">pdftoppm -png -r 200 -singlefile &lt;그림&gt;.pdf &lt;그림&gt;</w:t>
-      </w:r>
-      <w:r>
-        <w:t xml:space="preserve"> (여러 쪽이면 </w:t>
+        <w:t xml:space="preserve">주요 결과 이미지는 실제 데이터로 실행한 결과에서 가져와 </w:t>
+      </w:r>
+      <w:r>
+        <w:t xml:space="preserve">docs/ATAC-seq/modules/figures/module_results/&lt;모듈&gt;_result.{png,svg}</w:t>
+      </w:r>
+      <w:r>
+        <w:t xml:space="preserve">로 PNG(등록용)와 SVG(원본)를 함께 저장한다(A/B 두 그림이면 </w:t>
+      </w:r>
+      <w:r>
+        <w:t xml:space="preserve">_result_A</w:t>
+      </w:r>
+      <w:r>
+        <w:t xml:space="preserve">, </w:t>
+      </w:r>
+      <w:r>
+        <w:t xml:space="preserve">_result_B</w:t>
+      </w:r>
+      <w:r>
+        <w:t xml:space="preserve">). PDF는 </w:t>
+      </w:r>
+      <w:r>
+        <w:t xml:space="preserve">pdftocairo -png -r 200 -singlefile &lt;그림&gt;.pdf &lt;모듈&gt;_result</w:t>
+      </w:r>
+      <w:r>
+        <w:t xml:space="preserve">와 </w:t>
+      </w:r>
+      <w:r>
+        <w:t xml:space="preserve">pdftocairo -svg &lt;그림&gt;.pdf &lt;모듈&gt;_result.svg</w:t>
+      </w:r>
+      <w:r>
+        <w:t xml:space="preserve">로 바꾼다(여러 쪽이면 </w:t>
       </w:r>
       <w:r>
         <w:t xml:space="preserve">-f &lt;쪽&gt; -l &lt;쪽&gt;</w:t>
       </w:r>
       <w:r>
-        <w:t xml:space="preserve">로 쪽을 고른다). 표는 화면 캡처해 등록한다.</w:t>
+        <w:t xml:space="preserve">). 처음부터 PNG인 그림(IDR)과 표 캡처는 PNG만 저장한다.</w:t>
       </w:r>
     </w:p>
     <w:p>

</xml_diff>

<commit_message>
Fill example paths for required module inputs and outputs
The portal does not accept an empty value, so required Directory and
File parameters get the paths from the usage examples. Optional inputs
stay empty because the scripts read an empty value as unset.

Co-Authored-By: Claude Opus 5.5 <noreply@anthropic.com>
</commit_message>
<xml_diff>
--- a/docs/ATAC-seq/modules/Portal_Content.docx
+++ b/docs/ATAC-seq/modules/Portal_Content.docx
@@ -112,7 +112,45 @@
         <w:t xml:space="preserve">key=value</w:t>
       </w:r>
       <w:r>
-        <w:t xml:space="preserve"> 형식 인자를 받는다. 등록 화면의 Name은 인자 이름, Value는 기본값이다(빈칸은 기본값 없음).</w:t>
+        <w:t xml:space="preserve"> 형식 인자를 받는다. 등록 화면의 Name은 인자 이름, Value는 기본값이다.</w:t>
+      </w:r>
+    </w:p>
+    <w:p>
+      <w:pPr>
+        <w:pStyle w:val="ListParagraph"/>
+        <w:numPr>
+          <w:ilvl w:val="0"/>
+          <w:numId w:val="2"/>
+        </w:numPr>
+        <w:spacing w:after="80"/>
+      </w:pPr>
+      <w:r>
+        <w:t xml:space="preserve">필수(Required) 입력·출력은 Value가 비어 있으면 포탈에 등록되지 않으므로 예시 경로(</w:t>
+      </w:r>
+      <w:r>
+        <w:t xml:space="preserve">/data/…</w:t>
+      </w:r>
+      <w:r>
+        <w:t xml:space="preserve">, </w:t>
+      </w:r>
+      <w:r>
+        <w:t xml:space="preserve">/ref/…</w:t>
+      </w:r>
+      <w:r>
+        <w:t xml:space="preserve">)를 넣었다. 기본값이 아니며, 실행할 때 캔버스에서 실제 경로로 바꾼다. 예시 경로가 그대로 넘어가면 스크립트가 "not found"로 멈춘다.</w:t>
+      </w:r>
+    </w:p>
+    <w:p>
+      <w:pPr>
+        <w:pStyle w:val="ListParagraph"/>
+        <w:numPr>
+          <w:ilvl w:val="0"/>
+          <w:numId w:val="2"/>
+        </w:numPr>
+        <w:spacing w:after="80"/>
+      </w:pPr>
+      <w:r>
+        <w:t xml:space="preserve">선택(Optional) 입력은 빈 값이 "사용 안 함"이다. 경로를 넣어 두면 그 경로를 실제로 찾으므로 Value를 비워 둔다.</w:t>
       </w:r>
     </w:p>
     <w:p>
@@ -1273,7 +1311,15 @@
               <w:right w:type="dxa" w:w="90"/>
             </w:tcMar>
           </w:tcPr>
-          <w:p/>
+          <w:p>
+            <w:r>
+              <w:rPr>
+                <w:sz w:val="18"/>
+                <w:szCs w:val="18"/>
+              </w:rPr>
+              <w:t xml:space="preserve">/data/bam</w:t>
+            </w:r>
+          </w:p>
         </w:tc>
         <w:tc>
           <w:tcPr>
@@ -1407,7 +1453,15 @@
               <w:right w:type="dxa" w:w="90"/>
             </w:tcMar>
           </w:tcPr>
-          <w:p/>
+          <w:p>
+            <w:r>
+              <w:rPr>
+                <w:sz w:val="18"/>
+                <w:szCs w:val="18"/>
+              </w:rPr>
+              <w:t xml:space="preserve">/data/organellar_filter</w:t>
+            </w:r>
+          </w:p>
         </w:tc>
         <w:tc>
           <w:tcPr>
@@ -3241,7 +3295,15 @@
               <w:right w:type="dxa" w:w="90"/>
             </w:tcMar>
           </w:tcPr>
-          <w:p/>
+          <w:p>
+            <w:r>
+              <w:rPr>
+                <w:sz w:val="18"/>
+                <w:szCs w:val="18"/>
+              </w:rPr>
+              <w:t xml:space="preserve">/data/organellar_filter</w:t>
+            </w:r>
+          </w:p>
         </w:tc>
         <w:tc>
           <w:tcPr>
@@ -3375,7 +3437,15 @@
               <w:right w:type="dxa" w:w="90"/>
             </w:tcMar>
           </w:tcPr>
-          <w:p/>
+          <w:p>
+            <w:r>
+              <w:rPr>
+                <w:sz w:val="18"/>
+                <w:szCs w:val="18"/>
+              </w:rPr>
+              <w:t xml:space="preserve">/data/sample_data.csv</w:t>
+            </w:r>
+          </w:p>
         </w:tc>
         <w:tc>
           <w:tcPr>
@@ -3509,7 +3579,15 @@
               <w:right w:type="dxa" w:w="90"/>
             </w:tcMar>
           </w:tcPr>
-          <w:p/>
+          <w:p>
+            <w:r>
+              <w:rPr>
+                <w:sz w:val="18"/>
+                <w:szCs w:val="18"/>
+              </w:rPr>
+              <w:t xml:space="preserve">/ref/genes.bed</w:t>
+            </w:r>
+          </w:p>
         </w:tc>
         <w:tc>
           <w:tcPr>
@@ -3643,7 +3721,15 @@
               <w:right w:type="dxa" w:w="90"/>
             </w:tcMar>
           </w:tcPr>
-          <w:p/>
+          <w:p>
+            <w:r>
+              <w:rPr>
+                <w:sz w:val="18"/>
+                <w:szCs w:val="18"/>
+              </w:rPr>
+              <w:t xml:space="preserve">/ref/genome.fa</w:t>
+            </w:r>
+          </w:p>
         </w:tc>
         <w:tc>
           <w:tcPr>
@@ -3777,7 +3863,15 @@
               <w:right w:type="dxa" w:w="90"/>
             </w:tcMar>
           </w:tcPr>
-          <w:p/>
+          <w:p>
+            <w:r>
+              <w:rPr>
+                <w:sz w:val="18"/>
+                <w:szCs w:val="18"/>
+              </w:rPr>
+              <w:t xml:space="preserve">/data/atac_qc</w:t>
+            </w:r>
+          </w:p>
         </w:tc>
         <w:tc>
           <w:tcPr>
@@ -5913,7 +6007,15 @@
               <w:right w:type="dxa" w:w="90"/>
             </w:tcMar>
           </w:tcPr>
-          <w:p/>
+          <w:p>
+            <w:r>
+              <w:rPr>
+                <w:sz w:val="18"/>
+                <w:szCs w:val="18"/>
+              </w:rPr>
+              <w:t xml:space="preserve">/data/atac_qc</w:t>
+            </w:r>
+          </w:p>
         </w:tc>
         <w:tc>
           <w:tcPr>
@@ -6047,7 +6149,15 @@
               <w:right w:type="dxa" w:w="90"/>
             </w:tcMar>
           </w:tcPr>
-          <w:p/>
+          <w:p>
+            <w:r>
+              <w:rPr>
+                <w:sz w:val="18"/>
+                <w:szCs w:val="18"/>
+              </w:rPr>
+              <w:t xml:space="preserve">/ref/tss.bed</w:t>
+            </w:r>
+          </w:p>
         </w:tc>
         <w:tc>
           <w:tcPr>
@@ -6181,7 +6291,15 @@
               <w:right w:type="dxa" w:w="90"/>
             </w:tcMar>
           </w:tcPr>
-          <w:p/>
+          <w:p>
+            <w:r>
+              <w:rPr>
+                <w:sz w:val="18"/>
+                <w:szCs w:val="18"/>
+              </w:rPr>
+              <w:t xml:space="preserve">/data/atac_qc_plot</w:t>
+            </w:r>
+          </w:p>
         </w:tc>
         <w:tc>
           <w:tcPr>
@@ -8357,7 +8475,15 @@
               <w:right w:type="dxa" w:w="90"/>
             </w:tcMar>
           </w:tcPr>
-          <w:p/>
+          <w:p>
+            <w:r>
+              <w:rPr>
+                <w:sz w:val="18"/>
+                <w:szCs w:val="18"/>
+              </w:rPr>
+              <w:t xml:space="preserve">/data/atac_qc</w:t>
+            </w:r>
+          </w:p>
         </w:tc>
         <w:tc>
           <w:tcPr>
@@ -8491,7 +8617,15 @@
               <w:right w:type="dxa" w:w="90"/>
             </w:tcMar>
           </w:tcPr>
-          <w:p/>
+          <w:p>
+            <w:r>
+              <w:rPr>
+                <w:sz w:val="18"/>
+                <w:szCs w:val="18"/>
+              </w:rPr>
+              <w:t xml:space="preserve">/data/macs3</w:t>
+            </w:r>
+          </w:p>
         </w:tc>
         <w:tc>
           <w:tcPr>
@@ -10707,7 +10841,15 @@
               <w:right w:type="dxa" w:w="90"/>
             </w:tcMar>
           </w:tcPr>
-          <w:p/>
+          <w:p>
+            <w:r>
+              <w:rPr>
+                <w:sz w:val="18"/>
+                <w:szCs w:val="18"/>
+              </w:rPr>
+              <w:t xml:space="preserve">/data/macs3</w:t>
+            </w:r>
+          </w:p>
         </w:tc>
         <w:tc>
           <w:tcPr>
@@ -10841,7 +10983,15 @@
               <w:right w:type="dxa" w:w="90"/>
             </w:tcMar>
           </w:tcPr>
-          <w:p/>
+          <w:p>
+            <w:r>
+              <w:rPr>
+                <w:sz w:val="18"/>
+                <w:szCs w:val="18"/>
+              </w:rPr>
+              <w:t xml:space="preserve">/ref/genes.gff3</w:t>
+            </w:r>
+          </w:p>
         </w:tc>
         <w:tc>
           <w:tcPr>
@@ -10975,7 +11125,15 @@
               <w:right w:type="dxa" w:w="90"/>
             </w:tcMar>
           </w:tcPr>
-          <w:p/>
+          <w:p>
+            <w:r>
+              <w:rPr>
+                <w:sz w:val="18"/>
+                <w:szCs w:val="18"/>
+              </w:rPr>
+              <w:t xml:space="preserve">/data/peak_annotation</w:t>
+            </w:r>
+          </w:p>
         </w:tc>
         <w:tc>
           <w:tcPr>
@@ -13206,7 +13364,15 @@
               <w:right w:type="dxa" w:w="90"/>
             </w:tcMar>
           </w:tcPr>
-          <w:p/>
+          <w:p>
+            <w:r>
+              <w:rPr>
+                <w:sz w:val="18"/>
+                <w:szCs w:val="18"/>
+              </w:rPr>
+              <w:t xml:space="preserve">/data/da_sample_data.csv</w:t>
+            </w:r>
+          </w:p>
         </w:tc>
         <w:tc>
           <w:tcPr>
@@ -13340,7 +13506,15 @@
               <w:right w:type="dxa" w:w="90"/>
             </w:tcMar>
           </w:tcPr>
-          <w:p/>
+          <w:p>
+            <w:r>
+              <w:rPr>
+                <w:sz w:val="18"/>
+                <w:szCs w:val="18"/>
+              </w:rPr>
+              <w:t xml:space="preserve">/ref/genome.fa</w:t>
+            </w:r>
+          </w:p>
         </w:tc>
         <w:tc>
           <w:tcPr>
@@ -13742,7 +13916,15 @@
               <w:right w:type="dxa" w:w="90"/>
             </w:tcMar>
           </w:tcPr>
-          <w:p/>
+          <w:p>
+            <w:r>
+              <w:rPr>
+                <w:sz w:val="18"/>
+                <w:szCs w:val="18"/>
+              </w:rPr>
+              <w:t xml:space="preserve">/data/da</w:t>
+            </w:r>
+          </w:p>
         </w:tc>
         <w:tc>
           <w:tcPr>
@@ -16654,7 +16836,15 @@
               <w:right w:type="dxa" w:w="90"/>
             </w:tcMar>
           </w:tcPr>
-          <w:p/>
+          <w:p>
+            <w:r>
+              <w:rPr>
+                <w:sz w:val="18"/>
+                <w:szCs w:val="18"/>
+              </w:rPr>
+              <w:t xml:space="preserve">/ref/genome.fa</w:t>
+            </w:r>
+          </w:p>
         </w:tc>
         <w:tc>
           <w:tcPr>
@@ -16788,7 +16978,15 @@
               <w:right w:type="dxa" w:w="90"/>
             </w:tcMar>
           </w:tcPr>
-          <w:p/>
+          <w:p>
+            <w:r>
+              <w:rPr>
+                <w:sz w:val="18"/>
+                <w:szCs w:val="18"/>
+              </w:rPr>
+              <w:t xml:space="preserve">/ref/motifs.meme</w:t>
+            </w:r>
+          </w:p>
         </w:tc>
         <w:tc>
           <w:tcPr>
@@ -16922,7 +17120,15 @@
               <w:right w:type="dxa" w:w="90"/>
             </w:tcMar>
           </w:tcPr>
-          <w:p/>
+          <w:p>
+            <w:r>
+              <w:rPr>
+                <w:sz w:val="18"/>
+                <w:szCs w:val="18"/>
+              </w:rPr>
+              <w:t xml:space="preserve">/data/atac_motif</w:t>
+            </w:r>
+          </w:p>
         </w:tc>
         <w:tc>
           <w:tcPr>
@@ -20263,7 +20469,15 @@
               <w:right w:type="dxa" w:w="90"/>
             </w:tcMar>
           </w:tcPr>
-          <w:p/>
+          <w:p>
+            <w:r>
+              <w:rPr>
+                <w:sz w:val="18"/>
+                <w:szCs w:val="18"/>
+              </w:rPr>
+              <w:t xml:space="preserve">/data/atac_qc</w:t>
+            </w:r>
+          </w:p>
         </w:tc>
         <w:tc>
           <w:tcPr>
@@ -20397,7 +20611,15 @@
               <w:right w:type="dxa" w:w="90"/>
             </w:tcMar>
           </w:tcPr>
-          <w:p/>
+          <w:p>
+            <w:r>
+              <w:rPr>
+                <w:sz w:val="18"/>
+                <w:szCs w:val="18"/>
+              </w:rPr>
+              <w:t xml:space="preserve">/data/metadata.tsv</w:t>
+            </w:r>
+          </w:p>
         </w:tc>
         <w:tc>
           <w:tcPr>
@@ -20531,7 +20753,15 @@
               <w:right w:type="dxa" w:w="90"/>
             </w:tcMar>
           </w:tcPr>
-          <w:p/>
+          <w:p>
+            <w:r>
+              <w:rPr>
+                <w:sz w:val="18"/>
+                <w:szCs w:val="18"/>
+              </w:rPr>
+              <w:t xml:space="preserve">/ref/genome.fa</w:t>
+            </w:r>
+          </w:p>
         </w:tc>
         <w:tc>
           <w:tcPr>
@@ -20665,7 +20895,15 @@
               <w:right w:type="dxa" w:w="90"/>
             </w:tcMar>
           </w:tcPr>
-          <w:p/>
+          <w:p>
+            <w:r>
+              <w:rPr>
+                <w:sz w:val="18"/>
+                <w:szCs w:val="18"/>
+              </w:rPr>
+              <w:t xml:space="preserve">/ref/motifs.meme</w:t>
+            </w:r>
+          </w:p>
         </w:tc>
         <w:tc>
           <w:tcPr>
@@ -21067,7 +21305,15 @@
               <w:right w:type="dxa" w:w="90"/>
             </w:tcMar>
           </w:tcPr>
-          <w:p/>
+          <w:p>
+            <w:r>
+              <w:rPr>
+                <w:sz w:val="18"/>
+                <w:szCs w:val="18"/>
+              </w:rPr>
+              <w:t xml:space="preserve">/data/tf_footprinting</w:t>
+            </w:r>
+          </w:p>
         </w:tc>
         <w:tc>
           <w:tcPr>
@@ -24103,7 +24349,15 @@
               <w:right w:type="dxa" w:w="90"/>
             </w:tcMar>
           </w:tcPr>
-          <w:p/>
+          <w:p>
+            <w:r>
+              <w:rPr>
+                <w:sz w:val="18"/>
+                <w:szCs w:val="18"/>
+              </w:rPr>
+              <w:t xml:space="preserve">/data/functional_enrichment</w:t>
+            </w:r>
+          </w:p>
         </w:tc>
         <w:tc>
           <w:tcPr>
@@ -27647,7 +27901,15 @@
               <w:right w:type="dxa" w:w="90"/>
             </w:tcMar>
           </w:tcPr>
-          <w:p/>
+          <w:p>
+            <w:r>
+              <w:rPr>
+                <w:sz w:val="18"/>
+                <w:szCs w:val="18"/>
+              </w:rPr>
+              <w:t xml:space="preserve">/data/atac_qc</w:t>
+            </w:r>
+          </w:p>
         </w:tc>
         <w:tc>
           <w:tcPr>
@@ -27781,7 +28043,15 @@
               <w:right w:type="dxa" w:w="90"/>
             </w:tcMar>
           </w:tcPr>
-          <w:p/>
+          <w:p>
+            <w:r>
+              <w:rPr>
+                <w:sz w:val="18"/>
+                <w:szCs w:val="18"/>
+              </w:rPr>
+              <w:t xml:space="preserve">/data/sample_data.csv</w:t>
+            </w:r>
+          </w:p>
         </w:tc>
         <w:tc>
           <w:tcPr>
@@ -27915,7 +28185,15 @@
               <w:right w:type="dxa" w:w="90"/>
             </w:tcMar>
           </w:tcPr>
-          <w:p/>
+          <w:p>
+            <w:r>
+              <w:rPr>
+                <w:sz w:val="18"/>
+                <w:szCs w:val="18"/>
+              </w:rPr>
+              <w:t xml:space="preserve">/data/replicate_consistency</w:t>
+            </w:r>
+          </w:p>
         </w:tc>
         <w:tc>
           <w:tcPr>

</xml_diff>

<commit_message>
Match result-like concept panels to the real module outputs
Graph panels in the module concept figures now show what each module
actually writes: tables where the module writes only TSV (organellar
idxstats/flagstat, FRiP, IDR summary), per-sample annotation bars, the
edgeR MD plot with its red/blue up/down colors, the monaLisa heatmap
layout and colors, the BINDetect axis name, ATACseqQC class names, and
idr ranks that grow with signal. Legends follow the figures, and the
figure guide records the rule.

Co-Authored-By: Claude Opus 5.5 <noreply@anthropic.com>
</commit_message>
<xml_diff>
--- a/docs/ATAC-seq/modules/Portal_Content.docx
+++ b/docs/ATAC-seq/modules/Portal_Content.docx
@@ -2069,7 +2069,7 @@
         <w:t xml:space="preserve">그림. 세포소기관 read 제거.</w:t>
       </w:r>
       <w:r>
-        <w:t xml:space="preserve"> (A) 핵 DNA는 뉴클레오솜에 감겨 Tn5 절단이 열린 영역에 한정되지만, 미토콘드리아·엽록체 DNA는 뉴클레오솜이 없어 Tn5가 많이 자른다. (B) 그 결과 정렬된 read의 상당 부분이 세포소기관 contig(Mt, Pt)에 몰리며, 필터 후에는 핵 염색체 read만 남는다. (C) 세포소기관 contig는 이름 정규식(organellar_pattern)으로 찾아 제외한다.</w:t>
+        <w:t xml:space="preserve"> (A) 핵 DNA는 뉴클레오솜에 감겨 Tn5 절단이 열린 영역에 한정되지만, 미토콘드리아·엽록체 DNA는 뉴클레오솜이 없어 Tn5가 많이 자른다. (B) 그 결과 정렬된 read의 상당 부분이 세포소기관 contig(Mt, Pt)에 몰린다. 모듈은 contig별 read 수(idxstats)와 제거 전후 flagstat을 표로 남기며, 필터 후에는 핵 염색체 read만 남는다. (C) 세포소기관 contig는 이름 정규식(organellar_pattern)으로 찾아 제외한다.</w:t>
       </w:r>
     </w:p>
     <w:p>
@@ -2092,7 +2092,7 @@
         <w:t xml:space="preserve">Figure. Removal of organellar reads.</w:t>
       </w:r>
       <w:r>
-        <w:t xml:space="preserve"> (A) Nuclear DNA is wrapped around nucleosomes, so Tn5 cuts only open regions, whereas mitochondrial and chloroplast DNA lacks nucleosomes and is cut heavily. (B) Many aligned reads therefore fall on organellar contigs (Mt, Pt); after filtering only nuclear reads remain. (C) Organellar contigs are matched by a name pattern (organellar_pattern) and excluded.</w:t>
+        <w:t xml:space="preserve"> (A) Nuclear DNA is wrapped around nucleosomes, so Tn5 cuts only open regions, whereas mitochondrial and chloroplast DNA lacks nucleosomes and is cut heavily. (B) Many aligned reads therefore fall on organellar contigs (Mt, Pt). The module writes reads per contig (idxstats) and flagstat before and after filtering as tables; after filtering only nuclear reads remain. (C) Organellar contigs are matched by a name pattern (organellar_pattern) and excluded.</w:t>
       </w:r>
     </w:p>
     <w:p>
@@ -7291,7 +7291,7 @@
         <w:t xml:space="preserve">그림. TSS 주변 신호.</w:t>
       </w:r>
       <w:r>
-        <w:t xml:space="preserve"> (A) 모든 TSS를 기준으로 정렬한 nucleosome-free(왼쪽)와 nucleosome-bound(오른쪽) 신호 heatmap. 각 행은 하나의 TSS다. (B) 평균 신호. 좋은 데이터에서는 NFR 신호가 TSS에 모이고, 뉴클레오솜 신호는 그 양옆(−1, +1 뉴클레오솜)에 나타난다. Ou J. et al., BMC Genomics 19, 169 (2018), Fig. 1을 수정(CC BY 4.0).</w:t>
+        <w:t xml:space="preserve"> (A) 모든 TSS를 기준으로 정렬한 NucleosomeFree(왼쪽)와 mononucleosome(오른쪽) 신호 heatmap. 각 행은 하나의 TSS이며, dinucleosome·trinucleosome에 read가 있으면 그 패널도 함께 그려진다. (B) 평균 신호. 좋은 데이터에서는 NFR 신호가 TSS에 모이고, 뉴클레오솜 신호는 그 양옆(−1, +1 뉴클레오솜)에 나타난다. Ou J. et al., BMC Genomics 19, 169 (2018), Fig. 1을 수정(CC BY 4.0).</w:t>
       </w:r>
     </w:p>
     <w:p>
@@ -7314,7 +7314,7 @@
         <w:t xml:space="preserve">Figure. Signal around TSSs.</w:t>
       </w:r>
       <w:r>
-        <w:t xml:space="preserve"> (A) Heatmaps of nucleosome-free (left) and nucleosome-bound (right) signal aligned at all TSSs; each row is one TSS. (B) Averaged coverage. In good data the NFR signal concentrates at the TSS and the nucleosome signal flanks it (−1 and +1 nucleosomes). Adapted from Ou J. et al., BMC Genomics 19, 169 (2018), Fig. 1 (CC BY 4.0).</w:t>
+        <w:t xml:space="preserve"> (A) Heatmaps of NucleosomeFree (left) and mononucleosome (right) signal aligned at all TSSs; each row is one TSS, and dinucleosome and trinucleosome panels are added when they have reads. (B) Averaged coverage. In good data the NFR signal concentrates at the TSS and the nucleosome signal flanks it (−1 and +1 nucleosomes). Adapted from Ou J. et al., BMC Genomics 19, 169 (2018), Fig. 1 (CC BY 4.0).</w:t>
       </w:r>
     </w:p>
     <w:p>
@@ -9693,7 +9693,7 @@
         <w:t xml:space="preserve">그림. Peak 검출.</w:t>
       </w:r>
       <w:r>
-        <w:t xml:space="preserve"> (A) Tn5 보정 BAM의 paired-end fragment를 유전체에 쌓으면, 열린 영역에서 주변 배경(local λ)보다 높은 더미가 생긴다. (B) 각 위치에서 관찰된 fragment 수를 λ로부터 기대되는 값과 Poisson 분포로 비교해 p-value와 q-value를 구하고, 기준을 넘는 구간을 peak(summit 포함)로 기록한다. (C) 전체 read 중 peak 안에 들어간 비율(FRiP)로 신호 대 잡음을 평가한다.</w:t>
+        <w:t xml:space="preserve"> (A) Tn5 보정 BAM의 paired-end fragment를 유전체에 쌓으면, 열린 영역에서 주변 배경(local λ)보다 높은 더미가 생긴다. (B) 각 위치에서 관찰된 fragment 수를 λ로부터 기대되는 값과 Poisson 분포로 비교해 p-value와 q-value를 구하고, 기준을 넘는 구간을 peak(summit 포함)로 기록한다. (C) 전체 read 중 peak 안에 들어간 비율(FRiP)로 신호 대 잡음을 평가하며, 샘플별 peak 수와 함께 frip_summary.tsv 표로 남긴다.</w:t>
       </w:r>
     </w:p>
     <w:p>
@@ -9716,7 +9716,7 @@
         <w:t xml:space="preserve">Figure. Peak calling.</w:t>
       </w:r>
       <w:r>
-        <w:t xml:space="preserve"> (A) Piling up paired-end fragments from Tn5-shifted BAM files gives stacks above the local background (λ) at open regions. (B) Observed fragment counts are compared with those expected from λ under a Poisson model to obtain p- and q-values, and regions passing the threshold are reported as peaks with their summits. (C) The fraction of reads in peaks (FRiP) measures signal to noise.</w:t>
+        <w:t xml:space="preserve"> (A) Piling up paired-end fragments from Tn5-shifted BAM files gives stacks above the local background (λ) at open regions. (B) Observed fragment counts are compared with those expected from λ under a Poisson model to obtain p- and q-values, and regions passing the threshold are reported as peaks with their summits. (C) The fraction of reads in peaks (FRiP) measures signal to noise and is written with the peak count per sample to frip_summary.tsv.</w:t>
       </w:r>
     </w:p>
     <w:p>
@@ -12167,7 +12167,7 @@
         <w:t xml:space="preserve">그림. Peak 주석.</w:t>
       </w:r>
       <w:r>
-        <w:t xml:space="preserve"> (A) 각 peak를 유전자 구조(promoter, exon, intron, downstream, distal intergenic)에 따라 분류하고, 가장 가까운 유전자와 그 TSS까지의 거리(distanceToTSS)를 붙인다. 주석은 해당 종의 GFF3/GTF로 만든 TxDb를 사용한다. (B) 기능 영역별 peak 비율. ATAC-seq peak는 보통 promoter에 많이 모인다.</w:t>
+        <w:t xml:space="preserve"> (A) 각 peak를 유전자 구조(promoter, exon, intron, downstream, distal intergenic)에 따라 분류하고, 가장 가까운 유전자와 그 TSS까지의 거리(distanceToTSS)를 붙인다. 주석은 해당 종의 GFF3/GTF로 만든 TxDb를 사용한다. (B) 샘플별 기능 영역 peak 비율(막대 하나가 샘플 하나). ATAC-seq peak는 보통 promoter에 많이 모인다.</w:t>
       </w:r>
     </w:p>
     <w:p>
@@ -12190,7 +12190,7 @@
         <w:t xml:space="preserve">Figure. Peak annotation.</w:t>
       </w:r>
       <w:r>
-        <w:t xml:space="preserve"> (A) Each peak is classified by gene structure (promoter, exon, intron, downstream, distal intergenic), and the nearest gene and the distance to its TSS (distanceToTSS) are added, using a TxDb built from the species' GFF3/GTF. (B) Fraction of peaks per feature; ATAC-seq peaks are typically enriched at promoters.</w:t>
+        <w:t xml:space="preserve"> (A) Each peak is classified by gene structure (promoter, exon, intron, downstream, distal intergenic), and the nearest gene and the distance to its TSS (distanceToTSS) are added, using a TxDb built from the species' GFF3/GTF. (B) Fraction of peaks per feature for each sample (one bar per sample); ATAC-seq peaks are typically enriched at promoters.</w:t>
       </w:r>
     </w:p>
     <w:p>
@@ -15440,7 +15440,7 @@
         <w:t xml:space="preserve">그림. 차등 접근성 분석.</w:t>
       </w:r>
       <w:r>
-        <w:t xml:space="preserve"> (A) 샘플별 peak를 합쳐 공통 peak 집합을 만든다. (B) 공통 peak마다 조건별 read 수를 세어, 접근성이 증가·유지·감소한 peak를 구분한다. (C) TMM 정규화와 edgeR quasi-likelihood 검정 결과를 MA plot으로 보면, 유의하게 증가(up)·감소(down)한 peak가 드러난다.</w:t>
+        <w:t xml:space="preserve"> (A) 샘플별 peak를 합쳐 공통 peak 집합을 만든다. (B) 공통 peak마다 조건별 read 수를 세어, 접근성이 증가·유지·감소한 peak를 구분한다. (C) TMM 정규화와 edgeR quasi-likelihood 검정 결과를 MD plot(가로축 평균 log CPM, 세로축 log-fold-change)으로 보면, 유의하게 증가(up, 빨강)·감소(down, 파랑)한 peak가 드러난다.</w:t>
       </w:r>
     </w:p>
     <w:p>
@@ -15463,7 +15463,7 @@
         <w:t xml:space="preserve">Figure. Differential accessibility.</w:t>
       </w:r>
       <w:r>
-        <w:t xml:space="preserve"> (A) Sample peaks are merged into a consensus peak set. (B) Reads are counted per consensus peak and condition, separating peaks that gain, keep, or lose accessibility. (C) After TMM normalization and the edgeR quasi-likelihood test, the MA plot shows significantly increased (up) and decreased (down) peaks.</w:t>
+        <w:t xml:space="preserve"> (A) Sample peaks are merged into a consensus peak set. (B) Reads are counted per consensus peak and condition, separating peaks that gain, keep, or lose accessibility. (C) After TMM normalization and the edgeR quasi-likelihood test, the MD plot (average log CPM against log-fold-change) shows significantly increased (up, red) and decreased (down, blue) peaks.</w:t>
       </w:r>
     </w:p>
     <w:p>
@@ -19324,7 +19324,7 @@
         <w:t xml:space="preserve">그림. 모티프 농축 분석.</w:t>
       </w:r>
       <w:r>
-        <w:t xml:space="preserve"> (A) peak를 접근성 변화량(logFC) 순서로 정렬해 여러 구간(bin)으로 나눈다. (B) 구간마다 전사인자 모티프의 출현을 센다. (C) 모티프×구간 heatmap. 접근성이 증가한 구간에 농축된 모티프(파랑)와 감소한 구간에 농축된 모티프를 찾아, 변화와 함께 움직이는 전사인자 후보를 제시한다.</w:t>
+        <w:t xml:space="preserve"> (A) peak를 접근성 변화량(logFC) 순서로 정렬해 여러 구간(bin)으로 나눈다. (B) 구간마다 전사인자 모티프의 출현을 센다. (C) 모티프×구간 heatmap. 왼쪽부터 모티프 이름과 서열 로고, 농축도(log2 enrichment; 빨강은 농축, 파랑은 결핍), 보정 p-value(−log10; 진할수록 유의)다. 접근성이 증가하거나 감소한 구간에만 농축된 모티프가 변화와 함께 움직이는 전사인자 후보다.</w:t>
       </w:r>
     </w:p>
     <w:p>
@@ -19347,7 +19347,7 @@
         <w:t xml:space="preserve">Figure. Motif enrichment.</w:t>
       </w:r>
       <w:r>
-        <w:t xml:space="preserve"> (A) Peaks are ranked by accessibility change (logFC) and split into bins. (B) Transcription factor motif occurrences are counted per bin. (C) Motif-by-bin heatmap showing motifs enriched in bins of increased (blue) or decreased accessibility, which point to candidate factors driving the change.</w:t>
+        <w:t xml:space="preserve"> (A) Peaks are ranked by accessibility change (logFC) and split into bins. (B) Transcription factor motif occurrences are counted per bin. (C) Motif-by-bin heatmap with motif names and sequence logos, log2 enrichment (red enriched, blue depleted) and adjusted p-value (−log10; darker is more significant). Motifs enriched only in bins of increased or decreased accessibility point to candidate factors driving the change.</w:t>
       </w:r>
     </w:p>
     <w:p>
@@ -22227,7 +22227,7 @@
         <w:t xml:space="preserve">그림. 전사인자 footprint 분석.</w:t>
       </w:r>
       <w:r>
-        <w:t xml:space="preserve"> (A) 단백질이 결합한 DNA는 Tn5가 자르지 못해, 절단 신호에 움푹 패인 footprint가 생긴다. (B) 관찰된 절단 신호에서 Tn5 서열 선호도로 예측한 기대 신호를 빼서 편향을 보정한다(ATACorrect). (C) 조건 간 footprint 점수를 비교해(BINDetect), 결합이 늘거나 준 전사인자를 volcano plot으로 보여 준다. Bentsen M. et al., Nat Commun 11, 4267 (2020), Fig. 1을 수정(CC BY 4.0).</w:t>
+        <w:t xml:space="preserve"> (A) 단백질이 결합한 DNA는 Tn5가 자르지 못해, 절단 신호에 움푹 패인 footprint가 생긴다. (B) 관찰된 절단 신호에서 Tn5 서열 선호도로 예측한 기대 신호를 빼서 편향을 보정한다(ATACorrect). (C) 조건 간 footprint 점수를 비교해(BINDetect), 결합이 늘거나 준 전사인자를 volcano plot(가로축 differential binding score, 세로축 −log10 p-value)으로 보여 준다. Bentsen M. et al., Nat Commun 11, 4267 (2020), Fig. 1을 수정(CC BY 4.0).</w:t>
       </w:r>
     </w:p>
     <w:p>
@@ -22250,7 +22250,7 @@
         <w:t xml:space="preserve">Figure. Transcription factor footprinting.</w:t>
       </w:r>
       <w:r>
-        <w:t xml:space="preserve"> (A) DNA bound by a protein is protected from Tn5, leaving a footprint in the cut-site signal. (B) Tn5 sequence bias is corrected by subtracting the cutting expected from Tn5 sequence preference from the observed cut sites (ATACorrect). (C) Footprint scores are compared between conditions (BINDetect), and factors with increased or decreased binding are shown in a volcano plot. Adapted from Bentsen M. et al., Nat Commun 11, 4267 (2020), Fig. 1 (CC BY 4.0).</w:t>
+        <w:t xml:space="preserve"> (A) DNA bound by a protein is protected from Tn5, leaving a footprint in the cut-site signal. (B) Tn5 sequence bias is corrected by subtracting the cutting expected from Tn5 sequence preference from the observed cut sites (ATACorrect). (C) Footprint scores are compared between conditions (BINDetect), and factors with increased or decreased binding are shown in a volcano plot (differential binding score against −log10 p-value). Adapted from Bentsen M. et al., Nat Commun 11, 4267 (2020), Fig. 1 (CC BY 4.0).</w:t>
       </w:r>
     </w:p>
     <w:p>
@@ -29284,7 +29284,7 @@
         <w:t xml:space="preserve">그림. 반복 실험 재현성(IDR).</w:t>
       </w:r>
       <w:r>
-        <w:t xml:space="preserve"> (A) 실제 peak는 두 반복 실험에서 신호 순위가 비슷하지만, 잡음 peak는 순위가 어긋난다. (B) 두 반복의 peak 순위를 비교해 IDR(Irreproducible Discovery Rate)을 계산하고, 기준(IDR ≤ 0.05)을 통과한 peak를 재현성 있는 peak로 본다. (C) 느슨한 기준으로 찾은 peak 중 IDR을 통과한 peak가 가장 많은 반복 쌍을 조건의 대표 peak 세트로 정한다.</w:t>
+        <w:t xml:space="preserve"> (A) 실제 peak는 두 반복 실험에서 신호 순위가 비슷하지만, 잡음 peak는 순위가 어긋난다. (B) 두 반복의 peak 순위를 비교해 IDR(Irreproducible Discovery Rate)을 계산한다. idr 결과 그림의 순위 산점도처럼, 기준(IDR ≤ 0.05)을 통과한 peak(검정)는 신호가 강한 쪽(오른쪽 위)에서 두 반복의 순위가 맞고, 통과하지 못한 peak(빨강)는 흩어진다. (C) 조건과 반복 쌍별로 느슨한 기준의 peak 수와 IDR 통과 peak 수를 idr_summary.tsv로 남기며, 통과 peak가 가장 많은 쌍을 조건의 대표 peak 세트로 정한다.</w:t>
       </w:r>
     </w:p>
     <w:p>
@@ -29307,7 +29307,7 @@
         <w:t xml:space="preserve">Figure. Replicate consistency (IDR).</w:t>
       </w:r>
       <w:r>
-        <w:t xml:space="preserve"> (A) True peaks keep similar signal ranks in two replicates, whereas noise peaks do not. (B) Ranks are compared between replicates to compute the Irreproducible Discovery Rate (IDR), and peaks passing IDR ≤ 0.05 are reproducible. (C) Among relaxed peaks, the replicate pair with the most passing peaks gives the conservative peak set of the condition.</w:t>
+        <w:t xml:space="preserve"> (A) True peaks keep similar signal ranks in two replicates, whereas noise peaks do not. (B) Ranks are compared between replicates to compute the Irreproducible Discovery Rate (IDR). As in the rank scatter of the idr plot, peaks passing IDR ≤ 0.05 (black) agree in rank at the strong end (upper right), while failing peaks (red) scatter. (C) Relaxed and passing peak counts per condition and replicate pair are written to idr_summary.tsv, and the pair with the most passing peaks gives the conservative peak set of the condition.</w:t>
       </w:r>
     </w:p>
     <w:p>

</xml_diff>

<commit_message>
Fix the BINDetect score direction and tighten result legends
TOBIAS colors a positive differential binding score red and means
stronger binding in the first condition (conditions sorted by name in
tf_footprinting); the result legend had the direction reversed. The
concept figure now uses the same red/blue and labels both sides. Result
legends for ATAC_QC_plot and atac_motif now describe every panel the
real plots contain.

Co-Authored-By: Claude Opus 5.5 <noreply@anthropic.com>
</commit_message>
<xml_diff>
--- a/docs/ATAC-seq/modules/Portal_Content.docx
+++ b/docs/ATAC-seq/modules/Portal_Content.docx
@@ -7423,7 +7423,7 @@
         <w:t xml:space="preserve">TSS 주변의 nucleosome-free 신호와 mononucleosome 신호.</w:t>
       </w:r>
       <w:r>
-        <w:t xml:space="preserve"> 각 행은 TSS 하나이고, 가로축은 TSS 중심 ±1,010 bp 구간이다. 왼쪽 패널은 nucleosome-free fragment, 오른쪽 패널은 mononucleosome fragment의 신호(log2)를 색으로 나타낸다. 정상적인 ATAC-seq에서는 nucleosome-free 신호가 TSS 바로 위에 모이고, mononucleosome 신호는 TSS 양옆(nucleosome 자리)에 나타난다.</w:t>
+        <w:t xml:space="preserve"> 각 행은 TSS 하나이고, 가로축은 TSS 중심 ±1,010 bp 구간이다. 패널은 fragment 종류별(NucleosomeFree, mononucleosome, 그리고 read가 있으면 dinucleosome, trinucleosome)이며, 신호(log2)를 색으로 나타낸다. 정상적인 ATAC-seq에서는 nucleosome-free 신호가 TSS 바로 위에 모이고, mononucleosome 신호는 TSS 양옆(nucleosome 자리)에 나타난다.</w:t>
       </w:r>
     </w:p>
     <w:p>
@@ -7450,7 +7450,7 @@
         <w:t xml:space="preserve">Nucleosome-free and mononucleosome signal around TSSs.</w:t>
       </w:r>
       <w:r>
-        <w:t xml:space="preserve"> Each row is one TSS and the x-axis spans ±1,010 bp around its centre. The left panel shows nucleosome-free fragment signal and the right panel mononucleosome fragment signal (log2, colour scale). In good ATAC-seq data the nucleosome-free signal concentrates at the TSS, while the mononucleosome signal flanks it where nucleosomes sit.</w:t>
+        <w:t xml:space="preserve"> Each row is one TSS and the x-axis spans ±1,010 bp around its centre. Panels are per fragment class (NucleosomeFree, mononucleosome, and dinucleosome and trinucleosome when they have reads), with signal (log2) as a colour scale. In good ATAC-seq data the nucleosome-free signal concentrates at the TSS, while the mononucleosome signal flanks it where nucleosomes sit.</w:t>
       </w:r>
     </w:p>
     <w:p>
@@ -19443,7 +19443,7 @@
         <w:t xml:space="preserve">접근성 변화 구간별 모티프 농축.</w:t>
       </w:r>
       <w:r>
-        <w:t xml:space="preserve"> peak를 접근성 변화(log2 fold change) 크기에 따라 여러 구간(bin)으로 나누고, 구간마다 각 전사인자 모티프가 배경보다 얼마나 많은지를 색으로 보여 준다. 행은 유의하게 농축된 모티프이며, 서로 비슷한 모티프끼리 묶어 정렬했고 왼쪽에 서열 로고를 붙였다. 열린 쪽 구간에서만 진하게 나타나는 모티프는 조건 변화로 활성이 커진 전사인자의 후보다.</w:t>
+        <w:t xml:space="preserve"> peak를 접근성 변화(log2 fold change) 크기에 따라 여러 구간(bin)으로 나누고, 구간마다 각 전사인자 모티프가 배경보다 얼마나 많은지를 색으로 보여 준다. 행은 유의하게 농축된 모티프이며, 서로 비슷한 모티프끼리 묶어 정렬했고 왼쪽에 서열 로고와 GC 비율을 붙였다. 첫 heatmap은 농축도(log2 enrichment; 빨강 농축, 파랑 결핍), 둘째는 보정 p-value(−log10; 진할수록 유의)다. 열린 쪽 구간에서만 진하게 나타나는 모티프는 조건 변화로 활성이 커진 전사인자의 후보다.</w:t>
       </w:r>
     </w:p>
     <w:p>
@@ -19470,7 +19470,7 @@
         <w:t xml:space="preserve">Motif enrichment across bins of accessibility change.</w:t>
       </w:r>
       <w:r>
-        <w:t xml:space="preserve"> Peaks are grouped into bins by log2 fold change in accessibility, and the colour shows how strongly each transcription factor motif is enriched in each bin relative to background. Rows are significantly enriched motifs, clustered by motif similarity and shown with sequence logos. Motifs enriched only in the gained-accessibility bins point to transcription factors that become more active.</w:t>
+        <w:t xml:space="preserve"> Peaks are grouped into bins by log2 fold change in accessibility, and the colour shows how strongly each transcription factor motif is enriched in each bin relative to background. Rows are significantly enriched motifs, clustered by motif similarity and shown with sequence logos and GC content. The first heatmap is log2 enrichment (red enriched, blue depleted) and the second the adjusted p-value (−log10; darker is more significant). Motifs enriched only in the gained-accessibility bins point to transcription factors that become more active.</w:t>
       </w:r>
     </w:p>
     <w:p>
@@ -22227,7 +22227,7 @@
         <w:t xml:space="preserve">그림. 전사인자 footprint 분석.</w:t>
       </w:r>
       <w:r>
-        <w:t xml:space="preserve"> (A) 단백질이 결합한 DNA는 Tn5가 자르지 못해, 절단 신호에 움푹 패인 footprint가 생긴다. (B) 관찰된 절단 신호에서 Tn5 서열 선호도로 예측한 기대 신호를 빼서 편향을 보정한다(ATACorrect). (C) 조건 간 footprint 점수를 비교해(BINDetect), 결합이 늘거나 준 전사인자를 volcano plot(가로축 differential binding score, 세로축 −log10 p-value)으로 보여 준다. Bentsen M. et al., Nat Commun 11, 4267 (2020), Fig. 1을 수정(CC BY 4.0).</w:t>
+        <w:t xml:space="preserve"> (A) 단백질이 결합한 DNA는 Tn5가 자르지 못해, 절단 신호에 움푹 패인 footprint가 생긴다. (B) 관찰된 절단 신호에서 Tn5 서열 선호도로 예측한 기대 신호를 빼서 편향을 보정한다(ATACorrect). (C) 조건 간 footprint 점수를 비교해(BINDetect), 결합이 늘거나 준 전사인자를 volcano plot(가로축 differential binding score, 세로축 −log10 p-value)으로 보여 준다. 조건 이름을 알파벳순으로 놓았을 때 첫 번째 조건에서 결합이 강하면 양수(빨강), 두 번째 조건에서 강하면 음수(파랑)다. Bentsen M. et al., Nat Commun 11, 4267 (2020), Fig. 1을 수정(CC BY 4.0).</w:t>
       </w:r>
     </w:p>
     <w:p>
@@ -22250,7 +22250,7 @@
         <w:t xml:space="preserve">Figure. Transcription factor footprinting.</w:t>
       </w:r>
       <w:r>
-        <w:t xml:space="preserve"> (A) DNA bound by a protein is protected from Tn5, leaving a footprint in the cut-site signal. (B) Tn5 sequence bias is corrected by subtracting the cutting expected from Tn5 sequence preference from the observed cut sites (ATACorrect). (C) Footprint scores are compared between conditions (BINDetect), and factors with increased or decreased binding are shown in a volcano plot (differential binding score against −log10 p-value). Adapted from Bentsen M. et al., Nat Commun 11, 4267 (2020), Fig. 1 (CC BY 4.0).</w:t>
+        <w:t xml:space="preserve"> (A) DNA bound by a protein is protected from Tn5, leaving a footprint in the cut-site signal. (B) Tn5 sequence bias is corrected by subtracting the cutting expected from Tn5 sequence preference from the observed cut sites (ATACorrect). (C) Footprint scores are compared between conditions (BINDetect), and factors with increased or decreased binding are shown in a volcano plot (differential binding score against −log10 p-value). With the condition names in alphabetical order, positive scores (red) mean stronger binding in the first condition and negative scores (blue) in the second. Adapted from Bentsen M. et al., Nat Commun 11, 4267 (2020), Fig. 1 (CC BY 4.0).</w:t>
       </w:r>
     </w:p>
     <w:p>
@@ -22359,7 +22359,7 @@
         <w:t xml:space="preserve">조건 간 전사인자 결합 변화(BINDetect volcano plot).</w:t>
       </w:r>
       <w:r>
-        <w:t xml:space="preserve"> 점 하나가 전사인자(모티프) 하나다. 가로축은 두 조건 사이의 결합 점수 차이(differential binding score)로, 오른쪽은 두 번째 조건에서, 왼쪽은 첫 번째 조건에서 결합이 더 강하다는 뜻이다. 세로축은 그 차이의 유의성(−log10 p)이며, 유의하게 변한 전사인자는 색과 이름으로 표시된다.</w:t>
+        <w:t xml:space="preserve"> 점 하나가 전사인자(모티프) 하나다. 가로축은 두 조건 사이의 결합 점수 차이(differential binding score)다. 조건 이름을 알파벳순으로 놓았을 때 양수(오른쪽, 빨강)는 첫 번째 조건에서, 음수(왼쪽, 파랑)는 두 번째 조건에서 결합이 더 강하다는 뜻이다. 세로축은 그 차이의 유의성(−log10 p-value)이며, 변화가 크거나 유의한 전사인자는 색과 이름으로 표시된다.</w:t>
       </w:r>
     </w:p>
     <w:p>
@@ -22386,7 +22386,7 @@
         <w:t xml:space="preserve">Differential transcription factor binding between conditions (BINDetect volcano plot).</w:t>
       </w:r>
       <w:r>
-        <w:t xml:space="preserve"> Each point is one transcription factor motif. The x-axis is the differential binding score between the two conditions (positive: stronger in the second condition; negative: stronger in the first), and the y-axis is its significance (−log10 p). Significantly changed factors are coloured and labelled.</w:t>
+        <w:t xml:space="preserve"> Each point is one transcription factor motif. The x-axis is the differential binding score between the two conditions; with the condition names in alphabetical order, positive scores (right, red) mean stronger binding in the first condition and negative scores (left, blue) in the second. The y-axis is its significance (−log10 p-value), and factors with large or significant changes are coloured and labelled.</w:t>
       </w:r>
     </w:p>
     <w:p>

</xml_diff>

<commit_message>
Show every option in the module usage examples
Each example now lists all options with their defaults, one argument per
line; options without a default are named below the example. Option
names were checked against the scripts, and genome_size uses the
Arabidopsis value to match the other example inputs.

Co-Authored-By: Claude Opus 5.5 <noreply@anthropic.com>
</commit_message>
<xml_diff>
--- a/docs/ATAC-seq/modules/Portal_Content.docx
+++ b/docs/ATAC-seq/modules/Portal_Content.docx
@@ -151,6 +151,19 @@
       </w:pPr>
       <w:r>
         <w:t xml:space="preserve">선택(Optional) 입력은 빈 값이 "사용 안 함"이다. 경로를 넣어 두면 그 경로를 실제로 찾으므로 Value를 비워 둔다.</w:t>
+      </w:r>
+    </w:p>
+    <w:p>
+      <w:pPr>
+        <w:pStyle w:val="ListParagraph"/>
+        <w:numPr>
+          <w:ilvl w:val="0"/>
+          <w:numId w:val="2"/>
+        </w:numPr>
+        <w:spacing w:after="80"/>
+      </w:pPr>
+      <w:r>
+        <w:t xml:space="preserve">스크립트 사용 예제는 모든 옵션을 기본값으로 적었다(기본값이 없는 옵션은 제외). 예시 값은 애기장대(TAIR10, 유전체 약 1.2e8 bp) 기준이다.</w:t>
       </w:r>
     </w:p>
     <w:p>
@@ -2134,7 +2147,63 @@
           <w:sz w:val="19"/>
           <w:szCs w:val="19"/>
         </w:rPr>
-        <w:t xml:space="preserve">bash organellar_filter.1.1.sh input_dir=/data/bam output_dir=/data/organellar_filter</w:t>
+        <w:t xml:space="preserve">bash organellar_filter.1.1.sh \</w:t>
+      </w:r>
+    </w:p>
+    <w:p>
+      <w:pPr>
+        <w:shd w:fill="F3F4F6" w:color="auto" w:val="clear"/>
+        <w:spacing w:after="0"/>
+      </w:pPr>
+      <w:r>
+        <w:rPr>
+          <w:color w:val="3A3A3A"/>
+          <w:sz w:val="19"/>
+          <w:szCs w:val="19"/>
+        </w:rPr>
+        <w:t xml:space="preserve">  input_dir=/data/bam \</w:t>
+      </w:r>
+    </w:p>
+    <w:p>
+      <w:pPr>
+        <w:shd w:fill="F3F4F6" w:color="auto" w:val="clear"/>
+        <w:spacing w:after="0"/>
+      </w:pPr>
+      <w:r>
+        <w:rPr>
+          <w:color w:val="3A3A3A"/>
+          <w:sz w:val="19"/>
+          <w:szCs w:val="19"/>
+        </w:rPr>
+        <w:t xml:space="preserve">  output_dir=/data/organellar_filter \</w:t>
+      </w:r>
+    </w:p>
+    <w:p>
+      <w:pPr>
+        <w:shd w:fill="F3F4F6" w:color="auto" w:val="clear"/>
+        <w:spacing w:after="0"/>
+      </w:pPr>
+      <w:r>
+        <w:rPr>
+          <w:color w:val="3A3A3A"/>
+          <w:sz w:val="19"/>
+          <w:szCs w:val="19"/>
+        </w:rPr>
+        <w:t xml:space="preserve">  threads=auto \</w:t>
+      </w:r>
+    </w:p>
+    <w:p>
+      <w:pPr>
+        <w:shd w:fill="F3F4F6" w:color="auto" w:val="clear"/>
+        <w:spacing w:after="0"/>
+      </w:pPr>
+      <w:r>
+        <w:rPr>
+          <w:color w:val="3A3A3A"/>
+          <w:sz w:val="19"/>
+          <w:szCs w:val="19"/>
+        </w:rPr>
+        <w:t xml:space="preserve">  organellar_pattern='(^chrM$|^MT$|^Mt$|mitochond|mitochondrion|mitochondrial|chloroplast|plastid|^Pt$|^PT$|^chrC$)'</w:t>
       </w:r>
     </w:p>
     <w:p/>
@@ -4944,7 +5013,119 @@
           <w:sz w:val="19"/>
           <w:szCs w:val="19"/>
         </w:rPr>
-        <w:t xml:space="preserve">Rscript ATAC_QC.1.2.R input_dir=/data/organellar_filter sample_data=/data/sample_data.csv txs_bed=/ref/genes.bed genome_fasta=/ref/genome.fa output_dir=/data/atac_qc</w:t>
+        <w:t xml:space="preserve">Rscript ATAC_QC.1.2.R \</w:t>
+      </w:r>
+    </w:p>
+    <w:p>
+      <w:pPr>
+        <w:shd w:fill="F3F4F6" w:color="auto" w:val="clear"/>
+        <w:spacing w:after="0"/>
+      </w:pPr>
+      <w:r>
+        <w:rPr>
+          <w:color w:val="3A3A3A"/>
+          <w:sz w:val="19"/>
+          <w:szCs w:val="19"/>
+        </w:rPr>
+        <w:t xml:space="preserve">  input_dir=/data/organellar_filter \</w:t>
+      </w:r>
+    </w:p>
+    <w:p>
+      <w:pPr>
+        <w:shd w:fill="F3F4F6" w:color="auto" w:val="clear"/>
+        <w:spacing w:after="0"/>
+      </w:pPr>
+      <w:r>
+        <w:rPr>
+          <w:color w:val="3A3A3A"/>
+          <w:sz w:val="19"/>
+          <w:szCs w:val="19"/>
+        </w:rPr>
+        <w:t xml:space="preserve">  sample_data=/data/sample_data.csv \</w:t>
+      </w:r>
+    </w:p>
+    <w:p>
+      <w:pPr>
+        <w:shd w:fill="F3F4F6" w:color="auto" w:val="clear"/>
+        <w:spacing w:after="0"/>
+      </w:pPr>
+      <w:r>
+        <w:rPr>
+          <w:color w:val="3A3A3A"/>
+          <w:sz w:val="19"/>
+          <w:szCs w:val="19"/>
+        </w:rPr>
+        <w:t xml:space="preserve">  txs_bed=/ref/genes.bed \</w:t>
+      </w:r>
+    </w:p>
+    <w:p>
+      <w:pPr>
+        <w:shd w:fill="F3F4F6" w:color="auto" w:val="clear"/>
+        <w:spacing w:after="0"/>
+      </w:pPr>
+      <w:r>
+        <w:rPr>
+          <w:color w:val="3A3A3A"/>
+          <w:sz w:val="19"/>
+          <w:szCs w:val="19"/>
+        </w:rPr>
+        <w:t xml:space="preserve">  genome_fasta=/ref/genome.fa \</w:t>
+      </w:r>
+    </w:p>
+    <w:p>
+      <w:pPr>
+        <w:shd w:fill="F3F4F6" w:color="auto" w:val="clear"/>
+        <w:spacing w:after="0"/>
+      </w:pPr>
+      <w:r>
+        <w:rPr>
+          <w:color w:val="3A3A3A"/>
+          <w:sz w:val="19"/>
+          <w:szCs w:val="19"/>
+        </w:rPr>
+        <w:t xml:space="preserve">  output_dir=/data/atac_qc \</w:t>
+      </w:r>
+    </w:p>
+    <w:p>
+      <w:pPr>
+        <w:shd w:fill="F3F4F6" w:color="auto" w:val="clear"/>
+        <w:spacing w:after="0"/>
+      </w:pPr>
+      <w:r>
+        <w:rPr>
+          <w:color w:val="3A3A3A"/>
+          <w:sz w:val="19"/>
+          <w:szCs w:val="19"/>
+        </w:rPr>
+        <w:t xml:space="preserve">  seqlev=auto \</w:t>
+      </w:r>
+    </w:p>
+    <w:p>
+      <w:pPr>
+        <w:shd w:fill="F3F4F6" w:color="auto" w:val="clear"/>
+        <w:spacing w:after="0"/>
+      </w:pPr>
+      <w:r>
+        <w:rPr>
+          <w:color w:val="3A3A3A"/>
+          <w:sz w:val="19"/>
+          <w:szCs w:val="19"/>
+        </w:rPr>
+        <w:t xml:space="preserve">  tss_flank=1000 \</w:t>
+      </w:r>
+    </w:p>
+    <w:p>
+      <w:pPr>
+        <w:shd w:fill="F3F4F6" w:color="auto" w:val="clear"/>
+        <w:spacing w:after="0"/>
+      </w:pPr>
+      <w:r>
+        <w:rPr>
+          <w:color w:val="3A3A3A"/>
+          <w:sz w:val="19"/>
+          <w:szCs w:val="19"/>
+        </w:rPr>
+        <w:t xml:space="preserve">  make_bigwig=TRUE</w:t>
       </w:r>
     </w:p>
     <w:p/>
@@ -7366,7 +7547,119 @@
           <w:sz w:val="19"/>
           <w:szCs w:val="19"/>
         </w:rPr>
-        <w:t xml:space="preserve">Rscript ATAC_QC_plot.1.1.R input_dir=/data/atac_qc tss_bed=/ref/tss.bed output_dir=/data/atac_qc_plot</w:t>
+        <w:t xml:space="preserve">Rscript ATAC_QC_plot.1.1.R \</w:t>
+      </w:r>
+    </w:p>
+    <w:p>
+      <w:pPr>
+        <w:shd w:fill="F3F4F6" w:color="auto" w:val="clear"/>
+        <w:spacing w:after="0"/>
+      </w:pPr>
+      <w:r>
+        <w:rPr>
+          <w:color w:val="3A3A3A"/>
+          <w:sz w:val="19"/>
+          <w:szCs w:val="19"/>
+        </w:rPr>
+        <w:t xml:space="preserve">  input_dir=/data/atac_qc \</w:t>
+      </w:r>
+    </w:p>
+    <w:p>
+      <w:pPr>
+        <w:shd w:fill="F3F4F6" w:color="auto" w:val="clear"/>
+        <w:spacing w:after="0"/>
+      </w:pPr>
+      <w:r>
+        <w:rPr>
+          <w:color w:val="3A3A3A"/>
+          <w:sz w:val="19"/>
+          <w:szCs w:val="19"/>
+        </w:rPr>
+        <w:t xml:space="preserve">  tss_bed=/ref/tss.bed \</w:t>
+      </w:r>
+    </w:p>
+    <w:p>
+      <w:pPr>
+        <w:shd w:fill="F3F4F6" w:color="auto" w:val="clear"/>
+        <w:spacing w:after="0"/>
+      </w:pPr>
+      <w:r>
+        <w:rPr>
+          <w:color w:val="3A3A3A"/>
+          <w:sz w:val="19"/>
+          <w:szCs w:val="19"/>
+        </w:rPr>
+        <w:t xml:space="preserve">  output_dir=/data/atac_qc_plot \</w:t>
+      </w:r>
+    </w:p>
+    <w:p>
+      <w:pPr>
+        <w:shd w:fill="F3F4F6" w:color="auto" w:val="clear"/>
+        <w:spacing w:after="0"/>
+      </w:pPr>
+      <w:r>
+        <w:rPr>
+          <w:color w:val="3A3A3A"/>
+          <w:sz w:val="19"/>
+          <w:szCs w:val="19"/>
+        </w:rPr>
+        <w:t xml:space="preserve">  upstream=1010 \</w:t>
+      </w:r>
+    </w:p>
+    <w:p>
+      <w:pPr>
+        <w:shd w:fill="F3F4F6" w:color="auto" w:val="clear"/>
+        <w:spacing w:after="0"/>
+      </w:pPr>
+      <w:r>
+        <w:rPr>
+          <w:color w:val="3A3A3A"/>
+          <w:sz w:val="19"/>
+          <w:szCs w:val="19"/>
+        </w:rPr>
+        <w:t xml:space="preserve">  downstream=1010 \</w:t>
+      </w:r>
+    </w:p>
+    <w:p>
+      <w:pPr>
+        <w:shd w:fill="F3F4F6" w:color="auto" w:val="clear"/>
+        <w:spacing w:after="0"/>
+      </w:pPr>
+      <w:r>
+        <w:rPr>
+          <w:color w:val="3A3A3A"/>
+          <w:sz w:val="19"/>
+          <w:szCs w:val="19"/>
+        </w:rPr>
+        <w:t xml:space="preserve">  ntile=101 \</w:t>
+      </w:r>
+    </w:p>
+    <w:p>
+      <w:pPr>
+        <w:shd w:fill="F3F4F6" w:color="auto" w:val="clear"/>
+        <w:spacing w:after="0"/>
+      </w:pPr>
+      <w:r>
+        <w:rPr>
+          <w:color w:val="3A3A3A"/>
+          <w:sz w:val="19"/>
+          <w:szCs w:val="19"/>
+        </w:rPr>
+        <w:t xml:space="preserve">  tss_filter=0.5 \</w:t>
+      </w:r>
+    </w:p>
+    <w:p>
+      <w:pPr>
+        <w:shd w:fill="F3F4F6" w:color="auto" w:val="clear"/>
+        <w:spacing w:after="0"/>
+      </w:pPr>
+      <w:r>
+        <w:rPr>
+          <w:color w:val="3A3A3A"/>
+          <w:sz w:val="19"/>
+          <w:szCs w:val="19"/>
+        </w:rPr>
+        <w:t xml:space="preserve">  harmonize_mode=auto</w:t>
       </w:r>
     </w:p>
     <w:p/>
@@ -9758,7 +10051,105 @@
           <w:sz w:val="19"/>
           <w:szCs w:val="19"/>
         </w:rPr>
-        <w:t xml:space="preserve">bash MACS3_callpeak_ATAC.1.2.sh input_dir=/data/atac_qc output_dir=/data/macs3 genome_size=hs</w:t>
+        <w:t xml:space="preserve">bash MACS3_callpeak_ATAC.1.2.sh \</w:t>
+      </w:r>
+    </w:p>
+    <w:p>
+      <w:pPr>
+        <w:shd w:fill="F3F4F6" w:color="auto" w:val="clear"/>
+        <w:spacing w:after="0"/>
+      </w:pPr>
+      <w:r>
+        <w:rPr>
+          <w:color w:val="3A3A3A"/>
+          <w:sz w:val="19"/>
+          <w:szCs w:val="19"/>
+        </w:rPr>
+        <w:t xml:space="preserve">  input_dir=/data/atac_qc \</w:t>
+      </w:r>
+    </w:p>
+    <w:p>
+      <w:pPr>
+        <w:shd w:fill="F3F4F6" w:color="auto" w:val="clear"/>
+        <w:spacing w:after="0"/>
+      </w:pPr>
+      <w:r>
+        <w:rPr>
+          <w:color w:val="3A3A3A"/>
+          <w:sz w:val="19"/>
+          <w:szCs w:val="19"/>
+        </w:rPr>
+        <w:t xml:space="preserve">  output_dir=/data/macs3 \</w:t>
+      </w:r>
+    </w:p>
+    <w:p>
+      <w:pPr>
+        <w:shd w:fill="F3F4F6" w:color="auto" w:val="clear"/>
+        <w:spacing w:after="0"/>
+      </w:pPr>
+      <w:r>
+        <w:rPr>
+          <w:color w:val="3A3A3A"/>
+          <w:sz w:val="19"/>
+          <w:szCs w:val="19"/>
+        </w:rPr>
+        <w:t xml:space="preserve">  genome_size=1.2e8 \</w:t>
+      </w:r>
+    </w:p>
+    <w:p>
+      <w:pPr>
+        <w:shd w:fill="F3F4F6" w:color="auto" w:val="clear"/>
+        <w:spacing w:after="0"/>
+      </w:pPr>
+      <w:r>
+        <w:rPr>
+          <w:color w:val="3A3A3A"/>
+          <w:sz w:val="19"/>
+          <w:szCs w:val="19"/>
+        </w:rPr>
+        <w:t xml:space="preserve">  peak_type=atac \</w:t>
+      </w:r>
+    </w:p>
+    <w:p>
+      <w:pPr>
+        <w:shd w:fill="F3F4F6" w:color="auto" w:val="clear"/>
+        <w:spacing w:after="0"/>
+      </w:pPr>
+      <w:r>
+        <w:rPr>
+          <w:color w:val="3A3A3A"/>
+          <w:sz w:val="19"/>
+          <w:szCs w:val="19"/>
+        </w:rPr>
+        <w:t xml:space="preserve">  alignment_suffix=.shifted.bam \</w:t>
+      </w:r>
+    </w:p>
+    <w:p>
+      <w:pPr>
+        <w:shd w:fill="F3F4F6" w:color="auto" w:val="clear"/>
+        <w:spacing w:after="0"/>
+      </w:pPr>
+      <w:r>
+        <w:rPr>
+          <w:color w:val="3A3A3A"/>
+          <w:sz w:val="19"/>
+          <w:szCs w:val="19"/>
+        </w:rPr>
+        <w:t xml:space="preserve">  qvalue=0.05 \</w:t>
+      </w:r>
+    </w:p>
+    <w:p>
+      <w:pPr>
+        <w:shd w:fill="F3F4F6" w:color="auto" w:val="clear"/>
+        <w:spacing w:after="0"/>
+      </w:pPr>
+      <w:r>
+        <w:rPr>
+          <w:color w:val="3A3A3A"/>
+          <w:sz w:val="19"/>
+          <w:szCs w:val="19"/>
+        </w:rPr>
+        <w:t xml:space="preserve">  broad_cutoff=0.1</w:t>
       </w:r>
     </w:p>
     <w:p/>
@@ -12232,7 +12623,119 @@
           <w:sz w:val="19"/>
           <w:szCs w:val="19"/>
         </w:rPr>
-        <w:t xml:space="preserve">Rscript peak_annotation.1.1.R input_dir=/data/macs3 genome_gff=/ref/genes.gff3 output_dir=/data/peak_annotation genome_label=TAIR10</w:t>
+        <w:t xml:space="preserve">Rscript peak_annotation.1.1.R \</w:t>
+      </w:r>
+    </w:p>
+    <w:p>
+      <w:pPr>
+        <w:shd w:fill="F3F4F6" w:color="auto" w:val="clear"/>
+        <w:spacing w:after="0"/>
+      </w:pPr>
+      <w:r>
+        <w:rPr>
+          <w:color w:val="3A3A3A"/>
+          <w:sz w:val="19"/>
+          <w:szCs w:val="19"/>
+        </w:rPr>
+        <w:t xml:space="preserve">  input_dir=/data/macs3 \</w:t>
+      </w:r>
+    </w:p>
+    <w:p>
+      <w:pPr>
+        <w:shd w:fill="F3F4F6" w:color="auto" w:val="clear"/>
+        <w:spacing w:after="0"/>
+      </w:pPr>
+      <w:r>
+        <w:rPr>
+          <w:color w:val="3A3A3A"/>
+          <w:sz w:val="19"/>
+          <w:szCs w:val="19"/>
+        </w:rPr>
+        <w:t xml:space="preserve">  genome_gff=/ref/genes.gff3 \</w:t>
+      </w:r>
+    </w:p>
+    <w:p>
+      <w:pPr>
+        <w:shd w:fill="F3F4F6" w:color="auto" w:val="clear"/>
+        <w:spacing w:after="0"/>
+      </w:pPr>
+      <w:r>
+        <w:rPr>
+          <w:color w:val="3A3A3A"/>
+          <w:sz w:val="19"/>
+          <w:szCs w:val="19"/>
+        </w:rPr>
+        <w:t xml:space="preserve">  output_dir=/data/peak_annotation \</w:t>
+      </w:r>
+    </w:p>
+    <w:p>
+      <w:pPr>
+        <w:shd w:fill="F3F4F6" w:color="auto" w:val="clear"/>
+        <w:spacing w:after="0"/>
+      </w:pPr>
+      <w:r>
+        <w:rPr>
+          <w:color w:val="3A3A3A"/>
+          <w:sz w:val="19"/>
+          <w:szCs w:val="19"/>
+        </w:rPr>
+        <w:t xml:space="preserve">  genome_label=TAIR10 \</w:t>
+      </w:r>
+    </w:p>
+    <w:p>
+      <w:pPr>
+        <w:shd w:fill="F3F4F6" w:color="auto" w:val="clear"/>
+        <w:spacing w:after="0"/>
+      </w:pPr>
+      <w:r>
+        <w:rPr>
+          <w:color w:val="3A3A3A"/>
+          <w:sz w:val="19"/>
+          <w:szCs w:val="19"/>
+        </w:rPr>
+        <w:t xml:space="preserve">  peak_suffix=.narrowPeak \</w:t>
+      </w:r>
+    </w:p>
+    <w:p>
+      <w:pPr>
+        <w:shd w:fill="F3F4F6" w:color="auto" w:val="clear"/>
+        <w:spacing w:after="0"/>
+      </w:pPr>
+      <w:r>
+        <w:rPr>
+          <w:color w:val="3A3A3A"/>
+          <w:sz w:val="19"/>
+          <w:szCs w:val="19"/>
+        </w:rPr>
+        <w:t xml:space="preserve">  tss_upstream=3000 \</w:t>
+      </w:r>
+    </w:p>
+    <w:p>
+      <w:pPr>
+        <w:shd w:fill="F3F4F6" w:color="auto" w:val="clear"/>
+        <w:spacing w:after="0"/>
+      </w:pPr>
+      <w:r>
+        <w:rPr>
+          <w:color w:val="3A3A3A"/>
+          <w:sz w:val="19"/>
+          <w:szCs w:val="19"/>
+        </w:rPr>
+        <w:t xml:space="preserve">  tss_downstream=3000 \</w:t>
+      </w:r>
+    </w:p>
+    <w:p>
+      <w:pPr>
+        <w:shd w:fill="F3F4F6" w:color="auto" w:val="clear"/>
+        <w:spacing w:after="0"/>
+      </w:pPr>
+      <w:r>
+        <w:rPr>
+          <w:color w:val="3A3A3A"/>
+          <w:sz w:val="19"/>
+          <w:szCs w:val="19"/>
+        </w:rPr>
+        <w:t xml:space="preserve">  max_files=NA</w:t>
       </w:r>
     </w:p>
     <w:p/>
@@ -15505,10 +16008,178 @@
           <w:sz w:val="19"/>
           <w:szCs w:val="19"/>
         </w:rPr>
-        <w:t xml:space="preserve">Rscript differential_accessibility.1.2.R sample_data=/data/da_sample_data.csv genome_fasta=/ref/genome.fa input_dir=/data/atac_qc peak_dir=/data/macs3 output_dir=/data/da control_name=control</w:t>
+        <w:t xml:space="preserve">Rscript differential_accessibility.1.2.R \</w:t>
+      </w:r>
+    </w:p>
+    <w:p>
+      <w:pPr>
+        <w:shd w:fill="F3F4F6" w:color="auto" w:val="clear"/>
+        <w:spacing w:after="0"/>
+      </w:pPr>
+      <w:r>
+        <w:rPr>
+          <w:color w:val="3A3A3A"/>
+          <w:sz w:val="19"/>
+          <w:szCs w:val="19"/>
+        </w:rPr>
+        <w:t xml:space="preserve">  sample_data=/data/da_sample_data.csv \</w:t>
+      </w:r>
+    </w:p>
+    <w:p>
+      <w:pPr>
+        <w:shd w:fill="F3F4F6" w:color="auto" w:val="clear"/>
+        <w:spacing w:after="0"/>
+      </w:pPr>
+      <w:r>
+        <w:rPr>
+          <w:color w:val="3A3A3A"/>
+          <w:sz w:val="19"/>
+          <w:szCs w:val="19"/>
+        </w:rPr>
+        <w:t xml:space="preserve">  genome_fasta=/ref/genome.fa \</w:t>
+      </w:r>
+    </w:p>
+    <w:p>
+      <w:pPr>
+        <w:shd w:fill="F3F4F6" w:color="auto" w:val="clear"/>
+        <w:spacing w:after="0"/>
+      </w:pPr>
+      <w:r>
+        <w:rPr>
+          <w:color w:val="3A3A3A"/>
+          <w:sz w:val="19"/>
+          <w:szCs w:val="19"/>
+        </w:rPr>
+        <w:t xml:space="preserve">  input_dir=/data/atac_qc \</w:t>
+      </w:r>
+    </w:p>
+    <w:p>
+      <w:pPr>
+        <w:shd w:fill="F3F4F6" w:color="auto" w:val="clear"/>
+        <w:spacing w:after="0"/>
+      </w:pPr>
+      <w:r>
+        <w:rPr>
+          <w:color w:val="3A3A3A"/>
+          <w:sz w:val="19"/>
+          <w:szCs w:val="19"/>
+        </w:rPr>
+        <w:t xml:space="preserve">  peak_dir=/data/macs3 \</w:t>
+      </w:r>
+    </w:p>
+    <w:p>
+      <w:pPr>
+        <w:shd w:fill="F3F4F6" w:color="auto" w:val="clear"/>
+        <w:spacing w:after="0"/>
+      </w:pPr>
+      <w:r>
+        <w:rPr>
+          <w:color w:val="3A3A3A"/>
+          <w:sz w:val="19"/>
+          <w:szCs w:val="19"/>
+        </w:rPr>
+        <w:t xml:space="preserve">  output_dir=/data/da \</w:t>
+      </w:r>
+    </w:p>
+    <w:p>
+      <w:pPr>
+        <w:shd w:fill="F3F4F6" w:color="auto" w:val="clear"/>
+        <w:spacing w:after="0"/>
+      </w:pPr>
+      <w:r>
+        <w:rPr>
+          <w:color w:val="3A3A3A"/>
+          <w:sz w:val="19"/>
+          <w:szCs w:val="19"/>
+        </w:rPr>
+        <w:t xml:space="preserve">  control_name=control \</w:t>
+      </w:r>
+    </w:p>
+    <w:p>
+      <w:pPr>
+        <w:shd w:fill="F3F4F6" w:color="auto" w:val="clear"/>
+        <w:spacing w:after="0"/>
+      </w:pPr>
+      <w:r>
+        <w:rPr>
+          <w:color w:val="3A3A3A"/>
+          <w:sz w:val="19"/>
+          <w:szCs w:val="19"/>
+        </w:rPr>
+        <w:t xml:space="preserve">  fdr=0.05 \</w:t>
+      </w:r>
+    </w:p>
+    <w:p>
+      <w:pPr>
+        <w:shd w:fill="F3F4F6" w:color="auto" w:val="clear"/>
+        <w:spacing w:after="0"/>
+      </w:pPr>
+      <w:r>
+        <w:rPr>
+          <w:color w:val="3A3A3A"/>
+          <w:sz w:val="19"/>
+          <w:szCs w:val="19"/>
+        </w:rPr>
+        <w:t xml:space="preserve">  tile_width=5000 \</w:t>
+      </w:r>
+    </w:p>
+    <w:p>
+      <w:pPr>
+        <w:shd w:fill="F3F4F6" w:color="auto" w:val="clear"/>
+        <w:spacing w:after="0"/>
+      </w:pPr>
+      <w:r>
+        <w:rPr>
+          <w:color w:val="3A3A3A"/>
+          <w:sz w:val="19"/>
+          <w:szCs w:val="19"/>
+        </w:rPr>
+        <w:t xml:space="preserve">  paired=TRUE \</w:t>
+      </w:r>
+    </w:p>
+    <w:p>
+      <w:pPr>
+        <w:shd w:fill="F3F4F6" w:color="auto" w:val="clear"/>
+        <w:spacing w:after="0"/>
+      </w:pPr>
+      <w:r>
+        <w:rPr>
+          <w:color w:val="3A3A3A"/>
+          <w:sz w:val="19"/>
+          <w:szCs w:val="19"/>
+        </w:rPr>
+        <w:t xml:space="preserve">  run_edaseq=TRUE \</w:t>
+      </w:r>
+    </w:p>
+    <w:p>
+      <w:pPr>
+        <w:shd w:fill="F3F4F6" w:color="auto" w:val="clear"/>
+        <w:spacing w:after="0"/>
+      </w:pPr>
+      <w:r>
+        <w:rPr>
+          <w:color w:val="3A3A3A"/>
+          <w:sz w:val="19"/>
+          <w:szCs w:val="19"/>
+        </w:rPr>
+        <w:t xml:space="preserve">  run_cqn=TRUE</w:t>
       </w:r>
     </w:p>
     <w:p/>
+    <w:p>
+      <w:pPr>
+        <w:spacing w:after="140"/>
+      </w:pPr>
+      <w:r>
+        <w:t xml:space="preserve">기본값이 없는 옵션(</w:t>
+      </w:r>
+      <w:r>
+        <w:t xml:space="preserve">gc_bin_chr</w:t>
+      </w:r>
+      <w:r>
+        <w:t xml:space="preserve">)은 필요할 때만 넣는다.</w:t>
+      </w:r>
+    </w:p>
     <w:p>
       <w:pPr>
         <w:spacing w:after="100" w:before="200"/>
@@ -19389,10 +20060,240 @@
           <w:sz w:val="19"/>
           <w:szCs w:val="19"/>
         </w:rPr>
-        <w:t xml:space="preserve">Rscript atac_motif.1.1.R input_dir=/data/da genome_fasta=/ref/genome.fa motif_db=/ref/JASPAR2024_CORE_plants.meme output_dir=/data/atac_motif</w:t>
+        <w:t xml:space="preserve">Rscript atac_motif.1.1.R \</w:t>
+      </w:r>
+    </w:p>
+    <w:p>
+      <w:pPr>
+        <w:shd w:fill="F3F4F6" w:color="auto" w:val="clear"/>
+        <w:spacing w:after="0"/>
+      </w:pPr>
+      <w:r>
+        <w:rPr>
+          <w:color w:val="3A3A3A"/>
+          <w:sz w:val="19"/>
+          <w:szCs w:val="19"/>
+        </w:rPr>
+        <w:t xml:space="preserve">  input_dir=/data/da \</w:t>
+      </w:r>
+    </w:p>
+    <w:p>
+      <w:pPr>
+        <w:shd w:fill="F3F4F6" w:color="auto" w:val="clear"/>
+        <w:spacing w:after="0"/>
+      </w:pPr>
+      <w:r>
+        <w:rPr>
+          <w:color w:val="3A3A3A"/>
+          <w:sz w:val="19"/>
+          <w:szCs w:val="19"/>
+        </w:rPr>
+        <w:t xml:space="preserve">  genome_fasta=/ref/genome.fa \</w:t>
+      </w:r>
+    </w:p>
+    <w:p>
+      <w:pPr>
+        <w:shd w:fill="F3F4F6" w:color="auto" w:val="clear"/>
+        <w:spacing w:after="0"/>
+      </w:pPr>
+      <w:r>
+        <w:rPr>
+          <w:color w:val="3A3A3A"/>
+          <w:sz w:val="19"/>
+          <w:szCs w:val="19"/>
+        </w:rPr>
+        <w:t xml:space="preserve">  motif_db=/ref/JASPAR2024_CORE_plants.meme \</w:t>
+      </w:r>
+    </w:p>
+    <w:p>
+      <w:pPr>
+        <w:shd w:fill="F3F4F6" w:color="auto" w:val="clear"/>
+        <w:spacing w:after="0"/>
+      </w:pPr>
+      <w:r>
+        <w:rPr>
+          <w:color w:val="3A3A3A"/>
+          <w:sz w:val="19"/>
+          <w:szCs w:val="19"/>
+        </w:rPr>
+        <w:t xml:space="preserve">  output_dir=/data/atac_motif \</w:t>
+      </w:r>
+    </w:p>
+    <w:p>
+      <w:pPr>
+        <w:shd w:fill="F3F4F6" w:color="auto" w:val="clear"/>
+        <w:spacing w:after="0"/>
+      </w:pPr>
+      <w:r>
+        <w:rPr>
+          <w:color w:val="3A3A3A"/>
+          <w:sz w:val="19"/>
+          <w:szCs w:val="19"/>
+        </w:rPr>
+        <w:t xml:space="preserve">  norm=TMM \</w:t>
+      </w:r>
+    </w:p>
+    <w:p>
+      <w:pPr>
+        <w:shd w:fill="F3F4F6" w:color="auto" w:val="clear"/>
+        <w:spacing w:after="0"/>
+      </w:pPr>
+      <w:r>
+        <w:rPr>
+          <w:color w:val="3A3A3A"/>
+          <w:sz w:val="19"/>
+          <w:szCs w:val="19"/>
+        </w:rPr>
+        <w:t xml:space="preserve">  n_per_bin=400 \</w:t>
+      </w:r>
+    </w:p>
+    <w:p>
+      <w:pPr>
+        <w:shd w:fill="F3F4F6" w:color="auto" w:val="clear"/>
+        <w:spacing w:after="0"/>
+      </w:pPr>
+      <w:r>
+        <w:rPr>
+          <w:color w:val="3A3A3A"/>
+          <w:sz w:val="19"/>
+          <w:szCs w:val="19"/>
+        </w:rPr>
+        <w:t xml:space="preserve">  min_abs_logfc=0.3 \</w:t>
+      </w:r>
+    </w:p>
+    <w:p>
+      <w:pPr>
+        <w:shd w:fill="F3F4F6" w:color="auto" w:val="clear"/>
+        <w:spacing w:after="0"/>
+      </w:pPr>
+      <w:r>
+        <w:rPr>
+          <w:color w:val="3A3A3A"/>
+          <w:sz w:val="19"/>
+          <w:szCs w:val="19"/>
+        </w:rPr>
+        <w:t xml:space="preserve">  padj_cutoff=4.0 \</w:t>
+      </w:r>
+    </w:p>
+    <w:p>
+      <w:pPr>
+        <w:shd w:fill="F3F4F6" w:color="auto" w:val="clear"/>
+        <w:spacing w:after="0"/>
+      </w:pPr>
+      <w:r>
+        <w:rPr>
+          <w:color w:val="3A3A3A"/>
+          <w:sz w:val="19"/>
+          <w:szCs w:val="19"/>
+        </w:rPr>
+        <w:t xml:space="preserve">  kmer_len=6 \</w:t>
+      </w:r>
+    </w:p>
+    <w:p>
+      <w:pPr>
+        <w:shd w:fill="F3F4F6" w:color="auto" w:val="clear"/>
+        <w:spacing w:after="0"/>
+      </w:pPr>
+      <w:r>
+        <w:rPr>
+          <w:color w:val="3A3A3A"/>
+          <w:sz w:val="19"/>
+          <w:szCs w:val="19"/>
+        </w:rPr>
+        <w:t xml:space="preserve">  min_motif_score=10.0 \</w:t>
+      </w:r>
+    </w:p>
+    <w:p>
+      <w:pPr>
+        <w:shd w:fill="F3F4F6" w:color="auto" w:val="clear"/>
+        <w:spacing w:after="0"/>
+      </w:pPr>
+      <w:r>
+        <w:rPr>
+          <w:color w:val="3A3A3A"/>
+          <w:sz w:val="19"/>
+          <w:szCs w:val="19"/>
+        </w:rPr>
+        <w:t xml:space="preserve">  stabsel_cutoff=0.8 \</w:t>
+      </w:r>
+    </w:p>
+    <w:p>
+      <w:pPr>
+        <w:shd w:fill="F3F4F6" w:color="auto" w:val="clear"/>
+        <w:spacing w:after="0"/>
+      </w:pPr>
+      <w:r>
+        <w:rPr>
+          <w:color w:val="3A3A3A"/>
+          <w:sz w:val="19"/>
+          <w:szCs w:val="19"/>
+        </w:rPr>
+        <w:t xml:space="preserve">  seed=123 \</w:t>
+      </w:r>
+    </w:p>
+    <w:p>
+      <w:pPr>
+        <w:shd w:fill="F3F4F6" w:color="auto" w:val="clear"/>
+        <w:spacing w:after="0"/>
+      </w:pPr>
+      <w:r>
+        <w:rPr>
+          <w:color w:val="3A3A3A"/>
+          <w:sz w:val="19"/>
+          <w:szCs w:val="19"/>
+        </w:rPr>
+        <w:t xml:space="preserve">  threads=auto \</w:t>
+      </w:r>
+    </w:p>
+    <w:p>
+      <w:pPr>
+        <w:shd w:fill="F3F4F6" w:color="auto" w:val="clear"/>
+        <w:spacing w:after="0"/>
+      </w:pPr>
+      <w:r>
+        <w:rPr>
+          <w:color w:val="3A3A3A"/>
+          <w:sz w:val="19"/>
+          <w:szCs w:val="19"/>
+        </w:rPr>
+        <w:t xml:space="preserve">  run_kmer=TRUE \</w:t>
+      </w:r>
+    </w:p>
+    <w:p>
+      <w:pPr>
+        <w:shd w:fill="F3F4F6" w:color="auto" w:val="clear"/>
+        <w:spacing w:after="0"/>
+      </w:pPr>
+      <w:r>
+        <w:rPr>
+          <w:color w:val="3A3A3A"/>
+          <w:sz w:val="19"/>
+          <w:szCs w:val="19"/>
+        </w:rPr>
+        <w:t xml:space="preserve">  run_regression=TRUE</w:t>
       </w:r>
     </w:p>
     <w:p/>
+    <w:p>
+      <w:pPr>
+        <w:spacing w:after="140"/>
+      </w:pPr>
+      <w:r>
+        <w:t xml:space="preserve">기본값이 없는 옵션(</w:t>
+      </w:r>
+      <w:r>
+        <w:t xml:space="preserve">chrs</w:t>
+      </w:r>
+      <w:r>
+        <w:t xml:space="preserve">, </w:t>
+      </w:r>
+      <w:r>
+        <w:t xml:space="preserve">fdr_filter</w:t>
+      </w:r>
+      <w:r>
+        <w:t xml:space="preserve">)은 필요할 때만 넣는다.</w:t>
+      </w:r>
+    </w:p>
     <w:p>
       <w:pPr>
         <w:spacing w:after="100" w:before="200"/>
@@ -22302,7 +23203,133 @@
           <w:sz w:val="19"/>
           <w:szCs w:val="19"/>
         </w:rPr>
-        <w:t xml:space="preserve">bash tf_footprinting.1.1.sh input_dir=/data/atac_qc metadata=/data/metadata.tsv macs_dir=/data/macs3 genome_fasta=/ref/genome.fa motif_db=/ref/JASPAR2024_CORE_plants.meme output_dir=/data/tf_footprinting</w:t>
+        <w:t xml:space="preserve">bash tf_footprinting.1.1.sh \</w:t>
+      </w:r>
+    </w:p>
+    <w:p>
+      <w:pPr>
+        <w:shd w:fill="F3F4F6" w:color="auto" w:val="clear"/>
+        <w:spacing w:after="0"/>
+      </w:pPr>
+      <w:r>
+        <w:rPr>
+          <w:color w:val="3A3A3A"/>
+          <w:sz w:val="19"/>
+          <w:szCs w:val="19"/>
+        </w:rPr>
+        <w:t xml:space="preserve">  input_dir=/data/atac_qc \</w:t>
+      </w:r>
+    </w:p>
+    <w:p>
+      <w:pPr>
+        <w:shd w:fill="F3F4F6" w:color="auto" w:val="clear"/>
+        <w:spacing w:after="0"/>
+      </w:pPr>
+      <w:r>
+        <w:rPr>
+          <w:color w:val="3A3A3A"/>
+          <w:sz w:val="19"/>
+          <w:szCs w:val="19"/>
+        </w:rPr>
+        <w:t xml:space="preserve">  metadata=/data/metadata.tsv \</w:t>
+      </w:r>
+    </w:p>
+    <w:p>
+      <w:pPr>
+        <w:shd w:fill="F3F4F6" w:color="auto" w:val="clear"/>
+        <w:spacing w:after="0"/>
+      </w:pPr>
+      <w:r>
+        <w:rPr>
+          <w:color w:val="3A3A3A"/>
+          <w:sz w:val="19"/>
+          <w:szCs w:val="19"/>
+        </w:rPr>
+        <w:t xml:space="preserve">  macs_dir=/data/macs3 \</w:t>
+      </w:r>
+    </w:p>
+    <w:p>
+      <w:pPr>
+        <w:shd w:fill="F3F4F6" w:color="auto" w:val="clear"/>
+        <w:spacing w:after="0"/>
+      </w:pPr>
+      <w:r>
+        <w:rPr>
+          <w:color w:val="3A3A3A"/>
+          <w:sz w:val="19"/>
+          <w:szCs w:val="19"/>
+        </w:rPr>
+        <w:t xml:space="preserve">  genome_fasta=/ref/genome.fa \</w:t>
+      </w:r>
+    </w:p>
+    <w:p>
+      <w:pPr>
+        <w:shd w:fill="F3F4F6" w:color="auto" w:val="clear"/>
+        <w:spacing w:after="0"/>
+      </w:pPr>
+      <w:r>
+        <w:rPr>
+          <w:color w:val="3A3A3A"/>
+          <w:sz w:val="19"/>
+          <w:szCs w:val="19"/>
+        </w:rPr>
+        <w:t xml:space="preserve">  motif_db=/ref/JASPAR2024_CORE_plants.meme \</w:t>
+      </w:r>
+    </w:p>
+    <w:p>
+      <w:pPr>
+        <w:shd w:fill="F3F4F6" w:color="auto" w:val="clear"/>
+        <w:spacing w:after="0"/>
+      </w:pPr>
+      <w:r>
+        <w:rPr>
+          <w:color w:val="3A3A3A"/>
+          <w:sz w:val="19"/>
+          <w:szCs w:val="19"/>
+        </w:rPr>
+        <w:t xml:space="preserve">  output_dir=/data/tf_footprinting \</w:t>
+      </w:r>
+    </w:p>
+    <w:p>
+      <w:pPr>
+        <w:shd w:fill="F3F4F6" w:color="auto" w:val="clear"/>
+        <w:spacing w:after="0"/>
+      </w:pPr>
+      <w:r>
+        <w:rPr>
+          <w:color w:val="3A3A3A"/>
+          <w:sz w:val="19"/>
+          <w:szCs w:val="19"/>
+        </w:rPr>
+        <w:t xml:space="preserve">  sample_col=SampleID \</w:t>
+      </w:r>
+    </w:p>
+    <w:p>
+      <w:pPr>
+        <w:shd w:fill="F3F4F6" w:color="auto" w:val="clear"/>
+        <w:spacing w:after="0"/>
+      </w:pPr>
+      <w:r>
+        <w:rPr>
+          <w:color w:val="3A3A3A"/>
+          <w:sz w:val="19"/>
+          <w:szCs w:val="19"/>
+        </w:rPr>
+        <w:t xml:space="preserve">  condition_col=Condition \</w:t>
+      </w:r>
+    </w:p>
+    <w:p>
+      <w:pPr>
+        <w:shd w:fill="F3F4F6" w:color="auto" w:val="clear"/>
+        <w:spacing w:after="0"/>
+      </w:pPr>
+      <w:r>
+        <w:rPr>
+          <w:color w:val="3A3A3A"/>
+          <w:sz w:val="19"/>
+          <w:szCs w:val="19"/>
+        </w:rPr>
+        <w:t xml:space="preserve">  cores=auto</w:t>
       </w:r>
     </w:p>
     <w:p/>
@@ -26818,7 +27845,259 @@
           <w:sz w:val="19"/>
           <w:szCs w:val="19"/>
         </w:rPr>
-        <w:t xml:space="preserve">Rscript functional_enrichment.1.0.R da_dir=/data/da genome_gff=/ref/genes.gff3 orgdb_file=/ref/OrgDb/Arabidopsis_thaliana.AH121945.OrgDb.sqlite output_dir=/data/functional_enrichment</w:t>
+        <w:t xml:space="preserve">Rscript functional_enrichment.1.0.R \</w:t>
+      </w:r>
+    </w:p>
+    <w:p>
+      <w:pPr>
+        <w:shd w:fill="F3F4F6" w:color="auto" w:val="clear"/>
+        <w:spacing w:after="0"/>
+      </w:pPr>
+      <w:r>
+        <w:rPr>
+          <w:color w:val="3A3A3A"/>
+          <w:sz w:val="19"/>
+          <w:szCs w:val="19"/>
+        </w:rPr>
+        <w:t xml:space="preserve">  da_dir=/data/da \</w:t>
+      </w:r>
+    </w:p>
+    <w:p>
+      <w:pPr>
+        <w:shd w:fill="F3F4F6" w:color="auto" w:val="clear"/>
+        <w:spacing w:after="0"/>
+      </w:pPr>
+      <w:r>
+        <w:rPr>
+          <w:color w:val="3A3A3A"/>
+          <w:sz w:val="19"/>
+          <w:szCs w:val="19"/>
+        </w:rPr>
+        <w:t xml:space="preserve">  genome_gff=/ref/genes.gff3 \</w:t>
+      </w:r>
+    </w:p>
+    <w:p>
+      <w:pPr>
+        <w:shd w:fill="F3F4F6" w:color="auto" w:val="clear"/>
+        <w:spacing w:after="0"/>
+      </w:pPr>
+      <w:r>
+        <w:rPr>
+          <w:color w:val="3A3A3A"/>
+          <w:sz w:val="19"/>
+          <w:szCs w:val="19"/>
+        </w:rPr>
+        <w:t xml:space="preserve">  orgdb_file=/ref/OrgDb/Arabidopsis_thaliana.AH121945.OrgDb.sqlite \</w:t>
+      </w:r>
+    </w:p>
+    <w:p>
+      <w:pPr>
+        <w:shd w:fill="F3F4F6" w:color="auto" w:val="clear"/>
+        <w:spacing w:after="0"/>
+      </w:pPr>
+      <w:r>
+        <w:rPr>
+          <w:color w:val="3A3A3A"/>
+          <w:sz w:val="19"/>
+          <w:szCs w:val="19"/>
+        </w:rPr>
+        <w:t xml:space="preserve">  output_dir=/data/functional_enrichment \</w:t>
+      </w:r>
+    </w:p>
+    <w:p>
+      <w:pPr>
+        <w:shd w:fill="F3F4F6" w:color="auto" w:val="clear"/>
+        <w:spacing w:after="0"/>
+      </w:pPr>
+      <w:r>
+        <w:rPr>
+          <w:color w:val="3A3A3A"/>
+          <w:sz w:val="19"/>
+          <w:szCs w:val="19"/>
+        </w:rPr>
+        <w:t xml:space="preserve">  gene_keytype=auto \</w:t>
+      </w:r>
+    </w:p>
+    <w:p>
+      <w:pPr>
+        <w:shd w:fill="F3F4F6" w:color="auto" w:val="clear"/>
+        <w:spacing w:after="0"/>
+      </w:pPr>
+      <w:r>
+        <w:rPr>
+          <w:color w:val="3A3A3A"/>
+          <w:sz w:val="19"/>
+          <w:szCs w:val="19"/>
+        </w:rPr>
+        <w:t xml:space="preserve">  ont=BP \</w:t>
+      </w:r>
+    </w:p>
+    <w:p>
+      <w:pPr>
+        <w:shd w:fill="F3F4F6" w:color="auto" w:val="clear"/>
+        <w:spacing w:after="0"/>
+      </w:pPr>
+      <w:r>
+        <w:rPr>
+          <w:color w:val="3A3A3A"/>
+          <w:sz w:val="19"/>
+          <w:szCs w:val="19"/>
+        </w:rPr>
+        <w:t xml:space="preserve">  max_distance_to_tss=3000 \</w:t>
+      </w:r>
+    </w:p>
+    <w:p>
+      <w:pPr>
+        <w:shd w:fill="F3F4F6" w:color="auto" w:val="clear"/>
+        <w:spacing w:after="0"/>
+      </w:pPr>
+      <w:r>
+        <w:rPr>
+          <w:color w:val="3A3A3A"/>
+          <w:sz w:val="19"/>
+          <w:szCs w:val="19"/>
+        </w:rPr>
+        <w:t xml:space="preserve">  universe=auto \</w:t>
+      </w:r>
+    </w:p>
+    <w:p>
+      <w:pPr>
+        <w:shd w:fill="F3F4F6" w:color="auto" w:val="clear"/>
+        <w:spacing w:after="0"/>
+      </w:pPr>
+      <w:r>
+        <w:rPr>
+          <w:color w:val="3A3A3A"/>
+          <w:sz w:val="19"/>
+          <w:szCs w:val="19"/>
+        </w:rPr>
+        <w:t xml:space="preserve">  pvalue_cutoff=0.05 \</w:t>
+      </w:r>
+    </w:p>
+    <w:p>
+      <w:pPr>
+        <w:shd w:fill="F3F4F6" w:color="auto" w:val="clear"/>
+        <w:spacing w:after="0"/>
+      </w:pPr>
+      <w:r>
+        <w:rPr>
+          <w:color w:val="3A3A3A"/>
+          <w:sz w:val="19"/>
+          <w:szCs w:val="19"/>
+        </w:rPr>
+        <w:t xml:space="preserve">  qvalue_cutoff=0.2 \</w:t>
+      </w:r>
+    </w:p>
+    <w:p>
+      <w:pPr>
+        <w:shd w:fill="F3F4F6" w:color="auto" w:val="clear"/>
+        <w:spacing w:after="0"/>
+      </w:pPr>
+      <w:r>
+        <w:rPr>
+          <w:color w:val="3A3A3A"/>
+          <w:sz w:val="19"/>
+          <w:szCs w:val="19"/>
+        </w:rPr>
+        <w:t xml:space="preserve">  p_adjust_method=BH \</w:t>
+      </w:r>
+    </w:p>
+    <w:p>
+      <w:pPr>
+        <w:shd w:fill="F3F4F6" w:color="auto" w:val="clear"/>
+        <w:spacing w:after="0"/>
+      </w:pPr>
+      <w:r>
+        <w:rPr>
+          <w:color w:val="3A3A3A"/>
+          <w:sz w:val="19"/>
+          <w:szCs w:val="19"/>
+        </w:rPr>
+        <w:t xml:space="preserve">  min_gs_size=10 \</w:t>
+      </w:r>
+    </w:p>
+    <w:p>
+      <w:pPr>
+        <w:shd w:fill="F3F4F6" w:color="auto" w:val="clear"/>
+        <w:spacing w:after="0"/>
+      </w:pPr>
+      <w:r>
+        <w:rPr>
+          <w:color w:val="3A3A3A"/>
+          <w:sz w:val="19"/>
+          <w:szCs w:val="19"/>
+        </w:rPr>
+        <w:t xml:space="preserve">  max_gs_size=500 \</w:t>
+      </w:r>
+    </w:p>
+    <w:p>
+      <w:pPr>
+        <w:shd w:fill="F3F4F6" w:color="auto" w:val="clear"/>
+        <w:spacing w:after="0"/>
+      </w:pPr>
+      <w:r>
+        <w:rPr>
+          <w:color w:val="3A3A3A"/>
+          <w:sz w:val="19"/>
+          <w:szCs w:val="19"/>
+        </w:rPr>
+        <w:t xml:space="preserve">  min_mapped_fraction=0.5 \</w:t>
+      </w:r>
+    </w:p>
+    <w:p>
+      <w:pPr>
+        <w:shd w:fill="F3F4F6" w:color="auto" w:val="clear"/>
+        <w:spacing w:after="0"/>
+      </w:pPr>
+      <w:r>
+        <w:rPr>
+          <w:color w:val="3A3A3A"/>
+          <w:sz w:val="19"/>
+          <w:szCs w:val="19"/>
+        </w:rPr>
+        <w:t xml:space="preserve">  show_category=20 \</w:t>
+      </w:r>
+    </w:p>
+    <w:p>
+      <w:pPr>
+        <w:shd w:fill="F3F4F6" w:color="auto" w:val="clear"/>
+        <w:spacing w:after="0"/>
+      </w:pPr>
+      <w:r>
+        <w:rPr>
+          <w:color w:val="3A3A3A"/>
+          <w:sz w:val="19"/>
+          <w:szCs w:val="19"/>
+        </w:rPr>
+        <w:t xml:space="preserve">  da_norm=TMM \</w:t>
+      </w:r>
+    </w:p>
+    <w:p>
+      <w:pPr>
+        <w:shd w:fill="F3F4F6" w:color="auto" w:val="clear"/>
+        <w:spacing w:after="0"/>
+      </w:pPr>
+      <w:r>
+        <w:rPr>
+          <w:color w:val="3A3A3A"/>
+          <w:sz w:val="19"/>
+          <w:szCs w:val="19"/>
+        </w:rPr>
+        <w:t xml:space="preserve">  da_fdr=0.05 \</w:t>
+      </w:r>
+    </w:p>
+    <w:p>
+      <w:pPr>
+        <w:shd w:fill="F3F4F6" w:color="auto" w:val="clear"/>
+        <w:spacing w:after="0"/>
+      </w:pPr>
+      <w:r>
+        <w:rPr>
+          <w:color w:val="3A3A3A"/>
+          <w:sz w:val="19"/>
+          <w:szCs w:val="19"/>
+        </w:rPr>
+        <w:t xml:space="preserve">  da_min_abs_logfc=0</w:t>
       </w:r>
     </w:p>
     <w:p/>
@@ -29349,7 +30628,119 @@
           <w:sz w:val="19"/>
           <w:szCs w:val="19"/>
         </w:rPr>
-        <w:t xml:space="preserve">bash replicate_consistency.1.0.sh input_dir=/data/atac_qc sample_data=/data/sample_data.csv genome_size=hs output_dir=/data/replicate_consistency</w:t>
+        <w:t xml:space="preserve">bash replicate_consistency.1.0.sh \</w:t>
+      </w:r>
+    </w:p>
+    <w:p>
+      <w:pPr>
+        <w:shd w:fill="F3F4F6" w:color="auto" w:val="clear"/>
+        <w:spacing w:after="0"/>
+      </w:pPr>
+      <w:r>
+        <w:rPr>
+          <w:color w:val="3A3A3A"/>
+          <w:sz w:val="19"/>
+          <w:szCs w:val="19"/>
+        </w:rPr>
+        <w:t xml:space="preserve">  input_dir=/data/atac_qc \</w:t>
+      </w:r>
+    </w:p>
+    <w:p>
+      <w:pPr>
+        <w:shd w:fill="F3F4F6" w:color="auto" w:val="clear"/>
+        <w:spacing w:after="0"/>
+      </w:pPr>
+      <w:r>
+        <w:rPr>
+          <w:color w:val="3A3A3A"/>
+          <w:sz w:val="19"/>
+          <w:szCs w:val="19"/>
+        </w:rPr>
+        <w:t xml:space="preserve">  sample_data=/data/sample_data.csv \</w:t>
+      </w:r>
+    </w:p>
+    <w:p>
+      <w:pPr>
+        <w:shd w:fill="F3F4F6" w:color="auto" w:val="clear"/>
+        <w:spacing w:after="0"/>
+      </w:pPr>
+      <w:r>
+        <w:rPr>
+          <w:color w:val="3A3A3A"/>
+          <w:sz w:val="19"/>
+          <w:szCs w:val="19"/>
+        </w:rPr>
+        <w:t xml:space="preserve">  genome_size=1.2e8 \</w:t>
+      </w:r>
+    </w:p>
+    <w:p>
+      <w:pPr>
+        <w:shd w:fill="F3F4F6" w:color="auto" w:val="clear"/>
+        <w:spacing w:after="0"/>
+      </w:pPr>
+      <w:r>
+        <w:rPr>
+          <w:color w:val="3A3A3A"/>
+          <w:sz w:val="19"/>
+          <w:szCs w:val="19"/>
+        </w:rPr>
+        <w:t xml:space="preserve">  output_dir=/data/replicate_consistency \</w:t>
+      </w:r>
+    </w:p>
+    <w:p>
+      <w:pPr>
+        <w:shd w:fill="F3F4F6" w:color="auto" w:val="clear"/>
+        <w:spacing w:after="0"/>
+      </w:pPr>
+      <w:r>
+        <w:rPr>
+          <w:color w:val="3A3A3A"/>
+          <w:sz w:val="19"/>
+          <w:szCs w:val="19"/>
+        </w:rPr>
+        <w:t xml:space="preserve">  alignment_suffix=.shifted.bam \</w:t>
+      </w:r>
+    </w:p>
+    <w:p>
+      <w:pPr>
+        <w:shd w:fill="F3F4F6" w:color="auto" w:val="clear"/>
+        <w:spacing w:after="0"/>
+      </w:pPr>
+      <w:r>
+        <w:rPr>
+          <w:color w:val="3A3A3A"/>
+          <w:sz w:val="19"/>
+          <w:szCs w:val="19"/>
+        </w:rPr>
+        <w:t xml:space="preserve">  pvalue=0.01 \</w:t>
+      </w:r>
+    </w:p>
+    <w:p>
+      <w:pPr>
+        <w:shd w:fill="F3F4F6" w:color="auto" w:val="clear"/>
+        <w:spacing w:after="0"/>
+      </w:pPr>
+      <w:r>
+        <w:rPr>
+          <w:color w:val="3A3A3A"/>
+          <w:sz w:val="19"/>
+          <w:szCs w:val="19"/>
+        </w:rPr>
+        <w:t xml:space="preserve">  idr_threshold=0.05 \</w:t>
+      </w:r>
+    </w:p>
+    <w:p>
+      <w:pPr>
+        <w:shd w:fill="F3F4F6" w:color="auto" w:val="clear"/>
+        <w:spacing w:after="0"/>
+      </w:pPr>
+      <w:r>
+        <w:rPr>
+          <w:color w:val="3A3A3A"/>
+          <w:sz w:val="19"/>
+          <w:szCs w:val="19"/>
+        </w:rPr>
+        <w:t xml:space="preserve">  max_peaks=300000</w:t>
       </w:r>
     </w:p>
     <w:p/>

</xml_diff>

<commit_message>
Warn when threads are capped and let the core mode decide
organellar_filter.1.2.sh and tf_footprinting.1.2.sh still cap a thread
count above the allocated cores, now with a warning in the error log;
tf_footprinting also stops on a cores value that is not auto or a
positive integer. The portal content no longer registers threads or
cores (organellar_filter, tf_footprinting, atac_motif): the Processor
Core selection decides, read by the scripts as auto. Script rules record
the policy and what the 2026-10-14 production logs showed about nproc.

Co-Authored-By: Claude Opus 5.5 <noreply@anthropic.com>
</commit_message>
<xml_diff>
--- a/docs/ATAC-seq/modules/Portal_Content.docx
+++ b/docs/ATAC-seq/modules/Portal_Content.docx
@@ -138,6 +138,37 @@
       </w:r>
       <w:r>
         <w:t xml:space="preserve">)를 넣었다. 기본값이 아니며, 실행할 때 캔버스에서 실제 경로로 바꾼다. 예시 경로가 그대로 넘어가면 스크립트가 "not found"로 멈춘다.</w:t>
+      </w:r>
+    </w:p>
+    <w:p>
+      <w:pPr>
+        <w:pStyle w:val="ListParagraph"/>
+        <w:numPr>
+          <w:ilvl w:val="0"/>
+          <w:numId w:val="2"/>
+        </w:numPr>
+        <w:spacing w:after="80"/>
+      </w:pPr>
+      <w:r>
+        <w:t xml:space="preserve">스레드·코어 수 옵션(</w:t>
+      </w:r>
+      <w:r>
+        <w:t xml:space="preserve">threads</w:t>
+      </w:r>
+      <w:r>
+        <w:t xml:space="preserve">, </w:t>
+      </w:r>
+      <w:r>
+        <w:t xml:space="preserve">cores</w:t>
+      </w:r>
+      <w:r>
+        <w:t xml:space="preserve">)은 포탈에 등록하지 않는다. 실행 환경의 Processor Core 선택이 곧 스레드 수이며(스크립트가 </w:t>
+      </w:r>
+      <w:r>
+        <w:t xml:space="preserve">auto</w:t>
+      </w:r>
+      <w:r>
+        <w:t xml:space="preserve">로 할당된 코어 수를 읽는다), 같은 값을 두 번 고르다 엇갈리는 일을 막는다.</w:t>
       </w:r>
     </w:p>
     <w:p>
@@ -2770,7 +2801,7 @@
                 <w:sz w:val="18"/>
                 <w:szCs w:val="18"/>
               </w:rPr>
-              <w:t xml:space="preserve">1.1</w:t>
+              <w:t xml:space="preserve">1.2</w:t>
             </w:r>
           </w:p>
         </w:tc>
@@ -3040,7 +3071,7 @@
                 <w:sz w:val="18"/>
                 <w:szCs w:val="18"/>
               </w:rPr>
-              <w:t xml:space="preserve">organellar_filter.1.1.sh</w:t>
+              <w:t xml:space="preserve">organellar_filter.1.2.sh</w:t>
             </w:r>
           </w:p>
         </w:tc>
@@ -3750,148 +3781,6 @@
                 <w:sz w:val="18"/>
                 <w:szCs w:val="18"/>
               </w:rPr>
-              <w:t xml:space="preserve">threads</w:t>
-            </w:r>
-          </w:p>
-        </w:tc>
-        <w:tc>
-          <w:tcPr>
-            <w:tcW w:type="dxa" w:w="1000"/>
-            <w:tcMar>
-              <w:top w:type="dxa" w:w="60"/>
-              <w:left w:type="dxa" w:w="90"/>
-              <w:bottom w:type="dxa" w:w="60"/>
-              <w:right w:type="dxa" w:w="90"/>
-            </w:tcMar>
-          </w:tcPr>
-          <w:p>
-            <w:r>
-              <w:rPr>
-                <w:sz w:val="18"/>
-                <w:szCs w:val="18"/>
-              </w:rPr>
-              <w:t xml:space="preserve">auto</w:t>
-            </w:r>
-          </w:p>
-        </w:tc>
-        <w:tc>
-          <w:tcPr>
-            <w:tcW w:type="dxa" w:w="2140"/>
-            <w:tcMar>
-              <w:top w:type="dxa" w:w="60"/>
-              <w:left w:type="dxa" w:w="90"/>
-              <w:bottom w:type="dxa" w:w="60"/>
-              <w:right w:type="dxa" w:w="90"/>
-            </w:tcMar>
-          </w:tcPr>
-          <w:p>
-            <w:r>
-              <w:rPr>
-                <w:sz w:val="18"/>
-                <w:szCs w:val="18"/>
-              </w:rPr>
-              <w:t xml:space="preserve">스레드 수. auto는 할당된 코어 수</w:t>
-            </w:r>
-          </w:p>
-        </w:tc>
-        <w:tc>
-          <w:tcPr>
-            <w:tcW w:type="dxa" w:w="2146"/>
-            <w:tcMar>
-              <w:top w:type="dxa" w:w="60"/>
-              <w:left w:type="dxa" w:w="90"/>
-              <w:bottom w:type="dxa" w:w="60"/>
-              <w:right w:type="dxa" w:w="90"/>
-            </w:tcMar>
-          </w:tcPr>
-          <w:p>
-            <w:r>
-              <w:rPr>
-                <w:sz w:val="18"/>
-                <w:szCs w:val="18"/>
-              </w:rPr>
-              <w:t xml:space="preserve">Threads; auto uses the allocated cores</w:t>
-            </w:r>
-          </w:p>
-        </w:tc>
-      </w:tr>
-      <w:tr>
-        <w:tc>
-          <w:tcPr>
-            <w:tcW w:type="dxa" w:w="920"/>
-            <w:tcMar>
-              <w:top w:type="dxa" w:w="60"/>
-              <w:left w:type="dxa" w:w="90"/>
-              <w:bottom w:type="dxa" w:w="60"/>
-              <w:right w:type="dxa" w:w="90"/>
-            </w:tcMar>
-          </w:tcPr>
-          <w:p>
-            <w:r>
-              <w:rPr>
-                <w:sz w:val="18"/>
-                <w:szCs w:val="18"/>
-              </w:rPr>
-              <w:t xml:space="preserve">Option</w:t>
-            </w:r>
-          </w:p>
-        </w:tc>
-        <w:tc>
-          <w:tcPr>
-            <w:tcW w:type="dxa" w:w="950"/>
-            <w:tcMar>
-              <w:top w:type="dxa" w:w="60"/>
-              <w:left w:type="dxa" w:w="90"/>
-              <w:bottom w:type="dxa" w:w="60"/>
-              <w:right w:type="dxa" w:w="90"/>
-            </w:tcMar>
-          </w:tcPr>
-          <w:p>
-            <w:r>
-              <w:rPr>
-                <w:sz w:val="18"/>
-                <w:szCs w:val="18"/>
-              </w:rPr>
-              <w:t xml:space="preserve">Optional</w:t>
-            </w:r>
-          </w:p>
-        </w:tc>
-        <w:tc>
-          <w:tcPr>
-            <w:tcW w:type="dxa" w:w="950"/>
-            <w:tcMar>
-              <w:top w:type="dxa" w:w="60"/>
-              <w:left w:type="dxa" w:w="90"/>
-              <w:bottom w:type="dxa" w:w="60"/>
-              <w:right w:type="dxa" w:w="90"/>
-            </w:tcMar>
-          </w:tcPr>
-          <w:p>
-            <w:r>
-              <w:rPr>
-                <w:sz w:val="18"/>
-                <w:szCs w:val="18"/>
-              </w:rPr>
-              <w:t xml:space="preserve">String</w:t>
-            </w:r>
-          </w:p>
-        </w:tc>
-        <w:tc>
-          <w:tcPr>
-            <w:tcW w:type="dxa" w:w="1400"/>
-            <w:tcMar>
-              <w:top w:type="dxa" w:w="60"/>
-              <w:left w:type="dxa" w:w="90"/>
-              <w:bottom w:type="dxa" w:w="60"/>
-              <w:right w:type="dxa" w:w="90"/>
-            </w:tcMar>
-          </w:tcPr>
-          <w:p>
-            <w:r>
-              <w:rPr>
-                <w:sz w:val="18"/>
-                <w:szCs w:val="18"/>
-              </w:rPr>
               <w:t xml:space="preserve">organellar_pattern</w:t>
             </w:r>
           </w:p>
@@ -3959,6 +3848,26 @@
       </w:tr>
     </w:tbl>
     <w:p/>
+    <w:p>
+      <w:pPr>
+        <w:spacing w:after="140"/>
+      </w:pPr>
+      <w:r>
+        <w:t xml:space="preserve">스레드 수(</w:t>
+      </w:r>
+      <w:r>
+        <w:t xml:space="preserve">threads</w:t>
+      </w:r>
+      <w:r>
+        <w:t xml:space="preserve">)는 포탈에 등록하지 않는다. 실행 환경의 Processor Core 선택(싱글 코어 또는 최대 4코어)으로 정해지며, 스크립트 기본값 </w:t>
+      </w:r>
+      <w:r>
+        <w:t xml:space="preserve">auto</w:t>
+      </w:r>
+      <w:r>
+        <w:t xml:space="preserve">가 그 코어 수를 쓴다.</w:t>
+      </w:r>
+    </w:p>
     <w:p>
       <w:pPr>
         <w:spacing w:after="100" w:before="200"/>
@@ -4303,7 +4212,7 @@
           <w:sz w:val="19"/>
           <w:szCs w:val="19"/>
         </w:rPr>
-        <w:t xml:space="preserve">bash organellar_filter.1.1.sh \</w:t>
+        <w:t xml:space="preserve">bash organellar_filter.1.2.sh \</w:t>
       </w:r>
     </w:p>
     <w:p>
@@ -4332,20 +4241,6 @@
           <w:szCs w:val="19"/>
         </w:rPr>
         <w:t xml:space="preserve">  output_dir=/data/organellar_filter \</w:t>
-      </w:r>
-    </w:p>
-    <w:p>
-      <w:pPr>
-        <w:shd w:fill="F3F4F6" w:color="auto" w:val="clear"/>
-        <w:spacing w:after="0"/>
-      </w:pPr>
-      <w:r>
-        <w:rPr>
-          <w:color w:val="3A3A3A"/>
-          <w:sz w:val="19"/>
-          <w:szCs w:val="19"/>
-        </w:rPr>
-        <w:t xml:space="preserve">  threads=auto \</w:t>
       </w:r>
     </w:p>
     <w:p>
@@ -21459,148 +21354,6 @@
                 <w:sz w:val="18"/>
                 <w:szCs w:val="18"/>
               </w:rPr>
-              <w:t xml:space="preserve">String</w:t>
-            </w:r>
-          </w:p>
-        </w:tc>
-        <w:tc>
-          <w:tcPr>
-            <w:tcW w:type="dxa" w:w="1400"/>
-            <w:tcMar>
-              <w:top w:type="dxa" w:w="60"/>
-              <w:left w:type="dxa" w:w="90"/>
-              <w:bottom w:type="dxa" w:w="60"/>
-              <w:right w:type="dxa" w:w="90"/>
-            </w:tcMar>
-          </w:tcPr>
-          <w:p>
-            <w:r>
-              <w:rPr>
-                <w:sz w:val="18"/>
-                <w:szCs w:val="18"/>
-              </w:rPr>
-              <w:t xml:space="preserve">threads</w:t>
-            </w:r>
-          </w:p>
-        </w:tc>
-        <w:tc>
-          <w:tcPr>
-            <w:tcW w:type="dxa" w:w="1000"/>
-            <w:tcMar>
-              <w:top w:type="dxa" w:w="60"/>
-              <w:left w:type="dxa" w:w="90"/>
-              <w:bottom w:type="dxa" w:w="60"/>
-              <w:right w:type="dxa" w:w="90"/>
-            </w:tcMar>
-          </w:tcPr>
-          <w:p>
-            <w:r>
-              <w:rPr>
-                <w:sz w:val="18"/>
-                <w:szCs w:val="18"/>
-              </w:rPr>
-              <w:t xml:space="preserve">auto</w:t>
-            </w:r>
-          </w:p>
-        </w:tc>
-        <w:tc>
-          <w:tcPr>
-            <w:tcW w:type="dxa" w:w="2140"/>
-            <w:tcMar>
-              <w:top w:type="dxa" w:w="60"/>
-              <w:left w:type="dxa" w:w="90"/>
-              <w:bottom w:type="dxa" w:w="60"/>
-              <w:right w:type="dxa" w:w="90"/>
-            </w:tcMar>
-          </w:tcPr>
-          <w:p>
-            <w:r>
-              <w:rPr>
-                <w:sz w:val="18"/>
-                <w:szCs w:val="18"/>
-              </w:rPr>
-              <w:t xml:space="preserve">스레드 수. auto는 할당된 코어 수</w:t>
-            </w:r>
-          </w:p>
-        </w:tc>
-        <w:tc>
-          <w:tcPr>
-            <w:tcW w:type="dxa" w:w="2146"/>
-            <w:tcMar>
-              <w:top w:type="dxa" w:w="60"/>
-              <w:left w:type="dxa" w:w="90"/>
-              <w:bottom w:type="dxa" w:w="60"/>
-              <w:right w:type="dxa" w:w="90"/>
-            </w:tcMar>
-          </w:tcPr>
-          <w:p>
-            <w:r>
-              <w:rPr>
-                <w:sz w:val="18"/>
-                <w:szCs w:val="18"/>
-              </w:rPr>
-              <w:t xml:space="preserve">Threads; auto uses the allocated cores</w:t>
-            </w:r>
-          </w:p>
-        </w:tc>
-      </w:tr>
-      <w:tr>
-        <w:tc>
-          <w:tcPr>
-            <w:tcW w:type="dxa" w:w="920"/>
-            <w:tcMar>
-              <w:top w:type="dxa" w:w="60"/>
-              <w:left w:type="dxa" w:w="90"/>
-              <w:bottom w:type="dxa" w:w="60"/>
-              <w:right w:type="dxa" w:w="90"/>
-            </w:tcMar>
-          </w:tcPr>
-          <w:p>
-            <w:r>
-              <w:rPr>
-                <w:sz w:val="18"/>
-                <w:szCs w:val="18"/>
-              </w:rPr>
-              <w:t xml:space="preserve">Option</w:t>
-            </w:r>
-          </w:p>
-        </w:tc>
-        <w:tc>
-          <w:tcPr>
-            <w:tcW w:type="dxa" w:w="950"/>
-            <w:tcMar>
-              <w:top w:type="dxa" w:w="60"/>
-              <w:left w:type="dxa" w:w="90"/>
-              <w:bottom w:type="dxa" w:w="60"/>
-              <w:right w:type="dxa" w:w="90"/>
-            </w:tcMar>
-          </w:tcPr>
-          <w:p>
-            <w:r>
-              <w:rPr>
-                <w:sz w:val="18"/>
-                <w:szCs w:val="18"/>
-              </w:rPr>
-              <w:t xml:space="preserve">Optional</w:t>
-            </w:r>
-          </w:p>
-        </w:tc>
-        <w:tc>
-          <w:tcPr>
-            <w:tcW w:type="dxa" w:w="950"/>
-            <w:tcMar>
-              <w:top w:type="dxa" w:w="60"/>
-              <w:left w:type="dxa" w:w="90"/>
-              <w:bottom w:type="dxa" w:w="60"/>
-              <w:right w:type="dxa" w:w="90"/>
-            </w:tcMar>
-          </w:tcPr>
-          <w:p>
-            <w:r>
-              <w:rPr>
-                <w:sz w:val="18"/>
-                <w:szCs w:val="18"/>
-              </w:rPr>
               <w:t xml:space="preserve">List</w:t>
             </w:r>
           </w:p>
@@ -21830,6 +21583,26 @@
       </w:tr>
     </w:tbl>
     <w:p/>
+    <w:p>
+      <w:pPr>
+        <w:spacing w:after="140"/>
+      </w:pPr>
+      <w:r>
+        <w:t xml:space="preserve">스레드 수(</w:t>
+      </w:r>
+      <w:r>
+        <w:t xml:space="preserve">threads</w:t>
+      </w:r>
+      <w:r>
+        <w:t xml:space="preserve">)는 포탈에 등록하지 않는다. 실행 환경의 Processor Core 선택(싱글 코어 또는 최대 4코어)으로 정해지며, 스크립트 기본값 </w:t>
+      </w:r>
+      <w:r>
+        <w:t xml:space="preserve">auto</w:t>
+      </w:r>
+      <w:r>
+        <w:t xml:space="preserve">가 그 코어 수를 쓴다.</w:t>
+      </w:r>
+    </w:p>
     <w:p>
       <w:pPr>
         <w:spacing w:after="100" w:before="200"/>
@@ -22398,20 +22171,6 @@
           <w:sz w:val="19"/>
           <w:szCs w:val="19"/>
         </w:rPr>
-        <w:t xml:space="preserve">  threads=auto \</w:t>
-      </w:r>
-    </w:p>
-    <w:p>
-      <w:pPr>
-        <w:shd w:fill="F3F4F6" w:color="auto" w:val="clear"/>
-        <w:spacing w:after="0"/>
-      </w:pPr>
-      <w:r>
-        <w:rPr>
-          <w:color w:val="3A3A3A"/>
-          <w:sz w:val="19"/>
-          <w:szCs w:val="19"/>
-        </w:rPr>
         <w:t xml:space="preserve">  run_kmer=TRUE \</w:t>
       </w:r>
     </w:p>
@@ -22816,7 +22575,7 @@
                 <w:sz w:val="18"/>
                 <w:szCs w:val="18"/>
               </w:rPr>
-              <w:t xml:space="preserve">1.1</w:t>
+              <w:t xml:space="preserve">1.2</w:t>
             </w:r>
           </w:p>
         </w:tc>
@@ -23086,7 +22845,7 @@
                 <w:sz w:val="18"/>
                 <w:szCs w:val="18"/>
               </w:rPr>
-              <w:t xml:space="preserve">tf_footprinting.1.1.sh</w:t>
+              <w:t xml:space="preserve">tf_footprinting.1.2.sh</w:t>
             </w:r>
           </w:p>
         </w:tc>
@@ -24697,150 +24456,28 @@
           </w:p>
         </w:tc>
       </w:tr>
-      <w:tr>
-        <w:tc>
-          <w:tcPr>
-            <w:tcW w:type="dxa" w:w="920"/>
-            <w:tcMar>
-              <w:top w:type="dxa" w:w="60"/>
-              <w:left w:type="dxa" w:w="90"/>
-              <w:bottom w:type="dxa" w:w="60"/>
-              <w:right w:type="dxa" w:w="90"/>
-            </w:tcMar>
-          </w:tcPr>
-          <w:p>
-            <w:r>
-              <w:rPr>
-                <w:sz w:val="18"/>
-                <w:szCs w:val="18"/>
-              </w:rPr>
-              <w:t xml:space="preserve">Option</w:t>
-            </w:r>
-          </w:p>
-        </w:tc>
-        <w:tc>
-          <w:tcPr>
-            <w:tcW w:type="dxa" w:w="950"/>
-            <w:tcMar>
-              <w:top w:type="dxa" w:w="60"/>
-              <w:left w:type="dxa" w:w="90"/>
-              <w:bottom w:type="dxa" w:w="60"/>
-              <w:right w:type="dxa" w:w="90"/>
-            </w:tcMar>
-          </w:tcPr>
-          <w:p>
-            <w:r>
-              <w:rPr>
-                <w:sz w:val="18"/>
-                <w:szCs w:val="18"/>
-              </w:rPr>
-              <w:t xml:space="preserve">Optional</w:t>
-            </w:r>
-          </w:p>
-        </w:tc>
-        <w:tc>
-          <w:tcPr>
-            <w:tcW w:type="dxa" w:w="950"/>
-            <w:tcMar>
-              <w:top w:type="dxa" w:w="60"/>
-              <w:left w:type="dxa" w:w="90"/>
-              <w:bottom w:type="dxa" w:w="60"/>
-              <w:right w:type="dxa" w:w="90"/>
-            </w:tcMar>
-          </w:tcPr>
-          <w:p>
-            <w:r>
-              <w:rPr>
-                <w:sz w:val="18"/>
-                <w:szCs w:val="18"/>
-              </w:rPr>
-              <w:t xml:space="preserve">String</w:t>
-            </w:r>
-          </w:p>
-        </w:tc>
-        <w:tc>
-          <w:tcPr>
-            <w:tcW w:type="dxa" w:w="1400"/>
-            <w:tcMar>
-              <w:top w:type="dxa" w:w="60"/>
-              <w:left w:type="dxa" w:w="90"/>
-              <w:bottom w:type="dxa" w:w="60"/>
-              <w:right w:type="dxa" w:w="90"/>
-            </w:tcMar>
-          </w:tcPr>
-          <w:p>
-            <w:r>
-              <w:rPr>
-                <w:sz w:val="18"/>
-                <w:szCs w:val="18"/>
-              </w:rPr>
-              <w:t xml:space="preserve">cores</w:t>
-            </w:r>
-          </w:p>
-        </w:tc>
-        <w:tc>
-          <w:tcPr>
-            <w:tcW w:type="dxa" w:w="1000"/>
-            <w:tcMar>
-              <w:top w:type="dxa" w:w="60"/>
-              <w:left w:type="dxa" w:w="90"/>
-              <w:bottom w:type="dxa" w:w="60"/>
-              <w:right w:type="dxa" w:w="90"/>
-            </w:tcMar>
-          </w:tcPr>
-          <w:p>
-            <w:r>
-              <w:rPr>
-                <w:sz w:val="18"/>
-                <w:szCs w:val="18"/>
-              </w:rPr>
-              <w:t xml:space="preserve">auto</w:t>
-            </w:r>
-          </w:p>
-        </w:tc>
-        <w:tc>
-          <w:tcPr>
-            <w:tcW w:type="dxa" w:w="2140"/>
-            <w:tcMar>
-              <w:top w:type="dxa" w:w="60"/>
-              <w:left w:type="dxa" w:w="90"/>
-              <w:bottom w:type="dxa" w:w="60"/>
-              <w:right w:type="dxa" w:w="90"/>
-            </w:tcMar>
-          </w:tcPr>
-          <w:p>
-            <w:r>
-              <w:rPr>
-                <w:sz w:val="18"/>
-                <w:szCs w:val="18"/>
-              </w:rPr>
-              <w:t xml:space="preserve">코어 수. auto는 할당된 코어 수</w:t>
-            </w:r>
-          </w:p>
-        </w:tc>
-        <w:tc>
-          <w:tcPr>
-            <w:tcW w:type="dxa" w:w="2146"/>
-            <w:tcMar>
-              <w:top w:type="dxa" w:w="60"/>
-              <w:left w:type="dxa" w:w="90"/>
-              <w:bottom w:type="dxa" w:w="60"/>
-              <w:right w:type="dxa" w:w="90"/>
-            </w:tcMar>
-          </w:tcPr>
-          <w:p>
-            <w:r>
-              <w:rPr>
-                <w:sz w:val="18"/>
-                <w:szCs w:val="18"/>
-              </w:rPr>
-              <w:t xml:space="preserve">Cores; auto uses the allocated cores</w:t>
-            </w:r>
-          </w:p>
-        </w:tc>
-      </w:tr>
     </w:tbl>
     <w:p/>
+    <w:p>
+      <w:pPr>
+        <w:spacing w:after="140"/>
+      </w:pPr>
+      <w:r>
+        <w:t xml:space="preserve">코어 수(</w:t>
+      </w:r>
+      <w:r>
+        <w:t xml:space="preserve">cores</w:t>
+      </w:r>
+      <w:r>
+        <w:t xml:space="preserve">)는 포탈에 등록하지 않는다. 실행 환경의 Processor Core 선택(싱글 코어 또는 최대 4코어)으로 정해지며, 스크립트 기본값 </w:t>
+      </w:r>
+      <w:r>
+        <w:t xml:space="preserve">auto</w:t>
+      </w:r>
+      <w:r>
+        <w:t xml:space="preserve">가 그 코어 수를 쓴다.</w:t>
+      </w:r>
+    </w:p>
     <w:p>
       <w:pPr>
         <w:spacing w:after="100" w:before="200"/>
@@ -25359,7 +24996,7 @@
           <w:sz w:val="19"/>
           <w:szCs w:val="19"/>
         </w:rPr>
-        <w:t xml:space="preserve">bash tf_footprinting.1.1.sh \</w:t>
+        <w:t xml:space="preserve">bash tf_footprinting.1.2.sh \</w:t>
       </w:r>
     </w:p>
     <w:p>
@@ -25471,21 +25108,7 @@
           <w:sz w:val="19"/>
           <w:szCs w:val="19"/>
         </w:rPr>
-        <w:t xml:space="preserve">  condition_col=Condition \</w:t>
-      </w:r>
-    </w:p>
-    <w:p>
-      <w:pPr>
-        <w:shd w:fill="F3F4F6" w:color="auto" w:val="clear"/>
-        <w:spacing w:after="0"/>
-      </w:pPr>
-      <w:r>
-        <w:rPr>
-          <w:color w:val="3A3A3A"/>
-          <w:sz w:val="19"/>
-          <w:szCs w:val="19"/>
-        </w:rPr>
-        <w:t xml:space="preserve">  cores=auto</w:t>
+        <w:t xml:space="preserve">  condition_col=Condition</w:t>
       </w:r>
     </w:p>
     <w:p/>

</xml_diff>

<commit_message>
Read allocated cores with nproc in every module
- bowtie2.1.2.sh: -p and samtools sort -@ follow nproc instead of 4
- GATK_MarkDuplicates.1.1.sh: tools from /opt/bio/bin, Java heap from
  the memory limit instead of -Xmx20g, samtools index -@ from nproc
- MACS3_callpeak_ATAC.1.3.sh, replicate_consistency.1.1.sh: samtools
  index and view -c get -@ from nproc
- atac_motif.1.2.R: nproc first (mcaffinity fallback), warning on cap
All take an internal threads argument (default auto) that is not
registered on the portal, cap larger values with a warning, and stop on
invalid ones. MACS3 1.3 and replicate_consistency 1.1 were run in
Codespace images and gave the same peaks, FRiP and IDR results as 1.2
and 1.0. The portal content lists a recommended Processor Core per
module; the script rules and the core check script are updated.

Co-Authored-By: Claude Opus 5.5 <noreply@anthropic.com>
</commit_message>
<xml_diff>
--- a/docs/ATAC-seq/modules/Portal_Content.docx
+++ b/docs/ATAC-seq/modules/Portal_Content.docx
@@ -645,7 +645,7 @@
                 <w:sz w:val="18"/>
                 <w:szCs w:val="18"/>
               </w:rPr>
-              <w:t xml:space="preserve">1.1</w:t>
+              <w:t xml:space="preserve">1.2</w:t>
             </w:r>
           </w:p>
         </w:tc>
@@ -915,7 +915,7 @@
                 <w:sz w:val="18"/>
                 <w:szCs w:val="18"/>
               </w:rPr>
-              <w:t xml:space="preserve">bowtie2.1.1.sh</w:t>
+              <w:t xml:space="preserve">bowtie2.1.2.sh</w:t>
             </w:r>
           </w:p>
         </w:tc>
@@ -930,6 +930,68 @@
             </w:tcMar>
           </w:tcPr>
           <w:p/>
+        </w:tc>
+      </w:tr>
+      <w:tr>
+        <w:tc>
+          <w:tcPr>
+            <w:tcW w:type="dxa" w:w="1800"/>
+            <w:tcMar>
+              <w:top w:type="dxa" w:w="60"/>
+              <w:left w:type="dxa" w:w="90"/>
+              <w:bottom w:type="dxa" w:w="60"/>
+              <w:right w:type="dxa" w:w="90"/>
+            </w:tcMar>
+          </w:tcPr>
+          <w:p>
+            <w:r>
+              <w:rPr>
+                <w:sz w:val="18"/>
+                <w:szCs w:val="18"/>
+              </w:rPr>
+              <w:t xml:space="preserve">Processor Core (제안)</w:t>
+            </w:r>
+          </w:p>
+        </w:tc>
+        <w:tc>
+          <w:tcPr>
+            <w:tcW w:type="dxa" w:w="3853"/>
+            <w:tcMar>
+              <w:top w:type="dxa" w:w="60"/>
+              <w:left w:type="dxa" w:w="90"/>
+              <w:bottom w:type="dxa" w:w="60"/>
+              <w:right w:type="dxa" w:w="90"/>
+            </w:tcMar>
+          </w:tcPr>
+          <w:p>
+            <w:r>
+              <w:rPr>
+                <w:sz w:val="18"/>
+                <w:szCs w:val="18"/>
+              </w:rPr>
+              <w:t xml:space="preserve">최대 4코어 (bowtie2, samtools sort가 여러 코어 사용)</w:t>
+            </w:r>
+          </w:p>
+        </w:tc>
+        <w:tc>
+          <w:tcPr>
+            <w:tcW w:type="dxa" w:w="3853"/>
+            <w:tcMar>
+              <w:top w:type="dxa" w:w="60"/>
+              <w:left w:type="dxa" w:w="90"/>
+              <w:bottom w:type="dxa" w:w="60"/>
+              <w:right w:type="dxa" w:w="90"/>
+            </w:tcMar>
+          </w:tcPr>
+          <w:p>
+            <w:r>
+              <w:rPr>
+                <w:sz w:val="18"/>
+                <w:szCs w:val="18"/>
+              </w:rPr>
+              <w:t xml:space="preserve">Up to 4 cores (bowtie2 and samtools sort are multi-threaded)</w:t>
+            </w:r>
+          </w:p>
         </w:tc>
       </w:tr>
     </w:tbl>
@@ -2126,7 +2188,7 @@
                 <w:sz w:val="18"/>
                 <w:szCs w:val="18"/>
               </w:rPr>
-              <w:t xml:space="preserve">스레드 수는 4로 고정되어 있습니다.</w:t>
+              <w:t xml:space="preserve">스레드 수는 실행 환경의 Processor Core 선택(싱글 코어 또는 최대 4코어)을 따릅니다. 최대 4코어를 고르면 정렬이 빨라집니다.</w:t>
             </w:r>
           </w:p>
         </w:tc>
@@ -2146,7 +2208,7 @@
                 <w:sz w:val="18"/>
                 <w:szCs w:val="18"/>
               </w:rPr>
-              <w:t xml:space="preserve">The thread count is fixed at 4.</w:t>
+              <w:t xml:space="preserve">The thread count follows the Processor Core selection (single core or up to 4 cores); choosing up to 4 cores speeds up alignment.</w:t>
             </w:r>
           </w:p>
         </w:tc>
@@ -2372,7 +2434,7 @@
           <w:sz w:val="19"/>
           <w:szCs w:val="19"/>
         </w:rPr>
-        <w:t xml:space="preserve">bash bowtie2.1.1.sh \</w:t>
+        <w:t xml:space="preserve">bash bowtie2.1.2.sh \</w:t>
       </w:r>
     </w:p>
     <w:p>
@@ -3086,6 +3148,68 @@
             </w:tcMar>
           </w:tcPr>
           <w:p/>
+        </w:tc>
+      </w:tr>
+      <w:tr>
+        <w:tc>
+          <w:tcPr>
+            <w:tcW w:type="dxa" w:w="1800"/>
+            <w:tcMar>
+              <w:top w:type="dxa" w:w="60"/>
+              <w:left w:type="dxa" w:w="90"/>
+              <w:bottom w:type="dxa" w:w="60"/>
+              <w:right w:type="dxa" w:w="90"/>
+            </w:tcMar>
+          </w:tcPr>
+          <w:p>
+            <w:r>
+              <w:rPr>
+                <w:sz w:val="18"/>
+                <w:szCs w:val="18"/>
+              </w:rPr>
+              <w:t xml:space="preserve">Processor Core (제안)</w:t>
+            </w:r>
+          </w:p>
+        </w:tc>
+        <w:tc>
+          <w:tcPr>
+            <w:tcW w:type="dxa" w:w="3853"/>
+            <w:tcMar>
+              <w:top w:type="dxa" w:w="60"/>
+              <w:left w:type="dxa" w:w="90"/>
+              <w:bottom w:type="dxa" w:w="60"/>
+              <w:right w:type="dxa" w:w="90"/>
+            </w:tcMar>
+          </w:tcPr>
+          <w:p>
+            <w:r>
+              <w:rPr>
+                <w:sz w:val="18"/>
+                <w:szCs w:val="18"/>
+              </w:rPr>
+              <w:t xml:space="preserve">최대 4코어 (samtools가 여러 코어 사용)</w:t>
+            </w:r>
+          </w:p>
+        </w:tc>
+        <w:tc>
+          <w:tcPr>
+            <w:tcW w:type="dxa" w:w="3853"/>
+            <w:tcMar>
+              <w:top w:type="dxa" w:w="60"/>
+              <w:left w:type="dxa" w:w="90"/>
+              <w:bottom w:type="dxa" w:w="60"/>
+              <w:right w:type="dxa" w:w="90"/>
+            </w:tcMar>
+          </w:tcPr>
+          <w:p>
+            <w:r>
+              <w:rPr>
+                <w:sz w:val="18"/>
+                <w:szCs w:val="18"/>
+              </w:rPr>
+              <w:t xml:space="preserve">Up to 4 cores (samtools is multi-threaded)</w:t>
+            </w:r>
+          </w:p>
         </w:tc>
       </w:tr>
     </w:tbl>
@@ -4914,6 +5038,68 @@
           <w:p/>
         </w:tc>
       </w:tr>
+      <w:tr>
+        <w:tc>
+          <w:tcPr>
+            <w:tcW w:type="dxa" w:w="1800"/>
+            <w:tcMar>
+              <w:top w:type="dxa" w:w="60"/>
+              <w:left w:type="dxa" w:w="90"/>
+              <w:bottom w:type="dxa" w:w="60"/>
+              <w:right w:type="dxa" w:w="90"/>
+            </w:tcMar>
+          </w:tcPr>
+          <w:p>
+            <w:r>
+              <w:rPr>
+                <w:sz w:val="18"/>
+                <w:szCs w:val="18"/>
+              </w:rPr>
+              <w:t xml:space="preserve">Processor Core (제안)</w:t>
+            </w:r>
+          </w:p>
+        </w:tc>
+        <w:tc>
+          <w:tcPr>
+            <w:tcW w:type="dxa" w:w="3853"/>
+            <w:tcMar>
+              <w:top w:type="dxa" w:w="60"/>
+              <w:left w:type="dxa" w:w="90"/>
+              <w:bottom w:type="dxa" w:w="60"/>
+              <w:right w:type="dxa" w:w="90"/>
+            </w:tcMar>
+          </w:tcPr>
+          <w:p>
+            <w:r>
+              <w:rPr>
+                <w:sz w:val="18"/>
+                <w:szCs w:val="18"/>
+              </w:rPr>
+              <w:t xml:space="preserve">싱글 코어 (ATACseqQC는 1코어로 계산)</w:t>
+            </w:r>
+          </w:p>
+        </w:tc>
+        <w:tc>
+          <w:tcPr>
+            <w:tcW w:type="dxa" w:w="3853"/>
+            <w:tcMar>
+              <w:top w:type="dxa" w:w="60"/>
+              <w:left w:type="dxa" w:w="90"/>
+              <w:bottom w:type="dxa" w:w="60"/>
+              <w:right w:type="dxa" w:w="90"/>
+            </w:tcMar>
+          </w:tcPr>
+          <w:p>
+            <w:r>
+              <w:rPr>
+                <w:sz w:val="18"/>
+                <w:szCs w:val="18"/>
+              </w:rPr>
+              <w:t xml:space="preserve">Single core (ATACseqQC runs on one core)</w:t>
+            </w:r>
+          </w:p>
+        </w:tc>
+      </w:tr>
     </w:tbl>
     <w:p/>
     <w:p>
@@ -7842,6 +8028,68 @@
           <w:p/>
         </w:tc>
       </w:tr>
+      <w:tr>
+        <w:tc>
+          <w:tcPr>
+            <w:tcW w:type="dxa" w:w="1800"/>
+            <w:tcMar>
+              <w:top w:type="dxa" w:w="60"/>
+              <w:left w:type="dxa" w:w="90"/>
+              <w:bottom w:type="dxa" w:w="60"/>
+              <w:right w:type="dxa" w:w="90"/>
+            </w:tcMar>
+          </w:tcPr>
+          <w:p>
+            <w:r>
+              <w:rPr>
+                <w:sz w:val="18"/>
+                <w:szCs w:val="18"/>
+              </w:rPr>
+              <w:t xml:space="preserve">Processor Core (제안)</w:t>
+            </w:r>
+          </w:p>
+        </w:tc>
+        <w:tc>
+          <w:tcPr>
+            <w:tcW w:type="dxa" w:w="3853"/>
+            <w:tcMar>
+              <w:top w:type="dxa" w:w="60"/>
+              <w:left w:type="dxa" w:w="90"/>
+              <w:bottom w:type="dxa" w:w="60"/>
+              <w:right w:type="dxa" w:w="90"/>
+            </w:tcMar>
+          </w:tcPr>
+          <w:p>
+            <w:r>
+              <w:rPr>
+                <w:sz w:val="18"/>
+                <w:szCs w:val="18"/>
+              </w:rPr>
+              <w:t xml:space="preserve">싱글 코어</w:t>
+            </w:r>
+          </w:p>
+        </w:tc>
+        <w:tc>
+          <w:tcPr>
+            <w:tcW w:type="dxa" w:w="3853"/>
+            <w:tcMar>
+              <w:top w:type="dxa" w:w="60"/>
+              <w:left w:type="dxa" w:w="90"/>
+              <w:bottom w:type="dxa" w:w="60"/>
+              <w:right w:type="dxa" w:w="90"/>
+            </w:tcMar>
+          </w:tcPr>
+          <w:p>
+            <w:r>
+              <w:rPr>
+                <w:sz w:val="18"/>
+                <w:szCs w:val="18"/>
+              </w:rPr>
+              <w:t xml:space="preserve">Single core</w:t>
+            </w:r>
+          </w:p>
+        </w:tc>
+      </w:tr>
     </w:tbl>
     <w:p/>
     <w:p>
@@ -10083,7 +10331,7 @@
                 <w:sz w:val="18"/>
                 <w:szCs w:val="18"/>
               </w:rPr>
-              <w:t xml:space="preserve">1.2</w:t>
+              <w:t xml:space="preserve">1.3</w:t>
             </w:r>
           </w:p>
         </w:tc>
@@ -10353,7 +10601,7 @@
                 <w:sz w:val="18"/>
                 <w:szCs w:val="18"/>
               </w:rPr>
-              <w:t xml:space="preserve">MACS3_callpeak_ATAC.1.2.sh</w:t>
+              <w:t xml:space="preserve">MACS3_callpeak_ATAC.1.3.sh</w:t>
             </w:r>
           </w:p>
         </w:tc>
@@ -10368,6 +10616,68 @@
             </w:tcMar>
           </w:tcPr>
           <w:p/>
+        </w:tc>
+      </w:tr>
+      <w:tr>
+        <w:tc>
+          <w:tcPr>
+            <w:tcW w:type="dxa" w:w="1800"/>
+            <w:tcMar>
+              <w:top w:type="dxa" w:w="60"/>
+              <w:left w:type="dxa" w:w="90"/>
+              <w:bottom w:type="dxa" w:w="60"/>
+              <w:right w:type="dxa" w:w="90"/>
+            </w:tcMar>
+          </w:tcPr>
+          <w:p>
+            <w:r>
+              <w:rPr>
+                <w:sz w:val="18"/>
+                <w:szCs w:val="18"/>
+              </w:rPr>
+              <w:t xml:space="preserve">Processor Core (제안)</w:t>
+            </w:r>
+          </w:p>
+        </w:tc>
+        <w:tc>
+          <w:tcPr>
+            <w:tcW w:type="dxa" w:w="3853"/>
+            <w:tcMar>
+              <w:top w:type="dxa" w:w="60"/>
+              <w:left w:type="dxa" w:w="90"/>
+              <w:bottom w:type="dxa" w:w="60"/>
+              <w:right w:type="dxa" w:w="90"/>
+            </w:tcMar>
+          </w:tcPr>
+          <w:p>
+            <w:r>
+              <w:rPr>
+                <w:sz w:val="18"/>
+                <w:szCs w:val="18"/>
+              </w:rPr>
+              <w:t xml:space="preserve">싱글 코어 (MACS3는 1코어로 계산)</w:t>
+            </w:r>
+          </w:p>
+        </w:tc>
+        <w:tc>
+          <w:tcPr>
+            <w:tcW w:type="dxa" w:w="3853"/>
+            <w:tcMar>
+              <w:top w:type="dxa" w:w="60"/>
+              <w:left w:type="dxa" w:w="90"/>
+              <w:bottom w:type="dxa" w:w="60"/>
+              <w:right w:type="dxa" w:w="90"/>
+            </w:tcMar>
+          </w:tcPr>
+          <w:p>
+            <w:r>
+              <w:rPr>
+                <w:sz w:val="18"/>
+                <w:szCs w:val="18"/>
+              </w:rPr>
+              <w:t xml:space="preserve">Single core (MACS3 runs on one core)</w:t>
+            </w:r>
+          </w:p>
         </w:tc>
       </w:tr>
     </w:tbl>
@@ -12102,7 +12412,7 @@
           <w:sz w:val="19"/>
           <w:szCs w:val="19"/>
         </w:rPr>
-        <w:t xml:space="preserve">bash MACS3_callpeak_ATAC.1.2.sh \</w:t>
+        <w:t xml:space="preserve">bash MACS3_callpeak_ATAC.1.3.sh \</w:t>
       </w:r>
     </w:p>
     <w:p>
@@ -12858,6 +13168,68 @@
             </w:tcMar>
           </w:tcPr>
           <w:p/>
+        </w:tc>
+      </w:tr>
+      <w:tr>
+        <w:tc>
+          <w:tcPr>
+            <w:tcW w:type="dxa" w:w="1800"/>
+            <w:tcMar>
+              <w:top w:type="dxa" w:w="60"/>
+              <w:left w:type="dxa" w:w="90"/>
+              <w:bottom w:type="dxa" w:w="60"/>
+              <w:right w:type="dxa" w:w="90"/>
+            </w:tcMar>
+          </w:tcPr>
+          <w:p>
+            <w:r>
+              <w:rPr>
+                <w:sz w:val="18"/>
+                <w:szCs w:val="18"/>
+              </w:rPr>
+              <w:t xml:space="preserve">Processor Core (제안)</w:t>
+            </w:r>
+          </w:p>
+        </w:tc>
+        <w:tc>
+          <w:tcPr>
+            <w:tcW w:type="dxa" w:w="3853"/>
+            <w:tcMar>
+              <w:top w:type="dxa" w:w="60"/>
+              <w:left w:type="dxa" w:w="90"/>
+              <w:bottom w:type="dxa" w:w="60"/>
+              <w:right w:type="dxa" w:w="90"/>
+            </w:tcMar>
+          </w:tcPr>
+          <w:p>
+            <w:r>
+              <w:rPr>
+                <w:sz w:val="18"/>
+                <w:szCs w:val="18"/>
+              </w:rPr>
+              <w:t xml:space="preserve">싱글 코어</w:t>
+            </w:r>
+          </w:p>
+        </w:tc>
+        <w:tc>
+          <w:tcPr>
+            <w:tcW w:type="dxa" w:w="3853"/>
+            <w:tcMar>
+              <w:top w:type="dxa" w:w="60"/>
+              <w:left w:type="dxa" w:w="90"/>
+              <w:bottom w:type="dxa" w:w="60"/>
+              <w:right w:type="dxa" w:w="90"/>
+            </w:tcMar>
+          </w:tcPr>
+          <w:p>
+            <w:r>
+              <w:rPr>
+                <w:sz w:val="18"/>
+                <w:szCs w:val="18"/>
+              </w:rPr>
+              <w:t xml:space="preserve">Single core</w:t>
+            </w:r>
+          </w:p>
         </w:tc>
       </w:tr>
     </w:tbl>
@@ -15443,6 +15815,68 @@
           <w:p/>
         </w:tc>
       </w:tr>
+      <w:tr>
+        <w:tc>
+          <w:tcPr>
+            <w:tcW w:type="dxa" w:w="1800"/>
+            <w:tcMar>
+              <w:top w:type="dxa" w:w="60"/>
+              <w:left w:type="dxa" w:w="90"/>
+              <w:bottom w:type="dxa" w:w="60"/>
+              <w:right w:type="dxa" w:w="90"/>
+            </w:tcMar>
+          </w:tcPr>
+          <w:p>
+            <w:r>
+              <w:rPr>
+                <w:sz w:val="18"/>
+                <w:szCs w:val="18"/>
+              </w:rPr>
+              <w:t xml:space="preserve">Processor Core (제안)</w:t>
+            </w:r>
+          </w:p>
+        </w:tc>
+        <w:tc>
+          <w:tcPr>
+            <w:tcW w:type="dxa" w:w="3853"/>
+            <w:tcMar>
+              <w:top w:type="dxa" w:w="60"/>
+              <w:left w:type="dxa" w:w="90"/>
+              <w:bottom w:type="dxa" w:w="60"/>
+              <w:right w:type="dxa" w:w="90"/>
+            </w:tcMar>
+          </w:tcPr>
+          <w:p>
+            <w:r>
+              <w:rPr>
+                <w:sz w:val="18"/>
+                <w:szCs w:val="18"/>
+              </w:rPr>
+              <w:t xml:space="preserve">싱글 코어</w:t>
+            </w:r>
+          </w:p>
+        </w:tc>
+        <w:tc>
+          <w:tcPr>
+            <w:tcW w:type="dxa" w:w="3853"/>
+            <w:tcMar>
+              <w:top w:type="dxa" w:w="60"/>
+              <w:left w:type="dxa" w:w="90"/>
+              <w:bottom w:type="dxa" w:w="60"/>
+              <w:right w:type="dxa" w:w="90"/>
+            </w:tcMar>
+          </w:tcPr>
+          <w:p>
+            <w:r>
+              <w:rPr>
+                <w:sz w:val="18"/>
+                <w:szCs w:val="18"/>
+              </w:rPr>
+              <w:t xml:space="preserve">Single core</w:t>
+            </w:r>
+          </w:p>
+        </w:tc>
+      </w:tr>
     </w:tbl>
     <w:p/>
     <w:p>
@@ -18606,7 +19040,7 @@
                 <w:sz w:val="18"/>
                 <w:szCs w:val="18"/>
               </w:rPr>
-              <w:t xml:space="preserve">1.1</w:t>
+              <w:t xml:space="preserve">1.2</w:t>
             </w:r>
           </w:p>
         </w:tc>
@@ -18876,7 +19310,7 @@
                 <w:sz w:val="18"/>
                 <w:szCs w:val="18"/>
               </w:rPr>
-              <w:t xml:space="preserve">atac_motif.1.1.R</w:t>
+              <w:t xml:space="preserve">atac_motif.1.2.R</w:t>
             </w:r>
           </w:p>
         </w:tc>
@@ -18891,6 +19325,68 @@
             </w:tcMar>
           </w:tcPr>
           <w:p/>
+        </w:tc>
+      </w:tr>
+      <w:tr>
+        <w:tc>
+          <w:tcPr>
+            <w:tcW w:type="dxa" w:w="1800"/>
+            <w:tcMar>
+              <w:top w:type="dxa" w:w="60"/>
+              <w:left w:type="dxa" w:w="90"/>
+              <w:bottom w:type="dxa" w:w="60"/>
+              <w:right w:type="dxa" w:w="90"/>
+            </w:tcMar>
+          </w:tcPr>
+          <w:p>
+            <w:r>
+              <w:rPr>
+                <w:sz w:val="18"/>
+                <w:szCs w:val="18"/>
+              </w:rPr>
+              <w:t xml:space="preserve">Processor Core (제안)</w:t>
+            </w:r>
+          </w:p>
+        </w:tc>
+        <w:tc>
+          <w:tcPr>
+            <w:tcW w:type="dxa" w:w="3853"/>
+            <w:tcMar>
+              <w:top w:type="dxa" w:w="60"/>
+              <w:left w:type="dxa" w:w="90"/>
+              <w:bottom w:type="dxa" w:w="60"/>
+              <w:right w:type="dxa" w:w="90"/>
+            </w:tcMar>
+          </w:tcPr>
+          <w:p>
+            <w:r>
+              <w:rPr>
+                <w:sz w:val="18"/>
+                <w:szCs w:val="18"/>
+              </w:rPr>
+              <w:t xml:space="preserve">최대 4코어 (모티프 계산을 여러 코어로 나눔)</w:t>
+            </w:r>
+          </w:p>
+        </w:tc>
+        <w:tc>
+          <w:tcPr>
+            <w:tcW w:type="dxa" w:w="3853"/>
+            <w:tcMar>
+              <w:top w:type="dxa" w:w="60"/>
+              <w:left w:type="dxa" w:w="90"/>
+              <w:bottom w:type="dxa" w:w="60"/>
+              <w:right w:type="dxa" w:w="90"/>
+            </w:tcMar>
+          </w:tcPr>
+          <w:p>
+            <w:r>
+              <w:rPr>
+                <w:sz w:val="18"/>
+                <w:szCs w:val="18"/>
+              </w:rPr>
+              <w:t xml:space="preserve">Up to 4 cores (motif scoring is parallel)</w:t>
+            </w:r>
+          </w:p>
         </w:tc>
       </w:tr>
     </w:tbl>
@@ -21989,7 +22485,7 @@
           <w:sz w:val="19"/>
           <w:szCs w:val="19"/>
         </w:rPr>
-        <w:t xml:space="preserve">Rscript atac_motif.1.1.R \</w:t>
+        <w:t xml:space="preserve">Rscript atac_motif.1.2.R \</w:t>
       </w:r>
     </w:p>
     <w:p>
@@ -22860,6 +23356,68 @@
             </w:tcMar>
           </w:tcPr>
           <w:p/>
+        </w:tc>
+      </w:tr>
+      <w:tr>
+        <w:tc>
+          <w:tcPr>
+            <w:tcW w:type="dxa" w:w="1800"/>
+            <w:tcMar>
+              <w:top w:type="dxa" w:w="60"/>
+              <w:left w:type="dxa" w:w="90"/>
+              <w:bottom w:type="dxa" w:w="60"/>
+              <w:right w:type="dxa" w:w="90"/>
+            </w:tcMar>
+          </w:tcPr>
+          <w:p>
+            <w:r>
+              <w:rPr>
+                <w:sz w:val="18"/>
+                <w:szCs w:val="18"/>
+              </w:rPr>
+              <w:t xml:space="preserve">Processor Core (제안)</w:t>
+            </w:r>
+          </w:p>
+        </w:tc>
+        <w:tc>
+          <w:tcPr>
+            <w:tcW w:type="dxa" w:w="3853"/>
+            <w:tcMar>
+              <w:top w:type="dxa" w:w="60"/>
+              <w:left w:type="dxa" w:w="90"/>
+              <w:bottom w:type="dxa" w:w="60"/>
+              <w:right w:type="dxa" w:w="90"/>
+            </w:tcMar>
+          </w:tcPr>
+          <w:p>
+            <w:r>
+              <w:rPr>
+                <w:sz w:val="18"/>
+                <w:szCs w:val="18"/>
+              </w:rPr>
+              <w:t xml:space="preserve">최대 4코어 (TOBIAS가 여러 코어 사용)</w:t>
+            </w:r>
+          </w:p>
+        </w:tc>
+        <w:tc>
+          <w:tcPr>
+            <w:tcW w:type="dxa" w:w="3853"/>
+            <w:tcMar>
+              <w:top w:type="dxa" w:w="60"/>
+              <w:left w:type="dxa" w:w="90"/>
+              <w:bottom w:type="dxa" w:w="60"/>
+              <w:right w:type="dxa" w:w="90"/>
+            </w:tcMar>
+          </w:tcPr>
+          <w:p>
+            <w:r>
+              <w:rPr>
+                <w:sz w:val="18"/>
+                <w:szCs w:val="18"/>
+              </w:rPr>
+              <w:t xml:space="preserve">Up to 4 cores (TOBIAS is multi-threaded)</w:t>
+            </w:r>
+          </w:p>
         </w:tc>
       </w:tr>
     </w:tbl>
@@ -25768,6 +26326,68 @@
           <w:p/>
         </w:tc>
       </w:tr>
+      <w:tr>
+        <w:tc>
+          <w:tcPr>
+            <w:tcW w:type="dxa" w:w="1800"/>
+            <w:tcMar>
+              <w:top w:type="dxa" w:w="60"/>
+              <w:left w:type="dxa" w:w="90"/>
+              <w:bottom w:type="dxa" w:w="60"/>
+              <w:right w:type="dxa" w:w="90"/>
+            </w:tcMar>
+          </w:tcPr>
+          <w:p>
+            <w:r>
+              <w:rPr>
+                <w:sz w:val="18"/>
+                <w:szCs w:val="18"/>
+              </w:rPr>
+              <w:t xml:space="preserve">Processor Core (제안)</w:t>
+            </w:r>
+          </w:p>
+        </w:tc>
+        <w:tc>
+          <w:tcPr>
+            <w:tcW w:type="dxa" w:w="3853"/>
+            <w:tcMar>
+              <w:top w:type="dxa" w:w="60"/>
+              <w:left w:type="dxa" w:w="90"/>
+              <w:bottom w:type="dxa" w:w="60"/>
+              <w:right w:type="dxa" w:w="90"/>
+            </w:tcMar>
+          </w:tcPr>
+          <w:p>
+            <w:r>
+              <w:rPr>
+                <w:sz w:val="18"/>
+                <w:szCs w:val="18"/>
+              </w:rPr>
+              <w:t xml:space="preserve">싱글 코어</w:t>
+            </w:r>
+          </w:p>
+        </w:tc>
+        <w:tc>
+          <w:tcPr>
+            <w:tcW w:type="dxa" w:w="3853"/>
+            <w:tcMar>
+              <w:top w:type="dxa" w:w="60"/>
+              <w:left w:type="dxa" w:w="90"/>
+              <w:bottom w:type="dxa" w:w="60"/>
+              <w:right w:type="dxa" w:w="90"/>
+            </w:tcMar>
+          </w:tcPr>
+          <w:p>
+            <w:r>
+              <w:rPr>
+                <w:sz w:val="18"/>
+                <w:szCs w:val="18"/>
+              </w:rPr>
+              <w:t xml:space="preserve">Single core</w:t>
+            </w:r>
+          </w:p>
+        </w:tc>
+      </w:tr>
     </w:tbl>
     <w:p/>
     <w:p>
@@ -30249,7 +30869,7 @@
                 <w:sz w:val="18"/>
                 <w:szCs w:val="18"/>
               </w:rPr>
-              <w:t xml:space="preserve">1.0</w:t>
+              <w:t xml:space="preserve">1.1</w:t>
             </w:r>
           </w:p>
         </w:tc>
@@ -30519,7 +31139,7 @@
                 <w:sz w:val="18"/>
                 <w:szCs w:val="18"/>
               </w:rPr>
-              <w:t xml:space="preserve">replicate_consistency.1.0.sh</w:t>
+              <w:t xml:space="preserve">replicate_consistency.1.1.sh</w:t>
             </w:r>
           </w:p>
         </w:tc>
@@ -30534,6 +31154,68 @@
             </w:tcMar>
           </w:tcPr>
           <w:p/>
+        </w:tc>
+      </w:tr>
+      <w:tr>
+        <w:tc>
+          <w:tcPr>
+            <w:tcW w:type="dxa" w:w="1800"/>
+            <w:tcMar>
+              <w:top w:type="dxa" w:w="60"/>
+              <w:left w:type="dxa" w:w="90"/>
+              <w:bottom w:type="dxa" w:w="60"/>
+              <w:right w:type="dxa" w:w="90"/>
+            </w:tcMar>
+          </w:tcPr>
+          <w:p>
+            <w:r>
+              <w:rPr>
+                <w:sz w:val="18"/>
+                <w:szCs w:val="18"/>
+              </w:rPr>
+              <w:t xml:space="preserve">Processor Core (제안)</w:t>
+            </w:r>
+          </w:p>
+        </w:tc>
+        <w:tc>
+          <w:tcPr>
+            <w:tcW w:type="dxa" w:w="3853"/>
+            <w:tcMar>
+              <w:top w:type="dxa" w:w="60"/>
+              <w:left w:type="dxa" w:w="90"/>
+              <w:bottom w:type="dxa" w:w="60"/>
+              <w:right w:type="dxa" w:w="90"/>
+            </w:tcMar>
+          </w:tcPr>
+          <w:p>
+            <w:r>
+              <w:rPr>
+                <w:sz w:val="18"/>
+                <w:szCs w:val="18"/>
+              </w:rPr>
+              <w:t xml:space="preserve">싱글 코어 (MACS3, idr은 1코어로 계산)</w:t>
+            </w:r>
+          </w:p>
+        </w:tc>
+        <w:tc>
+          <w:tcPr>
+            <w:tcW w:type="dxa" w:w="3853"/>
+            <w:tcMar>
+              <w:top w:type="dxa" w:w="60"/>
+              <w:left w:type="dxa" w:w="90"/>
+              <w:bottom w:type="dxa" w:w="60"/>
+              <w:right w:type="dxa" w:w="90"/>
+            </w:tcMar>
+          </w:tcPr>
+          <w:p>
+            <w:r>
+              <w:rPr>
+                <w:sz w:val="18"/>
+                <w:szCs w:val="18"/>
+              </w:rPr>
+              <w:t xml:space="preserve">Single core (MACS3 and idr run on one core)</w:t>
+            </w:r>
+          </w:p>
         </w:tc>
       </w:tr>
     </w:tbl>
@@ -32407,7 +33089,7 @@
           <w:sz w:val="19"/>
           <w:szCs w:val="19"/>
         </w:rPr>
-        <w:t xml:space="preserve">bash replicate_consistency.1.0.sh \</w:t>
+        <w:t xml:space="preserve">bash replicate_consistency.1.1.sh \</w:t>
       </w:r>
     </w:p>
     <w:p>

</xml_diff>

<commit_message>
Describe options by what the tools do and how they relate
MACS3: peak_type is the MACS3 mode (narrow default, broad), qvalue is
the -q cutoff, and broad_cutoff applies only to broad and must be at
least qvalue. Options that only matter with another one now say so
(ATAC_QC_plot window bins, peak_annotation peak_suffix for broad peaks,
DA GC-plot options and control_name, atac_motif kmer_len, stabsel_cutoff
and seed, functional_enrichment da_* and cutoffs). Each description was
checked against the script code.

Co-Authored-By: Claude Opus 5.5 <noreply@anthropic.com>
</commit_message>
<xml_diff>
--- a/docs/ATAC-seq/modules/Portal_Content.docx
+++ b/docs/ATAC-seq/modules/Portal_Content.docx
@@ -9223,7 +9223,7 @@
                 <w:sz w:val="18"/>
                 <w:szCs w:val="18"/>
               </w:rPr>
-              <w:t xml:space="preserve">구간을 나누는 칸 수</w:t>
+              <w:t xml:space="preserve">TSS 창(upstream+downstream)을 나누는 칸 수. 칸 크기 = (upstream+downstream)/ntile. 홀수로 두어야 가운데 칸이 TSS에 옴(기본 2020/101 = 20 bp)</w:t>
             </w:r>
           </w:p>
         </w:tc>
@@ -9243,7 +9243,7 @@
                 <w:sz w:val="18"/>
                 <w:szCs w:val="18"/>
               </w:rPr>
-              <w:t xml:space="preserve">Number of bins</w:t>
+              <w:t xml:space="preserve">Bins across the TSS window (upstream+downstream); bin size = (upstream+downstream)/ntile. Keep it odd so the middle bin sits on the TSS (default 2020/101 = 20 bp)</w:t>
             </w:r>
           </w:p>
         </w:tc>
@@ -9365,7 +9365,7 @@
                 <w:sz w:val="18"/>
                 <w:szCs w:val="18"/>
               </w:rPr>
-              <w:t xml:space="preserve">TSS 신호 필터 기준(ATACseqQC TSS.filter)</w:t>
+              <w:t xml:space="preserve">신호가 약한 TSS를 빼는 기준(ATACseqQC TSS.filter). TSS 창의 평균 신호가 이 값보다 커야 그림에 넣음. 0이면 필터 없음</w:t>
             </w:r>
           </w:p>
         </w:tc>
@@ -9385,7 +9385,7 @@
                 <w:sz w:val="18"/>
                 <w:szCs w:val="18"/>
               </w:rPr>
-              <w:t xml:space="preserve">TSS signal filter (ATACseqQC TSS.filter)</w:t>
+              <w:t xml:space="preserve">Drops weak TSSs (ATACseqQC TSS.filter): a TSS is kept when its mean signal over the window exceeds this value; 0 disables the filter</w:t>
             </w:r>
           </w:p>
         </w:tc>
@@ -10715,7 +10715,7 @@
         <w:spacing w:after="80"/>
       </w:pPr>
       <w:r>
-        <w:t xml:space="preserve">peak_type으로 atac(기본), narrow, broad, tf 설정을 고릅니다.</w:t>
+        <w:t xml:space="preserve">peak_type으로 MACS3 peak 모드를 고릅니다. ATAC-seq은 narrow(기본), 넓은 신호는 broad입니다.</w:t>
       </w:r>
     </w:p>
     <w:p>
@@ -10790,7 +10790,7 @@
         <w:spacing w:after="80"/>
       </w:pPr>
       <w:r>
-        <w:t xml:space="preserve">peak_type selects the atac (default), narrow, broad, or tf preset.</w:t>
+        <w:t xml:space="preserve">peak_type selects the MACS3 peak mode: narrow (default) for ATAC-seq, or broad for wide signals.</w:t>
       </w:r>
     </w:p>
     <w:p>
@@ -11553,7 +11553,7 @@
                 <w:sz w:val="18"/>
                 <w:szCs w:val="18"/>
               </w:rPr>
-              <w:t xml:space="preserve">atac</w:t>
+              <w:t xml:space="preserve">narrow</w:t>
             </w:r>
           </w:p>
         </w:tc>
@@ -11573,7 +11573,7 @@
                 <w:sz w:val="18"/>
                 <w:szCs w:val="18"/>
               </w:rPr>
-              <w:t xml:space="preserve">atac, narrow, broad, tf</w:t>
+              <w:t xml:space="preserve">MACS3 peak 모드. narrow(기본): 좁은 peak(.narrowPeak), ATAC-seq은 narrow 사용. broad: 넓은 peak(.broadPeak), broad_cutoff를 함께 사용하며 peak_annotation의 peak_suffix를 .broadPeak로 바꿔야 함</w:t>
             </w:r>
           </w:p>
         </w:tc>
@@ -11593,7 +11593,7 @@
                 <w:sz w:val="18"/>
                 <w:szCs w:val="18"/>
               </w:rPr>
-              <w:t xml:space="preserve">atac, narrow, broad, tf</w:t>
+              <w:t xml:space="preserve">MACS3 peak mode. narrow (default): narrow peaks (.narrowPeak), used for ATAC-seq. broad: broad peaks (.broadPeak); uses broad_cutoff, and peak_annotation needs peak_suffix=.broadPeak</w:t>
             </w:r>
           </w:p>
         </w:tc>
@@ -11857,7 +11857,7 @@
                 <w:sz w:val="18"/>
                 <w:szCs w:val="18"/>
               </w:rPr>
-              <w:t xml:space="preserve">q-value 기준</w:t>
+              <w:t xml:space="preserve">peak로 인정하는 q-value 상한(MACS3 -q). 이보다 작은 구간만 peak. 작을수록 엄격</w:t>
             </w:r>
           </w:p>
         </w:tc>
@@ -11877,7 +11877,7 @@
                 <w:sz w:val="18"/>
                 <w:szCs w:val="18"/>
               </w:rPr>
-              <w:t xml:space="preserve">q-value cutoff</w:t>
+              <w:t xml:space="preserve">Upper q-value for a peak (MACS3 -q); only regions below it are peaks. Smaller is stricter</w:t>
             </w:r>
           </w:p>
         </w:tc>
@@ -11999,7 +11999,7 @@
                 <w:sz w:val="18"/>
                 <w:szCs w:val="18"/>
               </w:rPr>
-              <w:t xml:space="preserve">broad peak 기준(peak_type=broad일 때)</w:t>
+              <w:t xml:space="preserve">peak_type=broad일 때만 사용(narrow면 무시). 강한 구간 주변의 약한 구간을 이어 붙이는 느슨한 q-value 기준(MACS3 --broad-cutoff)으로, qvalue보다 크거나 같아야 함</w:t>
             </w:r>
           </w:p>
         </w:tc>
@@ -12019,7 +12019,7 @@
                 <w:sz w:val="18"/>
                 <w:szCs w:val="18"/>
               </w:rPr>
-              <w:t xml:space="preserve">Broad peak cutoff (peak_type=broad)</w:t>
+              <w:t xml:space="preserve">Used only with peak_type=broad (ignored for narrow). Looser q-value for linking weaker nearby regions to strong ones (MACS3 --broad-cutoff); must be at least qvalue</w:t>
             </w:r>
           </w:p>
         </w:tc>
@@ -12468,7 +12468,7 @@
           <w:sz w:val="19"/>
           <w:szCs w:val="19"/>
         </w:rPr>
-        <w:t xml:space="preserve">  peak_type=atac \</w:t>
+        <w:t xml:space="preserve">  peak_type=narrow \</w:t>
       </w:r>
     </w:p>
     <w:p>
@@ -14249,7 +14249,7 @@
                 <w:sz w:val="18"/>
                 <w:szCs w:val="18"/>
               </w:rPr>
-              <w:t xml:space="preserve">peak 파일 이름 끝부분</w:t>
+              <w:t xml:space="preserve">peak 파일 이름 끝부분. MACS3를 peak_type=broad로 돌렸으면 .broadPeak</w:t>
             </w:r>
           </w:p>
         </w:tc>
@@ -14269,7 +14269,7 @@
                 <w:sz w:val="18"/>
                 <w:szCs w:val="18"/>
               </w:rPr>
-              <w:t xml:space="preserve">Peak file name suffix</w:t>
+              <w:t xml:space="preserve">Peak file name ending; use .broadPeak when MACS3 ran with peak_type=broad</w:t>
             </w:r>
           </w:p>
         </w:tc>
@@ -17072,7 +17072,7 @@
                 <w:sz w:val="18"/>
                 <w:szCs w:val="18"/>
               </w:rPr>
-              <w:t xml:space="preserve">기준(분모) 조건 이름. logFC = log2(비교 조건 / 기준 조건)</w:t>
+              <w:t xml:space="preserve">기준(분모) 조건 이름. 샘플 정보의 Condition 값 중 하나와 정확히 같아야 함. logFC = log2(다른 조건 / 기준 조건)</w:t>
             </w:r>
           </w:p>
         </w:tc>
@@ -17092,7 +17092,7 @@
                 <w:sz w:val="18"/>
                 <w:szCs w:val="18"/>
               </w:rPr>
-              <w:t xml:space="preserve">Baseline (denominator) condition; logFC = log2(other / baseline)</w:t>
+              <w:t xml:space="preserve">Reference (denominator) condition; must match one Condition value exactly. logFC = log2(other condition / reference)</w:t>
             </w:r>
           </w:p>
         </w:tc>
@@ -17348,7 +17348,7 @@
                 <w:sz w:val="18"/>
                 <w:szCs w:val="18"/>
               </w:rPr>
-              <w:t xml:space="preserve">GC 편향 그림에 쓸 염색체. 비우면 가장 긴 염색체</w:t>
+              <w:t xml:space="preserve">GC 편향 그림에만 쓰는 염색체(분석 결과에는 영향 없음). 비우면 가장 긴 염색체</w:t>
             </w:r>
           </w:p>
         </w:tc>
@@ -17368,7 +17368,7 @@
                 <w:sz w:val="18"/>
                 <w:szCs w:val="18"/>
               </w:rPr>
-              <w:t xml:space="preserve">Chromosome for the GC bias plot; empty uses the longest</w:t>
+              <w:t xml:space="preserve">Chromosome for the GC-bias plot only (no effect on results); empty uses the longest chromosome</w:t>
             </w:r>
           </w:p>
         </w:tc>
@@ -17490,7 +17490,7 @@
                 <w:sz w:val="18"/>
                 <w:szCs w:val="18"/>
               </w:rPr>
-              <w:t xml:space="preserve">GC 편향 그림의 구간 크기(bp)</w:t>
+              <w:t xml:space="preserve">GC 편향 그림에만 쓰는 구간 크기(bp, 분석 결과에는 영향 없음)</w:t>
             </w:r>
           </w:p>
         </w:tc>
@@ -17510,7 +17510,7 @@
                 <w:sz w:val="18"/>
                 <w:szCs w:val="18"/>
               </w:rPr>
-              <w:t xml:space="preserve">Bin size for the GC bias plot (bp)</w:t>
+              <w:t xml:space="preserve">Bin size for the GC-bias plot only (bp; no effect on results)</w:t>
             </w:r>
           </w:p>
         </w:tc>
@@ -21342,7 +21342,7 @@
                 <w:sz w:val="18"/>
                 <w:szCs w:val="18"/>
               </w:rPr>
-              <w:t xml:space="preserve">k-mer 길이</w:t>
+              <w:t xml:space="preserve">k-mer 길이. run_kmer=TRUE일 때만 사용</w:t>
             </w:r>
           </w:p>
         </w:tc>
@@ -21362,7 +21362,7 @@
                 <w:sz w:val="18"/>
                 <w:szCs w:val="18"/>
               </w:rPr>
-              <w:t xml:space="preserve">k-mer length</w:t>
+              <w:t xml:space="preserve">k-mer length; used only with run_kmer=TRUE</w:t>
             </w:r>
           </w:p>
         </w:tc>
@@ -21626,7 +21626,7 @@
                 <w:sz w:val="18"/>
                 <w:szCs w:val="18"/>
               </w:rPr>
-              <w:t xml:space="preserve">안정성 선택 기준(0~1]</w:t>
+              <w:t xml:space="preserve">안정성 선택 기준(0~1]. run_regression=TRUE일 때만 사용</w:t>
             </w:r>
           </w:p>
         </w:tc>
@@ -21646,7 +21646,7 @@
                 <w:sz w:val="18"/>
                 <w:szCs w:val="18"/>
               </w:rPr>
-              <w:t xml:space="preserve">Stability selection cutoff (0–1]</w:t>
+              <w:t xml:space="preserve">Stability selection cutoff (0-1]; used only with run_regression=TRUE</w:t>
             </w:r>
           </w:p>
         </w:tc>
@@ -21768,7 +21768,7 @@
                 <w:sz w:val="18"/>
                 <w:szCs w:val="18"/>
               </w:rPr>
-              <w:t xml:space="preserve">난수 시드</w:t>
+              <w:t xml:space="preserve">회귀 분석(안정성 선택)을 재현하기 위한 난수 시드. run_regression=TRUE일 때만 사용</w:t>
             </w:r>
           </w:p>
         </w:tc>
@@ -21788,7 +21788,7 @@
                 <w:sz w:val="18"/>
                 <w:szCs w:val="18"/>
               </w:rPr>
-              <w:t xml:space="preserve">Random seed</w:t>
+              <w:t xml:space="preserve">Random seed that makes the regression (stability selection) reproducible; used only with run_regression=TRUE</w:t>
             </w:r>
           </w:p>
         </w:tc>
@@ -28511,7 +28511,7 @@
                 <w:sz w:val="18"/>
                 <w:szCs w:val="18"/>
               </w:rPr>
-              <w:t xml:space="preserve">조정 p-value 기준</w:t>
+              <w:t xml:space="preserve">유의 GO 항목의 조정 p-value(p.adjust) 기준. p_adjust_method로 보정한 값에 적용</w:t>
             </w:r>
           </w:p>
         </w:tc>
@@ -28531,7 +28531,7 @@
                 <w:sz w:val="18"/>
                 <w:szCs w:val="18"/>
               </w:rPr>
-              <w:t xml:space="preserve">Adjusted p-value cutoff</w:t>
+              <w:t xml:space="preserve">Adjusted p-value (p.adjust) cutoff for significant GO terms, after p_adjust_method</w:t>
             </w:r>
           </w:p>
         </w:tc>
@@ -28653,7 +28653,7 @@
                 <w:sz w:val="18"/>
                 <w:szCs w:val="18"/>
               </w:rPr>
-              <w:t xml:space="preserve">q-value 기준</w:t>
+              <w:t xml:space="preserve">유의 GO 항목의 q-value 기준. pvalue_cutoff와 둘 다 만족해야 유의</w:t>
             </w:r>
           </w:p>
         </w:tc>
@@ -28673,7 +28673,7 @@
                 <w:sz w:val="18"/>
                 <w:szCs w:val="18"/>
               </w:rPr>
-              <w:t xml:space="preserve">q-value cutoff</w:t>
+              <w:t xml:space="preserve">q-value cutoff for significant GO terms; a term must pass both this and pvalue_cutoff</w:t>
             </w:r>
           </w:p>
         </w:tc>
@@ -29505,7 +29505,7 @@
                 <w:sz w:val="18"/>
                 <w:szCs w:val="18"/>
               </w:rPr>
-              <w:t xml:space="preserve">da_dir에서 읽을 정규화 결과(TMM, EDASeq, CQN)</w:t>
+              <w:t xml:space="preserve">da_dir에서 읽을 정규화 결과(TMM, EDASeq, CQN). da_dir일 때만 사용</w:t>
             </w:r>
           </w:p>
         </w:tc>
@@ -29525,7 +29525,7 @@
                 <w:sz w:val="18"/>
                 <w:szCs w:val="18"/>
               </w:rPr>
-              <w:t xml:space="preserve">Normalization result to read from da_dir (TMM, EDASeq, CQN)</w:t>
+              <w:t xml:space="preserve">Normalization result read from da_dir (TMM, EDASeq, CQN); used only with da_dir</w:t>
             </w:r>
           </w:p>
         </w:tc>
@@ -29647,7 +29647,7 @@
                 <w:sz w:val="18"/>
                 <w:szCs w:val="18"/>
               </w:rPr>
-              <w:t xml:space="preserve">up/down peak FDR 기준</w:t>
+              <w:t xml:space="preserve">up/down peak FDR 기준. da_dir 또는 da_file일 때만 사용</w:t>
             </w:r>
           </w:p>
         </w:tc>
@@ -29667,7 +29667,7 @@
                 <w:sz w:val="18"/>
                 <w:szCs w:val="18"/>
               </w:rPr>
-              <w:t xml:space="preserve">FDR cutoff for up/down peaks</w:t>
+              <w:t xml:space="preserve">FDR cutoff for up/down peaks; used only with da_dir or da_file</w:t>
             </w:r>
           </w:p>
         </w:tc>
@@ -29789,7 +29789,7 @@
                 <w:sz w:val="18"/>
                 <w:szCs w:val="18"/>
               </w:rPr>
-              <w:t xml:space="preserve">up/down peak 최소 abs(logFC)</w:t>
+              <w:t xml:space="preserve">up/down peak 최소 abs(logFC). da_dir 또는 da_file일 때만 사용</w:t>
             </w:r>
           </w:p>
         </w:tc>
@@ -29809,7 +29809,7 @@
                 <w:sz w:val="18"/>
                 <w:szCs w:val="18"/>
               </w:rPr>
-              <w:t xml:space="preserve">Minimum abs(logFC) for up/down peaks</w:t>
+              <w:t xml:space="preserve">Minimum abs(logFC) for up/down peaks; used only with da_dir or da_file</w:t>
             </w:r>
           </w:p>
         </w:tc>

</xml_diff>

<commit_message>
Register pipeline-connected inputs as required
differential_accessibility input_dir and peak_dir, atac_motif input_dir
and tf_footprinting macs_dir are the inputs the canvas connects from
earlier modules, so they are required on the portal with example paths.
The alternatives keep working: a format (A) sample sheet makes the DA
folders unused, and da_csv or peak_file are used instead when given.

Co-Authored-By: Claude Opus 5.5 <noreply@anthropic.com>
</commit_message>
<xml_diff>
--- a/docs/ATAC-seq/modules/Portal_Content.docx
+++ b/docs/ATAC-seq/modules/Portal_Content.docx
@@ -16378,7 +16378,7 @@
                 <w:sz w:val="18"/>
                 <w:szCs w:val="18"/>
               </w:rPr>
-              <w:t xml:space="preserve">샘플 정보 CSV. (A) SampleID,Condition,bamReads,Peaks 또는 (B) SampleID,Condition</w:t>
+              <w:t xml:space="preserve">샘플 정보 CSV. 파이프라인에서는 (B) SampleID,Condition 형식을 쓰고 BAM과 peak는 input_dir, peak_dir에서 찾음. (A) SampleID,Condition,bamReads,Peaks 형식은 CSV에 파일 경로를 직접 적을 때</w:t>
             </w:r>
           </w:p>
         </w:tc>
@@ -16398,7 +16398,7 @@
                 <w:sz w:val="18"/>
                 <w:szCs w:val="18"/>
               </w:rPr>
-              <w:t xml:space="preserve">Sample sheet CSV: (A) SampleID,Condition,bamReads,Peaks or (B) SampleID,Condition</w:t>
+              <w:t xml:space="preserve">Sample sheet CSV. In the pipeline use format (B) SampleID,Condition, with BAM and peak files found in input_dir and peak_dir; format (A) SampleID,Condition,bamReads,Peaks lists file paths in the CSV itself</w:t>
             </w:r>
           </w:p>
         </w:tc>
@@ -16582,7 +16582,7 @@
                 <w:sz w:val="18"/>
                 <w:szCs w:val="18"/>
               </w:rPr>
-              <w:t xml:space="preserve">Optional</w:t>
+              <w:t xml:space="preserve">Required</w:t>
             </w:r>
           </w:p>
         </w:tc>
@@ -16636,7 +16636,15 @@
               <w:right w:type="dxa" w:w="90"/>
             </w:tcMar>
           </w:tcPr>
-          <w:p/>
+          <w:p>
+            <w:r>
+              <w:rPr>
+                <w:sz w:val="18"/>
+                <w:szCs w:val="18"/>
+              </w:rPr>
+              <w:t xml:space="preserve">/data/atac_qc</w:t>
+            </w:r>
+          </w:p>
         </w:tc>
         <w:tc>
           <w:tcPr>
@@ -16654,7 +16662,7 @@
                 <w:sz w:val="18"/>
                 <w:szCs w:val="18"/>
               </w:rPr>
-              <w:t xml:space="preserve">(B) 형식일 때 필수. BAM 폴더(ATAC_QC의 output_dir이면 03_shifted_bam 사용)</w:t>
+              <w:t xml:space="preserve">Tn5 보정 BAM 폴더. ATAC_QC의 output_dir(03_shifted_bam 사용). 샘플 정보가 (A) 형식이면 무시됨</w:t>
             </w:r>
           </w:p>
         </w:tc>
@@ -16674,7 +16682,7 @@
                 <w:sz w:val="18"/>
                 <w:szCs w:val="18"/>
               </w:rPr>
-              <w:t xml:space="preserve">Required for format (B): BAM folder (03_shifted_bam of an ATAC_QC output_dir)</w:t>
+              <w:t xml:space="preserve">Tn5-shifted BAM folder: the ATAC_QC output_dir (03_shifted_bam is used). Ignored when the sample sheet is format (A)</w:t>
             </w:r>
           </w:p>
         </w:tc>
@@ -16716,7 +16724,7 @@
                 <w:sz w:val="18"/>
                 <w:szCs w:val="18"/>
               </w:rPr>
-              <w:t xml:space="preserve">Optional</w:t>
+              <w:t xml:space="preserve">Required</w:t>
             </w:r>
           </w:p>
         </w:tc>
@@ -16770,7 +16778,15 @@
               <w:right w:type="dxa" w:w="90"/>
             </w:tcMar>
           </w:tcPr>
-          <w:p/>
+          <w:p>
+            <w:r>
+              <w:rPr>
+                <w:sz w:val="18"/>
+                <w:szCs w:val="18"/>
+              </w:rPr>
+              <w:t xml:space="preserve">/data/macs3</w:t>
+            </w:r>
+          </w:p>
         </w:tc>
         <w:tc>
           <w:tcPr>
@@ -16788,7 +16804,7 @@
                 <w:sz w:val="18"/>
                 <w:szCs w:val="18"/>
               </w:rPr>
-              <w:t xml:space="preserve">(B) 형식일 때 필수. MACS3의 output_dir</w:t>
+              <w:t xml:space="preserve">peak 폴더. MACS3_callpeak_ATAC의 output_dir. 샘플 정보가 (A) 형식이면 무시됨</w:t>
             </w:r>
           </w:p>
         </w:tc>
@@ -16808,7 +16824,7 @@
                 <w:sz w:val="18"/>
                 <w:szCs w:val="18"/>
               </w:rPr>
-              <w:t xml:space="preserve">Required for format (B): MACS3 output_dir</w:t>
+              <w:t xml:space="preserve">Peak folder: the MACS3_callpeak_ATAC output_dir. Ignored when the sample sheet is format (A)</w:t>
             </w:r>
           </w:p>
         </w:tc>
@@ -19732,7 +19748,7 @@
                 <w:sz w:val="18"/>
                 <w:szCs w:val="18"/>
               </w:rPr>
-              <w:t xml:space="preserve">Optional</w:t>
+              <w:t xml:space="preserve">Required</w:t>
             </w:r>
           </w:p>
         </w:tc>
@@ -19786,7 +19802,15 @@
               <w:right w:type="dxa" w:w="90"/>
             </w:tcMar>
           </w:tcPr>
-          <w:p/>
+          <w:p>
+            <w:r>
+              <w:rPr>
+                <w:sz w:val="18"/>
+                <w:szCs w:val="18"/>
+              </w:rPr>
+              <w:t xml:space="preserve">/data/da</w:t>
+            </w:r>
+          </w:p>
         </w:tc>
         <w:tc>
           <w:tcPr>
@@ -19804,7 +19828,7 @@
                 <w:sz w:val="18"/>
                 <w:szCs w:val="18"/>
               </w:rPr>
-              <w:t xml:space="preserve">differential_accessibility의 output_dir. input_dir과 da_csv 중 하나는 필수</w:t>
+              <w:t xml:space="preserve">differential_accessibility의 output_dir. da_csv를 주면 da_csv를 대신 사용</w:t>
             </w:r>
           </w:p>
         </w:tc>
@@ -19824,7 +19848,7 @@
                 <w:sz w:val="18"/>
                 <w:szCs w:val="18"/>
               </w:rPr>
-              <w:t xml:space="preserve">differential_accessibility output_dir; one of input_dir or da_csv is required</w:t>
+              <w:t xml:space="preserve">differential_accessibility output_dir; da_csv is used instead when given</w:t>
             </w:r>
           </w:p>
         </w:tc>
@@ -24357,7 +24381,7 @@
                 <w:sz w:val="18"/>
                 <w:szCs w:val="18"/>
               </w:rPr>
-              <w:t xml:space="preserve">Optional</w:t>
+              <w:t xml:space="preserve">Required</w:t>
             </w:r>
           </w:p>
         </w:tc>
@@ -24411,7 +24435,15 @@
               <w:right w:type="dxa" w:w="90"/>
             </w:tcMar>
           </w:tcPr>
-          <w:p/>
+          <w:p>
+            <w:r>
+              <w:rPr>
+                <w:sz w:val="18"/>
+                <w:szCs w:val="18"/>
+              </w:rPr>
+              <w:t xml:space="preserve">/data/macs3</w:t>
+            </w:r>
+          </w:p>
         </w:tc>
         <w:tc>
           <w:tcPr>
@@ -24429,7 +24461,7 @@
                 <w:sz w:val="18"/>
                 <w:szCs w:val="18"/>
               </w:rPr>
-              <w:t xml:space="preserve">MACS3의 output_dir. peak_file이 없으면 필수</w:t>
+              <w:t xml:space="preserve">MACS3_callpeak_ATAC의 output_dir. peak_file을 주면 peak_file을 대신 사용</w:t>
             </w:r>
           </w:p>
         </w:tc>
@@ -24449,7 +24481,7 @@
                 <w:sz w:val="18"/>
                 <w:szCs w:val="18"/>
               </w:rPr>
-              <w:t xml:space="preserve">MACS3 output_dir; required without peak_file</w:t>
+              <w:t xml:space="preserve">MACS3_callpeak_ATAC output_dir; peak_file is used instead when given</w:t>
             </w:r>
           </w:p>
         </w:tc>

</xml_diff>

<commit_message>
Take DA inputs from arguments only on the portal
On the Slurm and Apptainer portal only paths given as arguments are
bound into the container, so file paths written inside the sample sheet
(bamReads, Peaks) cannot be read. The DA content now describes only the
SampleID,Condition sheet with BAM and peak files from input_dir and
peak_dir.

Co-Authored-By: Claude Opus 5.5 <noreply@anthropic.com>
</commit_message>
<xml_diff>
--- a/docs/ATAC-seq/modules/Portal_Content.docx
+++ b/docs/ATAC-seq/modules/Portal_Content.docx
@@ -16378,7 +16378,7 @@
                 <w:sz w:val="18"/>
                 <w:szCs w:val="18"/>
               </w:rPr>
-              <w:t xml:space="preserve">샘플 정보 CSV. 파이프라인에서는 (B) SampleID,Condition 형식을 쓰고 BAM과 peak는 input_dir, peak_dir에서 찾음. (A) SampleID,Condition,bamReads,Peaks 형식은 CSV에 파일 경로를 직접 적을 때</w:t>
+              <w:t xml:space="preserve">샘플 정보 CSV(SampleID, Condition). BAM과 peak는 input_dir, peak_dir에서 찾음. CSV 안에 파일 경로(bamReads, Peaks 열)를 적는 방식은 포탈에서 쓸 수 없음(인자로 받은 경로만 컨테이너에 연결됨)</w:t>
             </w:r>
           </w:p>
         </w:tc>
@@ -16398,7 +16398,7 @@
                 <w:sz w:val="18"/>
                 <w:szCs w:val="18"/>
               </w:rPr>
-              <w:t xml:space="preserve">Sample sheet CSV. In the pipeline use format (B) SampleID,Condition, with BAM and peak files found in input_dir and peak_dir; format (A) SampleID,Condition,bamReads,Peaks lists file paths in the CSV itself</w:t>
+              <w:t xml:space="preserve">Sample sheet CSV (SampleID, Condition); BAM and peak files are found in input_dir and peak_dir. File paths inside the CSV (bamReads, Peaks columns) cannot be used on the portal, because only paths given as arguments are bound into the container</w:t>
             </w:r>
           </w:p>
         </w:tc>
@@ -16662,7 +16662,7 @@
                 <w:sz w:val="18"/>
                 <w:szCs w:val="18"/>
               </w:rPr>
-              <w:t xml:space="preserve">Tn5 보정 BAM 폴더. ATAC_QC의 output_dir(03_shifted_bam 사용). 샘플 정보가 (A) 형식이면 무시됨</w:t>
+              <w:t xml:space="preserve">Tn5 보정 BAM 폴더. ATAC_QC의 output_dir(03_shifted_bam 사용)</w:t>
             </w:r>
           </w:p>
         </w:tc>
@@ -16682,7 +16682,7 @@
                 <w:sz w:val="18"/>
                 <w:szCs w:val="18"/>
               </w:rPr>
-              <w:t xml:space="preserve">Tn5-shifted BAM folder: the ATAC_QC output_dir (03_shifted_bam is used). Ignored when the sample sheet is format (A)</w:t>
+              <w:t xml:space="preserve">Tn5-shifted BAM folder: the ATAC_QC output_dir (03_shifted_bam is used)</w:t>
             </w:r>
           </w:p>
         </w:tc>
@@ -16804,7 +16804,7 @@
                 <w:sz w:val="18"/>
                 <w:szCs w:val="18"/>
               </w:rPr>
-              <w:t xml:space="preserve">peak 폴더. MACS3_callpeak_ATAC의 output_dir. 샘플 정보가 (A) 형식이면 무시됨</w:t>
+              <w:t xml:space="preserve">peak 폴더. MACS3_callpeak_ATAC의 output_dir</w:t>
             </w:r>
           </w:p>
         </w:tc>
@@ -16824,7 +16824,7 @@
                 <w:sz w:val="18"/>
                 <w:szCs w:val="18"/>
               </w:rPr>
-              <w:t xml:space="preserve">Peak folder: the MACS3_callpeak_ATAC output_dir. Ignored when the sample sheet is format (A)</w:t>
+              <w:t xml:space="preserve">Peak folder: the MACS3_callpeak_ATAC output_dir</w:t>
             </w:r>
           </w:p>
         </w:tc>
@@ -18010,7 +18010,7 @@
         <w:spacing w:after="80"/>
       </w:pPr>
       <w:r>
-        <w:t xml:space="preserve">본문(국문): 두 가지 형식을 지원합니다. (A) SampleID, Condition, bamReads, Peaks 컬럼이 있으면 파일 경로를 그대로 사용합니다(DiffBind 형식). (B) SampleID, Condition만 있으면 input_dir과 peak_dir에서 SampleID로 BAM과 peak 파일을 찾습니다. Condition은 정확히 두 종류여야 합니다.</w:t>
+        <w:t xml:space="preserve">본문(국문): SampleID와 Condition 두 열을 적습니다. BAM과 peak 파일은 input_dir과 peak_dir에서 SampleID로 찾습니다. Condition은 정확히 두 종류여야 합니다. 파일 경로를 CSV에 직접 적는 방식(bamReads, Peaks 열)은 포탈에서 쓸 수 없습니다.</w:t>
       </w:r>
     </w:p>
     <w:p>
@@ -18023,7 +18023,7 @@
         <w:spacing w:after="80"/>
       </w:pPr>
       <w:r>
-        <w:t xml:space="preserve">본문(영문): Two formats are supported. (A) With the SampleID, Condition, bamReads, and Peaks columns, the file paths are used as given (DiffBind style). (B) With only SampleID and Condition, BAM and peak files are found by SampleID in input_dir and peak_dir. Condition must have exactly two values.</w:t>
+        <w:t xml:space="preserve">본문(영문): List the SampleID and Condition columns. BAM and peak files are found by SampleID in input_dir and peak_dir. Condition must have exactly two values. File paths in the CSV (bamReads, Peaks columns) cannot be used on the portal.</w:t>
       </w:r>
     </w:p>
     <w:p>
@@ -18036,7 +18036,7 @@
         <w:spacing w:after="80"/>
       </w:pPr>
       <w:r>
-        <w:t xml:space="preserve">예시 제목: da_sample_data.csv (B 형식)</w:t>
+        <w:t xml:space="preserve">예시 제목: da_sample_data.csv</w:t>
       </w:r>
     </w:p>
     <w:p>

</xml_diff>

<commit_message>
Note where modules write indexes next to their inputs
When a BAM index or FASTA .fai is missing, organellar_filter, ATAC_QC,
MACS3, replicate_consistency and tf_footprinting create it beside the
input, which fails in a read-only shared folder. The parameter
descriptions say so, and the pipeline key notes ask for the reference
.fai to be prepared in advance.

Co-Authored-By: Claude Opus 5.5 <noreply@anthropic.com>
</commit_message>
<xml_diff>
--- a/docs/ATAC-seq/modules/Portal_Content.docx
+++ b/docs/ATAC-seq/modules/Portal_Content.docx
@@ -3661,7 +3661,7 @@
                 <w:sz w:val="18"/>
                 <w:szCs w:val="18"/>
               </w:rPr>
-              <w:t xml:space="preserve">좌표 정렬된 BAM 폴더(*.unsorted.bam 제외). 인덱스가 없으면 BAM 옆에 생성</w:t>
+              <w:t xml:space="preserve">좌표 정렬된 BAM 폴더(*.unsorted.bam 제외). BAM 인덱스(.bai)가 없으면 BAM 옆에 만들므로 그 폴더에 쓰기 권한이 필요(앞 모듈 결과에는 인덱스가 있음)</w:t>
             </w:r>
           </w:p>
         </w:tc>
@@ -3681,7 +3681,7 @@
                 <w:sz w:val="18"/>
                 <w:szCs w:val="18"/>
               </w:rPr>
-              <w:t xml:space="preserve">Folder of coordinate-sorted BAM files (*.unsorted.bam excluded); missing indexes are created beside the BAM</w:t>
+              <w:t xml:space="preserve">Folder of coordinate-sorted BAM files (*.unsorted.bam excluded). A missing BAM index (.bai) is created beside the BAM, so the folder must be writable (outputs of the previous module already have one)</w:t>
             </w:r>
           </w:p>
         </w:tc>
@@ -5627,7 +5627,7 @@
                 <w:sz w:val="18"/>
                 <w:szCs w:val="18"/>
               </w:rPr>
-              <w:t xml:space="preserve">shift 전 BAM 폴더. organellar_filter의 output_dir 권장</w:t>
+              <w:t xml:space="preserve">shift 전 BAM 폴더. organellar_filter의 output_dir 권장. BAM 인덱스(.bai)가 없으면 BAM 옆에 만들므로 그 폴더에 쓰기 권한이 필요(앞 모듈 결과에는 인덱스가 있음)</w:t>
             </w:r>
           </w:p>
         </w:tc>
@@ -5647,7 +5647,7 @@
                 <w:sz w:val="18"/>
                 <w:szCs w:val="18"/>
               </w:rPr>
-              <w:t xml:space="preserve">Folder of pre-shift BAM files; the organellar_filter output_dir is recommended</w:t>
+              <w:t xml:space="preserve">Folder of pre-shift BAM files; the organellar_filter output_dir is recommended. A missing BAM index (.bai) is created beside the BAM, so the folder must be writable (outputs of the previous module already have one)</w:t>
             </w:r>
           </w:p>
         </w:tc>
@@ -6053,7 +6053,7 @@
                 <w:sz w:val="18"/>
                 <w:szCs w:val="18"/>
               </w:rPr>
-              <w:t xml:space="preserve">참조 유전체 FASTA. .fai가 없으면 옆에 생성</w:t>
+              <w:t xml:space="preserve">참조 유전체 FASTA. .fai가 없으면 FASTA 옆에 만들므로 그 폴더에 쓰기 권한이 필요. 공유 참조는 .fai를 미리 만들어 둘 것(samtools faidx)</w:t>
             </w:r>
           </w:p>
         </w:tc>
@@ -6073,7 +6073,7 @@
                 <w:sz w:val="18"/>
                 <w:szCs w:val="18"/>
               </w:rPr>
-              <w:t xml:space="preserve">Reference genome FASTA; a missing .fai is created beside it</w:t>
+              <w:t xml:space="preserve">Reference genome FASTA. A missing .fai is created beside the FASTA, so the folder must be writable; prepare the .fai in advance for shared references (samtools faidx)</w:t>
             </w:r>
           </w:p>
         </w:tc>
@@ -11155,7 +11155,7 @@
                 <w:sz w:val="18"/>
                 <w:szCs w:val="18"/>
               </w:rPr>
-              <w:t xml:space="preserve">Tn5 보정 BAM 폴더. ATAC_QC의 output_dir이면 03_shifted_bam만 검색</w:t>
+              <w:t xml:space="preserve">Tn5 보정 BAM 폴더. ATAC_QC의 output_dir이면 03_shifted_bam만 검색. BAM 인덱스(.bai)가 없으면 BAM 옆에 만들므로 그 폴더에 쓰기 권한이 필요(앞 모듈 결과에는 인덱스가 있음)</w:t>
             </w:r>
           </w:p>
         </w:tc>
@@ -11175,7 +11175,7 @@
                 <w:sz w:val="18"/>
                 <w:szCs w:val="18"/>
               </w:rPr>
-              <w:t xml:space="preserve">Folder of Tn5-shifted BAM files; for an ATAC_QC output_dir only 03_shifted_bam is searched</w:t>
+              <w:t xml:space="preserve">Folder of Tn5-shifted BAM files; for an ATAC_QC output_dir only 03_shifted_bam is searched. A missing BAM index (.bai) is created beside the BAM, so the folder must be writable (outputs of the previous module already have one)</w:t>
             </w:r>
           </w:p>
         </w:tc>
@@ -24177,7 +24177,7 @@
                 <w:sz w:val="18"/>
                 <w:szCs w:val="18"/>
               </w:rPr>
-              <w:t xml:space="preserve">참조 유전체 FASTA. .fai가 없으면 옆에 생성</w:t>
+              <w:t xml:space="preserve">참조 유전체 FASTA. .fai가 없으면 FASTA 옆에 만들므로 그 폴더에 쓰기 권한이 필요. 공유 참조는 .fai를 미리 만들어 둘 것(samtools faidx)</w:t>
             </w:r>
           </w:p>
         </w:tc>
@@ -24197,7 +24197,7 @@
                 <w:sz w:val="18"/>
                 <w:szCs w:val="18"/>
               </w:rPr>
-              <w:t xml:space="preserve">Reference genome FASTA; a missing .fai is created beside it</w:t>
+              <w:t xml:space="preserve">Reference genome FASTA. A missing .fai is created beside the FASTA, so the folder must be writable; prepare the .fai in advance for shared references (samtools faidx)</w:t>
             </w:r>
           </w:p>
         </w:tc>
@@ -31699,7 +31699,7 @@
                 <w:sz w:val="18"/>
                 <w:szCs w:val="18"/>
               </w:rPr>
-              <w:t xml:space="preserve">Tn5 보정 BAM 폴더. ATAC_QC의 output_dir이면 03_shifted_bam에서 찾음</w:t>
+              <w:t xml:space="preserve">Tn5 보정 BAM 폴더. ATAC_QC의 output_dir이면 03_shifted_bam에서 찾음. BAM 인덱스(.bai)가 없으면 BAM 옆에 만들므로 그 폴더에 쓰기 권한이 필요(앞 모듈 결과에는 인덱스가 있음)</w:t>
             </w:r>
           </w:p>
         </w:tc>
@@ -31719,7 +31719,7 @@
                 <w:sz w:val="18"/>
                 <w:szCs w:val="18"/>
               </w:rPr>
-              <w:t xml:space="preserve">Folder of Tn5-shifted BAM files; 03_shifted_bam of an ATAC_QC output_dir</w:t>
+              <w:t xml:space="preserve">Folder of Tn5-shifted BAM files; 03_shifted_bam of an ATAC_QC output_dir. A missing BAM index (.bai) is created beside the BAM, so the folder must be writable (outputs of the previous module already have one)</w:t>
             </w:r>
           </w:p>
         </w:tc>

</xml_diff>

<commit_message>
Read the atac_motif DA table only from input_dir (1.3)
atac_motif.1.3.R takes the differential accessibility table from
input_dir (03_results/diff_accessibility_<norm>.csv of a
differential_accessibility output_dir) and no longer accepts da_csv: a
non-empty da_csv stops the run, an empty one is ignored. The portal
content and Registration.md drop da_csv and point to 1.3.

Co-Authored-By: Claude Opus 5.5 <noreply@anthropic.com>
</commit_message>
<xml_diff>
--- a/docs/ATAC-seq/modules/Portal_Content.docx
+++ b/docs/ATAC-seq/modules/Portal_Content.docx
@@ -19056,7 +19056,7 @@
                 <w:sz w:val="18"/>
                 <w:szCs w:val="18"/>
               </w:rPr>
-              <w:t xml:space="preserve">1.2</w:t>
+              <w:t xml:space="preserve">1.3</w:t>
             </w:r>
           </w:p>
         </w:tc>
@@ -19326,7 +19326,7 @@
                 <w:sz w:val="18"/>
                 <w:szCs w:val="18"/>
               </w:rPr>
-              <w:t xml:space="preserve">atac_motif.1.2.R</w:t>
+              <w:t xml:space="preserve">atac_motif.1.3.R</w:t>
             </w:r>
           </w:p>
         </w:tc>
@@ -19828,7 +19828,7 @@
                 <w:sz w:val="18"/>
                 <w:szCs w:val="18"/>
               </w:rPr>
-              <w:t xml:space="preserve">differential_accessibility의 output_dir. da_csv를 주면 da_csv를 대신 사용</w:t>
+              <w:t xml:space="preserve">differential_accessibility의 output_dir. 그 안의 03_results/diff_accessibility_&lt;norm&gt;.csv를 읽음</w:t>
             </w:r>
           </w:p>
         </w:tc>
@@ -19848,141 +19848,7 @@
                 <w:sz w:val="18"/>
                 <w:szCs w:val="18"/>
               </w:rPr>
-              <w:t xml:space="preserve">differential_accessibility output_dir; da_csv is used instead when given</w:t>
-            </w:r>
-          </w:p>
-        </w:tc>
-      </w:tr>
-      <w:tr>
-        <w:tc>
-          <w:tcPr>
-            <w:tcW w:type="dxa" w:w="920"/>
-            <w:tcMar>
-              <w:top w:type="dxa" w:w="60"/>
-              <w:left w:type="dxa" w:w="90"/>
-              <w:bottom w:type="dxa" w:w="60"/>
-              <w:right w:type="dxa" w:w="90"/>
-            </w:tcMar>
-          </w:tcPr>
-          <w:p>
-            <w:r>
-              <w:rPr>
-                <w:sz w:val="18"/>
-                <w:szCs w:val="18"/>
-              </w:rPr>
-              <w:t xml:space="preserve">Input</w:t>
-            </w:r>
-          </w:p>
-        </w:tc>
-        <w:tc>
-          <w:tcPr>
-            <w:tcW w:type="dxa" w:w="950"/>
-            <w:tcMar>
-              <w:top w:type="dxa" w:w="60"/>
-              <w:left w:type="dxa" w:w="90"/>
-              <w:bottom w:type="dxa" w:w="60"/>
-              <w:right w:type="dxa" w:w="90"/>
-            </w:tcMar>
-          </w:tcPr>
-          <w:p>
-            <w:r>
-              <w:rPr>
-                <w:sz w:val="18"/>
-                <w:szCs w:val="18"/>
-              </w:rPr>
-              <w:t xml:space="preserve">Optional</w:t>
-            </w:r>
-          </w:p>
-        </w:tc>
-        <w:tc>
-          <w:tcPr>
-            <w:tcW w:type="dxa" w:w="950"/>
-            <w:tcMar>
-              <w:top w:type="dxa" w:w="60"/>
-              <w:left w:type="dxa" w:w="90"/>
-              <w:bottom w:type="dxa" w:w="60"/>
-              <w:right w:type="dxa" w:w="90"/>
-            </w:tcMar>
-          </w:tcPr>
-          <w:p>
-            <w:r>
-              <w:rPr>
-                <w:sz w:val="18"/>
-                <w:szCs w:val="18"/>
-              </w:rPr>
-              <w:t xml:space="preserve">File</w:t>
-            </w:r>
-          </w:p>
-        </w:tc>
-        <w:tc>
-          <w:tcPr>
-            <w:tcW w:type="dxa" w:w="1400"/>
-            <w:tcMar>
-              <w:top w:type="dxa" w:w="60"/>
-              <w:left w:type="dxa" w:w="90"/>
-              <w:bottom w:type="dxa" w:w="60"/>
-              <w:right w:type="dxa" w:w="90"/>
-            </w:tcMar>
-          </w:tcPr>
-          <w:p>
-            <w:r>
-              <w:rPr>
-                <w:sz w:val="18"/>
-                <w:szCs w:val="18"/>
-              </w:rPr>
-              <w:t xml:space="preserve">da_csv</w:t>
-            </w:r>
-          </w:p>
-        </w:tc>
-        <w:tc>
-          <w:tcPr>
-            <w:tcW w:type="dxa" w:w="1000"/>
-            <w:tcMar>
-              <w:top w:type="dxa" w:w="60"/>
-              <w:left w:type="dxa" w:w="90"/>
-              <w:bottom w:type="dxa" w:w="60"/>
-              <w:right w:type="dxa" w:w="90"/>
-            </w:tcMar>
-          </w:tcPr>
-          <w:p/>
-        </w:tc>
-        <w:tc>
-          <w:tcPr>
-            <w:tcW w:type="dxa" w:w="2140"/>
-            <w:tcMar>
-              <w:top w:type="dxa" w:w="60"/>
-              <w:left w:type="dxa" w:w="90"/>
-              <w:bottom w:type="dxa" w:w="60"/>
-              <w:right w:type="dxa" w:w="90"/>
-            </w:tcMar>
-          </w:tcPr>
-          <w:p>
-            <w:r>
-              <w:rPr>
-                <w:sz w:val="18"/>
-                <w:szCs w:val="18"/>
-              </w:rPr>
-              <w:t xml:space="preserve">차등 접근성 결과 CSV를 직접 지정</w:t>
-            </w:r>
-          </w:p>
-        </w:tc>
-        <w:tc>
-          <w:tcPr>
-            <w:tcW w:type="dxa" w:w="2146"/>
-            <w:tcMar>
-              <w:top w:type="dxa" w:w="60"/>
-              <w:left w:type="dxa" w:w="90"/>
-              <w:bottom w:type="dxa" w:w="60"/>
-              <w:right w:type="dxa" w:w="90"/>
-            </w:tcMar>
-          </w:tcPr>
-          <w:p>
-            <w:r>
-              <w:rPr>
-                <w:sz w:val="18"/>
-                <w:szCs w:val="18"/>
-              </w:rPr>
-              <w:t xml:space="preserve">Differential accessibility CSV given directly</w:t>
+              <w:t xml:space="preserve">differential_accessibility output_dir; 03_results/diff_accessibility_&lt;norm&gt;.csv inside it is read</w:t>
             </w:r>
           </w:p>
         </w:tc>
@@ -22509,7 +22375,7 @@
           <w:sz w:val="19"/>
           <w:szCs w:val="19"/>
         </w:rPr>
-        <w:t xml:space="preserve">Rscript atac_motif.1.2.R \</w:t>
+        <w:t xml:space="preserve">Rscript atac_motif.1.3.R \</w:t>
       </w:r>
     </w:p>
     <w:p>

</xml_diff>

<commit_message>
Merge tf_footprinting peaks only from macs_dir (1.3)
tf_footprinting.1.3.sh requires macs_dir and always merges the peaks in
it; peak_file is no longer accepted (a non-empty value stops the run,
an empty one is ignored). The portal content and Registration.md drop
peak_file and point to 1.3.

Co-Authored-By: Claude Opus 5.5 <noreply@anthropic.com>
</commit_message>
<xml_diff>
--- a/docs/ATAC-seq/modules/Portal_Content.docx
+++ b/docs/ATAC-seq/modules/Portal_Content.docx
@@ -22961,7 +22961,7 @@
                 <w:sz w:val="18"/>
                 <w:szCs w:val="18"/>
               </w:rPr>
-              <w:t xml:space="preserve">1.2</w:t>
+              <w:t xml:space="preserve">1.3</w:t>
             </w:r>
           </w:p>
         </w:tc>
@@ -23231,7 +23231,7 @@
                 <w:sz w:val="18"/>
                 <w:szCs w:val="18"/>
               </w:rPr>
-              <w:t xml:space="preserve">tf_footprinting.1.2.sh</w:t>
+              <w:t xml:space="preserve">tf_footprinting.1.3.sh</w:t>
             </w:r>
           </w:p>
         </w:tc>
@@ -24327,7 +24327,7 @@
                 <w:sz w:val="18"/>
                 <w:szCs w:val="18"/>
               </w:rPr>
-              <w:t xml:space="preserve">MACS3_callpeak_ATAC의 output_dir. peak_file을 주면 peak_file을 대신 사용</w:t>
+              <w:t xml:space="preserve">MACS3_callpeak_ATAC의 output_dir. 그 안의 샘플별 peak를 합쳐 공통 peak를 만듦</w:t>
             </w:r>
           </w:p>
         </w:tc>
@@ -24347,141 +24347,7 @@
                 <w:sz w:val="18"/>
                 <w:szCs w:val="18"/>
               </w:rPr>
-              <w:t xml:space="preserve">MACS3_callpeak_ATAC output_dir; peak_file is used instead when given</w:t>
-            </w:r>
-          </w:p>
-        </w:tc>
-      </w:tr>
-      <w:tr>
-        <w:tc>
-          <w:tcPr>
-            <w:tcW w:type="dxa" w:w="920"/>
-            <w:tcMar>
-              <w:top w:type="dxa" w:w="60"/>
-              <w:left w:type="dxa" w:w="90"/>
-              <w:bottom w:type="dxa" w:w="60"/>
-              <w:right w:type="dxa" w:w="90"/>
-            </w:tcMar>
-          </w:tcPr>
-          <w:p>
-            <w:r>
-              <w:rPr>
-                <w:sz w:val="18"/>
-                <w:szCs w:val="18"/>
-              </w:rPr>
-              <w:t xml:space="preserve">Input</w:t>
-            </w:r>
-          </w:p>
-        </w:tc>
-        <w:tc>
-          <w:tcPr>
-            <w:tcW w:type="dxa" w:w="950"/>
-            <w:tcMar>
-              <w:top w:type="dxa" w:w="60"/>
-              <w:left w:type="dxa" w:w="90"/>
-              <w:bottom w:type="dxa" w:w="60"/>
-              <w:right w:type="dxa" w:w="90"/>
-            </w:tcMar>
-          </w:tcPr>
-          <w:p>
-            <w:r>
-              <w:rPr>
-                <w:sz w:val="18"/>
-                <w:szCs w:val="18"/>
-              </w:rPr>
-              <w:t xml:space="preserve">Optional</w:t>
-            </w:r>
-          </w:p>
-        </w:tc>
-        <w:tc>
-          <w:tcPr>
-            <w:tcW w:type="dxa" w:w="950"/>
-            <w:tcMar>
-              <w:top w:type="dxa" w:w="60"/>
-              <w:left w:type="dxa" w:w="90"/>
-              <w:bottom w:type="dxa" w:w="60"/>
-              <w:right w:type="dxa" w:w="90"/>
-            </w:tcMar>
-          </w:tcPr>
-          <w:p>
-            <w:r>
-              <w:rPr>
-                <w:sz w:val="18"/>
-                <w:szCs w:val="18"/>
-              </w:rPr>
-              <w:t xml:space="preserve">File</w:t>
-            </w:r>
-          </w:p>
-        </w:tc>
-        <w:tc>
-          <w:tcPr>
-            <w:tcW w:type="dxa" w:w="1400"/>
-            <w:tcMar>
-              <w:top w:type="dxa" w:w="60"/>
-              <w:left w:type="dxa" w:w="90"/>
-              <w:bottom w:type="dxa" w:w="60"/>
-              <w:right w:type="dxa" w:w="90"/>
-            </w:tcMar>
-          </w:tcPr>
-          <w:p>
-            <w:r>
-              <w:rPr>
-                <w:sz w:val="18"/>
-                <w:szCs w:val="18"/>
-              </w:rPr>
-              <w:t xml:space="preserve">peak_file</w:t>
-            </w:r>
-          </w:p>
-        </w:tc>
-        <w:tc>
-          <w:tcPr>
-            <w:tcW w:type="dxa" w:w="1000"/>
-            <w:tcMar>
-              <w:top w:type="dxa" w:w="60"/>
-              <w:left w:type="dxa" w:w="90"/>
-              <w:bottom w:type="dxa" w:w="60"/>
-              <w:right w:type="dxa" w:w="90"/>
-            </w:tcMar>
-          </w:tcPr>
-          <w:p/>
-        </w:tc>
-        <w:tc>
-          <w:tcPr>
-            <w:tcW w:type="dxa" w:w="2140"/>
-            <w:tcMar>
-              <w:top w:type="dxa" w:w="60"/>
-              <w:left w:type="dxa" w:w="90"/>
-              <w:bottom w:type="dxa" w:w="60"/>
-              <w:right w:type="dxa" w:w="90"/>
-            </w:tcMar>
-          </w:tcPr>
-          <w:p>
-            <w:r>
-              <w:rPr>
-                <w:sz w:val="18"/>
-                <w:szCs w:val="18"/>
-              </w:rPr>
-              <w:t xml:space="preserve">미리 합친 공통 peak(BED/narrowPeak/broadPeak)</w:t>
-            </w:r>
-          </w:p>
-        </w:tc>
-        <w:tc>
-          <w:tcPr>
-            <w:tcW w:type="dxa" w:w="2146"/>
-            <w:tcMar>
-              <w:top w:type="dxa" w:w="60"/>
-              <w:left w:type="dxa" w:w="90"/>
-              <w:bottom w:type="dxa" w:w="60"/>
-              <w:right w:type="dxa" w:w="90"/>
-            </w:tcMar>
-          </w:tcPr>
-          <w:p>
-            <w:r>
-              <w:rPr>
-                <w:sz w:val="18"/>
-                <w:szCs w:val="18"/>
-              </w:rPr>
-              <w:t xml:space="preserve">Pre-merged consensus peaks (BED/narrowPeak/broadPeak)</w:t>
+              <w:t xml:space="preserve">MACS3_callpeak_ATAC output_dir; the sample peaks in it are merged into common peaks</w:t>
             </w:r>
           </w:p>
         </w:tc>
@@ -25452,7 +25318,7 @@
           <w:sz w:val="19"/>
           <w:szCs w:val="19"/>
         </w:rPr>
-        <w:t xml:space="preserve">bash tf_footprinting.1.2.sh \</w:t>
+        <w:t xml:space="preserve">bash tf_footprinting.1.3.sh \</w:t>
       </w:r>
     </w:p>
     <w:p>

</xml_diff>

<commit_message>
Take one required input folder in functional_enrichment (1.1)
functional_enrichment.1.1.R reads input_dir only and tells a
peak_annotation output (gene_lists/*.annotated_gene_list.tsv) from a
differential_accessibility output (03_results/diff_accessibility_<norm>
.csv) by its files. gene_file, da_dir, da_file and go_table are no
longer accepted (a non-empty value stops the run); genome_gff and
orgdb_file are required. Run in a Codespace image on both kinds of
input: enrichment results match 1.0. The portal content, the example
and Registration.md follow 1.1.

Co-Authored-By: Claude Opus 5.5 <noreply@anthropic.com>
</commit_message>
<xml_diff>
--- a/docs/ATAC-seq/modules/Portal_Content.docx
+++ b/docs/ATAC-seq/modules/Portal_Content.docx
@@ -25803,7 +25803,7 @@
                 <w:sz w:val="18"/>
                 <w:szCs w:val="18"/>
               </w:rPr>
-              <w:t xml:space="preserve">1.0</w:t>
+              <w:t xml:space="preserve">1.1</w:t>
             </w:r>
           </w:p>
         </w:tc>
@@ -26073,7 +26073,7 @@
                 <w:sz w:val="18"/>
                 <w:szCs w:val="18"/>
               </w:rPr>
-              <w:t xml:space="preserve">functional_enrichment.1.0.R</w:t>
+              <w:t xml:space="preserve">functional_enrichment.1.1.R</w:t>
             </w:r>
           </w:p>
         </w:tc>
@@ -26187,7 +26187,7 @@
         <w:spacing w:after="80"/>
       </w:pPr>
       <w:r>
-        <w:t xml:space="preserve">peak_annotation 결과(input_dir)를 주면 샘플별 연관 유전자 목록을 분석합니다.</w:t>
+        <w:t xml:space="preserve">앞 모듈의 결과 폴더(input_dir)를 받아, 안의 파일을 보고 어떤 결과인지 스스로 판단합니다.</w:t>
       </w:r>
     </w:p>
     <w:p>
@@ -26200,7 +26200,7 @@
         <w:spacing w:after="80"/>
       </w:pPr>
       <w:r>
-        <w:t xml:space="preserve">differential_accessibility 결과(da_dir)를 주면 peak마다 가장 가까운 유전자를 찾아 접근성 증가(up)·감소(down) 유전자 목록을 분석합니다.</w:t>
+        <w:t xml:space="preserve">peak_annotation 결과이면 샘플별 연관 유전자 목록을 분석합니다.</w:t>
       </w:r>
     </w:p>
     <w:p>
@@ -26213,7 +26213,7 @@
         <w:spacing w:after="80"/>
       </w:pPr>
       <w:r>
-        <w:t xml:space="preserve">종별 OrgDb 파일 또는 유전자–GO 대응표(GAF 등)를 사용하며, 유전자 ID 종류는 자동으로 맞춥니다.</w:t>
+        <w:t xml:space="preserve">differential_accessibility 결과이면 peak마다 가장 가까운 유전자를 찾아 접근성 증가(up)·감소(down) 유전자 목록을 분석합니다.</w:t>
       </w:r>
     </w:p>
     <w:p>
@@ -26226,30 +26226,7 @@
         <w:spacing w:after="80"/>
       </w:pPr>
       <w:r>
-        <w:t xml:space="preserve">GO 항목별 결과표와 dotplot, barplot을 만듭니다.</w:t>
-      </w:r>
-    </w:p>
-    <w:p>
-      <w:pPr>
-        <w:spacing w:after="100" w:before="200"/>
-      </w:pPr>
-      <w:r>
-        <w:rPr>
-          <w:b/>
-          <w:bCs/>
-          <w:color w:val="3A3A3A"/>
-          <w:sz w:val="24"/>
-          <w:szCs w:val="24"/>
-        </w:rPr>
-        <w:t xml:space="preserve">내용(영문)</w:t>
-      </w:r>
-    </w:p>
-    <w:p>
-      <w:pPr>
-        <w:spacing w:after="140"/>
-      </w:pPr>
-      <w:r>
-        <w:t xml:space="preserve">Analyzes with clusterProfiler which biological functions (GO) are enriched among genes near open regions or regions with changed accessibility.</w:t>
+        <w:t xml:space="preserve">종별 OrgDb 파일을 사용하며, 유전자 ID 종류는 자동으로 맞춥니다.</w:t>
       </w:r>
     </w:p>
     <w:p>
@@ -26262,7 +26239,30 @@
         <w:spacing w:after="80"/>
       </w:pPr>
       <w:r>
-        <w:t xml:space="preserve">With a peak_annotation output (input_dir), the gene list of each sample is analyzed.</w:t>
+        <w:t xml:space="preserve">GO 항목별 결과표와 dotplot, barplot을 만듭니다.</w:t>
+      </w:r>
+    </w:p>
+    <w:p>
+      <w:pPr>
+        <w:spacing w:after="100" w:before="200"/>
+      </w:pPr>
+      <w:r>
+        <w:rPr>
+          <w:b/>
+          <w:bCs/>
+          <w:color w:val="3A3A3A"/>
+          <w:sz w:val="24"/>
+          <w:szCs w:val="24"/>
+        </w:rPr>
+        <w:t xml:space="preserve">내용(영문)</w:t>
+      </w:r>
+    </w:p>
+    <w:p>
+      <w:pPr>
+        <w:spacing w:after="140"/>
+      </w:pPr>
+      <w:r>
+        <w:t xml:space="preserve">Analyzes with clusterProfiler which biological functions (GO) are enriched among genes near open regions or regions with changed accessibility.</w:t>
       </w:r>
     </w:p>
     <w:p>
@@ -26275,7 +26275,7 @@
         <w:spacing w:after="80"/>
       </w:pPr>
       <w:r>
-        <w:t xml:space="preserve">With a differential_accessibility output (da_dir), each peak is assigned to the nearest gene and the up and down gene lists are analyzed.</w:t>
+        <w:t xml:space="preserve">The output folder of the previous module (input_dir) is read, and its contents tell which module produced it.</w:t>
       </w:r>
     </w:p>
     <w:p>
@@ -26288,7 +26288,33 @@
         <w:spacing w:after="80"/>
       </w:pPr>
       <w:r>
-        <w:t xml:space="preserve">An OrgDb file for the species or a gene-to-GO table (GAF and others) is used, and the gene ID type is matched automatically.</w:t>
+        <w:t xml:space="preserve">For a peak_annotation output, the gene list of each sample is analyzed.</w:t>
+      </w:r>
+    </w:p>
+    <w:p>
+      <w:pPr>
+        <w:pStyle w:val="ListParagraph"/>
+        <w:numPr>
+          <w:ilvl w:val="0"/>
+          <w:numId w:val="2"/>
+        </w:numPr>
+        <w:spacing w:after="80"/>
+      </w:pPr>
+      <w:r>
+        <w:t xml:space="preserve">For a differential_accessibility output, each peak is assigned to the nearest gene and the up and down gene lists are analyzed.</w:t>
+      </w:r>
+    </w:p>
+    <w:p>
+      <w:pPr>
+        <w:pStyle w:val="ListParagraph"/>
+        <w:numPr>
+          <w:ilvl w:val="0"/>
+          <w:numId w:val="2"/>
+        </w:numPr>
+        <w:spacing w:after="80"/>
+      </w:pPr>
+      <w:r>
+        <w:t xml:space="preserve">An OrgDb file for the species is used, and the gene ID type is matched automatically.</w:t>
       </w:r>
     </w:p>
     <w:p>
@@ -26547,7 +26573,7 @@
                 <w:sz w:val="18"/>
                 <w:szCs w:val="18"/>
               </w:rPr>
-              <w:t xml:space="preserve">Optional</w:t>
+              <w:t xml:space="preserve">Required</w:t>
             </w:r>
           </w:p>
         </w:tc>
@@ -26601,7 +26627,15 @@
               <w:right w:type="dxa" w:w="90"/>
             </w:tcMar>
           </w:tcPr>
-          <w:p/>
+          <w:p>
+            <w:r>
+              <w:rPr>
+                <w:sz w:val="18"/>
+                <w:szCs w:val="18"/>
+              </w:rPr>
+              <w:t xml:space="preserve">/data/peak_annotation</w:t>
+            </w:r>
+          </w:p>
         </w:tc>
         <w:tc>
           <w:tcPr>
@@ -26619,7 +26653,7 @@
                 <w:sz w:val="18"/>
                 <w:szCs w:val="18"/>
               </w:rPr>
-              <w:t xml:space="preserve">peak_annotation의 output_dir. 아래 4개 입력 중 하나만</w:t>
+              <w:t xml:space="preserve">앞 모듈의 output_dir. peak_annotation(gene_lists/*.annotated_gene_list.tsv) 또는 differential_accessibility(03_results/diff_accessibility_&lt;da_norm&gt;.csv) 결과를 안의 파일로 구분</w:t>
             </w:r>
           </w:p>
         </w:tc>
@@ -26639,7 +26673,7 @@
                 <w:sz w:val="18"/>
                 <w:szCs w:val="18"/>
               </w:rPr>
-              <w:t xml:space="preserve">peak_annotation output_dir; give only one of the four inputs</w:t>
+              <w:t xml:space="preserve">Output_dir of the previous module: a peak_annotation (gene_lists/*.annotated_gene_list.tsv) or differential_accessibility (03_results/diff_accessibility_&lt;da_norm&gt;.csv) output, told apart by its files</w:t>
             </w:r>
           </w:p>
         </w:tc>
@@ -26681,7 +26715,7 @@
                 <w:sz w:val="18"/>
                 <w:szCs w:val="18"/>
               </w:rPr>
-              <w:t xml:space="preserve">Optional</w:t>
+              <w:t xml:space="preserve">Required</w:t>
             </w:r>
           </w:p>
         </w:tc>
@@ -26721,7 +26755,7 @@
                 <w:sz w:val="18"/>
                 <w:szCs w:val="18"/>
               </w:rPr>
-              <w:t xml:space="preserve">gene_file</w:t>
+              <w:t xml:space="preserve">genome_gff</w:t>
             </w:r>
           </w:p>
         </w:tc>
@@ -26735,7 +26769,15 @@
               <w:right w:type="dxa" w:w="90"/>
             </w:tcMar>
           </w:tcPr>
-          <w:p/>
+          <w:p>
+            <w:r>
+              <w:rPr>
+                <w:sz w:val="18"/>
+                <w:szCs w:val="18"/>
+              </w:rPr>
+              <w:t xml:space="preserve">/ref/genes.gff3</w:t>
+            </w:r>
+          </w:p>
         </w:tc>
         <w:tc>
           <w:tcPr>
@@ -26753,7 +26795,7 @@
                 <w:sz w:val="18"/>
                 <w:szCs w:val="18"/>
               </w:rPr>
-              <w:t xml:space="preserve">유전자 목록 파일 하나</w:t>
+              <w:t xml:space="preserve">유전자 주석 GFF3/GTF. differential_accessibility 결과일 때 peak를 가장 가까운 유전자에 연결하는 데 사용(peak_annotation 결과면 쓰지 않음)</w:t>
             </w:r>
           </w:p>
         </w:tc>
@@ -26773,7 +26815,7 @@
                 <w:sz w:val="18"/>
                 <w:szCs w:val="18"/>
               </w:rPr>
-              <w:t xml:space="preserve">One gene list file</w:t>
+              <w:t xml:space="preserve">Gene annotation GFF3/GTF, used to link differential peaks to their nearest genes (not used for a peak_annotation output)</w:t>
             </w:r>
           </w:p>
         </w:tc>
@@ -26815,7 +26857,7 @@
                 <w:sz w:val="18"/>
                 <w:szCs w:val="18"/>
               </w:rPr>
-              <w:t xml:space="preserve">Optional</w:t>
+              <w:t xml:space="preserve">Required</w:t>
             </w:r>
           </w:p>
         </w:tc>
@@ -26835,7 +26877,7 @@
                 <w:sz w:val="18"/>
                 <w:szCs w:val="18"/>
               </w:rPr>
-              <w:t xml:space="preserve">Directory</w:t>
+              <w:t xml:space="preserve">File</w:t>
             </w:r>
           </w:p>
         </w:tc>
@@ -26855,7 +26897,7 @@
                 <w:sz w:val="18"/>
                 <w:szCs w:val="18"/>
               </w:rPr>
-              <w:t xml:space="preserve">da_dir</w:t>
+              <w:t xml:space="preserve">orgdb_file</w:t>
             </w:r>
           </w:p>
         </w:tc>
@@ -26869,7 +26911,15 @@
               <w:right w:type="dxa" w:w="90"/>
             </w:tcMar>
           </w:tcPr>
-          <w:p/>
+          <w:p>
+            <w:r>
+              <w:rPr>
+                <w:sz w:val="18"/>
+                <w:szCs w:val="18"/>
+              </w:rPr>
+              <w:t xml:space="preserve">/ref/OrgDb/Arabidopsis_thaliana.AH121945.OrgDb.sqlite</w:t>
+            </w:r>
+          </w:p>
         </w:tc>
         <w:tc>
           <w:tcPr>
@@ -26887,7 +26937,7 @@
                 <w:sz w:val="18"/>
                 <w:szCs w:val="18"/>
               </w:rPr>
-              <w:t xml:space="preserve">differential_accessibility의 output_dir</w:t>
+              <w:t xml:space="preserve">분석 종의 OrgDb SQLite 파일(tools/download_orgdb.R로 저장)</w:t>
             </w:r>
           </w:p>
         </w:tc>
@@ -26907,7 +26957,7 @@
                 <w:sz w:val="18"/>
                 <w:szCs w:val="18"/>
               </w:rPr>
-              <w:t xml:space="preserve">differential_accessibility output_dir</w:t>
+              <w:t xml:space="preserve">OrgDb SQLite file of the species (saved with tools/download_orgdb.R)</w:t>
             </w:r>
           </w:p>
         </w:tc>
@@ -26929,7 +26979,7 @@
                 <w:sz w:val="18"/>
                 <w:szCs w:val="18"/>
               </w:rPr>
-              <w:t xml:space="preserve">Input</w:t>
+              <w:t xml:space="preserve">Output</w:t>
             </w:r>
           </w:p>
         </w:tc>
@@ -26949,7 +26999,7 @@
                 <w:sz w:val="18"/>
                 <w:szCs w:val="18"/>
               </w:rPr>
-              <w:t xml:space="preserve">Optional</w:t>
+              <w:t xml:space="preserve">Required</w:t>
             </w:r>
           </w:p>
         </w:tc>
@@ -26969,7 +27019,7 @@
                 <w:sz w:val="18"/>
                 <w:szCs w:val="18"/>
               </w:rPr>
-              <w:t xml:space="preserve">File</w:t>
+              <w:t xml:space="preserve">Directory</w:t>
             </w:r>
           </w:p>
         </w:tc>
@@ -26989,7 +27039,7 @@
                 <w:sz w:val="18"/>
                 <w:szCs w:val="18"/>
               </w:rPr>
-              <w:t xml:space="preserve">da_file</w:t>
+              <w:t xml:space="preserve">output_dir</w:t>
             </w:r>
           </w:p>
         </w:tc>
@@ -27003,7 +27053,15 @@
               <w:right w:type="dxa" w:w="90"/>
             </w:tcMar>
           </w:tcPr>
-          <w:p/>
+          <w:p>
+            <w:r>
+              <w:rPr>
+                <w:sz w:val="18"/>
+                <w:szCs w:val="18"/>
+              </w:rPr>
+              <w:t xml:space="preserve">/data/functional_enrichment</w:t>
+            </w:r>
+          </w:p>
         </w:tc>
         <w:tc>
           <w:tcPr>
@@ -27021,7 +27079,7 @@
                 <w:sz w:val="18"/>
                 <w:szCs w:val="18"/>
               </w:rPr>
-              <w:t xml:space="preserve">차등 접근성 결과 파일 하나(seqnames/chr, start, end, logFC, FDR)</w:t>
+              <w:t xml:space="preserve">결과 폴더</w:t>
             </w:r>
           </w:p>
         </w:tc>
@@ -27041,7 +27099,7 @@
                 <w:sz w:val="18"/>
                 <w:szCs w:val="18"/>
               </w:rPr>
-              <w:t xml:space="preserve">One differential accessibility table (seqnames/chr, start, end, logFC, FDR)</w:t>
+              <w:t xml:space="preserve">Output folder</w:t>
             </w:r>
           </w:p>
         </w:tc>
@@ -27063,7 +27121,7 @@
                 <w:sz w:val="18"/>
                 <w:szCs w:val="18"/>
               </w:rPr>
-              <w:t xml:space="preserve">Input</w:t>
+              <w:t xml:space="preserve">Option</w:t>
             </w:r>
           </w:p>
         </w:tc>
@@ -27103,7 +27161,7 @@
                 <w:sz w:val="18"/>
                 <w:szCs w:val="18"/>
               </w:rPr>
-              <w:t xml:space="preserve">File</w:t>
+              <w:t xml:space="preserve">String</w:t>
             </w:r>
           </w:p>
         </w:tc>
@@ -27123,7 +27181,7 @@
                 <w:sz w:val="18"/>
                 <w:szCs w:val="18"/>
               </w:rPr>
-              <w:t xml:space="preserve">genome_gff</w:t>
+              <w:t xml:space="preserve">gene_keytype</w:t>
             </w:r>
           </w:p>
         </w:tc>
@@ -27137,7 +27195,15 @@
               <w:right w:type="dxa" w:w="90"/>
             </w:tcMar>
           </w:tcPr>
-          <w:p/>
+          <w:p>
+            <w:r>
+              <w:rPr>
+                <w:sz w:val="18"/>
+                <w:szCs w:val="18"/>
+              </w:rPr>
+              <w:t xml:space="preserve">auto</w:t>
+            </w:r>
+          </w:p>
         </w:tc>
         <w:tc>
           <w:tcPr>
@@ -27155,7 +27221,7 @@
                 <w:sz w:val="18"/>
                 <w:szCs w:val="18"/>
               </w:rPr>
-              <w:t xml:space="preserve">da_dir/da_file일 때 필수. 유전자 주석 GFF3/GTF</w:t>
+              <w:t xml:space="preserve">OrgDb ID 종류(TAIR, ENTREZID, SYMBOL 등). auto는 자동 선택</w:t>
             </w:r>
           </w:p>
         </w:tc>
@@ -27175,7 +27241,7 @@
                 <w:sz w:val="18"/>
                 <w:szCs w:val="18"/>
               </w:rPr>
-              <w:t xml:space="preserve">Required with da_dir/da_file: gene annotation GFF3/GTF</w:t>
+              <w:t xml:space="preserve">OrgDb key type (TAIR, ENTREZID, SYMBOL, ...); auto selects it</w:t>
             </w:r>
           </w:p>
         </w:tc>
@@ -27197,7 +27263,7 @@
                 <w:sz w:val="18"/>
                 <w:szCs w:val="18"/>
               </w:rPr>
-              <w:t xml:space="preserve">Input</w:t>
+              <w:t xml:space="preserve">Option</w:t>
             </w:r>
           </w:p>
         </w:tc>
@@ -27237,7 +27303,7 @@
                 <w:sz w:val="18"/>
                 <w:szCs w:val="18"/>
               </w:rPr>
-              <w:t xml:space="preserve">File</w:t>
+              <w:t xml:space="preserve">List</w:t>
             </w:r>
           </w:p>
         </w:tc>
@@ -27257,7 +27323,7 @@
                 <w:sz w:val="18"/>
                 <w:szCs w:val="18"/>
               </w:rPr>
-              <w:t xml:space="preserve">orgdb_file</w:t>
+              <w:t xml:space="preserve">ont</w:t>
             </w:r>
           </w:p>
         </w:tc>
@@ -27271,7 +27337,15 @@
               <w:right w:type="dxa" w:w="90"/>
             </w:tcMar>
           </w:tcPr>
-          <w:p/>
+          <w:p>
+            <w:r>
+              <w:rPr>
+                <w:sz w:val="18"/>
+                <w:szCs w:val="18"/>
+              </w:rPr>
+              <w:t xml:space="preserve">BP</w:t>
+            </w:r>
+          </w:p>
         </w:tc>
         <w:tc>
           <w:tcPr>
@@ -27289,7 +27363,7 @@
                 <w:sz w:val="18"/>
                 <w:szCs w:val="18"/>
               </w:rPr>
-              <w:t xml:space="preserve">OrgDb SQLite 파일. go_table과 둘 중 하나</w:t>
+              <w:t xml:space="preserve">GO 분류(BP, MF, CC, ALL)</w:t>
             </w:r>
           </w:p>
         </w:tc>
@@ -27309,7 +27383,7 @@
                 <w:sz w:val="18"/>
                 <w:szCs w:val="18"/>
               </w:rPr>
-              <w:t xml:space="preserve">OrgDb SQLite file; one of orgdb_file or go_table</w:t>
+              <w:t xml:space="preserve">GO ontology (BP, MF, CC, ALL)</w:t>
             </w:r>
           </w:p>
         </w:tc>
@@ -27331,7 +27405,7 @@
                 <w:sz w:val="18"/>
                 <w:szCs w:val="18"/>
               </w:rPr>
-              <w:t xml:space="preserve">Input</w:t>
+              <w:t xml:space="preserve">Option</w:t>
             </w:r>
           </w:p>
         </w:tc>
@@ -27371,7 +27445,7 @@
                 <w:sz w:val="18"/>
                 <w:szCs w:val="18"/>
               </w:rPr>
-              <w:t xml:space="preserve">File</w:t>
+              <w:t xml:space="preserve">String</w:t>
             </w:r>
           </w:p>
         </w:tc>
@@ -27391,7 +27465,7 @@
                 <w:sz w:val="18"/>
                 <w:szCs w:val="18"/>
               </w:rPr>
-              <w:t xml:space="preserve">go_table</w:t>
+              <w:t xml:space="preserve">max_distance_to_tss</w:t>
             </w:r>
           </w:p>
         </w:tc>
@@ -27405,7 +27479,15 @@
               <w:right w:type="dxa" w:w="90"/>
             </w:tcMar>
           </w:tcPr>
-          <w:p/>
+          <w:p>
+            <w:r>
+              <w:rPr>
+                <w:sz w:val="18"/>
+                <w:szCs w:val="18"/>
+              </w:rPr>
+              <w:t xml:space="preserve">3000</w:t>
+            </w:r>
+          </w:p>
         </w:tc>
         <w:tc>
           <w:tcPr>
@@ -27423,7 +27505,7 @@
                 <w:sz w:val="18"/>
                 <w:szCs w:val="18"/>
               </w:rPr>
-              <w:t xml:space="preserve">유전자–GO 대응표(GAF/TSV/CSV)</w:t>
+              <w:t xml:space="preserve">TSS에서 이 거리(bp) 안의 peak에 연결된 유전자만 사용. NA는 전부</w:t>
             </w:r>
           </w:p>
         </w:tc>
@@ -27443,7 +27525,7 @@
                 <w:sz w:val="18"/>
                 <w:szCs w:val="18"/>
               </w:rPr>
-              <w:t xml:space="preserve">Gene-to-GO table (GAF/TSV/CSV)</w:t>
+              <w:t xml:space="preserve">Use genes whose peak is within this distance of the TSS (bp); NA uses all</w:t>
             </w:r>
           </w:p>
         </w:tc>
@@ -27465,7 +27547,7 @@
                 <w:sz w:val="18"/>
                 <w:szCs w:val="18"/>
               </w:rPr>
-              <w:t xml:space="preserve">Output</w:t>
+              <w:t xml:space="preserve">Option</w:t>
             </w:r>
           </w:p>
         </w:tc>
@@ -27485,7 +27567,7 @@
                 <w:sz w:val="18"/>
                 <w:szCs w:val="18"/>
               </w:rPr>
-              <w:t xml:space="preserve">Required</w:t>
+              <w:t xml:space="preserve">Optional</w:t>
             </w:r>
           </w:p>
         </w:tc>
@@ -27505,7 +27587,7 @@
                 <w:sz w:val="18"/>
                 <w:szCs w:val="18"/>
               </w:rPr>
-              <w:t xml:space="preserve">Directory</w:t>
+              <w:t xml:space="preserve">String</w:t>
             </w:r>
           </w:p>
         </w:tc>
@@ -27525,7 +27607,7 @@
                 <w:sz w:val="18"/>
                 <w:szCs w:val="18"/>
               </w:rPr>
-              <w:t xml:space="preserve">output_dir</w:t>
+              <w:t xml:space="preserve">universe</w:t>
             </w:r>
           </w:p>
         </w:tc>
@@ -27545,7 +27627,7 @@
                 <w:sz w:val="18"/>
                 <w:szCs w:val="18"/>
               </w:rPr>
-              <w:t xml:space="preserve">/data/functional_enrichment</w:t>
+              <w:t xml:space="preserve">auto</w:t>
             </w:r>
           </w:p>
         </w:tc>
@@ -27565,7 +27647,7 @@
                 <w:sz w:val="18"/>
                 <w:szCs w:val="18"/>
               </w:rPr>
-              <w:t xml:space="preserve">결과 폴더</w:t>
+              <w:t xml:space="preserve">배경 유전자(auto, all, 또는 파일 경로)</w:t>
             </w:r>
           </w:p>
         </w:tc>
@@ -27585,7 +27667,7 @@
                 <w:sz w:val="18"/>
                 <w:szCs w:val="18"/>
               </w:rPr>
-              <w:t xml:space="preserve">Output folder</w:t>
+              <w:t xml:space="preserve">Background genes (auto, all, or a file path)</w:t>
             </w:r>
           </w:p>
         </w:tc>
@@ -27647,7 +27729,7 @@
                 <w:sz w:val="18"/>
                 <w:szCs w:val="18"/>
               </w:rPr>
-              <w:t xml:space="preserve">String</w:t>
+              <w:t xml:space="preserve">Float</w:t>
             </w:r>
           </w:p>
         </w:tc>
@@ -27667,7 +27749,7 @@
                 <w:sz w:val="18"/>
                 <w:szCs w:val="18"/>
               </w:rPr>
-              <w:t xml:space="preserve">gene_keytype</w:t>
+              <w:t xml:space="preserve">pvalue_cutoff</w:t>
             </w:r>
           </w:p>
         </w:tc>
@@ -27687,7 +27769,7 @@
                 <w:sz w:val="18"/>
                 <w:szCs w:val="18"/>
               </w:rPr>
-              <w:t xml:space="preserve">auto</w:t>
+              <w:t xml:space="preserve">0.05</w:t>
             </w:r>
           </w:p>
         </w:tc>
@@ -27707,7 +27789,7 @@
                 <w:sz w:val="18"/>
                 <w:szCs w:val="18"/>
               </w:rPr>
-              <w:t xml:space="preserve">OrgDb ID 종류(TAIR, ENTREZID, SYMBOL 등). auto는 자동 선택</w:t>
+              <w:t xml:space="preserve">유의 GO 항목의 조정 p-value(p.adjust) 기준. p_adjust_method로 보정한 값에 적용</w:t>
             </w:r>
           </w:p>
         </w:tc>
@@ -27727,7 +27809,7 @@
                 <w:sz w:val="18"/>
                 <w:szCs w:val="18"/>
               </w:rPr>
-              <w:t xml:space="preserve">OrgDb key type (TAIR, ENTREZID, SYMBOL, ...); auto selects it</w:t>
+              <w:t xml:space="preserve">Adjusted p-value (p.adjust) cutoff for significant GO terms, after p_adjust_method</w:t>
             </w:r>
           </w:p>
         </w:tc>
@@ -27789,7 +27871,7 @@
                 <w:sz w:val="18"/>
                 <w:szCs w:val="18"/>
               </w:rPr>
-              <w:t xml:space="preserve">List</w:t>
+              <w:t xml:space="preserve">Float</w:t>
             </w:r>
           </w:p>
         </w:tc>
@@ -27809,7 +27891,7 @@
                 <w:sz w:val="18"/>
                 <w:szCs w:val="18"/>
               </w:rPr>
-              <w:t xml:space="preserve">ont</w:t>
+              <w:t xml:space="preserve">qvalue_cutoff</w:t>
             </w:r>
           </w:p>
         </w:tc>
@@ -27829,7 +27911,7 @@
                 <w:sz w:val="18"/>
                 <w:szCs w:val="18"/>
               </w:rPr>
-              <w:t xml:space="preserve">BP</w:t>
+              <w:t xml:space="preserve">0.2</w:t>
             </w:r>
           </w:p>
         </w:tc>
@@ -27849,7 +27931,7 @@
                 <w:sz w:val="18"/>
                 <w:szCs w:val="18"/>
               </w:rPr>
-              <w:t xml:space="preserve">GO 분류(BP, MF, CC, ALL)</w:t>
+              <w:t xml:space="preserve">유의 GO 항목의 q-value 기준. pvalue_cutoff와 둘 다 만족해야 유의</w:t>
             </w:r>
           </w:p>
         </w:tc>
@@ -27869,7 +27951,7 @@
                 <w:sz w:val="18"/>
                 <w:szCs w:val="18"/>
               </w:rPr>
-              <w:t xml:space="preserve">GO ontology (BP, MF, CC, ALL)</w:t>
+              <w:t xml:space="preserve">q-value cutoff for significant GO terms; a term must pass both this and pvalue_cutoff</w:t>
             </w:r>
           </w:p>
         </w:tc>
@@ -27931,7 +28013,7 @@
                 <w:sz w:val="18"/>
                 <w:szCs w:val="18"/>
               </w:rPr>
-              <w:t xml:space="preserve">String</w:t>
+              <w:t xml:space="preserve">List</w:t>
             </w:r>
           </w:p>
         </w:tc>
@@ -27951,7 +28033,7 @@
                 <w:sz w:val="18"/>
                 <w:szCs w:val="18"/>
               </w:rPr>
-              <w:t xml:space="preserve">max_distance_to_tss</w:t>
+              <w:t xml:space="preserve">p_adjust_method</w:t>
             </w:r>
           </w:p>
         </w:tc>
@@ -27971,7 +28053,7 @@
                 <w:sz w:val="18"/>
                 <w:szCs w:val="18"/>
               </w:rPr>
-              <w:t xml:space="preserve">3000</w:t>
+              <w:t xml:space="preserve">BH</w:t>
             </w:r>
           </w:p>
         </w:tc>
@@ -27991,7 +28073,7 @@
                 <w:sz w:val="18"/>
                 <w:szCs w:val="18"/>
               </w:rPr>
-              <w:t xml:space="preserve">TSS에서 이 거리(bp) 안의 peak에 연결된 유전자만 사용. NA는 전부</w:t>
+              <w:t xml:space="preserve">다중검정 보정(BH, bonferroni, holm, hochberg, hommel, BY, fdr, none)</w:t>
             </w:r>
           </w:p>
         </w:tc>
@@ -28011,7 +28093,7 @@
                 <w:sz w:val="18"/>
                 <w:szCs w:val="18"/>
               </w:rPr>
-              <w:t xml:space="preserve">Use genes whose peak is within this distance of the TSS (bp); NA uses all</w:t>
+              <w:t xml:space="preserve">Multiple testing correction (BH, bonferroni, holm, hochberg, hommel, BY, fdr, none)</w:t>
             </w:r>
           </w:p>
         </w:tc>
@@ -28073,7 +28155,7 @@
                 <w:sz w:val="18"/>
                 <w:szCs w:val="18"/>
               </w:rPr>
-              <w:t xml:space="preserve">String</w:t>
+              <w:t xml:space="preserve">Integer</w:t>
             </w:r>
           </w:p>
         </w:tc>
@@ -28093,7 +28175,7 @@
                 <w:sz w:val="18"/>
                 <w:szCs w:val="18"/>
               </w:rPr>
-              <w:t xml:space="preserve">universe</w:t>
+              <w:t xml:space="preserve">min_gs_size</w:t>
             </w:r>
           </w:p>
         </w:tc>
@@ -28113,7 +28195,7 @@
                 <w:sz w:val="18"/>
                 <w:szCs w:val="18"/>
               </w:rPr>
-              <w:t xml:space="preserve">auto</w:t>
+              <w:t xml:space="preserve">10</w:t>
             </w:r>
           </w:p>
         </w:tc>
@@ -28133,7 +28215,7 @@
                 <w:sz w:val="18"/>
                 <w:szCs w:val="18"/>
               </w:rPr>
-              <w:t xml:space="preserve">배경 유전자(auto, all, 또는 파일 경로)</w:t>
+              <w:t xml:space="preserve">GO 항목 최소 유전자 수</w:t>
             </w:r>
           </w:p>
         </w:tc>
@@ -28153,7 +28235,7 @@
                 <w:sz w:val="18"/>
                 <w:szCs w:val="18"/>
               </w:rPr>
-              <w:t xml:space="preserve">Background genes (auto, all, or a file path)</w:t>
+              <w:t xml:space="preserve">Minimum genes per GO term</w:t>
             </w:r>
           </w:p>
         </w:tc>
@@ -28215,7 +28297,7 @@
                 <w:sz w:val="18"/>
                 <w:szCs w:val="18"/>
               </w:rPr>
-              <w:t xml:space="preserve">Float</w:t>
+              <w:t xml:space="preserve">Integer</w:t>
             </w:r>
           </w:p>
         </w:tc>
@@ -28235,7 +28317,7 @@
                 <w:sz w:val="18"/>
                 <w:szCs w:val="18"/>
               </w:rPr>
-              <w:t xml:space="preserve">pvalue_cutoff</w:t>
+              <w:t xml:space="preserve">max_gs_size</w:t>
             </w:r>
           </w:p>
         </w:tc>
@@ -28255,7 +28337,7 @@
                 <w:sz w:val="18"/>
                 <w:szCs w:val="18"/>
               </w:rPr>
-              <w:t xml:space="preserve">0.05</w:t>
+              <w:t xml:space="preserve">500</w:t>
             </w:r>
           </w:p>
         </w:tc>
@@ -28275,7 +28357,7 @@
                 <w:sz w:val="18"/>
                 <w:szCs w:val="18"/>
               </w:rPr>
-              <w:t xml:space="preserve">유의 GO 항목의 조정 p-value(p.adjust) 기준. p_adjust_method로 보정한 값에 적용</w:t>
+              <w:t xml:space="preserve">GO 항목 최대 유전자 수</w:t>
             </w:r>
           </w:p>
         </w:tc>
@@ -28295,7 +28377,7 @@
                 <w:sz w:val="18"/>
                 <w:szCs w:val="18"/>
               </w:rPr>
-              <w:t xml:space="preserve">Adjusted p-value (p.adjust) cutoff for significant GO terms, after p_adjust_method</w:t>
+              <w:t xml:space="preserve">Maximum genes per GO term</w:t>
             </w:r>
           </w:p>
         </w:tc>
@@ -28377,7 +28459,7 @@
                 <w:sz w:val="18"/>
                 <w:szCs w:val="18"/>
               </w:rPr>
-              <w:t xml:space="preserve">qvalue_cutoff</w:t>
+              <w:t xml:space="preserve">min_mapped_fraction</w:t>
             </w:r>
           </w:p>
         </w:tc>
@@ -28397,7 +28479,7 @@
                 <w:sz w:val="18"/>
                 <w:szCs w:val="18"/>
               </w:rPr>
-              <w:t xml:space="preserve">0.2</w:t>
+              <w:t xml:space="preserve">0.5</w:t>
             </w:r>
           </w:p>
         </w:tc>
@@ -28417,7 +28499,7 @@
                 <w:sz w:val="18"/>
                 <w:szCs w:val="18"/>
               </w:rPr>
-              <w:t xml:space="preserve">유의 GO 항목의 q-value 기준. pvalue_cutoff와 둘 다 만족해야 유의</w:t>
+              <w:t xml:space="preserve">주석에서 찾은 ID 비율이 이보다 낮으면 중단</w:t>
             </w:r>
           </w:p>
         </w:tc>
@@ -28437,7 +28519,7 @@
                 <w:sz w:val="18"/>
                 <w:szCs w:val="18"/>
               </w:rPr>
-              <w:t xml:space="preserve">q-value cutoff for significant GO terms; a term must pass both this and pvalue_cutoff</w:t>
+              <w:t xml:space="preserve">Stop if fewer IDs than this fraction are found in the annotation</w:t>
             </w:r>
           </w:p>
         </w:tc>
@@ -28499,7 +28581,7 @@
                 <w:sz w:val="18"/>
                 <w:szCs w:val="18"/>
               </w:rPr>
-              <w:t xml:space="preserve">List</w:t>
+              <w:t xml:space="preserve">Integer</w:t>
             </w:r>
           </w:p>
         </w:tc>
@@ -28519,7 +28601,7 @@
                 <w:sz w:val="18"/>
                 <w:szCs w:val="18"/>
               </w:rPr>
-              <w:t xml:space="preserve">p_adjust_method</w:t>
+              <w:t xml:space="preserve">show_category</w:t>
             </w:r>
           </w:p>
         </w:tc>
@@ -28539,7 +28621,7 @@
                 <w:sz w:val="18"/>
                 <w:szCs w:val="18"/>
               </w:rPr>
-              <w:t xml:space="preserve">BH</w:t>
+              <w:t xml:space="preserve">20</w:t>
             </w:r>
           </w:p>
         </w:tc>
@@ -28559,7 +28641,7 @@
                 <w:sz w:val="18"/>
                 <w:szCs w:val="18"/>
               </w:rPr>
-              <w:t xml:space="preserve">다중검정 보정(BH, bonferroni, holm, hochberg, hommel, BY, fdr, none)</w:t>
+              <w:t xml:space="preserve">그림에 보일 GO 항목 수</w:t>
             </w:r>
           </w:p>
         </w:tc>
@@ -28579,7 +28661,7 @@
                 <w:sz w:val="18"/>
                 <w:szCs w:val="18"/>
               </w:rPr>
-              <w:t xml:space="preserve">Multiple testing correction (BH, bonferroni, holm, hochberg, hommel, BY, fdr, none)</w:t>
+              <w:t xml:space="preserve">GO terms shown in plots</w:t>
             </w:r>
           </w:p>
         </w:tc>
@@ -28641,7 +28723,7 @@
                 <w:sz w:val="18"/>
                 <w:szCs w:val="18"/>
               </w:rPr>
-              <w:t xml:space="preserve">Integer</w:t>
+              <w:t xml:space="preserve">List</w:t>
             </w:r>
           </w:p>
         </w:tc>
@@ -28661,7 +28743,7 @@
                 <w:sz w:val="18"/>
                 <w:szCs w:val="18"/>
               </w:rPr>
-              <w:t xml:space="preserve">min_gs_size</w:t>
+              <w:t xml:space="preserve">da_norm</w:t>
             </w:r>
           </w:p>
         </w:tc>
@@ -28681,7 +28763,7 @@
                 <w:sz w:val="18"/>
                 <w:szCs w:val="18"/>
               </w:rPr>
-              <w:t xml:space="preserve">10</w:t>
+              <w:t xml:space="preserve">TMM</w:t>
             </w:r>
           </w:p>
         </w:tc>
@@ -28701,7 +28783,7 @@
                 <w:sz w:val="18"/>
                 <w:szCs w:val="18"/>
               </w:rPr>
-              <w:t xml:space="preserve">GO 항목 최소 유전자 수</w:t>
+              <w:t xml:space="preserve">differential_accessibility 결과에서 읽을 정규화 결과(TMM, EDASeq, CQN). 그 결과일 때만 사용</w:t>
             </w:r>
           </w:p>
         </w:tc>
@@ -28721,7 +28803,7 @@
                 <w:sz w:val="18"/>
                 <w:szCs w:val="18"/>
               </w:rPr>
-              <w:t xml:space="preserve">Minimum genes per GO term</w:t>
+              <w:t xml:space="preserve">Normalization result read from a differential_accessibility output (TMM, EDASeq, CQN); used only for that input</w:t>
             </w:r>
           </w:p>
         </w:tc>
@@ -28783,7 +28865,7 @@
                 <w:sz w:val="18"/>
                 <w:szCs w:val="18"/>
               </w:rPr>
-              <w:t xml:space="preserve">Integer</w:t>
+              <w:t xml:space="preserve">Float</w:t>
             </w:r>
           </w:p>
         </w:tc>
@@ -28803,7 +28885,7 @@
                 <w:sz w:val="18"/>
                 <w:szCs w:val="18"/>
               </w:rPr>
-              <w:t xml:space="preserve">max_gs_size</w:t>
+              <w:t xml:space="preserve">da_fdr</w:t>
             </w:r>
           </w:p>
         </w:tc>
@@ -28823,7 +28905,7 @@
                 <w:sz w:val="18"/>
                 <w:szCs w:val="18"/>
               </w:rPr>
-              <w:t xml:space="preserve">500</w:t>
+              <w:t xml:space="preserve">0.05</w:t>
             </w:r>
           </w:p>
         </w:tc>
@@ -28843,7 +28925,7 @@
                 <w:sz w:val="18"/>
                 <w:szCs w:val="18"/>
               </w:rPr>
-              <w:t xml:space="preserve">GO 항목 최대 유전자 수</w:t>
+              <w:t xml:space="preserve">up/down peak FDR 기준. differential_accessibility 결과일 때만 사용</w:t>
             </w:r>
           </w:p>
         </w:tc>
@@ -28863,7 +28945,7 @@
                 <w:sz w:val="18"/>
                 <w:szCs w:val="18"/>
               </w:rPr>
-              <w:t xml:space="preserve">Maximum genes per GO term</w:t>
+              <w:t xml:space="preserve">FDR cutoff for up/down peaks; used only for a differential_accessibility output</w:t>
             </w:r>
           </w:p>
         </w:tc>
@@ -28945,7 +29027,7 @@
                 <w:sz w:val="18"/>
                 <w:szCs w:val="18"/>
               </w:rPr>
-              <w:t xml:space="preserve">min_mapped_fraction</w:t>
+              <w:t xml:space="preserve">da_min_abs_logfc</w:t>
             </w:r>
           </w:p>
         </w:tc>
@@ -28965,7 +29047,7 @@
                 <w:sz w:val="18"/>
                 <w:szCs w:val="18"/>
               </w:rPr>
-              <w:t xml:space="preserve">0.5</w:t>
+              <w:t xml:space="preserve">0</w:t>
             </w:r>
           </w:p>
         </w:tc>
@@ -28985,7 +29067,7 @@
                 <w:sz w:val="18"/>
                 <w:szCs w:val="18"/>
               </w:rPr>
-              <w:t xml:space="preserve">주석에서 찾은 ID 비율이 이보다 낮으면 중단</w:t>
+              <w:t xml:space="preserve">up/down peak 최소 abs(logFC). differential_accessibility 결과일 때만 사용</w:t>
             </w:r>
           </w:p>
         </w:tc>
@@ -29005,575 +29087,7 @@
                 <w:sz w:val="18"/>
                 <w:szCs w:val="18"/>
               </w:rPr>
-              <w:t xml:space="preserve">Stop if fewer IDs than this fraction are found in the annotation</w:t>
-            </w:r>
-          </w:p>
-        </w:tc>
-      </w:tr>
-      <w:tr>
-        <w:tc>
-          <w:tcPr>
-            <w:tcW w:type="dxa" w:w="920"/>
-            <w:tcMar>
-              <w:top w:type="dxa" w:w="60"/>
-              <w:left w:type="dxa" w:w="90"/>
-              <w:bottom w:type="dxa" w:w="60"/>
-              <w:right w:type="dxa" w:w="90"/>
-            </w:tcMar>
-          </w:tcPr>
-          <w:p>
-            <w:r>
-              <w:rPr>
-                <w:sz w:val="18"/>
-                <w:szCs w:val="18"/>
-              </w:rPr>
-              <w:t xml:space="preserve">Option</w:t>
-            </w:r>
-          </w:p>
-        </w:tc>
-        <w:tc>
-          <w:tcPr>
-            <w:tcW w:type="dxa" w:w="950"/>
-            <w:tcMar>
-              <w:top w:type="dxa" w:w="60"/>
-              <w:left w:type="dxa" w:w="90"/>
-              <w:bottom w:type="dxa" w:w="60"/>
-              <w:right w:type="dxa" w:w="90"/>
-            </w:tcMar>
-          </w:tcPr>
-          <w:p>
-            <w:r>
-              <w:rPr>
-                <w:sz w:val="18"/>
-                <w:szCs w:val="18"/>
-              </w:rPr>
-              <w:t xml:space="preserve">Optional</w:t>
-            </w:r>
-          </w:p>
-        </w:tc>
-        <w:tc>
-          <w:tcPr>
-            <w:tcW w:type="dxa" w:w="950"/>
-            <w:tcMar>
-              <w:top w:type="dxa" w:w="60"/>
-              <w:left w:type="dxa" w:w="90"/>
-              <w:bottom w:type="dxa" w:w="60"/>
-              <w:right w:type="dxa" w:w="90"/>
-            </w:tcMar>
-          </w:tcPr>
-          <w:p>
-            <w:r>
-              <w:rPr>
-                <w:sz w:val="18"/>
-                <w:szCs w:val="18"/>
-              </w:rPr>
-              <w:t xml:space="preserve">Integer</w:t>
-            </w:r>
-          </w:p>
-        </w:tc>
-        <w:tc>
-          <w:tcPr>
-            <w:tcW w:type="dxa" w:w="1400"/>
-            <w:tcMar>
-              <w:top w:type="dxa" w:w="60"/>
-              <w:left w:type="dxa" w:w="90"/>
-              <w:bottom w:type="dxa" w:w="60"/>
-              <w:right w:type="dxa" w:w="90"/>
-            </w:tcMar>
-          </w:tcPr>
-          <w:p>
-            <w:r>
-              <w:rPr>
-                <w:sz w:val="18"/>
-                <w:szCs w:val="18"/>
-              </w:rPr>
-              <w:t xml:space="preserve">show_category</w:t>
-            </w:r>
-          </w:p>
-        </w:tc>
-        <w:tc>
-          <w:tcPr>
-            <w:tcW w:type="dxa" w:w="1000"/>
-            <w:tcMar>
-              <w:top w:type="dxa" w:w="60"/>
-              <w:left w:type="dxa" w:w="90"/>
-              <w:bottom w:type="dxa" w:w="60"/>
-              <w:right w:type="dxa" w:w="90"/>
-            </w:tcMar>
-          </w:tcPr>
-          <w:p>
-            <w:r>
-              <w:rPr>
-                <w:sz w:val="18"/>
-                <w:szCs w:val="18"/>
-              </w:rPr>
-              <w:t xml:space="preserve">20</w:t>
-            </w:r>
-          </w:p>
-        </w:tc>
-        <w:tc>
-          <w:tcPr>
-            <w:tcW w:type="dxa" w:w="2140"/>
-            <w:tcMar>
-              <w:top w:type="dxa" w:w="60"/>
-              <w:left w:type="dxa" w:w="90"/>
-              <w:bottom w:type="dxa" w:w="60"/>
-              <w:right w:type="dxa" w:w="90"/>
-            </w:tcMar>
-          </w:tcPr>
-          <w:p>
-            <w:r>
-              <w:rPr>
-                <w:sz w:val="18"/>
-                <w:szCs w:val="18"/>
-              </w:rPr>
-              <w:t xml:space="preserve">그림에 보일 GO 항목 수</w:t>
-            </w:r>
-          </w:p>
-        </w:tc>
-        <w:tc>
-          <w:tcPr>
-            <w:tcW w:type="dxa" w:w="2146"/>
-            <w:tcMar>
-              <w:top w:type="dxa" w:w="60"/>
-              <w:left w:type="dxa" w:w="90"/>
-              <w:bottom w:type="dxa" w:w="60"/>
-              <w:right w:type="dxa" w:w="90"/>
-            </w:tcMar>
-          </w:tcPr>
-          <w:p>
-            <w:r>
-              <w:rPr>
-                <w:sz w:val="18"/>
-                <w:szCs w:val="18"/>
-              </w:rPr>
-              <w:t xml:space="preserve">GO terms shown in plots</w:t>
-            </w:r>
-          </w:p>
-        </w:tc>
-      </w:tr>
-      <w:tr>
-        <w:tc>
-          <w:tcPr>
-            <w:tcW w:type="dxa" w:w="920"/>
-            <w:tcMar>
-              <w:top w:type="dxa" w:w="60"/>
-              <w:left w:type="dxa" w:w="90"/>
-              <w:bottom w:type="dxa" w:w="60"/>
-              <w:right w:type="dxa" w:w="90"/>
-            </w:tcMar>
-          </w:tcPr>
-          <w:p>
-            <w:r>
-              <w:rPr>
-                <w:sz w:val="18"/>
-                <w:szCs w:val="18"/>
-              </w:rPr>
-              <w:t xml:space="preserve">Option</w:t>
-            </w:r>
-          </w:p>
-        </w:tc>
-        <w:tc>
-          <w:tcPr>
-            <w:tcW w:type="dxa" w:w="950"/>
-            <w:tcMar>
-              <w:top w:type="dxa" w:w="60"/>
-              <w:left w:type="dxa" w:w="90"/>
-              <w:bottom w:type="dxa" w:w="60"/>
-              <w:right w:type="dxa" w:w="90"/>
-            </w:tcMar>
-          </w:tcPr>
-          <w:p>
-            <w:r>
-              <w:rPr>
-                <w:sz w:val="18"/>
-                <w:szCs w:val="18"/>
-              </w:rPr>
-              <w:t xml:space="preserve">Optional</w:t>
-            </w:r>
-          </w:p>
-        </w:tc>
-        <w:tc>
-          <w:tcPr>
-            <w:tcW w:type="dxa" w:w="950"/>
-            <w:tcMar>
-              <w:top w:type="dxa" w:w="60"/>
-              <w:left w:type="dxa" w:w="90"/>
-              <w:bottom w:type="dxa" w:w="60"/>
-              <w:right w:type="dxa" w:w="90"/>
-            </w:tcMar>
-          </w:tcPr>
-          <w:p>
-            <w:r>
-              <w:rPr>
-                <w:sz w:val="18"/>
-                <w:szCs w:val="18"/>
-              </w:rPr>
-              <w:t xml:space="preserve">List</w:t>
-            </w:r>
-          </w:p>
-        </w:tc>
-        <w:tc>
-          <w:tcPr>
-            <w:tcW w:type="dxa" w:w="1400"/>
-            <w:tcMar>
-              <w:top w:type="dxa" w:w="60"/>
-              <w:left w:type="dxa" w:w="90"/>
-              <w:bottom w:type="dxa" w:w="60"/>
-              <w:right w:type="dxa" w:w="90"/>
-            </w:tcMar>
-          </w:tcPr>
-          <w:p>
-            <w:r>
-              <w:rPr>
-                <w:sz w:val="18"/>
-                <w:szCs w:val="18"/>
-              </w:rPr>
-              <w:t xml:space="preserve">da_norm</w:t>
-            </w:r>
-          </w:p>
-        </w:tc>
-        <w:tc>
-          <w:tcPr>
-            <w:tcW w:type="dxa" w:w="1000"/>
-            <w:tcMar>
-              <w:top w:type="dxa" w:w="60"/>
-              <w:left w:type="dxa" w:w="90"/>
-              <w:bottom w:type="dxa" w:w="60"/>
-              <w:right w:type="dxa" w:w="90"/>
-            </w:tcMar>
-          </w:tcPr>
-          <w:p>
-            <w:r>
-              <w:rPr>
-                <w:sz w:val="18"/>
-                <w:szCs w:val="18"/>
-              </w:rPr>
-              <w:t xml:space="preserve">TMM</w:t>
-            </w:r>
-          </w:p>
-        </w:tc>
-        <w:tc>
-          <w:tcPr>
-            <w:tcW w:type="dxa" w:w="2140"/>
-            <w:tcMar>
-              <w:top w:type="dxa" w:w="60"/>
-              <w:left w:type="dxa" w:w="90"/>
-              <w:bottom w:type="dxa" w:w="60"/>
-              <w:right w:type="dxa" w:w="90"/>
-            </w:tcMar>
-          </w:tcPr>
-          <w:p>
-            <w:r>
-              <w:rPr>
-                <w:sz w:val="18"/>
-                <w:szCs w:val="18"/>
-              </w:rPr>
-              <w:t xml:space="preserve">da_dir에서 읽을 정규화 결과(TMM, EDASeq, CQN). da_dir일 때만 사용</w:t>
-            </w:r>
-          </w:p>
-        </w:tc>
-        <w:tc>
-          <w:tcPr>
-            <w:tcW w:type="dxa" w:w="2146"/>
-            <w:tcMar>
-              <w:top w:type="dxa" w:w="60"/>
-              <w:left w:type="dxa" w:w="90"/>
-              <w:bottom w:type="dxa" w:w="60"/>
-              <w:right w:type="dxa" w:w="90"/>
-            </w:tcMar>
-          </w:tcPr>
-          <w:p>
-            <w:r>
-              <w:rPr>
-                <w:sz w:val="18"/>
-                <w:szCs w:val="18"/>
-              </w:rPr>
-              <w:t xml:space="preserve">Normalization result read from da_dir (TMM, EDASeq, CQN); used only with da_dir</w:t>
-            </w:r>
-          </w:p>
-        </w:tc>
-      </w:tr>
-      <w:tr>
-        <w:tc>
-          <w:tcPr>
-            <w:tcW w:type="dxa" w:w="920"/>
-            <w:tcMar>
-              <w:top w:type="dxa" w:w="60"/>
-              <w:left w:type="dxa" w:w="90"/>
-              <w:bottom w:type="dxa" w:w="60"/>
-              <w:right w:type="dxa" w:w="90"/>
-            </w:tcMar>
-          </w:tcPr>
-          <w:p>
-            <w:r>
-              <w:rPr>
-                <w:sz w:val="18"/>
-                <w:szCs w:val="18"/>
-              </w:rPr>
-              <w:t xml:space="preserve">Option</w:t>
-            </w:r>
-          </w:p>
-        </w:tc>
-        <w:tc>
-          <w:tcPr>
-            <w:tcW w:type="dxa" w:w="950"/>
-            <w:tcMar>
-              <w:top w:type="dxa" w:w="60"/>
-              <w:left w:type="dxa" w:w="90"/>
-              <w:bottom w:type="dxa" w:w="60"/>
-              <w:right w:type="dxa" w:w="90"/>
-            </w:tcMar>
-          </w:tcPr>
-          <w:p>
-            <w:r>
-              <w:rPr>
-                <w:sz w:val="18"/>
-                <w:szCs w:val="18"/>
-              </w:rPr>
-              <w:t xml:space="preserve">Optional</w:t>
-            </w:r>
-          </w:p>
-        </w:tc>
-        <w:tc>
-          <w:tcPr>
-            <w:tcW w:type="dxa" w:w="950"/>
-            <w:tcMar>
-              <w:top w:type="dxa" w:w="60"/>
-              <w:left w:type="dxa" w:w="90"/>
-              <w:bottom w:type="dxa" w:w="60"/>
-              <w:right w:type="dxa" w:w="90"/>
-            </w:tcMar>
-          </w:tcPr>
-          <w:p>
-            <w:r>
-              <w:rPr>
-                <w:sz w:val="18"/>
-                <w:szCs w:val="18"/>
-              </w:rPr>
-              <w:t xml:space="preserve">Float</w:t>
-            </w:r>
-          </w:p>
-        </w:tc>
-        <w:tc>
-          <w:tcPr>
-            <w:tcW w:type="dxa" w:w="1400"/>
-            <w:tcMar>
-              <w:top w:type="dxa" w:w="60"/>
-              <w:left w:type="dxa" w:w="90"/>
-              <w:bottom w:type="dxa" w:w="60"/>
-              <w:right w:type="dxa" w:w="90"/>
-            </w:tcMar>
-          </w:tcPr>
-          <w:p>
-            <w:r>
-              <w:rPr>
-                <w:sz w:val="18"/>
-                <w:szCs w:val="18"/>
-              </w:rPr>
-              <w:t xml:space="preserve">da_fdr</w:t>
-            </w:r>
-          </w:p>
-        </w:tc>
-        <w:tc>
-          <w:tcPr>
-            <w:tcW w:type="dxa" w:w="1000"/>
-            <w:tcMar>
-              <w:top w:type="dxa" w:w="60"/>
-              <w:left w:type="dxa" w:w="90"/>
-              <w:bottom w:type="dxa" w:w="60"/>
-              <w:right w:type="dxa" w:w="90"/>
-            </w:tcMar>
-          </w:tcPr>
-          <w:p>
-            <w:r>
-              <w:rPr>
-                <w:sz w:val="18"/>
-                <w:szCs w:val="18"/>
-              </w:rPr>
-              <w:t xml:space="preserve">0.05</w:t>
-            </w:r>
-          </w:p>
-        </w:tc>
-        <w:tc>
-          <w:tcPr>
-            <w:tcW w:type="dxa" w:w="2140"/>
-            <w:tcMar>
-              <w:top w:type="dxa" w:w="60"/>
-              <w:left w:type="dxa" w:w="90"/>
-              <w:bottom w:type="dxa" w:w="60"/>
-              <w:right w:type="dxa" w:w="90"/>
-            </w:tcMar>
-          </w:tcPr>
-          <w:p>
-            <w:r>
-              <w:rPr>
-                <w:sz w:val="18"/>
-                <w:szCs w:val="18"/>
-              </w:rPr>
-              <w:t xml:space="preserve">up/down peak FDR 기준. da_dir 또는 da_file일 때만 사용</w:t>
-            </w:r>
-          </w:p>
-        </w:tc>
-        <w:tc>
-          <w:tcPr>
-            <w:tcW w:type="dxa" w:w="2146"/>
-            <w:tcMar>
-              <w:top w:type="dxa" w:w="60"/>
-              <w:left w:type="dxa" w:w="90"/>
-              <w:bottom w:type="dxa" w:w="60"/>
-              <w:right w:type="dxa" w:w="90"/>
-            </w:tcMar>
-          </w:tcPr>
-          <w:p>
-            <w:r>
-              <w:rPr>
-                <w:sz w:val="18"/>
-                <w:szCs w:val="18"/>
-              </w:rPr>
-              <w:t xml:space="preserve">FDR cutoff for up/down peaks; used only with da_dir or da_file</w:t>
-            </w:r>
-          </w:p>
-        </w:tc>
-      </w:tr>
-      <w:tr>
-        <w:tc>
-          <w:tcPr>
-            <w:tcW w:type="dxa" w:w="920"/>
-            <w:tcMar>
-              <w:top w:type="dxa" w:w="60"/>
-              <w:left w:type="dxa" w:w="90"/>
-              <w:bottom w:type="dxa" w:w="60"/>
-              <w:right w:type="dxa" w:w="90"/>
-            </w:tcMar>
-          </w:tcPr>
-          <w:p>
-            <w:r>
-              <w:rPr>
-                <w:sz w:val="18"/>
-                <w:szCs w:val="18"/>
-              </w:rPr>
-              <w:t xml:space="preserve">Option</w:t>
-            </w:r>
-          </w:p>
-        </w:tc>
-        <w:tc>
-          <w:tcPr>
-            <w:tcW w:type="dxa" w:w="950"/>
-            <w:tcMar>
-              <w:top w:type="dxa" w:w="60"/>
-              <w:left w:type="dxa" w:w="90"/>
-              <w:bottom w:type="dxa" w:w="60"/>
-              <w:right w:type="dxa" w:w="90"/>
-            </w:tcMar>
-          </w:tcPr>
-          <w:p>
-            <w:r>
-              <w:rPr>
-                <w:sz w:val="18"/>
-                <w:szCs w:val="18"/>
-              </w:rPr>
-              <w:t xml:space="preserve">Optional</w:t>
-            </w:r>
-          </w:p>
-        </w:tc>
-        <w:tc>
-          <w:tcPr>
-            <w:tcW w:type="dxa" w:w="950"/>
-            <w:tcMar>
-              <w:top w:type="dxa" w:w="60"/>
-              <w:left w:type="dxa" w:w="90"/>
-              <w:bottom w:type="dxa" w:w="60"/>
-              <w:right w:type="dxa" w:w="90"/>
-            </w:tcMar>
-          </w:tcPr>
-          <w:p>
-            <w:r>
-              <w:rPr>
-                <w:sz w:val="18"/>
-                <w:szCs w:val="18"/>
-              </w:rPr>
-              <w:t xml:space="preserve">Float</w:t>
-            </w:r>
-          </w:p>
-        </w:tc>
-        <w:tc>
-          <w:tcPr>
-            <w:tcW w:type="dxa" w:w="1400"/>
-            <w:tcMar>
-              <w:top w:type="dxa" w:w="60"/>
-              <w:left w:type="dxa" w:w="90"/>
-              <w:bottom w:type="dxa" w:w="60"/>
-              <w:right w:type="dxa" w:w="90"/>
-            </w:tcMar>
-          </w:tcPr>
-          <w:p>
-            <w:r>
-              <w:rPr>
-                <w:sz w:val="18"/>
-                <w:szCs w:val="18"/>
-              </w:rPr>
-              <w:t xml:space="preserve">da_min_abs_logfc</w:t>
-            </w:r>
-          </w:p>
-        </w:tc>
-        <w:tc>
-          <w:tcPr>
-            <w:tcW w:type="dxa" w:w="1000"/>
-            <w:tcMar>
-              <w:top w:type="dxa" w:w="60"/>
-              <w:left w:type="dxa" w:w="90"/>
-              <w:bottom w:type="dxa" w:w="60"/>
-              <w:right w:type="dxa" w:w="90"/>
-            </w:tcMar>
-          </w:tcPr>
-          <w:p>
-            <w:r>
-              <w:rPr>
-                <w:sz w:val="18"/>
-                <w:szCs w:val="18"/>
-              </w:rPr>
-              <w:t xml:space="preserve">0</w:t>
-            </w:r>
-          </w:p>
-        </w:tc>
-        <w:tc>
-          <w:tcPr>
-            <w:tcW w:type="dxa" w:w="2140"/>
-            <w:tcMar>
-              <w:top w:type="dxa" w:w="60"/>
-              <w:left w:type="dxa" w:w="90"/>
-              <w:bottom w:type="dxa" w:w="60"/>
-              <w:right w:type="dxa" w:w="90"/>
-            </w:tcMar>
-          </w:tcPr>
-          <w:p>
-            <w:r>
-              <w:rPr>
-                <w:sz w:val="18"/>
-                <w:szCs w:val="18"/>
-              </w:rPr>
-              <w:t xml:space="preserve">up/down peak 최소 abs(logFC). da_dir 또는 da_file일 때만 사용</w:t>
-            </w:r>
-          </w:p>
-        </w:tc>
-        <w:tc>
-          <w:tcPr>
-            <w:tcW w:type="dxa" w:w="2146"/>
-            <w:tcMar>
-              <w:top w:type="dxa" w:w="60"/>
-              <w:left w:type="dxa" w:w="90"/>
-              <w:bottom w:type="dxa" w:w="60"/>
-              <w:right w:type="dxa" w:w="90"/>
-            </w:tcMar>
-          </w:tcPr>
-          <w:p>
-            <w:r>
-              <w:rPr>
-                <w:sz w:val="18"/>
-                <w:szCs w:val="18"/>
-              </w:rPr>
-              <w:t xml:space="preserve">Minimum abs(logFC) for up/down peaks; used only with da_dir or da_file</w:t>
+              <w:t xml:space="preserve">Minimum abs(logFC) for up/down peaks; used only for a differential_accessibility output</w:t>
             </w:r>
           </w:p>
         </w:tc>
@@ -29678,7 +29192,7 @@
                 <w:sz w:val="18"/>
                 <w:szCs w:val="18"/>
               </w:rPr>
-              <w:t xml:space="preserve">분석 종의 OrgDb 파일(tools/download_orgdb.R로 저장) 또는 유전자–GO 대응표가 필요합니다.</w:t>
+              <w:t xml:space="preserve">분석 종의 OrgDb 파일(tools/download_orgdb.R로 저장)이 필요합니다.</w:t>
             </w:r>
           </w:p>
         </w:tc>
@@ -29698,7 +29212,7 @@
                 <w:sz w:val="18"/>
                 <w:szCs w:val="18"/>
               </w:rPr>
-              <w:t xml:space="preserve">An OrgDb file for the species (saved with tools/download_orgdb.R) or a gene-to-GO table is required.</w:t>
+              <w:t xml:space="preserve">An OrgDb file for the species (saved with tools/download_orgdb.R) is required.</w:t>
             </w:r>
           </w:p>
         </w:tc>
@@ -29804,7 +29318,7 @@
                 <w:sz w:val="18"/>
                 <w:szCs w:val="18"/>
               </w:rPr>
-              <w:t xml:space="preserve">입력은 input_dir, gene_file, da_dir, da_file 중 하나만 지정합니다.</w:t>
+              <w:t xml:space="preserve">파이프라인에서 peak_annotation 뒤와 differential_accessibility 뒤에 같은 모듈을 쓰며, 앞 모듈의 output_dir만 input_dir에 연결하면 됩니다.</w:t>
             </w:r>
           </w:p>
         </w:tc>
@@ -29824,7 +29338,7 @@
                 <w:sz w:val="18"/>
                 <w:szCs w:val="18"/>
               </w:rPr>
-              <w:t xml:space="preserve">Give only one of input_dir, gene_file, da_dir, or da_file.</w:t>
+              <w:t xml:space="preserve">In the pipeline the same module follows peak_annotation and differential_accessibility; connect the previous module's output_dir to input_dir.</w:t>
             </w:r>
           </w:p>
         </w:tc>
@@ -30008,7 +29522,7 @@
           <w:sz w:val="19"/>
           <w:szCs w:val="19"/>
         </w:rPr>
-        <w:t xml:space="preserve">Rscript functional_enrichment.1.0.R \</w:t>
+        <w:t xml:space="preserve">Rscript functional_enrichment.1.1.R \</w:t>
       </w:r>
     </w:p>
     <w:p>
@@ -30022,7 +29536,7 @@
           <w:sz w:val="19"/>
           <w:szCs w:val="19"/>
         </w:rPr>
-        <w:t xml:space="preserve">  da_dir=/data/da \</w:t>
+        <w:t xml:space="preserve">  input_dir=/data/da \</w:t>
       </w:r>
     </w:p>
     <w:p>

</xml_diff>

<commit_message>
Name the tf_footprinting sample sheet sample_data (1.3)
tf_footprinting.1.3.sh now takes the sample sheet as sample_data like
the other modules, with fixed SampleID and Condition columns; metadata,
sample_col and condition_col with a value stop the run. The ATAC_QC
sample_data (with Replicate) can be used as is. Content, example and
Registration.md follow.

Co-Authored-By: Claude Opus 5.5 <noreply@anthropic.com>
</commit_message>
<xml_diff>
--- a/docs/ATAC-seq/modules/Portal_Content.docx
+++ b/docs/ATAC-seq/modules/Portal_Content.docx
@@ -23861,7 +23861,7 @@
                 <w:sz w:val="18"/>
                 <w:szCs w:val="18"/>
               </w:rPr>
-              <w:t xml:space="preserve">metadata</w:t>
+              <w:t xml:space="preserve">sample_data</w:t>
             </w:r>
           </w:p>
         </w:tc>
@@ -23881,7 +23881,7 @@
                 <w:sz w:val="18"/>
                 <w:szCs w:val="18"/>
               </w:rPr>
-              <w:t xml:space="preserve">/data/metadata.tsv</w:t>
+              <w:t xml:space="preserve">/data/sample_data.csv</w:t>
             </w:r>
           </w:p>
         </w:tc>
@@ -23901,7 +23901,7 @@
                 <w:sz w:val="18"/>
                 <w:szCs w:val="18"/>
               </w:rPr>
-              <w:t xml:space="preserve">샘플 정보 TSV/CSV(SampleID, Condition), 조건 2개 이상</w:t>
+              <w:t xml:space="preserve">샘플 정보 CSV/TSV(SampleID, Condition), 조건 2개 이상. ATAC_QC의 sample_data를 그대로 써도 됨</w:t>
             </w:r>
           </w:p>
         </w:tc>
@@ -23921,7 +23921,7 @@
                 <w:sz w:val="18"/>
                 <w:szCs w:val="18"/>
               </w:rPr>
-              <w:t xml:space="preserve">Sample information TSV/CSV (SampleID, Condition) with two or more conditions</w:t>
+              <w:t xml:space="preserve">Sample sheet CSV/TSV (SampleID, Condition) with two or more conditions; the ATAC_QC sample_data can be used as is</w:t>
             </w:r>
           </w:p>
         </w:tc>
@@ -24490,290 +24490,6 @@
                 <w:szCs w:val="18"/>
               </w:rPr>
               <w:t xml:space="preserve">Output folder</w:t>
-            </w:r>
-          </w:p>
-        </w:tc>
-      </w:tr>
-      <w:tr>
-        <w:tc>
-          <w:tcPr>
-            <w:tcW w:type="dxa" w:w="920"/>
-            <w:tcMar>
-              <w:top w:type="dxa" w:w="60"/>
-              <w:left w:type="dxa" w:w="90"/>
-              <w:bottom w:type="dxa" w:w="60"/>
-              <w:right w:type="dxa" w:w="90"/>
-            </w:tcMar>
-          </w:tcPr>
-          <w:p>
-            <w:r>
-              <w:rPr>
-                <w:sz w:val="18"/>
-                <w:szCs w:val="18"/>
-              </w:rPr>
-              <w:t xml:space="preserve">Option</w:t>
-            </w:r>
-          </w:p>
-        </w:tc>
-        <w:tc>
-          <w:tcPr>
-            <w:tcW w:type="dxa" w:w="950"/>
-            <w:tcMar>
-              <w:top w:type="dxa" w:w="60"/>
-              <w:left w:type="dxa" w:w="90"/>
-              <w:bottom w:type="dxa" w:w="60"/>
-              <w:right w:type="dxa" w:w="90"/>
-            </w:tcMar>
-          </w:tcPr>
-          <w:p>
-            <w:r>
-              <w:rPr>
-                <w:sz w:val="18"/>
-                <w:szCs w:val="18"/>
-              </w:rPr>
-              <w:t xml:space="preserve">Optional</w:t>
-            </w:r>
-          </w:p>
-        </w:tc>
-        <w:tc>
-          <w:tcPr>
-            <w:tcW w:type="dxa" w:w="950"/>
-            <w:tcMar>
-              <w:top w:type="dxa" w:w="60"/>
-              <w:left w:type="dxa" w:w="90"/>
-              <w:bottom w:type="dxa" w:w="60"/>
-              <w:right w:type="dxa" w:w="90"/>
-            </w:tcMar>
-          </w:tcPr>
-          <w:p>
-            <w:r>
-              <w:rPr>
-                <w:sz w:val="18"/>
-                <w:szCs w:val="18"/>
-              </w:rPr>
-              <w:t xml:space="preserve">String</w:t>
-            </w:r>
-          </w:p>
-        </w:tc>
-        <w:tc>
-          <w:tcPr>
-            <w:tcW w:type="dxa" w:w="1400"/>
-            <w:tcMar>
-              <w:top w:type="dxa" w:w="60"/>
-              <w:left w:type="dxa" w:w="90"/>
-              <w:bottom w:type="dxa" w:w="60"/>
-              <w:right w:type="dxa" w:w="90"/>
-            </w:tcMar>
-          </w:tcPr>
-          <w:p>
-            <w:r>
-              <w:rPr>
-                <w:sz w:val="18"/>
-                <w:szCs w:val="18"/>
-              </w:rPr>
-              <w:t xml:space="preserve">sample_col</w:t>
-            </w:r>
-          </w:p>
-        </w:tc>
-        <w:tc>
-          <w:tcPr>
-            <w:tcW w:type="dxa" w:w="1000"/>
-            <w:tcMar>
-              <w:top w:type="dxa" w:w="60"/>
-              <w:left w:type="dxa" w:w="90"/>
-              <w:bottom w:type="dxa" w:w="60"/>
-              <w:right w:type="dxa" w:w="90"/>
-            </w:tcMar>
-          </w:tcPr>
-          <w:p>
-            <w:r>
-              <w:rPr>
-                <w:sz w:val="18"/>
-                <w:szCs w:val="18"/>
-              </w:rPr>
-              <w:t xml:space="preserve">SampleID</w:t>
-            </w:r>
-          </w:p>
-        </w:tc>
-        <w:tc>
-          <w:tcPr>
-            <w:tcW w:type="dxa" w:w="2140"/>
-            <w:tcMar>
-              <w:top w:type="dxa" w:w="60"/>
-              <w:left w:type="dxa" w:w="90"/>
-              <w:bottom w:type="dxa" w:w="60"/>
-              <w:right w:type="dxa" w:w="90"/>
-            </w:tcMar>
-          </w:tcPr>
-          <w:p>
-            <w:r>
-              <w:rPr>
-                <w:sz w:val="18"/>
-                <w:szCs w:val="18"/>
-              </w:rPr>
-              <w:t xml:space="preserve">metadata의 샘플 컬럼 이름</w:t>
-            </w:r>
-          </w:p>
-        </w:tc>
-        <w:tc>
-          <w:tcPr>
-            <w:tcW w:type="dxa" w:w="2146"/>
-            <w:tcMar>
-              <w:top w:type="dxa" w:w="60"/>
-              <w:left w:type="dxa" w:w="90"/>
-              <w:bottom w:type="dxa" w:w="60"/>
-              <w:right w:type="dxa" w:w="90"/>
-            </w:tcMar>
-          </w:tcPr>
-          <w:p>
-            <w:r>
-              <w:rPr>
-                <w:sz w:val="18"/>
-                <w:szCs w:val="18"/>
-              </w:rPr>
-              <w:t xml:space="preserve">Sample column name in metadata</w:t>
-            </w:r>
-          </w:p>
-        </w:tc>
-      </w:tr>
-      <w:tr>
-        <w:tc>
-          <w:tcPr>
-            <w:tcW w:type="dxa" w:w="920"/>
-            <w:tcMar>
-              <w:top w:type="dxa" w:w="60"/>
-              <w:left w:type="dxa" w:w="90"/>
-              <w:bottom w:type="dxa" w:w="60"/>
-              <w:right w:type="dxa" w:w="90"/>
-            </w:tcMar>
-          </w:tcPr>
-          <w:p>
-            <w:r>
-              <w:rPr>
-                <w:sz w:val="18"/>
-                <w:szCs w:val="18"/>
-              </w:rPr>
-              <w:t xml:space="preserve">Option</w:t>
-            </w:r>
-          </w:p>
-        </w:tc>
-        <w:tc>
-          <w:tcPr>
-            <w:tcW w:type="dxa" w:w="950"/>
-            <w:tcMar>
-              <w:top w:type="dxa" w:w="60"/>
-              <w:left w:type="dxa" w:w="90"/>
-              <w:bottom w:type="dxa" w:w="60"/>
-              <w:right w:type="dxa" w:w="90"/>
-            </w:tcMar>
-          </w:tcPr>
-          <w:p>
-            <w:r>
-              <w:rPr>
-                <w:sz w:val="18"/>
-                <w:szCs w:val="18"/>
-              </w:rPr>
-              <w:t xml:space="preserve">Optional</w:t>
-            </w:r>
-          </w:p>
-        </w:tc>
-        <w:tc>
-          <w:tcPr>
-            <w:tcW w:type="dxa" w:w="950"/>
-            <w:tcMar>
-              <w:top w:type="dxa" w:w="60"/>
-              <w:left w:type="dxa" w:w="90"/>
-              <w:bottom w:type="dxa" w:w="60"/>
-              <w:right w:type="dxa" w:w="90"/>
-            </w:tcMar>
-          </w:tcPr>
-          <w:p>
-            <w:r>
-              <w:rPr>
-                <w:sz w:val="18"/>
-                <w:szCs w:val="18"/>
-              </w:rPr>
-              <w:t xml:space="preserve">String</w:t>
-            </w:r>
-          </w:p>
-        </w:tc>
-        <w:tc>
-          <w:tcPr>
-            <w:tcW w:type="dxa" w:w="1400"/>
-            <w:tcMar>
-              <w:top w:type="dxa" w:w="60"/>
-              <w:left w:type="dxa" w:w="90"/>
-              <w:bottom w:type="dxa" w:w="60"/>
-              <w:right w:type="dxa" w:w="90"/>
-            </w:tcMar>
-          </w:tcPr>
-          <w:p>
-            <w:r>
-              <w:rPr>
-                <w:sz w:val="18"/>
-                <w:szCs w:val="18"/>
-              </w:rPr>
-              <w:t xml:space="preserve">condition_col</w:t>
-            </w:r>
-          </w:p>
-        </w:tc>
-        <w:tc>
-          <w:tcPr>
-            <w:tcW w:type="dxa" w:w="1000"/>
-            <w:tcMar>
-              <w:top w:type="dxa" w:w="60"/>
-              <w:left w:type="dxa" w:w="90"/>
-              <w:bottom w:type="dxa" w:w="60"/>
-              <w:right w:type="dxa" w:w="90"/>
-            </w:tcMar>
-          </w:tcPr>
-          <w:p>
-            <w:r>
-              <w:rPr>
-                <w:sz w:val="18"/>
-                <w:szCs w:val="18"/>
-              </w:rPr>
-              <w:t xml:space="preserve">Condition</w:t>
-            </w:r>
-          </w:p>
-        </w:tc>
-        <w:tc>
-          <w:tcPr>
-            <w:tcW w:type="dxa" w:w="2140"/>
-            <w:tcMar>
-              <w:top w:type="dxa" w:w="60"/>
-              <w:left w:type="dxa" w:w="90"/>
-              <w:bottom w:type="dxa" w:w="60"/>
-              <w:right w:type="dxa" w:w="90"/>
-            </w:tcMar>
-          </w:tcPr>
-          <w:p>
-            <w:r>
-              <w:rPr>
-                <w:sz w:val="18"/>
-                <w:szCs w:val="18"/>
-              </w:rPr>
-              <w:t xml:space="preserve">metadata의 조건 컬럼 이름</w:t>
-            </w:r>
-          </w:p>
-        </w:tc>
-        <w:tc>
-          <w:tcPr>
-            <w:tcW w:type="dxa" w:w="2146"/>
-            <w:tcMar>
-              <w:top w:type="dxa" w:w="60"/>
-              <w:left w:type="dxa" w:w="90"/>
-              <w:bottom w:type="dxa" w:w="60"/>
-              <w:right w:type="dxa" w:w="90"/>
-            </w:tcMar>
-          </w:tcPr>
-          <w:p>
-            <w:r>
-              <w:rPr>
-                <w:sz w:val="18"/>
-                <w:szCs w:val="18"/>
-              </w:rPr>
-              <w:t xml:space="preserve">Condition column name in metadata</w:t>
             </w:r>
           </w:p>
         </w:tc>
@@ -24825,7 +24541,7 @@
         <w:spacing w:after="80"/>
       </w:pPr>
       <w:r>
-        <w:t xml:space="preserve">제목(국문): 샘플 정보 파일(metadata)</w:t>
+        <w:t xml:space="preserve">제목(국문): 샘플 정보 파일(sample_data)</w:t>
       </w:r>
     </w:p>
     <w:p>
@@ -24838,7 +24554,7 @@
         <w:spacing w:after="80"/>
       </w:pPr>
       <w:r>
-        <w:t xml:space="preserve">제목(영문): Sample information (metadata)</w:t>
+        <w:t xml:space="preserve">제목(영문): Sample sheet (sample_data)</w:t>
       </w:r>
     </w:p>
     <w:p>
@@ -24851,7 +24567,7 @@
         <w:spacing w:after="80"/>
       </w:pPr>
       <w:r>
-        <w:t xml:space="preserve">본문(국문): 탭 또는 쉼표로 구분한 파일이며 SampleID와 Condition 컬럼이 필요합니다. 컬럼 이름이 다르면 sample_col, condition_col로 지정합니다. BAM 파일 이름에 SampleID가 포함되어 있어야 합니다.</w:t>
+        <w:t xml:space="preserve">본문(국문): 쉼표 또는 탭으로 구분한 파일이며 SampleID와 Condition 컬럼이 필요합니다. ATAC_QC에 쓴 sample_data(Replicate 열 포함)를 그대로 써도 됩니다. BAM 파일 이름에 SampleID가 포함되어 있어야 합니다.</w:t>
       </w:r>
     </w:p>
     <w:p>
@@ -24864,7 +24580,7 @@
         <w:spacing w:after="80"/>
       </w:pPr>
       <w:r>
-        <w:t xml:space="preserve">본문(영문): A tab- or comma-separated file with the SampleID and Condition columns; set sample_col and condition_col if the names differ. Each BAM file name must contain its SampleID.</w:t>
+        <w:t xml:space="preserve">본문(영문): A comma- or tab-separated file with the SampleID and Condition columns; the ATAC_QC sample_data (with its Replicate column) can be used as is. Each BAM file name must contain its SampleID.</w:t>
       </w:r>
     </w:p>
     <w:p>
@@ -24877,7 +24593,7 @@
         <w:spacing w:after="80"/>
       </w:pPr>
       <w:r>
-        <w:t xml:space="preserve">예시 제목: metadata.tsv</w:t>
+        <w:t xml:space="preserve">예시 제목: sample_data.csv</w:t>
       </w:r>
     </w:p>
     <w:p>
@@ -24904,7 +24620,7 @@
           <w:sz w:val="19"/>
           <w:szCs w:val="19"/>
         </w:rPr>
-        <w:t xml:space="preserve">SampleID	Condition</w:t>
+        <w:t xml:space="preserve">SampleID,Condition,Replicate</w:t>
       </w:r>
     </w:p>
     <w:p>
@@ -24918,7 +24634,7 @@
           <w:sz w:val="19"/>
           <w:szCs w:val="19"/>
         </w:rPr>
-        <w:t xml:space="preserve">ctrl_1	control</w:t>
+        <w:t xml:space="preserve">ctrl_1,control,1</w:t>
       </w:r>
     </w:p>
     <w:p>
@@ -24932,7 +24648,7 @@
           <w:sz w:val="19"/>
           <w:szCs w:val="19"/>
         </w:rPr>
-        <w:t xml:space="preserve">ctrl_2	control</w:t>
+        <w:t xml:space="preserve">ctrl_2,control,2</w:t>
       </w:r>
     </w:p>
     <w:p>
@@ -24946,7 +24662,7 @@
           <w:sz w:val="19"/>
           <w:szCs w:val="19"/>
         </w:rPr>
-        <w:t xml:space="preserve">trt_1	treated</w:t>
+        <w:t xml:space="preserve">trt_1,treated,1</w:t>
       </w:r>
     </w:p>
     <w:p>
@@ -24960,7 +24676,7 @@
           <w:sz w:val="19"/>
           <w:szCs w:val="19"/>
         </w:rPr>
-        <w:t xml:space="preserve">trt_2	treated</w:t>
+        <w:t xml:space="preserve">trt_2,treated,2</w:t>
       </w:r>
     </w:p>
     <w:p/>
@@ -25346,7 +25062,7 @@
           <w:sz w:val="19"/>
           <w:szCs w:val="19"/>
         </w:rPr>
-        <w:t xml:space="preserve">  metadata=/data/metadata.tsv \</w:t>
+        <w:t xml:space="preserve">  sample_data=/data/sample_data.csv \</w:t>
       </w:r>
     </w:p>
     <w:p>
@@ -25402,35 +25118,7 @@
           <w:sz w:val="19"/>
           <w:szCs w:val="19"/>
         </w:rPr>
-        <w:t xml:space="preserve">  output_dir=/data/tf_footprinting \</w:t>
-      </w:r>
-    </w:p>
-    <w:p>
-      <w:pPr>
-        <w:shd w:fill="F3F4F6" w:color="auto" w:val="clear"/>
-        <w:spacing w:after="0"/>
-      </w:pPr>
-      <w:r>
-        <w:rPr>
-          <w:color w:val="3A3A3A"/>
-          <w:sz w:val="19"/>
-          <w:szCs w:val="19"/>
-        </w:rPr>
-        <w:t xml:space="preserve">  sample_col=SampleID \</w:t>
-      </w:r>
-    </w:p>
-    <w:p>
-      <w:pPr>
-        <w:shd w:fill="F3F4F6" w:color="auto" w:val="clear"/>
-        <w:spacing w:after="0"/>
-      </w:pPr>
-      <w:r>
-        <w:rPr>
-          <w:color w:val="3A3A3A"/>
-          <w:sz w:val="19"/>
-          <w:szCs w:val="19"/>
-        </w:rPr>
-        <w:t xml:space="preserve">  condition_col=Condition</w:t>
+        <w:t xml:space="preserve">  output_dir=/data/tf_footprinting</w:t>
       </w:r>
     </w:p>
     <w:p/>

</xml_diff>

<commit_message>
Write each description in full instead of pointing to other modules
Parameter descriptions and sample sheet sections no longer say 'same as
MACS3' or 'the ATAC_QC sample sheet as is': tf_footprinting and
replicate_consistency describe their sample_data columns themselves,
replicate_consistency gets its own sample sheet section, and both
genome_size rows spell out the MACS3 values. The portal guide records
the rule.

Co-Authored-By: Claude Opus 5.5 <noreply@anthropic.com>
</commit_message>
<xml_diff>
--- a/docs/ATAC-seq/modules/Portal_Content.docx
+++ b/docs/ATAC-seq/modules/Portal_Content.docx
@@ -6699,7 +6699,7 @@
         <w:spacing w:after="80"/>
       </w:pPr>
       <w:r>
-        <w:t xml:space="preserve">본문(국문): 쉼표로 구분한 CSV 파일이며 SampleID, Condition, Replicate 컬럼이 필요합니다. BAM 파일 이름에 SampleID가 포함되어 있어야 자동으로 연결됩니다. replicate_consistency 모듈에도 같은 파일을 사용합니다.</w:t>
+        <w:t xml:space="preserve">본문(국문): 쉼표로 구분한 CSV 파일이며 SampleID, Condition, Replicate 컬럼이 필요합니다. BAM 파일 이름에 SampleID가 포함되어 있어야 자동으로 연결됩니다.</w:t>
       </w:r>
     </w:p>
     <w:p>
@@ -6712,7 +6712,7 @@
         <w:spacing w:after="80"/>
       </w:pPr>
       <w:r>
-        <w:t xml:space="preserve">본문(영문): A comma-separated CSV with the SampleID, Condition, and Replicate columns. Each BAM file name must contain its SampleID for automatic matching. The same file is used by replicate_consistency.</w:t>
+        <w:t xml:space="preserve">본문(영문): A comma-separated CSV with the SampleID, Condition, and Replicate columns. Each BAM file name must contain its SampleID for automatic matching.</w:t>
       </w:r>
     </w:p>
     <w:p>
@@ -11431,7 +11431,7 @@
                 <w:sz w:val="18"/>
                 <w:szCs w:val="18"/>
               </w:rPr>
-              <w:t xml:space="preserve">유효 유전체 크기. hs, mm, ce, dm 또는 숫자</w:t>
+              <w:t xml:space="preserve">MACS3에 넘기는 유효 유전체 크기(-g). hs(사람), mm(쥐), ce(예쁜꼬마선충), dm(초파리) 또는 숫자(예: 애기장대 1.2e8)</w:t>
             </w:r>
           </w:p>
         </w:tc>
@@ -11451,7 +11451,7 @@
                 <w:sz w:val="18"/>
                 <w:szCs w:val="18"/>
               </w:rPr>
-              <w:t xml:space="preserve">Effective genome size: hs, mm, ce, dm, or a number</w:t>
+              <w:t xml:space="preserve">Effective genome size passed to MACS3 (-g): hs (human), mm (mouse), ce (C. elegans), dm (fruit fly), or a number (for example 1.2e8 for Arabidopsis)</w:t>
             </w:r>
           </w:p>
         </w:tc>
@@ -23901,7 +23901,7 @@
                 <w:sz w:val="18"/>
                 <w:szCs w:val="18"/>
               </w:rPr>
-              <w:t xml:space="preserve">샘플 정보 CSV/TSV(SampleID, Condition), 조건 2개 이상. ATAC_QC의 sample_data를 그대로 써도 됨</w:t>
+              <w:t xml:space="preserve">샘플 정보 CSV/TSV. SampleID(BAM 파일 이름에 들어 있는 샘플 이름), Condition(조건 이름) 열이 필요하고 조건은 2개 이상. 다른 열(Replicate 등)은 있어도 됨</w:t>
             </w:r>
           </w:p>
         </w:tc>
@@ -23921,7 +23921,7 @@
                 <w:sz w:val="18"/>
                 <w:szCs w:val="18"/>
               </w:rPr>
-              <w:t xml:space="preserve">Sample sheet CSV/TSV (SampleID, Condition) with two or more conditions; the ATAC_QC sample_data can be used as is</w:t>
+              <w:t xml:space="preserve">Sample sheet CSV/TSV with SampleID (the sample name contained in each BAM file name) and Condition (condition name) columns, two or more conditions; other columns such as Replicate may be present</w:t>
             </w:r>
           </w:p>
         </w:tc>
@@ -24567,7 +24567,7 @@
         <w:spacing w:after="80"/>
       </w:pPr>
       <w:r>
-        <w:t xml:space="preserve">본문(국문): 쉼표 또는 탭으로 구분한 파일이며 SampleID와 Condition 컬럼이 필요합니다. ATAC_QC에 쓴 sample_data(Replicate 열 포함)를 그대로 써도 됩니다. BAM 파일 이름에 SampleID가 포함되어 있어야 합니다.</w:t>
+        <w:t xml:space="preserve">본문(국문): 쉼표 또는 탭으로 구분한 파일이며 SampleID와 Condition 컬럼이 필요합니다. Replicate 같은 다른 열은 있어도 됩니다. BAM 파일 이름에 SampleID가 포함되어 있어야 합니다.</w:t>
       </w:r>
     </w:p>
     <w:p>
@@ -24580,7 +24580,7 @@
         <w:spacing w:after="80"/>
       </w:pPr>
       <w:r>
-        <w:t xml:space="preserve">본문(영문): A comma- or tab-separated file with the SampleID and Condition columns; the ATAC_QC sample_data (with its Replicate column) can be used as is. Each BAM file name must contain its SampleID.</w:t>
+        <w:t xml:space="preserve">본문(영문): A comma- or tab-separated file with the SampleID and Condition columns; other columns such as Replicate may be present. Each BAM file name must contain its SampleID.</w:t>
       </w:r>
     </w:p>
     <w:p>
@@ -30775,7 +30775,7 @@
                 <w:sz w:val="18"/>
                 <w:szCs w:val="18"/>
               </w:rPr>
-              <w:t xml:space="preserve">ATAC_QC와 같은 샘플 정보 CSV(SampleID, Condition, Replicate)</w:t>
+              <w:t xml:space="preserve">샘플 정보 CSV. SampleID(BAM 파일 이름에 들어 있는 샘플 이름), Condition(조건 이름), Replicate(반복 번호) 열이 필요. 조건마다 반복 2개 이상</w:t>
             </w:r>
           </w:p>
         </w:tc>
@@ -30795,7 +30795,7 @@
                 <w:sz w:val="18"/>
                 <w:szCs w:val="18"/>
               </w:rPr>
-              <w:t xml:space="preserve">Same sample sheet CSV as ATAC_QC (SampleID, Condition, Replicate)</w:t>
+              <w:t xml:space="preserve">Sample sheet CSV with SampleID (the sample name contained in each BAM file name), Condition (condition name), and Replicate (replicate number) columns; two or more replicates per condition</w:t>
             </w:r>
           </w:p>
         </w:tc>
@@ -31051,7 +31051,7 @@
                 <w:sz w:val="18"/>
                 <w:szCs w:val="18"/>
               </w:rPr>
-              <w:t xml:space="preserve">유효 유전체 크기(MACS3와 같음). hs, mm, ce, dm 또는 숫자</w:t>
+              <w:t xml:space="preserve">MACS3에 넘기는 유효 유전체 크기(-g). hs(사람), mm(쥐), ce(예쁜꼬마선충), dm(초파리) 또는 숫자(예: 애기장대 1.2e8)</w:t>
             </w:r>
           </w:p>
         </w:tc>
@@ -31071,7 +31071,7 @@
                 <w:sz w:val="18"/>
                 <w:szCs w:val="18"/>
               </w:rPr>
-              <w:t xml:space="preserve">Effective genome size (as for MACS3): hs, mm, ce, dm, or a number</w:t>
+              <w:t xml:space="preserve">Effective genome size passed to MACS3 (-g): hs (human), mm (mouse), ce (C. elegans), dm (fruit fly), or a number (for example 1.2e8 for Arabidopsis)</w:t>
             </w:r>
           </w:p>
         </w:tc>
@@ -31663,12 +31663,153 @@
     </w:p>
     <w:p>
       <w:pPr>
-        <w:spacing w:after="140"/>
-      </w:pPr>
-      <w:r>
-        <w:t xml:space="preserve">ATAC_QC와 같은 sample_data.csv를 사용한다(2번 모듈의 샘플시트 내용을 그대로 등록).</w:t>
-      </w:r>
-    </w:p>
+        <w:pStyle w:val="ListParagraph"/>
+        <w:numPr>
+          <w:ilvl w:val="0"/>
+          <w:numId w:val="2"/>
+        </w:numPr>
+        <w:spacing w:after="80"/>
+      </w:pPr>
+      <w:r>
+        <w:t xml:space="preserve">제목(국문): 샘플 정보 파일(sample_data)</w:t>
+      </w:r>
+    </w:p>
+    <w:p>
+      <w:pPr>
+        <w:pStyle w:val="ListParagraph"/>
+        <w:numPr>
+          <w:ilvl w:val="0"/>
+          <w:numId w:val="2"/>
+        </w:numPr>
+        <w:spacing w:after="80"/>
+      </w:pPr>
+      <w:r>
+        <w:t xml:space="preserve">제목(영문): Sample sheet (sample_data)</w:t>
+      </w:r>
+    </w:p>
+    <w:p>
+      <w:pPr>
+        <w:pStyle w:val="ListParagraph"/>
+        <w:numPr>
+          <w:ilvl w:val="0"/>
+          <w:numId w:val="2"/>
+        </w:numPr>
+        <w:spacing w:after="80"/>
+      </w:pPr>
+      <w:r>
+        <w:t xml:space="preserve">본문(국문): 쉼표로 구분한 CSV 파일이며 SampleID, Condition, Replicate 컬럼이 필요합니다. BAM 파일 이름에 SampleID가 포함되어 있어야 자동으로 연결됩니다. 조건마다 반복 실험이 2개 이상이어야 재현성을 계산합니다.</w:t>
+      </w:r>
+    </w:p>
+    <w:p>
+      <w:pPr>
+        <w:pStyle w:val="ListParagraph"/>
+        <w:numPr>
+          <w:ilvl w:val="0"/>
+          <w:numId w:val="2"/>
+        </w:numPr>
+        <w:spacing w:after="80"/>
+      </w:pPr>
+      <w:r>
+        <w:t xml:space="preserve">본문(영문): A comma-separated CSV with the SampleID, Condition, and Replicate columns. Each BAM file name must contain its SampleID for automatic matching. Each condition needs two or more replicates for the reproducibility analysis.</w:t>
+      </w:r>
+    </w:p>
+    <w:p>
+      <w:pPr>
+        <w:pStyle w:val="ListParagraph"/>
+        <w:numPr>
+          <w:ilvl w:val="0"/>
+          <w:numId w:val="2"/>
+        </w:numPr>
+        <w:spacing w:after="80"/>
+      </w:pPr>
+      <w:r>
+        <w:t xml:space="preserve">예시 제목: sample_data.csv</w:t>
+      </w:r>
+    </w:p>
+    <w:p>
+      <w:pPr>
+        <w:pStyle w:val="ListParagraph"/>
+        <w:numPr>
+          <w:ilvl w:val="0"/>
+          <w:numId w:val="2"/>
+        </w:numPr>
+        <w:spacing w:after="80"/>
+      </w:pPr>
+      <w:r>
+        <w:t xml:space="preserve">예시 본문:</w:t>
+      </w:r>
+    </w:p>
+    <w:p>
+      <w:pPr>
+        <w:shd w:fill="F3F4F6" w:color="auto" w:val="clear"/>
+        <w:spacing w:after="0"/>
+      </w:pPr>
+      <w:r>
+        <w:rPr>
+          <w:color w:val="3A3A3A"/>
+          <w:sz w:val="19"/>
+          <w:szCs w:val="19"/>
+        </w:rPr>
+        <w:t xml:space="preserve">SampleID,Condition,Replicate</w:t>
+      </w:r>
+    </w:p>
+    <w:p>
+      <w:pPr>
+        <w:shd w:fill="F3F4F6" w:color="auto" w:val="clear"/>
+        <w:spacing w:after="0"/>
+      </w:pPr>
+      <w:r>
+        <w:rPr>
+          <w:color w:val="3A3A3A"/>
+          <w:sz w:val="19"/>
+          <w:szCs w:val="19"/>
+        </w:rPr>
+        <w:t xml:space="preserve">ctrl_1,control,1</w:t>
+      </w:r>
+    </w:p>
+    <w:p>
+      <w:pPr>
+        <w:shd w:fill="F3F4F6" w:color="auto" w:val="clear"/>
+        <w:spacing w:after="0"/>
+      </w:pPr>
+      <w:r>
+        <w:rPr>
+          <w:color w:val="3A3A3A"/>
+          <w:sz w:val="19"/>
+          <w:szCs w:val="19"/>
+        </w:rPr>
+        <w:t xml:space="preserve">ctrl_2,control,2</w:t>
+      </w:r>
+    </w:p>
+    <w:p>
+      <w:pPr>
+        <w:shd w:fill="F3F4F6" w:color="auto" w:val="clear"/>
+        <w:spacing w:after="0"/>
+      </w:pPr>
+      <w:r>
+        <w:rPr>
+          <w:color w:val="3A3A3A"/>
+          <w:sz w:val="19"/>
+          <w:szCs w:val="19"/>
+        </w:rPr>
+        <w:t xml:space="preserve">trt_1,treated,1</w:t>
+      </w:r>
+    </w:p>
+    <w:p>
+      <w:pPr>
+        <w:shd w:fill="F3F4F6" w:color="auto" w:val="clear"/>
+        <w:spacing w:after="0"/>
+      </w:pPr>
+      <w:r>
+        <w:rPr>
+          <w:color w:val="3A3A3A"/>
+          <w:sz w:val="19"/>
+          <w:szCs w:val="19"/>
+        </w:rPr>
+        <w:t xml:space="preserve">trt_2,treated,2</w:t>
+      </w:r>
+    </w:p>
+    <w:p/>
     <w:p>
       <w:pPr>
         <w:spacing w:after="100" w:before="200"/>

</xml_diff>

<commit_message>
Leave gene_keytype off the portal and mark registration notes
functional_enrichment chooses the OrgDb key type itself (auto), so
gene_keytype is no longer listed in the portal content. Notes that only
tell the registrant which options are left off the portal now start with
'등록 메모:', which the Word builder shows as a do-not-paste note.

Co-Authored-By: Claude Opus 5.5 <noreply@anthropic.com>
</commit_message>
<xml_diff>
--- a/docs/ATAC-seq/modules/Portal_Content.docx
+++ b/docs/ATAC-seq/modules/Portal_Content.docx
@@ -3974,21 +3974,56 @@
     <w:p/>
     <w:p>
       <w:pPr>
-        <w:spacing w:after="140"/>
-      </w:pPr>
-      <w:r>
-        <w:t xml:space="preserve">스레드 수(</w:t>
-      </w:r>
-      <w:r>
+        <w:spacing w:after="120"/>
+      </w:pPr>
+      <w:r>
+        <w:rPr>
+          <w:b/>
+          <w:bCs/>
+          <w:color w:val="B0B0B0"/>
+          <w:sz w:val="18"/>
+          <w:szCs w:val="18"/>
+        </w:rPr>
+        <w:t xml:space="preserve">[내부 메모 · 붙여 넣지 마세요] </w:t>
+      </w:r>
+      <w:r>
+        <w:rPr>
+          <w:color w:val="8A8F99"/>
+          <w:sz w:val="18"/>
+          <w:szCs w:val="18"/>
+        </w:rPr>
+        <w:t xml:space="preserve">등록 메모: 스레드 수(</w:t>
+      </w:r>
+      <w:r>
+        <w:rPr>
+          <w:color w:val="8A8F99"/>
+          <w:sz w:val="18"/>
+          <w:szCs w:val="18"/>
+        </w:rPr>
         <w:t xml:space="preserve">threads</w:t>
       </w:r>
       <w:r>
+        <w:rPr>
+          <w:color w:val="8A8F99"/>
+          <w:sz w:val="18"/>
+          <w:szCs w:val="18"/>
+        </w:rPr>
         <w:t xml:space="preserve">)는 포탈에 등록하지 않는다. 실행 환경의 Processor Core 선택(싱글 코어 또는 최대 4코어)으로 정해지며, 스크립트 기본값 </w:t>
       </w:r>
       <w:r>
+        <w:rPr>
+          <w:color w:val="8A8F99"/>
+          <w:sz w:val="18"/>
+          <w:szCs w:val="18"/>
+        </w:rPr>
         <w:t xml:space="preserve">auto</w:t>
       </w:r>
       <w:r>
+        <w:rPr>
+          <w:color w:val="8A8F99"/>
+          <w:sz w:val="18"/>
+          <w:szCs w:val="18"/>
+        </w:rPr>
         <w:t xml:space="preserve">가 그 코어 수를 쓴다.</w:t>
       </w:r>
     </w:p>
@@ -21971,21 +22006,56 @@
     <w:p/>
     <w:p>
       <w:pPr>
-        <w:spacing w:after="140"/>
-      </w:pPr>
-      <w:r>
-        <w:t xml:space="preserve">스레드 수(</w:t>
-      </w:r>
-      <w:r>
+        <w:spacing w:after="120"/>
+      </w:pPr>
+      <w:r>
+        <w:rPr>
+          <w:b/>
+          <w:bCs/>
+          <w:color w:val="B0B0B0"/>
+          <w:sz w:val="18"/>
+          <w:szCs w:val="18"/>
+        </w:rPr>
+        <w:t xml:space="preserve">[내부 메모 · 붙여 넣지 마세요] </w:t>
+      </w:r>
+      <w:r>
+        <w:rPr>
+          <w:color w:val="8A8F99"/>
+          <w:sz w:val="18"/>
+          <w:szCs w:val="18"/>
+        </w:rPr>
+        <w:t xml:space="preserve">등록 메모: 스레드 수(</w:t>
+      </w:r>
+      <w:r>
+        <w:rPr>
+          <w:color w:val="8A8F99"/>
+          <w:sz w:val="18"/>
+          <w:szCs w:val="18"/>
+        </w:rPr>
         <w:t xml:space="preserve">threads</w:t>
       </w:r>
       <w:r>
+        <w:rPr>
+          <w:color w:val="8A8F99"/>
+          <w:sz w:val="18"/>
+          <w:szCs w:val="18"/>
+        </w:rPr>
         <w:t xml:space="preserve">)는 포탈에 등록하지 않는다. 실행 환경의 Processor Core 선택(싱글 코어 또는 최대 4코어)으로 정해지며, 스크립트 기본값 </w:t>
       </w:r>
       <w:r>
+        <w:rPr>
+          <w:color w:val="8A8F99"/>
+          <w:sz w:val="18"/>
+          <w:szCs w:val="18"/>
+        </w:rPr>
         <w:t xml:space="preserve">auto</w:t>
       </w:r>
       <w:r>
+        <w:rPr>
+          <w:color w:val="8A8F99"/>
+          <w:sz w:val="18"/>
+          <w:szCs w:val="18"/>
+        </w:rPr>
         <w:t xml:space="preserve">가 그 코어 수를 쓴다.</w:t>
       </w:r>
     </w:p>
@@ -24498,21 +24568,56 @@
     <w:p/>
     <w:p>
       <w:pPr>
-        <w:spacing w:after="140"/>
-      </w:pPr>
-      <w:r>
-        <w:t xml:space="preserve">코어 수(</w:t>
-      </w:r>
-      <w:r>
+        <w:spacing w:after="120"/>
+      </w:pPr>
+      <w:r>
+        <w:rPr>
+          <w:b/>
+          <w:bCs/>
+          <w:color w:val="B0B0B0"/>
+          <w:sz w:val="18"/>
+          <w:szCs w:val="18"/>
+        </w:rPr>
+        <w:t xml:space="preserve">[내부 메모 · 붙여 넣지 마세요] </w:t>
+      </w:r>
+      <w:r>
+        <w:rPr>
+          <w:color w:val="8A8F99"/>
+          <w:sz w:val="18"/>
+          <w:szCs w:val="18"/>
+        </w:rPr>
+        <w:t xml:space="preserve">등록 메모: 코어 수(</w:t>
+      </w:r>
+      <w:r>
+        <w:rPr>
+          <w:color w:val="8A8F99"/>
+          <w:sz w:val="18"/>
+          <w:szCs w:val="18"/>
+        </w:rPr>
         <w:t xml:space="preserve">cores</w:t>
       </w:r>
       <w:r>
+        <w:rPr>
+          <w:color w:val="8A8F99"/>
+          <w:sz w:val="18"/>
+          <w:szCs w:val="18"/>
+        </w:rPr>
         <w:t xml:space="preserve">)는 포탈에 등록하지 않는다. 실행 환경의 Processor Core 선택(싱글 코어 또는 최대 4코어)으로 정해지며, 스크립트 기본값 </w:t>
       </w:r>
       <w:r>
+        <w:rPr>
+          <w:color w:val="8A8F99"/>
+          <w:sz w:val="18"/>
+          <w:szCs w:val="18"/>
+        </w:rPr>
         <w:t xml:space="preserve">auto</w:t>
       </w:r>
       <w:r>
+        <w:rPr>
+          <w:color w:val="8A8F99"/>
+          <w:sz w:val="18"/>
+          <w:szCs w:val="18"/>
+        </w:rPr>
         <w:t xml:space="preserve">가 그 코어 수를 쓴다.</w:t>
       </w:r>
     </w:p>
@@ -26849,148 +26954,6 @@
                 <w:sz w:val="18"/>
                 <w:szCs w:val="18"/>
               </w:rPr>
-              <w:t xml:space="preserve">String</w:t>
-            </w:r>
-          </w:p>
-        </w:tc>
-        <w:tc>
-          <w:tcPr>
-            <w:tcW w:type="dxa" w:w="1400"/>
-            <w:tcMar>
-              <w:top w:type="dxa" w:w="60"/>
-              <w:left w:type="dxa" w:w="90"/>
-              <w:bottom w:type="dxa" w:w="60"/>
-              <w:right w:type="dxa" w:w="90"/>
-            </w:tcMar>
-          </w:tcPr>
-          <w:p>
-            <w:r>
-              <w:rPr>
-                <w:sz w:val="18"/>
-                <w:szCs w:val="18"/>
-              </w:rPr>
-              <w:t xml:space="preserve">gene_keytype</w:t>
-            </w:r>
-          </w:p>
-        </w:tc>
-        <w:tc>
-          <w:tcPr>
-            <w:tcW w:type="dxa" w:w="1000"/>
-            <w:tcMar>
-              <w:top w:type="dxa" w:w="60"/>
-              <w:left w:type="dxa" w:w="90"/>
-              <w:bottom w:type="dxa" w:w="60"/>
-              <w:right w:type="dxa" w:w="90"/>
-            </w:tcMar>
-          </w:tcPr>
-          <w:p>
-            <w:r>
-              <w:rPr>
-                <w:sz w:val="18"/>
-                <w:szCs w:val="18"/>
-              </w:rPr>
-              <w:t xml:space="preserve">auto</w:t>
-            </w:r>
-          </w:p>
-        </w:tc>
-        <w:tc>
-          <w:tcPr>
-            <w:tcW w:type="dxa" w:w="2140"/>
-            <w:tcMar>
-              <w:top w:type="dxa" w:w="60"/>
-              <w:left w:type="dxa" w:w="90"/>
-              <w:bottom w:type="dxa" w:w="60"/>
-              <w:right w:type="dxa" w:w="90"/>
-            </w:tcMar>
-          </w:tcPr>
-          <w:p>
-            <w:r>
-              <w:rPr>
-                <w:sz w:val="18"/>
-                <w:szCs w:val="18"/>
-              </w:rPr>
-              <w:t xml:space="preserve">OrgDb ID 종류(TAIR, ENTREZID, SYMBOL 등). auto는 자동 선택</w:t>
-            </w:r>
-          </w:p>
-        </w:tc>
-        <w:tc>
-          <w:tcPr>
-            <w:tcW w:type="dxa" w:w="2146"/>
-            <w:tcMar>
-              <w:top w:type="dxa" w:w="60"/>
-              <w:left w:type="dxa" w:w="90"/>
-              <w:bottom w:type="dxa" w:w="60"/>
-              <w:right w:type="dxa" w:w="90"/>
-            </w:tcMar>
-          </w:tcPr>
-          <w:p>
-            <w:r>
-              <w:rPr>
-                <w:sz w:val="18"/>
-                <w:szCs w:val="18"/>
-              </w:rPr>
-              <w:t xml:space="preserve">OrgDb key type (TAIR, ENTREZID, SYMBOL, ...); auto selects it</w:t>
-            </w:r>
-          </w:p>
-        </w:tc>
-      </w:tr>
-      <w:tr>
-        <w:tc>
-          <w:tcPr>
-            <w:tcW w:type="dxa" w:w="920"/>
-            <w:tcMar>
-              <w:top w:type="dxa" w:w="60"/>
-              <w:left w:type="dxa" w:w="90"/>
-              <w:bottom w:type="dxa" w:w="60"/>
-              <w:right w:type="dxa" w:w="90"/>
-            </w:tcMar>
-          </w:tcPr>
-          <w:p>
-            <w:r>
-              <w:rPr>
-                <w:sz w:val="18"/>
-                <w:szCs w:val="18"/>
-              </w:rPr>
-              <w:t xml:space="preserve">Option</w:t>
-            </w:r>
-          </w:p>
-        </w:tc>
-        <w:tc>
-          <w:tcPr>
-            <w:tcW w:type="dxa" w:w="950"/>
-            <w:tcMar>
-              <w:top w:type="dxa" w:w="60"/>
-              <w:left w:type="dxa" w:w="90"/>
-              <w:bottom w:type="dxa" w:w="60"/>
-              <w:right w:type="dxa" w:w="90"/>
-            </w:tcMar>
-          </w:tcPr>
-          <w:p>
-            <w:r>
-              <w:rPr>
-                <w:sz w:val="18"/>
-                <w:szCs w:val="18"/>
-              </w:rPr>
-              <w:t xml:space="preserve">Optional</w:t>
-            </w:r>
-          </w:p>
-        </w:tc>
-        <w:tc>
-          <w:tcPr>
-            <w:tcW w:type="dxa" w:w="950"/>
-            <w:tcMar>
-              <w:top w:type="dxa" w:w="60"/>
-              <w:left w:type="dxa" w:w="90"/>
-              <w:bottom w:type="dxa" w:w="60"/>
-              <w:right w:type="dxa" w:w="90"/>
-            </w:tcMar>
-          </w:tcPr>
-          <w:p>
-            <w:r>
-              <w:rPr>
-                <w:sz w:val="18"/>
-                <w:szCs w:val="18"/>
-              </w:rPr>
               <w:t xml:space="preserve">List</w:t>
             </w:r>
           </w:p>
@@ -28782,6 +28745,45 @@
       </w:tr>
     </w:tbl>
     <w:p/>
+    <w:p>
+      <w:pPr>
+        <w:spacing w:after="120"/>
+      </w:pPr>
+      <w:r>
+        <w:rPr>
+          <w:b/>
+          <w:bCs/>
+          <w:color w:val="B0B0B0"/>
+          <w:sz w:val="18"/>
+          <w:szCs w:val="18"/>
+        </w:rPr>
+        <w:t xml:space="preserve">[내부 메모 · 붙여 넣지 마세요] </w:t>
+      </w:r>
+      <w:r>
+        <w:rPr>
+          <w:color w:val="8A8F99"/>
+          <w:sz w:val="18"/>
+          <w:szCs w:val="18"/>
+        </w:rPr>
+        <w:t xml:space="preserve">등록 메모: OrgDb의 ID 종류(</w:t>
+      </w:r>
+      <w:r>
+        <w:rPr>
+          <w:color w:val="8A8F99"/>
+          <w:sz w:val="18"/>
+          <w:szCs w:val="18"/>
+        </w:rPr>
+        <w:t xml:space="preserve">gene_keytype</w:t>
+      </w:r>
+      <w:r>
+        <w:rPr>
+          <w:color w:val="8A8F99"/>
+          <w:sz w:val="18"/>
+          <w:szCs w:val="18"/>
+        </w:rPr>
+        <w:t xml:space="preserve">)는 포탈에 등록하지 않는다. 스크립트가 입력 유전자 ID와 가장 많이 맞는 종류(TAIR, ENTREZID, SYMBOL 등)를 자동으로 고른다.</w:t>
+      </w:r>
+    </w:p>
     <w:p>
       <w:pPr>
         <w:spacing w:after="100" w:before="200"/>
@@ -29267,20 +29269,6 @@
           <w:szCs w:val="19"/>
         </w:rPr>
         <w:t xml:space="preserve">  output_dir=/data/functional_enrichment \</w:t>
-      </w:r>
-    </w:p>
-    <w:p>
-      <w:pPr>
-        <w:shd w:fill="F3F4F6" w:color="auto" w:val="clear"/>
-        <w:spacing w:after="0"/>
-      </w:pPr>
-      <w:r>
-        <w:rPr>
-          <w:color w:val="3A3A3A"/>
-          <w:sz w:val="19"/>
-          <w:szCs w:val="19"/>
-        </w:rPr>
-        <w:t xml:space="preserve">  gene_keytype=auto \</w:t>
       </w:r>
     </w:p>
     <w:p>

</xml_diff>

<commit_message>
Set the major and minor category of every ATAC-seq module
Each module now has its category as two rows (major, minor) in Korean
and English, following the function-based list instead of the earlier
suggestions such as Epigenomics / Peak Calling. The portal guide lists
every major and minor category with Korean names and the ATAC-seq
module in each.

Co-Authored-By: Claude Opus 5.5 <noreply@anthropic.com>
</commit_message>
<xml_diff>
--- a/docs/ATAC-seq/modules/Portal_Content.docx
+++ b/docs/ATAC-seq/modules/Portal_Content.docx
@@ -313,7 +313,13 @@
         <w:spacing w:after="80"/>
       </w:pPr>
       <w:r>
-        <w:t xml:space="preserve">카테고리와 아이콘은 포탈 목록에서 고른다. 원고의 카테고리는 제안이다.</w:t>
+        <w:t xml:space="preserve">카테고리는 기능(분석 단계) 기준의 대분류·중분류로 정했다(</w:t>
+      </w:r>
+      <w:r>
+        <w:t xml:space="preserve">docs/CLOSHA_Portal_Guide_v1.md</w:t>
+      </w:r>
+      <w:r>
+        <w:t xml:space="preserve"> 5.2). 아이콘은 대분류마다 하나다.</w:t>
       </w:r>
     </w:p>
     <w:p>
@@ -685,7 +691,7 @@
                 <w:sz w:val="18"/>
                 <w:szCs w:val="18"/>
               </w:rPr>
-              <w:t xml:space="preserve">카테고리 (제안)</w:t>
+              <w:t xml:space="preserve">카테고리 대분류</w:t>
             </w:r>
           </w:p>
         </w:tc>
@@ -705,7 +711,7 @@
                 <w:sz w:val="18"/>
                 <w:szCs w:val="18"/>
               </w:rPr>
-              <w:t xml:space="preserve">Alignment / Read Alignment</w:t>
+              <w:t xml:space="preserve">정렬</w:t>
             </w:r>
           </w:p>
         </w:tc>
@@ -719,7 +725,77 @@
               <w:right w:type="dxa" w:w="90"/>
             </w:tcMar>
           </w:tcPr>
-          <w:p/>
+          <w:p>
+            <w:r>
+              <w:rPr>
+                <w:sz w:val="18"/>
+                <w:szCs w:val="18"/>
+              </w:rPr>
+              <w:t xml:space="preserve">Alignment</w:t>
+            </w:r>
+          </w:p>
+        </w:tc>
+      </w:tr>
+      <w:tr>
+        <w:tc>
+          <w:tcPr>
+            <w:tcW w:type="dxa" w:w="1800"/>
+            <w:tcMar>
+              <w:top w:type="dxa" w:w="60"/>
+              <w:left w:type="dxa" w:w="90"/>
+              <w:bottom w:type="dxa" w:w="60"/>
+              <w:right w:type="dxa" w:w="90"/>
+            </w:tcMar>
+          </w:tcPr>
+          <w:p>
+            <w:r>
+              <w:rPr>
+                <w:sz w:val="18"/>
+                <w:szCs w:val="18"/>
+              </w:rPr>
+              <w:t xml:space="preserve">카테고리 중분류</w:t>
+            </w:r>
+          </w:p>
+        </w:tc>
+        <w:tc>
+          <w:tcPr>
+            <w:tcW w:type="dxa" w:w="3853"/>
+            <w:tcMar>
+              <w:top w:type="dxa" w:w="60"/>
+              <w:left w:type="dxa" w:w="90"/>
+              <w:bottom w:type="dxa" w:w="60"/>
+              <w:right w:type="dxa" w:w="90"/>
+            </w:tcMar>
+          </w:tcPr>
+          <w:p>
+            <w:r>
+              <w:rPr>
+                <w:sz w:val="18"/>
+                <w:szCs w:val="18"/>
+              </w:rPr>
+              <w:t xml:space="preserve">read 정렬</w:t>
+            </w:r>
+          </w:p>
+        </w:tc>
+        <w:tc>
+          <w:tcPr>
+            <w:tcW w:type="dxa" w:w="3853"/>
+            <w:tcMar>
+              <w:top w:type="dxa" w:w="60"/>
+              <w:left w:type="dxa" w:w="90"/>
+              <w:bottom w:type="dxa" w:w="60"/>
+              <w:right w:type="dxa" w:w="90"/>
+            </w:tcMar>
+          </w:tcPr>
+          <w:p>
+            <w:r>
+              <w:rPr>
+                <w:sz w:val="18"/>
+                <w:szCs w:val="18"/>
+              </w:rPr>
+              <w:t xml:space="preserve">Read Alignment</w:t>
+            </w:r>
+          </w:p>
         </w:tc>
       </w:tr>
       <w:tr>
@@ -2941,7 +3017,7 @@
                 <w:sz w:val="18"/>
                 <w:szCs w:val="18"/>
               </w:rPr>
-              <w:t xml:space="preserve">카테고리 (제안)</w:t>
+              <w:t xml:space="preserve">카테고리 대분류</w:t>
             </w:r>
           </w:p>
         </w:tc>
@@ -2961,7 +3037,7 @@
                 <w:sz w:val="18"/>
                 <w:szCs w:val="18"/>
               </w:rPr>
-              <w:t xml:space="preserve">Quality Control / Read Filtering</w:t>
+              <w:t xml:space="preserve">정렬</w:t>
             </w:r>
           </w:p>
         </w:tc>
@@ -2975,7 +3051,77 @@
               <w:right w:type="dxa" w:w="90"/>
             </w:tcMar>
           </w:tcPr>
-          <w:p/>
+          <w:p>
+            <w:r>
+              <w:rPr>
+                <w:sz w:val="18"/>
+                <w:szCs w:val="18"/>
+              </w:rPr>
+              <w:t xml:space="preserve">Alignment</w:t>
+            </w:r>
+          </w:p>
+        </w:tc>
+      </w:tr>
+      <w:tr>
+        <w:tc>
+          <w:tcPr>
+            <w:tcW w:type="dxa" w:w="1800"/>
+            <w:tcMar>
+              <w:top w:type="dxa" w:w="60"/>
+              <w:left w:type="dxa" w:w="90"/>
+              <w:bottom w:type="dxa" w:w="60"/>
+              <w:right w:type="dxa" w:w="90"/>
+            </w:tcMar>
+          </w:tcPr>
+          <w:p>
+            <w:r>
+              <w:rPr>
+                <w:sz w:val="18"/>
+                <w:szCs w:val="18"/>
+              </w:rPr>
+              <w:t xml:space="preserve">카테고리 중분류</w:t>
+            </w:r>
+          </w:p>
+        </w:tc>
+        <w:tc>
+          <w:tcPr>
+            <w:tcW w:type="dxa" w:w="3853"/>
+            <w:tcMar>
+              <w:top w:type="dxa" w:w="60"/>
+              <w:left w:type="dxa" w:w="90"/>
+              <w:bottom w:type="dxa" w:w="60"/>
+              <w:right w:type="dxa" w:w="90"/>
+            </w:tcMar>
+          </w:tcPr>
+          <w:p>
+            <w:r>
+              <w:rPr>
+                <w:sz w:val="18"/>
+                <w:szCs w:val="18"/>
+              </w:rPr>
+              <w:t xml:space="preserve">정렬 결과 처리</w:t>
+            </w:r>
+          </w:p>
+        </w:tc>
+        <w:tc>
+          <w:tcPr>
+            <w:tcW w:type="dxa" w:w="3853"/>
+            <w:tcMar>
+              <w:top w:type="dxa" w:w="60"/>
+              <w:left w:type="dxa" w:w="90"/>
+              <w:bottom w:type="dxa" w:w="60"/>
+              <w:right w:type="dxa" w:w="90"/>
+            </w:tcMar>
+          </w:tcPr>
+          <w:p>
+            <w:r>
+              <w:rPr>
+                <w:sz w:val="18"/>
+                <w:szCs w:val="18"/>
+              </w:rPr>
+              <w:t xml:space="preserve">Alignment Processing</w:t>
+            </w:r>
+          </w:p>
         </w:tc>
       </w:tr>
       <w:tr>
@@ -5336,7 +5482,7 @@
                 <w:sz w:val="18"/>
                 <w:szCs w:val="18"/>
               </w:rPr>
-              <w:t xml:space="preserve">카테고리 (제안)</w:t>
+              <w:t xml:space="preserve">카테고리 대분류</w:t>
             </w:r>
           </w:p>
         </w:tc>
@@ -5356,7 +5502,7 @@
                 <w:sz w:val="18"/>
                 <w:szCs w:val="18"/>
               </w:rPr>
-              <w:t xml:space="preserve">Quality Control / ATAC-seq QC</w:t>
+              <w:t xml:space="preserve">품질 관리</w:t>
             </w:r>
           </w:p>
         </w:tc>
@@ -5370,7 +5516,77 @@
               <w:right w:type="dxa" w:w="90"/>
             </w:tcMar>
           </w:tcPr>
-          <w:p/>
+          <w:p>
+            <w:r>
+              <w:rPr>
+                <w:sz w:val="18"/>
+                <w:szCs w:val="18"/>
+              </w:rPr>
+              <w:t xml:space="preserve">Quality Control</w:t>
+            </w:r>
+          </w:p>
+        </w:tc>
+      </w:tr>
+      <w:tr>
+        <w:tc>
+          <w:tcPr>
+            <w:tcW w:type="dxa" w:w="1800"/>
+            <w:tcMar>
+              <w:top w:type="dxa" w:w="60"/>
+              <w:left w:type="dxa" w:w="90"/>
+              <w:bottom w:type="dxa" w:w="60"/>
+              <w:right w:type="dxa" w:w="90"/>
+            </w:tcMar>
+          </w:tcPr>
+          <w:p>
+            <w:r>
+              <w:rPr>
+                <w:sz w:val="18"/>
+                <w:szCs w:val="18"/>
+              </w:rPr>
+              <w:t xml:space="preserve">카테고리 중분류</w:t>
+            </w:r>
+          </w:p>
+        </w:tc>
+        <w:tc>
+          <w:tcPr>
+            <w:tcW w:type="dxa" w:w="3853"/>
+            <w:tcMar>
+              <w:top w:type="dxa" w:w="60"/>
+              <w:left w:type="dxa" w:w="90"/>
+              <w:bottom w:type="dxa" w:w="60"/>
+              <w:right w:type="dxa" w:w="90"/>
+            </w:tcMar>
+          </w:tcPr>
+          <w:p>
+            <w:r>
+              <w:rPr>
+                <w:sz w:val="18"/>
+                <w:szCs w:val="18"/>
+              </w:rPr>
+              <w:t xml:space="preserve">정렬 품질 평가</w:t>
+            </w:r>
+          </w:p>
+        </w:tc>
+        <w:tc>
+          <w:tcPr>
+            <w:tcW w:type="dxa" w:w="3853"/>
+            <w:tcMar>
+              <w:top w:type="dxa" w:w="60"/>
+              <w:left w:type="dxa" w:w="90"/>
+              <w:bottom w:type="dxa" w:w="60"/>
+              <w:right w:type="dxa" w:w="90"/>
+            </w:tcMar>
+          </w:tcPr>
+          <w:p>
+            <w:r>
+              <w:rPr>
+                <w:sz w:val="18"/>
+                <w:szCs w:val="18"/>
+              </w:rPr>
+              <w:t xml:space="preserve">Alignment QC</w:t>
+            </w:r>
+          </w:p>
         </w:tc>
       </w:tr>
       <w:tr>
@@ -9050,7 +9266,7 @@
                 <w:sz w:val="18"/>
                 <w:szCs w:val="18"/>
               </w:rPr>
-              <w:t xml:space="preserve">카테고리 (제안)</w:t>
+              <w:t xml:space="preserve">카테고리 대분류</w:t>
             </w:r>
           </w:p>
         </w:tc>
@@ -9070,7 +9286,7 @@
                 <w:sz w:val="18"/>
                 <w:szCs w:val="18"/>
               </w:rPr>
-              <w:t xml:space="preserve">Quality Control / ATAC-seq QC</w:t>
+              <w:t xml:space="preserve">품질 관리</w:t>
             </w:r>
           </w:p>
         </w:tc>
@@ -9084,7 +9300,77 @@
               <w:right w:type="dxa" w:w="90"/>
             </w:tcMar>
           </w:tcPr>
-          <w:p/>
+          <w:p>
+            <w:r>
+              <w:rPr>
+                <w:sz w:val="18"/>
+                <w:szCs w:val="18"/>
+              </w:rPr>
+              <w:t xml:space="preserve">Quality Control</w:t>
+            </w:r>
+          </w:p>
+        </w:tc>
+      </w:tr>
+      <w:tr>
+        <w:tc>
+          <w:tcPr>
+            <w:tcW w:type="dxa" w:w="1800"/>
+            <w:tcMar>
+              <w:top w:type="dxa" w:w="60"/>
+              <w:left w:type="dxa" w:w="90"/>
+              <w:bottom w:type="dxa" w:w="60"/>
+              <w:right w:type="dxa" w:w="90"/>
+            </w:tcMar>
+          </w:tcPr>
+          <w:p>
+            <w:r>
+              <w:rPr>
+                <w:sz w:val="18"/>
+                <w:szCs w:val="18"/>
+              </w:rPr>
+              <w:t xml:space="preserve">카테고리 중분류</w:t>
+            </w:r>
+          </w:p>
+        </w:tc>
+        <w:tc>
+          <w:tcPr>
+            <w:tcW w:type="dxa" w:w="3853"/>
+            <w:tcMar>
+              <w:top w:type="dxa" w:w="60"/>
+              <w:left w:type="dxa" w:w="90"/>
+              <w:bottom w:type="dxa" w:w="60"/>
+              <w:right w:type="dxa" w:w="90"/>
+            </w:tcMar>
+          </w:tcPr>
+          <w:p>
+            <w:r>
+              <w:rPr>
+                <w:sz w:val="18"/>
+                <w:szCs w:val="18"/>
+              </w:rPr>
+              <w:t xml:space="preserve">정렬 품질 평가</w:t>
+            </w:r>
+          </w:p>
+        </w:tc>
+        <w:tc>
+          <w:tcPr>
+            <w:tcW w:type="dxa" w:w="3853"/>
+            <w:tcMar>
+              <w:top w:type="dxa" w:w="60"/>
+              <w:left w:type="dxa" w:w="90"/>
+              <w:bottom w:type="dxa" w:w="60"/>
+              <w:right w:type="dxa" w:w="90"/>
+            </w:tcMar>
+          </w:tcPr>
+          <w:p>
+            <w:r>
+              <w:rPr>
+                <w:sz w:val="18"/>
+                <w:szCs w:val="18"/>
+              </w:rPr>
+              <w:t xml:space="preserve">Alignment QC</w:t>
+            </w:r>
+          </w:p>
         </w:tc>
       </w:tr>
       <w:tr>
@@ -12364,7 +12650,7 @@
                 <w:sz w:val="18"/>
                 <w:szCs w:val="18"/>
               </w:rPr>
-              <w:t xml:space="preserve">카테고리 (제안)</w:t>
+              <w:t xml:space="preserve">카테고리 대분류</w:t>
             </w:r>
           </w:p>
         </w:tc>
@@ -12384,7 +12670,7 @@
                 <w:sz w:val="18"/>
                 <w:szCs w:val="18"/>
               </w:rPr>
-              <w:t xml:space="preserve">Epigenomics / Peak Calling</w:t>
+              <w:t xml:space="preserve">특징 검출</w:t>
             </w:r>
           </w:p>
         </w:tc>
@@ -12398,7 +12684,77 @@
               <w:right w:type="dxa" w:w="90"/>
             </w:tcMar>
           </w:tcPr>
-          <w:p/>
+          <w:p>
+            <w:r>
+              <w:rPr>
+                <w:sz w:val="18"/>
+                <w:szCs w:val="18"/>
+              </w:rPr>
+              <w:t xml:space="preserve">Feature Detection</w:t>
+            </w:r>
+          </w:p>
+        </w:tc>
+      </w:tr>
+      <w:tr>
+        <w:tc>
+          <w:tcPr>
+            <w:tcW w:type="dxa" w:w="1800"/>
+            <w:tcMar>
+              <w:top w:type="dxa" w:w="60"/>
+              <w:left w:type="dxa" w:w="90"/>
+              <w:bottom w:type="dxa" w:w="60"/>
+              <w:right w:type="dxa" w:w="90"/>
+            </w:tcMar>
+          </w:tcPr>
+          <w:p>
+            <w:r>
+              <w:rPr>
+                <w:sz w:val="18"/>
+                <w:szCs w:val="18"/>
+              </w:rPr>
+              <w:t xml:space="preserve">카테고리 중분류</w:t>
+            </w:r>
+          </w:p>
+        </w:tc>
+        <w:tc>
+          <w:tcPr>
+            <w:tcW w:type="dxa" w:w="3853"/>
+            <w:tcMar>
+              <w:top w:type="dxa" w:w="60"/>
+              <w:left w:type="dxa" w:w="90"/>
+              <w:bottom w:type="dxa" w:w="60"/>
+              <w:right w:type="dxa" w:w="90"/>
+            </w:tcMar>
+          </w:tcPr>
+          <w:p>
+            <w:r>
+              <w:rPr>
+                <w:sz w:val="18"/>
+                <w:szCs w:val="18"/>
+              </w:rPr>
+              <w:t xml:space="preserve">peak 검출</w:t>
+            </w:r>
+          </w:p>
+        </w:tc>
+        <w:tc>
+          <w:tcPr>
+            <w:tcW w:type="dxa" w:w="3853"/>
+            <w:tcMar>
+              <w:top w:type="dxa" w:w="60"/>
+              <w:left w:type="dxa" w:w="90"/>
+              <w:bottom w:type="dxa" w:w="60"/>
+              <w:right w:type="dxa" w:w="90"/>
+            </w:tcMar>
+          </w:tcPr>
+          <w:p>
+            <w:r>
+              <w:rPr>
+                <w:sz w:val="18"/>
+                <w:szCs w:val="18"/>
+              </w:rPr>
+              <w:t xml:space="preserve">Peak Calling</w:t>
+            </w:r>
+          </w:p>
         </w:tc>
       </w:tr>
       <w:tr>
@@ -15472,7 +15828,7 @@
                 <w:sz w:val="18"/>
                 <w:szCs w:val="18"/>
               </w:rPr>
-              <w:t xml:space="preserve">카테고리 (제안)</w:t>
+              <w:t xml:space="preserve">카테고리 대분류</w:t>
             </w:r>
           </w:p>
         </w:tc>
@@ -15492,7 +15848,7 @@
                 <w:sz w:val="18"/>
                 <w:szCs w:val="18"/>
               </w:rPr>
-              <w:t xml:space="preserve">Epigenomics / Annotation</w:t>
+              <w:t xml:space="preserve">주석</w:t>
             </w:r>
           </w:p>
         </w:tc>
@@ -15506,7 +15862,77 @@
               <w:right w:type="dxa" w:w="90"/>
             </w:tcMar>
           </w:tcPr>
-          <w:p/>
+          <w:p>
+            <w:r>
+              <w:rPr>
+                <w:sz w:val="18"/>
+                <w:szCs w:val="18"/>
+              </w:rPr>
+              <w:t xml:space="preserve">Annotation</w:t>
+            </w:r>
+          </w:p>
+        </w:tc>
+      </w:tr>
+      <w:tr>
+        <w:tc>
+          <w:tcPr>
+            <w:tcW w:type="dxa" w:w="1800"/>
+            <w:tcMar>
+              <w:top w:type="dxa" w:w="60"/>
+              <w:left w:type="dxa" w:w="90"/>
+              <w:bottom w:type="dxa" w:w="60"/>
+              <w:right w:type="dxa" w:w="90"/>
+            </w:tcMar>
+          </w:tcPr>
+          <w:p>
+            <w:r>
+              <w:rPr>
+                <w:sz w:val="18"/>
+                <w:szCs w:val="18"/>
+              </w:rPr>
+              <w:t xml:space="preserve">카테고리 중분류</w:t>
+            </w:r>
+          </w:p>
+        </w:tc>
+        <w:tc>
+          <w:tcPr>
+            <w:tcW w:type="dxa" w:w="3853"/>
+            <w:tcMar>
+              <w:top w:type="dxa" w:w="60"/>
+              <w:left w:type="dxa" w:w="90"/>
+              <w:bottom w:type="dxa" w:w="60"/>
+              <w:right w:type="dxa" w:w="90"/>
+            </w:tcMar>
+          </w:tcPr>
+          <w:p>
+            <w:r>
+              <w:rPr>
+                <w:sz w:val="18"/>
+                <w:szCs w:val="18"/>
+              </w:rPr>
+              <w:t xml:space="preserve">유전체 영역 주석</w:t>
+            </w:r>
+          </w:p>
+        </w:tc>
+        <w:tc>
+          <w:tcPr>
+            <w:tcW w:type="dxa" w:w="3853"/>
+            <w:tcMar>
+              <w:top w:type="dxa" w:w="60"/>
+              <w:left w:type="dxa" w:w="90"/>
+              <w:bottom w:type="dxa" w:w="60"/>
+              <w:right w:type="dxa" w:w="90"/>
+            </w:tcMar>
+          </w:tcPr>
+          <w:p>
+            <w:r>
+              <w:rPr>
+                <w:sz w:val="18"/>
+                <w:szCs w:val="18"/>
+              </w:rPr>
+              <w:t xml:space="preserve">Genomic Feature Annotation</w:t>
+            </w:r>
+          </w:p>
         </w:tc>
       </w:tr>
       <w:tr>
@@ -18925,7 +19351,7 @@
                 <w:sz w:val="18"/>
                 <w:szCs w:val="18"/>
               </w:rPr>
-              <w:t xml:space="preserve">카테고리 (제안)</w:t>
+              <w:t xml:space="preserve">카테고리 대분류</w:t>
             </w:r>
           </w:p>
         </w:tc>
@@ -18945,7 +19371,7 @@
                 <w:sz w:val="18"/>
                 <w:szCs w:val="18"/>
               </w:rPr>
-              <w:t xml:space="preserve">Epigenomics / Differential Analysis</w:t>
+              <w:t xml:space="preserve">통계 분석</w:t>
             </w:r>
           </w:p>
         </w:tc>
@@ -18959,7 +19385,77 @@
               <w:right w:type="dxa" w:w="90"/>
             </w:tcMar>
           </w:tcPr>
-          <w:p/>
+          <w:p>
+            <w:r>
+              <w:rPr>
+                <w:sz w:val="18"/>
+                <w:szCs w:val="18"/>
+              </w:rPr>
+              <w:t xml:space="preserve">Statistical Analysis</w:t>
+            </w:r>
+          </w:p>
+        </w:tc>
+      </w:tr>
+      <w:tr>
+        <w:tc>
+          <w:tcPr>
+            <w:tcW w:type="dxa" w:w="1800"/>
+            <w:tcMar>
+              <w:top w:type="dxa" w:w="60"/>
+              <w:left w:type="dxa" w:w="90"/>
+              <w:bottom w:type="dxa" w:w="60"/>
+              <w:right w:type="dxa" w:w="90"/>
+            </w:tcMar>
+          </w:tcPr>
+          <w:p>
+            <w:r>
+              <w:rPr>
+                <w:sz w:val="18"/>
+                <w:szCs w:val="18"/>
+              </w:rPr>
+              <w:t xml:space="preserve">카테고리 중분류</w:t>
+            </w:r>
+          </w:p>
+        </w:tc>
+        <w:tc>
+          <w:tcPr>
+            <w:tcW w:type="dxa" w:w="3853"/>
+            <w:tcMar>
+              <w:top w:type="dxa" w:w="60"/>
+              <w:left w:type="dxa" w:w="90"/>
+              <w:bottom w:type="dxa" w:w="60"/>
+              <w:right w:type="dxa" w:w="90"/>
+            </w:tcMar>
+          </w:tcPr>
+          <w:p>
+            <w:r>
+              <w:rPr>
+                <w:sz w:val="18"/>
+                <w:szCs w:val="18"/>
+              </w:rPr>
+              <w:t xml:space="preserve">차등 분석</w:t>
+            </w:r>
+          </w:p>
+        </w:tc>
+        <w:tc>
+          <w:tcPr>
+            <w:tcW w:type="dxa" w:w="3853"/>
+            <w:tcMar>
+              <w:top w:type="dxa" w:w="60"/>
+              <w:left w:type="dxa" w:w="90"/>
+              <w:bottom w:type="dxa" w:w="60"/>
+              <w:right w:type="dxa" w:w="90"/>
+            </w:tcMar>
+          </w:tcPr>
+          <w:p>
+            <w:r>
+              <w:rPr>
+                <w:sz w:val="18"/>
+                <w:szCs w:val="18"/>
+              </w:rPr>
+              <w:t xml:space="preserve">Differential Analysis</w:t>
+            </w:r>
+          </w:p>
         </w:tc>
       </w:tr>
       <w:tr>
@@ -23261,7 +23757,7 @@
                 <w:sz w:val="18"/>
                 <w:szCs w:val="18"/>
               </w:rPr>
-              <w:t xml:space="preserve">카테고리 (제안)</w:t>
+              <w:t xml:space="preserve">카테고리 대분류</w:t>
             </w:r>
           </w:p>
         </w:tc>
@@ -23281,7 +23777,7 @@
                 <w:sz w:val="18"/>
                 <w:szCs w:val="18"/>
               </w:rPr>
-              <w:t xml:space="preserve">Epigenomics / Motif Analysis</w:t>
+              <w:t xml:space="preserve">유전자 조절</w:t>
             </w:r>
           </w:p>
         </w:tc>
@@ -23295,7 +23791,77 @@
               <w:right w:type="dxa" w:w="90"/>
             </w:tcMar>
           </w:tcPr>
-          <w:p/>
+          <w:p>
+            <w:r>
+              <w:rPr>
+                <w:sz w:val="18"/>
+                <w:szCs w:val="18"/>
+              </w:rPr>
+              <w:t xml:space="preserve">Gene Regulation</w:t>
+            </w:r>
+          </w:p>
+        </w:tc>
+      </w:tr>
+      <w:tr>
+        <w:tc>
+          <w:tcPr>
+            <w:tcW w:type="dxa" w:w="1800"/>
+            <w:tcMar>
+              <w:top w:type="dxa" w:w="60"/>
+              <w:left w:type="dxa" w:w="90"/>
+              <w:bottom w:type="dxa" w:w="60"/>
+              <w:right w:type="dxa" w:w="90"/>
+            </w:tcMar>
+          </w:tcPr>
+          <w:p>
+            <w:r>
+              <w:rPr>
+                <w:sz w:val="18"/>
+                <w:szCs w:val="18"/>
+              </w:rPr>
+              <w:t xml:space="preserve">카테고리 중분류</w:t>
+            </w:r>
+          </w:p>
+        </w:tc>
+        <w:tc>
+          <w:tcPr>
+            <w:tcW w:type="dxa" w:w="3853"/>
+            <w:tcMar>
+              <w:top w:type="dxa" w:w="60"/>
+              <w:left w:type="dxa" w:w="90"/>
+              <w:bottom w:type="dxa" w:w="60"/>
+              <w:right w:type="dxa" w:w="90"/>
+            </w:tcMar>
+          </w:tcPr>
+          <w:p>
+            <w:r>
+              <w:rPr>
+                <w:sz w:val="18"/>
+                <w:szCs w:val="18"/>
+              </w:rPr>
+              <w:t xml:space="preserve">모티프 분석</w:t>
+            </w:r>
+          </w:p>
+        </w:tc>
+        <w:tc>
+          <w:tcPr>
+            <w:tcW w:type="dxa" w:w="3853"/>
+            <w:tcMar>
+              <w:top w:type="dxa" w:w="60"/>
+              <w:left w:type="dxa" w:w="90"/>
+              <w:bottom w:type="dxa" w:w="60"/>
+              <w:right w:type="dxa" w:w="90"/>
+            </w:tcMar>
+          </w:tcPr>
+          <w:p>
+            <w:r>
+              <w:rPr>
+                <w:sz w:val="18"/>
+                <w:szCs w:val="18"/>
+              </w:rPr>
+              <w:t xml:space="preserve">Motif Analysis</w:t>
+            </w:r>
+          </w:p>
         </w:tc>
       </w:tr>
       <w:tr>
@@ -27967,7 +28533,7 @@
                 <w:sz w:val="18"/>
                 <w:szCs w:val="18"/>
               </w:rPr>
-              <w:t xml:space="preserve">카테고리 (제안)</w:t>
+              <w:t xml:space="preserve">카테고리 대분류</w:t>
             </w:r>
           </w:p>
         </w:tc>
@@ -27987,7 +28553,7 @@
                 <w:sz w:val="18"/>
                 <w:szCs w:val="18"/>
               </w:rPr>
-              <w:t xml:space="preserve">Epigenomics / Footprinting</w:t>
+              <w:t xml:space="preserve">유전자 조절</w:t>
             </w:r>
           </w:p>
         </w:tc>
@@ -28001,7 +28567,77 @@
               <w:right w:type="dxa" w:w="90"/>
             </w:tcMar>
           </w:tcPr>
-          <w:p/>
+          <w:p>
+            <w:r>
+              <w:rPr>
+                <w:sz w:val="18"/>
+                <w:szCs w:val="18"/>
+              </w:rPr>
+              <w:t xml:space="preserve">Gene Regulation</w:t>
+            </w:r>
+          </w:p>
+        </w:tc>
+      </w:tr>
+      <w:tr>
+        <w:tc>
+          <w:tcPr>
+            <w:tcW w:type="dxa" w:w="1800"/>
+            <w:tcMar>
+              <w:top w:type="dxa" w:w="60"/>
+              <w:left w:type="dxa" w:w="90"/>
+              <w:bottom w:type="dxa" w:w="60"/>
+              <w:right w:type="dxa" w:w="90"/>
+            </w:tcMar>
+          </w:tcPr>
+          <w:p>
+            <w:r>
+              <w:rPr>
+                <w:sz w:val="18"/>
+                <w:szCs w:val="18"/>
+              </w:rPr>
+              <w:t xml:space="preserve">카테고리 중분류</w:t>
+            </w:r>
+          </w:p>
+        </w:tc>
+        <w:tc>
+          <w:tcPr>
+            <w:tcW w:type="dxa" w:w="3853"/>
+            <w:tcMar>
+              <w:top w:type="dxa" w:w="60"/>
+              <w:left w:type="dxa" w:w="90"/>
+              <w:bottom w:type="dxa" w:w="60"/>
+              <w:right w:type="dxa" w:w="90"/>
+            </w:tcMar>
+          </w:tcPr>
+          <w:p>
+            <w:r>
+              <w:rPr>
+                <w:sz w:val="18"/>
+                <w:szCs w:val="18"/>
+              </w:rPr>
+              <w:t xml:space="preserve">전사인자 footprint</w:t>
+            </w:r>
+          </w:p>
+        </w:tc>
+        <w:tc>
+          <w:tcPr>
+            <w:tcW w:type="dxa" w:w="3853"/>
+            <w:tcMar>
+              <w:top w:type="dxa" w:w="60"/>
+              <w:left w:type="dxa" w:w="90"/>
+              <w:bottom w:type="dxa" w:w="60"/>
+              <w:right w:type="dxa" w:w="90"/>
+            </w:tcMar>
+          </w:tcPr>
+          <w:p>
+            <w:r>
+              <w:rPr>
+                <w:sz w:val="18"/>
+                <w:szCs w:val="18"/>
+              </w:rPr>
+              <w:t xml:space="preserve">TF Footprinting</w:t>
+            </w:r>
+          </w:p>
         </w:tc>
       </w:tr>
       <w:tr>
@@ -31172,7 +31808,7 @@
                 <w:sz w:val="18"/>
                 <w:szCs w:val="18"/>
               </w:rPr>
-              <w:t xml:space="preserve">카테고리 (제안)</w:t>
+              <w:t xml:space="preserve">카테고리 대분류</w:t>
             </w:r>
           </w:p>
         </w:tc>
@@ -31192,7 +31828,7 @@
                 <w:sz w:val="18"/>
                 <w:szCs w:val="18"/>
               </w:rPr>
-              <w:t xml:space="preserve">Functional Analysis / Enrichment</w:t>
+              <w:t xml:space="preserve">기능 분석</w:t>
             </w:r>
           </w:p>
         </w:tc>
@@ -31206,7 +31842,77 @@
               <w:right w:type="dxa" w:w="90"/>
             </w:tcMar>
           </w:tcPr>
-          <w:p/>
+          <w:p>
+            <w:r>
+              <w:rPr>
+                <w:sz w:val="18"/>
+                <w:szCs w:val="18"/>
+              </w:rPr>
+              <w:t xml:space="preserve">Functional Analysis</w:t>
+            </w:r>
+          </w:p>
+        </w:tc>
+      </w:tr>
+      <w:tr>
+        <w:tc>
+          <w:tcPr>
+            <w:tcW w:type="dxa" w:w="1800"/>
+            <w:tcMar>
+              <w:top w:type="dxa" w:w="60"/>
+              <w:left w:type="dxa" w:w="90"/>
+              <w:bottom w:type="dxa" w:w="60"/>
+              <w:right w:type="dxa" w:w="90"/>
+            </w:tcMar>
+          </w:tcPr>
+          <w:p>
+            <w:r>
+              <w:rPr>
+                <w:sz w:val="18"/>
+                <w:szCs w:val="18"/>
+              </w:rPr>
+              <w:t xml:space="preserve">카테고리 중분류</w:t>
+            </w:r>
+          </w:p>
+        </w:tc>
+        <w:tc>
+          <w:tcPr>
+            <w:tcW w:type="dxa" w:w="3853"/>
+            <w:tcMar>
+              <w:top w:type="dxa" w:w="60"/>
+              <w:left w:type="dxa" w:w="90"/>
+              <w:bottom w:type="dxa" w:w="60"/>
+              <w:right w:type="dxa" w:w="90"/>
+            </w:tcMar>
+          </w:tcPr>
+          <w:p>
+            <w:r>
+              <w:rPr>
+                <w:sz w:val="18"/>
+                <w:szCs w:val="18"/>
+              </w:rPr>
+              <w:t xml:space="preserve">농축 분석</w:t>
+            </w:r>
+          </w:p>
+        </w:tc>
+        <w:tc>
+          <w:tcPr>
+            <w:tcW w:type="dxa" w:w="3853"/>
+            <w:tcMar>
+              <w:top w:type="dxa" w:w="60"/>
+              <w:left w:type="dxa" w:w="90"/>
+              <w:bottom w:type="dxa" w:w="60"/>
+              <w:right w:type="dxa" w:w="90"/>
+            </w:tcMar>
+          </w:tcPr>
+          <w:p>
+            <w:r>
+              <w:rPr>
+                <w:sz w:val="18"/>
+                <w:szCs w:val="18"/>
+              </w:rPr>
+              <w:t xml:space="preserve">Enrichment Analysis</w:t>
+            </w:r>
+          </w:p>
         </w:tc>
       </w:tr>
       <w:tr>
@@ -36039,7 +36745,7 @@
                 <w:sz w:val="18"/>
                 <w:szCs w:val="18"/>
               </w:rPr>
-              <w:t xml:space="preserve">카테고리 (제안)</w:t>
+              <w:t xml:space="preserve">카테고리 대분류</w:t>
             </w:r>
           </w:p>
         </w:tc>
@@ -36059,7 +36765,7 @@
                 <w:sz w:val="18"/>
                 <w:szCs w:val="18"/>
               </w:rPr>
-              <w:t xml:space="preserve">Quality Control / Reproducibility</w:t>
+              <w:t xml:space="preserve">품질 관리</w:t>
             </w:r>
           </w:p>
         </w:tc>
@@ -36073,7 +36779,77 @@
               <w:right w:type="dxa" w:w="90"/>
             </w:tcMar>
           </w:tcPr>
-          <w:p/>
+          <w:p>
+            <w:r>
+              <w:rPr>
+                <w:sz w:val="18"/>
+                <w:szCs w:val="18"/>
+              </w:rPr>
+              <w:t xml:space="preserve">Quality Control</w:t>
+            </w:r>
+          </w:p>
+        </w:tc>
+      </w:tr>
+      <w:tr>
+        <w:tc>
+          <w:tcPr>
+            <w:tcW w:type="dxa" w:w="1800"/>
+            <w:tcMar>
+              <w:top w:type="dxa" w:w="60"/>
+              <w:left w:type="dxa" w:w="90"/>
+              <w:bottom w:type="dxa" w:w="60"/>
+              <w:right w:type="dxa" w:w="90"/>
+            </w:tcMar>
+          </w:tcPr>
+          <w:p>
+            <w:r>
+              <w:rPr>
+                <w:sz w:val="18"/>
+                <w:szCs w:val="18"/>
+              </w:rPr>
+              <w:t xml:space="preserve">카테고리 중분류</w:t>
+            </w:r>
+          </w:p>
+        </w:tc>
+        <w:tc>
+          <w:tcPr>
+            <w:tcW w:type="dxa" w:w="3853"/>
+            <w:tcMar>
+              <w:top w:type="dxa" w:w="60"/>
+              <w:left w:type="dxa" w:w="90"/>
+              <w:bottom w:type="dxa" w:w="60"/>
+              <w:right w:type="dxa" w:w="90"/>
+            </w:tcMar>
+          </w:tcPr>
+          <w:p>
+            <w:r>
+              <w:rPr>
+                <w:sz w:val="18"/>
+                <w:szCs w:val="18"/>
+              </w:rPr>
+              <w:t xml:space="preserve">재현성 평가</w:t>
+            </w:r>
+          </w:p>
+        </w:tc>
+        <w:tc>
+          <w:tcPr>
+            <w:tcW w:type="dxa" w:w="3853"/>
+            <w:tcMar>
+              <w:top w:type="dxa" w:w="60"/>
+              <w:left w:type="dxa" w:w="90"/>
+              <w:bottom w:type="dxa" w:w="60"/>
+              <w:right w:type="dxa" w:w="90"/>
+            </w:tcMar>
+          </w:tcPr>
+          <w:p>
+            <w:r>
+              <w:rPr>
+                <w:sz w:val="18"/>
+                <w:szCs w:val="18"/>
+              </w:rPr>
+              <w:t xml:space="preserve">Reproducibility</w:t>
+            </w:r>
+          </w:p>
         </w:tc>
       </w:tr>
       <w:tr>

</xml_diff>

<commit_message>
Fix ATAC_QC_plot for samples with an empty split class (1.2)
Production stopped with 'enrichedFragments failed: length(gal) == 4 is
not TRUE' for a sample with an empty trinucleosome split: 1.1 passed
only the classes with reads, but ATACseqQC 1.34.0 enrichedFragments
needs all four and reads them by position. ATAC_QC_plot.1.2.R passes all
four in order, an empty class as an empty alignment set with library
size 1. Reproduced in a Codespace image: 1.1 fails with the same error,
1.2 runs every sample and gives the same signals as 1.1 for samples
without an empty class.

enrichedFragments returns two signals, nucleosome-free and nucleosome
(mono-, di- and trinucleosome combined, labelled mononucleosome), so
the content, legends and concept figure no longer claim extra panels
for di- and trinucleosome. Versions point to 1.2.

Co-Authored-By: Claude Opus 5.5 <noreply@anthropic.com>
</commit_message>
<xml_diff>
--- a/docs/ATAC-seq/modules/Portal_Content.docx
+++ b/docs/ATAC-seq/modules/Portal_Content.docx
@@ -8689,7 +8689,7 @@
                 <w:sz w:val="18"/>
                 <w:szCs w:val="18"/>
               </w:rPr>
-              <w:t xml:space="preserve">clean BAM은 proper pair만 남기므로 긴 fragment가 적은 데이터에서는 trinucleosome 분할이 비어 있을 수 있습니다. ATAC_QC_plot은 빈 분할을 빼고 그립니다.</w:t>
+              <w:t xml:space="preserve">clean BAM은 proper pair만 남기므로 긴 fragment가 적은 데이터에서는 trinucleosome 분할이 비어 있을 수 있습니다. 빈 분할은 read가 없는 것으로 기록됩니다.</w:t>
             </w:r>
           </w:p>
         </w:tc>
@@ -8709,7 +8709,7 @@
                 <w:sz w:val="18"/>
                 <w:szCs w:val="18"/>
               </w:rPr>
-              <w:t xml:space="preserve">The clean BAM keeps proper pairs only, so the trinucleosome split can be empty when long fragments are rare; ATAC_QC_plot skips empty classes.</w:t>
+              <w:t xml:space="preserve">The clean BAM keeps proper pairs only, so the trinucleosome split can be empty when long fragments are rare; an empty split is recorded as having no reads.</w:t>
             </w:r>
           </w:p>
         </w:tc>
@@ -9394,7 +9394,7 @@
                 <w:sz w:val="18"/>
                 <w:szCs w:val="18"/>
               </w:rPr>
-              <w:t xml:space="preserve">1.1</w:t>
+              <w:t xml:space="preserve">1.2</w:t>
             </w:r>
           </w:p>
         </w:tc>
@@ -9788,7 +9788,7 @@
                 <w:sz w:val="18"/>
                 <w:szCs w:val="18"/>
               </w:rPr>
-              <w:t xml:space="preserve">ATAC_QC_plot.1.1.R</w:t>
+              <w:t xml:space="preserve">ATAC_QC_plot.1.2.R</w:t>
             </w:r>
           </w:p>
         </w:tc>
@@ -10626,7 +10626,7 @@
         <w:spacing w:after="80"/>
       </w:pPr>
       <w:r>
-        <w:t xml:space="preserve">종류별(NFR, mononucleosome 등) TSS 주변 신호 heatmap과 profile을 PDF와 TSV로 저장합니다.</w:t>
+        <w:t xml:space="preserve">nucleosome-free 신호와 nucleosome 신호(mono, di, trinucleosome을 합친 것) 두 가지의 TSS 주변 heatmap과 profile을 PDF와 TSV로 저장합니다.</w:t>
       </w:r>
     </w:p>
     <w:p>
@@ -10639,7 +10639,7 @@
         <w:spacing w:after="80"/>
       </w:pPr>
       <w:r>
-        <w:t xml:space="preserve">비어 있는 종류는 빼고 그리며, 샘플별로 사용한 종류와 제외한 종류를 요약합니다.</w:t>
+        <w:t xml:space="preserve">비어 있는 종류(예: trinucleosome)는 read가 없는 것으로 계산하며, 샘플별로 read가 있던 종류와 비어 있던 종류를 요약합니다.</w:t>
       </w:r>
     </w:p>
     <w:p>
@@ -10675,7 +10675,7 @@
         <w:spacing w:after="80"/>
       </w:pPr>
       <w:r>
-        <w:t xml:space="preserve">TSS heatmaps and profiles per class (NFR, mononucleosome, and so on) are saved as PDF and TSV.</w:t>
+        <w:t xml:space="preserve">TSS heatmaps and profiles of two signals, nucleosome-free and nucleosome (mono-, di-, and trinucleosome combined), are saved as PDF and TSV.</w:t>
       </w:r>
     </w:p>
     <w:p>
@@ -10688,7 +10688,7 @@
         <w:spacing w:after="80"/>
       </w:pPr>
       <w:r>
-        <w:t xml:space="preserve">Empty classes are skipped, and the used and skipped classes are summarized per sample.</w:t>
+        <w:t xml:space="preserve">An empty class (for example trinucleosome) counts as having no reads, and the classes with and without reads are summarized per sample.</w:t>
       </w:r>
     </w:p>
     <w:p>
@@ -12272,7 +12272,7 @@
         <w:t xml:space="preserve">그림. TSS 주변 신호.</w:t>
       </w:r>
       <w:r>
-        <w:t xml:space="preserve"> (A) 모든 TSS를 기준으로 정렬한 NucleosomeFree(왼쪽)와 mononucleosome(오른쪽) 신호 heatmap. 각 행은 하나의 TSS이며, dinucleosome·trinucleosome에 read가 있으면 그 패널도 함께 그려진다. (B) 평균 신호. 좋은 데이터에서는 NFR 신호가 TSS에 모이고, 뉴클레오솜 신호는 그 양옆(−1, +1 뉴클레오솜)에 나타난다. Ou J. et al., BMC Genomics 19, 169 (2018), Fig. 1을 수정(CC BY 4.0).</w:t>
+        <w:t xml:space="preserve"> (A) 모든 TSS를 기준으로 정렬한 NucleosomeFree(왼쪽)와 nucleosome(오른쪽) 신호 heatmap. 오른쪽은 결과 그림에 mononucleosome으로 표시되지만 mono, di, trinucleosome fragment를 합친 신호다. 각 행은 하나의 TSS다. (B) 평균 신호. 좋은 데이터에서는 NFR 신호가 TSS에 모이고, 뉴클레오솜 신호는 그 양옆(−1, +1 뉴클레오솜)에 나타난다. Ou J. et al., BMC Genomics 19, 169 (2018), Fig. 1을 수정(CC BY 4.0).</w:t>
       </w:r>
     </w:p>
     <w:p>
@@ -12295,7 +12295,7 @@
         <w:t xml:space="preserve">Figure. Signal around TSSs.</w:t>
       </w:r>
       <w:r>
-        <w:t xml:space="preserve"> (A) Heatmaps of NucleosomeFree (left) and mononucleosome (right) signal aligned at all TSSs; each row is one TSS, and dinucleosome and trinucleosome panels are added when they have reads. (B) Averaged coverage. In good data the NFR signal concentrates at the TSS and the nucleosome signal flanks it (−1 and +1 nucleosomes). Adapted from Ou J. et al., BMC Genomics 19, 169 (2018), Fig. 1 (CC BY 4.0).</w:t>
+        <w:t xml:space="preserve"> (A) Heatmaps of NucleosomeFree (left) and nucleosome (right) signal aligned at all TSSs; the right panel is labelled mononucleosome in the output but combines mono-, di-, and trinucleosome fragments. Each row is one TSS. (B) Averaged coverage. In good data the NFR signal concentrates at the TSS and the nucleosome signal flanks it (−1 and +1 nucleosomes). Adapted from Ou J. et al., BMC Genomics 19, 169 (2018), Fig. 1 (CC BY 4.0).</w:t>
       </w:r>
     </w:p>
     <w:p>
@@ -12347,7 +12347,7 @@
           <w:sz w:val="19"/>
           <w:szCs w:val="19"/>
         </w:rPr>
-        <w:t xml:space="preserve">Rscript ATAC_QC_plot.1.1.R \</w:t>
+        <w:t xml:space="preserve">Rscript ATAC_QC_plot.1.2.R \</w:t>
       </w:r>
     </w:p>
     <w:p>
@@ -12513,10 +12513,10 @@
           <w:b/>
           <w:bCs/>
         </w:rPr>
-        <w:t xml:space="preserve">TSS 주변의 nucleosome-free 신호와 mononucleosome 신호.</w:t>
-      </w:r>
-      <w:r>
-        <w:t xml:space="preserve"> 각 행은 TSS 하나이고, 가로축은 TSS 중심 ±1,010 bp 구간이다. 패널은 fragment 종류별(NucleosomeFree, mononucleosome, 그리고 read가 있으면 dinucleosome, trinucleosome)이며, 신호(log2)를 색으로 나타낸다. 정상적인 ATAC-seq에서는 nucleosome-free 신호가 TSS 바로 위에 모이고, mononucleosome 신호는 TSS 양옆(nucleosome 자리)에 나타난다.</w:t>
+        <w:t xml:space="preserve">TSS 주변의 nucleosome-free 신호와 nucleosome 신호.</w:t>
+      </w:r>
+      <w:r>
+        <w:t xml:space="preserve"> 각 행은 TSS 하나이고, 가로축은 TSS 중심 ±1,010 bp 구간이다. 왼쪽 패널(NucleosomeFree)은 nucleosome-free fragment, 오른쪽 패널(그림에는 mononucleosome으로 표시)은 mono, di, trinucleosome fragment를 합친 nucleosome 신호이며, 신호(log2)를 노랑(낮음)에서 빨강(높음)으로 나타낸다. 정상적인 ATAC-seq에서는 nucleosome-free 신호가 TSS 바로 위에 모이고, nucleosome 신호는 TSS 양옆(nucleosome 자리)에 나타난다.</w:t>
       </w:r>
     </w:p>
     <w:p>
@@ -12540,10 +12540,10 @@
           <w:b/>
           <w:bCs/>
         </w:rPr>
-        <w:t xml:space="preserve">Nucleosome-free and mononucleosome signal around TSSs.</w:t>
-      </w:r>
-      <w:r>
-        <w:t xml:space="preserve"> Each row is one TSS and the x-axis spans ±1,010 bp around its centre. Panels are per fragment class (NucleosomeFree, mononucleosome, and dinucleosome and trinucleosome when they have reads), with signal (log2) as a colour scale. In good ATAC-seq data the nucleosome-free signal concentrates at the TSS, while the mononucleosome signal flanks it where nucleosomes sit.</w:t>
+        <w:t xml:space="preserve">Nucleosome-free and nucleosome signal around TSSs.</w:t>
+      </w:r>
+      <w:r>
+        <w:t xml:space="preserve"> Each row is one TSS and the x-axis spans ±1,010 bp around its centre. The left panel (NucleosomeFree) shows nucleosome-free fragments and the right panel (labelled mononucleosome in the plot) the nucleosome signal of mono-, di-, and trinucleosome fragments combined, with signal (log2) from yellow (low) to red (high). In good ATAC-seq data the nucleosome-free signal concentrates at the TSS, while the nucleosome signal flanks it where nucleosomes sit.</w:t>
       </w:r>
     </w:p>
     <w:p>

</xml_diff>

<commit_message>
Show several result figures per module in the portal content
Each module now lists its main result figures in order (result 1 is the
representative one, then QC and supporting plots, then a summary table),
each with its file path, saved file name (<module>_result_<N>) and
Korean and English legends. The portal guide asks for the same.

Co-Authored-By: Claude Opus 5.5 <noreply@anthropic.com>
</commit_message>
<xml_diff>
--- a/docs/ATAC-seq/modules/Portal_Content.docx
+++ b/docs/ATAC-seq/modules/Portal_Content.docx
@@ -335,31 +335,31 @@
         <w:t xml:space="preserve">주요 결과 이미지는 실제 데이터로 실행한 결과에서 가져와 </w:t>
       </w:r>
       <w:r>
-        <w:t xml:space="preserve">docs/ATAC-seq/modules/figures/module_results/&lt;모듈&gt;_result.{png,svg}</w:t>
-      </w:r>
-      <w:r>
-        <w:t xml:space="preserve">로 PNG(등록용)와 SVG(원본)를 함께 저장한다(A/B 두 그림이면 </w:t>
-      </w:r>
-      <w:r>
-        <w:t xml:space="preserve">_result_A</w:t>
+        <w:t xml:space="preserve">docs/ATAC-seq/modules/figures/module_results/&lt;모듈&gt;_result_&lt;N&gt;.{png,svg}</w:t>
+      </w:r>
+      <w:r>
+        <w:t xml:space="preserve">로 PNG(등록용)와 SVG(원본)를 함께 저장한다(모듈마다 결과 그림을 여러 개 등록하며 순서대로 </w:t>
+      </w:r>
+      <w:r>
+        <w:t xml:space="preserve">_result_1</w:t>
       </w:r>
       <w:r>
         <w:t xml:space="preserve">, </w:t>
       </w:r>
       <w:r>
-        <w:t xml:space="preserve">_result_B</w:t>
-      </w:r>
-      <w:r>
-        <w:t xml:space="preserve">). PDF는 </w:t>
-      </w:r>
-      <w:r>
-        <w:t xml:space="preserve">pdftocairo -png -r 200 -singlefile &lt;그림&gt;.pdf &lt;모듈&gt;_result</w:t>
+        <w:t xml:space="preserve">_result_2</w:t>
+      </w:r>
+      <w:r>
+        <w:t xml:space="preserve">, …로 이름 붙인다). PDF는 </w:t>
+      </w:r>
+      <w:r>
+        <w:t xml:space="preserve">pdftocairo -png -r 200 -singlefile &lt;그림&gt;.pdf &lt;모듈&gt;_result_&lt;N&gt;</w:t>
       </w:r>
       <w:r>
         <w:t xml:space="preserve">와 </w:t>
       </w:r>
       <w:r>
-        <w:t xml:space="preserve">pdftocairo -svg &lt;그림&gt;.pdf &lt;모듈&gt;_result.svg</w:t>
+        <w:t xml:space="preserve">pdftocairo -svg &lt;그림&gt;.pdf &lt;모듈&gt;_result_&lt;N&gt;.svg</w:t>
       </w:r>
       <w:r>
         <w:t xml:space="preserve">로 바꾼다(여러 쪽이면 </w:t>
@@ -2688,58 +2688,114 @@
         <w:spacing w:after="140"/>
       </w:pPr>
       <w:r>
-        <w:t xml:space="preserve">등록할 그림: 화면 캡처 </w:t>
-      </w:r>
-      <w:r>
-        <w:t xml:space="preserve">&lt;sample&gt;_bowtie.log</w:t>
-      </w:r>
-      <w:r>
-        <w:t xml:space="preserve">의 정렬 요약 부분 (이 모듈은 그림을 만들지 않는다)</w:t>
-      </w:r>
-    </w:p>
-    <w:p>
-      <w:pPr>
-        <w:spacing w:after="140"/>
-      </w:pPr>
-      <w:r>
         <w:rPr>
           <w:b/>
           <w:bCs/>
         </w:rPr>
-        <w:t xml:space="preserve">레전드(국문)</w:t>
-      </w:r>
-    </w:p>
-    <w:p>
-      <w:pPr>
-        <w:spacing w:after="140"/>
+        <w:t xml:space="preserve">결과 1. 정렬 요약</w:t>
+      </w:r>
+    </w:p>
+    <w:p>
+      <w:pPr>
+        <w:pStyle w:val="ListParagraph"/>
+        <w:numPr>
+          <w:ilvl w:val="0"/>
+          <w:numId w:val="2"/>
+        </w:numPr>
+        <w:spacing w:after="80"/>
+      </w:pPr>
+      <w:r>
+        <w:t xml:space="preserve">등록할 그림: 화면 캡처 </w:t>
+      </w:r>
+      <w:r>
+        <w:t xml:space="preserve">&lt;sample&gt;_bowtie.log</w:t>
+      </w:r>
+      <w:r>
+        <w:t xml:space="preserve">의 정렬 요약 부분 (이 모듈은 그림을 만들지 않는다)</w:t>
+      </w:r>
+    </w:p>
+    <w:p>
+      <w:pPr>
+        <w:pStyle w:val="ListParagraph"/>
+        <w:numPr>
+          <w:ilvl w:val="0"/>
+          <w:numId w:val="2"/>
+        </w:numPr>
+        <w:spacing w:after="80"/>
+      </w:pPr>
+      <w:r>
+        <w:t xml:space="preserve">저장 파일: </w:t>
+      </w:r>
+      <w:r>
+        <w:t xml:space="preserve">docs/ATAC-seq/modules/figures/module_results/bowtie2_result_1.png</w:t>
+      </w:r>
+    </w:p>
+    <w:p>
+      <w:pPr>
+        <w:spacing w:after="120"/>
       </w:pPr>
       <w:r>
         <w:rPr>
           <w:b/>
           <w:bCs/>
-        </w:rPr>
-        <w:t xml:space="preserve">샘플별 bowtie2 정렬 요약.</w:t>
-      </w:r>
-      <w:r>
-        <w:t xml:space="preserve"> 전체 read 쌍 중 정상 짝으로 한 곳에 정렬된 비율(aligned concordantly exactly 1 time), 여러 곳에 정렬된 비율(&gt;1 times), 정렬되지 않은 비율(0 times)과 전체 정렬률(overall alignment rate)을 보여 준다. ENCODE ATAC-seq 기준은 전체 정렬률 95% 이상이 바람직하고 80% 이상이면 허용하며, 여러 곳에 정렬된 비율이 높으면 반복 서열이나 오염을 의심할 수 있다.</w:t>
-      </w:r>
-    </w:p>
-    <w:p>
-      <w:pPr>
-        <w:spacing w:after="140"/>
-      </w:pPr>
+          <w:color w:val="B0B0B0"/>
+          <w:sz w:val="18"/>
+          <w:szCs w:val="18"/>
+        </w:rPr>
+        <w:t xml:space="preserve">[내부 메모 · 붙여 넣지 마세요] </w:t>
+      </w:r>
+      <w:r>
+        <w:rPr>
+          <w:color w:val="8A8F99"/>
+          <w:sz w:val="18"/>
+          <w:szCs w:val="18"/>
+        </w:rPr>
+        <w:t xml:space="preserve">그림: </w:t>
+      </w:r>
+      <w:r>
+        <w:rPr>
+          <w:color w:val="8A8F99"/>
+          <w:sz w:val="18"/>
+          <w:szCs w:val="18"/>
+        </w:rPr>
+        <w:t xml:space="preserve">docs/ATAC-seq/modules/figures/module_results/bowtie2_result_1.png</w:t>
+      </w:r>
+    </w:p>
+    <w:p>
+      <w:pPr>
+        <w:pStyle w:val="ListParagraph"/>
+        <w:numPr>
+          <w:ilvl w:val="0"/>
+          <w:numId w:val="2"/>
+        </w:numPr>
+        <w:spacing w:after="80"/>
+      </w:pPr>
+      <w:r>
+        <w:t xml:space="preserve">레전드(국문): </w:t>
+      </w:r>
       <w:r>
         <w:rPr>
           <w:b/>
           <w:bCs/>
         </w:rPr>
-        <w:t xml:space="preserve">Legend (English)</w:t>
-      </w:r>
-    </w:p>
-    <w:p>
-      <w:pPr>
-        <w:spacing w:after="140"/>
-      </w:pPr>
+        <w:t xml:space="preserve">샘플별 bowtie2 정렬 요약.</w:t>
+      </w:r>
+      <w:r>
+        <w:t xml:space="preserve"> 전체 read 쌍 중 정상 짝으로 한 곳에 정렬된 비율(aligned concordantly exactly 1 time), 여러 곳에 정렬된 비율(&gt;1 times), 정렬되지 않은 비율(0 times)과 전체 정렬률(overall alignment rate)을 보여 준다. ENCODE ATAC-seq 기준은 전체 정렬률 95% 이상이 바람직하고 80% 이상이면 허용하며, 여러 곳에 정렬된 비율이 높으면 반복 서열이나 오염을 의심할 수 있다.</w:t>
+      </w:r>
+    </w:p>
+    <w:p>
+      <w:pPr>
+        <w:pStyle w:val="ListParagraph"/>
+        <w:numPr>
+          <w:ilvl w:val="0"/>
+          <w:numId w:val="2"/>
+        </w:numPr>
+        <w:spacing w:after="80"/>
+      </w:pPr>
+      <w:r>
+        <w:t xml:space="preserve">레전드(영문): </w:t>
+      </w:r>
       <w:r>
         <w:rPr>
           <w:b/>
@@ -5207,58 +5263,114 @@
         <w:spacing w:after="140"/>
       </w:pPr>
       <w:r>
-        <w:t xml:space="preserve">등록할 그림: 표 캡처 </w:t>
-      </w:r>
-      <w:r>
-        <w:t xml:space="preserve">04_summary/organellar_filter_summary.tsv</w:t>
-      </w:r>
-      <w:r>
-        <w:t xml:space="preserve"> (이 모듈은 그림을 만들지 않는다)</w:t>
-      </w:r>
-    </w:p>
-    <w:p>
-      <w:pPr>
-        <w:spacing w:after="140"/>
-      </w:pPr>
-      <w:r>
         <w:rPr>
           <w:b/>
           <w:bCs/>
         </w:rPr>
-        <w:t xml:space="preserve">레전드(국문)</w:t>
-      </w:r>
-    </w:p>
-    <w:p>
-      <w:pPr>
-        <w:spacing w:after="140"/>
+        <w:t xml:space="preserve">결과 1. 소기관 contig 제거 요약</w:t>
+      </w:r>
+    </w:p>
+    <w:p>
+      <w:pPr>
+        <w:pStyle w:val="ListParagraph"/>
+        <w:numPr>
+          <w:ilvl w:val="0"/>
+          <w:numId w:val="2"/>
+        </w:numPr>
+        <w:spacing w:after="80"/>
+      </w:pPr>
+      <w:r>
+        <w:t xml:space="preserve">등록할 그림: 표 캡처 </w:t>
+      </w:r>
+      <w:r>
+        <w:t xml:space="preserve">04_summary/organellar_filter_summary.tsv</w:t>
+      </w:r>
+      <w:r>
+        <w:t xml:space="preserve"> (이 모듈은 그림을 만들지 않는다)</w:t>
+      </w:r>
+    </w:p>
+    <w:p>
+      <w:pPr>
+        <w:pStyle w:val="ListParagraph"/>
+        <w:numPr>
+          <w:ilvl w:val="0"/>
+          <w:numId w:val="2"/>
+        </w:numPr>
+        <w:spacing w:after="80"/>
+      </w:pPr>
+      <w:r>
+        <w:t xml:space="preserve">저장 파일: </w:t>
+      </w:r>
+      <w:r>
+        <w:t xml:space="preserve">docs/ATAC-seq/modules/figures/module_results/organellar_filter_result_1.png</w:t>
+      </w:r>
+    </w:p>
+    <w:p>
+      <w:pPr>
+        <w:spacing w:after="120"/>
       </w:pPr>
       <w:r>
         <w:rPr>
           <w:b/>
           <w:bCs/>
-        </w:rPr>
-        <w:t xml:space="preserve">샘플별 소기관 contig 제거 요약.</w:t>
-      </w:r>
-      <w:r>
-        <w:t xml:space="preserve"> 샘플마다 입력 BAM의 전체 contig 수, 제거한 소기관 contig(미토콘드리아·엽록체) 수, 남긴 contig 수, 필터링된 BAM 경로와 처리 상태를 보여 준다. status가 모든 샘플에서 정상이면 다음 단계(ATAC_QC)에 쓸 BAM이 준비된 것이다.</w:t>
-      </w:r>
-    </w:p>
-    <w:p>
-      <w:pPr>
-        <w:spacing w:after="140"/>
-      </w:pPr>
+          <w:color w:val="B0B0B0"/>
+          <w:sz w:val="18"/>
+          <w:szCs w:val="18"/>
+        </w:rPr>
+        <w:t xml:space="preserve">[내부 메모 · 붙여 넣지 마세요] </w:t>
+      </w:r>
+      <w:r>
+        <w:rPr>
+          <w:color w:val="8A8F99"/>
+          <w:sz w:val="18"/>
+          <w:szCs w:val="18"/>
+        </w:rPr>
+        <w:t xml:space="preserve">그림: </w:t>
+      </w:r>
+      <w:r>
+        <w:rPr>
+          <w:color w:val="8A8F99"/>
+          <w:sz w:val="18"/>
+          <w:szCs w:val="18"/>
+        </w:rPr>
+        <w:t xml:space="preserve">docs/ATAC-seq/modules/figures/module_results/organellar_filter_result_1.png</w:t>
+      </w:r>
+    </w:p>
+    <w:p>
+      <w:pPr>
+        <w:pStyle w:val="ListParagraph"/>
+        <w:numPr>
+          <w:ilvl w:val="0"/>
+          <w:numId w:val="2"/>
+        </w:numPr>
+        <w:spacing w:after="80"/>
+      </w:pPr>
+      <w:r>
+        <w:t xml:space="preserve">레전드(국문): </w:t>
+      </w:r>
       <w:r>
         <w:rPr>
           <w:b/>
           <w:bCs/>
         </w:rPr>
-        <w:t xml:space="preserve">Legend (English)</w:t>
-      </w:r>
-    </w:p>
-    <w:p>
-      <w:pPr>
-        <w:spacing w:after="140"/>
-      </w:pPr>
+        <w:t xml:space="preserve">샘플별 소기관 contig 제거 요약.</w:t>
+      </w:r>
+      <w:r>
+        <w:t xml:space="preserve"> 샘플마다 입력 BAM의 전체 contig 수, 제거한 소기관 contig(미토콘드리아·엽록체) 수, 남긴 contig 수, 필터링된 BAM 경로와 처리 상태를 보여 준다. status가 모든 샘플에서 정상이면 다음 단계(ATAC_QC)에 쓸 BAM이 준비된 것이다.</w:t>
+      </w:r>
+    </w:p>
+    <w:p>
+      <w:pPr>
+        <w:pStyle w:val="ListParagraph"/>
+        <w:numPr>
+          <w:ilvl w:val="0"/>
+          <w:numId w:val="2"/>
+        </w:numPr>
+        <w:spacing w:after="80"/>
+      </w:pPr>
+      <w:r>
+        <w:t xml:space="preserve">레전드(영문): </w:t>
+      </w:r>
       <w:r>
         <w:rPr>
           <w:b/>
@@ -9039,19 +9151,7 @@
         <w:spacing w:after="140"/>
       </w:pPr>
       <w:r>
-        <w:t xml:space="preserve">등록할 그림: </w:t>
-      </w:r>
-      <w:r>
-        <w:t xml:space="preserve">01_fragment_size/&lt;sample&gt;/&lt;sample&gt;.fragSizeDist.pdf</w:t>
-      </w:r>
-      <w:r>
-        <w:t xml:space="preserve">, </w:t>
-      </w:r>
-      <w:r>
-        <w:t xml:space="preserve">07_tss_enrichment/&lt;sample&gt;.tss_enrichment.pdf</w:t>
-      </w:r>
-      <w:r>
-        <w:t xml:space="preserve"> (대표 샘플 1개, 두 그림을 나란히)</w:t>
+        <w:t xml:space="preserve">결과 그림 3개를 아래 순서대로 등록한다. 결과 1이 대표 그림이다.</w:t>
       </w:r>
     </w:p>
     <w:p>
@@ -9063,49 +9163,376 @@
           <w:b/>
           <w:bCs/>
         </w:rPr>
-        <w:t xml:space="preserve">레전드(국문)</w:t>
-      </w:r>
-    </w:p>
-    <w:p>
-      <w:pPr>
-        <w:spacing w:after="140"/>
+        <w:t xml:space="preserve">결과 1. Fragment 크기 분포</w:t>
+      </w:r>
+    </w:p>
+    <w:p>
+      <w:pPr>
+        <w:pStyle w:val="ListParagraph"/>
+        <w:numPr>
+          <w:ilvl w:val="0"/>
+          <w:numId w:val="2"/>
+        </w:numPr>
+        <w:spacing w:after="80"/>
+      </w:pPr>
+      <w:r>
+        <w:t xml:space="preserve">등록할 그림: </w:t>
+      </w:r>
+      <w:r>
+        <w:t xml:space="preserve">01_fragment_size/&lt;sample&gt;/&lt;sample&gt;.fragSizeDist.pdf</w:t>
+      </w:r>
+      <w:r>
+        <w:t xml:space="preserve"> (대표 샘플 1개)</w:t>
+      </w:r>
+    </w:p>
+    <w:p>
+      <w:pPr>
+        <w:pStyle w:val="ListParagraph"/>
+        <w:numPr>
+          <w:ilvl w:val="0"/>
+          <w:numId w:val="2"/>
+        </w:numPr>
+        <w:spacing w:after="80"/>
+      </w:pPr>
+      <w:r>
+        <w:t xml:space="preserve">저장 파일: </w:t>
+      </w:r>
+      <w:r>
+        <w:t xml:space="preserve">docs/ATAC-seq/modules/figures/module_results/ATAC_QC_result_1.{png,svg}</w:t>
+      </w:r>
+    </w:p>
+    <w:p>
+      <w:pPr>
+        <w:spacing w:after="120"/>
       </w:pPr>
       <w:r>
         <w:rPr>
           <w:b/>
           <w:bCs/>
-        </w:rPr>
-        <w:t xml:space="preserve">ATAC-seq 라이브러리 품질: fragment 크기 분포와 TSS enrichment.</w:t>
-      </w:r>
-      <w:r>
-        <w:t xml:space="preserve"> (A) paired-end fragment 길이 분포. 100 bp 이하의 nucleosome-free 봉우리와 약 200 bp(mononucleosome), 약 400 bp(dinucleosome) 간격의 주기적인 봉우리가 보이면 Tn5 절단이 정상적으로 일어난 것이다. 작은 그림은 같은 분포를 로그 축으로 보여 준다. (B) TSS 주변(기본 ±1,000 bp)의 aggregate TSS score. TSS(0 bp)에서 신호가 뚜렷하게 높을수록 열린 염색질이 잘 포착된 것이며, 제목에 TSS enrichment score가 표시된다.</w:t>
-      </w:r>
-    </w:p>
-    <w:p>
-      <w:pPr>
-        <w:spacing w:after="140"/>
-      </w:pPr>
+          <w:color w:val="B0B0B0"/>
+          <w:sz w:val="18"/>
+          <w:szCs w:val="18"/>
+        </w:rPr>
+        <w:t xml:space="preserve">[내부 메모 · 붙여 넣지 마세요] </w:t>
+      </w:r>
+      <w:r>
+        <w:rPr>
+          <w:color w:val="8A8F99"/>
+          <w:sz w:val="18"/>
+          <w:szCs w:val="18"/>
+        </w:rPr>
+        <w:t xml:space="preserve">그림: </w:t>
+      </w:r>
+      <w:r>
+        <w:rPr>
+          <w:color w:val="8A8F99"/>
+          <w:sz w:val="18"/>
+          <w:szCs w:val="18"/>
+        </w:rPr>
+        <w:t xml:space="preserve">docs/ATAC-seq/modules/figures/module_results/ATAC_QC_result_1.png</w:t>
+      </w:r>
+    </w:p>
+    <w:p>
+      <w:pPr>
+        <w:pStyle w:val="ListParagraph"/>
+        <w:numPr>
+          <w:ilvl w:val="0"/>
+          <w:numId w:val="2"/>
+        </w:numPr>
+        <w:spacing w:after="80"/>
+      </w:pPr>
+      <w:r>
+        <w:t xml:space="preserve">레전드(국문): </w:t>
+      </w:r>
       <w:r>
         <w:rPr>
           <w:b/>
           <w:bCs/>
         </w:rPr>
-        <w:t xml:space="preserve">Legend (English)</w:t>
-      </w:r>
-    </w:p>
-    <w:p>
-      <w:pPr>
-        <w:spacing w:after="140"/>
-      </w:pPr>
+        <w:t xml:space="preserve">Fragment 크기 분포.</w:t>
+      </w:r>
+      <w:r>
+        <w:t xml:space="preserve"> paired-end fragment의 길이(가로축, bp)별 read 수(세로축)다. 100 bp 이하의 nucleosome-free 봉우리와 약 200 bp(mononucleosome), 약 400 bp(dinucleosome) 간격의 주기적인 봉우리가 보이면 Tn5 절단이 정상적으로 일어난 것이다. 작은 그림은 같은 분포를 로그 축으로 보여 주며, 짧은 구간의 약 10.5 bp 물결(DNA 나선 주기)도 여기서 보인다. 봉우리 없이 매끄럽게 줄어들면 Tn5 반응이 과하거나 세포 상태가 나쁜 경우다.</w:t>
+      </w:r>
+    </w:p>
+    <w:p>
+      <w:pPr>
+        <w:pStyle w:val="ListParagraph"/>
+        <w:numPr>
+          <w:ilvl w:val="0"/>
+          <w:numId w:val="2"/>
+        </w:numPr>
+        <w:spacing w:after="80"/>
+      </w:pPr>
+      <w:r>
+        <w:t xml:space="preserve">레전드(영문): </w:t>
+      </w:r>
       <w:r>
         <w:rPr>
           <w:b/>
           <w:bCs/>
         </w:rPr>
-        <w:t xml:space="preserve">ATAC-seq library quality: fragment size distribution and TSS enrichment.</w:t>
-      </w:r>
-      <w:r>
-        <w:t xml:space="preserve"> (A) Paired-end fragment length distribution. A nucleosome-free peak below 100 bp followed by periodic peaks near 200 bp (mononucleosome) and 400 bp (dinucleosome) indicates proper Tn5 cutting; the inset shows the same distribution on a log scale. (B) Aggregate TSS score around transcription start sites (±1,000 bp by default). A sharp rise at the TSS (0 bp) indicates good capture of open chromatin; the TSS enrichment score is shown in the title.</w:t>
+        <w:t xml:space="preserve">Fragment size distribution.</w:t>
+      </w:r>
+      <w:r>
+        <w:t xml:space="preserve"> Read counts (y-axis) by paired-end fragment length (x-axis, bp). A nucleosome-free peak below 100 bp followed by periodic peaks near 200 bp (mononucleosome) and 400 bp (dinucleosome) indicates proper Tn5 cutting. The inset shows the same distribution on a log scale, where the ~10.5 bp helical ripple of short fragments is also visible. A smooth decay without peaks points to over-tagmentation or poor cell condition.</w:t>
+      </w:r>
+    </w:p>
+    <w:p>
+      <w:pPr>
+        <w:spacing w:after="140"/>
+      </w:pPr>
+      <w:r>
+        <w:rPr>
+          <w:b/>
+          <w:bCs/>
+        </w:rPr>
+        <w:t xml:space="preserve">결과 2. TSS enrichment</w:t>
+      </w:r>
+    </w:p>
+    <w:p>
+      <w:pPr>
+        <w:pStyle w:val="ListParagraph"/>
+        <w:numPr>
+          <w:ilvl w:val="0"/>
+          <w:numId w:val="2"/>
+        </w:numPr>
+        <w:spacing w:after="80"/>
+      </w:pPr>
+      <w:r>
+        <w:t xml:space="preserve">등록할 그림: </w:t>
+      </w:r>
+      <w:r>
+        <w:t xml:space="preserve">07_tss_enrichment/&lt;sample&gt;.tss_enrichment.pdf</w:t>
+      </w:r>
+      <w:r>
+        <w:t xml:space="preserve"> (대표 샘플 1개)</w:t>
+      </w:r>
+    </w:p>
+    <w:p>
+      <w:pPr>
+        <w:pStyle w:val="ListParagraph"/>
+        <w:numPr>
+          <w:ilvl w:val="0"/>
+          <w:numId w:val="2"/>
+        </w:numPr>
+        <w:spacing w:after="80"/>
+      </w:pPr>
+      <w:r>
+        <w:t xml:space="preserve">저장 파일: </w:t>
+      </w:r>
+      <w:r>
+        <w:t xml:space="preserve">docs/ATAC-seq/modules/figures/module_results/ATAC_QC_result_2.{png,svg}</w:t>
+      </w:r>
+    </w:p>
+    <w:p>
+      <w:pPr>
+        <w:spacing w:after="120"/>
+      </w:pPr>
+      <w:r>
+        <w:rPr>
+          <w:b/>
+          <w:bCs/>
+          <w:color w:val="B0B0B0"/>
+          <w:sz w:val="18"/>
+          <w:szCs w:val="18"/>
+        </w:rPr>
+        <w:t xml:space="preserve">[내부 메모 · 붙여 넣지 마세요] </w:t>
+      </w:r>
+      <w:r>
+        <w:rPr>
+          <w:color w:val="8A8F99"/>
+          <w:sz w:val="18"/>
+          <w:szCs w:val="18"/>
+        </w:rPr>
+        <w:t xml:space="preserve">그림: </w:t>
+      </w:r>
+      <w:r>
+        <w:rPr>
+          <w:color w:val="8A8F99"/>
+          <w:sz w:val="18"/>
+          <w:szCs w:val="18"/>
+        </w:rPr>
+        <w:t xml:space="preserve">docs/ATAC-seq/modules/figures/module_results/ATAC_QC_result_2.png</w:t>
+      </w:r>
+    </w:p>
+    <w:p>
+      <w:pPr>
+        <w:pStyle w:val="ListParagraph"/>
+        <w:numPr>
+          <w:ilvl w:val="0"/>
+          <w:numId w:val="2"/>
+        </w:numPr>
+        <w:spacing w:after="80"/>
+      </w:pPr>
+      <w:r>
+        <w:t xml:space="preserve">레전드(국문): </w:t>
+      </w:r>
+      <w:r>
+        <w:rPr>
+          <w:b/>
+          <w:bCs/>
+        </w:rPr>
+        <w:t xml:space="preserve">TSS enrichment.</w:t>
+      </w:r>
+      <w:r>
+        <w:t xml:space="preserve"> 가로축은 TSS로부터의 거리(기본 ±1,000 bp), 세로축은 양 끝 구간 대비 신호 비율(aggregate TSS score)이다. TSS(0 bp, 점선)에서 신호가 뚜렷하게 솟을수록 열린 염색질이 잘 포착된 것이며, 제목에 TSS enrichment score가 표시된다. ENCODE는 사람(GRCh38, RefSeq TSS) 기준 7 이상을 이상적, 5~7을 허용으로 둔다. 값은 유전체와 TSS 주석에 따라 달라지므로 같은 실험의 샘플끼리 비교하는 데 주로 쓴다.</w:t>
+      </w:r>
+    </w:p>
+    <w:p>
+      <w:pPr>
+        <w:pStyle w:val="ListParagraph"/>
+        <w:numPr>
+          <w:ilvl w:val="0"/>
+          <w:numId w:val="2"/>
+        </w:numPr>
+        <w:spacing w:after="80"/>
+      </w:pPr>
+      <w:r>
+        <w:t xml:space="preserve">레전드(영문): </w:t>
+      </w:r>
+      <w:r>
+        <w:rPr>
+          <w:b/>
+          <w:bCs/>
+        </w:rPr>
+        <w:t xml:space="preserve">TSS enrichment.</w:t>
+      </w:r>
+      <w:r>
+        <w:t xml:space="preserve"> The x-axis is the distance from the TSS (±1,000 bp by default) and the y-axis the signal relative to the flanking ends (aggregate TSS score). A sharp rise at the TSS (0 bp, dashed line) indicates good capture of open chromatin; the TSS enrichment score is shown in the title. ENCODE considers 7 or more ideal and 5-7 acceptable for human (GRCh38, RefSeq TSS). The value depends on the genome and TSS annotation, so it is mainly used to compare samples within an experiment.</w:t>
+      </w:r>
+    </w:p>
+    <w:p>
+      <w:pPr>
+        <w:spacing w:after="140"/>
+      </w:pPr>
+      <w:r>
+        <w:rPr>
+          <w:b/>
+          <w:bCs/>
+        </w:rPr>
+        <w:t xml:space="preserve">결과 3. 샘플별 QC 지표</w:t>
+      </w:r>
+    </w:p>
+    <w:p>
+      <w:pPr>
+        <w:pStyle w:val="ListParagraph"/>
+        <w:numPr>
+          <w:ilvl w:val="0"/>
+          <w:numId w:val="2"/>
+        </w:numPr>
+        <w:spacing w:after="80"/>
+      </w:pPr>
+      <w:r>
+        <w:t xml:space="preserve">등록할 그림: 표 캡처 </w:t>
+      </w:r>
+      <w:r>
+        <w:t xml:space="preserve">05_metadata/atac_qc_metrics.tsv</w:t>
+      </w:r>
+    </w:p>
+    <w:p>
+      <w:pPr>
+        <w:pStyle w:val="ListParagraph"/>
+        <w:numPr>
+          <w:ilvl w:val="0"/>
+          <w:numId w:val="2"/>
+        </w:numPr>
+        <w:spacing w:after="80"/>
+      </w:pPr>
+      <w:r>
+        <w:t xml:space="preserve">저장 파일: </w:t>
+      </w:r>
+      <w:r>
+        <w:t xml:space="preserve">docs/ATAC-seq/modules/figures/module_results/ATAC_QC_result_3.png</w:t>
+      </w:r>
+    </w:p>
+    <w:p>
+      <w:pPr>
+        <w:spacing w:after="120"/>
+      </w:pPr>
+      <w:r>
+        <w:rPr>
+          <w:b/>
+          <w:bCs/>
+          <w:color w:val="B0B0B0"/>
+          <w:sz w:val="18"/>
+          <w:szCs w:val="18"/>
+        </w:rPr>
+        <w:t xml:space="preserve">[내부 메모 · 붙여 넣지 마세요] </w:t>
+      </w:r>
+      <w:r>
+        <w:rPr>
+          <w:color w:val="8A8F99"/>
+          <w:sz w:val="18"/>
+          <w:szCs w:val="18"/>
+        </w:rPr>
+        <w:t xml:space="preserve">그림: </w:t>
+      </w:r>
+      <w:r>
+        <w:rPr>
+          <w:color w:val="8A8F99"/>
+          <w:sz w:val="18"/>
+          <w:szCs w:val="18"/>
+        </w:rPr>
+        <w:t xml:space="preserve">docs/ATAC-seq/modules/figures/module_results/ATAC_QC_result_3.png</w:t>
+      </w:r>
+    </w:p>
+    <w:p>
+      <w:pPr>
+        <w:pStyle w:val="ListParagraph"/>
+        <w:numPr>
+          <w:ilvl w:val="0"/>
+          <w:numId w:val="2"/>
+        </w:numPr>
+        <w:spacing w:after="80"/>
+      </w:pPr>
+      <w:r>
+        <w:t xml:space="preserve">레전드(국문): </w:t>
+      </w:r>
+      <w:r>
+        <w:rPr>
+          <w:b/>
+          <w:bCs/>
+        </w:rPr>
+        <w:t xml:space="preserve">샘플별 QC 지표.</w:t>
+      </w:r>
+      <w:r>
+        <w:t xml:space="preserve"> 샘플마다 입력 read 수(InputMappedReads), 정제 후 read 수(CleanMappedReads)와 그 비율(CleanFraction), Tn5 보정 후 read 수(ShiftedReads), TSS enrichment score(TSSEnrichment), fragment 분리 상태(SplitStatus)를 한 줄로 보여 준다. CleanFraction이 다른 샘플보다 크게 낮으면 중복·저품질 read가 많은 샘플이다. SplitStatus가 </w:t>
+      </w:r>
+      <w:r>
+        <w:t xml:space="preserve">empty_split:&lt;분류&gt;</w:t>
+      </w:r>
+      <w:r>
+        <w:t xml:space="preserve">이면 그 길이 분류에 fragment가 없다는 뜻이다(예: 긴 fragment가 적은 데이터의 trinucleosome).</w:t>
+      </w:r>
+    </w:p>
+    <w:p>
+      <w:pPr>
+        <w:pStyle w:val="ListParagraph"/>
+        <w:numPr>
+          <w:ilvl w:val="0"/>
+          <w:numId w:val="2"/>
+        </w:numPr>
+        <w:spacing w:after="80"/>
+      </w:pPr>
+      <w:r>
+        <w:t xml:space="preserve">레전드(영문): </w:t>
+      </w:r>
+      <w:r>
+        <w:rPr>
+          <w:b/>
+          <w:bCs/>
+        </w:rPr>
+        <w:t xml:space="preserve">QC metrics per sample.</w:t>
+      </w:r>
+      <w:r>
+        <w:t xml:space="preserve"> One row per sample with input reads (InputMappedReads), reads after cleaning (CleanMappedReads) and their fraction (CleanFraction), reads after the Tn5 shift (ShiftedReads), the TSS enrichment score (TSSEnrichment) and the fragment split status (SplitStatus). A CleanFraction far below the other samples indicates many duplicate or low-quality reads. </w:t>
+      </w:r>
+      <w:r>
+        <w:t xml:space="preserve">empty_split:&lt;class&gt;</w:t>
+      </w:r>
+      <w:r>
+        <w:t xml:space="preserve"> means no fragments fell into that length class (for example trinucleosome in data with few long fragments).</w:t>
       </w:r>
     </w:p>
     <w:p>
@@ -12483,13 +12910,7 @@
         <w:spacing w:after="140"/>
       </w:pPr>
       <w:r>
-        <w:t xml:space="preserve">등록할 그림: </w:t>
-      </w:r>
-      <w:r>
-        <w:t xml:space="preserve">01_tss_signal/&lt;sample&gt;.Heatmap_splitbam.pdf</w:t>
-      </w:r>
-      <w:r>
-        <w:t xml:space="preserve"> (대표 샘플 1개)</w:t>
+        <w:t xml:space="preserve">결과 그림 2개를 아래 순서대로 등록한다. 결과 1이 대표 그림이다.</w:t>
       </w:r>
     </w:p>
     <w:p>
@@ -12501,40 +12922,110 @@
           <w:b/>
           <w:bCs/>
         </w:rPr>
-        <w:t xml:space="preserve">레전드(국문)</w:t>
-      </w:r>
-    </w:p>
-    <w:p>
-      <w:pPr>
-        <w:spacing w:after="140"/>
+        <w:t xml:space="preserve">결과 1. TSS 주변 신호 heatmap</w:t>
+      </w:r>
+    </w:p>
+    <w:p>
+      <w:pPr>
+        <w:pStyle w:val="ListParagraph"/>
+        <w:numPr>
+          <w:ilvl w:val="0"/>
+          <w:numId w:val="2"/>
+        </w:numPr>
+        <w:spacing w:after="80"/>
+      </w:pPr>
+      <w:r>
+        <w:t xml:space="preserve">등록할 그림: </w:t>
+      </w:r>
+      <w:r>
+        <w:t xml:space="preserve">01_tss_signal/&lt;sample&gt;.Heatmap_splitbam.pdf</w:t>
+      </w:r>
+      <w:r>
+        <w:t xml:space="preserve"> (대표 샘플 1개)</w:t>
+      </w:r>
+    </w:p>
+    <w:p>
+      <w:pPr>
+        <w:pStyle w:val="ListParagraph"/>
+        <w:numPr>
+          <w:ilvl w:val="0"/>
+          <w:numId w:val="2"/>
+        </w:numPr>
+        <w:spacing w:after="80"/>
+      </w:pPr>
+      <w:r>
+        <w:t xml:space="preserve">저장 파일: </w:t>
+      </w:r>
+      <w:r>
+        <w:t xml:space="preserve">docs/ATAC-seq/modules/figures/module_results/ATAC_QC_plot_result_1.{png,svg}</w:t>
+      </w:r>
+    </w:p>
+    <w:p>
+      <w:pPr>
+        <w:spacing w:after="120"/>
       </w:pPr>
       <w:r>
         <w:rPr>
           <w:b/>
           <w:bCs/>
-        </w:rPr>
-        <w:t xml:space="preserve">TSS 주변의 nucleosome-free 신호와 nucleosome 신호.</w:t>
-      </w:r>
-      <w:r>
-        <w:t xml:space="preserve"> 각 행은 TSS 하나이고, 가로축은 TSS 중심 ±1,010 bp 구간이다. 왼쪽 패널(NucleosomeFree)은 nucleosome-free fragment, 오른쪽 패널(그림에는 mononucleosome으로 표시)은 mono, di, trinucleosome fragment를 합친 nucleosome 신호이며, 신호(log2)를 노랑(낮음)에서 빨강(높음)으로 나타낸다. 정상적인 ATAC-seq에서는 nucleosome-free 신호가 TSS 바로 위에 모이고, nucleosome 신호는 TSS 양옆(nucleosome 자리)에 나타난다.</w:t>
-      </w:r>
-    </w:p>
-    <w:p>
-      <w:pPr>
-        <w:spacing w:after="140"/>
-      </w:pPr>
+          <w:color w:val="B0B0B0"/>
+          <w:sz w:val="18"/>
+          <w:szCs w:val="18"/>
+        </w:rPr>
+        <w:t xml:space="preserve">[내부 메모 · 붙여 넣지 마세요] </w:t>
+      </w:r>
+      <w:r>
+        <w:rPr>
+          <w:color w:val="8A8F99"/>
+          <w:sz w:val="18"/>
+          <w:szCs w:val="18"/>
+        </w:rPr>
+        <w:t xml:space="preserve">그림: </w:t>
+      </w:r>
+      <w:r>
+        <w:rPr>
+          <w:color w:val="8A8F99"/>
+          <w:sz w:val="18"/>
+          <w:szCs w:val="18"/>
+        </w:rPr>
+        <w:t xml:space="preserve">docs/ATAC-seq/modules/figures/module_results/ATAC_QC_plot_result_1.png</w:t>
+      </w:r>
+    </w:p>
+    <w:p>
+      <w:pPr>
+        <w:pStyle w:val="ListParagraph"/>
+        <w:numPr>
+          <w:ilvl w:val="0"/>
+          <w:numId w:val="2"/>
+        </w:numPr>
+        <w:spacing w:after="80"/>
+      </w:pPr>
+      <w:r>
+        <w:t xml:space="preserve">레전드(국문): </w:t>
+      </w:r>
       <w:r>
         <w:rPr>
           <w:b/>
           <w:bCs/>
         </w:rPr>
-        <w:t xml:space="preserve">Legend (English)</w:t>
-      </w:r>
-    </w:p>
-    <w:p>
-      <w:pPr>
-        <w:spacing w:after="140"/>
-      </w:pPr>
+        <w:t xml:space="preserve">TSS 주변의 nucleosome-free 신호와 nucleosome 신호.</w:t>
+      </w:r>
+      <w:r>
+        <w:t xml:space="preserve"> 각 행은 TSS 하나이고, 가로축은 TSS 중심 ±1,010 bp 구간이다. 왼쪽 패널(NucleosomeFree)은 nucleosome-free fragment, 오른쪽 패널(그림에는 mononucleosome으로 표시)은 mono, di, trinucleosome fragment를 합친 nucleosome 신호이며, 신호(log2)를 노랑(낮음)에서 빨강(높음)으로 나타낸다. 정상적인 ATAC-seq에서는 nucleosome-free 신호가 TSS 바로 위에 모이고, nucleosome 신호는 TSS 양옆(nucleosome 자리)에 나타난다.</w:t>
+      </w:r>
+    </w:p>
+    <w:p>
+      <w:pPr>
+        <w:pStyle w:val="ListParagraph"/>
+        <w:numPr>
+          <w:ilvl w:val="0"/>
+          <w:numId w:val="2"/>
+        </w:numPr>
+        <w:spacing w:after="80"/>
+      </w:pPr>
+      <w:r>
+        <w:t xml:space="preserve">레전드(영문): </w:t>
+      </w:r>
       <w:r>
         <w:rPr>
           <w:b/>
@@ -12544,6 +13035,130 @@
       </w:r>
       <w:r>
         <w:t xml:space="preserve"> Each row is one TSS and the x-axis spans ±1,010 bp around its centre. The left panel (NucleosomeFree) shows nucleosome-free fragments and the right panel (labelled mononucleosome in the plot) the nucleosome signal of mono-, di-, and trinucleosome fragments combined, with signal (log2) from yellow (low) to red (high). In good ATAC-seq data the nucleosome-free signal concentrates at the TSS, while the nucleosome signal flanks it where nucleosomes sit.</w:t>
+      </w:r>
+    </w:p>
+    <w:p>
+      <w:pPr>
+        <w:spacing w:after="140"/>
+      </w:pPr>
+      <w:r>
+        <w:rPr>
+          <w:b/>
+          <w:bCs/>
+        </w:rPr>
+        <w:t xml:space="preserve">결과 2. TSS 주변 평균 신호</w:t>
+      </w:r>
+    </w:p>
+    <w:p>
+      <w:pPr>
+        <w:pStyle w:val="ListParagraph"/>
+        <w:numPr>
+          <w:ilvl w:val="0"/>
+          <w:numId w:val="2"/>
+        </w:numPr>
+        <w:spacing w:after="80"/>
+      </w:pPr>
+      <w:r>
+        <w:t xml:space="preserve">등록할 그림: </w:t>
+      </w:r>
+      <w:r>
+        <w:t xml:space="preserve">01_tss_signal/&lt;sample&gt;.TSSprofile_splitbam.pdf</w:t>
+      </w:r>
+      <w:r>
+        <w:t xml:space="preserve"> (결과 1과 같은 샘플)</w:t>
+      </w:r>
+    </w:p>
+    <w:p>
+      <w:pPr>
+        <w:pStyle w:val="ListParagraph"/>
+        <w:numPr>
+          <w:ilvl w:val="0"/>
+          <w:numId w:val="2"/>
+        </w:numPr>
+        <w:spacing w:after="80"/>
+      </w:pPr>
+      <w:r>
+        <w:t xml:space="preserve">저장 파일: </w:t>
+      </w:r>
+      <w:r>
+        <w:t xml:space="preserve">docs/ATAC-seq/modules/figures/module_results/ATAC_QC_plot_result_2.{png,svg}</w:t>
+      </w:r>
+    </w:p>
+    <w:p>
+      <w:pPr>
+        <w:spacing w:after="120"/>
+      </w:pPr>
+      <w:r>
+        <w:rPr>
+          <w:b/>
+          <w:bCs/>
+          <w:color w:val="B0B0B0"/>
+          <w:sz w:val="18"/>
+          <w:szCs w:val="18"/>
+        </w:rPr>
+        <w:t xml:space="preserve">[내부 메모 · 붙여 넣지 마세요] </w:t>
+      </w:r>
+      <w:r>
+        <w:rPr>
+          <w:color w:val="8A8F99"/>
+          <w:sz w:val="18"/>
+          <w:szCs w:val="18"/>
+        </w:rPr>
+        <w:t xml:space="preserve">그림: </w:t>
+      </w:r>
+      <w:r>
+        <w:rPr>
+          <w:color w:val="8A8F99"/>
+          <w:sz w:val="18"/>
+          <w:szCs w:val="18"/>
+        </w:rPr>
+        <w:t xml:space="preserve">docs/ATAC-seq/modules/figures/module_results/ATAC_QC_plot_result_2.png</w:t>
+      </w:r>
+    </w:p>
+    <w:p>
+      <w:pPr>
+        <w:pStyle w:val="ListParagraph"/>
+        <w:numPr>
+          <w:ilvl w:val="0"/>
+          <w:numId w:val="2"/>
+        </w:numPr>
+        <w:spacing w:after="80"/>
+      </w:pPr>
+      <w:r>
+        <w:t xml:space="preserve">레전드(국문): </w:t>
+      </w:r>
+      <w:r>
+        <w:rPr>
+          <w:b/>
+          <w:bCs/>
+        </w:rPr>
+        <w:t xml:space="preserve">TSS 주변 평균 신호.</w:t>
+      </w:r>
+      <w:r>
+        <w:t xml:space="preserve"> 결과 1의 heatmap을 모든 TSS에 대해 평균한 선 그래프다. 가로축은 TSS 기준 위치(−1 kb~+1 kb), 세로축은 각 신호를 0~1로 맞춘 값(Fraction of signal)이다. 검은 선은 NucleosomeFree, 빨간 선은 nucleosome 신호(그림에는 mononucleosome으로 표시, mono, di, trinucleosome fragment를 합친 신호)다. 정상적인 ATAC-seq에서는 검은 선이 TSS(가운데)에서 가장 높고, 빨간 선은 TSS에서 낮아졌다가 양옆(−1, +1 nucleosome 자리)에서 높아진다.</w:t>
+      </w:r>
+    </w:p>
+    <w:p>
+      <w:pPr>
+        <w:pStyle w:val="ListParagraph"/>
+        <w:numPr>
+          <w:ilvl w:val="0"/>
+          <w:numId w:val="2"/>
+        </w:numPr>
+        <w:spacing w:after="80"/>
+      </w:pPr>
+      <w:r>
+        <w:t xml:space="preserve">레전드(영문): </w:t>
+      </w:r>
+      <w:r>
+        <w:rPr>
+          <w:b/>
+          <w:bCs/>
+        </w:rPr>
+        <w:t xml:space="preserve">Average signal around TSSs.</w:t>
+      </w:r>
+      <w:r>
+        <w:t xml:space="preserve"> The heatmap of result 1 averaged over all TSSs. The x-axis is the position relative to the TSS (−1 kb to +1 kb) and the y-axis each signal scaled to 0-1 (fraction of signal). The black line is NucleosomeFree and the red line the nucleosome signal (labelled mononucleosome in the plot; mono-, di-, and trinucleosome fragments combined). In good ATAC-seq data the black line peaks at the TSS (centre), while the red line dips at the TSS and rises on both sides at the −1 and +1 nucleosome positions.</w:t>
       </w:r>
     </w:p>
     <w:p>
@@ -15715,58 +16330,114 @@
         <w:spacing w:after="140"/>
       </w:pPr>
       <w:r>
-        <w:t xml:space="preserve">등록할 그림: 표 캡처 </w:t>
-      </w:r>
-      <w:r>
-        <w:t xml:space="preserve">frip_summary.tsv</w:t>
-      </w:r>
-      <w:r>
-        <w:t xml:space="preserve"> (이 모듈은 그림을 만들지 않는다)</w:t>
-      </w:r>
-    </w:p>
-    <w:p>
-      <w:pPr>
-        <w:spacing w:after="140"/>
-      </w:pPr>
-      <w:r>
         <w:rPr>
           <w:b/>
           <w:bCs/>
         </w:rPr>
-        <w:t xml:space="preserve">레전드(국문)</w:t>
-      </w:r>
-    </w:p>
-    <w:p>
-      <w:pPr>
-        <w:spacing w:after="140"/>
+        <w:t xml:space="preserve">결과 1. 샘플별 peak 수와 FRiP</w:t>
+      </w:r>
+    </w:p>
+    <w:p>
+      <w:pPr>
+        <w:pStyle w:val="ListParagraph"/>
+        <w:numPr>
+          <w:ilvl w:val="0"/>
+          <w:numId w:val="2"/>
+        </w:numPr>
+        <w:spacing w:after="80"/>
+      </w:pPr>
+      <w:r>
+        <w:t xml:space="preserve">등록할 그림: 표 캡처 </w:t>
+      </w:r>
+      <w:r>
+        <w:t xml:space="preserve">frip_summary.tsv</w:t>
+      </w:r>
+      <w:r>
+        <w:t xml:space="preserve"> (이 모듈은 그림을 만들지 않는다)</w:t>
+      </w:r>
+    </w:p>
+    <w:p>
+      <w:pPr>
+        <w:pStyle w:val="ListParagraph"/>
+        <w:numPr>
+          <w:ilvl w:val="0"/>
+          <w:numId w:val="2"/>
+        </w:numPr>
+        <w:spacing w:after="80"/>
+      </w:pPr>
+      <w:r>
+        <w:t xml:space="preserve">저장 파일: </w:t>
+      </w:r>
+      <w:r>
+        <w:t xml:space="preserve">docs/ATAC-seq/modules/figures/module_results/MACS3_callpeak_ATAC_result_1.png</w:t>
+      </w:r>
+    </w:p>
+    <w:p>
+      <w:pPr>
+        <w:spacing w:after="120"/>
       </w:pPr>
       <w:r>
         <w:rPr>
           <w:b/>
           <w:bCs/>
-        </w:rPr>
-        <w:t xml:space="preserve">샘플별 peak 수와 FRiP.</w:t>
-      </w:r>
-      <w:r>
-        <w:t xml:space="preserve"> 샘플마다 MACS3로 찾은 peak 수(peaks), 전체 read 수(total_reads), peak 안에 들어간 read 수(reads_in_peaks), 그 비율(FRiP)을 보여 준다. FRiP는 신호 대 잡음의 지표로, ENCODE ATAC-seq 기준에서는 0.3 이상이 바람직하고 0.2 이상이면 허용한다.</w:t>
-      </w:r>
-    </w:p>
-    <w:p>
-      <w:pPr>
-        <w:spacing w:after="140"/>
-      </w:pPr>
+          <w:color w:val="B0B0B0"/>
+          <w:sz w:val="18"/>
+          <w:szCs w:val="18"/>
+        </w:rPr>
+        <w:t xml:space="preserve">[내부 메모 · 붙여 넣지 마세요] </w:t>
+      </w:r>
+      <w:r>
+        <w:rPr>
+          <w:color w:val="8A8F99"/>
+          <w:sz w:val="18"/>
+          <w:szCs w:val="18"/>
+        </w:rPr>
+        <w:t xml:space="preserve">그림: </w:t>
+      </w:r>
+      <w:r>
+        <w:rPr>
+          <w:color w:val="8A8F99"/>
+          <w:sz w:val="18"/>
+          <w:szCs w:val="18"/>
+        </w:rPr>
+        <w:t xml:space="preserve">docs/ATAC-seq/modules/figures/module_results/MACS3_callpeak_ATAC_result_1.png</w:t>
+      </w:r>
+    </w:p>
+    <w:p>
+      <w:pPr>
+        <w:pStyle w:val="ListParagraph"/>
+        <w:numPr>
+          <w:ilvl w:val="0"/>
+          <w:numId w:val="2"/>
+        </w:numPr>
+        <w:spacing w:after="80"/>
+      </w:pPr>
+      <w:r>
+        <w:t xml:space="preserve">레전드(국문): </w:t>
+      </w:r>
       <w:r>
         <w:rPr>
           <w:b/>
           <w:bCs/>
         </w:rPr>
-        <w:t xml:space="preserve">Legend (English)</w:t>
-      </w:r>
-    </w:p>
-    <w:p>
-      <w:pPr>
-        <w:spacing w:after="140"/>
-      </w:pPr>
+        <w:t xml:space="preserve">샘플별 peak 수와 FRiP.</w:t>
+      </w:r>
+      <w:r>
+        <w:t xml:space="preserve"> 샘플마다 MACS3로 찾은 peak 수(peaks), 전체 read 수(total_reads), peak 안에 들어간 read 수(reads_in_peaks), 그 비율(FRiP)을 보여 준다. FRiP는 신호 대 잡음의 지표로, ENCODE ATAC-seq 기준에서는 0.3 이상이 바람직하고 0.2 이상이면 허용한다.</w:t>
+      </w:r>
+    </w:p>
+    <w:p>
+      <w:pPr>
+        <w:pStyle w:val="ListParagraph"/>
+        <w:numPr>
+          <w:ilvl w:val="0"/>
+          <w:numId w:val="2"/>
+        </w:numPr>
+        <w:spacing w:after="80"/>
+      </w:pPr>
+      <w:r>
+        <w:t xml:space="preserve">레전드(영문): </w:t>
+      </w:r>
       <w:r>
         <w:rPr>
           <w:b/>
@@ -19295,10 +19966,7 @@
         <w:spacing w:after="140"/>
       </w:pPr>
       <w:r>
-        <w:t xml:space="preserve">등록할 그림: </w:t>
-      </w:r>
-      <w:r>
-        <w:t xml:space="preserve">plots/annotation_summary_percent_barplot.pdf</w:t>
+        <w:t xml:space="preserve">결과 그림 4개를 아래 순서대로 등록한다. 결과 1이 대표 그림이다.</w:t>
       </w:r>
     </w:p>
     <w:p>
@@ -19310,40 +19978,107 @@
           <w:b/>
           <w:bCs/>
         </w:rPr>
-        <w:t xml:space="preserve">레전드(국문)</w:t>
-      </w:r>
-    </w:p>
-    <w:p>
-      <w:pPr>
-        <w:spacing w:after="140"/>
+        <w:t xml:space="preserve">결과 1. 샘플별 peak 유전체 영역 분포</w:t>
+      </w:r>
+    </w:p>
+    <w:p>
+      <w:pPr>
+        <w:pStyle w:val="ListParagraph"/>
+        <w:numPr>
+          <w:ilvl w:val="0"/>
+          <w:numId w:val="2"/>
+        </w:numPr>
+        <w:spacing w:after="80"/>
+      </w:pPr>
+      <w:r>
+        <w:t xml:space="preserve">등록할 그림: </w:t>
+      </w:r>
+      <w:r>
+        <w:t xml:space="preserve">plots/annotation_summary_percent_barplot.pdf</w:t>
+      </w:r>
+    </w:p>
+    <w:p>
+      <w:pPr>
+        <w:pStyle w:val="ListParagraph"/>
+        <w:numPr>
+          <w:ilvl w:val="0"/>
+          <w:numId w:val="2"/>
+        </w:numPr>
+        <w:spacing w:after="80"/>
+      </w:pPr>
+      <w:r>
+        <w:t xml:space="preserve">저장 파일: </w:t>
+      </w:r>
+      <w:r>
+        <w:t xml:space="preserve">docs/ATAC-seq/modules/figures/module_results/peak_annotation_result_1.{png,svg}</w:t>
+      </w:r>
+    </w:p>
+    <w:p>
+      <w:pPr>
+        <w:spacing w:after="120"/>
       </w:pPr>
       <w:r>
         <w:rPr>
           <w:b/>
           <w:bCs/>
-        </w:rPr>
-        <w:t xml:space="preserve">샘플별 peak의 유전체 영역 분포.</w:t>
-      </w:r>
-      <w:r>
-        <w:t xml:space="preserve"> 막대 하나가 샘플 하나이며, peak가 promoter, UTR, exon, intron, distal intergenic 등 각 유전체 영역에 놓인 비율(%)을 색으로 나누어 보여 준다. ATAC-seq peak는 보통 promoter와 intron, distal intergenic에 많이 놓이며, 샘플 간 분포가 비슷한지로 데이터의 일관성을 확인할 수 있다.</w:t>
-      </w:r>
-    </w:p>
-    <w:p>
-      <w:pPr>
-        <w:spacing w:after="140"/>
-      </w:pPr>
+          <w:color w:val="B0B0B0"/>
+          <w:sz w:val="18"/>
+          <w:szCs w:val="18"/>
+        </w:rPr>
+        <w:t xml:space="preserve">[내부 메모 · 붙여 넣지 마세요] </w:t>
+      </w:r>
+      <w:r>
+        <w:rPr>
+          <w:color w:val="8A8F99"/>
+          <w:sz w:val="18"/>
+          <w:szCs w:val="18"/>
+        </w:rPr>
+        <w:t xml:space="preserve">그림: </w:t>
+      </w:r>
+      <w:r>
+        <w:rPr>
+          <w:color w:val="8A8F99"/>
+          <w:sz w:val="18"/>
+          <w:szCs w:val="18"/>
+        </w:rPr>
+        <w:t xml:space="preserve">docs/ATAC-seq/modules/figures/module_results/peak_annotation_result_1.png</w:t>
+      </w:r>
+    </w:p>
+    <w:p>
+      <w:pPr>
+        <w:pStyle w:val="ListParagraph"/>
+        <w:numPr>
+          <w:ilvl w:val="0"/>
+          <w:numId w:val="2"/>
+        </w:numPr>
+        <w:spacing w:after="80"/>
+      </w:pPr>
+      <w:r>
+        <w:t xml:space="preserve">레전드(국문): </w:t>
+      </w:r>
       <w:r>
         <w:rPr>
           <w:b/>
           <w:bCs/>
         </w:rPr>
-        <w:t xml:space="preserve">Legend (English)</w:t>
-      </w:r>
-    </w:p>
-    <w:p>
-      <w:pPr>
-        <w:spacing w:after="140"/>
-      </w:pPr>
+        <w:t xml:space="preserve">샘플별 peak의 유전체 영역 분포.</w:t>
+      </w:r>
+      <w:r>
+        <w:t xml:space="preserve"> 막대 하나가 샘플 하나이며, peak가 promoter, UTR, exon, intron, distal intergenic 등 각 유전체 영역에 놓인 비율(%)을 색으로 나누어 보여 준다. ATAC-seq peak는 보통 promoter와 intron, distal intergenic에 많이 놓이며, 샘플 간 분포가 비슷한지로 데이터의 일관성을 확인할 수 있다.</w:t>
+      </w:r>
+    </w:p>
+    <w:p>
+      <w:pPr>
+        <w:pStyle w:val="ListParagraph"/>
+        <w:numPr>
+          <w:ilvl w:val="0"/>
+          <w:numId w:val="2"/>
+        </w:numPr>
+        <w:spacing w:after="80"/>
+      </w:pPr>
+      <w:r>
+        <w:t xml:space="preserve">레전드(영문): </w:t>
+      </w:r>
       <w:r>
         <w:rPr>
           <w:b/>
@@ -19353,6 +20088,378 @@
       </w:r>
       <w:r>
         <w:t xml:space="preserve"> Each bar is one sample, split by colour into the percentage of peaks in promoters, UTRs, exons, introns, distal intergenic regions and other features. ATAC-seq peaks are usually enriched in promoters, introns and distal intergenic regions; similar distributions across samples indicate consistent data.</w:t>
+      </w:r>
+    </w:p>
+    <w:p>
+      <w:pPr>
+        <w:spacing w:after="140"/>
+      </w:pPr>
+      <w:r>
+        <w:rPr>
+          <w:b/>
+          <w:bCs/>
+        </w:rPr>
+        <w:t xml:space="preserve">결과 2. 겹치는 주석 영역(UpSet)</w:t>
+      </w:r>
+    </w:p>
+    <w:p>
+      <w:pPr>
+        <w:pStyle w:val="ListParagraph"/>
+        <w:numPr>
+          <w:ilvl w:val="0"/>
+          <w:numId w:val="2"/>
+        </w:numPr>
+        <w:spacing w:after="80"/>
+      </w:pPr>
+      <w:r>
+        <w:t xml:space="preserve">등록할 그림: </w:t>
+      </w:r>
+      <w:r>
+        <w:t xml:space="preserve">plots/&lt;sample&gt;.annotation_upset_vennpie.pdf</w:t>
+      </w:r>
+      <w:r>
+        <w:t xml:space="preserve"> (대표 샘플 1개)</w:t>
+      </w:r>
+    </w:p>
+    <w:p>
+      <w:pPr>
+        <w:pStyle w:val="ListParagraph"/>
+        <w:numPr>
+          <w:ilvl w:val="0"/>
+          <w:numId w:val="2"/>
+        </w:numPr>
+        <w:spacing w:after="80"/>
+      </w:pPr>
+      <w:r>
+        <w:t xml:space="preserve">저장 파일: </w:t>
+      </w:r>
+      <w:r>
+        <w:t xml:space="preserve">docs/ATAC-seq/modules/figures/module_results/peak_annotation_result_2.{png,svg}</w:t>
+      </w:r>
+    </w:p>
+    <w:p>
+      <w:pPr>
+        <w:spacing w:after="120"/>
+      </w:pPr>
+      <w:r>
+        <w:rPr>
+          <w:b/>
+          <w:bCs/>
+          <w:color w:val="B0B0B0"/>
+          <w:sz w:val="18"/>
+          <w:szCs w:val="18"/>
+        </w:rPr>
+        <w:t xml:space="preserve">[내부 메모 · 붙여 넣지 마세요] </w:t>
+      </w:r>
+      <w:r>
+        <w:rPr>
+          <w:color w:val="8A8F99"/>
+          <w:sz w:val="18"/>
+          <w:szCs w:val="18"/>
+        </w:rPr>
+        <w:t xml:space="preserve">그림: </w:t>
+      </w:r>
+      <w:r>
+        <w:rPr>
+          <w:color w:val="8A8F99"/>
+          <w:sz w:val="18"/>
+          <w:szCs w:val="18"/>
+        </w:rPr>
+        <w:t xml:space="preserve">docs/ATAC-seq/modules/figures/module_results/peak_annotation_result_2.png</w:t>
+      </w:r>
+    </w:p>
+    <w:p>
+      <w:pPr>
+        <w:pStyle w:val="ListParagraph"/>
+        <w:numPr>
+          <w:ilvl w:val="0"/>
+          <w:numId w:val="2"/>
+        </w:numPr>
+        <w:spacing w:after="80"/>
+      </w:pPr>
+      <w:r>
+        <w:t xml:space="preserve">레전드(국문): </w:t>
+      </w:r>
+      <w:r>
+        <w:rPr>
+          <w:b/>
+          <w:bCs/>
+        </w:rPr>
+        <w:t xml:space="preserve">peak가 동시에 걸치는 유전체 영역(UpSet plot).</w:t>
+      </w:r>
+      <w:r>
+        <w:t xml:space="preserve"> peak 하나가 여러 영역(예: promoter이면서 exon)에 함께 걸칠 수 있으므로, 영역 조합별 peak 수를 보여 준다. 아래 점과 선은 영역 조합, 위 막대는 그 조합에 속한 peak 수다. 왼쪽 위의 원그래프(vennpie)는 전체 peak의 영역 구성을 요약한다. 결과 1의 막대는 우선순위에 따라 영역 하나만 고른 것이고, 이 그림은 겹침까지 보여 준다.</w:t>
+      </w:r>
+    </w:p>
+    <w:p>
+      <w:pPr>
+        <w:pStyle w:val="ListParagraph"/>
+        <w:numPr>
+          <w:ilvl w:val="0"/>
+          <w:numId w:val="2"/>
+        </w:numPr>
+        <w:spacing w:after="80"/>
+      </w:pPr>
+      <w:r>
+        <w:t xml:space="preserve">레전드(영문): </w:t>
+      </w:r>
+      <w:r>
+        <w:rPr>
+          <w:b/>
+          <w:bCs/>
+        </w:rPr>
+        <w:t xml:space="preserve">Overlapping genomic features of peaks (UpSet plot).</w:t>
+      </w:r>
+      <w:r>
+        <w:t xml:space="preserve"> A peak can fall in several features at once (for example promoter and exon), so the plot shows peak counts per feature combination: the dots and lines below define the combination and the bars above give its peak count. The pie (vennpie) at the top left summarises the feature composition of all peaks. Result 1 assigns each peak to one feature by priority; this plot shows the overlaps.</w:t>
+      </w:r>
+    </w:p>
+    <w:p>
+      <w:pPr>
+        <w:spacing w:after="140"/>
+      </w:pPr>
+      <w:r>
+        <w:rPr>
+          <w:b/>
+          <w:bCs/>
+        </w:rPr>
+        <w:t xml:space="preserve">결과 3. TSS까지 거리 분포</w:t>
+      </w:r>
+    </w:p>
+    <w:p>
+      <w:pPr>
+        <w:pStyle w:val="ListParagraph"/>
+        <w:numPr>
+          <w:ilvl w:val="0"/>
+          <w:numId w:val="2"/>
+        </w:numPr>
+        <w:spacing w:after="80"/>
+      </w:pPr>
+      <w:r>
+        <w:t xml:space="preserve">등록할 그림: </w:t>
+      </w:r>
+      <w:r>
+        <w:t xml:space="preserve">plots/&lt;sample&gt;.distance_to_tss.pdf</w:t>
+      </w:r>
+      <w:r>
+        <w:t xml:space="preserve"> (결과 2와 같은 샘플)</w:t>
+      </w:r>
+    </w:p>
+    <w:p>
+      <w:pPr>
+        <w:pStyle w:val="ListParagraph"/>
+        <w:numPr>
+          <w:ilvl w:val="0"/>
+          <w:numId w:val="2"/>
+        </w:numPr>
+        <w:spacing w:after="80"/>
+      </w:pPr>
+      <w:r>
+        <w:t xml:space="preserve">저장 파일: </w:t>
+      </w:r>
+      <w:r>
+        <w:t xml:space="preserve">docs/ATAC-seq/modules/figures/module_results/peak_annotation_result_3.{png,svg}</w:t>
+      </w:r>
+    </w:p>
+    <w:p>
+      <w:pPr>
+        <w:spacing w:after="120"/>
+      </w:pPr>
+      <w:r>
+        <w:rPr>
+          <w:b/>
+          <w:bCs/>
+          <w:color w:val="B0B0B0"/>
+          <w:sz w:val="18"/>
+          <w:szCs w:val="18"/>
+        </w:rPr>
+        <w:t xml:space="preserve">[내부 메모 · 붙여 넣지 마세요] </w:t>
+      </w:r>
+      <w:r>
+        <w:rPr>
+          <w:color w:val="8A8F99"/>
+          <w:sz w:val="18"/>
+          <w:szCs w:val="18"/>
+        </w:rPr>
+        <w:t xml:space="preserve">그림: </w:t>
+      </w:r>
+      <w:r>
+        <w:rPr>
+          <w:color w:val="8A8F99"/>
+          <w:sz w:val="18"/>
+          <w:szCs w:val="18"/>
+        </w:rPr>
+        <w:t xml:space="preserve">docs/ATAC-seq/modules/figures/module_results/peak_annotation_result_3.png</w:t>
+      </w:r>
+    </w:p>
+    <w:p>
+      <w:pPr>
+        <w:pStyle w:val="ListParagraph"/>
+        <w:numPr>
+          <w:ilvl w:val="0"/>
+          <w:numId w:val="2"/>
+        </w:numPr>
+        <w:spacing w:after="80"/>
+      </w:pPr>
+      <w:r>
+        <w:t xml:space="preserve">레전드(국문): </w:t>
+      </w:r>
+      <w:r>
+        <w:rPr>
+          <w:b/>
+          <w:bCs/>
+        </w:rPr>
+        <w:t xml:space="preserve">peak에서 가장 가까운 TSS까지의 거리 분포.</w:t>
+      </w:r>
+      <w:r>
+        <w:t xml:space="preserve"> 가로 막대는 peak의 비율(%)이며, 거리 구간(0~1 kb, 1~3 kb, 3~5 kb, 5~10 kb, 10~100 kb, 100 kb 이상)별로 색을 나누었다. 왼쪽(음수)은 유전자 상류, 오른쪽(양수)은 하류에 놓인 peak다. ATAC-seq peak는 TSS 가까이(0~3 kb)에 많이 모이며, 원거리 peak는 enhancer 같은 조절 부위의 후보다.</w:t>
+      </w:r>
+    </w:p>
+    <w:p>
+      <w:pPr>
+        <w:pStyle w:val="ListParagraph"/>
+        <w:numPr>
+          <w:ilvl w:val="0"/>
+          <w:numId w:val="2"/>
+        </w:numPr>
+        <w:spacing w:after="80"/>
+      </w:pPr>
+      <w:r>
+        <w:t xml:space="preserve">레전드(영문): </w:t>
+      </w:r>
+      <w:r>
+        <w:rPr>
+          <w:b/>
+          <w:bCs/>
+        </w:rPr>
+        <w:t xml:space="preserve">Distance from peaks to the nearest TSS.</w:t>
+      </w:r>
+      <w:r>
+        <w:t xml:space="preserve"> The horizontal bar gives the percentage of peaks in distance bins (0-1 kb, 1-3 kb, 3-5 kb, 5-10 kb, 10-100 kb, over 100 kb), with upstream peaks to the left (negative) and downstream peaks to the right (positive). ATAC-seq peaks concentrate near TSSs (0-3 kb), and distal peaks are candidates for regulatory elements such as enhancers.</w:t>
+      </w:r>
+    </w:p>
+    <w:p>
+      <w:pPr>
+        <w:spacing w:after="140"/>
+      </w:pPr>
+      <w:r>
+        <w:rPr>
+          <w:b/>
+          <w:bCs/>
+        </w:rPr>
+        <w:t xml:space="preserve">결과 4. TSS 주변 peak 분포</w:t>
+      </w:r>
+    </w:p>
+    <w:p>
+      <w:pPr>
+        <w:pStyle w:val="ListParagraph"/>
+        <w:numPr>
+          <w:ilvl w:val="0"/>
+          <w:numId w:val="2"/>
+        </w:numPr>
+        <w:spacing w:after="80"/>
+      </w:pPr>
+      <w:r>
+        <w:t xml:space="preserve">등록할 그림: </w:t>
+      </w:r>
+      <w:r>
+        <w:t xml:space="preserve">plots/&lt;sample&gt;.tss_profile.pdf</w:t>
+      </w:r>
+      <w:r>
+        <w:t xml:space="preserve"> (결과 2와 같은 샘플)</w:t>
+      </w:r>
+    </w:p>
+    <w:p>
+      <w:pPr>
+        <w:pStyle w:val="ListParagraph"/>
+        <w:numPr>
+          <w:ilvl w:val="0"/>
+          <w:numId w:val="2"/>
+        </w:numPr>
+        <w:spacing w:after="80"/>
+      </w:pPr>
+      <w:r>
+        <w:t xml:space="preserve">저장 파일: </w:t>
+      </w:r>
+      <w:r>
+        <w:t xml:space="preserve">docs/ATAC-seq/modules/figures/module_results/peak_annotation_result_4.{png,svg}</w:t>
+      </w:r>
+    </w:p>
+    <w:p>
+      <w:pPr>
+        <w:spacing w:after="120"/>
+      </w:pPr>
+      <w:r>
+        <w:rPr>
+          <w:b/>
+          <w:bCs/>
+          <w:color w:val="B0B0B0"/>
+          <w:sz w:val="18"/>
+          <w:szCs w:val="18"/>
+        </w:rPr>
+        <w:t xml:space="preserve">[내부 메모 · 붙여 넣지 마세요] </w:t>
+      </w:r>
+      <w:r>
+        <w:rPr>
+          <w:color w:val="8A8F99"/>
+          <w:sz w:val="18"/>
+          <w:szCs w:val="18"/>
+        </w:rPr>
+        <w:t xml:space="preserve">그림: </w:t>
+      </w:r>
+      <w:r>
+        <w:rPr>
+          <w:color w:val="8A8F99"/>
+          <w:sz w:val="18"/>
+          <w:szCs w:val="18"/>
+        </w:rPr>
+        <w:t xml:space="preserve">docs/ATAC-seq/modules/figures/module_results/peak_annotation_result_4.png</w:t>
+      </w:r>
+    </w:p>
+    <w:p>
+      <w:pPr>
+        <w:pStyle w:val="ListParagraph"/>
+        <w:numPr>
+          <w:ilvl w:val="0"/>
+          <w:numId w:val="2"/>
+        </w:numPr>
+        <w:spacing w:after="80"/>
+      </w:pPr>
+      <w:r>
+        <w:t xml:space="preserve">레전드(국문): </w:t>
+      </w:r>
+      <w:r>
+        <w:rPr>
+          <w:b/>
+          <w:bCs/>
+        </w:rPr>
+        <w:t xml:space="preserve">TSS 주변 peak 분포.</w:t>
+      </w:r>
+      <w:r>
+        <w:t xml:space="preserve"> 가로축은 TSS 기준 위치(기본 −3,000~+3,000 bp, 옵션 tss_upstream·tss_downstream), 세로축은 그 위치를 덮는 peak의 빈도(Peak Count Frequency)다. ATAC-seq에서는 TSS(0 bp) 바로 위에서 가장 높은 봉우리가 나타나며, 이는 promoter가 열려 있다는 뜻이다.</w:t>
+      </w:r>
+    </w:p>
+    <w:p>
+      <w:pPr>
+        <w:pStyle w:val="ListParagraph"/>
+        <w:numPr>
+          <w:ilvl w:val="0"/>
+          <w:numId w:val="2"/>
+        </w:numPr>
+        <w:spacing w:after="80"/>
+      </w:pPr>
+      <w:r>
+        <w:t xml:space="preserve">레전드(영문): </w:t>
+      </w:r>
+      <w:r>
+        <w:rPr>
+          <w:b/>
+          <w:bCs/>
+        </w:rPr>
+        <w:t xml:space="preserve">Peak distribution around TSSs.</w:t>
+      </w:r>
+      <w:r>
+        <w:t xml:space="preserve"> The x-axis is the position relative to the TSS (−3,000 to +3,000 bp by default; options tss_upstream and tss_downstream) and the y-axis how often peaks cover that position (peak count frequency). ATAC-seq data show the highest peak right at the TSS (0 bp), meaning that promoters are open.</w:t>
       </w:r>
     </w:p>
     <w:p>
@@ -23746,19 +24853,7 @@
         <w:spacing w:after="140"/>
       </w:pPr>
       <w:r>
-        <w:t xml:space="preserve">등록할 그림: </w:t>
-      </w:r>
-      <w:r>
-        <w:t xml:space="preserve">04_plots/PCA_plot.pdf</w:t>
-      </w:r>
-      <w:r>
-        <w:t xml:space="preserve">, </w:t>
-      </w:r>
-      <w:r>
-        <w:t xml:space="preserve">04_plots/MD_plot.pdf</w:t>
-      </w:r>
-      <w:r>
-        <w:t xml:space="preserve"> (두 그림을 나란히)</w:t>
+        <w:t xml:space="preserve">결과 그림 4개를 아래 순서대로 등록한다. 결과 1이 대표 그림이다.</w:t>
       </w:r>
     </w:p>
     <w:p>
@@ -23770,49 +24865,494 @@
           <w:b/>
           <w:bCs/>
         </w:rPr>
-        <w:t xml:space="preserve">레전드(국문)</w:t>
-      </w:r>
-    </w:p>
-    <w:p>
-      <w:pPr>
-        <w:spacing w:after="140"/>
+        <w:t xml:space="preserve">결과 1. PCA</w:t>
+      </w:r>
+    </w:p>
+    <w:p>
+      <w:pPr>
+        <w:pStyle w:val="ListParagraph"/>
+        <w:numPr>
+          <w:ilvl w:val="0"/>
+          <w:numId w:val="2"/>
+        </w:numPr>
+        <w:spacing w:after="80"/>
+      </w:pPr>
+      <w:r>
+        <w:t xml:space="preserve">등록할 그림: </w:t>
+      </w:r>
+      <w:r>
+        <w:t xml:space="preserve">04_plots/PCA_plot.pdf</w:t>
+      </w:r>
+    </w:p>
+    <w:p>
+      <w:pPr>
+        <w:pStyle w:val="ListParagraph"/>
+        <w:numPr>
+          <w:ilvl w:val="0"/>
+          <w:numId w:val="2"/>
+        </w:numPr>
+        <w:spacing w:after="80"/>
+      </w:pPr>
+      <w:r>
+        <w:t xml:space="preserve">저장 파일: </w:t>
+      </w:r>
+      <w:r>
+        <w:t xml:space="preserve">docs/ATAC-seq/modules/figures/module_results/differential_accessibility_result_1.{png,svg}</w:t>
+      </w:r>
+    </w:p>
+    <w:p>
+      <w:pPr>
+        <w:spacing w:after="120"/>
       </w:pPr>
       <w:r>
         <w:rPr>
           <w:b/>
           <w:bCs/>
-        </w:rPr>
-        <w:t xml:space="preserve">샘플 간 차이와 조건 간 접근성 변화.</w:t>
-      </w:r>
-      <w:r>
-        <w:t xml:space="preserve"> (A) PCA. 변동이 큰 peak의 log CPM으로 샘플을 2차원에 놓은 그림으로, 점 하나가 샘플 하나이고 색은 조건이다. 같은 조건의 반복 샘플이 모이고 조건끼리 떨어져 있으면 조건 간 차이가 반복 간 차이보다 크다는 뜻이다. (B) MD plot. 점 하나가 peak 하나이며, 가로축은 평균 접근성(log CPM), 세로축은 조건 간 변화(log2 fold change)다. 유의하게 열린 peak와 닫힌 peak가 색으로 구분된다.</w:t>
-      </w:r>
-    </w:p>
-    <w:p>
-      <w:pPr>
-        <w:spacing w:after="140"/>
-      </w:pPr>
+          <w:color w:val="B0B0B0"/>
+          <w:sz w:val="18"/>
+          <w:szCs w:val="18"/>
+        </w:rPr>
+        <w:t xml:space="preserve">[내부 메모 · 붙여 넣지 마세요] </w:t>
+      </w:r>
+      <w:r>
+        <w:rPr>
+          <w:color w:val="8A8F99"/>
+          <w:sz w:val="18"/>
+          <w:szCs w:val="18"/>
+        </w:rPr>
+        <w:t xml:space="preserve">그림: </w:t>
+      </w:r>
+      <w:r>
+        <w:rPr>
+          <w:color w:val="8A8F99"/>
+          <w:sz w:val="18"/>
+          <w:szCs w:val="18"/>
+        </w:rPr>
+        <w:t xml:space="preserve">docs/ATAC-seq/modules/figures/module_results/differential_accessibility_result_1.png</w:t>
+      </w:r>
+    </w:p>
+    <w:p>
+      <w:pPr>
+        <w:pStyle w:val="ListParagraph"/>
+        <w:numPr>
+          <w:ilvl w:val="0"/>
+          <w:numId w:val="2"/>
+        </w:numPr>
+        <w:spacing w:after="80"/>
+      </w:pPr>
+      <w:r>
+        <w:t xml:space="preserve">레전드(국문): </w:t>
+      </w:r>
       <w:r>
         <w:rPr>
           <w:b/>
           <w:bCs/>
         </w:rPr>
-        <w:t xml:space="preserve">Legend (English)</w:t>
-      </w:r>
-    </w:p>
-    <w:p>
-      <w:pPr>
-        <w:spacing w:after="140"/>
-      </w:pPr>
+        <w:t xml:space="preserve">샘플 PCA.</w:t>
+      </w:r>
+      <w:r>
+        <w:t xml:space="preserve"> 변동이 큰 peak(최대 5,000개)의 log2 CPM으로 샘플을 2차원에 놓은 그림이다. 점 하나가 샘플 하나이고 색은 조건이며, 축 이름에 각 주성분이 설명하는 변동(%)이 붙는다. 같은 조건의 반복 샘플이 모이고 조건끼리 떨어져 있으면 조건 간 차이가 반복 간 차이보다 크다는 뜻이다. 샘플이 3개 이상일 때 만든다.</w:t>
+      </w:r>
+    </w:p>
+    <w:p>
+      <w:pPr>
+        <w:pStyle w:val="ListParagraph"/>
+        <w:numPr>
+          <w:ilvl w:val="0"/>
+          <w:numId w:val="2"/>
+        </w:numPr>
+        <w:spacing w:after="80"/>
+      </w:pPr>
+      <w:r>
+        <w:t xml:space="preserve">레전드(영문): </w:t>
+      </w:r>
       <w:r>
         <w:rPr>
           <w:b/>
           <w:bCs/>
         </w:rPr>
-        <w:t xml:space="preserve">Sample relationships and accessibility changes between conditions.</w:t>
-      </w:r>
-      <w:r>
-        <w:t xml:space="preserve"> (A) PCA of samples based on log CPM of the most variable peaks; each point is a sample coloured by condition. Replicates clustering together and conditions separating indicate that the condition effect exceeds replicate variation. (B) MD plot; each point is a peak, with mean accessibility (log CPM) on the x-axis and the change between conditions (log2 fold change) on the y-axis. Significantly gained and lost peaks are highlighted in colour.</w:t>
+        <w:t xml:space="preserve">Sample PCA.</w:t>
+      </w:r>
+      <w:r>
+        <w:t xml:space="preserve"> Samples placed in two dimensions by the log2 CPM of the most variable peaks (up to 5,000). Each point is a sample coloured by condition, and each axis label gives the variance explained (%). Replicates clustering together and conditions separating indicate that the condition effect exceeds replicate variation. Drawn with three or more samples.</w:t>
+      </w:r>
+    </w:p>
+    <w:p>
+      <w:pPr>
+        <w:spacing w:after="140"/>
+      </w:pPr>
+      <w:r>
+        <w:rPr>
+          <w:b/>
+          <w:bCs/>
+        </w:rPr>
+        <w:t xml:space="preserve">결과 2. 샘플 상관 heatmap</w:t>
+      </w:r>
+    </w:p>
+    <w:p>
+      <w:pPr>
+        <w:pStyle w:val="ListParagraph"/>
+        <w:numPr>
+          <w:ilvl w:val="0"/>
+          <w:numId w:val="2"/>
+        </w:numPr>
+        <w:spacing w:after="80"/>
+      </w:pPr>
+      <w:r>
+        <w:t xml:space="preserve">등록할 그림: </w:t>
+      </w:r>
+      <w:r>
+        <w:t xml:space="preserve">04_plots/sample_correlation_heatmap.pdf</w:t>
+      </w:r>
+    </w:p>
+    <w:p>
+      <w:pPr>
+        <w:pStyle w:val="ListParagraph"/>
+        <w:numPr>
+          <w:ilvl w:val="0"/>
+          <w:numId w:val="2"/>
+        </w:numPr>
+        <w:spacing w:after="80"/>
+      </w:pPr>
+      <w:r>
+        <w:t xml:space="preserve">저장 파일: </w:t>
+      </w:r>
+      <w:r>
+        <w:t xml:space="preserve">docs/ATAC-seq/modules/figures/module_results/differential_accessibility_result_2.{png,svg}</w:t>
+      </w:r>
+    </w:p>
+    <w:p>
+      <w:pPr>
+        <w:spacing w:after="120"/>
+      </w:pPr>
+      <w:r>
+        <w:rPr>
+          <w:b/>
+          <w:bCs/>
+          <w:color w:val="B0B0B0"/>
+          <w:sz w:val="18"/>
+          <w:szCs w:val="18"/>
+        </w:rPr>
+        <w:t xml:space="preserve">[내부 메모 · 붙여 넣지 마세요] </w:t>
+      </w:r>
+      <w:r>
+        <w:rPr>
+          <w:color w:val="8A8F99"/>
+          <w:sz w:val="18"/>
+          <w:szCs w:val="18"/>
+        </w:rPr>
+        <w:t xml:space="preserve">그림: </w:t>
+      </w:r>
+      <w:r>
+        <w:rPr>
+          <w:color w:val="8A8F99"/>
+          <w:sz w:val="18"/>
+          <w:szCs w:val="18"/>
+        </w:rPr>
+        <w:t xml:space="preserve">docs/ATAC-seq/modules/figures/module_results/differential_accessibility_result_2.png</w:t>
+      </w:r>
+    </w:p>
+    <w:p>
+      <w:pPr>
+        <w:pStyle w:val="ListParagraph"/>
+        <w:numPr>
+          <w:ilvl w:val="0"/>
+          <w:numId w:val="2"/>
+        </w:numPr>
+        <w:spacing w:after="80"/>
+      </w:pPr>
+      <w:r>
+        <w:t xml:space="preserve">레전드(국문): </w:t>
+      </w:r>
+      <w:r>
+        <w:rPr>
+          <w:b/>
+          <w:bCs/>
+        </w:rPr>
+        <w:t xml:space="preserve">샘플 간 상관 heatmap.</w:t>
+      </w:r>
+      <w:r>
+        <w:t xml:space="preserve"> 모든 샘플 쌍의 Pearson 상관계수(log2 CPM 기준)를 칸마다 숫자와 색(연한 파랑 낮음, 진한 남색 높음)으로 보여 준다. 비슷한 샘플끼리 가깝게 놓이도록 계층 군집 순서로 정렬했다. 같은 조건의 반복끼리 상관이 가장 높아야 하며, 한 샘플만 다른 샘플과 상관이 낮으면 이상 샘플을 의심한다.</w:t>
+      </w:r>
+    </w:p>
+    <w:p>
+      <w:pPr>
+        <w:pStyle w:val="ListParagraph"/>
+        <w:numPr>
+          <w:ilvl w:val="0"/>
+          <w:numId w:val="2"/>
+        </w:numPr>
+        <w:spacing w:after="80"/>
+      </w:pPr>
+      <w:r>
+        <w:t xml:space="preserve">레전드(영문): </w:t>
+      </w:r>
+      <w:r>
+        <w:rPr>
+          <w:b/>
+          <w:bCs/>
+        </w:rPr>
+        <w:t xml:space="preserve">Sample correlation heatmap.</w:t>
+      </w:r>
+      <w:r>
+        <w:t xml:space="preserve"> Pearson correlation (log2 CPM) for every pair of samples, shown as numbers and colour (light blue low, dark navy high), with samples ordered by hierarchical clustering so similar ones sit together. Replicates of the same condition should correlate most strongly; a single sample with low correlation to all others suggests an outlier.</w:t>
+      </w:r>
+    </w:p>
+    <w:p>
+      <w:pPr>
+        <w:spacing w:after="140"/>
+      </w:pPr>
+      <w:r>
+        <w:rPr>
+          <w:b/>
+          <w:bCs/>
+        </w:rPr>
+        <w:t xml:space="preserve">결과 3. MD plot</w:t>
+      </w:r>
+    </w:p>
+    <w:p>
+      <w:pPr>
+        <w:pStyle w:val="ListParagraph"/>
+        <w:numPr>
+          <w:ilvl w:val="0"/>
+          <w:numId w:val="2"/>
+        </w:numPr>
+        <w:spacing w:after="80"/>
+      </w:pPr>
+      <w:r>
+        <w:t xml:space="preserve">등록할 그림: </w:t>
+      </w:r>
+      <w:r>
+        <w:t xml:space="preserve">04_plots/MD_plot.pdf</w:t>
+      </w:r>
+    </w:p>
+    <w:p>
+      <w:pPr>
+        <w:pStyle w:val="ListParagraph"/>
+        <w:numPr>
+          <w:ilvl w:val="0"/>
+          <w:numId w:val="2"/>
+        </w:numPr>
+        <w:spacing w:after="80"/>
+      </w:pPr>
+      <w:r>
+        <w:t xml:space="preserve">저장 파일: </w:t>
+      </w:r>
+      <w:r>
+        <w:t xml:space="preserve">docs/ATAC-seq/modules/figures/module_results/differential_accessibility_result_3.{png,svg}</w:t>
+      </w:r>
+    </w:p>
+    <w:p>
+      <w:pPr>
+        <w:spacing w:after="120"/>
+      </w:pPr>
+      <w:r>
+        <w:rPr>
+          <w:b/>
+          <w:bCs/>
+          <w:color w:val="B0B0B0"/>
+          <w:sz w:val="18"/>
+          <w:szCs w:val="18"/>
+        </w:rPr>
+        <w:t xml:space="preserve">[내부 메모 · 붙여 넣지 마세요] </w:t>
+      </w:r>
+      <w:r>
+        <w:rPr>
+          <w:color w:val="8A8F99"/>
+          <w:sz w:val="18"/>
+          <w:szCs w:val="18"/>
+        </w:rPr>
+        <w:t xml:space="preserve">그림: </w:t>
+      </w:r>
+      <w:r>
+        <w:rPr>
+          <w:color w:val="8A8F99"/>
+          <w:sz w:val="18"/>
+          <w:szCs w:val="18"/>
+        </w:rPr>
+        <w:t xml:space="preserve">docs/ATAC-seq/modules/figures/module_results/differential_accessibility_result_3.png</w:t>
+      </w:r>
+    </w:p>
+    <w:p>
+      <w:pPr>
+        <w:pStyle w:val="ListParagraph"/>
+        <w:numPr>
+          <w:ilvl w:val="0"/>
+          <w:numId w:val="2"/>
+        </w:numPr>
+        <w:spacing w:after="80"/>
+      </w:pPr>
+      <w:r>
+        <w:t xml:space="preserve">레전드(국문): </w:t>
+      </w:r>
+      <w:r>
+        <w:rPr>
+          <w:b/>
+          <w:bCs/>
+        </w:rPr>
+        <w:t xml:space="preserve">조건 간 접근성 변화(MD plot).</w:t>
+      </w:r>
+      <w:r>
+        <w:t xml:space="preserve"> 점 하나가 peak 하나다. 가로축은 평균 접근성(average log CPM), 세로축은 조건 간 변화(log2 fold change)이며 빨간 점선이 0이다. 유의하게 열린 peak(Up)와 닫힌 peak(Down)가 색으로 구분된다. 대부분의 peak가 0 근처에 모이고 유의한 peak가 위아래로 갈라지면 정규화가 잘 된 것이다. 반복 샘플이 없으면 유의성 없이 fold change만 그린다.</w:t>
+      </w:r>
+    </w:p>
+    <w:p>
+      <w:pPr>
+        <w:pStyle w:val="ListParagraph"/>
+        <w:numPr>
+          <w:ilvl w:val="0"/>
+          <w:numId w:val="2"/>
+        </w:numPr>
+        <w:spacing w:after="80"/>
+      </w:pPr>
+      <w:r>
+        <w:t xml:space="preserve">레전드(영문): </w:t>
+      </w:r>
+      <w:r>
+        <w:rPr>
+          <w:b/>
+          <w:bCs/>
+        </w:rPr>
+        <w:t xml:space="preserve">Accessibility changes between conditions (MD plot).</w:t>
+      </w:r>
+      <w:r>
+        <w:t xml:space="preserve"> Each point is a peak, with mean accessibility (average log CPM) on the x-axis and the change between conditions (log2 fold change) on the y-axis; the red dashed line marks 0. Significantly gained (Up) and lost (Down) peaks are coloured. Most peaks centred on 0 with significant peaks splitting above and below indicate good normalization. Without replicates only the fold change is drawn, without significance.</w:t>
+      </w:r>
+    </w:p>
+    <w:p>
+      <w:pPr>
+        <w:spacing w:after="140"/>
+      </w:pPr>
+      <w:r>
+        <w:rPr>
+          <w:b/>
+          <w:bCs/>
+        </w:rPr>
+        <w:t xml:space="preserve">결과 4. GC 구간별 logFC</w:t>
+      </w:r>
+    </w:p>
+    <w:p>
+      <w:pPr>
+        <w:pStyle w:val="ListParagraph"/>
+        <w:numPr>
+          <w:ilvl w:val="0"/>
+          <w:numId w:val="2"/>
+        </w:numPr>
+        <w:spacing w:after="80"/>
+      </w:pPr>
+      <w:r>
+        <w:t xml:space="preserve">등록할 그림: </w:t>
+      </w:r>
+      <w:r>
+        <w:t xml:space="preserve">04_plots/logFC_by_GC_bin_TMM.pdf</w:t>
+      </w:r>
+      <w:r>
+        <w:t xml:space="preserve"> (EDASeq·CQN을 실행했으면 </w:t>
+      </w:r>
+      <w:r>
+        <w:t xml:space="preserve">_EDASeq</w:t>
+      </w:r>
+      <w:r>
+        <w:t xml:space="preserve">, </w:t>
+      </w:r>
+      <w:r>
+        <w:t xml:space="preserve">_CQN</w:t>
+      </w:r>
+      <w:r>
+        <w:t xml:space="preserve"> 그림과 비교)</w:t>
+      </w:r>
+    </w:p>
+    <w:p>
+      <w:pPr>
+        <w:pStyle w:val="ListParagraph"/>
+        <w:numPr>
+          <w:ilvl w:val="0"/>
+          <w:numId w:val="2"/>
+        </w:numPr>
+        <w:spacing w:after="80"/>
+      </w:pPr>
+      <w:r>
+        <w:t xml:space="preserve">저장 파일: </w:t>
+      </w:r>
+      <w:r>
+        <w:t xml:space="preserve">docs/ATAC-seq/modules/figures/module_results/differential_accessibility_result_4.{png,svg}</w:t>
+      </w:r>
+    </w:p>
+    <w:p>
+      <w:pPr>
+        <w:spacing w:after="120"/>
+      </w:pPr>
+      <w:r>
+        <w:rPr>
+          <w:b/>
+          <w:bCs/>
+          <w:color w:val="B0B0B0"/>
+          <w:sz w:val="18"/>
+          <w:szCs w:val="18"/>
+        </w:rPr>
+        <w:t xml:space="preserve">[내부 메모 · 붙여 넣지 마세요] </w:t>
+      </w:r>
+      <w:r>
+        <w:rPr>
+          <w:color w:val="8A8F99"/>
+          <w:sz w:val="18"/>
+          <w:szCs w:val="18"/>
+        </w:rPr>
+        <w:t xml:space="preserve">그림: </w:t>
+      </w:r>
+      <w:r>
+        <w:rPr>
+          <w:color w:val="8A8F99"/>
+          <w:sz w:val="18"/>
+          <w:szCs w:val="18"/>
+        </w:rPr>
+        <w:t xml:space="preserve">docs/ATAC-seq/modules/figures/module_results/differential_accessibility_result_4.png</w:t>
+      </w:r>
+    </w:p>
+    <w:p>
+      <w:pPr>
+        <w:pStyle w:val="ListParagraph"/>
+        <w:numPr>
+          <w:ilvl w:val="0"/>
+          <w:numId w:val="2"/>
+        </w:numPr>
+        <w:spacing w:after="80"/>
+      </w:pPr>
+      <w:r>
+        <w:t xml:space="preserve">레전드(국문): </w:t>
+      </w:r>
+      <w:r>
+        <w:rPr>
+          <w:b/>
+          <w:bCs/>
+        </w:rPr>
+        <w:t xml:space="preserve">GC 함량 구간별 log2 fold change.</w:t>
+      </w:r>
+      <w:r>
+        <w:t xml:space="preserve"> peak를 GC 함량에 따라 20개 구간으로 나누고(가로축), 구간마다 logFC 분포를 바이올린과 상자 그림으로 보여 준다. 점선은 logFC 0이다. 구간별 분포가 모두 0 근처에 있으면 GC 편향이 없는 것이고, GC가 높거나 낮은 쪽으로 갈수록 분포가 한쪽으로 기울면 GC 편향이 있다는 뜻이다. 이때 EDASeq이나 CQN으로 보정한 결과를 쓴다.</w:t>
+      </w:r>
+    </w:p>
+    <w:p>
+      <w:pPr>
+        <w:pStyle w:val="ListParagraph"/>
+        <w:numPr>
+          <w:ilvl w:val="0"/>
+          <w:numId w:val="2"/>
+        </w:numPr>
+        <w:spacing w:after="80"/>
+      </w:pPr>
+      <w:r>
+        <w:t xml:space="preserve">레전드(영문): </w:t>
+      </w:r>
+      <w:r>
+        <w:rPr>
+          <w:b/>
+          <w:bCs/>
+        </w:rPr>
+        <w:t xml:space="preserve">log2 fold change by GC-content bin.</w:t>
+      </w:r>
+      <w:r>
+        <w:t xml:space="preserve"> Peaks are split into 20 bins by GC content (x-axis), and the logFC distribution of each bin is shown as a violin and box plot; the dashed line is logFC 0. Bins all centred on 0 mean no GC bias, while distributions drifting with GC content indicate GC bias, in which case the EDASeq or CQN results should be used.</w:t>
       </w:r>
     </w:p>
     <w:p>
@@ -28670,10 +30210,7 @@
         <w:spacing w:after="140"/>
       </w:pPr>
       <w:r>
-        <w:t xml:space="preserve">등록할 그림: </w:t>
-      </w:r>
-      <w:r>
-        <w:t xml:space="preserve">02_binned_enrichment/binned_motif_heatmap.pdf</w:t>
+        <w:t xml:space="preserve">결과 그림 4개를 아래 순서대로 등록한다. 결과 1이 대표 그림이다.</w:t>
       </w:r>
     </w:p>
     <w:p>
@@ -28685,40 +30222,107 @@
           <w:b/>
           <w:bCs/>
         </w:rPr>
-        <w:t xml:space="preserve">레전드(국문)</w:t>
-      </w:r>
-    </w:p>
-    <w:p>
-      <w:pPr>
-        <w:spacing w:after="140"/>
+        <w:t xml:space="preserve">결과 1. 구간별 모티프 농축 heatmap</w:t>
+      </w:r>
+    </w:p>
+    <w:p>
+      <w:pPr>
+        <w:pStyle w:val="ListParagraph"/>
+        <w:numPr>
+          <w:ilvl w:val="0"/>
+          <w:numId w:val="2"/>
+        </w:numPr>
+        <w:spacing w:after="80"/>
+      </w:pPr>
+      <w:r>
+        <w:t xml:space="preserve">등록할 그림: </w:t>
+      </w:r>
+      <w:r>
+        <w:t xml:space="preserve">02_binned_enrichment/binned_motif_heatmap.pdf</w:t>
+      </w:r>
+    </w:p>
+    <w:p>
+      <w:pPr>
+        <w:pStyle w:val="ListParagraph"/>
+        <w:numPr>
+          <w:ilvl w:val="0"/>
+          <w:numId w:val="2"/>
+        </w:numPr>
+        <w:spacing w:after="80"/>
+      </w:pPr>
+      <w:r>
+        <w:t xml:space="preserve">저장 파일: </w:t>
+      </w:r>
+      <w:r>
+        <w:t xml:space="preserve">docs/ATAC-seq/modules/figures/module_results/atac_motif_result_1.{png,svg}</w:t>
+      </w:r>
+    </w:p>
+    <w:p>
+      <w:pPr>
+        <w:spacing w:after="120"/>
       </w:pPr>
       <w:r>
         <w:rPr>
           <w:b/>
           <w:bCs/>
-        </w:rPr>
-        <w:t xml:space="preserve">접근성 변화 구간별 모티프 농축.</w:t>
-      </w:r>
-      <w:r>
-        <w:t xml:space="preserve"> peak를 접근성 변화(log2 fold change) 크기에 따라 여러 구간(bin)으로 나누고, 구간마다 각 전사인자 모티프가 배경보다 얼마나 많은지를 색으로 보여 준다. 행은 유의하게 농축된 모티프이며, 서로 비슷한 모티프끼리 묶어 정렬했고 왼쪽에 서열 로고와 GC 비율을 붙였다. 첫 heatmap은 농축도(log2 enrichment; 빨강 농축, 파랑 결핍), 둘째는 보정 p-value(−log10; 진할수록 유의)다. 열린 쪽 구간에서만 진하게 나타나는 모티프는 조건 변화로 활성이 커진 전사인자의 후보다.</w:t>
-      </w:r>
-    </w:p>
-    <w:p>
-      <w:pPr>
-        <w:spacing w:after="140"/>
-      </w:pPr>
+          <w:color w:val="B0B0B0"/>
+          <w:sz w:val="18"/>
+          <w:szCs w:val="18"/>
+        </w:rPr>
+        <w:t xml:space="preserve">[내부 메모 · 붙여 넣지 마세요] </w:t>
+      </w:r>
+      <w:r>
+        <w:rPr>
+          <w:color w:val="8A8F99"/>
+          <w:sz w:val="18"/>
+          <w:szCs w:val="18"/>
+        </w:rPr>
+        <w:t xml:space="preserve">그림: </w:t>
+      </w:r>
+      <w:r>
+        <w:rPr>
+          <w:color w:val="8A8F99"/>
+          <w:sz w:val="18"/>
+          <w:szCs w:val="18"/>
+        </w:rPr>
+        <w:t xml:space="preserve">docs/ATAC-seq/modules/figures/module_results/atac_motif_result_1.png</w:t>
+      </w:r>
+    </w:p>
+    <w:p>
+      <w:pPr>
+        <w:pStyle w:val="ListParagraph"/>
+        <w:numPr>
+          <w:ilvl w:val="0"/>
+          <w:numId w:val="2"/>
+        </w:numPr>
+        <w:spacing w:after="80"/>
+      </w:pPr>
+      <w:r>
+        <w:t xml:space="preserve">레전드(국문): </w:t>
+      </w:r>
       <w:r>
         <w:rPr>
           <w:b/>
           <w:bCs/>
         </w:rPr>
-        <w:t xml:space="preserve">Legend (English)</w:t>
-      </w:r>
-    </w:p>
-    <w:p>
-      <w:pPr>
-        <w:spacing w:after="140"/>
-      </w:pPr>
+        <w:t xml:space="preserve">접근성 변화 구간별 모티프 농축.</w:t>
+      </w:r>
+      <w:r>
+        <w:t xml:space="preserve"> peak를 접근성 변화(log2 fold change) 크기에 따라 여러 구간(bin)으로 나누고, 구간마다 각 전사인자 모티프가 배경보다 얼마나 많은지를 색으로 보여 준다. 행은 유의하게 농축된 모티프이며, 서로 비슷한 모티프끼리 묶어 정렬했고 왼쪽에 서열 로고와 GC 비율을 붙였다. 첫 heatmap은 농축도(log2 enrichment; 빨강 농축, 파랑 결핍), 둘째는 보정 p-value(−log10; 진할수록 유의)다. 열린 쪽 구간에서만 진하게 나타나는 모티프는 조건 변화로 활성이 커진 전사인자의 후보다.</w:t>
+      </w:r>
+    </w:p>
+    <w:p>
+      <w:pPr>
+        <w:pStyle w:val="ListParagraph"/>
+        <w:numPr>
+          <w:ilvl w:val="0"/>
+          <w:numId w:val="2"/>
+        </w:numPr>
+        <w:spacing w:after="80"/>
+      </w:pPr>
+      <w:r>
+        <w:t xml:space="preserve">레전드(영문): </w:t>
+      </w:r>
       <w:r>
         <w:rPr>
           <w:b/>
@@ -28728,6 +30332,375 @@
       </w:r>
       <w:r>
         <w:t xml:space="preserve"> Peaks are grouped into bins by log2 fold change in accessibility, and the colour shows how strongly each transcription factor motif is enriched in each bin relative to background. Rows are significantly enriched motifs, clustered by motif similarity and shown with sequence logos and GC content. The first heatmap is log2 enrichment (red enriched, blue depleted) and the second the adjusted p-value (−log10; darker is more significant). Motifs enriched only in the gained-accessibility bins point to transcription factors that become more active.</w:t>
+      </w:r>
+    </w:p>
+    <w:p>
+      <w:pPr>
+        <w:spacing w:after="140"/>
+      </w:pPr>
+      <w:r>
+        <w:rPr>
+          <w:b/>
+          <w:bCs/>
+        </w:rPr>
+        <w:t xml:space="preserve">결과 2. logFC 구간 나누기</w:t>
+      </w:r>
+    </w:p>
+    <w:p>
+      <w:pPr>
+        <w:pStyle w:val="ListParagraph"/>
+        <w:numPr>
+          <w:ilvl w:val="0"/>
+          <w:numId w:val="2"/>
+        </w:numPr>
+        <w:spacing w:after="80"/>
+      </w:pPr>
+      <w:r>
+        <w:t xml:space="preserve">등록할 그림: </w:t>
+      </w:r>
+      <w:r>
+        <w:t xml:space="preserve">01_qc/bin_density.pdf</w:t>
+      </w:r>
+    </w:p>
+    <w:p>
+      <w:pPr>
+        <w:pStyle w:val="ListParagraph"/>
+        <w:numPr>
+          <w:ilvl w:val="0"/>
+          <w:numId w:val="2"/>
+        </w:numPr>
+        <w:spacing w:after="80"/>
+      </w:pPr>
+      <w:r>
+        <w:t xml:space="preserve">저장 파일: </w:t>
+      </w:r>
+      <w:r>
+        <w:t xml:space="preserve">docs/ATAC-seq/modules/figures/module_results/atac_motif_result_2.{png,svg}</w:t>
+      </w:r>
+    </w:p>
+    <w:p>
+      <w:pPr>
+        <w:spacing w:after="120"/>
+      </w:pPr>
+      <w:r>
+        <w:rPr>
+          <w:b/>
+          <w:bCs/>
+          <w:color w:val="B0B0B0"/>
+          <w:sz w:val="18"/>
+          <w:szCs w:val="18"/>
+        </w:rPr>
+        <w:t xml:space="preserve">[내부 메모 · 붙여 넣지 마세요] </w:t>
+      </w:r>
+      <w:r>
+        <w:rPr>
+          <w:color w:val="8A8F99"/>
+          <w:sz w:val="18"/>
+          <w:szCs w:val="18"/>
+        </w:rPr>
+        <w:t xml:space="preserve">그림: </w:t>
+      </w:r>
+      <w:r>
+        <w:rPr>
+          <w:color w:val="8A8F99"/>
+          <w:sz w:val="18"/>
+          <w:szCs w:val="18"/>
+        </w:rPr>
+        <w:t xml:space="preserve">docs/ATAC-seq/modules/figures/module_results/atac_motif_result_2.png</w:t>
+      </w:r>
+    </w:p>
+    <w:p>
+      <w:pPr>
+        <w:pStyle w:val="ListParagraph"/>
+        <w:numPr>
+          <w:ilvl w:val="0"/>
+          <w:numId w:val="2"/>
+        </w:numPr>
+        <w:spacing w:after="80"/>
+      </w:pPr>
+      <w:r>
+        <w:t xml:space="preserve">레전드(국문): </w:t>
+      </w:r>
+      <w:r>
+        <w:rPr>
+          <w:b/>
+          <w:bCs/>
+        </w:rPr>
+        <w:t xml:space="preserve">logFC 분포와 구간(bin).</w:t>
+      </w:r>
+      <w:r>
+        <w:t xml:space="preserve"> 모든 peak의 log2 fold change 분포(가로축 logFC, 세로축 밀도) 위에 구간 경계를 색으로 나누어 보여 준다. 구간마다 peak 수가 같도록 나누며, 변화가 작은 peak(|logFC| &lt; min_abs_logfc)는 가운데 하나의 구간으로 묶는다. 결과 1의 heatmap 열이 이 구간이다.</w:t>
+      </w:r>
+    </w:p>
+    <w:p>
+      <w:pPr>
+        <w:pStyle w:val="ListParagraph"/>
+        <w:numPr>
+          <w:ilvl w:val="0"/>
+          <w:numId w:val="2"/>
+        </w:numPr>
+        <w:spacing w:after="80"/>
+      </w:pPr>
+      <w:r>
+        <w:t xml:space="preserve">레전드(영문): </w:t>
+      </w:r>
+      <w:r>
+        <w:rPr>
+          <w:b/>
+          <w:bCs/>
+        </w:rPr>
+        <w:t xml:space="preserve">logFC distribution and bins.</w:t>
+      </w:r>
+      <w:r>
+        <w:t xml:space="preserve"> The distribution of log2 fold change over all peaks (x-axis logFC, y-axis density), coloured by bin. Bins hold equal numbers of peaks, and peaks with small changes (|logFC| &lt; min_abs_logfc) are pooled into one central bin. These bins are the columns of the heatmap in result 1.</w:t>
+      </w:r>
+    </w:p>
+    <w:p>
+      <w:pPr>
+        <w:spacing w:after="140"/>
+      </w:pPr>
+      <w:r>
+        <w:rPr>
+          <w:b/>
+          <w:bCs/>
+        </w:rPr>
+        <w:t xml:space="preserve">결과 3. 모티프 선택 확률(회귀)</w:t>
+      </w:r>
+    </w:p>
+    <w:p>
+      <w:pPr>
+        <w:pStyle w:val="ListParagraph"/>
+        <w:numPr>
+          <w:ilvl w:val="0"/>
+          <w:numId w:val="2"/>
+        </w:numPr>
+        <w:spacing w:after="80"/>
+      </w:pPr>
+      <w:r>
+        <w:t xml:space="preserve">등록할 그림: </w:t>
+      </w:r>
+      <w:r>
+        <w:t xml:space="preserve">04_regression/selection_probability.pdf</w:t>
+      </w:r>
+      <w:r>
+        <w:t xml:space="preserve"> (run_regression=TRUE일 때)</w:t>
+      </w:r>
+    </w:p>
+    <w:p>
+      <w:pPr>
+        <w:pStyle w:val="ListParagraph"/>
+        <w:numPr>
+          <w:ilvl w:val="0"/>
+          <w:numId w:val="2"/>
+        </w:numPr>
+        <w:spacing w:after="80"/>
+      </w:pPr>
+      <w:r>
+        <w:t xml:space="preserve">저장 파일: </w:t>
+      </w:r>
+      <w:r>
+        <w:t xml:space="preserve">docs/ATAC-seq/modules/figures/module_results/atac_motif_result_3.{png,svg}</w:t>
+      </w:r>
+    </w:p>
+    <w:p>
+      <w:pPr>
+        <w:spacing w:after="120"/>
+      </w:pPr>
+      <w:r>
+        <w:rPr>
+          <w:b/>
+          <w:bCs/>
+          <w:color w:val="B0B0B0"/>
+          <w:sz w:val="18"/>
+          <w:szCs w:val="18"/>
+        </w:rPr>
+        <w:t xml:space="preserve">[내부 메모 · 붙여 넣지 마세요] </w:t>
+      </w:r>
+      <w:r>
+        <w:rPr>
+          <w:color w:val="8A8F99"/>
+          <w:sz w:val="18"/>
+          <w:szCs w:val="18"/>
+        </w:rPr>
+        <w:t xml:space="preserve">그림: </w:t>
+      </w:r>
+      <w:r>
+        <w:rPr>
+          <w:color w:val="8A8F99"/>
+          <w:sz w:val="18"/>
+          <w:szCs w:val="18"/>
+        </w:rPr>
+        <w:t xml:space="preserve">docs/ATAC-seq/modules/figures/module_results/atac_motif_result_3.png</w:t>
+      </w:r>
+    </w:p>
+    <w:p>
+      <w:pPr>
+        <w:pStyle w:val="ListParagraph"/>
+        <w:numPr>
+          <w:ilvl w:val="0"/>
+          <w:numId w:val="2"/>
+        </w:numPr>
+        <w:spacing w:after="80"/>
+      </w:pPr>
+      <w:r>
+        <w:t xml:space="preserve">레전드(국문): </w:t>
+      </w:r>
+      <w:r>
+        <w:rPr>
+          <w:b/>
+          <w:bCs/>
+        </w:rPr>
+        <w:t xml:space="preserve">안정성 선택 회귀로 고른 전사인자.</w:t>
+      </w:r>
+      <w:r>
+        <w:t xml:space="preserve"> 모든 모티프를 함께 넣어 peak의 logFC를 설명하는 회귀(randomized lasso stability selection)에서, 각 모티프가 선택된 확률을 막대로 보여 준다. 막대 방향은 그 모티프가 접근성 증가(위)와 감소(아래) 중 어느 쪽과 관련되는지이며, 점선은 선택 기준(stabsel_cutoff, 기본 0.8)이다. 기준을 넘은 모티프는 비슷한 모티프끼리 겹치는 효과를 걸러낸 뒤에도 남은 핵심 전사인자 후보다.</w:t>
+      </w:r>
+    </w:p>
+    <w:p>
+      <w:pPr>
+        <w:pStyle w:val="ListParagraph"/>
+        <w:numPr>
+          <w:ilvl w:val="0"/>
+          <w:numId w:val="2"/>
+        </w:numPr>
+        <w:spacing w:after="80"/>
+      </w:pPr>
+      <w:r>
+        <w:t xml:space="preserve">레전드(영문): </w:t>
+      </w:r>
+      <w:r>
+        <w:rPr>
+          <w:b/>
+          <w:bCs/>
+        </w:rPr>
+        <w:t xml:space="preserve">Transcription factors chosen by stability-selection regression.</w:t>
+      </w:r>
+      <w:r>
+        <w:t xml:space="preserve"> In a regression that explains peak logFC with all motifs together (randomized lasso stability selection), the bars show how often each motif was selected. Bar direction shows whether the motif is linked to gained (up) or lost (down) accessibility, and the dashed line is the selection cutoff (stabsel_cutoff, default 0.8). Motifs above the cutoff are core candidates that remain after redundancy between similar motifs is removed.</w:t>
+      </w:r>
+    </w:p>
+    <w:p>
+      <w:pPr>
+        <w:spacing w:after="140"/>
+      </w:pPr>
+      <w:r>
+        <w:rPr>
+          <w:b/>
+          <w:bCs/>
+        </w:rPr>
+        <w:t xml:space="preserve">결과 4. k-mer와 모티프 유사도</w:t>
+      </w:r>
+    </w:p>
+    <w:p>
+      <w:pPr>
+        <w:pStyle w:val="ListParagraph"/>
+        <w:numPr>
+          <w:ilvl w:val="0"/>
+          <w:numId w:val="2"/>
+        </w:numPr>
+        <w:spacing w:after="80"/>
+      </w:pPr>
+      <w:r>
+        <w:t xml:space="preserve">등록할 그림: </w:t>
+      </w:r>
+      <w:r>
+        <w:t xml:space="preserve">03_kmer/kmer_motif_similarity.pdf</w:t>
+      </w:r>
+      <w:r>
+        <w:t xml:space="preserve"> (run_kmer=TRUE일 때)</w:t>
+      </w:r>
+    </w:p>
+    <w:p>
+      <w:pPr>
+        <w:pStyle w:val="ListParagraph"/>
+        <w:numPr>
+          <w:ilvl w:val="0"/>
+          <w:numId w:val="2"/>
+        </w:numPr>
+        <w:spacing w:after="80"/>
+      </w:pPr>
+      <w:r>
+        <w:t xml:space="preserve">저장 파일: </w:t>
+      </w:r>
+      <w:r>
+        <w:t xml:space="preserve">docs/ATAC-seq/modules/figures/module_results/atac_motif_result_4.{png,svg}</w:t>
+      </w:r>
+    </w:p>
+    <w:p>
+      <w:pPr>
+        <w:spacing w:after="120"/>
+      </w:pPr>
+      <w:r>
+        <w:rPr>
+          <w:b/>
+          <w:bCs/>
+          <w:color w:val="B0B0B0"/>
+          <w:sz w:val="18"/>
+          <w:szCs w:val="18"/>
+        </w:rPr>
+        <w:t xml:space="preserve">[내부 메모 · 붙여 넣지 마세요] </w:t>
+      </w:r>
+      <w:r>
+        <w:rPr>
+          <w:color w:val="8A8F99"/>
+          <w:sz w:val="18"/>
+          <w:szCs w:val="18"/>
+        </w:rPr>
+        <w:t xml:space="preserve">그림: </w:t>
+      </w:r>
+      <w:r>
+        <w:rPr>
+          <w:color w:val="8A8F99"/>
+          <w:sz w:val="18"/>
+          <w:szCs w:val="18"/>
+        </w:rPr>
+        <w:t xml:space="preserve">docs/ATAC-seq/modules/figures/module_results/atac_motif_result_4.png</w:t>
+      </w:r>
+    </w:p>
+    <w:p>
+      <w:pPr>
+        <w:pStyle w:val="ListParagraph"/>
+        <w:numPr>
+          <w:ilvl w:val="0"/>
+          <w:numId w:val="2"/>
+        </w:numPr>
+        <w:spacing w:after="80"/>
+      </w:pPr>
+      <w:r>
+        <w:t xml:space="preserve">레전드(국문): </w:t>
+      </w:r>
+      <w:r>
+        <w:rPr>
+          <w:b/>
+          <w:bCs/>
+        </w:rPr>
+        <w:t xml:space="preserve">농축된 k-mer와 선택된 모티프의 유사도.</w:t>
+      </w:r>
+      <w:r>
+        <w:t xml:space="preserve"> 모티프 데이터베이스와 상관없이 접근성 변화 구간에서 농축된 짧은 서열(k-mer, 기본 6 bp)을 찾고, 결과 1의 유의한 모티프와 얼마나 닮았는지를 색(연회색 0, 주황 0.5, 진한 빨강 1)으로 보여 준다. 행은 모티프(왼쪽에 서열 로고), 열은 k-mer다. 데이터베이스 모티프와 닮은 k-mer가 많으면 모티프 결과가 서열 자체에서도 지지된다는 뜻이고, 어느 모티프와도 닮지 않은 k-mer는 데이터베이스에 없는 새 서열 후보다.</w:t>
+      </w:r>
+    </w:p>
+    <w:p>
+      <w:pPr>
+        <w:pStyle w:val="ListParagraph"/>
+        <w:numPr>
+          <w:ilvl w:val="0"/>
+          <w:numId w:val="2"/>
+        </w:numPr>
+        <w:spacing w:after="80"/>
+      </w:pPr>
+      <w:r>
+        <w:t xml:space="preserve">레전드(영문): </w:t>
+      </w:r>
+      <w:r>
+        <w:rPr>
+          <w:b/>
+          <w:bCs/>
+        </w:rPr>
+        <w:t xml:space="preserve">Similarity between enriched k-mers and selected motifs.</w:t>
+      </w:r>
+      <w:r>
+        <w:t xml:space="preserve"> Short sequences (k-mers, 6 bp by default) enriched across bins of accessibility change are found independently of the motif database and compared with the significant motifs of result 1, with similarity in colour (light grey 0, orange 0.5, dark red 1). Rows are motifs (with sequence logos) and columns are k-mers. Many k-mers resembling database motifs support the motif result from the sequence itself, and k-mers resembling no motif are candidates for sequences missing from the database.</w:t>
       </w:r>
     </w:p>
     <w:p>
@@ -32081,13 +34054,7 @@
         <w:spacing w:after="140"/>
       </w:pPr>
       <w:r>
-        <w:t xml:space="preserve">등록할 그림: </w:t>
-      </w:r>
-      <w:r>
-        <w:t xml:space="preserve">04_BINDetect/bindetect_figures.pdf</w:t>
-      </w:r>
-      <w:r>
-        <w:t xml:space="preserve">의 volcano plot 쪽</w:t>
+        <w:t xml:space="preserve">결과 그림 2개를 아래 순서대로 등록한다. 결과 1이 대표 그림이다.</w:t>
       </w:r>
     </w:p>
     <w:p>
@@ -32099,40 +34066,110 @@
           <w:b/>
           <w:bCs/>
         </w:rPr>
-        <w:t xml:space="preserve">레전드(국문)</w:t>
-      </w:r>
-    </w:p>
-    <w:p>
-      <w:pPr>
-        <w:spacing w:after="140"/>
+        <w:t xml:space="preserve">결과 1. BINDetect volcano plot</w:t>
+      </w:r>
+    </w:p>
+    <w:p>
+      <w:pPr>
+        <w:pStyle w:val="ListParagraph"/>
+        <w:numPr>
+          <w:ilvl w:val="0"/>
+          <w:numId w:val="2"/>
+        </w:numPr>
+        <w:spacing w:after="80"/>
+      </w:pPr>
+      <w:r>
+        <w:t xml:space="preserve">등록할 그림: </w:t>
+      </w:r>
+      <w:r>
+        <w:t xml:space="preserve">04_BINDetect/bindetect_figures.pdf</w:t>
+      </w:r>
+      <w:r>
+        <w:t xml:space="preserve">의 volcano plot 쪽</w:t>
+      </w:r>
+    </w:p>
+    <w:p>
+      <w:pPr>
+        <w:pStyle w:val="ListParagraph"/>
+        <w:numPr>
+          <w:ilvl w:val="0"/>
+          <w:numId w:val="2"/>
+        </w:numPr>
+        <w:spacing w:after="80"/>
+      </w:pPr>
+      <w:r>
+        <w:t xml:space="preserve">저장 파일: </w:t>
+      </w:r>
+      <w:r>
+        <w:t xml:space="preserve">docs/ATAC-seq/modules/figures/module_results/tf_footprinting_result_1.{png,svg}</w:t>
+      </w:r>
+    </w:p>
+    <w:p>
+      <w:pPr>
+        <w:spacing w:after="120"/>
       </w:pPr>
       <w:r>
         <w:rPr>
           <w:b/>
           <w:bCs/>
-        </w:rPr>
-        <w:t xml:space="preserve">조건 간 전사인자 결합 변화(BINDetect volcano plot).</w:t>
-      </w:r>
-      <w:r>
-        <w:t xml:space="preserve"> 점 하나가 전사인자(모티프) 하나다. 가로축은 두 조건 사이의 결합 점수 차이(differential binding score)다. 조건 이름을 알파벳순으로 놓았을 때 양수(오른쪽, 빨강)는 첫 번째 조건에서, 음수(왼쪽, 파랑)는 두 번째 조건에서 결합이 더 강하다는 뜻이다. 세로축은 그 차이의 유의성(−log10 p-value)이며, 변화가 크거나 유의한 전사인자는 색과 이름으로 표시된다.</w:t>
-      </w:r>
-    </w:p>
-    <w:p>
-      <w:pPr>
-        <w:spacing w:after="140"/>
-      </w:pPr>
+          <w:color w:val="B0B0B0"/>
+          <w:sz w:val="18"/>
+          <w:szCs w:val="18"/>
+        </w:rPr>
+        <w:t xml:space="preserve">[내부 메모 · 붙여 넣지 마세요] </w:t>
+      </w:r>
+      <w:r>
+        <w:rPr>
+          <w:color w:val="8A8F99"/>
+          <w:sz w:val="18"/>
+          <w:szCs w:val="18"/>
+        </w:rPr>
+        <w:t xml:space="preserve">그림: </w:t>
+      </w:r>
+      <w:r>
+        <w:rPr>
+          <w:color w:val="8A8F99"/>
+          <w:sz w:val="18"/>
+          <w:szCs w:val="18"/>
+        </w:rPr>
+        <w:t xml:space="preserve">docs/ATAC-seq/modules/figures/module_results/tf_footprinting_result_1.png</w:t>
+      </w:r>
+    </w:p>
+    <w:p>
+      <w:pPr>
+        <w:pStyle w:val="ListParagraph"/>
+        <w:numPr>
+          <w:ilvl w:val="0"/>
+          <w:numId w:val="2"/>
+        </w:numPr>
+        <w:spacing w:after="80"/>
+      </w:pPr>
+      <w:r>
+        <w:t xml:space="preserve">레전드(국문): </w:t>
+      </w:r>
       <w:r>
         <w:rPr>
           <w:b/>
           <w:bCs/>
         </w:rPr>
-        <w:t xml:space="preserve">Legend (English)</w:t>
-      </w:r>
-    </w:p>
-    <w:p>
-      <w:pPr>
-        <w:spacing w:after="140"/>
-      </w:pPr>
+        <w:t xml:space="preserve">조건 간 전사인자 결합 변화(BINDetect volcano plot).</w:t>
+      </w:r>
+      <w:r>
+        <w:t xml:space="preserve"> 점 하나가 전사인자(모티프) 하나다. 가로축은 두 조건 사이의 결합 점수 차이(differential binding score)다. 조건 이름을 알파벳순으로 놓았을 때 양수(오른쪽, 빨강)는 첫 번째 조건에서, 음수(왼쪽, 파랑)는 두 번째 조건에서 결합이 더 강하다는 뜻이다. 세로축은 그 차이의 유의성(−log10 p-value)이며, 변화가 크거나 유의한 전사인자는 색과 이름으로 표시된다.</w:t>
+      </w:r>
+    </w:p>
+    <w:p>
+      <w:pPr>
+        <w:pStyle w:val="ListParagraph"/>
+        <w:numPr>
+          <w:ilvl w:val="0"/>
+          <w:numId w:val="2"/>
+        </w:numPr>
+        <w:spacing w:after="80"/>
+      </w:pPr>
+      <w:r>
+        <w:t xml:space="preserve">레전드(영문): </w:t>
+      </w:r>
       <w:r>
         <w:rPr>
           <w:b/>
@@ -32142,6 +34179,130 @@
       </w:r>
       <w:r>
         <w:t xml:space="preserve"> Each point is one transcription factor motif. The x-axis is the differential binding score between the two conditions; with the condition names in alphabetical order, positive scores (right, red) mean stronger binding in the first condition and negative scores (left, blue) in the second. The y-axis is its significance (−log10 p-value), and factors with large or significant changes are coloured and labelled.</w:t>
+      </w:r>
+    </w:p>
+    <w:p>
+      <w:pPr>
+        <w:spacing w:after="140"/>
+      </w:pPr>
+      <w:r>
+        <w:rPr>
+          <w:b/>
+          <w:bCs/>
+        </w:rPr>
+        <w:t xml:space="preserve">결과 2. 조건별 footprint 점수 분포</w:t>
+      </w:r>
+    </w:p>
+    <w:p>
+      <w:pPr>
+        <w:pStyle w:val="ListParagraph"/>
+        <w:numPr>
+          <w:ilvl w:val="0"/>
+          <w:numId w:val="2"/>
+        </w:numPr>
+        <w:spacing w:after="80"/>
+      </w:pPr>
+      <w:r>
+        <w:t xml:space="preserve">등록할 그림: </w:t>
+      </w:r>
+      <w:r>
+        <w:t xml:space="preserve">04_BINDetect/bindetect_figures.pdf</w:t>
+      </w:r>
+      <w:r>
+        <w:t xml:space="preserve">의 점수 분포 쪽(정규화 후, Normalized)</w:t>
+      </w:r>
+    </w:p>
+    <w:p>
+      <w:pPr>
+        <w:pStyle w:val="ListParagraph"/>
+        <w:numPr>
+          <w:ilvl w:val="0"/>
+          <w:numId w:val="2"/>
+        </w:numPr>
+        <w:spacing w:after="80"/>
+      </w:pPr>
+      <w:r>
+        <w:t xml:space="preserve">저장 파일: </w:t>
+      </w:r>
+      <w:r>
+        <w:t xml:space="preserve">docs/ATAC-seq/modules/figures/module_results/tf_footprinting_result_2.{png,svg}</w:t>
+      </w:r>
+    </w:p>
+    <w:p>
+      <w:pPr>
+        <w:spacing w:after="120"/>
+      </w:pPr>
+      <w:r>
+        <w:rPr>
+          <w:b/>
+          <w:bCs/>
+          <w:color w:val="B0B0B0"/>
+          <w:sz w:val="18"/>
+          <w:szCs w:val="18"/>
+        </w:rPr>
+        <w:t xml:space="preserve">[내부 메모 · 붙여 넣지 마세요] </w:t>
+      </w:r>
+      <w:r>
+        <w:rPr>
+          <w:color w:val="8A8F99"/>
+          <w:sz w:val="18"/>
+          <w:szCs w:val="18"/>
+        </w:rPr>
+        <w:t xml:space="preserve">그림: </w:t>
+      </w:r>
+      <w:r>
+        <w:rPr>
+          <w:color w:val="8A8F99"/>
+          <w:sz w:val="18"/>
+          <w:szCs w:val="18"/>
+        </w:rPr>
+        <w:t xml:space="preserve">docs/ATAC-seq/modules/figures/module_results/tf_footprinting_result_2.png</w:t>
+      </w:r>
+    </w:p>
+    <w:p>
+      <w:pPr>
+        <w:pStyle w:val="ListParagraph"/>
+        <w:numPr>
+          <w:ilvl w:val="0"/>
+          <w:numId w:val="2"/>
+        </w:numPr>
+        <w:spacing w:after="80"/>
+      </w:pPr>
+      <w:r>
+        <w:t xml:space="preserve">레전드(국문): </w:t>
+      </w:r>
+      <w:r>
+        <w:rPr>
+          <w:b/>
+          <w:bCs/>
+        </w:rPr>
+        <w:t xml:space="preserve">조건별 footprint 점수 분포.</w:t>
+      </w:r>
+      <w:r>
+        <w:t xml:space="preserve"> 모든 모티프 결합 후보 자리의 footprint 점수(가로축) 분포를 조건마다 다른 색의 선으로 겹쳐 보여 준다. 같은 PDF에 정규화 전(Raw)과 후(Normalized) 분포가 따로 있으며, BINDetect는 조건 간 점수 분포를 맞춘(정규화한) 뒤 결과 1의 차이를 계산한다. 정규화 뒤 두 조건의 분포가 거의 겹치면 결과 1의 차이가 전체 신호 세기 차이가 아니라 전사인자별 결합 변화를 반영한다는 뜻이다.</w:t>
+      </w:r>
+    </w:p>
+    <w:p>
+      <w:pPr>
+        <w:pStyle w:val="ListParagraph"/>
+        <w:numPr>
+          <w:ilvl w:val="0"/>
+          <w:numId w:val="2"/>
+        </w:numPr>
+        <w:spacing w:after="80"/>
+      </w:pPr>
+      <w:r>
+        <w:t xml:space="preserve">레전드(영문): </w:t>
+      </w:r>
+      <w:r>
+        <w:rPr>
+          <w:b/>
+          <w:bCs/>
+        </w:rPr>
+        <w:t xml:space="preserve">Footprint score distribution per condition.</w:t>
+      </w:r>
+      <w:r>
+        <w:t xml:space="preserve"> The distribution of footprint scores (x-axis) over all candidate motif sites, one coloured line per condition. The PDF holds the distributions before (raw) and after (normalized) normalization; BINDetect normalizes the score distributions between conditions before computing the differences in result 1. Nearly overlapping distributions after normalization mean that the differences in result 1 reflect factor-specific binding changes rather than overall signal strength.</w:t>
       </w:r>
     </w:p>
     <w:p>
@@ -37072,13 +39233,7 @@
         <w:spacing w:after="140"/>
       </w:pPr>
       <w:r>
-        <w:t xml:space="preserve">등록할 그림: </w:t>
-      </w:r>
-      <w:r>
-        <w:t xml:space="preserve">03_plots/&lt;list&gt;.GO_BP.dotplot.pdf</w:t>
-      </w:r>
-      <w:r>
-        <w:t xml:space="preserve"> (대표 목록 1개)</w:t>
+        <w:t xml:space="preserve">결과 그림 3개를 아래 순서대로 등록한다. 결과 1이 대표 그림이다.</w:t>
       </w:r>
     </w:p>
     <w:p>
@@ -37090,49 +39245,370 @@
           <w:b/>
           <w:bCs/>
         </w:rPr>
-        <w:t xml:space="preserve">레전드(국문)</w:t>
-      </w:r>
-    </w:p>
-    <w:p>
-      <w:pPr>
-        <w:spacing w:after="140"/>
+        <w:t xml:space="preserve">결과 1. GO 농축 dot plot</w:t>
+      </w:r>
+    </w:p>
+    <w:p>
+      <w:pPr>
+        <w:pStyle w:val="ListParagraph"/>
+        <w:numPr>
+          <w:ilvl w:val="0"/>
+          <w:numId w:val="2"/>
+        </w:numPr>
+        <w:spacing w:after="80"/>
+      </w:pPr>
+      <w:r>
+        <w:t xml:space="preserve">등록할 그림: </w:t>
+      </w:r>
+      <w:r>
+        <w:t xml:space="preserve">03_plots/&lt;list&gt;.GO_BP.dotplot.pdf</w:t>
+      </w:r>
+      <w:r>
+        <w:t xml:space="preserve"> (대표 목록 1개; DA 입력이면 </w:t>
+      </w:r>
+      <w:r>
+        <w:t xml:space="preserve">&lt;da_norm&gt;.up</w:t>
+      </w:r>
+      <w:r>
+        <w:t xml:space="preserve">)</w:t>
+      </w:r>
+    </w:p>
+    <w:p>
+      <w:pPr>
+        <w:pStyle w:val="ListParagraph"/>
+        <w:numPr>
+          <w:ilvl w:val="0"/>
+          <w:numId w:val="2"/>
+        </w:numPr>
+        <w:spacing w:after="80"/>
+      </w:pPr>
+      <w:r>
+        <w:t xml:space="preserve">저장 파일: </w:t>
+      </w:r>
+      <w:r>
+        <w:t xml:space="preserve">docs/ATAC-seq/modules/figures/module_results/functional_enrichment_result_1.{png,svg}</w:t>
+      </w:r>
+    </w:p>
+    <w:p>
+      <w:pPr>
+        <w:spacing w:after="120"/>
       </w:pPr>
       <w:r>
         <w:rPr>
           <w:b/>
           <w:bCs/>
-        </w:rPr>
-        <w:t xml:space="preserve">유전자 목록의 GO 생물학적 과정 농축.</w:t>
-      </w:r>
-      <w:r>
-        <w:t xml:space="preserve"> 행은 유의하게 농축된 GO term이다. 가로축은 목록 유전자 중 그 term에 속한 비율(GeneRatio), 점의 크기는 해당 유전자 수, 색은 보정된 p-value(p.adjust)다. peak 근처 유전자들이 어떤 생물학적 과정에 모여 있는지를 보여 준다.</w:t>
-      </w:r>
-    </w:p>
-    <w:p>
-      <w:pPr>
-        <w:spacing w:after="140"/>
-      </w:pPr>
+          <w:color w:val="B0B0B0"/>
+          <w:sz w:val="18"/>
+          <w:szCs w:val="18"/>
+        </w:rPr>
+        <w:t xml:space="preserve">[내부 메모 · 붙여 넣지 마세요] </w:t>
+      </w:r>
+      <w:r>
+        <w:rPr>
+          <w:color w:val="8A8F99"/>
+          <w:sz w:val="18"/>
+          <w:szCs w:val="18"/>
+        </w:rPr>
+        <w:t xml:space="preserve">그림: </w:t>
+      </w:r>
+      <w:r>
+        <w:rPr>
+          <w:color w:val="8A8F99"/>
+          <w:sz w:val="18"/>
+          <w:szCs w:val="18"/>
+        </w:rPr>
+        <w:t xml:space="preserve">docs/ATAC-seq/modules/figures/module_results/functional_enrichment_result_1.png</w:t>
+      </w:r>
+    </w:p>
+    <w:p>
+      <w:pPr>
+        <w:pStyle w:val="ListParagraph"/>
+        <w:numPr>
+          <w:ilvl w:val="0"/>
+          <w:numId w:val="2"/>
+        </w:numPr>
+        <w:spacing w:after="80"/>
+      </w:pPr>
+      <w:r>
+        <w:t xml:space="preserve">레전드(국문): </w:t>
+      </w:r>
       <w:r>
         <w:rPr>
           <w:b/>
           <w:bCs/>
         </w:rPr>
-        <w:t xml:space="preserve">Legend (English)</w:t>
-      </w:r>
-    </w:p>
-    <w:p>
-      <w:pPr>
-        <w:spacing w:after="140"/>
-      </w:pPr>
+        <w:t xml:space="preserve">유전자 목록의 GO 생물학적 과정 농축(dot plot).</w:t>
+      </w:r>
+      <w:r>
+        <w:t xml:space="preserve"> 행은 유의하게 농축된 GO term이다. 가로축은 목록 유전자 중 그 term에 속한 비율(GeneRatio), 점의 크기는 해당 유전자 수(Count), 색은 보정된 p-value(p.adjust; 빨강일수록 유의)다. peak 근처 유전자들이 어떤 생물학적 과정에 모여 있는지를 보여 준다.</w:t>
+      </w:r>
+    </w:p>
+    <w:p>
+      <w:pPr>
+        <w:pStyle w:val="ListParagraph"/>
+        <w:numPr>
+          <w:ilvl w:val="0"/>
+          <w:numId w:val="2"/>
+        </w:numPr>
+        <w:spacing w:after="80"/>
+      </w:pPr>
+      <w:r>
+        <w:t xml:space="preserve">레전드(영문): </w:t>
+      </w:r>
       <w:r>
         <w:rPr>
           <w:b/>
           <w:bCs/>
         </w:rPr>
-        <w:t xml:space="preserve">GO biological process enrichment of a gene list.</w:t>
-      </w:r>
-      <w:r>
-        <w:t xml:space="preserve"> Rows are significantly enriched GO terms. The x-axis is the fraction of list genes in each term (GeneRatio), point size is the gene count, and colour is the adjusted p-value (p.adjust). The plot shows which biological processes the genes near the peaks converge on.</w:t>
+        <w:t xml:space="preserve">GO biological process enrichment of a gene list (dot plot).</w:t>
+      </w:r>
+      <w:r>
+        <w:t xml:space="preserve"> Rows are significantly enriched GO terms. The x-axis is the fraction of list genes in each term (GeneRatio), point size is the gene count (Count), and colour is the adjusted p-value (p.adjust; redder is more significant). The plot shows which biological processes the genes near the peaks converge on.</w:t>
+      </w:r>
+    </w:p>
+    <w:p>
+      <w:pPr>
+        <w:spacing w:after="140"/>
+      </w:pPr>
+      <w:r>
+        <w:rPr>
+          <w:b/>
+          <w:bCs/>
+        </w:rPr>
+        <w:t xml:space="preserve">결과 2. GO 농축 bar plot</w:t>
+      </w:r>
+    </w:p>
+    <w:p>
+      <w:pPr>
+        <w:pStyle w:val="ListParagraph"/>
+        <w:numPr>
+          <w:ilvl w:val="0"/>
+          <w:numId w:val="2"/>
+        </w:numPr>
+        <w:spacing w:after="80"/>
+      </w:pPr>
+      <w:r>
+        <w:t xml:space="preserve">등록할 그림: </w:t>
+      </w:r>
+      <w:r>
+        <w:t xml:space="preserve">03_plots/&lt;list&gt;.GO_BP.barplot.pdf</w:t>
+      </w:r>
+      <w:r>
+        <w:t xml:space="preserve"> (결과 1과 같은 목록)</w:t>
+      </w:r>
+    </w:p>
+    <w:p>
+      <w:pPr>
+        <w:pStyle w:val="ListParagraph"/>
+        <w:numPr>
+          <w:ilvl w:val="0"/>
+          <w:numId w:val="2"/>
+        </w:numPr>
+        <w:spacing w:after="80"/>
+      </w:pPr>
+      <w:r>
+        <w:t xml:space="preserve">저장 파일: </w:t>
+      </w:r>
+      <w:r>
+        <w:t xml:space="preserve">docs/ATAC-seq/modules/figures/module_results/functional_enrichment_result_2.{png,svg}</w:t>
+      </w:r>
+    </w:p>
+    <w:p>
+      <w:pPr>
+        <w:spacing w:after="120"/>
+      </w:pPr>
+      <w:r>
+        <w:rPr>
+          <w:b/>
+          <w:bCs/>
+          <w:color w:val="B0B0B0"/>
+          <w:sz w:val="18"/>
+          <w:szCs w:val="18"/>
+        </w:rPr>
+        <w:t xml:space="preserve">[내부 메모 · 붙여 넣지 마세요] </w:t>
+      </w:r>
+      <w:r>
+        <w:rPr>
+          <w:color w:val="8A8F99"/>
+          <w:sz w:val="18"/>
+          <w:szCs w:val="18"/>
+        </w:rPr>
+        <w:t xml:space="preserve">그림: </w:t>
+      </w:r>
+      <w:r>
+        <w:rPr>
+          <w:color w:val="8A8F99"/>
+          <w:sz w:val="18"/>
+          <w:szCs w:val="18"/>
+        </w:rPr>
+        <w:t xml:space="preserve">docs/ATAC-seq/modules/figures/module_results/functional_enrichment_result_2.png</w:t>
+      </w:r>
+    </w:p>
+    <w:p>
+      <w:pPr>
+        <w:pStyle w:val="ListParagraph"/>
+        <w:numPr>
+          <w:ilvl w:val="0"/>
+          <w:numId w:val="2"/>
+        </w:numPr>
+        <w:spacing w:after="80"/>
+      </w:pPr>
+      <w:r>
+        <w:t xml:space="preserve">레전드(국문): </w:t>
+      </w:r>
+      <w:r>
+        <w:rPr>
+          <w:b/>
+          <w:bCs/>
+        </w:rPr>
+        <w:t xml:space="preserve">유전자 목록의 GO 생물학적 과정 농축(bar plot).</w:t>
+      </w:r>
+      <w:r>
+        <w:t xml:space="preserve"> 결과 1과 같은 GO term을 막대로 보여 준다. 막대 길이는 그 term에 속한 목록 유전자 수(Count), 색은 보정된 p-value(p.adjust)다. 유전자 수가 많은 term과 유의성이 높은 term을 한눈에 비교할 수 있다.</w:t>
+      </w:r>
+    </w:p>
+    <w:p>
+      <w:pPr>
+        <w:pStyle w:val="ListParagraph"/>
+        <w:numPr>
+          <w:ilvl w:val="0"/>
+          <w:numId w:val="2"/>
+        </w:numPr>
+        <w:spacing w:after="80"/>
+      </w:pPr>
+      <w:r>
+        <w:t xml:space="preserve">레전드(영문): </w:t>
+      </w:r>
+      <w:r>
+        <w:rPr>
+          <w:b/>
+          <w:bCs/>
+        </w:rPr>
+        <w:t xml:space="preserve">GO biological process enrichment of a gene list (bar plot).</w:t>
+      </w:r>
+      <w:r>
+        <w:t xml:space="preserve"> The same GO terms as result 1 shown as bars, with bar length the number of list genes in the term (Count) and colour the adjusted p-value (p.adjust). It compares terms with many genes and terms with strong significance at a glance.</w:t>
+      </w:r>
+    </w:p>
+    <w:p>
+      <w:pPr>
+        <w:spacing w:after="140"/>
+      </w:pPr>
+      <w:r>
+        <w:rPr>
+          <w:b/>
+          <w:bCs/>
+        </w:rPr>
+        <w:t xml:space="preserve">결과 3. 목록별 농축 요약</w:t>
+      </w:r>
+    </w:p>
+    <w:p>
+      <w:pPr>
+        <w:pStyle w:val="ListParagraph"/>
+        <w:numPr>
+          <w:ilvl w:val="0"/>
+          <w:numId w:val="2"/>
+        </w:numPr>
+        <w:spacing w:after="80"/>
+      </w:pPr>
+      <w:r>
+        <w:t xml:space="preserve">등록할 그림: 표 캡처 </w:t>
+      </w:r>
+      <w:r>
+        <w:t xml:space="preserve">04_summary/enrichment_summary.tsv</w:t>
+      </w:r>
+    </w:p>
+    <w:p>
+      <w:pPr>
+        <w:pStyle w:val="ListParagraph"/>
+        <w:numPr>
+          <w:ilvl w:val="0"/>
+          <w:numId w:val="2"/>
+        </w:numPr>
+        <w:spacing w:after="80"/>
+      </w:pPr>
+      <w:r>
+        <w:t xml:space="preserve">저장 파일: </w:t>
+      </w:r>
+      <w:r>
+        <w:t xml:space="preserve">docs/ATAC-seq/modules/figures/module_results/functional_enrichment_result_3.png</w:t>
+      </w:r>
+    </w:p>
+    <w:p>
+      <w:pPr>
+        <w:spacing w:after="120"/>
+      </w:pPr>
+      <w:r>
+        <w:rPr>
+          <w:b/>
+          <w:bCs/>
+          <w:color w:val="B0B0B0"/>
+          <w:sz w:val="18"/>
+          <w:szCs w:val="18"/>
+        </w:rPr>
+        <w:t xml:space="preserve">[내부 메모 · 붙여 넣지 마세요] </w:t>
+      </w:r>
+      <w:r>
+        <w:rPr>
+          <w:color w:val="8A8F99"/>
+          <w:sz w:val="18"/>
+          <w:szCs w:val="18"/>
+        </w:rPr>
+        <w:t xml:space="preserve">그림: </w:t>
+      </w:r>
+      <w:r>
+        <w:rPr>
+          <w:color w:val="8A8F99"/>
+          <w:sz w:val="18"/>
+          <w:szCs w:val="18"/>
+        </w:rPr>
+        <w:t xml:space="preserve">docs/ATAC-seq/modules/figures/module_results/functional_enrichment_result_3.png</w:t>
+      </w:r>
+    </w:p>
+    <w:p>
+      <w:pPr>
+        <w:pStyle w:val="ListParagraph"/>
+        <w:numPr>
+          <w:ilvl w:val="0"/>
+          <w:numId w:val="2"/>
+        </w:numPr>
+        <w:spacing w:after="80"/>
+      </w:pPr>
+      <w:r>
+        <w:t xml:space="preserve">레전드(국문): </w:t>
+      </w:r>
+      <w:r>
+        <w:rPr>
+          <w:b/>
+          <w:bCs/>
+        </w:rPr>
+        <w:t xml:space="preserve">유전자 목록별 농축 요약.</w:t>
+      </w:r>
+      <w:r>
+        <w:t xml:space="preserve"> 목록마다 유전자 수(genes), 주석에서 찾은 유전자 수(genes_annotated), 검정한 GO term 수(terms_tested), 유의한 term 수(significant_terms), GO 영역(ont), 사용한 주석 파일(annotation)과 ID 형식(keytype), 처리 상태(status)를 보여 준다. genes_annotated가 genes보다 크게 적으면 유전자 ID 형식이 주석과 맞지 않는 것이다.</w:t>
+      </w:r>
+    </w:p>
+    <w:p>
+      <w:pPr>
+        <w:pStyle w:val="ListParagraph"/>
+        <w:numPr>
+          <w:ilvl w:val="0"/>
+          <w:numId w:val="2"/>
+        </w:numPr>
+        <w:spacing w:after="80"/>
+      </w:pPr>
+      <w:r>
+        <w:t xml:space="preserve">레전드(영문): </w:t>
+      </w:r>
+      <w:r>
+        <w:rPr>
+          <w:b/>
+          <w:bCs/>
+        </w:rPr>
+        <w:t xml:space="preserve">Enrichment summary per gene list.</w:t>
+      </w:r>
+      <w:r>
+        <w:t xml:space="preserve"> For each list the table gives the number of genes (genes), genes found in the annotation (genes_annotated), GO terms tested (terms_tested) and significant (significant_terms), the GO ontology (ont), the annotation file (annotation), the ID type (keytype) and the status. genes_annotated far below genes means that the gene ID format does not match the annotation.</w:t>
       </w:r>
     </w:p>
     <w:p>
@@ -40640,13 +43116,7 @@
         <w:spacing w:after="140"/>
       </w:pPr>
       <w:r>
-        <w:t xml:space="preserve">등록할 그림: </w:t>
-      </w:r>
-      <w:r>
-        <w:t xml:space="preserve">02_idr/&lt;condition&gt;/&lt;repA&gt;_vs_&lt;repB&gt;.idr.png</w:t>
-      </w:r>
-      <w:r>
-        <w:t xml:space="preserve"> (대표 조건 1개)</w:t>
+        <w:t xml:space="preserve">결과 그림 2개를 아래 순서대로 등록한다. 결과 1이 대표 그림이다.</w:t>
       </w:r>
     </w:p>
     <w:p>
@@ -40658,40 +43128,110 @@
           <w:b/>
           <w:bCs/>
         </w:rPr>
-        <w:t xml:space="preserve">레전드(국문)</w:t>
-      </w:r>
-    </w:p>
-    <w:p>
-      <w:pPr>
-        <w:spacing w:after="140"/>
+        <w:t xml:space="preserve">결과 1. IDR 그림</w:t>
+      </w:r>
+    </w:p>
+    <w:p>
+      <w:pPr>
+        <w:pStyle w:val="ListParagraph"/>
+        <w:numPr>
+          <w:ilvl w:val="0"/>
+          <w:numId w:val="2"/>
+        </w:numPr>
+        <w:spacing w:after="80"/>
+      </w:pPr>
+      <w:r>
+        <w:t xml:space="preserve">등록할 그림: </w:t>
+      </w:r>
+      <w:r>
+        <w:t xml:space="preserve">02_idr/&lt;condition&gt;/&lt;repA&gt;_vs_&lt;repB&gt;.idr.png</w:t>
+      </w:r>
+      <w:r>
+        <w:t xml:space="preserve"> (대표 조건 1개)</w:t>
+      </w:r>
+    </w:p>
+    <w:p>
+      <w:pPr>
+        <w:pStyle w:val="ListParagraph"/>
+        <w:numPr>
+          <w:ilvl w:val="0"/>
+          <w:numId w:val="2"/>
+        </w:numPr>
+        <w:spacing w:after="80"/>
+      </w:pPr>
+      <w:r>
+        <w:t xml:space="preserve">저장 파일: </w:t>
+      </w:r>
+      <w:r>
+        <w:t xml:space="preserve">docs/ATAC-seq/modules/figures/module_results/replicate_consistency_result_1.png</w:t>
+      </w:r>
+    </w:p>
+    <w:p>
+      <w:pPr>
+        <w:spacing w:after="120"/>
       </w:pPr>
       <w:r>
         <w:rPr>
           <w:b/>
           <w:bCs/>
-        </w:rPr>
-        <w:t xml:space="preserve">반복 샘플 간 peak 재현성(IDR).</w:t>
-      </w:r>
-      <w:r>
-        <w:t xml:space="preserve"> 두 반복 샘플에서 찾은 peak를 짝지어 비교한 그림이다. 위쪽 패널은 두 반복의 peak 순위와 신호 세기를 서로 대응시킨 산점도로, 검은 점은 IDR 기준을 통과한 재현성 있는 peak, 빨간 점은 통과하지 못한 peak다. 아래쪽 패널은 peak 순위에 따른 IDR 값을 보여 준다. 강한 peak일수록 두 반복에서 함께 나타나고, 약한 peak로 갈수록 재현성이 떨어진다.</w:t>
-      </w:r>
-    </w:p>
-    <w:p>
-      <w:pPr>
-        <w:spacing w:after="140"/>
-      </w:pPr>
+          <w:color w:val="B0B0B0"/>
+          <w:sz w:val="18"/>
+          <w:szCs w:val="18"/>
+        </w:rPr>
+        <w:t xml:space="preserve">[내부 메모 · 붙여 넣지 마세요] </w:t>
+      </w:r>
+      <w:r>
+        <w:rPr>
+          <w:color w:val="8A8F99"/>
+          <w:sz w:val="18"/>
+          <w:szCs w:val="18"/>
+        </w:rPr>
+        <w:t xml:space="preserve">그림: </w:t>
+      </w:r>
+      <w:r>
+        <w:rPr>
+          <w:color w:val="8A8F99"/>
+          <w:sz w:val="18"/>
+          <w:szCs w:val="18"/>
+        </w:rPr>
+        <w:t xml:space="preserve">docs/ATAC-seq/modules/figures/module_results/replicate_consistency_result_1.png</w:t>
+      </w:r>
+    </w:p>
+    <w:p>
+      <w:pPr>
+        <w:pStyle w:val="ListParagraph"/>
+        <w:numPr>
+          <w:ilvl w:val="0"/>
+          <w:numId w:val="2"/>
+        </w:numPr>
+        <w:spacing w:after="80"/>
+      </w:pPr>
+      <w:r>
+        <w:t xml:space="preserve">레전드(국문): </w:t>
+      </w:r>
       <w:r>
         <w:rPr>
           <w:b/>
           <w:bCs/>
         </w:rPr>
-        <w:t xml:space="preserve">Legend (English)</w:t>
-      </w:r>
-    </w:p>
-    <w:p>
-      <w:pPr>
-        <w:spacing w:after="140"/>
-      </w:pPr>
+        <w:t xml:space="preserve">반복 샘플 간 peak 재현성(IDR).</w:t>
+      </w:r>
+      <w:r>
+        <w:t xml:space="preserve"> 두 반복 샘플에서 찾은 peak를 짝지어 비교한 그림이다. 위쪽 패널은 두 반복의 peak 순위와 신호 세기를 서로 대응시킨 산점도로, 검은 점은 IDR 기준을 통과한 재현성 있는 peak, 빨간 점은 통과하지 못한 peak다. 아래쪽 패널은 peak 순위에 따른 IDR 값을 보여 준다. 강한 peak일수록 두 반복에서 함께 나타나고, 약한 peak로 갈수록 재현성이 떨어진다.</w:t>
+      </w:r>
+    </w:p>
+    <w:p>
+      <w:pPr>
+        <w:pStyle w:val="ListParagraph"/>
+        <w:numPr>
+          <w:ilvl w:val="0"/>
+          <w:numId w:val="2"/>
+        </w:numPr>
+        <w:spacing w:after="80"/>
+      </w:pPr>
+      <w:r>
+        <w:t xml:space="preserve">레전드(영문): </w:t>
+      </w:r>
       <w:r>
         <w:rPr>
           <w:b/>
@@ -40701,6 +43241,139 @@
       </w:r>
       <w:r>
         <w:t xml:space="preserve"> Peaks from two replicates are matched and compared. The upper panels plot the ranks and signal strengths of matched peaks against each other; black points pass the IDR threshold (reproducible) and red points do not. The lower panels show IDR values along the peak ranks. Strong peaks tend to appear in both replicates, and reproducibility falls off for weaker peaks.</w:t>
+      </w:r>
+    </w:p>
+    <w:p>
+      <w:pPr>
+        <w:spacing w:after="140"/>
+      </w:pPr>
+      <w:r>
+        <w:rPr>
+          <w:b/>
+          <w:bCs/>
+        </w:rPr>
+        <w:t xml:space="preserve">결과 2. 조건별 IDR 요약</w:t>
+      </w:r>
+    </w:p>
+    <w:p>
+      <w:pPr>
+        <w:pStyle w:val="ListParagraph"/>
+        <w:numPr>
+          <w:ilvl w:val="0"/>
+          <w:numId w:val="2"/>
+        </w:numPr>
+        <w:spacing w:after="80"/>
+      </w:pPr>
+      <w:r>
+        <w:t xml:space="preserve">등록할 그림: 표 캡처 </w:t>
+      </w:r>
+      <w:r>
+        <w:t xml:space="preserve">04_summary/idr_summary.tsv</w:t>
+      </w:r>
+    </w:p>
+    <w:p>
+      <w:pPr>
+        <w:pStyle w:val="ListParagraph"/>
+        <w:numPr>
+          <w:ilvl w:val="0"/>
+          <w:numId w:val="2"/>
+        </w:numPr>
+        <w:spacing w:after="80"/>
+      </w:pPr>
+      <w:r>
+        <w:t xml:space="preserve">저장 파일: </w:t>
+      </w:r>
+      <w:r>
+        <w:t xml:space="preserve">docs/ATAC-seq/modules/figures/module_results/replicate_consistency_result_2.png</w:t>
+      </w:r>
+    </w:p>
+    <w:p>
+      <w:pPr>
+        <w:spacing w:after="120"/>
+      </w:pPr>
+      <w:r>
+        <w:rPr>
+          <w:b/>
+          <w:bCs/>
+          <w:color w:val="B0B0B0"/>
+          <w:sz w:val="18"/>
+          <w:szCs w:val="18"/>
+        </w:rPr>
+        <w:t xml:space="preserve">[내부 메모 · 붙여 넣지 마세요] </w:t>
+      </w:r>
+      <w:r>
+        <w:rPr>
+          <w:color w:val="8A8F99"/>
+          <w:sz w:val="18"/>
+          <w:szCs w:val="18"/>
+        </w:rPr>
+        <w:t xml:space="preserve">그림: </w:t>
+      </w:r>
+      <w:r>
+        <w:rPr>
+          <w:color w:val="8A8F99"/>
+          <w:sz w:val="18"/>
+          <w:szCs w:val="18"/>
+        </w:rPr>
+        <w:t xml:space="preserve">docs/ATAC-seq/modules/figures/module_results/replicate_consistency_result_2.png</w:t>
+      </w:r>
+    </w:p>
+    <w:p>
+      <w:pPr>
+        <w:pStyle w:val="ListParagraph"/>
+        <w:numPr>
+          <w:ilvl w:val="0"/>
+          <w:numId w:val="2"/>
+        </w:numPr>
+        <w:spacing w:after="80"/>
+      </w:pPr>
+      <w:r>
+        <w:t xml:space="preserve">레전드(국문): </w:t>
+      </w:r>
+      <w:r>
+        <w:rPr>
+          <w:b/>
+          <w:bCs/>
+        </w:rPr>
+        <w:t xml:space="preserve">조건별 IDR 요약.</w:t>
+      </w:r>
+      <w:r>
+        <w:t xml:space="preserve"> 조건과 반복 쌍마다 각 반복의 peak 수(peaks_a, peaks_b), 두 반복을 합쳐 찾은 peak 수(pooled_peaks), IDR 기준을 통과한 peak 수(idr_passed), 처리 상태(status)를 보여 준다. 두 반복의 peak 수가 크게 다르거나, idr_passed가 각 반복의 peak 수보다 크게 적으면 반복 간 재현성이 낮은 것이다. 반복이 하나뿐인 조건은 </w:t>
+      </w:r>
+      <w:r>
+        <w:t xml:space="preserve">skipped_single_replicate</w:t>
+      </w:r>
+      <w:r>
+        <w:t xml:space="preserve">로 표시된다.</w:t>
+      </w:r>
+    </w:p>
+    <w:p>
+      <w:pPr>
+        <w:pStyle w:val="ListParagraph"/>
+        <w:numPr>
+          <w:ilvl w:val="0"/>
+          <w:numId w:val="2"/>
+        </w:numPr>
+        <w:spacing w:after="80"/>
+      </w:pPr>
+      <w:r>
+        <w:t xml:space="preserve">레전드(영문): </w:t>
+      </w:r>
+      <w:r>
+        <w:rPr>
+          <w:b/>
+          <w:bCs/>
+        </w:rPr>
+        <w:t xml:space="preserve">IDR summary per condition.</w:t>
+      </w:r>
+      <w:r>
+        <w:t xml:space="preserve"> For each condition and replicate pair the table gives the peaks in each replicate (peaks_a, peaks_b), the peaks called on the pooled replicates (pooled_peaks), the peaks passing the IDR threshold (idr_passed) and the status. Very different peak counts between the replicates, or idr_passed far below the peaks of each replicate, indicate poor reproducibility. A condition with a single replicate is marked </w:t>
+      </w:r>
+      <w:r>
+        <w:t xml:space="preserve">skipped_single_replicate</w:t>
+      </w:r>
+      <w:r>
+        <w:t xml:space="preserve">.</w:t>
       </w:r>
     </w:p>
     <w:sectPr>

</xml_diff>

<commit_message>
List only the result file names for each module's result figures
The figures are captured from real results when the module is
registered, so the content no longer names saved image files.

Co-Authored-By: Claude Opus 5.5 <noreply@anthropic.com>
</commit_message>
<xml_diff>
--- a/docs/ATAC-seq/modules/Portal_Content.docx
+++ b/docs/ATAC-seq/modules/Portal_Content.docx
@@ -332,43 +332,13 @@
         <w:spacing w:after="80"/>
       </w:pPr>
       <w:r>
-        <w:t xml:space="preserve">주요 결과 이미지는 실제 데이터로 실행한 결과에서 가져와 </w:t>
-      </w:r>
-      <w:r>
-        <w:t xml:space="preserve">docs/ATAC-seq/modules/figures/module_results/&lt;모듈&gt;_result_&lt;N&gt;.{png,svg}</w:t>
-      </w:r>
-      <w:r>
-        <w:t xml:space="preserve">로 PNG(등록용)와 SVG(원본)를 함께 저장한다(모듈마다 결과 그림을 여러 개 등록하며 순서대로 </w:t>
-      </w:r>
-      <w:r>
-        <w:t xml:space="preserve">_result_1</w:t>
-      </w:r>
-      <w:r>
-        <w:t xml:space="preserve">, </w:t>
-      </w:r>
-      <w:r>
-        <w:t xml:space="preserve">_result_2</w:t>
-      </w:r>
-      <w:r>
-        <w:t xml:space="preserve">, …로 이름 붙인다). PDF는 </w:t>
-      </w:r>
-      <w:r>
-        <w:t xml:space="preserve">pdftocairo -png -r 200 -singlefile &lt;그림&gt;.pdf &lt;모듈&gt;_result_&lt;N&gt;</w:t>
-      </w:r>
-      <w:r>
-        <w:t xml:space="preserve">와 </w:t>
-      </w:r>
-      <w:r>
-        <w:t xml:space="preserve">pdftocairo -svg &lt;그림&gt;.pdf &lt;모듈&gt;_result_&lt;N&gt;.svg</w:t>
-      </w:r>
-      <w:r>
-        <w:t xml:space="preserve">로 바꾼다(여러 쪽이면 </w:t>
-      </w:r>
-      <w:r>
-        <w:t xml:space="preserve">-f &lt;쪽&gt; -l &lt;쪽&gt;</w:t>
-      </w:r>
-      <w:r>
-        <w:t xml:space="preserve">). 처음부터 PNG인 그림(IDR)과 표 캡처는 PNG만 저장한다.</w:t>
+        <w:t xml:space="preserve">주요 결과 이미지는 모듈 결과 중 등록할 파일 이름만 적는다(</w:t>
+      </w:r>
+      <w:r>
+        <w:t xml:space="preserve">output_dir</w:t>
+      </w:r>
+      <w:r>
+        <w:t xml:space="preserve"> 기준). 그림은 등록할 때 실제 결과를 캡처해 올린다.</w:t>
       </w:r>
     </w:p>
     <w:p>
@@ -2705,60 +2675,13 @@
         <w:spacing w:after="80"/>
       </w:pPr>
       <w:r>
-        <w:t xml:space="preserve">등록할 그림: 화면 캡처 </w:t>
+        <w:t xml:space="preserve">결과 파일: 화면 캡처 </w:t>
       </w:r>
       <w:r>
         <w:t xml:space="preserve">&lt;sample&gt;_bowtie.log</w:t>
       </w:r>
       <w:r>
         <w:t xml:space="preserve">의 정렬 요약 부분 (이 모듈은 그림을 만들지 않는다)</w:t>
-      </w:r>
-    </w:p>
-    <w:p>
-      <w:pPr>
-        <w:pStyle w:val="ListParagraph"/>
-        <w:numPr>
-          <w:ilvl w:val="0"/>
-          <w:numId w:val="2"/>
-        </w:numPr>
-        <w:spacing w:after="80"/>
-      </w:pPr>
-      <w:r>
-        <w:t xml:space="preserve">저장 파일: </w:t>
-      </w:r>
-      <w:r>
-        <w:t xml:space="preserve">docs/ATAC-seq/modules/figures/module_results/bowtie2_result_1.png</w:t>
-      </w:r>
-    </w:p>
-    <w:p>
-      <w:pPr>
-        <w:spacing w:after="120"/>
-      </w:pPr>
-      <w:r>
-        <w:rPr>
-          <w:b/>
-          <w:bCs/>
-          <w:color w:val="B0B0B0"/>
-          <w:sz w:val="18"/>
-          <w:szCs w:val="18"/>
-        </w:rPr>
-        <w:t xml:space="preserve">[내부 메모 · 붙여 넣지 마세요] </w:t>
-      </w:r>
-      <w:r>
-        <w:rPr>
-          <w:color w:val="8A8F99"/>
-          <w:sz w:val="18"/>
-          <w:szCs w:val="18"/>
-        </w:rPr>
-        <w:t xml:space="preserve">그림: </w:t>
-      </w:r>
-      <w:r>
-        <w:rPr>
-          <w:color w:val="8A8F99"/>
-          <w:sz w:val="18"/>
-          <w:szCs w:val="18"/>
-        </w:rPr>
-        <w:t xml:space="preserve">docs/ATAC-seq/modules/figures/module_results/bowtie2_result_1.png</w:t>
       </w:r>
     </w:p>
     <w:p>
@@ -5280,60 +5203,13 @@
         <w:spacing w:after="80"/>
       </w:pPr>
       <w:r>
-        <w:t xml:space="preserve">등록할 그림: 표 캡처 </w:t>
+        <w:t xml:space="preserve">결과 파일: 표 캡처 </w:t>
       </w:r>
       <w:r>
         <w:t xml:space="preserve">04_summary/organellar_filter_summary.tsv</w:t>
       </w:r>
       <w:r>
         <w:t xml:space="preserve"> (이 모듈은 그림을 만들지 않는다)</w:t>
-      </w:r>
-    </w:p>
-    <w:p>
-      <w:pPr>
-        <w:pStyle w:val="ListParagraph"/>
-        <w:numPr>
-          <w:ilvl w:val="0"/>
-          <w:numId w:val="2"/>
-        </w:numPr>
-        <w:spacing w:after="80"/>
-      </w:pPr>
-      <w:r>
-        <w:t xml:space="preserve">저장 파일: </w:t>
-      </w:r>
-      <w:r>
-        <w:t xml:space="preserve">docs/ATAC-seq/modules/figures/module_results/organellar_filter_result_1.png</w:t>
-      </w:r>
-    </w:p>
-    <w:p>
-      <w:pPr>
-        <w:spacing w:after="120"/>
-      </w:pPr>
-      <w:r>
-        <w:rPr>
-          <w:b/>
-          <w:bCs/>
-          <w:color w:val="B0B0B0"/>
-          <w:sz w:val="18"/>
-          <w:szCs w:val="18"/>
-        </w:rPr>
-        <w:t xml:space="preserve">[내부 메모 · 붙여 넣지 마세요] </w:t>
-      </w:r>
-      <w:r>
-        <w:rPr>
-          <w:color w:val="8A8F99"/>
-          <w:sz w:val="18"/>
-          <w:szCs w:val="18"/>
-        </w:rPr>
-        <w:t xml:space="preserve">그림: </w:t>
-      </w:r>
-      <w:r>
-        <w:rPr>
-          <w:color w:val="8A8F99"/>
-          <w:sz w:val="18"/>
-          <w:szCs w:val="18"/>
-        </w:rPr>
-        <w:t xml:space="preserve">docs/ATAC-seq/modules/figures/module_results/organellar_filter_result_1.png</w:t>
       </w:r>
     </w:p>
     <w:p>
@@ -9176,7 +9052,7 @@
         <w:spacing w:after="80"/>
       </w:pPr>
       <w:r>
-        <w:t xml:space="preserve">등록할 그림: </w:t>
+        <w:t xml:space="preserve">결과 파일: </w:t>
       </w:r>
       <w:r>
         <w:t xml:space="preserve">01_fragment_size/&lt;sample&gt;/&lt;sample&gt;.fragSizeDist.pdf</w:t>
@@ -9195,41 +9071,17 @@
         <w:spacing w:after="80"/>
       </w:pPr>
       <w:r>
-        <w:t xml:space="preserve">저장 파일: </w:t>
-      </w:r>
-      <w:r>
-        <w:t xml:space="preserve">docs/ATAC-seq/modules/figures/module_results/ATAC_QC_result_1.{png,svg}</w:t>
-      </w:r>
-    </w:p>
-    <w:p>
-      <w:pPr>
-        <w:spacing w:after="120"/>
-      </w:pPr>
+        <w:t xml:space="preserve">레전드(국문): </w:t>
+      </w:r>
       <w:r>
         <w:rPr>
           <w:b/>
           <w:bCs/>
-          <w:color w:val="B0B0B0"/>
-          <w:sz w:val="18"/>
-          <w:szCs w:val="18"/>
-        </w:rPr>
-        <w:t xml:space="preserve">[내부 메모 · 붙여 넣지 마세요] </w:t>
-      </w:r>
-      <w:r>
-        <w:rPr>
-          <w:color w:val="8A8F99"/>
-          <w:sz w:val="18"/>
-          <w:szCs w:val="18"/>
-        </w:rPr>
-        <w:t xml:space="preserve">그림: </w:t>
-      </w:r>
-      <w:r>
-        <w:rPr>
-          <w:color w:val="8A8F99"/>
-          <w:sz w:val="18"/>
-          <w:szCs w:val="18"/>
-        </w:rPr>
-        <w:t xml:space="preserve">docs/ATAC-seq/modules/figures/module_results/ATAC_QC_result_1.png</w:t>
+        </w:rPr>
+        <w:t xml:space="preserve">Fragment 크기 분포.</w:t>
+      </w:r>
+      <w:r>
+        <w:t xml:space="preserve"> paired-end fragment의 길이(가로축, bp)별 read 수(세로축)다. 100 bp 이하의 nucleosome-free 봉우리와 약 200 bp(mononucleosome), 약 400 bp(dinucleosome) 간격의 주기적인 봉우리가 보이면 Tn5 절단이 정상적으로 일어난 것이다. 작은 그림은 같은 분포를 로그 축으로 보여 주며, 짧은 구간의 약 10.5 bp 물결(DNA 나선 주기)도 여기서 보인다. 봉우리 없이 매끄럽게 줄어들면 Tn5 반응이 과하거나 세포 상태가 나쁜 경우다.</w:t>
       </w:r>
     </w:p>
     <w:p>
@@ -9242,17 +9094,29 @@
         <w:spacing w:after="80"/>
       </w:pPr>
       <w:r>
-        <w:t xml:space="preserve">레전드(국문): </w:t>
+        <w:t xml:space="preserve">레전드(영문): </w:t>
       </w:r>
       <w:r>
         <w:rPr>
           <w:b/>
           <w:bCs/>
         </w:rPr>
-        <w:t xml:space="preserve">Fragment 크기 분포.</w:t>
-      </w:r>
-      <w:r>
-        <w:t xml:space="preserve"> paired-end fragment의 길이(가로축, bp)별 read 수(세로축)다. 100 bp 이하의 nucleosome-free 봉우리와 약 200 bp(mononucleosome), 약 400 bp(dinucleosome) 간격의 주기적인 봉우리가 보이면 Tn5 절단이 정상적으로 일어난 것이다. 작은 그림은 같은 분포를 로그 축으로 보여 주며, 짧은 구간의 약 10.5 bp 물결(DNA 나선 주기)도 여기서 보인다. 봉우리 없이 매끄럽게 줄어들면 Tn5 반응이 과하거나 세포 상태가 나쁜 경우다.</w:t>
+        <w:t xml:space="preserve">Fragment size distribution.</w:t>
+      </w:r>
+      <w:r>
+        <w:t xml:space="preserve"> Read counts (y-axis) by paired-end fragment length (x-axis, bp). A nucleosome-free peak below 100 bp followed by periodic peaks near 200 bp (mononucleosome) and 400 bp (dinucleosome) indicates proper Tn5 cutting. The inset shows the same distribution on a log scale, where the ~10.5 bp helical ripple of short fragments is also visible. A smooth decay without peaks points to over-tagmentation or poor cell condition.</w:t>
+      </w:r>
+    </w:p>
+    <w:p>
+      <w:pPr>
+        <w:spacing w:after="140"/>
+      </w:pPr>
+      <w:r>
+        <w:rPr>
+          <w:b/>
+          <w:bCs/>
+        </w:rPr>
+        <w:t xml:space="preserve">결과 2. TSS enrichment</w:t>
       </w:r>
     </w:p>
     <w:p>
@@ -9265,29 +9129,13 @@
         <w:spacing w:after="80"/>
       </w:pPr>
       <w:r>
-        <w:t xml:space="preserve">레전드(영문): </w:t>
-      </w:r>
-      <w:r>
-        <w:rPr>
-          <w:b/>
-          <w:bCs/>
-        </w:rPr>
-        <w:t xml:space="preserve">Fragment size distribution.</w:t>
-      </w:r>
-      <w:r>
-        <w:t xml:space="preserve"> Read counts (y-axis) by paired-end fragment length (x-axis, bp). A nucleosome-free peak below 100 bp followed by periodic peaks near 200 bp (mononucleosome) and 400 bp (dinucleosome) indicates proper Tn5 cutting. The inset shows the same distribution on a log scale, where the ~10.5 bp helical ripple of short fragments is also visible. A smooth decay without peaks points to over-tagmentation or poor cell condition.</w:t>
-      </w:r>
-    </w:p>
-    <w:p>
-      <w:pPr>
-        <w:spacing w:after="140"/>
-      </w:pPr>
-      <w:r>
-        <w:rPr>
-          <w:b/>
-          <w:bCs/>
-        </w:rPr>
-        <w:t xml:space="preserve">결과 2. TSS enrichment</w:t>
+        <w:t xml:space="preserve">결과 파일: </w:t>
+      </w:r>
+      <w:r>
+        <w:t xml:space="preserve">07_tss_enrichment/&lt;sample&gt;.tss_enrichment.pdf</w:t>
+      </w:r>
+      <w:r>
+        <w:t xml:space="preserve"> (대표 샘플 1개)</w:t>
       </w:r>
     </w:p>
     <w:p>
@@ -9300,13 +9148,17 @@
         <w:spacing w:after="80"/>
       </w:pPr>
       <w:r>
-        <w:t xml:space="preserve">등록할 그림: </w:t>
-      </w:r>
-      <w:r>
-        <w:t xml:space="preserve">07_tss_enrichment/&lt;sample&gt;.tss_enrichment.pdf</w:t>
-      </w:r>
-      <w:r>
-        <w:t xml:space="preserve"> (대표 샘플 1개)</w:t>
+        <w:t xml:space="preserve">레전드(국문): </w:t>
+      </w:r>
+      <w:r>
+        <w:rPr>
+          <w:b/>
+          <w:bCs/>
+        </w:rPr>
+        <w:t xml:space="preserve">TSS enrichment.</w:t>
+      </w:r>
+      <w:r>
+        <w:t xml:space="preserve"> 가로축은 TSS로부터의 거리(기본 ±1,000 bp), 세로축은 양 끝 구간 대비 신호 비율(aggregate TSS score)이다. TSS(0 bp, 점선)에서 신호가 뚜렷하게 솟을수록 열린 염색질이 잘 포착된 것이며, 제목에 TSS enrichment score가 표시된다. ENCODE는 사람(GRCh38, RefSeq TSS) 기준 7 이상을 이상적, 5~7을 허용으로 둔다. 값은 유전체와 TSS 주석에 따라 달라지므로 같은 실험의 샘플끼리 비교하는 데 주로 쓴다.</w:t>
       </w:r>
     </w:p>
     <w:p>
@@ -9319,41 +9171,29 @@
         <w:spacing w:after="80"/>
       </w:pPr>
       <w:r>
-        <w:t xml:space="preserve">저장 파일: </w:t>
-      </w:r>
-      <w:r>
-        <w:t xml:space="preserve">docs/ATAC-seq/modules/figures/module_results/ATAC_QC_result_2.{png,svg}</w:t>
-      </w:r>
-    </w:p>
-    <w:p>
-      <w:pPr>
-        <w:spacing w:after="120"/>
-      </w:pPr>
+        <w:t xml:space="preserve">레전드(영문): </w:t>
+      </w:r>
       <w:r>
         <w:rPr>
           <w:b/>
           <w:bCs/>
-          <w:color w:val="B0B0B0"/>
-          <w:sz w:val="18"/>
-          <w:szCs w:val="18"/>
-        </w:rPr>
-        <w:t xml:space="preserve">[내부 메모 · 붙여 넣지 마세요] </w:t>
-      </w:r>
-      <w:r>
-        <w:rPr>
-          <w:color w:val="8A8F99"/>
-          <w:sz w:val="18"/>
-          <w:szCs w:val="18"/>
-        </w:rPr>
-        <w:t xml:space="preserve">그림: </w:t>
-      </w:r>
-      <w:r>
-        <w:rPr>
-          <w:color w:val="8A8F99"/>
-          <w:sz w:val="18"/>
-          <w:szCs w:val="18"/>
-        </w:rPr>
-        <w:t xml:space="preserve">docs/ATAC-seq/modules/figures/module_results/ATAC_QC_result_2.png</w:t>
+        </w:rPr>
+        <w:t xml:space="preserve">TSS enrichment.</w:t>
+      </w:r>
+      <w:r>
+        <w:t xml:space="preserve"> The x-axis is the distance from the TSS (±1,000 bp by default) and the y-axis the signal relative to the flanking ends (aggregate TSS score). A sharp rise at the TSS (0 bp, dashed line) indicates good capture of open chromatin; the TSS enrichment score is shown in the title. ENCODE considers 7 or more ideal and 5-7 acceptable for human (GRCh38, RefSeq TSS). The value depends on the genome and TSS annotation, so it is mainly used to compare samples within an experiment.</w:t>
+      </w:r>
+    </w:p>
+    <w:p>
+      <w:pPr>
+        <w:spacing w:after="140"/>
+      </w:pPr>
+      <w:r>
+        <w:rPr>
+          <w:b/>
+          <w:bCs/>
+        </w:rPr>
+        <w:t xml:space="preserve">결과 3. 샘플별 QC 지표</w:t>
       </w:r>
     </w:p>
     <w:p>
@@ -9366,115 +9206,10 @@
         <w:spacing w:after="80"/>
       </w:pPr>
       <w:r>
-        <w:t xml:space="preserve">레전드(국문): </w:t>
-      </w:r>
-      <w:r>
-        <w:rPr>
-          <w:b/>
-          <w:bCs/>
-        </w:rPr>
-        <w:t xml:space="preserve">TSS enrichment.</w:t>
-      </w:r>
-      <w:r>
-        <w:t xml:space="preserve"> 가로축은 TSS로부터의 거리(기본 ±1,000 bp), 세로축은 양 끝 구간 대비 신호 비율(aggregate TSS score)이다. TSS(0 bp, 점선)에서 신호가 뚜렷하게 솟을수록 열린 염색질이 잘 포착된 것이며, 제목에 TSS enrichment score가 표시된다. ENCODE는 사람(GRCh38, RefSeq TSS) 기준 7 이상을 이상적, 5~7을 허용으로 둔다. 값은 유전체와 TSS 주석에 따라 달라지므로 같은 실험의 샘플끼리 비교하는 데 주로 쓴다.</w:t>
-      </w:r>
-    </w:p>
-    <w:p>
-      <w:pPr>
-        <w:pStyle w:val="ListParagraph"/>
-        <w:numPr>
-          <w:ilvl w:val="0"/>
-          <w:numId w:val="2"/>
-        </w:numPr>
-        <w:spacing w:after="80"/>
-      </w:pPr>
-      <w:r>
-        <w:t xml:space="preserve">레전드(영문): </w:t>
-      </w:r>
-      <w:r>
-        <w:rPr>
-          <w:b/>
-          <w:bCs/>
-        </w:rPr>
-        <w:t xml:space="preserve">TSS enrichment.</w:t>
-      </w:r>
-      <w:r>
-        <w:t xml:space="preserve"> The x-axis is the distance from the TSS (±1,000 bp by default) and the y-axis the signal relative to the flanking ends (aggregate TSS score). A sharp rise at the TSS (0 bp, dashed line) indicates good capture of open chromatin; the TSS enrichment score is shown in the title. ENCODE considers 7 or more ideal and 5-7 acceptable for human (GRCh38, RefSeq TSS). The value depends on the genome and TSS annotation, so it is mainly used to compare samples within an experiment.</w:t>
-      </w:r>
-    </w:p>
-    <w:p>
-      <w:pPr>
-        <w:spacing w:after="140"/>
-      </w:pPr>
-      <w:r>
-        <w:rPr>
-          <w:b/>
-          <w:bCs/>
-        </w:rPr>
-        <w:t xml:space="preserve">결과 3. 샘플별 QC 지표</w:t>
-      </w:r>
-    </w:p>
-    <w:p>
-      <w:pPr>
-        <w:pStyle w:val="ListParagraph"/>
-        <w:numPr>
-          <w:ilvl w:val="0"/>
-          <w:numId w:val="2"/>
-        </w:numPr>
-        <w:spacing w:after="80"/>
-      </w:pPr>
-      <w:r>
-        <w:t xml:space="preserve">등록할 그림: 표 캡처 </w:t>
+        <w:t xml:space="preserve">결과 파일: 표 캡처 </w:t>
       </w:r>
       <w:r>
         <w:t xml:space="preserve">05_metadata/atac_qc_metrics.tsv</w:t>
-      </w:r>
-    </w:p>
-    <w:p>
-      <w:pPr>
-        <w:pStyle w:val="ListParagraph"/>
-        <w:numPr>
-          <w:ilvl w:val="0"/>
-          <w:numId w:val="2"/>
-        </w:numPr>
-        <w:spacing w:after="80"/>
-      </w:pPr>
-      <w:r>
-        <w:t xml:space="preserve">저장 파일: </w:t>
-      </w:r>
-      <w:r>
-        <w:t xml:space="preserve">docs/ATAC-seq/modules/figures/module_results/ATAC_QC_result_3.png</w:t>
-      </w:r>
-    </w:p>
-    <w:p>
-      <w:pPr>
-        <w:spacing w:after="120"/>
-      </w:pPr>
-      <w:r>
-        <w:rPr>
-          <w:b/>
-          <w:bCs/>
-          <w:color w:val="B0B0B0"/>
-          <w:sz w:val="18"/>
-          <w:szCs w:val="18"/>
-        </w:rPr>
-        <w:t xml:space="preserve">[내부 메모 · 붙여 넣지 마세요] </w:t>
-      </w:r>
-      <w:r>
-        <w:rPr>
-          <w:color w:val="8A8F99"/>
-          <w:sz w:val="18"/>
-          <w:szCs w:val="18"/>
-        </w:rPr>
-        <w:t xml:space="preserve">그림: </w:t>
-      </w:r>
-      <w:r>
-        <w:rPr>
-          <w:color w:val="8A8F99"/>
-          <w:sz w:val="18"/>
-          <w:szCs w:val="18"/>
-        </w:rPr>
-        <w:t xml:space="preserve">docs/ATAC-seq/modules/figures/module_results/ATAC_QC_result_3.png</w:t>
       </w:r>
     </w:p>
     <w:p>
@@ -12935,7 +12670,7 @@
         <w:spacing w:after="80"/>
       </w:pPr>
       <w:r>
-        <w:t xml:space="preserve">등록할 그림: </w:t>
+        <w:t xml:space="preserve">결과 파일: </w:t>
       </w:r>
       <w:r>
         <w:t xml:space="preserve">01_tss_signal/&lt;sample&gt;.Heatmap_splitbam.pdf</w:t>
@@ -12954,41 +12689,17 @@
         <w:spacing w:after="80"/>
       </w:pPr>
       <w:r>
-        <w:t xml:space="preserve">저장 파일: </w:t>
-      </w:r>
-      <w:r>
-        <w:t xml:space="preserve">docs/ATAC-seq/modules/figures/module_results/ATAC_QC_plot_result_1.{png,svg}</w:t>
-      </w:r>
-    </w:p>
-    <w:p>
-      <w:pPr>
-        <w:spacing w:after="120"/>
-      </w:pPr>
+        <w:t xml:space="preserve">레전드(국문): </w:t>
+      </w:r>
       <w:r>
         <w:rPr>
           <w:b/>
           <w:bCs/>
-          <w:color w:val="B0B0B0"/>
-          <w:sz w:val="18"/>
-          <w:szCs w:val="18"/>
-        </w:rPr>
-        <w:t xml:space="preserve">[내부 메모 · 붙여 넣지 마세요] </w:t>
-      </w:r>
-      <w:r>
-        <w:rPr>
-          <w:color w:val="8A8F99"/>
-          <w:sz w:val="18"/>
-          <w:szCs w:val="18"/>
-        </w:rPr>
-        <w:t xml:space="preserve">그림: </w:t>
-      </w:r>
-      <w:r>
-        <w:rPr>
-          <w:color w:val="8A8F99"/>
-          <w:sz w:val="18"/>
-          <w:szCs w:val="18"/>
-        </w:rPr>
-        <w:t xml:space="preserve">docs/ATAC-seq/modules/figures/module_results/ATAC_QC_plot_result_1.png</w:t>
+        </w:rPr>
+        <w:t xml:space="preserve">TSS 주변의 nucleosome-free 신호와 nucleosome 신호.</w:t>
+      </w:r>
+      <w:r>
+        <w:t xml:space="preserve"> 각 행은 TSS 하나이고, 가로축은 TSS 중심 ±1,010 bp 구간이다. 왼쪽 패널(NucleosomeFree)은 nucleosome-free fragment, 오른쪽 패널(그림에는 mononucleosome으로 표시)은 mono, di, trinucleosome fragment를 합친 nucleosome 신호이며, 신호(log2)를 노랑(낮음)에서 빨강(높음)으로 나타낸다. 정상적인 ATAC-seq에서는 nucleosome-free 신호가 TSS 바로 위에 모이고, nucleosome 신호는 TSS 양옆(nucleosome 자리)에 나타난다.</w:t>
       </w:r>
     </w:p>
     <w:p>
@@ -13001,17 +12712,29 @@
         <w:spacing w:after="80"/>
       </w:pPr>
       <w:r>
-        <w:t xml:space="preserve">레전드(국문): </w:t>
+        <w:t xml:space="preserve">레전드(영문): </w:t>
       </w:r>
       <w:r>
         <w:rPr>
           <w:b/>
           <w:bCs/>
         </w:rPr>
-        <w:t xml:space="preserve">TSS 주변의 nucleosome-free 신호와 nucleosome 신호.</w:t>
-      </w:r>
-      <w:r>
-        <w:t xml:space="preserve"> 각 행은 TSS 하나이고, 가로축은 TSS 중심 ±1,010 bp 구간이다. 왼쪽 패널(NucleosomeFree)은 nucleosome-free fragment, 오른쪽 패널(그림에는 mononucleosome으로 표시)은 mono, di, trinucleosome fragment를 합친 nucleosome 신호이며, 신호(log2)를 노랑(낮음)에서 빨강(높음)으로 나타낸다. 정상적인 ATAC-seq에서는 nucleosome-free 신호가 TSS 바로 위에 모이고, nucleosome 신호는 TSS 양옆(nucleosome 자리)에 나타난다.</w:t>
+        <w:t xml:space="preserve">Nucleosome-free and nucleosome signal around TSSs.</w:t>
+      </w:r>
+      <w:r>
+        <w:t xml:space="preserve"> Each row is one TSS and the x-axis spans ±1,010 bp around its centre. The left panel (NucleosomeFree) shows nucleosome-free fragments and the right panel (labelled mononucleosome in the plot) the nucleosome signal of mono-, di-, and trinucleosome fragments combined, with signal (log2) from yellow (low) to red (high). In good ATAC-seq data the nucleosome-free signal concentrates at the TSS, while the nucleosome signal flanks it where nucleosomes sit.</w:t>
+      </w:r>
+    </w:p>
+    <w:p>
+      <w:pPr>
+        <w:spacing w:after="140"/>
+      </w:pPr>
+      <w:r>
+        <w:rPr>
+          <w:b/>
+          <w:bCs/>
+        </w:rPr>
+        <w:t xml:space="preserve">결과 2. TSS 주변 평균 신호</w:t>
       </w:r>
     </w:p>
     <w:p>
@@ -13024,95 +12747,13 @@
         <w:spacing w:after="80"/>
       </w:pPr>
       <w:r>
-        <w:t xml:space="preserve">레전드(영문): </w:t>
-      </w:r>
-      <w:r>
-        <w:rPr>
-          <w:b/>
-          <w:bCs/>
-        </w:rPr>
-        <w:t xml:space="preserve">Nucleosome-free and nucleosome signal around TSSs.</w:t>
-      </w:r>
-      <w:r>
-        <w:t xml:space="preserve"> Each row is one TSS and the x-axis spans ±1,010 bp around its centre. The left panel (NucleosomeFree) shows nucleosome-free fragments and the right panel (labelled mononucleosome in the plot) the nucleosome signal of mono-, di-, and trinucleosome fragments combined, with signal (log2) from yellow (low) to red (high). In good ATAC-seq data the nucleosome-free signal concentrates at the TSS, while the nucleosome signal flanks it where nucleosomes sit.</w:t>
-      </w:r>
-    </w:p>
-    <w:p>
-      <w:pPr>
-        <w:spacing w:after="140"/>
-      </w:pPr>
-      <w:r>
-        <w:rPr>
-          <w:b/>
-          <w:bCs/>
-        </w:rPr>
-        <w:t xml:space="preserve">결과 2. TSS 주변 평균 신호</w:t>
-      </w:r>
-    </w:p>
-    <w:p>
-      <w:pPr>
-        <w:pStyle w:val="ListParagraph"/>
-        <w:numPr>
-          <w:ilvl w:val="0"/>
-          <w:numId w:val="2"/>
-        </w:numPr>
-        <w:spacing w:after="80"/>
-      </w:pPr>
-      <w:r>
-        <w:t xml:space="preserve">등록할 그림: </w:t>
+        <w:t xml:space="preserve">결과 파일: </w:t>
       </w:r>
       <w:r>
         <w:t xml:space="preserve">01_tss_signal/&lt;sample&gt;.TSSprofile_splitbam.pdf</w:t>
       </w:r>
       <w:r>
         <w:t xml:space="preserve"> (결과 1과 같은 샘플)</w:t>
-      </w:r>
-    </w:p>
-    <w:p>
-      <w:pPr>
-        <w:pStyle w:val="ListParagraph"/>
-        <w:numPr>
-          <w:ilvl w:val="0"/>
-          <w:numId w:val="2"/>
-        </w:numPr>
-        <w:spacing w:after="80"/>
-      </w:pPr>
-      <w:r>
-        <w:t xml:space="preserve">저장 파일: </w:t>
-      </w:r>
-      <w:r>
-        <w:t xml:space="preserve">docs/ATAC-seq/modules/figures/module_results/ATAC_QC_plot_result_2.{png,svg}</w:t>
-      </w:r>
-    </w:p>
-    <w:p>
-      <w:pPr>
-        <w:spacing w:after="120"/>
-      </w:pPr>
-      <w:r>
-        <w:rPr>
-          <w:b/>
-          <w:bCs/>
-          <w:color w:val="B0B0B0"/>
-          <w:sz w:val="18"/>
-          <w:szCs w:val="18"/>
-        </w:rPr>
-        <w:t xml:space="preserve">[내부 메모 · 붙여 넣지 마세요] </w:t>
-      </w:r>
-      <w:r>
-        <w:rPr>
-          <w:color w:val="8A8F99"/>
-          <w:sz w:val="18"/>
-          <w:szCs w:val="18"/>
-        </w:rPr>
-        <w:t xml:space="preserve">그림: </w:t>
-      </w:r>
-      <w:r>
-        <w:rPr>
-          <w:color w:val="8A8F99"/>
-          <w:sz w:val="18"/>
-          <w:szCs w:val="18"/>
-        </w:rPr>
-        <w:t xml:space="preserve">docs/ATAC-seq/modules/figures/module_results/ATAC_QC_plot_result_2.png</w:t>
       </w:r>
     </w:p>
     <w:p>
@@ -16347,60 +15988,13 @@
         <w:spacing w:after="80"/>
       </w:pPr>
       <w:r>
-        <w:t xml:space="preserve">등록할 그림: 표 캡처 </w:t>
+        <w:t xml:space="preserve">결과 파일: 표 캡처 </w:t>
       </w:r>
       <w:r>
         <w:t xml:space="preserve">frip_summary.tsv</w:t>
       </w:r>
       <w:r>
         <w:t xml:space="preserve"> (이 모듈은 그림을 만들지 않는다)</w:t>
-      </w:r>
-    </w:p>
-    <w:p>
-      <w:pPr>
-        <w:pStyle w:val="ListParagraph"/>
-        <w:numPr>
-          <w:ilvl w:val="0"/>
-          <w:numId w:val="2"/>
-        </w:numPr>
-        <w:spacing w:after="80"/>
-      </w:pPr>
-      <w:r>
-        <w:t xml:space="preserve">저장 파일: </w:t>
-      </w:r>
-      <w:r>
-        <w:t xml:space="preserve">docs/ATAC-seq/modules/figures/module_results/MACS3_callpeak_ATAC_result_1.png</w:t>
-      </w:r>
-    </w:p>
-    <w:p>
-      <w:pPr>
-        <w:spacing w:after="120"/>
-      </w:pPr>
-      <w:r>
-        <w:rPr>
-          <w:b/>
-          <w:bCs/>
-          <w:color w:val="B0B0B0"/>
-          <w:sz w:val="18"/>
-          <w:szCs w:val="18"/>
-        </w:rPr>
-        <w:t xml:space="preserve">[내부 메모 · 붙여 넣지 마세요] </w:t>
-      </w:r>
-      <w:r>
-        <w:rPr>
-          <w:color w:val="8A8F99"/>
-          <w:sz w:val="18"/>
-          <w:szCs w:val="18"/>
-        </w:rPr>
-        <w:t xml:space="preserve">그림: </w:t>
-      </w:r>
-      <w:r>
-        <w:rPr>
-          <w:color w:val="8A8F99"/>
-          <w:sz w:val="18"/>
-          <w:szCs w:val="18"/>
-        </w:rPr>
-        <w:t xml:space="preserve">docs/ATAC-seq/modules/figures/module_results/MACS3_callpeak_ATAC_result_1.png</w:t>
       </w:r>
     </w:p>
     <w:p>
@@ -19991,7 +19585,7 @@
         <w:spacing w:after="80"/>
       </w:pPr>
       <w:r>
-        <w:t xml:space="preserve">등록할 그림: </w:t>
+        <w:t xml:space="preserve">결과 파일: </w:t>
       </w:r>
       <w:r>
         <w:t xml:space="preserve">plots/annotation_summary_percent_barplot.pdf</w:t>
@@ -20007,41 +19601,17 @@
         <w:spacing w:after="80"/>
       </w:pPr>
       <w:r>
-        <w:t xml:space="preserve">저장 파일: </w:t>
-      </w:r>
-      <w:r>
-        <w:t xml:space="preserve">docs/ATAC-seq/modules/figures/module_results/peak_annotation_result_1.{png,svg}</w:t>
-      </w:r>
-    </w:p>
-    <w:p>
-      <w:pPr>
-        <w:spacing w:after="120"/>
-      </w:pPr>
+        <w:t xml:space="preserve">레전드(국문): </w:t>
+      </w:r>
       <w:r>
         <w:rPr>
           <w:b/>
           <w:bCs/>
-          <w:color w:val="B0B0B0"/>
-          <w:sz w:val="18"/>
-          <w:szCs w:val="18"/>
-        </w:rPr>
-        <w:t xml:space="preserve">[내부 메모 · 붙여 넣지 마세요] </w:t>
-      </w:r>
-      <w:r>
-        <w:rPr>
-          <w:color w:val="8A8F99"/>
-          <w:sz w:val="18"/>
-          <w:szCs w:val="18"/>
-        </w:rPr>
-        <w:t xml:space="preserve">그림: </w:t>
-      </w:r>
-      <w:r>
-        <w:rPr>
-          <w:color w:val="8A8F99"/>
-          <w:sz w:val="18"/>
-          <w:szCs w:val="18"/>
-        </w:rPr>
-        <w:t xml:space="preserve">docs/ATAC-seq/modules/figures/module_results/peak_annotation_result_1.png</w:t>
+        </w:rPr>
+        <w:t xml:space="preserve">샘플별 peak의 유전체 영역 분포.</w:t>
+      </w:r>
+      <w:r>
+        <w:t xml:space="preserve"> 막대 하나가 샘플 하나이며, peak가 promoter, UTR, exon, intron, distal intergenic 등 각 유전체 영역에 놓인 비율(%)을 색으로 나누어 보여 준다. ATAC-seq peak는 보통 promoter와 intron, distal intergenic에 많이 놓이며, 샘플 간 분포가 비슷한지로 데이터의 일관성을 확인할 수 있다.</w:t>
       </w:r>
     </w:p>
     <w:p>
@@ -20054,17 +19624,29 @@
         <w:spacing w:after="80"/>
       </w:pPr>
       <w:r>
-        <w:t xml:space="preserve">레전드(국문): </w:t>
+        <w:t xml:space="preserve">레전드(영문): </w:t>
       </w:r>
       <w:r>
         <w:rPr>
           <w:b/>
           <w:bCs/>
         </w:rPr>
-        <w:t xml:space="preserve">샘플별 peak의 유전체 영역 분포.</w:t>
-      </w:r>
-      <w:r>
-        <w:t xml:space="preserve"> 막대 하나가 샘플 하나이며, peak가 promoter, UTR, exon, intron, distal intergenic 등 각 유전체 영역에 놓인 비율(%)을 색으로 나누어 보여 준다. ATAC-seq peak는 보통 promoter와 intron, distal intergenic에 많이 놓이며, 샘플 간 분포가 비슷한지로 데이터의 일관성을 확인할 수 있다.</w:t>
+        <w:t xml:space="preserve">Genomic distribution of peaks per sample.</w:t>
+      </w:r>
+      <w:r>
+        <w:t xml:space="preserve"> Each bar is one sample, split by colour into the percentage of peaks in promoters, UTRs, exons, introns, distal intergenic regions and other features. ATAC-seq peaks are usually enriched in promoters, introns and distal intergenic regions; similar distributions across samples indicate consistent data.</w:t>
+      </w:r>
+    </w:p>
+    <w:p>
+      <w:pPr>
+        <w:spacing w:after="140"/>
+      </w:pPr>
+      <w:r>
+        <w:rPr>
+          <w:b/>
+          <w:bCs/>
+        </w:rPr>
+        <w:t xml:space="preserve">결과 2. 겹치는 주석 영역(UpSet)</w:t>
       </w:r>
     </w:p>
     <w:p>
@@ -20077,29 +19659,13 @@
         <w:spacing w:after="80"/>
       </w:pPr>
       <w:r>
-        <w:t xml:space="preserve">레전드(영문): </w:t>
-      </w:r>
-      <w:r>
-        <w:rPr>
-          <w:b/>
-          <w:bCs/>
-        </w:rPr>
-        <w:t xml:space="preserve">Genomic distribution of peaks per sample.</w:t>
-      </w:r>
-      <w:r>
-        <w:t xml:space="preserve"> Each bar is one sample, split by colour into the percentage of peaks in promoters, UTRs, exons, introns, distal intergenic regions and other features. ATAC-seq peaks are usually enriched in promoters, introns and distal intergenic regions; similar distributions across samples indicate consistent data.</w:t>
-      </w:r>
-    </w:p>
-    <w:p>
-      <w:pPr>
-        <w:spacing w:after="140"/>
-      </w:pPr>
-      <w:r>
-        <w:rPr>
-          <w:b/>
-          <w:bCs/>
-        </w:rPr>
-        <w:t xml:space="preserve">결과 2. 겹치는 주석 영역(UpSet)</w:t>
+        <w:t xml:space="preserve">결과 파일: </w:t>
+      </w:r>
+      <w:r>
+        <w:t xml:space="preserve">plots/&lt;sample&gt;.annotation_upset_vennpie.pdf</w:t>
+      </w:r>
+      <w:r>
+        <w:t xml:space="preserve"> (대표 샘플 1개)</w:t>
       </w:r>
     </w:p>
     <w:p>
@@ -20112,13 +19678,17 @@
         <w:spacing w:after="80"/>
       </w:pPr>
       <w:r>
-        <w:t xml:space="preserve">등록할 그림: </w:t>
-      </w:r>
-      <w:r>
-        <w:t xml:space="preserve">plots/&lt;sample&gt;.annotation_upset_vennpie.pdf</w:t>
-      </w:r>
-      <w:r>
-        <w:t xml:space="preserve"> (대표 샘플 1개)</w:t>
+        <w:t xml:space="preserve">레전드(국문): </w:t>
+      </w:r>
+      <w:r>
+        <w:rPr>
+          <w:b/>
+          <w:bCs/>
+        </w:rPr>
+        <w:t xml:space="preserve">peak가 동시에 걸치는 유전체 영역(UpSet plot).</w:t>
+      </w:r>
+      <w:r>
+        <w:t xml:space="preserve"> peak 하나가 여러 영역(예: promoter이면서 exon)에 함께 걸칠 수 있으므로, 영역 조합별 peak 수를 보여 준다. 아래 점과 선은 영역 조합, 위 막대는 그 조합에 속한 peak 수다. 왼쪽 위의 원그래프(vennpie)는 전체 peak의 영역 구성을 요약한다. 결과 1의 막대는 우선순위에 따라 영역 하나만 고른 것이고, 이 그림은 겹침까지 보여 준다.</w:t>
       </w:r>
     </w:p>
     <w:p>
@@ -20131,41 +19701,29 @@
         <w:spacing w:after="80"/>
       </w:pPr>
       <w:r>
-        <w:t xml:space="preserve">저장 파일: </w:t>
-      </w:r>
-      <w:r>
-        <w:t xml:space="preserve">docs/ATAC-seq/modules/figures/module_results/peak_annotation_result_2.{png,svg}</w:t>
-      </w:r>
-    </w:p>
-    <w:p>
-      <w:pPr>
-        <w:spacing w:after="120"/>
-      </w:pPr>
+        <w:t xml:space="preserve">레전드(영문): </w:t>
+      </w:r>
       <w:r>
         <w:rPr>
           <w:b/>
           <w:bCs/>
-          <w:color w:val="B0B0B0"/>
-          <w:sz w:val="18"/>
-          <w:szCs w:val="18"/>
-        </w:rPr>
-        <w:t xml:space="preserve">[내부 메모 · 붙여 넣지 마세요] </w:t>
-      </w:r>
-      <w:r>
-        <w:rPr>
-          <w:color w:val="8A8F99"/>
-          <w:sz w:val="18"/>
-          <w:szCs w:val="18"/>
-        </w:rPr>
-        <w:t xml:space="preserve">그림: </w:t>
-      </w:r>
-      <w:r>
-        <w:rPr>
-          <w:color w:val="8A8F99"/>
-          <w:sz w:val="18"/>
-          <w:szCs w:val="18"/>
-        </w:rPr>
-        <w:t xml:space="preserve">docs/ATAC-seq/modules/figures/module_results/peak_annotation_result_2.png</w:t>
+        </w:rPr>
+        <w:t xml:space="preserve">Overlapping genomic features of peaks (UpSet plot).</w:t>
+      </w:r>
+      <w:r>
+        <w:t xml:space="preserve"> A peak can fall in several features at once (for example promoter and exon), so the plot shows peak counts per feature combination: the dots and lines below define the combination and the bars above give its peak count. The pie (vennpie) at the top left summarises the feature composition of all peaks. Result 1 assigns each peak to one feature by priority; this plot shows the overlaps.</w:t>
+      </w:r>
+    </w:p>
+    <w:p>
+      <w:pPr>
+        <w:spacing w:after="140"/>
+      </w:pPr>
+      <w:r>
+        <w:rPr>
+          <w:b/>
+          <w:bCs/>
+        </w:rPr>
+        <w:t xml:space="preserve">결과 3. TSS까지 거리 분포</w:t>
       </w:r>
     </w:p>
     <w:p>
@@ -20178,17 +19736,13 @@
         <w:spacing w:after="80"/>
       </w:pPr>
       <w:r>
-        <w:t xml:space="preserve">레전드(국문): </w:t>
-      </w:r>
-      <w:r>
-        <w:rPr>
-          <w:b/>
-          <w:bCs/>
-        </w:rPr>
-        <w:t xml:space="preserve">peak가 동시에 걸치는 유전체 영역(UpSet plot).</w:t>
-      </w:r>
-      <w:r>
-        <w:t xml:space="preserve"> peak 하나가 여러 영역(예: promoter이면서 exon)에 함께 걸칠 수 있으므로, 영역 조합별 peak 수를 보여 준다. 아래 점과 선은 영역 조합, 위 막대는 그 조합에 속한 peak 수다. 왼쪽 위의 원그래프(vennpie)는 전체 peak의 영역 구성을 요약한다. 결과 1의 막대는 우선순위에 따라 영역 하나만 고른 것이고, 이 그림은 겹침까지 보여 준다.</w:t>
+        <w:t xml:space="preserve">결과 파일: </w:t>
+      </w:r>
+      <w:r>
+        <w:t xml:space="preserve">plots/&lt;sample&gt;.distance_to_tss.pdf</w:t>
+      </w:r>
+      <w:r>
+        <w:t xml:space="preserve"> (결과 2와 같은 샘플)</w:t>
       </w:r>
     </w:p>
     <w:p>
@@ -20201,29 +19755,17 @@
         <w:spacing w:after="80"/>
       </w:pPr>
       <w:r>
-        <w:t xml:space="preserve">레전드(영문): </w:t>
+        <w:t xml:space="preserve">레전드(국문): </w:t>
       </w:r>
       <w:r>
         <w:rPr>
           <w:b/>
           <w:bCs/>
         </w:rPr>
-        <w:t xml:space="preserve">Overlapping genomic features of peaks (UpSet plot).</w:t>
-      </w:r>
-      <w:r>
-        <w:t xml:space="preserve"> A peak can fall in several features at once (for example promoter and exon), so the plot shows peak counts per feature combination: the dots and lines below define the combination and the bars above give its peak count. The pie (vennpie) at the top left summarises the feature composition of all peaks. Result 1 assigns each peak to one feature by priority; this plot shows the overlaps.</w:t>
-      </w:r>
-    </w:p>
-    <w:p>
-      <w:pPr>
-        <w:spacing w:after="140"/>
-      </w:pPr>
-      <w:r>
-        <w:rPr>
-          <w:b/>
-          <w:bCs/>
-        </w:rPr>
-        <w:t xml:space="preserve">결과 3. TSS까지 거리 분포</w:t>
+        <w:t xml:space="preserve">peak에서 가장 가까운 TSS까지의 거리 분포.</w:t>
+      </w:r>
+      <w:r>
+        <w:t xml:space="preserve"> 가로 막대는 peak의 비율(%)이며, 거리 구간(0~1 kb, 1~3 kb, 3~5 kb, 5~10 kb, 10~100 kb, 100 kb 이상)별로 색을 나누었다. 왼쪽(음수)은 유전자 상류, 오른쪽(양수)은 하류에 놓인 peak다. ATAC-seq peak는 TSS 가까이(0~3 kb)에 많이 모이며, 원거리 peak는 enhancer 같은 조절 부위의 후보다.</w:t>
       </w:r>
     </w:p>
     <w:p>
@@ -20236,13 +19778,29 @@
         <w:spacing w:after="80"/>
       </w:pPr>
       <w:r>
-        <w:t xml:space="preserve">등록할 그림: </w:t>
-      </w:r>
-      <w:r>
-        <w:t xml:space="preserve">plots/&lt;sample&gt;.distance_to_tss.pdf</w:t>
-      </w:r>
-      <w:r>
-        <w:t xml:space="preserve"> (결과 2와 같은 샘플)</w:t>
+        <w:t xml:space="preserve">레전드(영문): </w:t>
+      </w:r>
+      <w:r>
+        <w:rPr>
+          <w:b/>
+          <w:bCs/>
+        </w:rPr>
+        <w:t xml:space="preserve">Distance from peaks to the nearest TSS.</w:t>
+      </w:r>
+      <w:r>
+        <w:t xml:space="preserve"> The horizontal bar gives the percentage of peaks in distance bins (0-1 kb, 1-3 kb, 3-5 kb, 5-10 kb, 10-100 kb, over 100 kb), with upstream peaks to the left (negative) and downstream peaks to the right (positive). ATAC-seq peaks concentrate near TSSs (0-3 kb), and distal peaks are candidates for regulatory elements such as enhancers.</w:t>
+      </w:r>
+    </w:p>
+    <w:p>
+      <w:pPr>
+        <w:spacing w:after="140"/>
+      </w:pPr>
+      <w:r>
+        <w:rPr>
+          <w:b/>
+          <w:bCs/>
+        </w:rPr>
+        <w:t xml:space="preserve">결과 4. TSS 주변 peak 분포</w:t>
       </w:r>
     </w:p>
     <w:p>
@@ -20255,165 +19813,13 @@
         <w:spacing w:after="80"/>
       </w:pPr>
       <w:r>
-        <w:t xml:space="preserve">저장 파일: </w:t>
-      </w:r>
-      <w:r>
-        <w:t xml:space="preserve">docs/ATAC-seq/modules/figures/module_results/peak_annotation_result_3.{png,svg}</w:t>
-      </w:r>
-    </w:p>
-    <w:p>
-      <w:pPr>
-        <w:spacing w:after="120"/>
-      </w:pPr>
-      <w:r>
-        <w:rPr>
-          <w:b/>
-          <w:bCs/>
-          <w:color w:val="B0B0B0"/>
-          <w:sz w:val="18"/>
-          <w:szCs w:val="18"/>
-        </w:rPr>
-        <w:t xml:space="preserve">[내부 메모 · 붙여 넣지 마세요] </w:t>
-      </w:r>
-      <w:r>
-        <w:rPr>
-          <w:color w:val="8A8F99"/>
-          <w:sz w:val="18"/>
-          <w:szCs w:val="18"/>
-        </w:rPr>
-        <w:t xml:space="preserve">그림: </w:t>
-      </w:r>
-      <w:r>
-        <w:rPr>
-          <w:color w:val="8A8F99"/>
-          <w:sz w:val="18"/>
-          <w:szCs w:val="18"/>
-        </w:rPr>
-        <w:t xml:space="preserve">docs/ATAC-seq/modules/figures/module_results/peak_annotation_result_3.png</w:t>
-      </w:r>
-    </w:p>
-    <w:p>
-      <w:pPr>
-        <w:pStyle w:val="ListParagraph"/>
-        <w:numPr>
-          <w:ilvl w:val="0"/>
-          <w:numId w:val="2"/>
-        </w:numPr>
-        <w:spacing w:after="80"/>
-      </w:pPr>
-      <w:r>
-        <w:t xml:space="preserve">레전드(국문): </w:t>
-      </w:r>
-      <w:r>
-        <w:rPr>
-          <w:b/>
-          <w:bCs/>
-        </w:rPr>
-        <w:t xml:space="preserve">peak에서 가장 가까운 TSS까지의 거리 분포.</w:t>
-      </w:r>
-      <w:r>
-        <w:t xml:space="preserve"> 가로 막대는 peak의 비율(%)이며, 거리 구간(0~1 kb, 1~3 kb, 3~5 kb, 5~10 kb, 10~100 kb, 100 kb 이상)별로 색을 나누었다. 왼쪽(음수)은 유전자 상류, 오른쪽(양수)은 하류에 놓인 peak다. ATAC-seq peak는 TSS 가까이(0~3 kb)에 많이 모이며, 원거리 peak는 enhancer 같은 조절 부위의 후보다.</w:t>
-      </w:r>
-    </w:p>
-    <w:p>
-      <w:pPr>
-        <w:pStyle w:val="ListParagraph"/>
-        <w:numPr>
-          <w:ilvl w:val="0"/>
-          <w:numId w:val="2"/>
-        </w:numPr>
-        <w:spacing w:after="80"/>
-      </w:pPr>
-      <w:r>
-        <w:t xml:space="preserve">레전드(영문): </w:t>
-      </w:r>
-      <w:r>
-        <w:rPr>
-          <w:b/>
-          <w:bCs/>
-        </w:rPr>
-        <w:t xml:space="preserve">Distance from peaks to the nearest TSS.</w:t>
-      </w:r>
-      <w:r>
-        <w:t xml:space="preserve"> The horizontal bar gives the percentage of peaks in distance bins (0-1 kb, 1-3 kb, 3-5 kb, 5-10 kb, 10-100 kb, over 100 kb), with upstream peaks to the left (negative) and downstream peaks to the right (positive). ATAC-seq peaks concentrate near TSSs (0-3 kb), and distal peaks are candidates for regulatory elements such as enhancers.</w:t>
-      </w:r>
-    </w:p>
-    <w:p>
-      <w:pPr>
-        <w:spacing w:after="140"/>
-      </w:pPr>
-      <w:r>
-        <w:rPr>
-          <w:b/>
-          <w:bCs/>
-        </w:rPr>
-        <w:t xml:space="preserve">결과 4. TSS 주변 peak 분포</w:t>
-      </w:r>
-    </w:p>
-    <w:p>
-      <w:pPr>
-        <w:pStyle w:val="ListParagraph"/>
-        <w:numPr>
-          <w:ilvl w:val="0"/>
-          <w:numId w:val="2"/>
-        </w:numPr>
-        <w:spacing w:after="80"/>
-      </w:pPr>
-      <w:r>
-        <w:t xml:space="preserve">등록할 그림: </w:t>
+        <w:t xml:space="preserve">결과 파일: </w:t>
       </w:r>
       <w:r>
         <w:t xml:space="preserve">plots/&lt;sample&gt;.tss_profile.pdf</w:t>
       </w:r>
       <w:r>
         <w:t xml:space="preserve"> (결과 2와 같은 샘플)</w:t>
-      </w:r>
-    </w:p>
-    <w:p>
-      <w:pPr>
-        <w:pStyle w:val="ListParagraph"/>
-        <w:numPr>
-          <w:ilvl w:val="0"/>
-          <w:numId w:val="2"/>
-        </w:numPr>
-        <w:spacing w:after="80"/>
-      </w:pPr>
-      <w:r>
-        <w:t xml:space="preserve">저장 파일: </w:t>
-      </w:r>
-      <w:r>
-        <w:t xml:space="preserve">docs/ATAC-seq/modules/figures/module_results/peak_annotation_result_4.{png,svg}</w:t>
-      </w:r>
-    </w:p>
-    <w:p>
-      <w:pPr>
-        <w:spacing w:after="120"/>
-      </w:pPr>
-      <w:r>
-        <w:rPr>
-          <w:b/>
-          <w:bCs/>
-          <w:color w:val="B0B0B0"/>
-          <w:sz w:val="18"/>
-          <w:szCs w:val="18"/>
-        </w:rPr>
-        <w:t xml:space="preserve">[내부 메모 · 붙여 넣지 마세요] </w:t>
-      </w:r>
-      <w:r>
-        <w:rPr>
-          <w:color w:val="8A8F99"/>
-          <w:sz w:val="18"/>
-          <w:szCs w:val="18"/>
-        </w:rPr>
-        <w:t xml:space="preserve">그림: </w:t>
-      </w:r>
-      <w:r>
-        <w:rPr>
-          <w:color w:val="8A8F99"/>
-          <w:sz w:val="18"/>
-          <w:szCs w:val="18"/>
-        </w:rPr>
-        <w:t xml:space="preserve">docs/ATAC-seq/modules/figures/module_results/peak_annotation_result_4.png</w:t>
       </w:r>
     </w:p>
     <w:p>
@@ -24878,7 +24284,7 @@
         <w:spacing w:after="80"/>
       </w:pPr>
       <w:r>
-        <w:t xml:space="preserve">등록할 그림: </w:t>
+        <w:t xml:space="preserve">결과 파일: </w:t>
       </w:r>
       <w:r>
         <w:t xml:space="preserve">04_plots/PCA_plot.pdf</w:t>
@@ -24894,41 +24300,17 @@
         <w:spacing w:after="80"/>
       </w:pPr>
       <w:r>
-        <w:t xml:space="preserve">저장 파일: </w:t>
-      </w:r>
-      <w:r>
-        <w:t xml:space="preserve">docs/ATAC-seq/modules/figures/module_results/differential_accessibility_result_1.{png,svg}</w:t>
-      </w:r>
-    </w:p>
-    <w:p>
-      <w:pPr>
-        <w:spacing w:after="120"/>
-      </w:pPr>
+        <w:t xml:space="preserve">레전드(국문): </w:t>
+      </w:r>
       <w:r>
         <w:rPr>
           <w:b/>
           <w:bCs/>
-          <w:color w:val="B0B0B0"/>
-          <w:sz w:val="18"/>
-          <w:szCs w:val="18"/>
-        </w:rPr>
-        <w:t xml:space="preserve">[내부 메모 · 붙여 넣지 마세요] </w:t>
-      </w:r>
-      <w:r>
-        <w:rPr>
-          <w:color w:val="8A8F99"/>
-          <w:sz w:val="18"/>
-          <w:szCs w:val="18"/>
-        </w:rPr>
-        <w:t xml:space="preserve">그림: </w:t>
-      </w:r>
-      <w:r>
-        <w:rPr>
-          <w:color w:val="8A8F99"/>
-          <w:sz w:val="18"/>
-          <w:szCs w:val="18"/>
-        </w:rPr>
-        <w:t xml:space="preserve">docs/ATAC-seq/modules/figures/module_results/differential_accessibility_result_1.png</w:t>
+        </w:rPr>
+        <w:t xml:space="preserve">샘플 PCA.</w:t>
+      </w:r>
+      <w:r>
+        <w:t xml:space="preserve"> 변동이 큰 peak(최대 5,000개)의 log2 CPM으로 샘플을 2차원에 놓은 그림이다. 점 하나가 샘플 하나이고 색은 조건이며, 축 이름에 각 주성분이 설명하는 변동(%)이 붙는다. 같은 조건의 반복 샘플이 모이고 조건끼리 떨어져 있으면 조건 간 차이가 반복 간 차이보다 크다는 뜻이다. 샘플이 3개 이상일 때 만든다.</w:t>
       </w:r>
     </w:p>
     <w:p>
@@ -24941,17 +24323,29 @@
         <w:spacing w:after="80"/>
       </w:pPr>
       <w:r>
-        <w:t xml:space="preserve">레전드(국문): </w:t>
+        <w:t xml:space="preserve">레전드(영문): </w:t>
       </w:r>
       <w:r>
         <w:rPr>
           <w:b/>
           <w:bCs/>
         </w:rPr>
-        <w:t xml:space="preserve">샘플 PCA.</w:t>
-      </w:r>
-      <w:r>
-        <w:t xml:space="preserve"> 변동이 큰 peak(최대 5,000개)의 log2 CPM으로 샘플을 2차원에 놓은 그림이다. 점 하나가 샘플 하나이고 색은 조건이며, 축 이름에 각 주성분이 설명하는 변동(%)이 붙는다. 같은 조건의 반복 샘플이 모이고 조건끼리 떨어져 있으면 조건 간 차이가 반복 간 차이보다 크다는 뜻이다. 샘플이 3개 이상일 때 만든다.</w:t>
+        <w:t xml:space="preserve">Sample PCA.</w:t>
+      </w:r>
+      <w:r>
+        <w:t xml:space="preserve"> Samples placed in two dimensions by the log2 CPM of the most variable peaks (up to 5,000). Each point is a sample coloured by condition, and each axis label gives the variance explained (%). Replicates clustering together and conditions separating indicate that the condition effect exceeds replicate variation. Drawn with three or more samples.</w:t>
+      </w:r>
+    </w:p>
+    <w:p>
+      <w:pPr>
+        <w:spacing w:after="140"/>
+      </w:pPr>
+      <w:r>
+        <w:rPr>
+          <w:b/>
+          <w:bCs/>
+        </w:rPr>
+        <w:t xml:space="preserve">결과 2. 샘플 상관 heatmap</w:t>
       </w:r>
     </w:p>
     <w:p>
@@ -24964,29 +24358,10 @@
         <w:spacing w:after="80"/>
       </w:pPr>
       <w:r>
-        <w:t xml:space="preserve">레전드(영문): </w:t>
-      </w:r>
-      <w:r>
-        <w:rPr>
-          <w:b/>
-          <w:bCs/>
-        </w:rPr>
-        <w:t xml:space="preserve">Sample PCA.</w:t>
-      </w:r>
-      <w:r>
-        <w:t xml:space="preserve"> Samples placed in two dimensions by the log2 CPM of the most variable peaks (up to 5,000). Each point is a sample coloured by condition, and each axis label gives the variance explained (%). Replicates clustering together and conditions separating indicate that the condition effect exceeds replicate variation. Drawn with three or more samples.</w:t>
-      </w:r>
-    </w:p>
-    <w:p>
-      <w:pPr>
-        <w:spacing w:after="140"/>
-      </w:pPr>
-      <w:r>
-        <w:rPr>
-          <w:b/>
-          <w:bCs/>
-        </w:rPr>
-        <w:t xml:space="preserve">결과 2. 샘플 상관 heatmap</w:t>
+        <w:t xml:space="preserve">결과 파일: </w:t>
+      </w:r>
+      <w:r>
+        <w:t xml:space="preserve">04_plots/sample_correlation_heatmap.pdf</w:t>
       </w:r>
     </w:p>
     <w:p>
@@ -24999,10 +24374,17 @@
         <w:spacing w:after="80"/>
       </w:pPr>
       <w:r>
-        <w:t xml:space="preserve">등록할 그림: </w:t>
-      </w:r>
-      <w:r>
-        <w:t xml:space="preserve">04_plots/sample_correlation_heatmap.pdf</w:t>
+        <w:t xml:space="preserve">레전드(국문): </w:t>
+      </w:r>
+      <w:r>
+        <w:rPr>
+          <w:b/>
+          <w:bCs/>
+        </w:rPr>
+        <w:t xml:space="preserve">샘플 간 상관 heatmap.</w:t>
+      </w:r>
+      <w:r>
+        <w:t xml:space="preserve"> 모든 샘플 쌍의 Pearson 상관계수(log2 CPM 기준)를 칸마다 숫자와 색(연한 파랑 낮음, 진한 남색 높음)으로 보여 준다. 비슷한 샘플끼리 가깝게 놓이도록 계층 군집 순서로 정렬했다. 같은 조건의 반복끼리 상관이 가장 높아야 하며, 한 샘플만 다른 샘플과 상관이 낮으면 이상 샘플을 의심한다.</w:t>
       </w:r>
     </w:p>
     <w:p>
@@ -25015,41 +24397,29 @@
         <w:spacing w:after="80"/>
       </w:pPr>
       <w:r>
-        <w:t xml:space="preserve">저장 파일: </w:t>
-      </w:r>
-      <w:r>
-        <w:t xml:space="preserve">docs/ATAC-seq/modules/figures/module_results/differential_accessibility_result_2.{png,svg}</w:t>
-      </w:r>
-    </w:p>
-    <w:p>
-      <w:pPr>
-        <w:spacing w:after="120"/>
-      </w:pPr>
+        <w:t xml:space="preserve">레전드(영문): </w:t>
+      </w:r>
       <w:r>
         <w:rPr>
           <w:b/>
           <w:bCs/>
-          <w:color w:val="B0B0B0"/>
-          <w:sz w:val="18"/>
-          <w:szCs w:val="18"/>
-        </w:rPr>
-        <w:t xml:space="preserve">[내부 메모 · 붙여 넣지 마세요] </w:t>
-      </w:r>
-      <w:r>
-        <w:rPr>
-          <w:color w:val="8A8F99"/>
-          <w:sz w:val="18"/>
-          <w:szCs w:val="18"/>
-        </w:rPr>
-        <w:t xml:space="preserve">그림: </w:t>
-      </w:r>
-      <w:r>
-        <w:rPr>
-          <w:color w:val="8A8F99"/>
-          <w:sz w:val="18"/>
-          <w:szCs w:val="18"/>
-        </w:rPr>
-        <w:t xml:space="preserve">docs/ATAC-seq/modules/figures/module_results/differential_accessibility_result_2.png</w:t>
+        </w:rPr>
+        <w:t xml:space="preserve">Sample correlation heatmap.</w:t>
+      </w:r>
+      <w:r>
+        <w:t xml:space="preserve"> Pearson correlation (log2 CPM) for every pair of samples, shown as numbers and colour (light blue low, dark navy high), with samples ordered by hierarchical clustering so similar ones sit together. Replicates of the same condition should correlate most strongly; a single sample with low correlation to all others suggests an outlier.</w:t>
+      </w:r>
+    </w:p>
+    <w:p>
+      <w:pPr>
+        <w:spacing w:after="140"/>
+      </w:pPr>
+      <w:r>
+        <w:rPr>
+          <w:b/>
+          <w:bCs/>
+        </w:rPr>
+        <w:t xml:space="preserve">결과 3. MD plot</w:t>
       </w:r>
     </w:p>
     <w:p>
@@ -25062,17 +24432,10 @@
         <w:spacing w:after="80"/>
       </w:pPr>
       <w:r>
-        <w:t xml:space="preserve">레전드(국문): </w:t>
-      </w:r>
-      <w:r>
-        <w:rPr>
-          <w:b/>
-          <w:bCs/>
-        </w:rPr>
-        <w:t xml:space="preserve">샘플 간 상관 heatmap.</w:t>
-      </w:r>
-      <w:r>
-        <w:t xml:space="preserve"> 모든 샘플 쌍의 Pearson 상관계수(log2 CPM 기준)를 칸마다 숫자와 색(연한 파랑 낮음, 진한 남색 높음)으로 보여 준다. 비슷한 샘플끼리 가깝게 놓이도록 계층 군집 순서로 정렬했다. 같은 조건의 반복끼리 상관이 가장 높아야 하며, 한 샘플만 다른 샘플과 상관이 낮으면 이상 샘플을 의심한다.</w:t>
+        <w:t xml:space="preserve">결과 파일: </w:t>
+      </w:r>
+      <w:r>
+        <w:t xml:space="preserve">04_plots/MD_plot.pdf</w:t>
       </w:r>
     </w:p>
     <w:p>
@@ -25085,29 +24448,17 @@
         <w:spacing w:after="80"/>
       </w:pPr>
       <w:r>
-        <w:t xml:space="preserve">레전드(영문): </w:t>
+        <w:t xml:space="preserve">레전드(국문): </w:t>
       </w:r>
       <w:r>
         <w:rPr>
           <w:b/>
           <w:bCs/>
         </w:rPr>
-        <w:t xml:space="preserve">Sample correlation heatmap.</w:t>
-      </w:r>
-      <w:r>
-        <w:t xml:space="preserve"> Pearson correlation (log2 CPM) for every pair of samples, shown as numbers and colour (light blue low, dark navy high), with samples ordered by hierarchical clustering so similar ones sit together. Replicates of the same condition should correlate most strongly; a single sample with low correlation to all others suggests an outlier.</w:t>
-      </w:r>
-    </w:p>
-    <w:p>
-      <w:pPr>
-        <w:spacing w:after="140"/>
-      </w:pPr>
-      <w:r>
-        <w:rPr>
-          <w:b/>
-          <w:bCs/>
-        </w:rPr>
-        <w:t xml:space="preserve">결과 3. MD plot</w:t>
+        <w:t xml:space="preserve">조건 간 접근성 변화(MD plot).</w:t>
+      </w:r>
+      <w:r>
+        <w:t xml:space="preserve"> 점 하나가 peak 하나다. 가로축은 평균 접근성(average log CPM), 세로축은 조건 간 변화(log2 fold change)이며 빨간 점선이 0이다. 유의하게 열린 peak(Up)와 닫힌 peak(Down)가 색으로 구분된다. 대부분의 peak가 0 근처에 모이고 유의한 peak가 위아래로 갈라지면 정규화가 잘 된 것이다. 반복 샘플이 없으면 유의성 없이 fold change만 그린다.</w:t>
       </w:r>
     </w:p>
     <w:p>
@@ -25120,10 +24471,29 @@
         <w:spacing w:after="80"/>
       </w:pPr>
       <w:r>
-        <w:t xml:space="preserve">등록할 그림: </w:t>
-      </w:r>
-      <w:r>
-        <w:t xml:space="preserve">04_plots/MD_plot.pdf</w:t>
+        <w:t xml:space="preserve">레전드(영문): </w:t>
+      </w:r>
+      <w:r>
+        <w:rPr>
+          <w:b/>
+          <w:bCs/>
+        </w:rPr>
+        <w:t xml:space="preserve">Accessibility changes between conditions (MD plot).</w:t>
+      </w:r>
+      <w:r>
+        <w:t xml:space="preserve"> Each point is a peak, with mean accessibility (average log CPM) on the x-axis and the change between conditions (log2 fold change) on the y-axis; the red dashed line marks 0. Significantly gained (Up) and lost (Down) peaks are coloured. Most peaks centred on 0 with significant peaks splitting above and below indicate good normalization. Without replicates only the fold change is drawn, without significance.</w:t>
+      </w:r>
+    </w:p>
+    <w:p>
+      <w:pPr>
+        <w:spacing w:after="140"/>
+      </w:pPr>
+      <w:r>
+        <w:rPr>
+          <w:b/>
+          <w:bCs/>
+        </w:rPr>
+        <w:t xml:space="preserve">결과 4. GC 구간별 logFC</w:t>
       </w:r>
     </w:p>
     <w:p>
@@ -25136,112 +24506,7 @@
         <w:spacing w:after="80"/>
       </w:pPr>
       <w:r>
-        <w:t xml:space="preserve">저장 파일: </w:t>
-      </w:r>
-      <w:r>
-        <w:t xml:space="preserve">docs/ATAC-seq/modules/figures/module_results/differential_accessibility_result_3.{png,svg}</w:t>
-      </w:r>
-    </w:p>
-    <w:p>
-      <w:pPr>
-        <w:spacing w:after="120"/>
-      </w:pPr>
-      <w:r>
-        <w:rPr>
-          <w:b/>
-          <w:bCs/>
-          <w:color w:val="B0B0B0"/>
-          <w:sz w:val="18"/>
-          <w:szCs w:val="18"/>
-        </w:rPr>
-        <w:t xml:space="preserve">[내부 메모 · 붙여 넣지 마세요] </w:t>
-      </w:r>
-      <w:r>
-        <w:rPr>
-          <w:color w:val="8A8F99"/>
-          <w:sz w:val="18"/>
-          <w:szCs w:val="18"/>
-        </w:rPr>
-        <w:t xml:space="preserve">그림: </w:t>
-      </w:r>
-      <w:r>
-        <w:rPr>
-          <w:color w:val="8A8F99"/>
-          <w:sz w:val="18"/>
-          <w:szCs w:val="18"/>
-        </w:rPr>
-        <w:t xml:space="preserve">docs/ATAC-seq/modules/figures/module_results/differential_accessibility_result_3.png</w:t>
-      </w:r>
-    </w:p>
-    <w:p>
-      <w:pPr>
-        <w:pStyle w:val="ListParagraph"/>
-        <w:numPr>
-          <w:ilvl w:val="0"/>
-          <w:numId w:val="2"/>
-        </w:numPr>
-        <w:spacing w:after="80"/>
-      </w:pPr>
-      <w:r>
-        <w:t xml:space="preserve">레전드(국문): </w:t>
-      </w:r>
-      <w:r>
-        <w:rPr>
-          <w:b/>
-          <w:bCs/>
-        </w:rPr>
-        <w:t xml:space="preserve">조건 간 접근성 변화(MD plot).</w:t>
-      </w:r>
-      <w:r>
-        <w:t xml:space="preserve"> 점 하나가 peak 하나다. 가로축은 평균 접근성(average log CPM), 세로축은 조건 간 변화(log2 fold change)이며 빨간 점선이 0이다. 유의하게 열린 peak(Up)와 닫힌 peak(Down)가 색으로 구분된다. 대부분의 peak가 0 근처에 모이고 유의한 peak가 위아래로 갈라지면 정규화가 잘 된 것이다. 반복 샘플이 없으면 유의성 없이 fold change만 그린다.</w:t>
-      </w:r>
-    </w:p>
-    <w:p>
-      <w:pPr>
-        <w:pStyle w:val="ListParagraph"/>
-        <w:numPr>
-          <w:ilvl w:val="0"/>
-          <w:numId w:val="2"/>
-        </w:numPr>
-        <w:spacing w:after="80"/>
-      </w:pPr>
-      <w:r>
-        <w:t xml:space="preserve">레전드(영문): </w:t>
-      </w:r>
-      <w:r>
-        <w:rPr>
-          <w:b/>
-          <w:bCs/>
-        </w:rPr>
-        <w:t xml:space="preserve">Accessibility changes between conditions (MD plot).</w:t>
-      </w:r>
-      <w:r>
-        <w:t xml:space="preserve"> Each point is a peak, with mean accessibility (average log CPM) on the x-axis and the change between conditions (log2 fold change) on the y-axis; the red dashed line marks 0. Significantly gained (Up) and lost (Down) peaks are coloured. Most peaks centred on 0 with significant peaks splitting above and below indicate good normalization. Without replicates only the fold change is drawn, without significance.</w:t>
-      </w:r>
-    </w:p>
-    <w:p>
-      <w:pPr>
-        <w:spacing w:after="140"/>
-      </w:pPr>
-      <w:r>
-        <w:rPr>
-          <w:b/>
-          <w:bCs/>
-        </w:rPr>
-        <w:t xml:space="preserve">결과 4. GC 구간별 logFC</w:t>
-      </w:r>
-    </w:p>
-    <w:p>
-      <w:pPr>
-        <w:pStyle w:val="ListParagraph"/>
-        <w:numPr>
-          <w:ilvl w:val="0"/>
-          <w:numId w:val="2"/>
-        </w:numPr>
-        <w:spacing w:after="80"/>
-      </w:pPr>
-      <w:r>
-        <w:t xml:space="preserve">등록할 그림: </w:t>
+        <w:t xml:space="preserve">결과 파일: </w:t>
       </w:r>
       <w:r>
         <w:t xml:space="preserve">04_plots/logFC_by_GC_bin_TMM.pdf</w:t>
@@ -25260,53 +24525,6 @@
       </w:r>
       <w:r>
         <w:t xml:space="preserve"> 그림과 비교)</w:t>
-      </w:r>
-    </w:p>
-    <w:p>
-      <w:pPr>
-        <w:pStyle w:val="ListParagraph"/>
-        <w:numPr>
-          <w:ilvl w:val="0"/>
-          <w:numId w:val="2"/>
-        </w:numPr>
-        <w:spacing w:after="80"/>
-      </w:pPr>
-      <w:r>
-        <w:t xml:space="preserve">저장 파일: </w:t>
-      </w:r>
-      <w:r>
-        <w:t xml:space="preserve">docs/ATAC-seq/modules/figures/module_results/differential_accessibility_result_4.{png,svg}</w:t>
-      </w:r>
-    </w:p>
-    <w:p>
-      <w:pPr>
-        <w:spacing w:after="120"/>
-      </w:pPr>
-      <w:r>
-        <w:rPr>
-          <w:b/>
-          <w:bCs/>
-          <w:color w:val="B0B0B0"/>
-          <w:sz w:val="18"/>
-          <w:szCs w:val="18"/>
-        </w:rPr>
-        <w:t xml:space="preserve">[내부 메모 · 붙여 넣지 마세요] </w:t>
-      </w:r>
-      <w:r>
-        <w:rPr>
-          <w:color w:val="8A8F99"/>
-          <w:sz w:val="18"/>
-          <w:szCs w:val="18"/>
-        </w:rPr>
-        <w:t xml:space="preserve">그림: </w:t>
-      </w:r>
-      <w:r>
-        <w:rPr>
-          <w:color w:val="8A8F99"/>
-          <w:sz w:val="18"/>
-          <w:szCs w:val="18"/>
-        </w:rPr>
-        <w:t xml:space="preserve">docs/ATAC-seq/modules/figures/module_results/differential_accessibility_result_4.png</w:t>
       </w:r>
     </w:p>
     <w:p>
@@ -30235,7 +29453,7 @@
         <w:spacing w:after="80"/>
       </w:pPr>
       <w:r>
-        <w:t xml:space="preserve">등록할 그림: </w:t>
+        <w:t xml:space="preserve">결과 파일: </w:t>
       </w:r>
       <w:r>
         <w:t xml:space="preserve">02_binned_enrichment/binned_motif_heatmap.pdf</w:t>
@@ -30251,41 +29469,17 @@
         <w:spacing w:after="80"/>
       </w:pPr>
       <w:r>
-        <w:t xml:space="preserve">저장 파일: </w:t>
-      </w:r>
-      <w:r>
-        <w:t xml:space="preserve">docs/ATAC-seq/modules/figures/module_results/atac_motif_result_1.{png,svg}</w:t>
-      </w:r>
-    </w:p>
-    <w:p>
-      <w:pPr>
-        <w:spacing w:after="120"/>
-      </w:pPr>
+        <w:t xml:space="preserve">레전드(국문): </w:t>
+      </w:r>
       <w:r>
         <w:rPr>
           <w:b/>
           <w:bCs/>
-          <w:color w:val="B0B0B0"/>
-          <w:sz w:val="18"/>
-          <w:szCs w:val="18"/>
-        </w:rPr>
-        <w:t xml:space="preserve">[내부 메모 · 붙여 넣지 마세요] </w:t>
-      </w:r>
-      <w:r>
-        <w:rPr>
-          <w:color w:val="8A8F99"/>
-          <w:sz w:val="18"/>
-          <w:szCs w:val="18"/>
-        </w:rPr>
-        <w:t xml:space="preserve">그림: </w:t>
-      </w:r>
-      <w:r>
-        <w:rPr>
-          <w:color w:val="8A8F99"/>
-          <w:sz w:val="18"/>
-          <w:szCs w:val="18"/>
-        </w:rPr>
-        <w:t xml:space="preserve">docs/ATAC-seq/modules/figures/module_results/atac_motif_result_1.png</w:t>
+        </w:rPr>
+        <w:t xml:space="preserve">접근성 변화 구간별 모티프 농축.</w:t>
+      </w:r>
+      <w:r>
+        <w:t xml:space="preserve"> peak를 접근성 변화(log2 fold change) 크기에 따라 여러 구간(bin)으로 나누고, 구간마다 각 전사인자 모티프가 배경보다 얼마나 많은지를 색으로 보여 준다. 행은 유의하게 농축된 모티프이며, 서로 비슷한 모티프끼리 묶어 정렬했고 왼쪽에 서열 로고와 GC 비율을 붙였다. 첫 heatmap은 농축도(log2 enrichment; 빨강 농축, 파랑 결핍), 둘째는 보정 p-value(−log10; 진할수록 유의)다. 열린 쪽 구간에서만 진하게 나타나는 모티프는 조건 변화로 활성이 커진 전사인자의 후보다.</w:t>
       </w:r>
     </w:p>
     <w:p>
@@ -30298,17 +29492,29 @@
         <w:spacing w:after="80"/>
       </w:pPr>
       <w:r>
-        <w:t xml:space="preserve">레전드(국문): </w:t>
+        <w:t xml:space="preserve">레전드(영문): </w:t>
       </w:r>
       <w:r>
         <w:rPr>
           <w:b/>
           <w:bCs/>
         </w:rPr>
-        <w:t xml:space="preserve">접근성 변화 구간별 모티프 농축.</w:t>
-      </w:r>
-      <w:r>
-        <w:t xml:space="preserve"> peak를 접근성 변화(log2 fold change) 크기에 따라 여러 구간(bin)으로 나누고, 구간마다 각 전사인자 모티프가 배경보다 얼마나 많은지를 색으로 보여 준다. 행은 유의하게 농축된 모티프이며, 서로 비슷한 모티프끼리 묶어 정렬했고 왼쪽에 서열 로고와 GC 비율을 붙였다. 첫 heatmap은 농축도(log2 enrichment; 빨강 농축, 파랑 결핍), 둘째는 보정 p-value(−log10; 진할수록 유의)다. 열린 쪽 구간에서만 진하게 나타나는 모티프는 조건 변화로 활성이 커진 전사인자의 후보다.</w:t>
+        <w:t xml:space="preserve">Motif enrichment across bins of accessibility change.</w:t>
+      </w:r>
+      <w:r>
+        <w:t xml:space="preserve"> Peaks are grouped into bins by log2 fold change in accessibility, and the colour shows how strongly each transcription factor motif is enriched in each bin relative to background. Rows are significantly enriched motifs, clustered by motif similarity and shown with sequence logos and GC content. The first heatmap is log2 enrichment (red enriched, blue depleted) and the second the adjusted p-value (−log10; darker is more significant). Motifs enriched only in the gained-accessibility bins point to transcription factors that become more active.</w:t>
+      </w:r>
+    </w:p>
+    <w:p>
+      <w:pPr>
+        <w:spacing w:after="140"/>
+      </w:pPr>
+      <w:r>
+        <w:rPr>
+          <w:b/>
+          <w:bCs/>
+        </w:rPr>
+        <w:t xml:space="preserve">결과 2. logFC 구간 나누기</w:t>
       </w:r>
     </w:p>
     <w:p>
@@ -30321,29 +29527,10 @@
         <w:spacing w:after="80"/>
       </w:pPr>
       <w:r>
-        <w:t xml:space="preserve">레전드(영문): </w:t>
-      </w:r>
-      <w:r>
-        <w:rPr>
-          <w:b/>
-          <w:bCs/>
-        </w:rPr>
-        <w:t xml:space="preserve">Motif enrichment across bins of accessibility change.</w:t>
-      </w:r>
-      <w:r>
-        <w:t xml:space="preserve"> Peaks are grouped into bins by log2 fold change in accessibility, and the colour shows how strongly each transcription factor motif is enriched in each bin relative to background. Rows are significantly enriched motifs, clustered by motif similarity and shown with sequence logos and GC content. The first heatmap is log2 enrichment (red enriched, blue depleted) and the second the adjusted p-value (−log10; darker is more significant). Motifs enriched only in the gained-accessibility bins point to transcription factors that become more active.</w:t>
-      </w:r>
-    </w:p>
-    <w:p>
-      <w:pPr>
-        <w:spacing w:after="140"/>
-      </w:pPr>
-      <w:r>
-        <w:rPr>
-          <w:b/>
-          <w:bCs/>
-        </w:rPr>
-        <w:t xml:space="preserve">결과 2. logFC 구간 나누기</w:t>
+        <w:t xml:space="preserve">결과 파일: </w:t>
+      </w:r>
+      <w:r>
+        <w:t xml:space="preserve">01_qc/bin_density.pdf</w:t>
       </w:r>
     </w:p>
     <w:p>
@@ -30356,10 +29543,17 @@
         <w:spacing w:after="80"/>
       </w:pPr>
       <w:r>
-        <w:t xml:space="preserve">등록할 그림: </w:t>
-      </w:r>
-      <w:r>
-        <w:t xml:space="preserve">01_qc/bin_density.pdf</w:t>
+        <w:t xml:space="preserve">레전드(국문): </w:t>
+      </w:r>
+      <w:r>
+        <w:rPr>
+          <w:b/>
+          <w:bCs/>
+        </w:rPr>
+        <w:t xml:space="preserve">logFC 분포와 구간(bin).</w:t>
+      </w:r>
+      <w:r>
+        <w:t xml:space="preserve"> 모든 peak의 log2 fold change 분포(가로축 logFC, 세로축 밀도) 위에 구간 경계를 색으로 나누어 보여 준다. 구간마다 peak 수가 같도록 나누며, 변화가 작은 peak(|logFC| &lt; min_abs_logfc)는 가운데 하나의 구간으로 묶는다. 결과 1의 heatmap 열이 이 구간이다.</w:t>
       </w:r>
     </w:p>
     <w:p>
@@ -30372,41 +29566,29 @@
         <w:spacing w:after="80"/>
       </w:pPr>
       <w:r>
-        <w:t xml:space="preserve">저장 파일: </w:t>
-      </w:r>
-      <w:r>
-        <w:t xml:space="preserve">docs/ATAC-seq/modules/figures/module_results/atac_motif_result_2.{png,svg}</w:t>
-      </w:r>
-    </w:p>
-    <w:p>
-      <w:pPr>
-        <w:spacing w:after="120"/>
-      </w:pPr>
+        <w:t xml:space="preserve">레전드(영문): </w:t>
+      </w:r>
       <w:r>
         <w:rPr>
           <w:b/>
           <w:bCs/>
-          <w:color w:val="B0B0B0"/>
-          <w:sz w:val="18"/>
-          <w:szCs w:val="18"/>
-        </w:rPr>
-        <w:t xml:space="preserve">[내부 메모 · 붙여 넣지 마세요] </w:t>
-      </w:r>
-      <w:r>
-        <w:rPr>
-          <w:color w:val="8A8F99"/>
-          <w:sz w:val="18"/>
-          <w:szCs w:val="18"/>
-        </w:rPr>
-        <w:t xml:space="preserve">그림: </w:t>
-      </w:r>
-      <w:r>
-        <w:rPr>
-          <w:color w:val="8A8F99"/>
-          <w:sz w:val="18"/>
-          <w:szCs w:val="18"/>
-        </w:rPr>
-        <w:t xml:space="preserve">docs/ATAC-seq/modules/figures/module_results/atac_motif_result_2.png</w:t>
+        </w:rPr>
+        <w:t xml:space="preserve">logFC distribution and bins.</w:t>
+      </w:r>
+      <w:r>
+        <w:t xml:space="preserve"> The distribution of log2 fold change over all peaks (x-axis logFC, y-axis density), coloured by bin. Bins hold equal numbers of peaks, and peaks with small changes (|logFC| &lt; min_abs_logfc) are pooled into one central bin. These bins are the columns of the heatmap in result 1.</w:t>
+      </w:r>
+    </w:p>
+    <w:p>
+      <w:pPr>
+        <w:spacing w:after="140"/>
+      </w:pPr>
+      <w:r>
+        <w:rPr>
+          <w:b/>
+          <w:bCs/>
+        </w:rPr>
+        <w:t xml:space="preserve">결과 3. 모티프 선택 확률(회귀)</w:t>
       </w:r>
     </w:p>
     <w:p>
@@ -30419,17 +29601,13 @@
         <w:spacing w:after="80"/>
       </w:pPr>
       <w:r>
-        <w:t xml:space="preserve">레전드(국문): </w:t>
-      </w:r>
-      <w:r>
-        <w:rPr>
-          <w:b/>
-          <w:bCs/>
-        </w:rPr>
-        <w:t xml:space="preserve">logFC 분포와 구간(bin).</w:t>
-      </w:r>
-      <w:r>
-        <w:t xml:space="preserve"> 모든 peak의 log2 fold change 분포(가로축 logFC, 세로축 밀도) 위에 구간 경계를 색으로 나누어 보여 준다. 구간마다 peak 수가 같도록 나누며, 변화가 작은 peak(|logFC| &lt; min_abs_logfc)는 가운데 하나의 구간으로 묶는다. 결과 1의 heatmap 열이 이 구간이다.</w:t>
+        <w:t xml:space="preserve">결과 파일: </w:t>
+      </w:r>
+      <w:r>
+        <w:t xml:space="preserve">04_regression/selection_probability.pdf</w:t>
+      </w:r>
+      <w:r>
+        <w:t xml:space="preserve"> (run_regression=TRUE일 때)</w:t>
       </w:r>
     </w:p>
     <w:p>
@@ -30442,29 +29620,17 @@
         <w:spacing w:after="80"/>
       </w:pPr>
       <w:r>
-        <w:t xml:space="preserve">레전드(영문): </w:t>
+        <w:t xml:space="preserve">레전드(국문): </w:t>
       </w:r>
       <w:r>
         <w:rPr>
           <w:b/>
           <w:bCs/>
         </w:rPr>
-        <w:t xml:space="preserve">logFC distribution and bins.</w:t>
-      </w:r>
-      <w:r>
-        <w:t xml:space="preserve"> The distribution of log2 fold change over all peaks (x-axis logFC, y-axis density), coloured by bin. Bins hold equal numbers of peaks, and peaks with small changes (|logFC| &lt; min_abs_logfc) are pooled into one central bin. These bins are the columns of the heatmap in result 1.</w:t>
-      </w:r>
-    </w:p>
-    <w:p>
-      <w:pPr>
-        <w:spacing w:after="140"/>
-      </w:pPr>
-      <w:r>
-        <w:rPr>
-          <w:b/>
-          <w:bCs/>
-        </w:rPr>
-        <w:t xml:space="preserve">결과 3. 모티프 선택 확률(회귀)</w:t>
+        <w:t xml:space="preserve">안정성 선택 회귀로 고른 전사인자.</w:t>
+      </w:r>
+      <w:r>
+        <w:t xml:space="preserve"> 모든 모티프를 함께 넣어 peak의 logFC를 설명하는 회귀(randomized lasso stability selection)에서, 각 모티프가 선택된 확률을 막대로 보여 준다. 막대 방향은 그 모티프가 접근성 증가(위)와 감소(아래) 중 어느 쪽과 관련되는지이며, 점선은 선택 기준(stabsel_cutoff, 기본 0.8)이다. 기준을 넘은 모티프는 비슷한 모티프끼리 겹치는 효과를 걸러낸 뒤에도 남은 핵심 전사인자 후보다.</w:t>
       </w:r>
     </w:p>
     <w:p>
@@ -30477,13 +29643,29 @@
         <w:spacing w:after="80"/>
       </w:pPr>
       <w:r>
-        <w:t xml:space="preserve">등록할 그림: </w:t>
-      </w:r>
-      <w:r>
-        <w:t xml:space="preserve">04_regression/selection_probability.pdf</w:t>
-      </w:r>
-      <w:r>
-        <w:t xml:space="preserve"> (run_regression=TRUE일 때)</w:t>
+        <w:t xml:space="preserve">레전드(영문): </w:t>
+      </w:r>
+      <w:r>
+        <w:rPr>
+          <w:b/>
+          <w:bCs/>
+        </w:rPr>
+        <w:t xml:space="preserve">Transcription factors chosen by stability-selection regression.</w:t>
+      </w:r>
+      <w:r>
+        <w:t xml:space="preserve"> In a regression that explains peak logFC with all motifs together (randomized lasso stability selection), the bars show how often each motif was selected. Bar direction shows whether the motif is linked to gained (up) or lost (down) accessibility, and the dashed line is the selection cutoff (stabsel_cutoff, default 0.8). Motifs above the cutoff are core candidates that remain after redundancy between similar motifs is removed.</w:t>
+      </w:r>
+    </w:p>
+    <w:p>
+      <w:pPr>
+        <w:spacing w:after="140"/>
+      </w:pPr>
+      <w:r>
+        <w:rPr>
+          <w:b/>
+          <w:bCs/>
+        </w:rPr>
+        <w:t xml:space="preserve">결과 4. k-mer와 모티프 유사도</w:t>
       </w:r>
     </w:p>
     <w:p>
@@ -30496,165 +29678,13 @@
         <w:spacing w:after="80"/>
       </w:pPr>
       <w:r>
-        <w:t xml:space="preserve">저장 파일: </w:t>
-      </w:r>
-      <w:r>
-        <w:t xml:space="preserve">docs/ATAC-seq/modules/figures/module_results/atac_motif_result_3.{png,svg}</w:t>
-      </w:r>
-    </w:p>
-    <w:p>
-      <w:pPr>
-        <w:spacing w:after="120"/>
-      </w:pPr>
-      <w:r>
-        <w:rPr>
-          <w:b/>
-          <w:bCs/>
-          <w:color w:val="B0B0B0"/>
-          <w:sz w:val="18"/>
-          <w:szCs w:val="18"/>
-        </w:rPr>
-        <w:t xml:space="preserve">[내부 메모 · 붙여 넣지 마세요] </w:t>
-      </w:r>
-      <w:r>
-        <w:rPr>
-          <w:color w:val="8A8F99"/>
-          <w:sz w:val="18"/>
-          <w:szCs w:val="18"/>
-        </w:rPr>
-        <w:t xml:space="preserve">그림: </w:t>
-      </w:r>
-      <w:r>
-        <w:rPr>
-          <w:color w:val="8A8F99"/>
-          <w:sz w:val="18"/>
-          <w:szCs w:val="18"/>
-        </w:rPr>
-        <w:t xml:space="preserve">docs/ATAC-seq/modules/figures/module_results/atac_motif_result_3.png</w:t>
-      </w:r>
-    </w:p>
-    <w:p>
-      <w:pPr>
-        <w:pStyle w:val="ListParagraph"/>
-        <w:numPr>
-          <w:ilvl w:val="0"/>
-          <w:numId w:val="2"/>
-        </w:numPr>
-        <w:spacing w:after="80"/>
-      </w:pPr>
-      <w:r>
-        <w:t xml:space="preserve">레전드(국문): </w:t>
-      </w:r>
-      <w:r>
-        <w:rPr>
-          <w:b/>
-          <w:bCs/>
-        </w:rPr>
-        <w:t xml:space="preserve">안정성 선택 회귀로 고른 전사인자.</w:t>
-      </w:r>
-      <w:r>
-        <w:t xml:space="preserve"> 모든 모티프를 함께 넣어 peak의 logFC를 설명하는 회귀(randomized lasso stability selection)에서, 각 모티프가 선택된 확률을 막대로 보여 준다. 막대 방향은 그 모티프가 접근성 증가(위)와 감소(아래) 중 어느 쪽과 관련되는지이며, 점선은 선택 기준(stabsel_cutoff, 기본 0.8)이다. 기준을 넘은 모티프는 비슷한 모티프끼리 겹치는 효과를 걸러낸 뒤에도 남은 핵심 전사인자 후보다.</w:t>
-      </w:r>
-    </w:p>
-    <w:p>
-      <w:pPr>
-        <w:pStyle w:val="ListParagraph"/>
-        <w:numPr>
-          <w:ilvl w:val="0"/>
-          <w:numId w:val="2"/>
-        </w:numPr>
-        <w:spacing w:after="80"/>
-      </w:pPr>
-      <w:r>
-        <w:t xml:space="preserve">레전드(영문): </w:t>
-      </w:r>
-      <w:r>
-        <w:rPr>
-          <w:b/>
-          <w:bCs/>
-        </w:rPr>
-        <w:t xml:space="preserve">Transcription factors chosen by stability-selection regression.</w:t>
-      </w:r>
-      <w:r>
-        <w:t xml:space="preserve"> In a regression that explains peak logFC with all motifs together (randomized lasso stability selection), the bars show how often each motif was selected. Bar direction shows whether the motif is linked to gained (up) or lost (down) accessibility, and the dashed line is the selection cutoff (stabsel_cutoff, default 0.8). Motifs above the cutoff are core candidates that remain after redundancy between similar motifs is removed.</w:t>
-      </w:r>
-    </w:p>
-    <w:p>
-      <w:pPr>
-        <w:spacing w:after="140"/>
-      </w:pPr>
-      <w:r>
-        <w:rPr>
-          <w:b/>
-          <w:bCs/>
-        </w:rPr>
-        <w:t xml:space="preserve">결과 4. k-mer와 모티프 유사도</w:t>
-      </w:r>
-    </w:p>
-    <w:p>
-      <w:pPr>
-        <w:pStyle w:val="ListParagraph"/>
-        <w:numPr>
-          <w:ilvl w:val="0"/>
-          <w:numId w:val="2"/>
-        </w:numPr>
-        <w:spacing w:after="80"/>
-      </w:pPr>
-      <w:r>
-        <w:t xml:space="preserve">등록할 그림: </w:t>
+        <w:t xml:space="preserve">결과 파일: </w:t>
       </w:r>
       <w:r>
         <w:t xml:space="preserve">03_kmer/kmer_motif_similarity.pdf</w:t>
       </w:r>
       <w:r>
         <w:t xml:space="preserve"> (run_kmer=TRUE일 때)</w:t>
-      </w:r>
-    </w:p>
-    <w:p>
-      <w:pPr>
-        <w:pStyle w:val="ListParagraph"/>
-        <w:numPr>
-          <w:ilvl w:val="0"/>
-          <w:numId w:val="2"/>
-        </w:numPr>
-        <w:spacing w:after="80"/>
-      </w:pPr>
-      <w:r>
-        <w:t xml:space="preserve">저장 파일: </w:t>
-      </w:r>
-      <w:r>
-        <w:t xml:space="preserve">docs/ATAC-seq/modules/figures/module_results/atac_motif_result_4.{png,svg}</w:t>
-      </w:r>
-    </w:p>
-    <w:p>
-      <w:pPr>
-        <w:spacing w:after="120"/>
-      </w:pPr>
-      <w:r>
-        <w:rPr>
-          <w:b/>
-          <w:bCs/>
-          <w:color w:val="B0B0B0"/>
-          <w:sz w:val="18"/>
-          <w:szCs w:val="18"/>
-        </w:rPr>
-        <w:t xml:space="preserve">[내부 메모 · 붙여 넣지 마세요] </w:t>
-      </w:r>
-      <w:r>
-        <w:rPr>
-          <w:color w:val="8A8F99"/>
-          <w:sz w:val="18"/>
-          <w:szCs w:val="18"/>
-        </w:rPr>
-        <w:t xml:space="preserve">그림: </w:t>
-      </w:r>
-      <w:r>
-        <w:rPr>
-          <w:color w:val="8A8F99"/>
-          <w:sz w:val="18"/>
-          <w:szCs w:val="18"/>
-        </w:rPr>
-        <w:t xml:space="preserve">docs/ATAC-seq/modules/figures/module_results/atac_motif_result_4.png</w:t>
       </w:r>
     </w:p>
     <w:p>
@@ -34079,7 +33109,7 @@
         <w:spacing w:after="80"/>
       </w:pPr>
       <w:r>
-        <w:t xml:space="preserve">등록할 그림: </w:t>
+        <w:t xml:space="preserve">결과 파일: </w:t>
       </w:r>
       <w:r>
         <w:t xml:space="preserve">04_BINDetect/bindetect_figures.pdf</w:t>
@@ -34098,41 +33128,17 @@
         <w:spacing w:after="80"/>
       </w:pPr>
       <w:r>
-        <w:t xml:space="preserve">저장 파일: </w:t>
-      </w:r>
-      <w:r>
-        <w:t xml:space="preserve">docs/ATAC-seq/modules/figures/module_results/tf_footprinting_result_1.{png,svg}</w:t>
-      </w:r>
-    </w:p>
-    <w:p>
-      <w:pPr>
-        <w:spacing w:after="120"/>
-      </w:pPr>
+        <w:t xml:space="preserve">레전드(국문): </w:t>
+      </w:r>
       <w:r>
         <w:rPr>
           <w:b/>
           <w:bCs/>
-          <w:color w:val="B0B0B0"/>
-          <w:sz w:val="18"/>
-          <w:szCs w:val="18"/>
-        </w:rPr>
-        <w:t xml:space="preserve">[내부 메모 · 붙여 넣지 마세요] </w:t>
-      </w:r>
-      <w:r>
-        <w:rPr>
-          <w:color w:val="8A8F99"/>
-          <w:sz w:val="18"/>
-          <w:szCs w:val="18"/>
-        </w:rPr>
-        <w:t xml:space="preserve">그림: </w:t>
-      </w:r>
-      <w:r>
-        <w:rPr>
-          <w:color w:val="8A8F99"/>
-          <w:sz w:val="18"/>
-          <w:szCs w:val="18"/>
-        </w:rPr>
-        <w:t xml:space="preserve">docs/ATAC-seq/modules/figures/module_results/tf_footprinting_result_1.png</w:t>
+        </w:rPr>
+        <w:t xml:space="preserve">조건 간 전사인자 결합 변화(BINDetect volcano plot).</w:t>
+      </w:r>
+      <w:r>
+        <w:t xml:space="preserve"> 점 하나가 전사인자(모티프) 하나다. 가로축은 두 조건 사이의 결합 점수 차이(differential binding score)다. 조건 이름을 알파벳순으로 놓았을 때 양수(오른쪽, 빨강)는 첫 번째 조건에서, 음수(왼쪽, 파랑)는 두 번째 조건에서 결합이 더 강하다는 뜻이다. 세로축은 그 차이의 유의성(−log10 p-value)이며, 변화가 크거나 유의한 전사인자는 색과 이름으로 표시된다.</w:t>
       </w:r>
     </w:p>
     <w:p>
@@ -34145,17 +33151,29 @@
         <w:spacing w:after="80"/>
       </w:pPr>
       <w:r>
-        <w:t xml:space="preserve">레전드(국문): </w:t>
+        <w:t xml:space="preserve">레전드(영문): </w:t>
       </w:r>
       <w:r>
         <w:rPr>
           <w:b/>
           <w:bCs/>
         </w:rPr>
-        <w:t xml:space="preserve">조건 간 전사인자 결합 변화(BINDetect volcano plot).</w:t>
-      </w:r>
-      <w:r>
-        <w:t xml:space="preserve"> 점 하나가 전사인자(모티프) 하나다. 가로축은 두 조건 사이의 결합 점수 차이(differential binding score)다. 조건 이름을 알파벳순으로 놓았을 때 양수(오른쪽, 빨강)는 첫 번째 조건에서, 음수(왼쪽, 파랑)는 두 번째 조건에서 결합이 더 강하다는 뜻이다. 세로축은 그 차이의 유의성(−log10 p-value)이며, 변화가 크거나 유의한 전사인자는 색과 이름으로 표시된다.</w:t>
+        <w:t xml:space="preserve">Differential transcription factor binding between conditions (BINDetect volcano plot).</w:t>
+      </w:r>
+      <w:r>
+        <w:t xml:space="preserve"> Each point is one transcription factor motif. The x-axis is the differential binding score between the two conditions; with the condition names in alphabetical order, positive scores (right, red) mean stronger binding in the first condition and negative scores (left, blue) in the second. The y-axis is its significance (−log10 p-value), and factors with large or significant changes are coloured and labelled.</w:t>
+      </w:r>
+    </w:p>
+    <w:p>
+      <w:pPr>
+        <w:spacing w:after="140"/>
+      </w:pPr>
+      <w:r>
+        <w:rPr>
+          <w:b/>
+          <w:bCs/>
+        </w:rPr>
+        <w:t xml:space="preserve">결과 2. 조건별 footprint 점수 분포</w:t>
       </w:r>
     </w:p>
     <w:p>
@@ -34168,95 +33186,13 @@
         <w:spacing w:after="80"/>
       </w:pPr>
       <w:r>
-        <w:t xml:space="preserve">레전드(영문): </w:t>
-      </w:r>
-      <w:r>
-        <w:rPr>
-          <w:b/>
-          <w:bCs/>
-        </w:rPr>
-        <w:t xml:space="preserve">Differential transcription factor binding between conditions (BINDetect volcano plot).</w:t>
-      </w:r>
-      <w:r>
-        <w:t xml:space="preserve"> Each point is one transcription factor motif. The x-axis is the differential binding score between the two conditions; with the condition names in alphabetical order, positive scores (right, red) mean stronger binding in the first condition and negative scores (left, blue) in the second. The y-axis is its significance (−log10 p-value), and factors with large or significant changes are coloured and labelled.</w:t>
-      </w:r>
-    </w:p>
-    <w:p>
-      <w:pPr>
-        <w:spacing w:after="140"/>
-      </w:pPr>
-      <w:r>
-        <w:rPr>
-          <w:b/>
-          <w:bCs/>
-        </w:rPr>
-        <w:t xml:space="preserve">결과 2. 조건별 footprint 점수 분포</w:t>
-      </w:r>
-    </w:p>
-    <w:p>
-      <w:pPr>
-        <w:pStyle w:val="ListParagraph"/>
-        <w:numPr>
-          <w:ilvl w:val="0"/>
-          <w:numId w:val="2"/>
-        </w:numPr>
-        <w:spacing w:after="80"/>
-      </w:pPr>
-      <w:r>
-        <w:t xml:space="preserve">등록할 그림: </w:t>
+        <w:t xml:space="preserve">결과 파일: </w:t>
       </w:r>
       <w:r>
         <w:t xml:space="preserve">04_BINDetect/bindetect_figures.pdf</w:t>
       </w:r>
       <w:r>
         <w:t xml:space="preserve">의 점수 분포 쪽(정규화 후, Normalized)</w:t>
-      </w:r>
-    </w:p>
-    <w:p>
-      <w:pPr>
-        <w:pStyle w:val="ListParagraph"/>
-        <w:numPr>
-          <w:ilvl w:val="0"/>
-          <w:numId w:val="2"/>
-        </w:numPr>
-        <w:spacing w:after="80"/>
-      </w:pPr>
-      <w:r>
-        <w:t xml:space="preserve">저장 파일: </w:t>
-      </w:r>
-      <w:r>
-        <w:t xml:space="preserve">docs/ATAC-seq/modules/figures/module_results/tf_footprinting_result_2.{png,svg}</w:t>
-      </w:r>
-    </w:p>
-    <w:p>
-      <w:pPr>
-        <w:spacing w:after="120"/>
-      </w:pPr>
-      <w:r>
-        <w:rPr>
-          <w:b/>
-          <w:bCs/>
-          <w:color w:val="B0B0B0"/>
-          <w:sz w:val="18"/>
-          <w:szCs w:val="18"/>
-        </w:rPr>
-        <w:t xml:space="preserve">[내부 메모 · 붙여 넣지 마세요] </w:t>
-      </w:r>
-      <w:r>
-        <w:rPr>
-          <w:color w:val="8A8F99"/>
-          <w:sz w:val="18"/>
-          <w:szCs w:val="18"/>
-        </w:rPr>
-        <w:t xml:space="preserve">그림: </w:t>
-      </w:r>
-      <w:r>
-        <w:rPr>
-          <w:color w:val="8A8F99"/>
-          <w:sz w:val="18"/>
-          <w:szCs w:val="18"/>
-        </w:rPr>
-        <w:t xml:space="preserve">docs/ATAC-seq/modules/figures/module_results/tf_footprinting_result_2.png</w:t>
       </w:r>
     </w:p>
     <w:p>
@@ -39258,7 +38194,7 @@
         <w:spacing w:after="80"/>
       </w:pPr>
       <w:r>
-        <w:t xml:space="preserve">등록할 그림: </w:t>
+        <w:t xml:space="preserve">결과 파일: </w:t>
       </w:r>
       <w:r>
         <w:t xml:space="preserve">03_plots/&lt;list&gt;.GO_BP.dotplot.pdf</w:t>
@@ -39283,41 +38219,17 @@
         <w:spacing w:after="80"/>
       </w:pPr>
       <w:r>
-        <w:t xml:space="preserve">저장 파일: </w:t>
-      </w:r>
-      <w:r>
-        <w:t xml:space="preserve">docs/ATAC-seq/modules/figures/module_results/functional_enrichment_result_1.{png,svg}</w:t>
-      </w:r>
-    </w:p>
-    <w:p>
-      <w:pPr>
-        <w:spacing w:after="120"/>
-      </w:pPr>
+        <w:t xml:space="preserve">레전드(국문): </w:t>
+      </w:r>
       <w:r>
         <w:rPr>
           <w:b/>
           <w:bCs/>
-          <w:color w:val="B0B0B0"/>
-          <w:sz w:val="18"/>
-          <w:szCs w:val="18"/>
-        </w:rPr>
-        <w:t xml:space="preserve">[내부 메모 · 붙여 넣지 마세요] </w:t>
-      </w:r>
-      <w:r>
-        <w:rPr>
-          <w:color w:val="8A8F99"/>
-          <w:sz w:val="18"/>
-          <w:szCs w:val="18"/>
-        </w:rPr>
-        <w:t xml:space="preserve">그림: </w:t>
-      </w:r>
-      <w:r>
-        <w:rPr>
-          <w:color w:val="8A8F99"/>
-          <w:sz w:val="18"/>
-          <w:szCs w:val="18"/>
-        </w:rPr>
-        <w:t xml:space="preserve">docs/ATAC-seq/modules/figures/module_results/functional_enrichment_result_1.png</w:t>
+        </w:rPr>
+        <w:t xml:space="preserve">유전자 목록의 GO 생물학적 과정 농축(dot plot).</w:t>
+      </w:r>
+      <w:r>
+        <w:t xml:space="preserve"> 행은 유의하게 농축된 GO term이다. 가로축은 목록 유전자 중 그 term에 속한 비율(GeneRatio), 점의 크기는 해당 유전자 수(Count), 색은 보정된 p-value(p.adjust; 빨강일수록 유의)다. peak 근처 유전자들이 어떤 생물학적 과정에 모여 있는지를 보여 준다.</w:t>
       </w:r>
     </w:p>
     <w:p>
@@ -39330,17 +38242,29 @@
         <w:spacing w:after="80"/>
       </w:pPr>
       <w:r>
-        <w:t xml:space="preserve">레전드(국문): </w:t>
+        <w:t xml:space="preserve">레전드(영문): </w:t>
       </w:r>
       <w:r>
         <w:rPr>
           <w:b/>
           <w:bCs/>
         </w:rPr>
-        <w:t xml:space="preserve">유전자 목록의 GO 생물학적 과정 농축(dot plot).</w:t>
-      </w:r>
-      <w:r>
-        <w:t xml:space="preserve"> 행은 유의하게 농축된 GO term이다. 가로축은 목록 유전자 중 그 term에 속한 비율(GeneRatio), 점의 크기는 해당 유전자 수(Count), 색은 보정된 p-value(p.adjust; 빨강일수록 유의)다. peak 근처 유전자들이 어떤 생물학적 과정에 모여 있는지를 보여 준다.</w:t>
+        <w:t xml:space="preserve">GO biological process enrichment of a gene list (dot plot).</w:t>
+      </w:r>
+      <w:r>
+        <w:t xml:space="preserve"> Rows are significantly enriched GO terms. The x-axis is the fraction of list genes in each term (GeneRatio), point size is the gene count (Count), and colour is the adjusted p-value (p.adjust; redder is more significant). The plot shows which biological processes the genes near the peaks converge on.</w:t>
+      </w:r>
+    </w:p>
+    <w:p>
+      <w:pPr>
+        <w:spacing w:after="140"/>
+      </w:pPr>
+      <w:r>
+        <w:rPr>
+          <w:b/>
+          <w:bCs/>
+        </w:rPr>
+        <w:t xml:space="preserve">결과 2. GO 농축 bar plot</w:t>
       </w:r>
     </w:p>
     <w:p>
@@ -39353,29 +38277,13 @@
         <w:spacing w:after="80"/>
       </w:pPr>
       <w:r>
-        <w:t xml:space="preserve">레전드(영문): </w:t>
-      </w:r>
-      <w:r>
-        <w:rPr>
-          <w:b/>
-          <w:bCs/>
-        </w:rPr>
-        <w:t xml:space="preserve">GO biological process enrichment of a gene list (dot plot).</w:t>
-      </w:r>
-      <w:r>
-        <w:t xml:space="preserve"> Rows are significantly enriched GO terms. The x-axis is the fraction of list genes in each term (GeneRatio), point size is the gene count (Count), and colour is the adjusted p-value (p.adjust; redder is more significant). The plot shows which biological processes the genes near the peaks converge on.</w:t>
-      </w:r>
-    </w:p>
-    <w:p>
-      <w:pPr>
-        <w:spacing w:after="140"/>
-      </w:pPr>
-      <w:r>
-        <w:rPr>
-          <w:b/>
-          <w:bCs/>
-        </w:rPr>
-        <w:t xml:space="preserve">결과 2. GO 농축 bar plot</w:t>
+        <w:t xml:space="preserve">결과 파일: </w:t>
+      </w:r>
+      <w:r>
+        <w:t xml:space="preserve">03_plots/&lt;list&gt;.GO_BP.barplot.pdf</w:t>
+      </w:r>
+      <w:r>
+        <w:t xml:space="preserve"> (결과 1과 같은 목록)</w:t>
       </w:r>
     </w:p>
     <w:p>
@@ -39388,13 +38296,17 @@
         <w:spacing w:after="80"/>
       </w:pPr>
       <w:r>
-        <w:t xml:space="preserve">등록할 그림: </w:t>
-      </w:r>
-      <w:r>
-        <w:t xml:space="preserve">03_plots/&lt;list&gt;.GO_BP.barplot.pdf</w:t>
-      </w:r>
-      <w:r>
-        <w:t xml:space="preserve"> (결과 1과 같은 목록)</w:t>
+        <w:t xml:space="preserve">레전드(국문): </w:t>
+      </w:r>
+      <w:r>
+        <w:rPr>
+          <w:b/>
+          <w:bCs/>
+        </w:rPr>
+        <w:t xml:space="preserve">유전자 목록의 GO 생물학적 과정 농축(bar plot).</w:t>
+      </w:r>
+      <w:r>
+        <w:t xml:space="preserve"> 결과 1과 같은 GO term을 막대로 보여 준다. 막대 길이는 그 term에 속한 목록 유전자 수(Count), 색은 보정된 p-value(p.adjust)다. 유전자 수가 많은 term과 유의성이 높은 term을 한눈에 비교할 수 있다.</w:t>
       </w:r>
     </w:p>
     <w:p>
@@ -39407,41 +38319,29 @@
         <w:spacing w:after="80"/>
       </w:pPr>
       <w:r>
-        <w:t xml:space="preserve">저장 파일: </w:t>
-      </w:r>
-      <w:r>
-        <w:t xml:space="preserve">docs/ATAC-seq/modules/figures/module_results/functional_enrichment_result_2.{png,svg}</w:t>
-      </w:r>
-    </w:p>
-    <w:p>
-      <w:pPr>
-        <w:spacing w:after="120"/>
-      </w:pPr>
+        <w:t xml:space="preserve">레전드(영문): </w:t>
+      </w:r>
       <w:r>
         <w:rPr>
           <w:b/>
           <w:bCs/>
-          <w:color w:val="B0B0B0"/>
-          <w:sz w:val="18"/>
-          <w:szCs w:val="18"/>
-        </w:rPr>
-        <w:t xml:space="preserve">[내부 메모 · 붙여 넣지 마세요] </w:t>
-      </w:r>
-      <w:r>
-        <w:rPr>
-          <w:color w:val="8A8F99"/>
-          <w:sz w:val="18"/>
-          <w:szCs w:val="18"/>
-        </w:rPr>
-        <w:t xml:space="preserve">그림: </w:t>
-      </w:r>
-      <w:r>
-        <w:rPr>
-          <w:color w:val="8A8F99"/>
-          <w:sz w:val="18"/>
-          <w:szCs w:val="18"/>
-        </w:rPr>
-        <w:t xml:space="preserve">docs/ATAC-seq/modules/figures/module_results/functional_enrichment_result_2.png</w:t>
+        </w:rPr>
+        <w:t xml:space="preserve">GO biological process enrichment of a gene list (bar plot).</w:t>
+      </w:r>
+      <w:r>
+        <w:t xml:space="preserve"> The same GO terms as result 1 shown as bars, with bar length the number of list genes in the term (Count) and colour the adjusted p-value (p.adjust). It compares terms with many genes and terms with strong significance at a glance.</w:t>
+      </w:r>
+    </w:p>
+    <w:p>
+      <w:pPr>
+        <w:spacing w:after="140"/>
+      </w:pPr>
+      <w:r>
+        <w:rPr>
+          <w:b/>
+          <w:bCs/>
+        </w:rPr>
+        <w:t xml:space="preserve">결과 3. 목록별 농축 요약</w:t>
       </w:r>
     </w:p>
     <w:p>
@@ -39454,115 +38354,10 @@
         <w:spacing w:after="80"/>
       </w:pPr>
       <w:r>
-        <w:t xml:space="preserve">레전드(국문): </w:t>
-      </w:r>
-      <w:r>
-        <w:rPr>
-          <w:b/>
-          <w:bCs/>
-        </w:rPr>
-        <w:t xml:space="preserve">유전자 목록의 GO 생물학적 과정 농축(bar plot).</w:t>
-      </w:r>
-      <w:r>
-        <w:t xml:space="preserve"> 결과 1과 같은 GO term을 막대로 보여 준다. 막대 길이는 그 term에 속한 목록 유전자 수(Count), 색은 보정된 p-value(p.adjust)다. 유전자 수가 많은 term과 유의성이 높은 term을 한눈에 비교할 수 있다.</w:t>
-      </w:r>
-    </w:p>
-    <w:p>
-      <w:pPr>
-        <w:pStyle w:val="ListParagraph"/>
-        <w:numPr>
-          <w:ilvl w:val="0"/>
-          <w:numId w:val="2"/>
-        </w:numPr>
-        <w:spacing w:after="80"/>
-      </w:pPr>
-      <w:r>
-        <w:t xml:space="preserve">레전드(영문): </w:t>
-      </w:r>
-      <w:r>
-        <w:rPr>
-          <w:b/>
-          <w:bCs/>
-        </w:rPr>
-        <w:t xml:space="preserve">GO biological process enrichment of a gene list (bar plot).</w:t>
-      </w:r>
-      <w:r>
-        <w:t xml:space="preserve"> The same GO terms as result 1 shown as bars, with bar length the number of list genes in the term (Count) and colour the adjusted p-value (p.adjust). It compares terms with many genes and terms with strong significance at a glance.</w:t>
-      </w:r>
-    </w:p>
-    <w:p>
-      <w:pPr>
-        <w:spacing w:after="140"/>
-      </w:pPr>
-      <w:r>
-        <w:rPr>
-          <w:b/>
-          <w:bCs/>
-        </w:rPr>
-        <w:t xml:space="preserve">결과 3. 목록별 농축 요약</w:t>
-      </w:r>
-    </w:p>
-    <w:p>
-      <w:pPr>
-        <w:pStyle w:val="ListParagraph"/>
-        <w:numPr>
-          <w:ilvl w:val="0"/>
-          <w:numId w:val="2"/>
-        </w:numPr>
-        <w:spacing w:after="80"/>
-      </w:pPr>
-      <w:r>
-        <w:t xml:space="preserve">등록할 그림: 표 캡처 </w:t>
+        <w:t xml:space="preserve">결과 파일: 표 캡처 </w:t>
       </w:r>
       <w:r>
         <w:t xml:space="preserve">04_summary/enrichment_summary.tsv</w:t>
-      </w:r>
-    </w:p>
-    <w:p>
-      <w:pPr>
-        <w:pStyle w:val="ListParagraph"/>
-        <w:numPr>
-          <w:ilvl w:val="0"/>
-          <w:numId w:val="2"/>
-        </w:numPr>
-        <w:spacing w:after="80"/>
-      </w:pPr>
-      <w:r>
-        <w:t xml:space="preserve">저장 파일: </w:t>
-      </w:r>
-      <w:r>
-        <w:t xml:space="preserve">docs/ATAC-seq/modules/figures/module_results/functional_enrichment_result_3.png</w:t>
-      </w:r>
-    </w:p>
-    <w:p>
-      <w:pPr>
-        <w:spacing w:after="120"/>
-      </w:pPr>
-      <w:r>
-        <w:rPr>
-          <w:b/>
-          <w:bCs/>
-          <w:color w:val="B0B0B0"/>
-          <w:sz w:val="18"/>
-          <w:szCs w:val="18"/>
-        </w:rPr>
-        <w:t xml:space="preserve">[내부 메모 · 붙여 넣지 마세요] </w:t>
-      </w:r>
-      <w:r>
-        <w:rPr>
-          <w:color w:val="8A8F99"/>
-          <w:sz w:val="18"/>
-          <w:szCs w:val="18"/>
-        </w:rPr>
-        <w:t xml:space="preserve">그림: </w:t>
-      </w:r>
-      <w:r>
-        <w:rPr>
-          <w:color w:val="8A8F99"/>
-          <w:sz w:val="18"/>
-          <w:szCs w:val="18"/>
-        </w:rPr>
-        <w:t xml:space="preserve">docs/ATAC-seq/modules/figures/module_results/functional_enrichment_result_3.png</w:t>
       </w:r>
     </w:p>
     <w:p>
@@ -43141,7 +41936,7 @@
         <w:spacing w:after="80"/>
       </w:pPr>
       <w:r>
-        <w:t xml:space="preserve">등록할 그림: </w:t>
+        <w:t xml:space="preserve">결과 파일: </w:t>
       </w:r>
       <w:r>
         <w:t xml:space="preserve">02_idr/&lt;condition&gt;/&lt;repA&gt;_vs_&lt;repB&gt;.idr.png</w:t>
@@ -43160,41 +41955,17 @@
         <w:spacing w:after="80"/>
       </w:pPr>
       <w:r>
-        <w:t xml:space="preserve">저장 파일: </w:t>
-      </w:r>
-      <w:r>
-        <w:t xml:space="preserve">docs/ATAC-seq/modules/figures/module_results/replicate_consistency_result_1.png</w:t>
-      </w:r>
-    </w:p>
-    <w:p>
-      <w:pPr>
-        <w:spacing w:after="120"/>
-      </w:pPr>
+        <w:t xml:space="preserve">레전드(국문): </w:t>
+      </w:r>
       <w:r>
         <w:rPr>
           <w:b/>
           <w:bCs/>
-          <w:color w:val="B0B0B0"/>
-          <w:sz w:val="18"/>
-          <w:szCs w:val="18"/>
-        </w:rPr>
-        <w:t xml:space="preserve">[내부 메모 · 붙여 넣지 마세요] </w:t>
-      </w:r>
-      <w:r>
-        <w:rPr>
-          <w:color w:val="8A8F99"/>
-          <w:sz w:val="18"/>
-          <w:szCs w:val="18"/>
-        </w:rPr>
-        <w:t xml:space="preserve">그림: </w:t>
-      </w:r>
-      <w:r>
-        <w:rPr>
-          <w:color w:val="8A8F99"/>
-          <w:sz w:val="18"/>
-          <w:szCs w:val="18"/>
-        </w:rPr>
-        <w:t xml:space="preserve">docs/ATAC-seq/modules/figures/module_results/replicate_consistency_result_1.png</w:t>
+        </w:rPr>
+        <w:t xml:space="preserve">반복 샘플 간 peak 재현성(IDR).</w:t>
+      </w:r>
+      <w:r>
+        <w:t xml:space="preserve"> 두 반복 샘플에서 찾은 peak를 짝지어 비교한 그림이다. 위쪽 패널은 두 반복의 peak 순위와 신호 세기를 서로 대응시킨 산점도로, 검은 점은 IDR 기준을 통과한 재현성 있는 peak, 빨간 점은 통과하지 못한 peak다. 아래쪽 패널은 peak 순위에 따른 IDR 값을 보여 준다. 강한 peak일수록 두 반복에서 함께 나타나고, 약한 peak로 갈수록 재현성이 떨어진다.</w:t>
       </w:r>
     </w:p>
     <w:p>
@@ -43207,17 +41978,29 @@
         <w:spacing w:after="80"/>
       </w:pPr>
       <w:r>
-        <w:t xml:space="preserve">레전드(국문): </w:t>
+        <w:t xml:space="preserve">레전드(영문): </w:t>
       </w:r>
       <w:r>
         <w:rPr>
           <w:b/>
           <w:bCs/>
         </w:rPr>
-        <w:t xml:space="preserve">반복 샘플 간 peak 재현성(IDR).</w:t>
-      </w:r>
-      <w:r>
-        <w:t xml:space="preserve"> 두 반복 샘플에서 찾은 peak를 짝지어 비교한 그림이다. 위쪽 패널은 두 반복의 peak 순위와 신호 세기를 서로 대응시킨 산점도로, 검은 점은 IDR 기준을 통과한 재현성 있는 peak, 빨간 점은 통과하지 못한 peak다. 아래쪽 패널은 peak 순위에 따른 IDR 값을 보여 준다. 강한 peak일수록 두 반복에서 함께 나타나고, 약한 peak로 갈수록 재현성이 떨어진다.</w:t>
+        <w:t xml:space="preserve">Peak reproducibility between replicates (IDR).</w:t>
+      </w:r>
+      <w:r>
+        <w:t xml:space="preserve"> Peaks from two replicates are matched and compared. The upper panels plot the ranks and signal strengths of matched peaks against each other; black points pass the IDR threshold (reproducible) and red points do not. The lower panels show IDR values along the peak ranks. Strong peaks tend to appear in both replicates, and reproducibility falls off for weaker peaks.</w:t>
+      </w:r>
+    </w:p>
+    <w:p>
+      <w:pPr>
+        <w:spacing w:after="140"/>
+      </w:pPr>
+      <w:r>
+        <w:rPr>
+          <w:b/>
+          <w:bCs/>
+        </w:rPr>
+        <w:t xml:space="preserve">결과 2. 조건별 IDR 요약</w:t>
       </w:r>
     </w:p>
     <w:p>
@@ -43230,92 +42013,10 @@
         <w:spacing w:after="80"/>
       </w:pPr>
       <w:r>
-        <w:t xml:space="preserve">레전드(영문): </w:t>
-      </w:r>
-      <w:r>
-        <w:rPr>
-          <w:b/>
-          <w:bCs/>
-        </w:rPr>
-        <w:t xml:space="preserve">Peak reproducibility between replicates (IDR).</w:t>
-      </w:r>
-      <w:r>
-        <w:t xml:space="preserve"> Peaks from two replicates are matched and compared. The upper panels plot the ranks and signal strengths of matched peaks against each other; black points pass the IDR threshold (reproducible) and red points do not. The lower panels show IDR values along the peak ranks. Strong peaks tend to appear in both replicates, and reproducibility falls off for weaker peaks.</w:t>
-      </w:r>
-    </w:p>
-    <w:p>
-      <w:pPr>
-        <w:spacing w:after="140"/>
-      </w:pPr>
-      <w:r>
-        <w:rPr>
-          <w:b/>
-          <w:bCs/>
-        </w:rPr>
-        <w:t xml:space="preserve">결과 2. 조건별 IDR 요약</w:t>
-      </w:r>
-    </w:p>
-    <w:p>
-      <w:pPr>
-        <w:pStyle w:val="ListParagraph"/>
-        <w:numPr>
-          <w:ilvl w:val="0"/>
-          <w:numId w:val="2"/>
-        </w:numPr>
-        <w:spacing w:after="80"/>
-      </w:pPr>
-      <w:r>
-        <w:t xml:space="preserve">등록할 그림: 표 캡처 </w:t>
+        <w:t xml:space="preserve">결과 파일: 표 캡처 </w:t>
       </w:r>
       <w:r>
         <w:t xml:space="preserve">04_summary/idr_summary.tsv</w:t>
-      </w:r>
-    </w:p>
-    <w:p>
-      <w:pPr>
-        <w:pStyle w:val="ListParagraph"/>
-        <w:numPr>
-          <w:ilvl w:val="0"/>
-          <w:numId w:val="2"/>
-        </w:numPr>
-        <w:spacing w:after="80"/>
-      </w:pPr>
-      <w:r>
-        <w:t xml:space="preserve">저장 파일: </w:t>
-      </w:r>
-      <w:r>
-        <w:t xml:space="preserve">docs/ATAC-seq/modules/figures/module_results/replicate_consistency_result_2.png</w:t>
-      </w:r>
-    </w:p>
-    <w:p>
-      <w:pPr>
-        <w:spacing w:after="120"/>
-      </w:pPr>
-      <w:r>
-        <w:rPr>
-          <w:b/>
-          <w:bCs/>
-          <w:color w:val="B0B0B0"/>
-          <w:sz w:val="18"/>
-          <w:szCs w:val="18"/>
-        </w:rPr>
-        <w:t xml:space="preserve">[내부 메모 · 붙여 넣지 마세요] </w:t>
-      </w:r>
-      <w:r>
-        <w:rPr>
-          <w:color w:val="8A8F99"/>
-          <w:sz w:val="18"/>
-          <w:szCs w:val="18"/>
-        </w:rPr>
-        <w:t xml:space="preserve">그림: </w:t>
-      </w:r>
-      <w:r>
-        <w:rPr>
-          <w:color w:val="8A8F99"/>
-          <w:sz w:val="18"/>
-          <w:szCs w:val="18"/>
-        </w:rPr>
-        <w:t xml:space="preserve">docs/ATAC-seq/modules/figures/module_results/replicate_consistency_result_2.png</w:t>
       </w:r>
     </w:p>
     <w:p>

</xml_diff>

<commit_message>
Fix peak_annotation OOM (1.2) and atac_motif without KernSmooth (1.4)
peak_annotation 1.1 was OOM-killed with 8 GB on TAIR10: the ChIPseeker
tag matrix for all promoters and tagHeatmap's one tile per bp need far
more. 1.2 builds the matrix in chunks of promoters that overlap a peak,
keeps only the column sums (TSS profile, identical to 1.1) and 10 bp
binned rows (heatmap drawn as a raster). Peak memory 2.8 GB on TAIR10
with 3 x 40,000 peaks. The plain UpSet plot no longer fails when ggimage
is missing.

atac_motif 1.4 draws the right panel of logFC_vs_GC.pdf as a
semi-transparent scatter when KernSmooth is missing (bx_atac_motif 1.0
has no KernSmooth, so smoothScatter stopped the run).

Co-Authored-By: Claude Opus 5.5 <noreply@anthropic.com>
</commit_message>
<xml_diff>
--- a/docs/ATAC-seq/modules/Portal_Content.docx
+++ b/docs/ATAC-seq/modules/Portal_Content.docx
@@ -16329,7 +16329,7 @@
                 <w:sz w:val="18"/>
                 <w:szCs w:val="18"/>
               </w:rPr>
-              <w:t xml:space="preserve">1.1</w:t>
+              <w:t xml:space="preserve">1.2</w:t>
             </w:r>
           </w:p>
         </w:tc>
@@ -16723,7 +16723,7 @@
                 <w:sz w:val="18"/>
                 <w:szCs w:val="18"/>
               </w:rPr>
-              <w:t xml:space="preserve">peak_annotation.1.1.R</w:t>
+              <w:t xml:space="preserve">peak_annotation.1.2.R</w:t>
             </w:r>
           </w:p>
         </w:tc>
@@ -19424,7 +19424,7 @@
           <w:sz w:val="19"/>
           <w:szCs w:val="19"/>
         </w:rPr>
-        <w:t xml:space="preserve">Rscript peak_annotation.1.1.R \</w:t>
+        <w:t xml:space="preserve">Rscript peak_annotation.1.2.R \</w:t>
       </w:r>
     </w:p>
     <w:p>
@@ -19662,7 +19662,7 @@
         <w:t xml:space="preserve">결과 파일: </w:t>
       </w:r>
       <w:r>
-        <w:t xml:space="preserve">plots/&lt;sample&gt;.annotation_upset_vennpie.pdf</w:t>
+        <w:t xml:space="preserve">plots/&lt;sample&gt;.annotation_upset.pdf</w:t>
       </w:r>
       <w:r>
         <w:t xml:space="preserve"> (대표 샘플 1개)</w:t>
@@ -19688,7 +19688,7 @@
         <w:t xml:space="preserve">peak가 동시에 걸치는 유전체 영역(UpSet plot).</w:t>
       </w:r>
       <w:r>
-        <w:t xml:space="preserve"> peak 하나가 여러 영역(예: promoter이면서 exon)에 함께 걸칠 수 있으므로, 영역 조합별 peak 수를 보여 준다. 아래 점과 선은 영역 조합, 위 막대는 그 조합에 속한 peak 수다. 왼쪽 위의 원그래프(vennpie)는 전체 peak의 영역 구성을 요약한다. 결과 1의 막대는 우선순위에 따라 영역 하나만 고른 것이고, 이 그림은 겹침까지 보여 준다.</w:t>
+        <w:t xml:space="preserve"> peak 하나가 여러 영역(예: promoter이면서 exon)에 함께 걸칠 수 있으므로, 영역 조합별 peak 수를 보여 준다. 아래 점과 선은 영역 조합, 위 막대는 그 조합에 속한 peak 수다. 결과 1의 막대는 우선순위에 따라 영역 하나만 고른 것이고, 이 그림은 겹침까지 보여 준다.</w:t>
       </w:r>
     </w:p>
     <w:p>
@@ -19711,7 +19711,7 @@
         <w:t xml:space="preserve">Overlapping genomic features of peaks (UpSet plot).</w:t>
       </w:r>
       <w:r>
-        <w:t xml:space="preserve"> A peak can fall in several features at once (for example promoter and exon), so the plot shows peak counts per feature combination: the dots and lines below define the combination and the bars above give its peak count. The pie (vennpie) at the top left summarises the feature composition of all peaks. Result 1 assigns each peak to one feature by priority; this plot shows the overlaps.</w:t>
+        <w:t xml:space="preserve"> A peak can fall in several features at once (for example promoter and exon), so the plot shows peak counts per feature combination: the dots and lines below define the combination and the bars above give its peak count. Result 1 assigns each peak to one feature by priority; this plot shows the overlaps.</w:t>
       </w:r>
     </w:p>
     <w:p>
@@ -24859,7 +24859,7 @@
                 <w:sz w:val="18"/>
                 <w:szCs w:val="18"/>
               </w:rPr>
-              <w:t xml:space="preserve">1.3</w:t>
+              <w:t xml:space="preserve">1.4</w:t>
             </w:r>
           </w:p>
         </w:tc>
@@ -25253,7 +25253,7 @@
                 <w:sz w:val="18"/>
                 <w:szCs w:val="18"/>
               </w:rPr>
-              <w:t xml:space="preserve">atac_motif.1.3.R</w:t>
+              <w:t xml:space="preserve">atac_motif.1.4.R</w:t>
             </w:r>
           </w:p>
         </w:tc>
@@ -29188,7 +29188,7 @@
           <w:sz w:val="19"/>
           <w:szCs w:val="19"/>
         </w:rPr>
-        <w:t xml:space="preserve">Rscript atac_motif.1.3.R \</w:t>
+        <w:t xml:space="preserve">Rscript atac_motif.1.4.R \</w:t>
       </w:r>
     </w:p>
     <w:p>

</xml_diff>

<commit_message>
List KernSmooth in the atac_motif image tools
Co-Authored-By: Claude Opus 5.5 <noreply@anthropic.com>
</commit_message>
<xml_diff>
--- a/docs/ATAC-seq/modules/Portal_Content.docx
+++ b/docs/ATAC-seq/modules/Portal_Content.docx
@@ -26137,6 +26137,48 @@
                 <w:szCs w:val="18"/>
               </w:rPr>
               <w:t xml:space="preserve">5.0</w:t>
+            </w:r>
+          </w:p>
+        </w:tc>
+      </w:tr>
+      <w:tr>
+        <w:tc>
+          <w:tcPr>
+            <w:tcW w:type="dxa" w:w="4753"/>
+            <w:tcMar>
+              <w:top w:type="dxa" w:w="60"/>
+              <w:left w:type="dxa" w:w="90"/>
+              <w:bottom w:type="dxa" w:w="60"/>
+              <w:right w:type="dxa" w:w="90"/>
+            </w:tcMar>
+          </w:tcPr>
+          <w:p>
+            <w:r>
+              <w:rPr>
+                <w:sz w:val="18"/>
+                <w:szCs w:val="18"/>
+              </w:rPr>
+              <w:t xml:space="preserve">KernSmooth</w:t>
+            </w:r>
+          </w:p>
+        </w:tc>
+        <w:tc>
+          <w:tcPr>
+            <w:tcW w:type="dxa" w:w="4753"/>
+            <w:tcMar>
+              <w:top w:type="dxa" w:w="60"/>
+              <w:left w:type="dxa" w:w="90"/>
+              <w:bottom w:type="dxa" w:w="60"/>
+              <w:right w:type="dxa" w:w="90"/>
+            </w:tcMar>
+          </w:tcPr>
+          <w:p>
+            <w:r>
+              <w:rPr>
+                <w:sz w:val="18"/>
+                <w:szCs w:val="18"/>
+              </w:rPr>
+              <w:t xml:space="preserve">2.23-27</w:t>
             </w:r>
           </w:p>
         </w:tc>

</xml_diff>

<commit_message>
atac_motif 1.4: stop with a clear message when too few peaks remain
With fdr_filter=0.05 a production run kept 14 of 22,275 peaks and
stopped inside monaLisa::bin() with "invalid number of intervals".
1.4 counts the bins the way monaLisa's equalN binning does and, with
fewer than 2, stops with the peak counts and how to fix it (leave
fdr_filter empty or lower n_per_bin). min_abs_logfc=0 is passed as no
central bin. 1.4 is now 1.3 plus this check; the KernSmooth fallback
is dropped because the image now includes KernSmooth.

Co-Authored-By: Claude Opus 5.5 <noreply@anthropic.com>
</commit_message>
<xml_diff>
--- a/docs/ATAC-seq/modules/Portal_Content.docx
+++ b/docs/ATAC-seq/modules/Portal_Content.docx
@@ -27484,7 +27484,7 @@
                 <w:sz w:val="18"/>
                 <w:szCs w:val="18"/>
               </w:rPr>
-              <w:t xml:space="preserve">이 FDR 이하 peak만 사용. 비우면 필터 없음</w:t>
+              <w:t xml:space="preserve">이 FDR 이하 peak만 사용. 비우면 필터 없음(권장). monaLisa는 전체 peak를 logFC 순으로 구간에 나눠 비교하므로 보통 비워 둔다. 값을 넣어 남은 peak가 n_per_bin의 약 2배보다 적으면 구간을 만들 수 없어 이유를 알리고 멈춤</w:t>
             </w:r>
           </w:p>
         </w:tc>
@@ -27504,7 +27504,7 @@
                 <w:sz w:val="18"/>
                 <w:szCs w:val="18"/>
               </w:rPr>
-              <w:t xml:space="preserve">Use peaks with FDR at or below this; empty applies no filter</w:t>
+              <w:t xml:space="preserve">Use peaks with FDR at or below this; empty applies no filter (recommended). monaLisa compares bins of all peaks ordered by logFC, so this is usually left empty; if fewer than about twice n_per_bin peaks remain, no bins can be made and the run stops with the reason</w:t>
             </w:r>
           </w:p>
         </w:tc>

</xml_diff>

<commit_message>
bowtie2 1.3: give each sample a read group
bowtie2 now runs with --rg-id/--rg SM, LB, PL so the BAMs carry an @RG
line. GATK MarkDuplicates 4.6 stops with a NullPointerException on BAMs
without read groups (4.5 and earlier did not). Checked in a
Codespace-only image: GATK_MarkDuplicates.1.1 runs on the 1.3 output
with the same duplicate counts as GATK 4.5 on read-group-free BAMs.

Co-Authored-By: Claude Opus 5.5 <noreply@anthropic.com>
</commit_message>
<xml_diff>
--- a/docs/ATAC-seq/modules/Portal_Content.docx
+++ b/docs/ATAC-seq/modules/Portal_Content.docx
@@ -627,7 +627,7 @@
                 <w:sz w:val="18"/>
                 <w:szCs w:val="18"/>
               </w:rPr>
-              <w:t xml:space="preserve">1.2</w:t>
+              <w:t xml:space="preserve">1.3</w:t>
             </w:r>
           </w:p>
         </w:tc>
@@ -1021,7 +1021,7 @@
                 <w:sz w:val="18"/>
                 <w:szCs w:val="18"/>
               </w:rPr>
-              <w:t xml:space="preserve">bowtie2.1.2.sh</w:t>
+              <w:t xml:space="preserve">bowtie2.1.3.sh</w:t>
             </w:r>
           </w:p>
         </w:tc>
@@ -2578,7 +2578,7 @@
           <w:sz w:val="19"/>
           <w:szCs w:val="19"/>
         </w:rPr>
-        <w:t xml:space="preserve">bash bowtie2.1.2.sh \</w:t>
+        <w:t xml:space="preserve">bash bowtie2.1.3.sh \</w:t>
       </w:r>
     </w:p>
     <w:p>

</xml_diff>

<commit_message>
Add the GATK_MarkDuplicates module to the portal content
The uploaded GATK_MarkDuplicates_1.0.sh (v1.1 content) and
bx_gatk_1.0.def get their own section between bowtie2 and
organellar_filter, with the image, parameters, notes (read groups
required by GATK 4.6, fixed 20 GB Java heap, temp folders in input_dir),
usage, and the duplicate metrics as the result. bowtie2 now mentions the
read group it writes. Modules after bowtie2 are renumbered.

Co-Authored-By: Claude Opus 5.5 <noreply@anthropic.com>
</commit_message>
<xml_diff>
--- a/docs/ATAC-seq/modules/Portal_Content.docx
+++ b/docs/ATAC-seq/modules/Portal_Content.docx
@@ -1212,30 +1212,7 @@
         <w:spacing w:after="80"/>
       </w:pPr>
       <w:r>
-        <w:t xml:space="preserve">결과 BAM은 GATK_MarkDuplicates 모듈의 입력으로 사용합니다.</w:t>
-      </w:r>
-    </w:p>
-    <w:p>
-      <w:pPr>
-        <w:spacing w:after="100" w:before="200"/>
-      </w:pPr>
-      <w:r>
-        <w:rPr>
-          <w:b/>
-          <w:bCs/>
-          <w:color w:val="3A3A3A"/>
-          <w:sz w:val="24"/>
-          <w:szCs w:val="24"/>
-        </w:rPr>
-        <w:t xml:space="preserve">내용(영문)</w:t>
-      </w:r>
-    </w:p>
-    <w:p>
-      <w:pPr>
-        <w:spacing w:after="140"/>
-      </w:pPr>
-      <w:r>
-        <w:t xml:space="preserve">Aligns FASTQ reads to the reference genome with bowtie2. R1/R2 pairs are found from the FASTQ file names in the folder and aligned as paired-end; files without a mate are aligned as single-end.</w:t>
+        <w:t xml:space="preserve">샘플마다 read group(ID, SM, LB = 샘플 이름, PL = ILLUMINA)을 붙입니다. GATK_MarkDuplicates는 read group이 있어야 실행됩니다.</w:t>
       </w:r>
     </w:p>
     <w:p>
@@ -1248,7 +1225,30 @@
         <w:spacing w:after="80"/>
       </w:pPr>
       <w:r>
-        <w:t xml:space="preserve">The reference is given as a bowtie2 index prefix or a FASTA file. If no index exists, one is built beside the FASTA.</w:t>
+        <w:t xml:space="preserve">결과 BAM은 GATK_MarkDuplicates 모듈의 입력으로 사용합니다.</w:t>
+      </w:r>
+    </w:p>
+    <w:p>
+      <w:pPr>
+        <w:spacing w:after="100" w:before="200"/>
+      </w:pPr>
+      <w:r>
+        <w:rPr>
+          <w:b/>
+          <w:bCs/>
+          <w:color w:val="3A3A3A"/>
+          <w:sz w:val="24"/>
+          <w:szCs w:val="24"/>
+        </w:rPr>
+        <w:t xml:space="preserve">내용(영문)</w:t>
+      </w:r>
+    </w:p>
+    <w:p>
+      <w:pPr>
+        <w:spacing w:after="140"/>
+      </w:pPr>
+      <w:r>
+        <w:t xml:space="preserve">Aligns FASTQ reads to the reference genome with bowtie2. R1/R2 pairs are found from the FASTQ file names in the folder and aligned as paired-end; files without a mate are aligned as single-end.</w:t>
       </w:r>
     </w:p>
     <w:p>
@@ -1261,7 +1261,7 @@
         <w:spacing w:after="80"/>
       </w:pPr>
       <w:r>
-        <w:t xml:space="preserve">With post_process_bam=yes, samtools converts the alignments to a coordinate-sorted BAM and builds its index (.bai).</w:t>
+        <w:t xml:space="preserve">The reference is given as a bowtie2 index prefix or a FASTA file. If no index exists, one is built beside the FASTA.</w:t>
       </w:r>
     </w:p>
     <w:p>
@@ -1274,7 +1274,33 @@
         <w:spacing w:after="80"/>
       </w:pPr>
       <w:r>
+        <w:t xml:space="preserve">With post_process_bam=yes, samtools converts the alignments to a coordinate-sorted BAM and builds its index (.bai).</w:t>
+      </w:r>
+    </w:p>
+    <w:p>
+      <w:pPr>
+        <w:pStyle w:val="ListParagraph"/>
+        <w:numPr>
+          <w:ilvl w:val="0"/>
+          <w:numId w:val="2"/>
+        </w:numPr>
+        <w:spacing w:after="80"/>
+      </w:pPr>
+      <w:r>
         <w:t xml:space="preserve">An alignment summary per sample (overall alignment rate and so on) is written to a log.</w:t>
+      </w:r>
+    </w:p>
+    <w:p>
+      <w:pPr>
+        <w:pStyle w:val="ListParagraph"/>
+        <w:numPr>
+          <w:ilvl w:val="0"/>
+          <w:numId w:val="2"/>
+        </w:numPr>
+        <w:spacing w:after="80"/>
+      </w:pPr>
+      <w:r>
+        <w:t xml:space="preserve">Each sample gets a read group (ID, SM, and LB = the sample name, PL = ILLUMINA); GATK_MarkDuplicates needs read groups.</w:t>
       </w:r>
     </w:p>
     <w:p>
@@ -2746,7 +2772,7 @@
           <w:sz w:val="30"/>
           <w:szCs w:val="30"/>
         </w:rPr>
-        <w:t xml:space="preserve">2. organellar_filter</w:t>
+        <w:t xml:space="preserve">2. GATK_MarkDuplicates</w:t>
       </w:r>
     </w:p>
     <w:p>
@@ -2892,7 +2918,7 @@
                 <w:sz w:val="18"/>
                 <w:szCs w:val="18"/>
               </w:rPr>
-              <w:t xml:space="preserve">organellar_filter</w:t>
+              <w:t xml:space="preserve">GATK_MarkDuplicates</w:t>
             </w:r>
           </w:p>
         </w:tc>
@@ -2912,7 +2938,7 @@
                 <w:sz w:val="18"/>
                 <w:szCs w:val="18"/>
               </w:rPr>
-              <w:t xml:space="preserve">organellar_filter</w:t>
+              <w:t xml:space="preserve">GATK_MarkDuplicates</w:t>
             </w:r>
           </w:p>
         </w:tc>
@@ -2954,7 +2980,7 @@
                 <w:sz w:val="18"/>
                 <w:szCs w:val="18"/>
               </w:rPr>
-              <w:t xml:space="preserve">세포소기관 read 제거</w:t>
+              <w:t xml:space="preserve">중복 read 표시</w:t>
             </w:r>
           </w:p>
         </w:tc>
@@ -2974,7 +3000,7 @@
                 <w:sz w:val="18"/>
                 <w:szCs w:val="18"/>
               </w:rPr>
-              <w:t xml:space="preserve">Organellar read removal</w:t>
+              <w:t xml:space="preserve">Duplicate read marking</w:t>
             </w:r>
           </w:p>
         </w:tc>
@@ -3016,7 +3042,7 @@
                 <w:sz w:val="18"/>
                 <w:szCs w:val="18"/>
               </w:rPr>
-              <w:t xml:space="preserve">1.2</w:t>
+              <w:t xml:space="preserve">1.0</w:t>
             </w:r>
           </w:p>
         </w:tc>
@@ -3248,7 +3274,7 @@
                 <w:sz w:val="18"/>
                 <w:szCs w:val="18"/>
               </w:rPr>
-              <w:t xml:space="preserve">ATAC-seq, mitochondria, chloroplast, samtools, BAM filtering</w:t>
+              <w:t xml:space="preserve">ATAC-seq, GATK, Picard, MarkDuplicates, PCR duplicates, BAM</w:t>
             </w:r>
           </w:p>
         </w:tc>
@@ -3302,7 +3328,7 @@
                 <w:sz w:val="18"/>
                 <w:szCs w:val="18"/>
               </w:rPr>
-              <w:t xml:space="preserve">https://www.htslib.org/</w:t>
+              <w:t xml:space="preserve">https://gatk.broadinstitute.org/</w:t>
             </w:r>
           </w:p>
         </w:tc>
@@ -3356,7 +3382,7 @@
                 <w:sz w:val="18"/>
                 <w:szCs w:val="18"/>
               </w:rPr>
-              <w:t xml:space="preserve">bx_organellar_filter.1.0</w:t>
+              <w:t xml:space="preserve">gatk.1.0</w:t>
             </w:r>
           </w:p>
         </w:tc>
@@ -3410,7 +3436,7 @@
                 <w:sz w:val="18"/>
                 <w:szCs w:val="18"/>
               </w:rPr>
-              <w:t xml:space="preserve">organellar_filter.1.2.sh</w:t>
+              <w:t xml:space="preserve">GATK_MarkDuplicates_1.0.sh</w:t>
             </w:r>
           </w:p>
         </w:tc>
@@ -3464,7 +3490,7 @@
                 <w:sz w:val="18"/>
                 <w:szCs w:val="18"/>
               </w:rPr>
-              <w:t xml:space="preserve">최대 4코어 (samtools가 여러 코어 사용)</w:t>
+              <w:t xml:space="preserve">싱글 코어 (MarkDuplicates는 한 코어로 실행)</w:t>
             </w:r>
           </w:p>
         </w:tc>
@@ -3484,13 +3510,36 @@
                 <w:sz w:val="18"/>
                 <w:szCs w:val="18"/>
               </w:rPr>
-              <w:t xml:space="preserve">Up to 4 cores (samtools is multi-threaded)</w:t>
+              <w:t xml:space="preserve">Single core (MarkDuplicates runs on one core)</w:t>
             </w:r>
           </w:p>
         </w:tc>
       </w:tr>
     </w:tbl>
     <w:p/>
+    <w:p>
+      <w:pPr>
+        <w:spacing w:after="120"/>
+      </w:pPr>
+      <w:r>
+        <w:rPr>
+          <w:b/>
+          <w:bCs/>
+          <w:color w:val="B0B0B0"/>
+          <w:sz w:val="18"/>
+          <w:szCs w:val="18"/>
+        </w:rPr>
+        <w:t xml:space="preserve">[내부 메모 · 붙여 넣지 마세요] </w:t>
+      </w:r>
+      <w:r>
+        <w:rPr>
+          <w:color w:val="8A8F99"/>
+          <w:sz w:val="18"/>
+          <w:szCs w:val="18"/>
+        </w:rPr>
+        <w:t xml:space="preserve">등록 메모: 스크립트 파일 이름은 1.0이지만 내용은 v1.1이다(도구 경로 /opt/bio/bin, 실패 시 종료 코드 1). Java 힙이 20GB로 고정(-Xmx20g)되어 있으므로 실행 메모리는 24GB 이상을 고른다. 스크립트가 받는 threads 인자는 쓰이지 않으므로 포탈에 등록하지 않는다.</w:t>
+      </w:r>
+    </w:p>
     <w:p>
       <w:pPr>
         <w:spacing w:after="100" w:before="200"/>
@@ -3511,7 +3560,7 @@
         <w:spacing w:after="140"/>
       </w:pPr>
       <w:r>
-        <w:t xml:space="preserve">이미지: bx_organellar_filter 1.0</w:t>
+        <w:t xml:space="preserve">이미지: gatk 1.0</w:t>
       </w:r>
     </w:p>
     <w:tbl>
@@ -3617,7 +3666,7 @@
                 <w:sz w:val="18"/>
                 <w:szCs w:val="18"/>
               </w:rPr>
-              <w:t xml:space="preserve">defs/ATAC-seq/bx_organellar_filter.1.0.def</w:t>
+              <w:t xml:space="preserve">defs/ATAC-seq/bx_gatk_1.0.def</w:t>
             </w:r>
           </w:p>
         </w:tc>
@@ -3701,28 +3750,14 @@
                 <w:sz w:val="18"/>
                 <w:szCs w:val="18"/>
               </w:rPr>
-              <w:t xml:space="preserve">rockylinux/rockylinux@sha256:8101994123cf3d0a8fee517bee7f39e555c7d92bd2d9eb3303cc988a0eeed00f</w:t>
-            </w:r>
-            <w:r>
-              <w:rPr>
-                <w:sz w:val="18"/>
-                <w:szCs w:val="18"/>
-              </w:rPr>
-              <w:t xml:space="preserve"> (Rocky Linux 9.8, </w:t>
-            </w:r>
-            <w:r>
-              <w:rPr>
-                <w:sz w:val="18"/>
-                <w:szCs w:val="18"/>
-              </w:rPr>
-              <w:t xml:space="preserve">9.8.20260525.0</w:t>
-            </w:r>
-            <w:r>
-              <w:rPr>
-                <w:sz w:val="18"/>
-                <w:szCs w:val="18"/>
-              </w:rPr>
-              <w:t xml:space="preserve">)</w:t>
+              <w:t xml:space="preserve">rockylinux/rockylinux:9</w:t>
+            </w:r>
+            <w:r>
+              <w:rPr>
+                <w:sz w:val="18"/>
+                <w:szCs w:val="18"/>
+              </w:rPr>
+              <w:t xml:space="preserve"> (Rocky Linux 9, digest 고정 없음)</w:t>
             </w:r>
           </w:p>
         </w:tc>
@@ -3764,7 +3799,7 @@
                 <w:sz w:val="18"/>
                 <w:szCs w:val="18"/>
               </w:rPr>
-              <w:t xml:space="preserve">Miniforge3 26.7.2-0 (conda-forge, bioconda)</w:t>
+              <w:t xml:space="preserve">Miniforge3 26.5.3-0 (conda-forge, bioconda)</w:t>
             </w:r>
           </w:p>
         </w:tc>
@@ -3788,7 +3823,7 @@
         <w:t xml:space="preserve">설명(국문):</w:t>
       </w:r>
       <w:r>
-        <w:t xml:space="preserve"> 정렬된 BAM에서 세포소기관(미토콘드리아, 엽록체) read를 제거하는 SAMtools 환경입니다.</w:t>
+        <w:t xml:space="preserve"> GATK(Picard)로 BAM의 중복 read를 표시하는 환경입니다. 같은 이미지가 WGS 파이프라인의 다른 GATK 모듈(BaseRecalibrator, ApplyBQSR, Mutect2 등)에도 쓰입니다.</w:t>
       </w:r>
     </w:p>
     <w:p>
@@ -3808,7 +3843,7 @@
         <w:t xml:space="preserve">Description (English):</w:t>
       </w:r>
       <w:r>
-        <w:t xml:space="preserve"> SAMtools environment for removing organellar (mitochondrial and chloroplast) reads from aligned BAM files.</w:t>
+        <w:t xml:space="preserve"> GATK (Picard) environment for marking duplicate reads in BAM files. The same image serves the other GATK modules of the WGS pipeline (BaseRecalibrator, ApplyBQSR, Mutect2 and others).</w:t>
       </w:r>
     </w:p>
     <w:tbl>
@@ -3894,7 +3929,7 @@
                 <w:sz w:val="18"/>
                 <w:szCs w:val="18"/>
               </w:rPr>
-              <w:t xml:space="preserve">SAMtools</w:t>
+              <w:t xml:space="preserve">GATK</w:t>
             </w:r>
           </w:p>
         </w:tc>
@@ -3914,7 +3949,7 @@
                 <w:sz w:val="18"/>
                 <w:szCs w:val="18"/>
               </w:rPr>
-              <w:t xml:space="preserve">1.23.1</w:t>
+              <w:t xml:space="preserve">4.6.2.0</w:t>
             </w:r>
           </w:p>
         </w:tc>
@@ -3936,6 +3971,48 @@
                 <w:sz w:val="18"/>
                 <w:szCs w:val="18"/>
               </w:rPr>
+              <w:t xml:space="preserve">SAMtools</w:t>
+            </w:r>
+          </w:p>
+        </w:tc>
+        <w:tc>
+          <w:tcPr>
+            <w:tcW w:type="dxa" w:w="4753"/>
+            <w:tcMar>
+              <w:top w:type="dxa" w:w="60"/>
+              <w:left w:type="dxa" w:w="90"/>
+              <w:bottom w:type="dxa" w:w="60"/>
+              <w:right w:type="dxa" w:w="90"/>
+            </w:tcMar>
+          </w:tcPr>
+          <w:p>
+            <w:r>
+              <w:rPr>
+                <w:sz w:val="18"/>
+                <w:szCs w:val="18"/>
+              </w:rPr>
+              <w:t xml:space="preserve">1.24</w:t>
+            </w:r>
+          </w:p>
+        </w:tc>
+      </w:tr>
+      <w:tr>
+        <w:tc>
+          <w:tcPr>
+            <w:tcW w:type="dxa" w:w="4753"/>
+            <w:tcMar>
+              <w:top w:type="dxa" w:w="60"/>
+              <w:left w:type="dxa" w:w="90"/>
+              <w:bottom w:type="dxa" w:w="60"/>
+              <w:right w:type="dxa" w:w="90"/>
+            </w:tcMar>
+          </w:tcPr>
+          <w:p>
+            <w:r>
+              <w:rPr>
+                <w:sz w:val="18"/>
+                <w:szCs w:val="18"/>
+              </w:rPr>
               <w:t xml:space="preserve">HTSlib</w:t>
             </w:r>
           </w:p>
@@ -3956,7 +4033,49 @@
                 <w:sz w:val="18"/>
                 <w:szCs w:val="18"/>
               </w:rPr>
-              <w:t xml:space="preserve">1.23.1</w:t>
+              <w:t xml:space="preserve">1.24</w:t>
+            </w:r>
+          </w:p>
+        </w:tc>
+      </w:tr>
+      <w:tr>
+        <w:tc>
+          <w:tcPr>
+            <w:tcW w:type="dxa" w:w="4753"/>
+            <w:tcMar>
+              <w:top w:type="dxa" w:w="60"/>
+              <w:left w:type="dxa" w:w="90"/>
+              <w:bottom w:type="dxa" w:w="60"/>
+              <w:right w:type="dxa" w:w="90"/>
+            </w:tcMar>
+          </w:tcPr>
+          <w:p>
+            <w:r>
+              <w:rPr>
+                <w:sz w:val="18"/>
+                <w:szCs w:val="18"/>
+              </w:rPr>
+              <w:t xml:space="preserve">OpenJDK</w:t>
+            </w:r>
+          </w:p>
+        </w:tc>
+        <w:tc>
+          <w:tcPr>
+            <w:tcW w:type="dxa" w:w="4753"/>
+            <w:tcMar>
+              <w:top w:type="dxa" w:w="60"/>
+              <w:left w:type="dxa" w:w="90"/>
+              <w:bottom w:type="dxa" w:w="60"/>
+              <w:right w:type="dxa" w:w="90"/>
+            </w:tcMar>
+          </w:tcPr>
+          <w:p>
+            <w:r>
+              <w:rPr>
+                <w:sz w:val="18"/>
+                <w:szCs w:val="18"/>
+              </w:rPr>
+              <w:t xml:space="preserve">17</w:t>
             </w:r>
           </w:p>
         </w:tc>
@@ -3983,7 +4102,7 @@
         <w:spacing w:after="140"/>
       </w:pPr>
       <w:r>
-        <w:t xml:space="preserve">정렬된 BAM 파일에서 미토콘드리아와 엽록체 등 세포소기관 염색체에 정렬된 read를 제거합니다. ATAC-seq에서는 Tn5가 뉴클레오솜이 없는 세포소기관 DNA를 많이 자르기 때문에 이 read의 비율이 높게 나타나며, 그대로 두면 peak 검출과 정규화에 영향을 줍니다.</w:t>
+        <w:t xml:space="preserve">정렬된 BAM에서 PCR·광학 중복 read를 찾아 표시합니다. 같은 위치에서 시작하고 같은 방향인 read 쌍을 중복으로 보고, 그중 염기 품질 합이 가장 높은 쌍 하나만 남기고 나머지에 중복 표시(flag 0x400)를 붙입니다.</w:t>
       </w:r>
     </w:p>
     <w:p>
@@ -3996,7 +4115,7 @@
         <w:spacing w:after="80"/>
       </w:pPr>
       <w:r>
-        <w:t xml:space="preserve">세포소기관 염색체 이름을 정규식으로 찾아 제외합니다(chrM, MT, Pt, chrC 등).</w:t>
+        <w:t xml:space="preserve">read는 지우지 않고 표시만 합니다. 이후 모듈은 이 표시를 보고 중복을 뺄 수 있습니다.</w:t>
       </w:r>
     </w:p>
     <w:p>
@@ -4009,7 +4128,7 @@
         <w:spacing w:after="80"/>
       </w:pPr>
       <w:r>
-        <w:t xml:space="preserve">제거 전후의 idxstats와 flagstat, 제거한 염색체 목록과 요약표를 함께 만듭니다.</w:t>
+        <w:t xml:space="preserve">샘플마다 중복 표시된 BAM과 인덱스(.bai), 중복 통계(duplicate metrics)를 만듭니다.</w:t>
       </w:r>
     </w:p>
     <w:p>
@@ -4022,30 +4141,17 @@
         <w:spacing w:after="80"/>
       </w:pPr>
       <w:r>
-        <w:t xml:space="preserve">결과 BAM은 ATAC_QC 모듈의 입력으로 사용합니다.</w:t>
-      </w:r>
-    </w:p>
-    <w:p>
-      <w:pPr>
-        <w:spacing w:after="100" w:before="200"/>
-      </w:pPr>
-      <w:r>
-        <w:rPr>
-          <w:b/>
-          <w:bCs/>
-          <w:color w:val="3A3A3A"/>
-          <w:sz w:val="24"/>
-          <w:szCs w:val="24"/>
-        </w:rPr>
-        <w:t xml:space="preserve">내용(영문)</w:t>
-      </w:r>
-    </w:p>
-    <w:p>
-      <w:pPr>
-        <w:spacing w:after="140"/>
-      </w:pPr>
-      <w:r>
-        <w:t xml:space="preserve">Removes reads aligned to organellar chromosomes such as mitochondria and chloroplasts from aligned BAM files. In ATAC-seq, Tn5 cuts nucleosome-free organellar DNA heavily, so these reads are often abundant and can bias peak calling and normalization.</w:t>
+        <w:t xml:space="preserve">입력 폴더에서 </w:t>
+      </w:r>
+      <w:r>
+        <w:rPr>
+          <w:i/>
+          <w:iCs/>
+        </w:rPr>
+        <w:t xml:space="preserve">sorted.bam을 모두 찾아(하위 폴더 포함, </w:t>
+      </w:r>
+      <w:r>
+        <w:t xml:space="preserve">unsorted.bam 제외) 차례로 처리합니다.</w:t>
       </w:r>
     </w:p>
     <w:p>
@@ -4058,7 +4164,30 @@
         <w:spacing w:after="80"/>
       </w:pPr>
       <w:r>
-        <w:t xml:space="preserve">Organellar chromosomes are matched by a regular expression and excluded (chrM, MT, Pt, chrC, and so on).</w:t>
+        <w:t xml:space="preserve">결과 BAM은 organellar_filter 모듈의 입력으로 사용합니다.</w:t>
+      </w:r>
+    </w:p>
+    <w:p>
+      <w:pPr>
+        <w:spacing w:after="100" w:before="200"/>
+      </w:pPr>
+      <w:r>
+        <w:rPr>
+          <w:b/>
+          <w:bCs/>
+          <w:color w:val="3A3A3A"/>
+          <w:sz w:val="24"/>
+          <w:szCs w:val="24"/>
+        </w:rPr>
+        <w:t xml:space="preserve">내용(영문)</w:t>
+      </w:r>
+    </w:p>
+    <w:p>
+      <w:pPr>
+        <w:spacing w:after="140"/>
+      </w:pPr>
+      <w:r>
+        <w:t xml:space="preserve">Finds and marks PCR and optical duplicate reads in aligned BAM files. Read pairs that start at the same position in the same orientation are duplicates; the pair with the highest sum of base qualities is kept and the others get the duplicate flag (0x400).</w:t>
       </w:r>
     </w:p>
     <w:p>
@@ -4071,7 +4200,7 @@
         <w:spacing w:after="80"/>
       </w:pPr>
       <w:r>
-        <w:t xml:space="preserve">idxstats and flagstat before and after filtering, the list of removed contigs, and a summary table are written.</w:t>
+        <w:t xml:space="preserve">Reads are marked, not removed, so later modules can exclude them by the flag.</w:t>
       </w:r>
     </w:p>
     <w:p>
@@ -4084,7 +4213,43 @@
         <w:spacing w:after="80"/>
       </w:pPr>
       <w:r>
-        <w:t xml:space="preserve">The filtered BAM files are the input of the ATAC_QC module.</w:t>
+        <w:t xml:space="preserve">Each sample gives a duplicate-marked BAM with its index (.bai) and duplicate metrics.</w:t>
+      </w:r>
+    </w:p>
+    <w:p>
+      <w:pPr>
+        <w:pStyle w:val="ListParagraph"/>
+        <w:numPr>
+          <w:ilvl w:val="0"/>
+          <w:numId w:val="2"/>
+        </w:numPr>
+        <w:spacing w:after="80"/>
+      </w:pPr>
+      <w:r>
+        <w:t xml:space="preserve">All </w:t>
+      </w:r>
+      <w:r>
+        <w:rPr>
+          <w:i/>
+          <w:iCs/>
+        </w:rPr>
+        <w:t xml:space="preserve">sorted.bam files in the input folder (subfolders included, </w:t>
+      </w:r>
+      <w:r>
+        <w:t xml:space="preserve">unsorted.bam excluded) are processed one after another.</w:t>
+      </w:r>
+    </w:p>
+    <w:p>
+      <w:pPr>
+        <w:pStyle w:val="ListParagraph"/>
+        <w:numPr>
+          <w:ilvl w:val="0"/>
+          <w:numId w:val="2"/>
+        </w:numPr>
+        <w:spacing w:after="80"/>
+      </w:pPr>
+      <w:r>
+        <w:t xml:space="preserve">The BAM files are the input of the organellar_filter module.</w:t>
       </w:r>
     </w:p>
     <w:p>
@@ -4390,6 +4555,2524 @@
                 <w:sz w:val="18"/>
                 <w:szCs w:val="18"/>
               </w:rPr>
+              <w:t xml:space="preserve">/data/bowtie2</w:t>
+            </w:r>
+          </w:p>
+        </w:tc>
+        <w:tc>
+          <w:tcPr>
+            <w:tcW w:type="dxa" w:w="2140"/>
+            <w:tcMar>
+              <w:top w:type="dxa" w:w="60"/>
+              <w:left w:type="dxa" w:w="90"/>
+              <w:bottom w:type="dxa" w:w="60"/>
+              <w:right w:type="dxa" w:w="90"/>
+            </w:tcMar>
+          </w:tcPr>
+          <w:p>
+            <w:r>
+              <w:rPr>
+                <w:sz w:val="18"/>
+                <w:szCs w:val="18"/>
+              </w:rPr>
+              <w:t xml:space="preserve">좌표 정렬된 BAM 폴더(</w:t>
+            </w:r>
+            <w:r>
+              <w:rPr>
+                <w:i/>
+                <w:iCs/>
+                <w:sz w:val="18"/>
+                <w:szCs w:val="18"/>
+              </w:rPr>
+              <w:t xml:space="preserve">sorted.bam; 하위 폴더 포함, </w:t>
+            </w:r>
+            <w:r>
+              <w:rPr>
+                <w:sz w:val="18"/>
+                <w:szCs w:val="18"/>
+              </w:rPr>
+              <w:t xml:space="preserve">unsorted.bam 제외). bowtie2의 output_dir. 임시 폴더를 이 안에 만들므로 쓰기 권한이 필요</w:t>
+            </w:r>
+          </w:p>
+        </w:tc>
+        <w:tc>
+          <w:tcPr>
+            <w:tcW w:type="dxa" w:w="2146"/>
+            <w:tcMar>
+              <w:top w:type="dxa" w:w="60"/>
+              <w:left w:type="dxa" w:w="90"/>
+              <w:bottom w:type="dxa" w:w="60"/>
+              <w:right w:type="dxa" w:w="90"/>
+            </w:tcMar>
+          </w:tcPr>
+          <w:p>
+            <w:r>
+              <w:rPr>
+                <w:sz w:val="18"/>
+                <w:szCs w:val="18"/>
+              </w:rPr>
+              <w:t xml:space="preserve">Folder of coordinate-sorted BAM files (</w:t>
+            </w:r>
+            <w:r>
+              <w:rPr>
+                <w:i/>
+                <w:iCs/>
+                <w:sz w:val="18"/>
+                <w:szCs w:val="18"/>
+              </w:rPr>
+              <w:t xml:space="preserve">sorted.bam; subfolders included, </w:t>
+            </w:r>
+            <w:r>
+              <w:rPr>
+                <w:sz w:val="18"/>
+                <w:szCs w:val="18"/>
+              </w:rPr>
+              <w:t xml:space="preserve">unsorted.bam excluded); output_dir of bowtie2. Temporary folders are made inside it, so it must be writable</w:t>
+            </w:r>
+          </w:p>
+        </w:tc>
+      </w:tr>
+      <w:tr>
+        <w:tc>
+          <w:tcPr>
+            <w:tcW w:type="dxa" w:w="920"/>
+            <w:tcMar>
+              <w:top w:type="dxa" w:w="60"/>
+              <w:left w:type="dxa" w:w="90"/>
+              <w:bottom w:type="dxa" w:w="60"/>
+              <w:right w:type="dxa" w:w="90"/>
+            </w:tcMar>
+          </w:tcPr>
+          <w:p>
+            <w:r>
+              <w:rPr>
+                <w:sz w:val="18"/>
+                <w:szCs w:val="18"/>
+              </w:rPr>
+              <w:t xml:space="preserve">Output</w:t>
+            </w:r>
+          </w:p>
+        </w:tc>
+        <w:tc>
+          <w:tcPr>
+            <w:tcW w:type="dxa" w:w="950"/>
+            <w:tcMar>
+              <w:top w:type="dxa" w:w="60"/>
+              <w:left w:type="dxa" w:w="90"/>
+              <w:bottom w:type="dxa" w:w="60"/>
+              <w:right w:type="dxa" w:w="90"/>
+            </w:tcMar>
+          </w:tcPr>
+          <w:p>
+            <w:r>
+              <w:rPr>
+                <w:sz w:val="18"/>
+                <w:szCs w:val="18"/>
+              </w:rPr>
+              <w:t xml:space="preserve">Required</w:t>
+            </w:r>
+          </w:p>
+        </w:tc>
+        <w:tc>
+          <w:tcPr>
+            <w:tcW w:type="dxa" w:w="950"/>
+            <w:tcMar>
+              <w:top w:type="dxa" w:w="60"/>
+              <w:left w:type="dxa" w:w="90"/>
+              <w:bottom w:type="dxa" w:w="60"/>
+              <w:right w:type="dxa" w:w="90"/>
+            </w:tcMar>
+          </w:tcPr>
+          <w:p>
+            <w:r>
+              <w:rPr>
+                <w:sz w:val="18"/>
+                <w:szCs w:val="18"/>
+              </w:rPr>
+              <w:t xml:space="preserve">Directory</w:t>
+            </w:r>
+          </w:p>
+        </w:tc>
+        <w:tc>
+          <w:tcPr>
+            <w:tcW w:type="dxa" w:w="1400"/>
+            <w:tcMar>
+              <w:top w:type="dxa" w:w="60"/>
+              <w:left w:type="dxa" w:w="90"/>
+              <w:bottom w:type="dxa" w:w="60"/>
+              <w:right w:type="dxa" w:w="90"/>
+            </w:tcMar>
+          </w:tcPr>
+          <w:p>
+            <w:r>
+              <w:rPr>
+                <w:sz w:val="18"/>
+                <w:szCs w:val="18"/>
+              </w:rPr>
+              <w:t xml:space="preserve">output_dir</w:t>
+            </w:r>
+          </w:p>
+        </w:tc>
+        <w:tc>
+          <w:tcPr>
+            <w:tcW w:type="dxa" w:w="1000"/>
+            <w:tcMar>
+              <w:top w:type="dxa" w:w="60"/>
+              <w:left w:type="dxa" w:w="90"/>
+              <w:bottom w:type="dxa" w:w="60"/>
+              <w:right w:type="dxa" w:w="90"/>
+            </w:tcMar>
+          </w:tcPr>
+          <w:p>
+            <w:r>
+              <w:rPr>
+                <w:sz w:val="18"/>
+                <w:szCs w:val="18"/>
+              </w:rPr>
+              <w:t xml:space="preserve">/data/markdup</w:t>
+            </w:r>
+          </w:p>
+        </w:tc>
+        <w:tc>
+          <w:tcPr>
+            <w:tcW w:type="dxa" w:w="2140"/>
+            <w:tcMar>
+              <w:top w:type="dxa" w:w="60"/>
+              <w:left w:type="dxa" w:w="90"/>
+              <w:bottom w:type="dxa" w:w="60"/>
+              <w:right w:type="dxa" w:w="90"/>
+            </w:tcMar>
+          </w:tcPr>
+          <w:p>
+            <w:r>
+              <w:rPr>
+                <w:sz w:val="18"/>
+                <w:szCs w:val="18"/>
+              </w:rPr>
+              <w:t xml:space="preserve">결과 폴더(중복 표시 BAM, .bai, 중복 통계, 샘플별 로그). organellar_filter의 input_dir</w:t>
+            </w:r>
+          </w:p>
+        </w:tc>
+        <w:tc>
+          <w:tcPr>
+            <w:tcW w:type="dxa" w:w="2146"/>
+            <w:tcMar>
+              <w:top w:type="dxa" w:w="60"/>
+              <w:left w:type="dxa" w:w="90"/>
+              <w:bottom w:type="dxa" w:w="60"/>
+              <w:right w:type="dxa" w:w="90"/>
+            </w:tcMar>
+          </w:tcPr>
+          <w:p>
+            <w:r>
+              <w:rPr>
+                <w:sz w:val="18"/>
+                <w:szCs w:val="18"/>
+              </w:rPr>
+              <w:t xml:space="preserve">Output folder (duplicate-marked BAM, .bai, duplicate metrics, per-sample logs); input_dir of organellar_filter</w:t>
+            </w:r>
+          </w:p>
+        </w:tc>
+      </w:tr>
+      <w:tr>
+        <w:tc>
+          <w:tcPr>
+            <w:tcW w:type="dxa" w:w="920"/>
+            <w:tcMar>
+              <w:top w:type="dxa" w:w="60"/>
+              <w:left w:type="dxa" w:w="90"/>
+              <w:bottom w:type="dxa" w:w="60"/>
+              <w:right w:type="dxa" w:w="90"/>
+            </w:tcMar>
+          </w:tcPr>
+          <w:p>
+            <w:r>
+              <w:rPr>
+                <w:sz w:val="18"/>
+                <w:szCs w:val="18"/>
+              </w:rPr>
+              <w:t xml:space="preserve">Option</w:t>
+            </w:r>
+          </w:p>
+        </w:tc>
+        <w:tc>
+          <w:tcPr>
+            <w:tcW w:type="dxa" w:w="950"/>
+            <w:tcMar>
+              <w:top w:type="dxa" w:w="60"/>
+              <w:left w:type="dxa" w:w="90"/>
+              <w:bottom w:type="dxa" w:w="60"/>
+              <w:right w:type="dxa" w:w="90"/>
+            </w:tcMar>
+          </w:tcPr>
+          <w:p>
+            <w:r>
+              <w:rPr>
+                <w:sz w:val="18"/>
+                <w:szCs w:val="18"/>
+              </w:rPr>
+              <w:t xml:space="preserve">Required</w:t>
+            </w:r>
+          </w:p>
+        </w:tc>
+        <w:tc>
+          <w:tcPr>
+            <w:tcW w:type="dxa" w:w="950"/>
+            <w:tcMar>
+              <w:top w:type="dxa" w:w="60"/>
+              <w:left w:type="dxa" w:w="90"/>
+              <w:bottom w:type="dxa" w:w="60"/>
+              <w:right w:type="dxa" w:w="90"/>
+            </w:tcMar>
+          </w:tcPr>
+          <w:p>
+            <w:r>
+              <w:rPr>
+                <w:sz w:val="18"/>
+                <w:szCs w:val="18"/>
+              </w:rPr>
+              <w:t xml:space="preserve">File</w:t>
+            </w:r>
+          </w:p>
+        </w:tc>
+        <w:tc>
+          <w:tcPr>
+            <w:tcW w:type="dxa" w:w="1400"/>
+            <w:tcMar>
+              <w:top w:type="dxa" w:w="60"/>
+              <w:left w:type="dxa" w:w="90"/>
+              <w:bottom w:type="dxa" w:w="60"/>
+              <w:right w:type="dxa" w:w="90"/>
+            </w:tcMar>
+          </w:tcPr>
+          <w:p>
+            <w:r>
+              <w:rPr>
+                <w:sz w:val="18"/>
+                <w:szCs w:val="18"/>
+              </w:rPr>
+              <w:t xml:space="preserve">ref_genome</w:t>
+            </w:r>
+          </w:p>
+        </w:tc>
+        <w:tc>
+          <w:tcPr>
+            <w:tcW w:type="dxa" w:w="1000"/>
+            <w:tcMar>
+              <w:top w:type="dxa" w:w="60"/>
+              <w:left w:type="dxa" w:w="90"/>
+              <w:bottom w:type="dxa" w:w="60"/>
+              <w:right w:type="dxa" w:w="90"/>
+            </w:tcMar>
+          </w:tcPr>
+          <w:p>
+            <w:r>
+              <w:rPr>
+                <w:sz w:val="18"/>
+                <w:szCs w:val="18"/>
+              </w:rPr>
+              <w:t xml:space="preserve">/ref/genome.fa</w:t>
+            </w:r>
+          </w:p>
+        </w:tc>
+        <w:tc>
+          <w:tcPr>
+            <w:tcW w:type="dxa" w:w="2140"/>
+            <w:tcMar>
+              <w:top w:type="dxa" w:w="60"/>
+              <w:left w:type="dxa" w:w="90"/>
+              <w:bottom w:type="dxa" w:w="60"/>
+              <w:right w:type="dxa" w:w="90"/>
+            </w:tcMar>
+          </w:tcPr>
+          <w:p>
+            <w:r>
+              <w:rPr>
+                <w:sz w:val="18"/>
+                <w:szCs w:val="18"/>
+              </w:rPr>
+              <w:t xml:space="preserve">참조 유전체 FASTA. BAM을 정렬할 때 쓴 것과 같은 유전체</w:t>
+            </w:r>
+          </w:p>
+        </w:tc>
+        <w:tc>
+          <w:tcPr>
+            <w:tcW w:type="dxa" w:w="2146"/>
+            <w:tcMar>
+              <w:top w:type="dxa" w:w="60"/>
+              <w:left w:type="dxa" w:w="90"/>
+              <w:bottom w:type="dxa" w:w="60"/>
+              <w:right w:type="dxa" w:w="90"/>
+            </w:tcMar>
+          </w:tcPr>
+          <w:p>
+            <w:r>
+              <w:rPr>
+                <w:sz w:val="18"/>
+                <w:szCs w:val="18"/>
+              </w:rPr>
+              <w:t xml:space="preserve">Reference genome FASTA; the same genome the BAM files were aligned to</w:t>
+            </w:r>
+          </w:p>
+        </w:tc>
+      </w:tr>
+    </w:tbl>
+    <w:p/>
+    <w:p>
+      <w:pPr>
+        <w:spacing w:after="100" w:before="200"/>
+      </w:pPr>
+      <w:r>
+        <w:rPr>
+          <w:b/>
+          <w:bCs/>
+          <w:color w:val="3A3A3A"/>
+          <w:sz w:val="24"/>
+          <w:szCs w:val="24"/>
+        </w:rPr>
+        <w:t xml:space="preserve">주요 사항</w:t>
+      </w:r>
+    </w:p>
+    <w:tbl>
+      <w:tblPr>
+        <w:tblW w:type="dxa" w:w="9506"/>
+        <w:tblBorders>
+          <w:top w:val="single" w:color="auto" w:sz="4"/>
+          <w:left w:val="single" w:color="auto" w:sz="4"/>
+          <w:bottom w:val="single" w:color="auto" w:sz="4"/>
+          <w:right w:val="single" w:color="auto" w:sz="4"/>
+          <w:insideH w:val="single" w:color="auto" w:sz="4"/>
+          <w:insideV w:val="single" w:color="auto" w:sz="4"/>
+        </w:tblBorders>
+      </w:tblPr>
+      <w:tblGrid>
+        <w:gridCol w:w="4753"/>
+        <w:gridCol w:w="4753"/>
+      </w:tblGrid>
+      <w:tr>
+        <w:tc>
+          <w:tcPr>
+            <w:tcW w:type="dxa" w:w="4753"/>
+            <w:shd w:fill="E8EDF6" w:color="auto" w:val="clear"/>
+            <w:tcMar>
+              <w:top w:type="dxa" w:w="60"/>
+              <w:left w:type="dxa" w:w="90"/>
+              <w:bottom w:type="dxa" w:w="60"/>
+              <w:right w:type="dxa" w:w="90"/>
+            </w:tcMar>
+          </w:tcPr>
+          <w:p>
+            <w:r>
+              <w:rPr>
+                <w:b/>
+                <w:bCs/>
+                <w:color w:val="32549C"/>
+                <w:sz w:val="18"/>
+                <w:szCs w:val="18"/>
+              </w:rPr>
+              <w:t xml:space="preserve">국문</w:t>
+            </w:r>
+          </w:p>
+        </w:tc>
+        <w:tc>
+          <w:tcPr>
+            <w:tcW w:type="dxa" w:w="4753"/>
+            <w:shd w:fill="E8EDF6" w:color="auto" w:val="clear"/>
+            <w:tcMar>
+              <w:top w:type="dxa" w:w="60"/>
+              <w:left w:type="dxa" w:w="90"/>
+              <w:bottom w:type="dxa" w:w="60"/>
+              <w:right w:type="dxa" w:w="90"/>
+            </w:tcMar>
+          </w:tcPr>
+          <w:p>
+            <w:r>
+              <w:rPr>
+                <w:b/>
+                <w:bCs/>
+                <w:color w:val="32549C"/>
+                <w:sz w:val="18"/>
+                <w:szCs w:val="18"/>
+              </w:rPr>
+              <w:t xml:space="preserve">영문</w:t>
+            </w:r>
+          </w:p>
+        </w:tc>
+      </w:tr>
+      <w:tr>
+        <w:tc>
+          <w:tcPr>
+            <w:tcW w:type="dxa" w:w="4753"/>
+            <w:tcMar>
+              <w:top w:type="dxa" w:w="60"/>
+              <w:left w:type="dxa" w:w="90"/>
+              <w:bottom w:type="dxa" w:w="60"/>
+              <w:right w:type="dxa" w:w="90"/>
+            </w:tcMar>
+          </w:tcPr>
+          <w:p>
+            <w:r>
+              <w:rPr>
+                <w:sz w:val="18"/>
+                <w:szCs w:val="18"/>
+              </w:rPr>
+              <w:t xml:space="preserve">입력 BAM에 read group(@RG)이 있어야 합니다. GATK 4.6은 read group이 없는 BAM에서 NullPointerException으로 멈춥니다. bowtie2 1.3 이상의 결과에는 read group이 들어 있으며, 이전 bowtie2 결과는 다시 정렬해 주세요.</w:t>
+            </w:r>
+          </w:p>
+        </w:tc>
+        <w:tc>
+          <w:tcPr>
+            <w:tcW w:type="dxa" w:w="4753"/>
+            <w:tcMar>
+              <w:top w:type="dxa" w:w="60"/>
+              <w:left w:type="dxa" w:w="90"/>
+              <w:bottom w:type="dxa" w:w="60"/>
+              <w:right w:type="dxa" w:w="90"/>
+            </w:tcMar>
+          </w:tcPr>
+          <w:p>
+            <w:r>
+              <w:rPr>
+                <w:sz w:val="18"/>
+                <w:szCs w:val="18"/>
+              </w:rPr>
+              <w:t xml:space="preserve">The input BAM files need read groups (@RG). GATK 4.6 stops with a NullPointerException on BAM files without them. bowtie2 1.3 or later writes read groups; realign BAM files from earlier bowtie2 versions.</w:t>
+            </w:r>
+          </w:p>
+        </w:tc>
+      </w:tr>
+      <w:tr>
+        <w:tc>
+          <w:tcPr>
+            <w:tcW w:type="dxa" w:w="4753"/>
+            <w:tcMar>
+              <w:top w:type="dxa" w:w="60"/>
+              <w:left w:type="dxa" w:w="90"/>
+              <w:bottom w:type="dxa" w:w="60"/>
+              <w:right w:type="dxa" w:w="90"/>
+            </w:tcMar>
+          </w:tcPr>
+          <w:p>
+            <w:r>
+              <w:rPr>
+                <w:sz w:val="18"/>
+                <w:szCs w:val="18"/>
+              </w:rPr>
+              <w:t xml:space="preserve">Java 메모리가 20GB로 고정되어 있습니다. 실행 메모리는 24GB 이상을 골라 주세요. 그보다 작으면 큰 BAM에서 메모리 초과로 중단될 수 있습니다.</w:t>
+            </w:r>
+          </w:p>
+        </w:tc>
+        <w:tc>
+          <w:tcPr>
+            <w:tcW w:type="dxa" w:w="4753"/>
+            <w:tcMar>
+              <w:top w:type="dxa" w:w="60"/>
+              <w:left w:type="dxa" w:w="90"/>
+              <w:bottom w:type="dxa" w:w="60"/>
+              <w:right w:type="dxa" w:w="90"/>
+            </w:tcMar>
+          </w:tcPr>
+          <w:p>
+            <w:r>
+              <w:rPr>
+                <w:sz w:val="18"/>
+                <w:szCs w:val="18"/>
+              </w:rPr>
+              <w:t xml:space="preserve">The Java heap is fixed at 20 GB. Choose 24 GB of memory or more; with less, a large BAM can be stopped for exceeding memory.</w:t>
+            </w:r>
+          </w:p>
+        </w:tc>
+      </w:tr>
+      <w:tr>
+        <w:tc>
+          <w:tcPr>
+            <w:tcW w:type="dxa" w:w="4753"/>
+            <w:tcMar>
+              <w:top w:type="dxa" w:w="60"/>
+              <w:left w:type="dxa" w:w="90"/>
+              <w:bottom w:type="dxa" w:w="60"/>
+              <w:right w:type="dxa" w:w="90"/>
+            </w:tcMar>
+          </w:tcPr>
+          <w:p>
+            <w:r>
+              <w:rPr>
+                <w:sz w:val="18"/>
+                <w:szCs w:val="18"/>
+              </w:rPr>
+              <w:t xml:space="preserve">샘플별 임시 폴더(temp_&lt;sample&gt;_...)를 input_dir 안에 만들고 끝나면 지웁니다. input_dir에 쓰기 권한이 있어야 합니다.</w:t>
+            </w:r>
+          </w:p>
+        </w:tc>
+        <w:tc>
+          <w:tcPr>
+            <w:tcW w:type="dxa" w:w="4753"/>
+            <w:tcMar>
+              <w:top w:type="dxa" w:w="60"/>
+              <w:left w:type="dxa" w:w="90"/>
+              <w:bottom w:type="dxa" w:w="60"/>
+              <w:right w:type="dxa" w:w="90"/>
+            </w:tcMar>
+          </w:tcPr>
+          <w:p>
+            <w:r>
+              <w:rPr>
+                <w:sz w:val="18"/>
+                <w:szCs w:val="18"/>
+              </w:rPr>
+              <w:t xml:space="preserve">A temporary folder per sample (temp_&lt;sample&gt;_...) is made inside input_dir and removed afterwards, so input_dir must be writable.</w:t>
+            </w:r>
+          </w:p>
+        </w:tc>
+      </w:tr>
+      <w:tr>
+        <w:tc>
+          <w:tcPr>
+            <w:tcW w:type="dxa" w:w="4753"/>
+            <w:tcMar>
+              <w:top w:type="dxa" w:w="60"/>
+              <w:left w:type="dxa" w:w="90"/>
+              <w:bottom w:type="dxa" w:w="60"/>
+              <w:right w:type="dxa" w:w="90"/>
+            </w:tcMar>
+          </w:tcPr>
+          <w:p>
+            <w:r>
+              <w:rPr>
+                <w:sz w:val="18"/>
+                <w:szCs w:val="18"/>
+              </w:rPr>
+              <w:t xml:space="preserve">GATK의 실행 기록과 오류는 실행 로그가 아니라 output_dir의 &lt;sample&gt;_markduplicates.log에 남습니다. 샘플이 실패하면 이 파일을 확인해 주세요. 한 샘플이라도 실패하면 모듈은 실패(종료 코드 1)로 끝납니다.</w:t>
+            </w:r>
+          </w:p>
+        </w:tc>
+        <w:tc>
+          <w:tcPr>
+            <w:tcW w:type="dxa" w:w="4753"/>
+            <w:tcMar>
+              <w:top w:type="dxa" w:w="60"/>
+              <w:left w:type="dxa" w:w="90"/>
+              <w:bottom w:type="dxa" w:w="60"/>
+              <w:right w:type="dxa" w:w="90"/>
+            </w:tcMar>
+          </w:tcPr>
+          <w:p>
+            <w:r>
+              <w:rPr>
+                <w:sz w:val="18"/>
+                <w:szCs w:val="18"/>
+              </w:rPr>
+              <w:t xml:space="preserve">GATK's own output and errors go to &lt;sample&gt;_markduplicates.log in output_dir, not to the run log; check it when a sample fails. If any sample fails, the module ends as failed (exit code 1).</w:t>
+            </w:r>
+          </w:p>
+        </w:tc>
+      </w:tr>
+      <w:tr>
+        <w:tc>
+          <w:tcPr>
+            <w:tcW w:type="dxa" w:w="4753"/>
+            <w:tcMar>
+              <w:top w:type="dxa" w:w="60"/>
+              <w:left w:type="dxa" w:w="90"/>
+              <w:bottom w:type="dxa" w:w="60"/>
+              <w:right w:type="dxa" w:w="90"/>
+            </w:tcMar>
+          </w:tcPr>
+          <w:p>
+            <w:r>
+              <w:rPr>
+                <w:sz w:val="18"/>
+                <w:szCs w:val="18"/>
+              </w:rPr>
+              <w:t xml:space="preserve">SRA에서 받은 데이터는 read 이름(SRR...1)에 좌표가 없어 "read name ... did not start with a parsable number" 경고가 나옵니다. 광학 중복만 구분하지 못할 뿐 중복 표시는 정상입니다.</w:t>
+            </w:r>
+          </w:p>
+        </w:tc>
+        <w:tc>
+          <w:tcPr>
+            <w:tcW w:type="dxa" w:w="4753"/>
+            <w:tcMar>
+              <w:top w:type="dxa" w:w="60"/>
+              <w:left w:type="dxa" w:w="90"/>
+              <w:bottom w:type="dxa" w:w="60"/>
+              <w:right w:type="dxa" w:w="90"/>
+            </w:tcMar>
+          </w:tcPr>
+          <w:p>
+            <w:r>
+              <w:rPr>
+                <w:sz w:val="18"/>
+                <w:szCs w:val="18"/>
+              </w:rPr>
+              <w:t xml:space="preserve">Data from SRA has read names (SRR...1) without flowcell coordinates, so a "read name ... did not start with a parsable number" warning appears. Only optical duplicates cannot be told apart; duplicate marking works normally.</w:t>
+            </w:r>
+          </w:p>
+        </w:tc>
+      </w:tr>
+    </w:tbl>
+    <w:p/>
+    <w:p>
+      <w:pPr>
+        <w:spacing w:after="100" w:before="200"/>
+      </w:pPr>
+      <w:r>
+        <w:rPr>
+          <w:b/>
+          <w:bCs/>
+          <w:color w:val="3A3A3A"/>
+          <w:sz w:val="24"/>
+          <w:szCs w:val="24"/>
+        </w:rPr>
+        <w:t xml:space="preserve">분석 개념 이미지</w:t>
+      </w:r>
+    </w:p>
+    <w:p>
+      <w:pPr>
+        <w:spacing w:after="120"/>
+      </w:pPr>
+      <w:r>
+        <w:rPr>
+          <w:b/>
+          <w:bCs/>
+          <w:color w:val="B0B0B0"/>
+          <w:sz w:val="18"/>
+          <w:szCs w:val="18"/>
+        </w:rPr>
+        <w:t xml:space="preserve">[내부 메모 · 붙여 넣지 마세요] </w:t>
+      </w:r>
+      <w:r>
+        <w:rPr>
+          <w:color w:val="8A8F99"/>
+          <w:sz w:val="18"/>
+          <w:szCs w:val="18"/>
+        </w:rPr>
+        <w:t xml:space="preserve">등록 메모: 개념도는 아직 만들지 않았다.</w:t>
+      </w:r>
+    </w:p>
+    <w:p>
+      <w:pPr>
+        <w:spacing w:after="100" w:before="200"/>
+      </w:pPr>
+      <w:r>
+        <w:rPr>
+          <w:b/>
+          <w:bCs/>
+          <w:color w:val="3A3A3A"/>
+          <w:sz w:val="24"/>
+          <w:szCs w:val="24"/>
+        </w:rPr>
+        <w:t xml:space="preserve">스크립트 사용 예제</w:t>
+      </w:r>
+    </w:p>
+    <w:p>
+      <w:pPr>
+        <w:shd w:fill="F3F4F6" w:color="auto" w:val="clear"/>
+        <w:spacing w:after="0"/>
+      </w:pPr>
+      <w:r>
+        <w:rPr>
+          <w:color w:val="3A3A3A"/>
+          <w:sz w:val="19"/>
+          <w:szCs w:val="19"/>
+        </w:rPr>
+        <w:t xml:space="preserve">bash GATK_MarkDuplicates_1.0.sh \</w:t>
+      </w:r>
+    </w:p>
+    <w:p>
+      <w:pPr>
+        <w:shd w:fill="F3F4F6" w:color="auto" w:val="clear"/>
+        <w:spacing w:after="0"/>
+      </w:pPr>
+      <w:r>
+        <w:rPr>
+          <w:color w:val="3A3A3A"/>
+          <w:sz w:val="19"/>
+          <w:szCs w:val="19"/>
+        </w:rPr>
+        <w:t xml:space="preserve">  input_dir=/data/bowtie2 \</w:t>
+      </w:r>
+    </w:p>
+    <w:p>
+      <w:pPr>
+        <w:shd w:fill="F3F4F6" w:color="auto" w:val="clear"/>
+        <w:spacing w:after="0"/>
+      </w:pPr>
+      <w:r>
+        <w:rPr>
+          <w:color w:val="3A3A3A"/>
+          <w:sz w:val="19"/>
+          <w:szCs w:val="19"/>
+        </w:rPr>
+        <w:t xml:space="preserve">  output_dir=/data/markdup \</w:t>
+      </w:r>
+    </w:p>
+    <w:p>
+      <w:pPr>
+        <w:shd w:fill="F3F4F6" w:color="auto" w:val="clear"/>
+        <w:spacing w:after="0"/>
+      </w:pPr>
+      <w:r>
+        <w:rPr>
+          <w:color w:val="3A3A3A"/>
+          <w:sz w:val="19"/>
+          <w:szCs w:val="19"/>
+        </w:rPr>
+        <w:t xml:space="preserve">  ref_genome=/ref/genome.fa</w:t>
+      </w:r>
+    </w:p>
+    <w:p/>
+    <w:p>
+      <w:pPr>
+        <w:spacing w:after="100" w:before="200"/>
+      </w:pPr>
+      <w:r>
+        <w:rPr>
+          <w:b/>
+          <w:bCs/>
+          <w:color w:val="3A3A3A"/>
+          <w:sz w:val="24"/>
+          <w:szCs w:val="24"/>
+        </w:rPr>
+        <w:t xml:space="preserve">주요 결과 이미지</w:t>
+      </w:r>
+    </w:p>
+    <w:p>
+      <w:pPr>
+        <w:spacing w:after="140"/>
+      </w:pPr>
+      <w:r>
+        <w:rPr>
+          <w:b/>
+          <w:bCs/>
+        </w:rPr>
+        <w:t xml:space="preserve">결과 1. 중복 통계</w:t>
+      </w:r>
+    </w:p>
+    <w:p>
+      <w:pPr>
+        <w:pStyle w:val="ListParagraph"/>
+        <w:numPr>
+          <w:ilvl w:val="0"/>
+          <w:numId w:val="2"/>
+        </w:numPr>
+        <w:spacing w:after="80"/>
+      </w:pPr>
+      <w:r>
+        <w:t xml:space="preserve">결과 파일: 표 캡처 </w:t>
+      </w:r>
+      <w:r>
+        <w:t xml:space="preserve">&lt;sample&gt;_duplicate_metrics.txt</w:t>
+      </w:r>
+      <w:r>
+        <w:t xml:space="preserve">의 METRICS CLASS 부분 (이 모듈은 그림을 만들지 않는다)</w:t>
+      </w:r>
+    </w:p>
+    <w:p>
+      <w:pPr>
+        <w:pStyle w:val="ListParagraph"/>
+        <w:numPr>
+          <w:ilvl w:val="0"/>
+          <w:numId w:val="2"/>
+        </w:numPr>
+        <w:spacing w:after="80"/>
+      </w:pPr>
+      <w:r>
+        <w:t xml:space="preserve">레전드(국문): </w:t>
+      </w:r>
+      <w:r>
+        <w:rPr>
+          <w:b/>
+          <w:bCs/>
+        </w:rPr>
+        <w:t xml:space="preserve">샘플별 중복 read 통계.</w:t>
+      </w:r>
+      <w:r>
+        <w:t xml:space="preserve"> 검사한 read 쌍 수(READ_PAIRS_EXAMINED), 중복으로 표시된 read 쌍 수(READ_PAIR_DUPLICATES), 그중 광학 중복 수(READ_PAIR_OPTICAL_DUPLICATES), 중복 비율(PERCENT_DUPLICATION, 0~1)과 추정 라이브러리 크기(ESTIMATED_LIBRARY_SIZE)를 보여 준다. 중복 비율은 시퀀싱 깊이와 시료 양에 따라 달라지므로, 같은 실험의 샘플끼리 비교해 다른 샘플보다 크게 높은 샘플을 찾는 데 쓴다.</w:t>
+      </w:r>
+    </w:p>
+    <w:p>
+      <w:pPr>
+        <w:pStyle w:val="ListParagraph"/>
+        <w:numPr>
+          <w:ilvl w:val="0"/>
+          <w:numId w:val="2"/>
+        </w:numPr>
+        <w:spacing w:after="80"/>
+      </w:pPr>
+      <w:r>
+        <w:t xml:space="preserve">레전드(영문): </w:t>
+      </w:r>
+      <w:r>
+        <w:rPr>
+          <w:b/>
+          <w:bCs/>
+        </w:rPr>
+        <w:t xml:space="preserve">Duplicate read metrics per sample.</w:t>
+      </w:r>
+      <w:r>
+        <w:t xml:space="preserve"> The table gives the read pairs examined (READ_PAIRS_EXAMINED), the pairs marked as duplicates (READ_PAIR_DUPLICATES) and the optical duplicates among them (READ_PAIR_OPTICAL_DUPLICATES), the duplicate fraction (PERCENT_DUPLICATION, 0-1), and the estimated library size (ESTIMATED_LIBRARY_SIZE). The duplicate fraction depends on sequencing depth and input amount, so it is used to compare samples of an experiment and find ones far above the rest.</w:t>
+      </w:r>
+    </w:p>
+    <w:p>
+      <w:pPr>
+        <w:pBdr>
+          <w:bottom w:val="single" w:color="32549C" w:sz="8" w:space="4"/>
+        </w:pBdr>
+        <w:spacing w:after="160" w:before="360"/>
+      </w:pPr>
+      <w:r>
+        <w:rPr>
+          <w:rFonts w:ascii="GmarketSans" w:cs="GmarketSans" w:eastAsia="GmarketSans" w:hAnsi="GmarketSans"/>
+          <w:b/>
+          <w:bCs/>
+          <w:color w:val="32549C"/>
+          <w:sz w:val="30"/>
+          <w:szCs w:val="30"/>
+        </w:rPr>
+        <w:t xml:space="preserve">3. organellar_filter</w:t>
+      </w:r>
+    </w:p>
+    <w:p>
+      <w:pPr>
+        <w:spacing w:after="100" w:before="200"/>
+      </w:pPr>
+      <w:r>
+        <w:rPr>
+          <w:b/>
+          <w:bCs/>
+          <w:color w:val="3A3A3A"/>
+          <w:sz w:val="24"/>
+          <w:szCs w:val="24"/>
+        </w:rPr>
+        <w:t xml:space="preserve">기본 정보</w:t>
+      </w:r>
+    </w:p>
+    <w:tbl>
+      <w:tblPr>
+        <w:tblW w:type="dxa" w:w="9506"/>
+        <w:tblBorders>
+          <w:top w:val="single" w:color="auto" w:sz="4"/>
+          <w:left w:val="single" w:color="auto" w:sz="4"/>
+          <w:bottom w:val="single" w:color="auto" w:sz="4"/>
+          <w:right w:val="single" w:color="auto" w:sz="4"/>
+          <w:insideH w:val="single" w:color="auto" w:sz="4"/>
+          <w:insideV w:val="single" w:color="auto" w:sz="4"/>
+        </w:tblBorders>
+      </w:tblPr>
+      <w:tblGrid>
+        <w:gridCol w:w="1800"/>
+        <w:gridCol w:w="3853"/>
+        <w:gridCol w:w="3853"/>
+      </w:tblGrid>
+      <w:tr>
+        <w:tc>
+          <w:tcPr>
+            <w:tcW w:type="dxa" w:w="1800"/>
+            <w:shd w:fill="E8EDF6" w:color="auto" w:val="clear"/>
+            <w:tcMar>
+              <w:top w:type="dxa" w:w="60"/>
+              <w:left w:type="dxa" w:w="90"/>
+              <w:bottom w:type="dxa" w:w="60"/>
+              <w:right w:type="dxa" w:w="90"/>
+            </w:tcMar>
+          </w:tcPr>
+          <w:p>
+            <w:r>
+              <w:rPr>
+                <w:b/>
+                <w:bCs/>
+                <w:color w:val="32549C"/>
+                <w:sz w:val="18"/>
+                <w:szCs w:val="18"/>
+              </w:rPr>
+              <w:t xml:space="preserve">항목</w:t>
+            </w:r>
+          </w:p>
+        </w:tc>
+        <w:tc>
+          <w:tcPr>
+            <w:tcW w:type="dxa" w:w="3853"/>
+            <w:shd w:fill="E8EDF6" w:color="auto" w:val="clear"/>
+            <w:tcMar>
+              <w:top w:type="dxa" w:w="60"/>
+              <w:left w:type="dxa" w:w="90"/>
+              <w:bottom w:type="dxa" w:w="60"/>
+              <w:right w:type="dxa" w:w="90"/>
+            </w:tcMar>
+          </w:tcPr>
+          <w:p>
+            <w:r>
+              <w:rPr>
+                <w:b/>
+                <w:bCs/>
+                <w:color w:val="32549C"/>
+                <w:sz w:val="18"/>
+                <w:szCs w:val="18"/>
+              </w:rPr>
+              <w:t xml:space="preserve">국문</w:t>
+            </w:r>
+          </w:p>
+        </w:tc>
+        <w:tc>
+          <w:tcPr>
+            <w:tcW w:type="dxa" w:w="3853"/>
+            <w:shd w:fill="E8EDF6" w:color="auto" w:val="clear"/>
+            <w:tcMar>
+              <w:top w:type="dxa" w:w="60"/>
+              <w:left w:type="dxa" w:w="90"/>
+              <w:bottom w:type="dxa" w:w="60"/>
+              <w:right w:type="dxa" w:w="90"/>
+            </w:tcMar>
+          </w:tcPr>
+          <w:p>
+            <w:r>
+              <w:rPr>
+                <w:b/>
+                <w:bCs/>
+                <w:color w:val="32549C"/>
+                <w:sz w:val="18"/>
+                <w:szCs w:val="18"/>
+              </w:rPr>
+              <w:t xml:space="preserve">영문</w:t>
+            </w:r>
+          </w:p>
+        </w:tc>
+      </w:tr>
+      <w:tr>
+        <w:tc>
+          <w:tcPr>
+            <w:tcW w:type="dxa" w:w="1800"/>
+            <w:tcMar>
+              <w:top w:type="dxa" w:w="60"/>
+              <w:left w:type="dxa" w:w="90"/>
+              <w:bottom w:type="dxa" w:w="60"/>
+              <w:right w:type="dxa" w:w="90"/>
+            </w:tcMar>
+          </w:tcPr>
+          <w:p>
+            <w:r>
+              <w:rPr>
+                <w:sz w:val="18"/>
+                <w:szCs w:val="18"/>
+              </w:rPr>
+              <w:t xml:space="preserve">모듈명</w:t>
+            </w:r>
+          </w:p>
+        </w:tc>
+        <w:tc>
+          <w:tcPr>
+            <w:tcW w:type="dxa" w:w="3853"/>
+            <w:tcMar>
+              <w:top w:type="dxa" w:w="60"/>
+              <w:left w:type="dxa" w:w="90"/>
+              <w:bottom w:type="dxa" w:w="60"/>
+              <w:right w:type="dxa" w:w="90"/>
+            </w:tcMar>
+          </w:tcPr>
+          <w:p>
+            <w:r>
+              <w:rPr>
+                <w:sz w:val="18"/>
+                <w:szCs w:val="18"/>
+              </w:rPr>
+              <w:t xml:space="preserve">organellar_filter</w:t>
+            </w:r>
+          </w:p>
+        </w:tc>
+        <w:tc>
+          <w:tcPr>
+            <w:tcW w:type="dxa" w:w="3853"/>
+            <w:tcMar>
+              <w:top w:type="dxa" w:w="60"/>
+              <w:left w:type="dxa" w:w="90"/>
+              <w:bottom w:type="dxa" w:w="60"/>
+              <w:right w:type="dxa" w:w="90"/>
+            </w:tcMar>
+          </w:tcPr>
+          <w:p>
+            <w:r>
+              <w:rPr>
+                <w:sz w:val="18"/>
+                <w:szCs w:val="18"/>
+              </w:rPr>
+              <w:t xml:space="preserve">organellar_filter</w:t>
+            </w:r>
+          </w:p>
+        </w:tc>
+      </w:tr>
+      <w:tr>
+        <w:tc>
+          <w:tcPr>
+            <w:tcW w:type="dxa" w:w="1800"/>
+            <w:tcMar>
+              <w:top w:type="dxa" w:w="60"/>
+              <w:left w:type="dxa" w:w="90"/>
+              <w:bottom w:type="dxa" w:w="60"/>
+              <w:right w:type="dxa" w:w="90"/>
+            </w:tcMar>
+          </w:tcPr>
+          <w:p>
+            <w:r>
+              <w:rPr>
+                <w:sz w:val="18"/>
+                <w:szCs w:val="18"/>
+              </w:rPr>
+              <w:t xml:space="preserve">서브 타이틀</w:t>
+            </w:r>
+          </w:p>
+        </w:tc>
+        <w:tc>
+          <w:tcPr>
+            <w:tcW w:type="dxa" w:w="3853"/>
+            <w:tcMar>
+              <w:top w:type="dxa" w:w="60"/>
+              <w:left w:type="dxa" w:w="90"/>
+              <w:bottom w:type="dxa" w:w="60"/>
+              <w:right w:type="dxa" w:w="90"/>
+            </w:tcMar>
+          </w:tcPr>
+          <w:p>
+            <w:r>
+              <w:rPr>
+                <w:sz w:val="18"/>
+                <w:szCs w:val="18"/>
+              </w:rPr>
+              <w:t xml:space="preserve">세포소기관 read 제거</w:t>
+            </w:r>
+          </w:p>
+        </w:tc>
+        <w:tc>
+          <w:tcPr>
+            <w:tcW w:type="dxa" w:w="3853"/>
+            <w:tcMar>
+              <w:top w:type="dxa" w:w="60"/>
+              <w:left w:type="dxa" w:w="90"/>
+              <w:bottom w:type="dxa" w:w="60"/>
+              <w:right w:type="dxa" w:w="90"/>
+            </w:tcMar>
+          </w:tcPr>
+          <w:p>
+            <w:r>
+              <w:rPr>
+                <w:sz w:val="18"/>
+                <w:szCs w:val="18"/>
+              </w:rPr>
+              <w:t xml:space="preserve">Organellar read removal</w:t>
+            </w:r>
+          </w:p>
+        </w:tc>
+      </w:tr>
+      <w:tr>
+        <w:tc>
+          <w:tcPr>
+            <w:tcW w:type="dxa" w:w="1800"/>
+            <w:tcMar>
+              <w:top w:type="dxa" w:w="60"/>
+              <w:left w:type="dxa" w:w="90"/>
+              <w:bottom w:type="dxa" w:w="60"/>
+              <w:right w:type="dxa" w:w="90"/>
+            </w:tcMar>
+          </w:tcPr>
+          <w:p>
+            <w:r>
+              <w:rPr>
+                <w:sz w:val="18"/>
+                <w:szCs w:val="18"/>
+              </w:rPr>
+              <w:t xml:space="preserve">버전</w:t>
+            </w:r>
+          </w:p>
+        </w:tc>
+        <w:tc>
+          <w:tcPr>
+            <w:tcW w:type="dxa" w:w="3853"/>
+            <w:tcMar>
+              <w:top w:type="dxa" w:w="60"/>
+              <w:left w:type="dxa" w:w="90"/>
+              <w:bottom w:type="dxa" w:w="60"/>
+              <w:right w:type="dxa" w:w="90"/>
+            </w:tcMar>
+          </w:tcPr>
+          <w:p>
+            <w:r>
+              <w:rPr>
+                <w:sz w:val="18"/>
+                <w:szCs w:val="18"/>
+              </w:rPr>
+              <w:t xml:space="preserve">1.2</w:t>
+            </w:r>
+          </w:p>
+        </w:tc>
+        <w:tc>
+          <w:tcPr>
+            <w:tcW w:type="dxa" w:w="3853"/>
+            <w:tcMar>
+              <w:top w:type="dxa" w:w="60"/>
+              <w:left w:type="dxa" w:w="90"/>
+              <w:bottom w:type="dxa" w:w="60"/>
+              <w:right w:type="dxa" w:w="90"/>
+            </w:tcMar>
+          </w:tcPr>
+          <w:p/>
+        </w:tc>
+      </w:tr>
+      <w:tr>
+        <w:tc>
+          <w:tcPr>
+            <w:tcW w:type="dxa" w:w="1800"/>
+            <w:tcMar>
+              <w:top w:type="dxa" w:w="60"/>
+              <w:left w:type="dxa" w:w="90"/>
+              <w:bottom w:type="dxa" w:w="60"/>
+              <w:right w:type="dxa" w:w="90"/>
+            </w:tcMar>
+          </w:tcPr>
+          <w:p>
+            <w:r>
+              <w:rPr>
+                <w:sz w:val="18"/>
+                <w:szCs w:val="18"/>
+              </w:rPr>
+              <w:t xml:space="preserve">카테고리 대분류</w:t>
+            </w:r>
+          </w:p>
+        </w:tc>
+        <w:tc>
+          <w:tcPr>
+            <w:tcW w:type="dxa" w:w="3853"/>
+            <w:tcMar>
+              <w:top w:type="dxa" w:w="60"/>
+              <w:left w:type="dxa" w:w="90"/>
+              <w:bottom w:type="dxa" w:w="60"/>
+              <w:right w:type="dxa" w:w="90"/>
+            </w:tcMar>
+          </w:tcPr>
+          <w:p>
+            <w:r>
+              <w:rPr>
+                <w:sz w:val="18"/>
+                <w:szCs w:val="18"/>
+              </w:rPr>
+              <w:t xml:space="preserve">정렬</w:t>
+            </w:r>
+          </w:p>
+        </w:tc>
+        <w:tc>
+          <w:tcPr>
+            <w:tcW w:type="dxa" w:w="3853"/>
+            <w:tcMar>
+              <w:top w:type="dxa" w:w="60"/>
+              <w:left w:type="dxa" w:w="90"/>
+              <w:bottom w:type="dxa" w:w="60"/>
+              <w:right w:type="dxa" w:w="90"/>
+            </w:tcMar>
+          </w:tcPr>
+          <w:p>
+            <w:r>
+              <w:rPr>
+                <w:sz w:val="18"/>
+                <w:szCs w:val="18"/>
+              </w:rPr>
+              <w:t xml:space="preserve">Alignment</w:t>
+            </w:r>
+          </w:p>
+        </w:tc>
+      </w:tr>
+      <w:tr>
+        <w:tc>
+          <w:tcPr>
+            <w:tcW w:type="dxa" w:w="1800"/>
+            <w:tcMar>
+              <w:top w:type="dxa" w:w="60"/>
+              <w:left w:type="dxa" w:w="90"/>
+              <w:bottom w:type="dxa" w:w="60"/>
+              <w:right w:type="dxa" w:w="90"/>
+            </w:tcMar>
+          </w:tcPr>
+          <w:p>
+            <w:r>
+              <w:rPr>
+                <w:sz w:val="18"/>
+                <w:szCs w:val="18"/>
+              </w:rPr>
+              <w:t xml:space="preserve">카테고리 아이콘</w:t>
+            </w:r>
+          </w:p>
+        </w:tc>
+        <w:tc>
+          <w:tcPr>
+            <w:tcW w:type="dxa" w:w="3853"/>
+            <w:tcMar>
+              <w:top w:type="dxa" w:w="60"/>
+              <w:left w:type="dxa" w:w="90"/>
+              <w:bottom w:type="dxa" w:w="60"/>
+              <w:right w:type="dxa" w:w="90"/>
+            </w:tcMar>
+          </w:tcPr>
+          <w:p>
+            <w:r>
+              <w:rPr>
+                <w:sz w:val="18"/>
+                <w:szCs w:val="18"/>
+              </w:rPr>
+              <w:t xml:space="preserve">선택 예정(Alignment 아이콘, Shutterstock UniconLabs 선 아이콘 세트에서 고름)</w:t>
+            </w:r>
+          </w:p>
+        </w:tc>
+        <w:tc>
+          <w:tcPr>
+            <w:tcW w:type="dxa" w:w="3853"/>
+            <w:tcMar>
+              <w:top w:type="dxa" w:w="60"/>
+              <w:left w:type="dxa" w:w="90"/>
+              <w:bottom w:type="dxa" w:w="60"/>
+              <w:right w:type="dxa" w:w="90"/>
+            </w:tcMar>
+          </w:tcPr>
+          <w:p/>
+        </w:tc>
+      </w:tr>
+      <w:tr>
+        <w:tc>
+          <w:tcPr>
+            <w:tcW w:type="dxa" w:w="1800"/>
+            <w:tcMar>
+              <w:top w:type="dxa" w:w="60"/>
+              <w:left w:type="dxa" w:w="90"/>
+              <w:bottom w:type="dxa" w:w="60"/>
+              <w:right w:type="dxa" w:w="90"/>
+            </w:tcMar>
+          </w:tcPr>
+          <w:p>
+            <w:r>
+              <w:rPr>
+                <w:sz w:val="18"/>
+                <w:szCs w:val="18"/>
+              </w:rPr>
+              <w:t xml:space="preserve">카테고리 중분류</w:t>
+            </w:r>
+          </w:p>
+        </w:tc>
+        <w:tc>
+          <w:tcPr>
+            <w:tcW w:type="dxa" w:w="3853"/>
+            <w:tcMar>
+              <w:top w:type="dxa" w:w="60"/>
+              <w:left w:type="dxa" w:w="90"/>
+              <w:bottom w:type="dxa" w:w="60"/>
+              <w:right w:type="dxa" w:w="90"/>
+            </w:tcMar>
+          </w:tcPr>
+          <w:p>
+            <w:r>
+              <w:rPr>
+                <w:sz w:val="18"/>
+                <w:szCs w:val="18"/>
+              </w:rPr>
+              <w:t xml:space="preserve">정렬 결과 처리</w:t>
+            </w:r>
+          </w:p>
+        </w:tc>
+        <w:tc>
+          <w:tcPr>
+            <w:tcW w:type="dxa" w:w="3853"/>
+            <w:tcMar>
+              <w:top w:type="dxa" w:w="60"/>
+              <w:left w:type="dxa" w:w="90"/>
+              <w:bottom w:type="dxa" w:w="60"/>
+              <w:right w:type="dxa" w:w="90"/>
+            </w:tcMar>
+          </w:tcPr>
+          <w:p>
+            <w:r>
+              <w:rPr>
+                <w:sz w:val="18"/>
+                <w:szCs w:val="18"/>
+              </w:rPr>
+              <w:t xml:space="preserve">Alignment Processing</w:t>
+            </w:r>
+          </w:p>
+        </w:tc>
+      </w:tr>
+      <w:tr>
+        <w:tc>
+          <w:tcPr>
+            <w:tcW w:type="dxa" w:w="1800"/>
+            <w:tcMar>
+              <w:top w:type="dxa" w:w="60"/>
+              <w:left w:type="dxa" w:w="90"/>
+              <w:bottom w:type="dxa" w:w="60"/>
+              <w:right w:type="dxa" w:w="90"/>
+            </w:tcMar>
+          </w:tcPr>
+          <w:p>
+            <w:r>
+              <w:rPr>
+                <w:sz w:val="18"/>
+                <w:szCs w:val="18"/>
+              </w:rPr>
+              <w:t xml:space="preserve">태그</w:t>
+            </w:r>
+          </w:p>
+        </w:tc>
+        <w:tc>
+          <w:tcPr>
+            <w:tcW w:type="dxa" w:w="3853"/>
+            <w:tcMar>
+              <w:top w:type="dxa" w:w="60"/>
+              <w:left w:type="dxa" w:w="90"/>
+              <w:bottom w:type="dxa" w:w="60"/>
+              <w:right w:type="dxa" w:w="90"/>
+            </w:tcMar>
+          </w:tcPr>
+          <w:p>
+            <w:r>
+              <w:rPr>
+                <w:sz w:val="18"/>
+                <w:szCs w:val="18"/>
+              </w:rPr>
+              <w:t xml:space="preserve">ATAC-seq, mitochondria, chloroplast, samtools, BAM filtering</w:t>
+            </w:r>
+          </w:p>
+        </w:tc>
+        <w:tc>
+          <w:tcPr>
+            <w:tcW w:type="dxa" w:w="3853"/>
+            <w:tcMar>
+              <w:top w:type="dxa" w:w="60"/>
+              <w:left w:type="dxa" w:w="90"/>
+              <w:bottom w:type="dxa" w:w="60"/>
+              <w:right w:type="dxa" w:w="90"/>
+            </w:tcMar>
+          </w:tcPr>
+          <w:p/>
+        </w:tc>
+      </w:tr>
+      <w:tr>
+        <w:tc>
+          <w:tcPr>
+            <w:tcW w:type="dxa" w:w="1800"/>
+            <w:tcMar>
+              <w:top w:type="dxa" w:w="60"/>
+              <w:left w:type="dxa" w:w="90"/>
+              <w:bottom w:type="dxa" w:w="60"/>
+              <w:right w:type="dxa" w:w="90"/>
+            </w:tcMar>
+          </w:tcPr>
+          <w:p>
+            <w:r>
+              <w:rPr>
+                <w:sz w:val="18"/>
+                <w:szCs w:val="18"/>
+              </w:rPr>
+              <w:t xml:space="preserve">레퍼런스 URL</w:t>
+            </w:r>
+          </w:p>
+        </w:tc>
+        <w:tc>
+          <w:tcPr>
+            <w:tcW w:type="dxa" w:w="3853"/>
+            <w:tcMar>
+              <w:top w:type="dxa" w:w="60"/>
+              <w:left w:type="dxa" w:w="90"/>
+              <w:bottom w:type="dxa" w:w="60"/>
+              <w:right w:type="dxa" w:w="90"/>
+            </w:tcMar>
+          </w:tcPr>
+          <w:p>
+            <w:r>
+              <w:rPr>
+                <w:sz w:val="18"/>
+                <w:szCs w:val="18"/>
+              </w:rPr>
+              <w:t xml:space="preserve">https://www.htslib.org/</w:t>
+            </w:r>
+          </w:p>
+        </w:tc>
+        <w:tc>
+          <w:tcPr>
+            <w:tcW w:type="dxa" w:w="3853"/>
+            <w:tcMar>
+              <w:top w:type="dxa" w:w="60"/>
+              <w:left w:type="dxa" w:w="90"/>
+              <w:bottom w:type="dxa" w:w="60"/>
+              <w:right w:type="dxa" w:w="90"/>
+            </w:tcMar>
+          </w:tcPr>
+          <w:p/>
+        </w:tc>
+      </w:tr>
+      <w:tr>
+        <w:tc>
+          <w:tcPr>
+            <w:tcW w:type="dxa" w:w="1800"/>
+            <w:tcMar>
+              <w:top w:type="dxa" w:w="60"/>
+              <w:left w:type="dxa" w:w="90"/>
+              <w:bottom w:type="dxa" w:w="60"/>
+              <w:right w:type="dxa" w:w="90"/>
+            </w:tcMar>
+          </w:tcPr>
+          <w:p>
+            <w:r>
+              <w:rPr>
+                <w:sz w:val="18"/>
+                <w:szCs w:val="18"/>
+              </w:rPr>
+              <w:t xml:space="preserve">컨테이너 이미지</w:t>
+            </w:r>
+          </w:p>
+        </w:tc>
+        <w:tc>
+          <w:tcPr>
+            <w:tcW w:type="dxa" w:w="3853"/>
+            <w:tcMar>
+              <w:top w:type="dxa" w:w="60"/>
+              <w:left w:type="dxa" w:w="90"/>
+              <w:bottom w:type="dxa" w:w="60"/>
+              <w:right w:type="dxa" w:w="90"/>
+            </w:tcMar>
+          </w:tcPr>
+          <w:p>
+            <w:r>
+              <w:rPr>
+                <w:sz w:val="18"/>
+                <w:szCs w:val="18"/>
+              </w:rPr>
+              <w:t xml:space="preserve">bx_organellar_filter.1.0</w:t>
+            </w:r>
+          </w:p>
+        </w:tc>
+        <w:tc>
+          <w:tcPr>
+            <w:tcW w:type="dxa" w:w="3853"/>
+            <w:tcMar>
+              <w:top w:type="dxa" w:w="60"/>
+              <w:left w:type="dxa" w:w="90"/>
+              <w:bottom w:type="dxa" w:w="60"/>
+              <w:right w:type="dxa" w:w="90"/>
+            </w:tcMar>
+          </w:tcPr>
+          <w:p/>
+        </w:tc>
+      </w:tr>
+      <w:tr>
+        <w:tc>
+          <w:tcPr>
+            <w:tcW w:type="dxa" w:w="1800"/>
+            <w:tcMar>
+              <w:top w:type="dxa" w:w="60"/>
+              <w:left w:type="dxa" w:w="90"/>
+              <w:bottom w:type="dxa" w:w="60"/>
+              <w:right w:type="dxa" w:w="90"/>
+            </w:tcMar>
+          </w:tcPr>
+          <w:p>
+            <w:r>
+              <w:rPr>
+                <w:sz w:val="18"/>
+                <w:szCs w:val="18"/>
+              </w:rPr>
+              <w:t xml:space="preserve">실행 스크립트 파일</w:t>
+            </w:r>
+          </w:p>
+        </w:tc>
+        <w:tc>
+          <w:tcPr>
+            <w:tcW w:type="dxa" w:w="3853"/>
+            <w:tcMar>
+              <w:top w:type="dxa" w:w="60"/>
+              <w:left w:type="dxa" w:w="90"/>
+              <w:bottom w:type="dxa" w:w="60"/>
+              <w:right w:type="dxa" w:w="90"/>
+            </w:tcMar>
+          </w:tcPr>
+          <w:p>
+            <w:r>
+              <w:rPr>
+                <w:sz w:val="18"/>
+                <w:szCs w:val="18"/>
+              </w:rPr>
+              <w:t xml:space="preserve">organellar_filter.1.2.sh</w:t>
+            </w:r>
+          </w:p>
+        </w:tc>
+        <w:tc>
+          <w:tcPr>
+            <w:tcW w:type="dxa" w:w="3853"/>
+            <w:tcMar>
+              <w:top w:type="dxa" w:w="60"/>
+              <w:left w:type="dxa" w:w="90"/>
+              <w:bottom w:type="dxa" w:w="60"/>
+              <w:right w:type="dxa" w:w="90"/>
+            </w:tcMar>
+          </w:tcPr>
+          <w:p/>
+        </w:tc>
+      </w:tr>
+      <w:tr>
+        <w:tc>
+          <w:tcPr>
+            <w:tcW w:type="dxa" w:w="1800"/>
+            <w:tcMar>
+              <w:top w:type="dxa" w:w="60"/>
+              <w:left w:type="dxa" w:w="90"/>
+              <w:bottom w:type="dxa" w:w="60"/>
+              <w:right w:type="dxa" w:w="90"/>
+            </w:tcMar>
+          </w:tcPr>
+          <w:p>
+            <w:r>
+              <w:rPr>
+                <w:sz w:val="18"/>
+                <w:szCs w:val="18"/>
+              </w:rPr>
+              <w:t xml:space="preserve">Processor Core (제안)</w:t>
+            </w:r>
+          </w:p>
+        </w:tc>
+        <w:tc>
+          <w:tcPr>
+            <w:tcW w:type="dxa" w:w="3853"/>
+            <w:tcMar>
+              <w:top w:type="dxa" w:w="60"/>
+              <w:left w:type="dxa" w:w="90"/>
+              <w:bottom w:type="dxa" w:w="60"/>
+              <w:right w:type="dxa" w:w="90"/>
+            </w:tcMar>
+          </w:tcPr>
+          <w:p>
+            <w:r>
+              <w:rPr>
+                <w:sz w:val="18"/>
+                <w:szCs w:val="18"/>
+              </w:rPr>
+              <w:t xml:space="preserve">최대 4코어 (samtools가 여러 코어 사용)</w:t>
+            </w:r>
+          </w:p>
+        </w:tc>
+        <w:tc>
+          <w:tcPr>
+            <w:tcW w:type="dxa" w:w="3853"/>
+            <w:tcMar>
+              <w:top w:type="dxa" w:w="60"/>
+              <w:left w:type="dxa" w:w="90"/>
+              <w:bottom w:type="dxa" w:w="60"/>
+              <w:right w:type="dxa" w:w="90"/>
+            </w:tcMar>
+          </w:tcPr>
+          <w:p>
+            <w:r>
+              <w:rPr>
+                <w:sz w:val="18"/>
+                <w:szCs w:val="18"/>
+              </w:rPr>
+              <w:t xml:space="preserve">Up to 4 cores (samtools is multi-threaded)</w:t>
+            </w:r>
+          </w:p>
+        </w:tc>
+      </w:tr>
+    </w:tbl>
+    <w:p/>
+    <w:p>
+      <w:pPr>
+        <w:spacing w:after="100" w:before="200"/>
+      </w:pPr>
+      <w:r>
+        <w:rPr>
+          <w:b/>
+          <w:bCs/>
+          <w:color w:val="3A3A3A"/>
+          <w:sz w:val="24"/>
+          <w:szCs w:val="24"/>
+        </w:rPr>
+        <w:t xml:space="preserve">실행 이미지</w:t>
+      </w:r>
+    </w:p>
+    <w:p>
+      <w:pPr>
+        <w:spacing w:after="140"/>
+      </w:pPr>
+      <w:r>
+        <w:t xml:space="preserve">이미지: bx_organellar_filter 1.0</w:t>
+      </w:r>
+    </w:p>
+    <w:tbl>
+      <w:tblPr>
+        <w:tblW w:type="dxa" w:w="9506"/>
+        <w:tblBorders>
+          <w:top w:val="single" w:color="auto" w:sz="4"/>
+          <w:left w:val="single" w:color="auto" w:sz="4"/>
+          <w:bottom w:val="single" w:color="auto" w:sz="4"/>
+          <w:right w:val="single" w:color="auto" w:sz="4"/>
+          <w:insideH w:val="single" w:color="auto" w:sz="4"/>
+          <w:insideV w:val="single" w:color="auto" w:sz="4"/>
+        </w:tblBorders>
+      </w:tblPr>
+      <w:tblGrid>
+        <w:gridCol w:w="4753"/>
+        <w:gridCol w:w="4753"/>
+      </w:tblGrid>
+      <w:tr>
+        <w:tc>
+          <w:tcPr>
+            <w:tcW w:type="dxa" w:w="4753"/>
+            <w:shd w:fill="E8EDF6" w:color="auto" w:val="clear"/>
+            <w:tcMar>
+              <w:top w:type="dxa" w:w="60"/>
+              <w:left w:type="dxa" w:w="90"/>
+              <w:bottom w:type="dxa" w:w="60"/>
+              <w:right w:type="dxa" w:w="90"/>
+            </w:tcMar>
+          </w:tcPr>
+          <w:p>
+            <w:r>
+              <w:rPr>
+                <w:b/>
+                <w:bCs/>
+                <w:color w:val="32549C"/>
+                <w:sz w:val="18"/>
+                <w:szCs w:val="18"/>
+              </w:rPr>
+              <w:t xml:space="preserve">항목 / Item</w:t>
+            </w:r>
+          </w:p>
+        </w:tc>
+        <w:tc>
+          <w:tcPr>
+            <w:tcW w:type="dxa" w:w="4753"/>
+            <w:shd w:fill="E8EDF6" w:color="auto" w:val="clear"/>
+            <w:tcMar>
+              <w:top w:type="dxa" w:w="60"/>
+              <w:left w:type="dxa" w:w="90"/>
+              <w:bottom w:type="dxa" w:w="60"/>
+              <w:right w:type="dxa" w:w="90"/>
+            </w:tcMar>
+          </w:tcPr>
+          <w:p>
+            <w:r>
+              <w:rPr>
+                <w:b/>
+                <w:bCs/>
+                <w:color w:val="32549C"/>
+                <w:sz w:val="18"/>
+                <w:szCs w:val="18"/>
+              </w:rPr>
+              <w:t xml:space="preserve">값 / Value</w:t>
+            </w:r>
+          </w:p>
+        </w:tc>
+      </w:tr>
+      <w:tr>
+        <w:tc>
+          <w:tcPr>
+            <w:tcW w:type="dxa" w:w="4753"/>
+            <w:tcMar>
+              <w:top w:type="dxa" w:w="60"/>
+              <w:left w:type="dxa" w:w="90"/>
+              <w:bottom w:type="dxa" w:w="60"/>
+              <w:right w:type="dxa" w:w="90"/>
+            </w:tcMar>
+          </w:tcPr>
+          <w:p>
+            <w:r>
+              <w:rPr>
+                <w:sz w:val="18"/>
+                <w:szCs w:val="18"/>
+              </w:rPr>
+              <w:t xml:space="preserve">DEF 파일</w:t>
+            </w:r>
+          </w:p>
+        </w:tc>
+        <w:tc>
+          <w:tcPr>
+            <w:tcW w:type="dxa" w:w="4753"/>
+            <w:tcMar>
+              <w:top w:type="dxa" w:w="60"/>
+              <w:left w:type="dxa" w:w="90"/>
+              <w:bottom w:type="dxa" w:w="60"/>
+              <w:right w:type="dxa" w:w="90"/>
+            </w:tcMar>
+          </w:tcPr>
+          <w:p>
+            <w:r>
+              <w:rPr>
+                <w:sz w:val="18"/>
+                <w:szCs w:val="18"/>
+              </w:rPr>
+              <w:t xml:space="preserve">defs/ATAC-seq/bx_organellar_filter.1.0.def</w:t>
+            </w:r>
+          </w:p>
+        </w:tc>
+      </w:tr>
+      <w:tr>
+        <w:tc>
+          <w:tcPr>
+            <w:tcW w:type="dxa" w:w="4753"/>
+            <w:tcMar>
+              <w:top w:type="dxa" w:w="60"/>
+              <w:left w:type="dxa" w:w="90"/>
+              <w:bottom w:type="dxa" w:w="60"/>
+              <w:right w:type="dxa" w:w="90"/>
+            </w:tcMar>
+          </w:tcPr>
+          <w:p>
+            <w:r>
+              <w:rPr>
+                <w:sz w:val="18"/>
+                <w:szCs w:val="18"/>
+              </w:rPr>
+              <w:t xml:space="preserve">DEF Bootstrap</w:t>
+            </w:r>
+          </w:p>
+        </w:tc>
+        <w:tc>
+          <w:tcPr>
+            <w:tcW w:type="dxa" w:w="4753"/>
+            <w:tcMar>
+              <w:top w:type="dxa" w:w="60"/>
+              <w:left w:type="dxa" w:w="90"/>
+              <w:bottom w:type="dxa" w:w="60"/>
+              <w:right w:type="dxa" w:w="90"/>
+            </w:tcMar>
+          </w:tcPr>
+          <w:p>
+            <w:r>
+              <w:rPr>
+                <w:sz w:val="18"/>
+                <w:szCs w:val="18"/>
+              </w:rPr>
+              <w:t xml:space="preserve">docker</w:t>
+            </w:r>
+          </w:p>
+        </w:tc>
+      </w:tr>
+      <w:tr>
+        <w:tc>
+          <w:tcPr>
+            <w:tcW w:type="dxa" w:w="4753"/>
+            <w:tcMar>
+              <w:top w:type="dxa" w:w="60"/>
+              <w:left w:type="dxa" w:w="90"/>
+              <w:bottom w:type="dxa" w:w="60"/>
+              <w:right w:type="dxa" w:w="90"/>
+            </w:tcMar>
+          </w:tcPr>
+          <w:p>
+            <w:r>
+              <w:rPr>
+                <w:sz w:val="18"/>
+                <w:szCs w:val="18"/>
+              </w:rPr>
+              <w:t xml:space="preserve">DEF From</w:t>
+            </w:r>
+          </w:p>
+        </w:tc>
+        <w:tc>
+          <w:tcPr>
+            <w:tcW w:type="dxa" w:w="4753"/>
+            <w:tcMar>
+              <w:top w:type="dxa" w:w="60"/>
+              <w:left w:type="dxa" w:w="90"/>
+              <w:bottom w:type="dxa" w:w="60"/>
+              <w:right w:type="dxa" w:w="90"/>
+            </w:tcMar>
+          </w:tcPr>
+          <w:p>
+            <w:r>
+              <w:rPr>
+                <w:sz w:val="18"/>
+                <w:szCs w:val="18"/>
+              </w:rPr>
+              <w:t xml:space="preserve">rockylinux/rockylinux@sha256:8101994123cf3d0a8fee517bee7f39e555c7d92bd2d9eb3303cc988a0eeed00f</w:t>
+            </w:r>
+            <w:r>
+              <w:rPr>
+                <w:sz w:val="18"/>
+                <w:szCs w:val="18"/>
+              </w:rPr>
+              <w:t xml:space="preserve"> (Rocky Linux 9.8, </w:t>
+            </w:r>
+            <w:r>
+              <w:rPr>
+                <w:sz w:val="18"/>
+                <w:szCs w:val="18"/>
+              </w:rPr>
+              <w:t xml:space="preserve">9.8.20260525.0</w:t>
+            </w:r>
+            <w:r>
+              <w:rPr>
+                <w:sz w:val="18"/>
+                <w:szCs w:val="18"/>
+              </w:rPr>
+              <w:t xml:space="preserve">)</w:t>
+            </w:r>
+          </w:p>
+        </w:tc>
+      </w:tr>
+      <w:tr>
+        <w:tc>
+          <w:tcPr>
+            <w:tcW w:type="dxa" w:w="4753"/>
+            <w:tcMar>
+              <w:top w:type="dxa" w:w="60"/>
+              <w:left w:type="dxa" w:w="90"/>
+              <w:bottom w:type="dxa" w:w="60"/>
+              <w:right w:type="dxa" w:w="90"/>
+            </w:tcMar>
+          </w:tcPr>
+          <w:p>
+            <w:r>
+              <w:rPr>
+                <w:sz w:val="18"/>
+                <w:szCs w:val="18"/>
+              </w:rPr>
+              <w:t xml:space="preserve">conda 설치 도구 / installer</w:t>
+            </w:r>
+          </w:p>
+        </w:tc>
+        <w:tc>
+          <w:tcPr>
+            <w:tcW w:type="dxa" w:w="4753"/>
+            <w:tcMar>
+              <w:top w:type="dxa" w:w="60"/>
+              <w:left w:type="dxa" w:w="90"/>
+              <w:bottom w:type="dxa" w:w="60"/>
+              <w:right w:type="dxa" w:w="90"/>
+            </w:tcMar>
+          </w:tcPr>
+          <w:p>
+            <w:r>
+              <w:rPr>
+                <w:sz w:val="18"/>
+                <w:szCs w:val="18"/>
+              </w:rPr>
+              <w:t xml:space="preserve">Miniforge3 26.7.2-0 (conda-forge, bioconda)</w:t>
+            </w:r>
+          </w:p>
+        </w:tc>
+      </w:tr>
+    </w:tbl>
+    <w:p/>
+    <w:p>
+      <w:pPr>
+        <w:pStyle w:val="ListParagraph"/>
+        <w:numPr>
+          <w:ilvl w:val="0"/>
+          <w:numId w:val="2"/>
+        </w:numPr>
+        <w:spacing w:after="80"/>
+      </w:pPr>
+      <w:r>
+        <w:rPr>
+          <w:b/>
+          <w:bCs/>
+        </w:rPr>
+        <w:t xml:space="preserve">설명(국문):</w:t>
+      </w:r>
+      <w:r>
+        <w:t xml:space="preserve"> 정렬된 BAM에서 세포소기관(미토콘드리아, 엽록체) read를 제거하는 SAMtools 환경입니다.</w:t>
+      </w:r>
+    </w:p>
+    <w:p>
+      <w:pPr>
+        <w:pStyle w:val="ListParagraph"/>
+        <w:numPr>
+          <w:ilvl w:val="0"/>
+          <w:numId w:val="2"/>
+        </w:numPr>
+        <w:spacing w:after="80"/>
+      </w:pPr>
+      <w:r>
+        <w:rPr>
+          <w:b/>
+          <w:bCs/>
+        </w:rPr>
+        <w:t xml:space="preserve">Description (English):</w:t>
+      </w:r>
+      <w:r>
+        <w:t xml:space="preserve"> SAMtools environment for removing organellar (mitochondrial and chloroplast) reads from aligned BAM files.</w:t>
+      </w:r>
+    </w:p>
+    <w:tbl>
+      <w:tblPr>
+        <w:tblW w:type="dxa" w:w="9506"/>
+        <w:tblBorders>
+          <w:top w:val="single" w:color="auto" w:sz="4"/>
+          <w:left w:val="single" w:color="auto" w:sz="4"/>
+          <w:bottom w:val="single" w:color="auto" w:sz="4"/>
+          <w:right w:val="single" w:color="auto" w:sz="4"/>
+          <w:insideH w:val="single" w:color="auto" w:sz="4"/>
+          <w:insideV w:val="single" w:color="auto" w:sz="4"/>
+        </w:tblBorders>
+      </w:tblPr>
+      <w:tblGrid>
+        <w:gridCol w:w="4753"/>
+        <w:gridCol w:w="4753"/>
+      </w:tblGrid>
+      <w:tr>
+        <w:tc>
+          <w:tcPr>
+            <w:tcW w:type="dxa" w:w="4753"/>
+            <w:shd w:fill="E8EDF6" w:color="auto" w:val="clear"/>
+            <w:tcMar>
+              <w:top w:type="dxa" w:w="60"/>
+              <w:left w:type="dxa" w:w="90"/>
+              <w:bottom w:type="dxa" w:w="60"/>
+              <w:right w:type="dxa" w:w="90"/>
+            </w:tcMar>
+          </w:tcPr>
+          <w:p>
+            <w:r>
+              <w:rPr>
+                <w:b/>
+                <w:bCs/>
+                <w:color w:val="32549C"/>
+                <w:sz w:val="18"/>
+                <w:szCs w:val="18"/>
+              </w:rPr>
+              <w:t xml:space="preserve">도구</w:t>
+            </w:r>
+          </w:p>
+        </w:tc>
+        <w:tc>
+          <w:tcPr>
+            <w:tcW w:type="dxa" w:w="4753"/>
+            <w:shd w:fill="E8EDF6" w:color="auto" w:val="clear"/>
+            <w:tcMar>
+              <w:top w:type="dxa" w:w="60"/>
+              <w:left w:type="dxa" w:w="90"/>
+              <w:bottom w:type="dxa" w:w="60"/>
+              <w:right w:type="dxa" w:w="90"/>
+            </w:tcMar>
+          </w:tcPr>
+          <w:p>
+            <w:r>
+              <w:rPr>
+                <w:b/>
+                <w:bCs/>
+                <w:color w:val="32549C"/>
+                <w:sz w:val="18"/>
+                <w:szCs w:val="18"/>
+              </w:rPr>
+              <w:t xml:space="preserve">버전</w:t>
+            </w:r>
+          </w:p>
+        </w:tc>
+      </w:tr>
+      <w:tr>
+        <w:tc>
+          <w:tcPr>
+            <w:tcW w:type="dxa" w:w="4753"/>
+            <w:tcMar>
+              <w:top w:type="dxa" w:w="60"/>
+              <w:left w:type="dxa" w:w="90"/>
+              <w:bottom w:type="dxa" w:w="60"/>
+              <w:right w:type="dxa" w:w="90"/>
+            </w:tcMar>
+          </w:tcPr>
+          <w:p>
+            <w:r>
+              <w:rPr>
+                <w:sz w:val="18"/>
+                <w:szCs w:val="18"/>
+              </w:rPr>
+              <w:t xml:space="preserve">SAMtools</w:t>
+            </w:r>
+          </w:p>
+        </w:tc>
+        <w:tc>
+          <w:tcPr>
+            <w:tcW w:type="dxa" w:w="4753"/>
+            <w:tcMar>
+              <w:top w:type="dxa" w:w="60"/>
+              <w:left w:type="dxa" w:w="90"/>
+              <w:bottom w:type="dxa" w:w="60"/>
+              <w:right w:type="dxa" w:w="90"/>
+            </w:tcMar>
+          </w:tcPr>
+          <w:p>
+            <w:r>
+              <w:rPr>
+                <w:sz w:val="18"/>
+                <w:szCs w:val="18"/>
+              </w:rPr>
+              <w:t xml:space="preserve">1.23.1</w:t>
+            </w:r>
+          </w:p>
+        </w:tc>
+      </w:tr>
+      <w:tr>
+        <w:tc>
+          <w:tcPr>
+            <w:tcW w:type="dxa" w:w="4753"/>
+            <w:tcMar>
+              <w:top w:type="dxa" w:w="60"/>
+              <w:left w:type="dxa" w:w="90"/>
+              <w:bottom w:type="dxa" w:w="60"/>
+              <w:right w:type="dxa" w:w="90"/>
+            </w:tcMar>
+          </w:tcPr>
+          <w:p>
+            <w:r>
+              <w:rPr>
+                <w:sz w:val="18"/>
+                <w:szCs w:val="18"/>
+              </w:rPr>
+              <w:t xml:space="preserve">HTSlib</w:t>
+            </w:r>
+          </w:p>
+        </w:tc>
+        <w:tc>
+          <w:tcPr>
+            <w:tcW w:type="dxa" w:w="4753"/>
+            <w:tcMar>
+              <w:top w:type="dxa" w:w="60"/>
+              <w:left w:type="dxa" w:w="90"/>
+              <w:bottom w:type="dxa" w:w="60"/>
+              <w:right w:type="dxa" w:w="90"/>
+            </w:tcMar>
+          </w:tcPr>
+          <w:p>
+            <w:r>
+              <w:rPr>
+                <w:sz w:val="18"/>
+                <w:szCs w:val="18"/>
+              </w:rPr>
+              <w:t xml:space="preserve">1.23.1</w:t>
+            </w:r>
+          </w:p>
+        </w:tc>
+      </w:tr>
+    </w:tbl>
+    <w:p/>
+    <w:p>
+      <w:pPr>
+        <w:spacing w:after="100" w:before="200"/>
+      </w:pPr>
+      <w:r>
+        <w:rPr>
+          <w:b/>
+          <w:bCs/>
+          <w:color w:val="3A3A3A"/>
+          <w:sz w:val="24"/>
+          <w:szCs w:val="24"/>
+        </w:rPr>
+        <w:t xml:space="preserve">내용(국문)</w:t>
+      </w:r>
+    </w:p>
+    <w:p>
+      <w:pPr>
+        <w:spacing w:after="140"/>
+      </w:pPr>
+      <w:r>
+        <w:t xml:space="preserve">정렬된 BAM 파일에서 미토콘드리아와 엽록체 등 세포소기관 염색체에 정렬된 read를 제거합니다. ATAC-seq에서는 Tn5가 뉴클레오솜이 없는 세포소기관 DNA를 많이 자르기 때문에 이 read의 비율이 높게 나타나며, 그대로 두면 peak 검출과 정규화에 영향을 줍니다.</w:t>
+      </w:r>
+    </w:p>
+    <w:p>
+      <w:pPr>
+        <w:pStyle w:val="ListParagraph"/>
+        <w:numPr>
+          <w:ilvl w:val="0"/>
+          <w:numId w:val="2"/>
+        </w:numPr>
+        <w:spacing w:after="80"/>
+      </w:pPr>
+      <w:r>
+        <w:t xml:space="preserve">세포소기관 염색체 이름을 정규식으로 찾아 제외합니다(chrM, MT, Pt, chrC 등).</w:t>
+      </w:r>
+    </w:p>
+    <w:p>
+      <w:pPr>
+        <w:pStyle w:val="ListParagraph"/>
+        <w:numPr>
+          <w:ilvl w:val="0"/>
+          <w:numId w:val="2"/>
+        </w:numPr>
+        <w:spacing w:after="80"/>
+      </w:pPr>
+      <w:r>
+        <w:t xml:space="preserve">제거 전후의 idxstats와 flagstat, 제거한 염색체 목록과 요약표를 함께 만듭니다.</w:t>
+      </w:r>
+    </w:p>
+    <w:p>
+      <w:pPr>
+        <w:pStyle w:val="ListParagraph"/>
+        <w:numPr>
+          <w:ilvl w:val="0"/>
+          <w:numId w:val="2"/>
+        </w:numPr>
+        <w:spacing w:after="80"/>
+      </w:pPr>
+      <w:r>
+        <w:t xml:space="preserve">결과 BAM은 ATAC_QC 모듈의 입력으로 사용합니다.</w:t>
+      </w:r>
+    </w:p>
+    <w:p>
+      <w:pPr>
+        <w:spacing w:after="100" w:before="200"/>
+      </w:pPr>
+      <w:r>
+        <w:rPr>
+          <w:b/>
+          <w:bCs/>
+          <w:color w:val="3A3A3A"/>
+          <w:sz w:val="24"/>
+          <w:szCs w:val="24"/>
+        </w:rPr>
+        <w:t xml:space="preserve">내용(영문)</w:t>
+      </w:r>
+    </w:p>
+    <w:p>
+      <w:pPr>
+        <w:spacing w:after="140"/>
+      </w:pPr>
+      <w:r>
+        <w:t xml:space="preserve">Removes reads aligned to organellar chromosomes such as mitochondria and chloroplasts from aligned BAM files. In ATAC-seq, Tn5 cuts nucleosome-free organellar DNA heavily, so these reads are often abundant and can bias peak calling and normalization.</w:t>
+      </w:r>
+    </w:p>
+    <w:p>
+      <w:pPr>
+        <w:pStyle w:val="ListParagraph"/>
+        <w:numPr>
+          <w:ilvl w:val="0"/>
+          <w:numId w:val="2"/>
+        </w:numPr>
+        <w:spacing w:after="80"/>
+      </w:pPr>
+      <w:r>
+        <w:t xml:space="preserve">Organellar chromosomes are matched by a regular expression and excluded (chrM, MT, Pt, chrC, and so on).</w:t>
+      </w:r>
+    </w:p>
+    <w:p>
+      <w:pPr>
+        <w:pStyle w:val="ListParagraph"/>
+        <w:numPr>
+          <w:ilvl w:val="0"/>
+          <w:numId w:val="2"/>
+        </w:numPr>
+        <w:spacing w:after="80"/>
+      </w:pPr>
+      <w:r>
+        <w:t xml:space="preserve">idxstats and flagstat before and after filtering, the list of removed contigs, and a summary table are written.</w:t>
+      </w:r>
+    </w:p>
+    <w:p>
+      <w:pPr>
+        <w:pStyle w:val="ListParagraph"/>
+        <w:numPr>
+          <w:ilvl w:val="0"/>
+          <w:numId w:val="2"/>
+        </w:numPr>
+        <w:spacing w:after="80"/>
+      </w:pPr>
+      <w:r>
+        <w:t xml:space="preserve">The filtered BAM files are the input of the ATAC_QC module.</w:t>
+      </w:r>
+    </w:p>
+    <w:p>
+      <w:pPr>
+        <w:spacing w:after="100" w:before="200"/>
+      </w:pPr>
+      <w:r>
+        <w:rPr>
+          <w:b/>
+          <w:bCs/>
+          <w:color w:val="3A3A3A"/>
+          <w:sz w:val="24"/>
+          <w:szCs w:val="24"/>
+        </w:rPr>
+        <w:t xml:space="preserve">입출력 / 파라미터</w:t>
+      </w:r>
+    </w:p>
+    <w:tbl>
+      <w:tblPr>
+        <w:tblW w:type="dxa" w:w="9506"/>
+        <w:tblBorders>
+          <w:top w:val="single" w:color="auto" w:sz="4"/>
+          <w:left w:val="single" w:color="auto" w:sz="4"/>
+          <w:bottom w:val="single" w:color="auto" w:sz="4"/>
+          <w:right w:val="single" w:color="auto" w:sz="4"/>
+          <w:insideH w:val="single" w:color="auto" w:sz="4"/>
+          <w:insideV w:val="single" w:color="auto" w:sz="4"/>
+        </w:tblBorders>
+      </w:tblPr>
+      <w:tblGrid>
+        <w:gridCol w:w="920"/>
+        <w:gridCol w:w="950"/>
+        <w:gridCol w:w="950"/>
+        <w:gridCol w:w="1400"/>
+        <w:gridCol w:w="1000"/>
+        <w:gridCol w:w="2140"/>
+        <w:gridCol w:w="2146"/>
+      </w:tblGrid>
+      <w:tr>
+        <w:tc>
+          <w:tcPr>
+            <w:tcW w:type="dxa" w:w="920"/>
+            <w:shd w:fill="E8EDF6" w:color="auto" w:val="clear"/>
+            <w:tcMar>
+              <w:top w:type="dxa" w:w="60"/>
+              <w:left w:type="dxa" w:w="90"/>
+              <w:bottom w:type="dxa" w:w="60"/>
+              <w:right w:type="dxa" w:w="90"/>
+            </w:tcMar>
+          </w:tcPr>
+          <w:p>
+            <w:r>
+              <w:rPr>
+                <w:b/>
+                <w:bCs/>
+                <w:color w:val="32549C"/>
+                <w:sz w:val="18"/>
+                <w:szCs w:val="18"/>
+              </w:rPr>
+              <w:t xml:space="preserve">탭</w:t>
+            </w:r>
+          </w:p>
+        </w:tc>
+        <w:tc>
+          <w:tcPr>
+            <w:tcW w:type="dxa" w:w="950"/>
+            <w:shd w:fill="E8EDF6" w:color="auto" w:val="clear"/>
+            <w:tcMar>
+              <w:top w:type="dxa" w:w="60"/>
+              <w:left w:type="dxa" w:w="90"/>
+              <w:bottom w:type="dxa" w:w="60"/>
+              <w:right w:type="dxa" w:w="90"/>
+            </w:tcMar>
+          </w:tcPr>
+          <w:p>
+            <w:r>
+              <w:rPr>
+                <w:b/>
+                <w:bCs/>
+                <w:color w:val="32549C"/>
+                <w:sz w:val="18"/>
+                <w:szCs w:val="18"/>
+              </w:rPr>
+              <w:t xml:space="preserve">필수</w:t>
+            </w:r>
+          </w:p>
+        </w:tc>
+        <w:tc>
+          <w:tcPr>
+            <w:tcW w:type="dxa" w:w="950"/>
+            <w:shd w:fill="E8EDF6" w:color="auto" w:val="clear"/>
+            <w:tcMar>
+              <w:top w:type="dxa" w:w="60"/>
+              <w:left w:type="dxa" w:w="90"/>
+              <w:bottom w:type="dxa" w:w="60"/>
+              <w:right w:type="dxa" w:w="90"/>
+            </w:tcMar>
+          </w:tcPr>
+          <w:p>
+            <w:r>
+              <w:rPr>
+                <w:b/>
+                <w:bCs/>
+                <w:color w:val="32549C"/>
+                <w:sz w:val="18"/>
+                <w:szCs w:val="18"/>
+              </w:rPr>
+              <w:t xml:space="preserve">형식</w:t>
+            </w:r>
+          </w:p>
+        </w:tc>
+        <w:tc>
+          <w:tcPr>
+            <w:tcW w:type="dxa" w:w="1400"/>
+            <w:shd w:fill="E8EDF6" w:color="auto" w:val="clear"/>
+            <w:tcMar>
+              <w:top w:type="dxa" w:w="60"/>
+              <w:left w:type="dxa" w:w="90"/>
+              <w:bottom w:type="dxa" w:w="60"/>
+              <w:right w:type="dxa" w:w="90"/>
+            </w:tcMar>
+          </w:tcPr>
+          <w:p>
+            <w:r>
+              <w:rPr>
+                <w:b/>
+                <w:bCs/>
+                <w:color w:val="32549C"/>
+                <w:sz w:val="18"/>
+                <w:szCs w:val="18"/>
+              </w:rPr>
+              <w:t xml:space="preserve">Name</w:t>
+            </w:r>
+          </w:p>
+        </w:tc>
+        <w:tc>
+          <w:tcPr>
+            <w:tcW w:type="dxa" w:w="1000"/>
+            <w:shd w:fill="E8EDF6" w:color="auto" w:val="clear"/>
+            <w:tcMar>
+              <w:top w:type="dxa" w:w="60"/>
+              <w:left w:type="dxa" w:w="90"/>
+              <w:bottom w:type="dxa" w:w="60"/>
+              <w:right w:type="dxa" w:w="90"/>
+            </w:tcMar>
+          </w:tcPr>
+          <w:p>
+            <w:r>
+              <w:rPr>
+                <w:b/>
+                <w:bCs/>
+                <w:color w:val="32549C"/>
+                <w:sz w:val="18"/>
+                <w:szCs w:val="18"/>
+              </w:rPr>
+              <w:t xml:space="preserve">Value</w:t>
+            </w:r>
+          </w:p>
+        </w:tc>
+        <w:tc>
+          <w:tcPr>
+            <w:tcW w:type="dxa" w:w="2140"/>
+            <w:shd w:fill="E8EDF6" w:color="auto" w:val="clear"/>
+            <w:tcMar>
+              <w:top w:type="dxa" w:w="60"/>
+              <w:left w:type="dxa" w:w="90"/>
+              <w:bottom w:type="dxa" w:w="60"/>
+              <w:right w:type="dxa" w:w="90"/>
+            </w:tcMar>
+          </w:tcPr>
+          <w:p>
+            <w:r>
+              <w:rPr>
+                <w:b/>
+                <w:bCs/>
+                <w:color w:val="32549C"/>
+                <w:sz w:val="18"/>
+                <w:szCs w:val="18"/>
+              </w:rPr>
+              <w:t xml:space="preserve">Description</w:t>
+            </w:r>
+          </w:p>
+        </w:tc>
+        <w:tc>
+          <w:tcPr>
+            <w:tcW w:type="dxa" w:w="2146"/>
+            <w:shd w:fill="E8EDF6" w:color="auto" w:val="clear"/>
+            <w:tcMar>
+              <w:top w:type="dxa" w:w="60"/>
+              <w:left w:type="dxa" w:w="90"/>
+              <w:bottom w:type="dxa" w:w="60"/>
+              <w:right w:type="dxa" w:w="90"/>
+            </w:tcMar>
+          </w:tcPr>
+          <w:p>
+            <w:r>
+              <w:rPr>
+                <w:b/>
+                <w:bCs/>
+                <w:color w:val="32549C"/>
+                <w:sz w:val="18"/>
+                <w:szCs w:val="18"/>
+              </w:rPr>
+              <w:t xml:space="preserve">English Description</w:t>
+            </w:r>
+          </w:p>
+        </w:tc>
+      </w:tr>
+      <w:tr>
+        <w:tc>
+          <w:tcPr>
+            <w:tcW w:type="dxa" w:w="920"/>
+            <w:tcMar>
+              <w:top w:type="dxa" w:w="60"/>
+              <w:left w:type="dxa" w:w="90"/>
+              <w:bottom w:type="dxa" w:w="60"/>
+              <w:right w:type="dxa" w:w="90"/>
+            </w:tcMar>
+          </w:tcPr>
+          <w:p>
+            <w:r>
+              <w:rPr>
+                <w:sz w:val="18"/>
+                <w:szCs w:val="18"/>
+              </w:rPr>
+              <w:t xml:space="preserve">Input</w:t>
+            </w:r>
+          </w:p>
+        </w:tc>
+        <w:tc>
+          <w:tcPr>
+            <w:tcW w:type="dxa" w:w="950"/>
+            <w:tcMar>
+              <w:top w:type="dxa" w:w="60"/>
+              <w:left w:type="dxa" w:w="90"/>
+              <w:bottom w:type="dxa" w:w="60"/>
+              <w:right w:type="dxa" w:w="90"/>
+            </w:tcMar>
+          </w:tcPr>
+          <w:p>
+            <w:r>
+              <w:rPr>
+                <w:sz w:val="18"/>
+                <w:szCs w:val="18"/>
+              </w:rPr>
+              <w:t xml:space="preserve">Required</w:t>
+            </w:r>
+          </w:p>
+        </w:tc>
+        <w:tc>
+          <w:tcPr>
+            <w:tcW w:type="dxa" w:w="950"/>
+            <w:tcMar>
+              <w:top w:type="dxa" w:w="60"/>
+              <w:left w:type="dxa" w:w="90"/>
+              <w:bottom w:type="dxa" w:w="60"/>
+              <w:right w:type="dxa" w:w="90"/>
+            </w:tcMar>
+          </w:tcPr>
+          <w:p>
+            <w:r>
+              <w:rPr>
+                <w:sz w:val="18"/>
+                <w:szCs w:val="18"/>
+              </w:rPr>
+              <w:t xml:space="preserve">Directory</w:t>
+            </w:r>
+          </w:p>
+        </w:tc>
+        <w:tc>
+          <w:tcPr>
+            <w:tcW w:type="dxa" w:w="1400"/>
+            <w:tcMar>
+              <w:top w:type="dxa" w:w="60"/>
+              <w:left w:type="dxa" w:w="90"/>
+              <w:bottom w:type="dxa" w:w="60"/>
+              <w:right w:type="dxa" w:w="90"/>
+            </w:tcMar>
+          </w:tcPr>
+          <w:p>
+            <w:r>
+              <w:rPr>
+                <w:sz w:val="18"/>
+                <w:szCs w:val="18"/>
+              </w:rPr>
+              <w:t xml:space="preserve">input_dir</w:t>
+            </w:r>
+          </w:p>
+        </w:tc>
+        <w:tc>
+          <w:tcPr>
+            <w:tcW w:type="dxa" w:w="1000"/>
+            <w:tcMar>
+              <w:top w:type="dxa" w:w="60"/>
+              <w:left w:type="dxa" w:w="90"/>
+              <w:bottom w:type="dxa" w:w="60"/>
+              <w:right w:type="dxa" w:w="90"/>
+            </w:tcMar>
+          </w:tcPr>
+          <w:p>
+            <w:r>
+              <w:rPr>
+                <w:sz w:val="18"/>
+                <w:szCs w:val="18"/>
+              </w:rPr>
               <w:t xml:space="preserve">/data/bam</w:t>
             </w:r>
           </w:p>
@@ -4410,7 +7093,7 @@
                 <w:sz w:val="18"/>
                 <w:szCs w:val="18"/>
               </w:rPr>
-              <w:t xml:space="preserve">좌표 정렬된 BAM 폴더(*.unsorted.bam 제외). BAM 인덱스(.bai)가 없으면 BAM 옆에 만들므로 그 폴더에 쓰기 권한이 필요(앞 모듈 결과에는 인덱스가 있음)</w:t>
+              <w:t xml:space="preserve">좌표 정렬된 BAM 폴더(*.unsorted.bam 제외). GATK_MarkDuplicates의 output_dir. BAM 인덱스(.bai)가 없으면 BAM 옆에 만들므로 그 폴더에 쓰기 권한이 필요(앞 모듈 결과에는 인덱스가 있음)</w:t>
             </w:r>
           </w:p>
         </w:tc>
@@ -5274,7 +7957,7 @@
           <w:sz w:val="30"/>
           <w:szCs w:val="30"/>
         </w:rPr>
-        <w:t xml:space="preserve">3. ATAC_QC</w:t>
+        <w:t xml:space="preserve">4. ATAC_QC</w:t>
       </w:r>
     </w:p>
     <w:p>
@@ -9286,7 +11969,7 @@
           <w:sz w:val="30"/>
           <w:szCs w:val="30"/>
         </w:rPr>
-        <w:t xml:space="preserve">4. ATAC_QC_plot</w:t>
+        <w:t xml:space="preserve">5. ATAC_QC_plot</w:t>
       </w:r>
     </w:p>
     <w:p>
@@ -12818,7 +15501,7 @@
           <w:sz w:val="30"/>
           <w:szCs w:val="30"/>
         </w:rPr>
-        <w:t xml:space="preserve">5. MACS3_callpeak_ATAC</w:t>
+        <w:t xml:space="preserve">6. MACS3_callpeak_ATAC</w:t>
       </w:r>
     </w:p>
     <w:p>
@@ -16059,7 +18742,7 @@
           <w:sz w:val="30"/>
           <w:szCs w:val="30"/>
         </w:rPr>
-        <w:t xml:space="preserve">6. peak_annotation</w:t>
+        <w:t xml:space="preserve">7. peak_annotation</w:t>
       </w:r>
     </w:p>
     <w:p>
@@ -19884,7 +22567,7 @@
           <w:sz w:val="30"/>
           <w:szCs w:val="30"/>
         </w:rPr>
-        <w:t xml:space="preserve">7. differential_accessibility</w:t>
+        <w:t xml:space="preserve">8. differential_accessibility</w:t>
       </w:r>
     </w:p>
     <w:p>
@@ -24589,7 +27272,7 @@
           <w:sz w:val="30"/>
           <w:szCs w:val="30"/>
         </w:rPr>
-        <w:t xml:space="preserve">8. atac_motif</w:t>
+        <w:t xml:space="preserve">9. atac_motif</w:t>
       </w:r>
     </w:p>
     <w:p>
@@ -29791,7 +32474,7 @@
           <w:sz w:val="30"/>
           <w:szCs w:val="30"/>
         </w:rPr>
-        <w:t xml:space="preserve">9. tf_footprinting</w:t>
+        <w:t xml:space="preserve">10. tf_footprinting</w:t>
       </w:r>
     </w:p>
     <w:p>
@@ -33299,7 +35982,7 @@
           <w:sz w:val="30"/>
           <w:szCs w:val="30"/>
         </w:rPr>
-        <w:t xml:space="preserve">10. functional_enrichment</w:t>
+        <w:t xml:space="preserve">11. functional_enrichment</w:t>
       </w:r>
     </w:p>
     <w:p>
@@ -38464,7 +41147,7 @@
           <w:sz w:val="30"/>
           <w:szCs w:val="30"/>
         </w:rPr>
-        <w:t xml:space="preserve">11. replicate_consistency</w:t>
+        <w:t xml:space="preserve">12. replicate_consistency</w:t>
       </w:r>
     </w:p>
     <w:p>

</xml_diff>

<commit_message>
Note the bowtie2 1.3 read group in the module notes
Co-Authored-By: Claude Opus 5.5 <noreply@anthropic.com>
</commit_message>
<xml_diff>
--- a/docs/ATAC-seq/modules/Portal_Content.docx
+++ b/docs/ATAC-seq/modules/Portal_Content.docx
@@ -2421,6 +2421,48 @@
                 <w:szCs w:val="18"/>
               </w:rPr>
               <w:t xml:space="preserve">SAM files and unsorted BAM files (.unsorted.bam) also remain in the output folder and take up space.</w:t>
+            </w:r>
+          </w:p>
+        </w:tc>
+      </w:tr>
+      <w:tr>
+        <w:tc>
+          <w:tcPr>
+            <w:tcW w:type="dxa" w:w="4753"/>
+            <w:tcMar>
+              <w:top w:type="dxa" w:w="60"/>
+              <w:left w:type="dxa" w:w="90"/>
+              <w:bottom w:type="dxa" w:w="60"/>
+              <w:right w:type="dxa" w:w="90"/>
+            </w:tcMar>
+          </w:tcPr>
+          <w:p>
+            <w:r>
+              <w:rPr>
+                <w:sz w:val="18"/>
+                <w:szCs w:val="18"/>
+              </w:rPr>
+              <w:t xml:space="preserve">1.3부터 샘플마다 read group(@RG; ID, SM, LB = 샘플 이름, PL = ILLUMINA)을 붙입니다. GATK_MarkDuplicates(GATK 4.6)는 read group이 없는 BAM에서 멈추므로, 1.2 이하로 만든 BAM은 1.3으로 다시 정렬해 주세요.</w:t>
+            </w:r>
+          </w:p>
+        </w:tc>
+        <w:tc>
+          <w:tcPr>
+            <w:tcW w:type="dxa" w:w="4753"/>
+            <w:tcMar>
+              <w:top w:type="dxa" w:w="60"/>
+              <w:left w:type="dxa" w:w="90"/>
+              <w:bottom w:type="dxa" w:w="60"/>
+              <w:right w:type="dxa" w:w="90"/>
+            </w:tcMar>
+          </w:tcPr>
+          <w:p>
+            <w:r>
+              <w:rPr>
+                <w:sz w:val="18"/>
+                <w:szCs w:val="18"/>
+              </w:rPr>
+              <w:t xml:space="preserve">From 1.3 each sample gets a read group (@RG; ID, SM, and LB = the sample name, PL = ILLUMINA). GATK_MarkDuplicates (GATK 4.6) stops on BAM files without read groups, so realign BAM files made with 1.2 or earlier using 1.3.</w:t>
             </w:r>
           </w:p>
         </w:tc>

</xml_diff>

<commit_message>
Describe the bowtie2 and gatk images in the content and manual
Fill the bowtie2 execution image from bx_bowtie2_1.0.def and add the
bowtie2 and gatk images (shared with the WGS pipeline, rockylinux:9,
Miniforge3 26.5.3-0) to the container manual.

Co-Authored-By: Claude Opus 5.5 <noreply@anthropic.com>
</commit_message>
<xml_diff>
--- a/docs/ATAC-seq/modules/Portal_Content.docx
+++ b/docs/ATAC-seq/modules/Portal_Content.docx
@@ -244,7 +244,13 @@
         <w:t xml:space="preserve">sha256:8101994123cf3d0a8fee517bee7f39e555c7d92bd2d9eb3303cc988a0eeed00f</w:t>
       </w:r>
       <w:r>
-        <w:t xml:space="preserve">)이며 모든 모듈이 같다.</w:t>
+        <w:t xml:space="preserve">)이며 bowtie2와 GATK_MarkDuplicates를 뺀 모든 모듈이 같다. 이 두 모듈은 WGS 파이프라인과 같이 쓰는 이미지라 </w:t>
+      </w:r>
+      <w:r>
+        <w:t xml:space="preserve">rockylinux/rockylinux:9</w:t>
+      </w:r>
+      <w:r>
+        <w:t xml:space="preserve">(digest 고정 없음)와 Miniforge3 26.5.3-0을 쓴다.</w:t>
       </w:r>
     </w:p>
     <w:p>
@@ -1119,27 +1125,447 @@
     </w:p>
     <w:p>
       <w:pPr>
-        <w:spacing w:after="120"/>
+        <w:spacing w:after="140"/>
+      </w:pPr>
+      <w:r>
+        <w:t xml:space="preserve">이미지: bowtie2 1.0</w:t>
+      </w:r>
+    </w:p>
+    <w:tbl>
+      <w:tblPr>
+        <w:tblW w:type="dxa" w:w="9506"/>
+        <w:tblBorders>
+          <w:top w:val="single" w:color="auto" w:sz="4"/>
+          <w:left w:val="single" w:color="auto" w:sz="4"/>
+          <w:bottom w:val="single" w:color="auto" w:sz="4"/>
+          <w:right w:val="single" w:color="auto" w:sz="4"/>
+          <w:insideH w:val="single" w:color="auto" w:sz="4"/>
+          <w:insideV w:val="single" w:color="auto" w:sz="4"/>
+        </w:tblBorders>
+      </w:tblPr>
+      <w:tblGrid>
+        <w:gridCol w:w="4753"/>
+        <w:gridCol w:w="4753"/>
+      </w:tblGrid>
+      <w:tr>
+        <w:tc>
+          <w:tcPr>
+            <w:tcW w:type="dxa" w:w="4753"/>
+            <w:shd w:fill="E8EDF6" w:color="auto" w:val="clear"/>
+            <w:tcMar>
+              <w:top w:type="dxa" w:w="60"/>
+              <w:left w:type="dxa" w:w="90"/>
+              <w:bottom w:type="dxa" w:w="60"/>
+              <w:right w:type="dxa" w:w="90"/>
+            </w:tcMar>
+          </w:tcPr>
+          <w:p>
+            <w:r>
+              <w:rPr>
+                <w:b/>
+                <w:bCs/>
+                <w:color w:val="32549C"/>
+                <w:sz w:val="18"/>
+                <w:szCs w:val="18"/>
+              </w:rPr>
+              <w:t xml:space="preserve">항목 / Item</w:t>
+            </w:r>
+          </w:p>
+        </w:tc>
+        <w:tc>
+          <w:tcPr>
+            <w:tcW w:type="dxa" w:w="4753"/>
+            <w:shd w:fill="E8EDF6" w:color="auto" w:val="clear"/>
+            <w:tcMar>
+              <w:top w:type="dxa" w:w="60"/>
+              <w:left w:type="dxa" w:w="90"/>
+              <w:bottom w:type="dxa" w:w="60"/>
+              <w:right w:type="dxa" w:w="90"/>
+            </w:tcMar>
+          </w:tcPr>
+          <w:p>
+            <w:r>
+              <w:rPr>
+                <w:b/>
+                <w:bCs/>
+                <w:color w:val="32549C"/>
+                <w:sz w:val="18"/>
+                <w:szCs w:val="18"/>
+              </w:rPr>
+              <w:t xml:space="preserve">값 / Value</w:t>
+            </w:r>
+          </w:p>
+        </w:tc>
+      </w:tr>
+      <w:tr>
+        <w:tc>
+          <w:tcPr>
+            <w:tcW w:type="dxa" w:w="4753"/>
+            <w:tcMar>
+              <w:top w:type="dxa" w:w="60"/>
+              <w:left w:type="dxa" w:w="90"/>
+              <w:bottom w:type="dxa" w:w="60"/>
+              <w:right w:type="dxa" w:w="90"/>
+            </w:tcMar>
+          </w:tcPr>
+          <w:p>
+            <w:r>
+              <w:rPr>
+                <w:sz w:val="18"/>
+                <w:szCs w:val="18"/>
+              </w:rPr>
+              <w:t xml:space="preserve">DEF 파일</w:t>
+            </w:r>
+          </w:p>
+        </w:tc>
+        <w:tc>
+          <w:tcPr>
+            <w:tcW w:type="dxa" w:w="4753"/>
+            <w:tcMar>
+              <w:top w:type="dxa" w:w="60"/>
+              <w:left w:type="dxa" w:w="90"/>
+              <w:bottom w:type="dxa" w:w="60"/>
+              <w:right w:type="dxa" w:w="90"/>
+            </w:tcMar>
+          </w:tcPr>
+          <w:p>
+            <w:r>
+              <w:rPr>
+                <w:sz w:val="18"/>
+                <w:szCs w:val="18"/>
+              </w:rPr>
+              <w:t xml:space="preserve">defs/ATAC-seq/bx_bowtie2_1.0.def</w:t>
+            </w:r>
+          </w:p>
+        </w:tc>
+      </w:tr>
+      <w:tr>
+        <w:tc>
+          <w:tcPr>
+            <w:tcW w:type="dxa" w:w="4753"/>
+            <w:tcMar>
+              <w:top w:type="dxa" w:w="60"/>
+              <w:left w:type="dxa" w:w="90"/>
+              <w:bottom w:type="dxa" w:w="60"/>
+              <w:right w:type="dxa" w:w="90"/>
+            </w:tcMar>
+          </w:tcPr>
+          <w:p>
+            <w:r>
+              <w:rPr>
+                <w:sz w:val="18"/>
+                <w:szCs w:val="18"/>
+              </w:rPr>
+              <w:t xml:space="preserve">DEF Bootstrap</w:t>
+            </w:r>
+          </w:p>
+        </w:tc>
+        <w:tc>
+          <w:tcPr>
+            <w:tcW w:type="dxa" w:w="4753"/>
+            <w:tcMar>
+              <w:top w:type="dxa" w:w="60"/>
+              <w:left w:type="dxa" w:w="90"/>
+              <w:bottom w:type="dxa" w:w="60"/>
+              <w:right w:type="dxa" w:w="90"/>
+            </w:tcMar>
+          </w:tcPr>
+          <w:p>
+            <w:r>
+              <w:rPr>
+                <w:sz w:val="18"/>
+                <w:szCs w:val="18"/>
+              </w:rPr>
+              <w:t xml:space="preserve">docker</w:t>
+            </w:r>
+          </w:p>
+        </w:tc>
+      </w:tr>
+      <w:tr>
+        <w:tc>
+          <w:tcPr>
+            <w:tcW w:type="dxa" w:w="4753"/>
+            <w:tcMar>
+              <w:top w:type="dxa" w:w="60"/>
+              <w:left w:type="dxa" w:w="90"/>
+              <w:bottom w:type="dxa" w:w="60"/>
+              <w:right w:type="dxa" w:w="90"/>
+            </w:tcMar>
+          </w:tcPr>
+          <w:p>
+            <w:r>
+              <w:rPr>
+                <w:sz w:val="18"/>
+                <w:szCs w:val="18"/>
+              </w:rPr>
+              <w:t xml:space="preserve">DEF From</w:t>
+            </w:r>
+          </w:p>
+        </w:tc>
+        <w:tc>
+          <w:tcPr>
+            <w:tcW w:type="dxa" w:w="4753"/>
+            <w:tcMar>
+              <w:top w:type="dxa" w:w="60"/>
+              <w:left w:type="dxa" w:w="90"/>
+              <w:bottom w:type="dxa" w:w="60"/>
+              <w:right w:type="dxa" w:w="90"/>
+            </w:tcMar>
+          </w:tcPr>
+          <w:p>
+            <w:r>
+              <w:rPr>
+                <w:sz w:val="18"/>
+                <w:szCs w:val="18"/>
+              </w:rPr>
+              <w:t xml:space="preserve">rockylinux/rockylinux:9</w:t>
+            </w:r>
+            <w:r>
+              <w:rPr>
+                <w:sz w:val="18"/>
+                <w:szCs w:val="18"/>
+              </w:rPr>
+              <w:t xml:space="preserve"> (Rocky Linux 9, digest 고정 없음)</w:t>
+            </w:r>
+          </w:p>
+        </w:tc>
+      </w:tr>
+      <w:tr>
+        <w:tc>
+          <w:tcPr>
+            <w:tcW w:type="dxa" w:w="4753"/>
+            <w:tcMar>
+              <w:top w:type="dxa" w:w="60"/>
+              <w:left w:type="dxa" w:w="90"/>
+              <w:bottom w:type="dxa" w:w="60"/>
+              <w:right w:type="dxa" w:w="90"/>
+            </w:tcMar>
+          </w:tcPr>
+          <w:p>
+            <w:r>
+              <w:rPr>
+                <w:sz w:val="18"/>
+                <w:szCs w:val="18"/>
+              </w:rPr>
+              <w:t xml:space="preserve">conda 설치 도구 / installer</w:t>
+            </w:r>
+          </w:p>
+        </w:tc>
+        <w:tc>
+          <w:tcPr>
+            <w:tcW w:type="dxa" w:w="4753"/>
+            <w:tcMar>
+              <w:top w:type="dxa" w:w="60"/>
+              <w:left w:type="dxa" w:w="90"/>
+              <w:bottom w:type="dxa" w:w="60"/>
+              <w:right w:type="dxa" w:w="90"/>
+            </w:tcMar>
+          </w:tcPr>
+          <w:p>
+            <w:r>
+              <w:rPr>
+                <w:sz w:val="18"/>
+                <w:szCs w:val="18"/>
+              </w:rPr>
+              <w:t xml:space="preserve">Miniforge3 26.5.3-0 (conda-forge, bioconda)</w:t>
+            </w:r>
+          </w:p>
+        </w:tc>
+      </w:tr>
+    </w:tbl>
+    <w:p/>
+    <w:p>
+      <w:pPr>
+        <w:pStyle w:val="ListParagraph"/>
+        <w:numPr>
+          <w:ilvl w:val="0"/>
+          <w:numId w:val="2"/>
+        </w:numPr>
+        <w:spacing w:after="80"/>
       </w:pPr>
       <w:r>
         <w:rPr>
           <w:b/>
           <w:bCs/>
-          <w:color w:val="B0B0B0"/>
-          <w:sz w:val="18"/>
-          <w:szCs w:val="18"/>
-        </w:rPr>
-        <w:t xml:space="preserve">[내부 메모 · 붙여 넣지 마세요] </w:t>
-      </w:r>
-      <w:r>
-        <w:rPr>
-          <w:color w:val="8A8F99"/>
-          <w:sz w:val="18"/>
-          <w:szCs w:val="18"/>
-        </w:rPr>
-        <w:t xml:space="preserve">등록 메모: bowtie2 DEF는 아직 저장소에 없어 보류한다(bowtie2 2.5.4, SAMtools 1.24 구성 예정).</w:t>
-      </w:r>
-    </w:p>
+        </w:rPr>
+        <w:t xml:space="preserve">설명(국문):</w:t>
+      </w:r>
+      <w:r>
+        <w:t xml:space="preserve"> bowtie2로 read를 참조 유전체에 정렬하고 SAMtools로 BAM 변환·정렬·인덱스를 만드는 환경입니다.</w:t>
+      </w:r>
+    </w:p>
+    <w:p>
+      <w:pPr>
+        <w:pStyle w:val="ListParagraph"/>
+        <w:numPr>
+          <w:ilvl w:val="0"/>
+          <w:numId w:val="2"/>
+        </w:numPr>
+        <w:spacing w:after="80"/>
+      </w:pPr>
+      <w:r>
+        <w:rPr>
+          <w:b/>
+          <w:bCs/>
+        </w:rPr>
+        <w:t xml:space="preserve">Description (English):</w:t>
+      </w:r>
+      <w:r>
+        <w:t xml:space="preserve"> Environment for aligning reads to the reference genome with bowtie2 and converting, sorting, and indexing BAM files with SAMtools.</w:t>
+      </w:r>
+    </w:p>
+    <w:tbl>
+      <w:tblPr>
+        <w:tblW w:type="dxa" w:w="9506"/>
+        <w:tblBorders>
+          <w:top w:val="single" w:color="auto" w:sz="4"/>
+          <w:left w:val="single" w:color="auto" w:sz="4"/>
+          <w:bottom w:val="single" w:color="auto" w:sz="4"/>
+          <w:right w:val="single" w:color="auto" w:sz="4"/>
+          <w:insideH w:val="single" w:color="auto" w:sz="4"/>
+          <w:insideV w:val="single" w:color="auto" w:sz="4"/>
+        </w:tblBorders>
+      </w:tblPr>
+      <w:tblGrid>
+        <w:gridCol w:w="4753"/>
+        <w:gridCol w:w="4753"/>
+      </w:tblGrid>
+      <w:tr>
+        <w:tc>
+          <w:tcPr>
+            <w:tcW w:type="dxa" w:w="4753"/>
+            <w:shd w:fill="E8EDF6" w:color="auto" w:val="clear"/>
+            <w:tcMar>
+              <w:top w:type="dxa" w:w="60"/>
+              <w:left w:type="dxa" w:w="90"/>
+              <w:bottom w:type="dxa" w:w="60"/>
+              <w:right w:type="dxa" w:w="90"/>
+            </w:tcMar>
+          </w:tcPr>
+          <w:p>
+            <w:r>
+              <w:rPr>
+                <w:b/>
+                <w:bCs/>
+                <w:color w:val="32549C"/>
+                <w:sz w:val="18"/>
+                <w:szCs w:val="18"/>
+              </w:rPr>
+              <w:t xml:space="preserve">도구</w:t>
+            </w:r>
+          </w:p>
+        </w:tc>
+        <w:tc>
+          <w:tcPr>
+            <w:tcW w:type="dxa" w:w="4753"/>
+            <w:shd w:fill="E8EDF6" w:color="auto" w:val="clear"/>
+            <w:tcMar>
+              <w:top w:type="dxa" w:w="60"/>
+              <w:left w:type="dxa" w:w="90"/>
+              <w:bottom w:type="dxa" w:w="60"/>
+              <w:right w:type="dxa" w:w="90"/>
+            </w:tcMar>
+          </w:tcPr>
+          <w:p>
+            <w:r>
+              <w:rPr>
+                <w:b/>
+                <w:bCs/>
+                <w:color w:val="32549C"/>
+                <w:sz w:val="18"/>
+                <w:szCs w:val="18"/>
+              </w:rPr>
+              <w:t xml:space="preserve">버전</w:t>
+            </w:r>
+          </w:p>
+        </w:tc>
+      </w:tr>
+      <w:tr>
+        <w:tc>
+          <w:tcPr>
+            <w:tcW w:type="dxa" w:w="4753"/>
+            <w:tcMar>
+              <w:top w:type="dxa" w:w="60"/>
+              <w:left w:type="dxa" w:w="90"/>
+              <w:bottom w:type="dxa" w:w="60"/>
+              <w:right w:type="dxa" w:w="90"/>
+            </w:tcMar>
+          </w:tcPr>
+          <w:p>
+            <w:r>
+              <w:rPr>
+                <w:sz w:val="18"/>
+                <w:szCs w:val="18"/>
+              </w:rPr>
+              <w:t xml:space="preserve">bowtie2</w:t>
+            </w:r>
+          </w:p>
+        </w:tc>
+        <w:tc>
+          <w:tcPr>
+            <w:tcW w:type="dxa" w:w="4753"/>
+            <w:tcMar>
+              <w:top w:type="dxa" w:w="60"/>
+              <w:left w:type="dxa" w:w="90"/>
+              <w:bottom w:type="dxa" w:w="60"/>
+              <w:right w:type="dxa" w:w="90"/>
+            </w:tcMar>
+          </w:tcPr>
+          <w:p>
+            <w:r>
+              <w:rPr>
+                <w:sz w:val="18"/>
+                <w:szCs w:val="18"/>
+              </w:rPr>
+              <w:t xml:space="preserve">2.5.4</w:t>
+            </w:r>
+          </w:p>
+        </w:tc>
+      </w:tr>
+      <w:tr>
+        <w:tc>
+          <w:tcPr>
+            <w:tcW w:type="dxa" w:w="4753"/>
+            <w:tcMar>
+              <w:top w:type="dxa" w:w="60"/>
+              <w:left w:type="dxa" w:w="90"/>
+              <w:bottom w:type="dxa" w:w="60"/>
+              <w:right w:type="dxa" w:w="90"/>
+            </w:tcMar>
+          </w:tcPr>
+          <w:p>
+            <w:r>
+              <w:rPr>
+                <w:sz w:val="18"/>
+                <w:szCs w:val="18"/>
+              </w:rPr>
+              <w:t xml:space="preserve">SAMtools</w:t>
+            </w:r>
+          </w:p>
+        </w:tc>
+        <w:tc>
+          <w:tcPr>
+            <w:tcW w:type="dxa" w:w="4753"/>
+            <w:tcMar>
+              <w:top w:type="dxa" w:w="60"/>
+              <w:left w:type="dxa" w:w="90"/>
+              <w:bottom w:type="dxa" w:w="60"/>
+              <w:right w:type="dxa" w:w="90"/>
+            </w:tcMar>
+          </w:tcPr>
+          <w:p>
+            <w:r>
+              <w:rPr>
+                <w:sz w:val="18"/>
+                <w:szCs w:val="18"/>
+              </w:rPr>
+              <w:t xml:space="preserve">1.24</w:t>
+            </w:r>
+          </w:p>
+        </w:tc>
+      </w:tr>
+    </w:tbl>
+    <w:p/>
     <w:p>
       <w:pPr>
         <w:spacing w:after="100" w:before="200"/>

</xml_diff>

<commit_message>
Register bowtie2 post_process_bam as yes on the portal
Without it only SAM files are written and GATK_MarkDuplicates has no
input.

Co-Authored-By: Claude Opus 5.5 <noreply@anthropic.com>
</commit_message>
<xml_diff>
--- a/docs/ATAC-seq/modules/Portal_Content.docx
+++ b/docs/ATAC-seq/modules/Portal_Content.docx
@@ -2471,7 +2471,7 @@
                 <w:sz w:val="18"/>
                 <w:szCs w:val="18"/>
               </w:rPr>
-              <w:t xml:space="preserve">no</w:t>
+              <w:t xml:space="preserve">yes</w:t>
             </w:r>
           </w:p>
         </w:tc>
@@ -2491,7 +2491,7 @@
                 <w:sz w:val="18"/>
                 <w:szCs w:val="18"/>
               </w:rPr>
-              <w:t xml:space="preserve">yes/no(y/n). yes면 좌표 순 BAM(.sorted.bam)과 .bai 생성</w:t>
+              <w:t xml:space="preserve">yes/no(y/n). yes면 좌표 순 BAM(.sorted.bam)과 .bai 생성. no면 SAM만 남아 다음 모듈(GATK_MarkDuplicates)을 쓸 수 없음. 포탈 등록 값은 yes(스크립트 자체 기본값은 no)</w:t>
             </w:r>
           </w:p>
         </w:tc>
@@ -2511,7 +2511,7 @@
                 <w:sz w:val="18"/>
                 <w:szCs w:val="18"/>
               </w:rPr>
-              <w:t xml:space="preserve">yes/no (y/n); yes writes a coordinate-sorted BAM (.sorted.bam) and .bai</w:t>
+              <w:t xml:space="preserve">yes/no (y/n); yes writes a coordinate-sorted BAM (.sorted.bam) and .bai. With no only SAM files remain and the next module (GATK_MarkDuplicates) cannot run. Registered as yes on the portal (the script's own default is no)</w:t>
             </w:r>
           </w:p>
         </w:tc>
@@ -2616,7 +2616,7 @@
                 <w:sz w:val="18"/>
                 <w:szCs w:val="18"/>
               </w:rPr>
-              <w:t xml:space="preserve">ATAC-seq 파이프라인에서는 post_process_bam=yes로 실행해 주세요. 다음 단계(GATK_MarkDuplicates)는 *.sorted.bam만 읽습니다. 기본값(no)이면 SAM 파일만 만들어집니다.</w:t>
+              <w:t xml:space="preserve">post_process_bam은 yes로 두세요(포탈 기본값). 다음 단계(GATK_MarkDuplicates)는 *.sorted.bam만 읽습니다. no로 바꾸면 SAM 파일만 만들어집니다.</w:t>
             </w:r>
           </w:p>
         </w:tc>
@@ -2636,7 +2636,7 @@
                 <w:sz w:val="18"/>
                 <w:szCs w:val="18"/>
               </w:rPr>
-              <w:t xml:space="preserve">In the ATAC-seq pipeline run with post_process_bam=yes. The next step (GATK_MarkDuplicates) reads *.sorted.bam only; with the default (no) only SAM files are written.</w:t>
+              <w:t xml:space="preserve">Keep post_process_bam=yes (the portal default). The next step (GATK_MarkDuplicates) reads *.sorted.bam only; with no, only SAM files are written.</w:t>
             </w:r>
           </w:p>
         </w:tc>

</xml_diff>

<commit_message>
bowtie2 1.4: write sorted BAM files by default
post_process_bam is not registered on the portal, so 1.3 ran with its
default (no) and left only SAM files, which GATK_MarkDuplicates cannot
read. 1.4 defaults to yes. The content drops the option from the portal
table and the concept figure no longer labels the step as optional.

Co-Authored-By: Claude Opus 5.5 <noreply@anthropic.com>
</commit_message>
<xml_diff>
--- a/docs/ATAC-seq/modules/Portal_Content.docx
+++ b/docs/ATAC-seq/modules/Portal_Content.docx
@@ -633,7 +633,7 @@
                 <w:sz w:val="18"/>
                 <w:szCs w:val="18"/>
               </w:rPr>
-              <w:t xml:space="preserve">1.3</w:t>
+              <w:t xml:space="preserve">1.4</w:t>
             </w:r>
           </w:p>
         </w:tc>
@@ -1027,7 +1027,7 @@
                 <w:sz w:val="18"/>
                 <w:szCs w:val="18"/>
               </w:rPr>
-              <w:t xml:space="preserve">bowtie2.1.3.sh</w:t>
+              <w:t xml:space="preserve">bowtie2.1.4.sh</w:t>
             </w:r>
           </w:p>
         </w:tc>
@@ -1612,7 +1612,7 @@
         <w:spacing w:after="80"/>
       </w:pPr>
       <w:r>
-        <w:t xml:space="preserve">post_process_bam=yes이면 samtools로 정렬 결과를 좌표 순 BAM으로 바꾸고 인덱스(.bai)를 만듭니다.</w:t>
+        <w:t xml:space="preserve">samtools로 정렬 결과를 좌표 순 BAM으로 바꾸고 인덱스(.bai)를 만듭니다.</w:t>
       </w:r>
     </w:p>
     <w:p>
@@ -1700,7 +1700,7 @@
         <w:spacing w:after="80"/>
       </w:pPr>
       <w:r>
-        <w:t xml:space="preserve">With post_process_bam=yes, samtools converts the alignments to a coordinate-sorted BAM and builds its index (.bai).</w:t>
+        <w:t xml:space="preserve">samtools converts the alignments to a coordinate-sorted BAM and builds its index (.bai).</w:t>
       </w:r>
     </w:p>
     <w:p>
@@ -2374,150 +2374,31 @@
           </w:p>
         </w:tc>
       </w:tr>
-      <w:tr>
-        <w:tc>
-          <w:tcPr>
-            <w:tcW w:type="dxa" w:w="920"/>
-            <w:tcMar>
-              <w:top w:type="dxa" w:w="60"/>
-              <w:left w:type="dxa" w:w="90"/>
-              <w:bottom w:type="dxa" w:w="60"/>
-              <w:right w:type="dxa" w:w="90"/>
-            </w:tcMar>
-          </w:tcPr>
-          <w:p>
-            <w:r>
-              <w:rPr>
-                <w:sz w:val="18"/>
-                <w:szCs w:val="18"/>
-              </w:rPr>
-              <w:t xml:space="preserve">Option</w:t>
-            </w:r>
-          </w:p>
-        </w:tc>
-        <w:tc>
-          <w:tcPr>
-            <w:tcW w:type="dxa" w:w="950"/>
-            <w:tcMar>
-              <w:top w:type="dxa" w:w="60"/>
-              <w:left w:type="dxa" w:w="90"/>
-              <w:bottom w:type="dxa" w:w="60"/>
-              <w:right w:type="dxa" w:w="90"/>
-            </w:tcMar>
-          </w:tcPr>
-          <w:p>
-            <w:r>
-              <w:rPr>
-                <w:sz w:val="18"/>
-                <w:szCs w:val="18"/>
-              </w:rPr>
-              <w:t xml:space="preserve">Optional</w:t>
-            </w:r>
-          </w:p>
-        </w:tc>
-        <w:tc>
-          <w:tcPr>
-            <w:tcW w:type="dxa" w:w="950"/>
-            <w:tcMar>
-              <w:top w:type="dxa" w:w="60"/>
-              <w:left w:type="dxa" w:w="90"/>
-              <w:bottom w:type="dxa" w:w="60"/>
-              <w:right w:type="dxa" w:w="90"/>
-            </w:tcMar>
-          </w:tcPr>
-          <w:p>
-            <w:r>
-              <w:rPr>
-                <w:sz w:val="18"/>
-                <w:szCs w:val="18"/>
-              </w:rPr>
-              <w:t xml:space="preserve">List</w:t>
-            </w:r>
-          </w:p>
-        </w:tc>
-        <w:tc>
-          <w:tcPr>
-            <w:tcW w:type="dxa" w:w="1400"/>
-            <w:tcMar>
-              <w:top w:type="dxa" w:w="60"/>
-              <w:left w:type="dxa" w:w="90"/>
-              <w:bottom w:type="dxa" w:w="60"/>
-              <w:right w:type="dxa" w:w="90"/>
-            </w:tcMar>
-          </w:tcPr>
-          <w:p>
-            <w:r>
-              <w:rPr>
-                <w:sz w:val="18"/>
-                <w:szCs w:val="18"/>
-              </w:rPr>
-              <w:t xml:space="preserve">post_process_bam</w:t>
-            </w:r>
-          </w:p>
-        </w:tc>
-        <w:tc>
-          <w:tcPr>
-            <w:tcW w:type="dxa" w:w="1000"/>
-            <w:tcMar>
-              <w:top w:type="dxa" w:w="60"/>
-              <w:left w:type="dxa" w:w="90"/>
-              <w:bottom w:type="dxa" w:w="60"/>
-              <w:right w:type="dxa" w:w="90"/>
-            </w:tcMar>
-          </w:tcPr>
-          <w:p>
-            <w:r>
-              <w:rPr>
-                <w:sz w:val="18"/>
-                <w:szCs w:val="18"/>
-              </w:rPr>
-              <w:t xml:space="preserve">yes</w:t>
-            </w:r>
-          </w:p>
-        </w:tc>
-        <w:tc>
-          <w:tcPr>
-            <w:tcW w:type="dxa" w:w="2140"/>
-            <w:tcMar>
-              <w:top w:type="dxa" w:w="60"/>
-              <w:left w:type="dxa" w:w="90"/>
-              <w:bottom w:type="dxa" w:w="60"/>
-              <w:right w:type="dxa" w:w="90"/>
-            </w:tcMar>
-          </w:tcPr>
-          <w:p>
-            <w:r>
-              <w:rPr>
-                <w:sz w:val="18"/>
-                <w:szCs w:val="18"/>
-              </w:rPr>
-              <w:t xml:space="preserve">yes/no(y/n). yes면 좌표 순 BAM(.sorted.bam)과 .bai 생성. no면 SAM만 남아 다음 모듈(GATK_MarkDuplicates)을 쓸 수 없음. 포탈 등록 값은 yes(스크립트 자체 기본값은 no)</w:t>
-            </w:r>
-          </w:p>
-        </w:tc>
-        <w:tc>
-          <w:tcPr>
-            <w:tcW w:type="dxa" w:w="2146"/>
-            <w:tcMar>
-              <w:top w:type="dxa" w:w="60"/>
-              <w:left w:type="dxa" w:w="90"/>
-              <w:bottom w:type="dxa" w:w="60"/>
-              <w:right w:type="dxa" w:w="90"/>
-            </w:tcMar>
-          </w:tcPr>
-          <w:p>
-            <w:r>
-              <w:rPr>
-                <w:sz w:val="18"/>
-                <w:szCs w:val="18"/>
-              </w:rPr>
-              <w:t xml:space="preserve">yes/no (y/n); yes writes a coordinate-sorted BAM (.sorted.bam) and .bai. With no only SAM files remain and the next module (GATK_MarkDuplicates) cannot run. Registered as yes on the portal (the script's own default is no)</w:t>
-            </w:r>
-          </w:p>
-        </w:tc>
-      </w:tr>
     </w:tbl>
     <w:p/>
+    <w:p>
+      <w:pPr>
+        <w:spacing w:after="120"/>
+      </w:pPr>
+      <w:r>
+        <w:rPr>
+          <w:b/>
+          <w:bCs/>
+          <w:color w:val="B0B0B0"/>
+          <w:sz w:val="18"/>
+          <w:szCs w:val="18"/>
+        </w:rPr>
+        <w:t xml:space="preserve">[내부 메모 · 붙여 넣지 마세요] </w:t>
+      </w:r>
+      <w:r>
+        <w:rPr>
+          <w:color w:val="8A8F99"/>
+          <w:sz w:val="18"/>
+          <w:szCs w:val="18"/>
+        </w:rPr>
+        <w:t xml:space="preserve">등록 메모: post_process_bam은 포탈에 등록하지 않는다. 스크립트 기본값이 yes(1.4부터)라 항상 좌표 순 BAM과 .bai를 만든다(1.3 이하는 기본값 no라 인자 없이 실행하면 SAM만 남았다).</w:t>
+      </w:r>
+    </w:p>
     <w:p>
       <w:pPr>
         <w:spacing w:after="100" w:before="200"/>
@@ -2616,7 +2497,7 @@
                 <w:sz w:val="18"/>
                 <w:szCs w:val="18"/>
               </w:rPr>
-              <w:t xml:space="preserve">post_process_bam은 yes로 두세요(포탈 기본값). 다음 단계(GATK_MarkDuplicates)는 *.sorted.bam만 읽습니다. no로 바꾸면 SAM 파일만 만들어집니다.</w:t>
+              <w:t xml:space="preserve">샘플마다 좌표 순 BAM(&lt;sample&gt;_bowtie_paired.sorted.bam)과 인덱스(.bai)를 만듭니다. 다음 단계(GATK_MarkDuplicates)는 *.sorted.bam만 읽습니다.</w:t>
             </w:r>
           </w:p>
         </w:tc>
@@ -2636,7 +2517,7 @@
                 <w:sz w:val="18"/>
                 <w:szCs w:val="18"/>
               </w:rPr>
-              <w:t xml:space="preserve">Keep post_process_bam=yes (the portal default). The next step (GATK_MarkDuplicates) reads *.sorted.bam only; with no, only SAM files are written.</w:t>
+              <w:t xml:space="preserve">Each sample gets a coordinate-sorted BAM (&lt;sample&gt;_bowtie_paired.sorted.bam) with its index (.bai). The next step (GATK_MarkDuplicates) reads *.sorted.bam only.</w:t>
             </w:r>
           </w:p>
         </w:tc>
@@ -3007,7 +2888,7 @@
         <w:t xml:space="preserve">그림. bowtie2 정렬.</w:t>
       </w:r>
       <w:r>
-        <w:t xml:space="preserve"> (A) 참조 유전체 FASTA로 bowtie2 인덱스(.bt2 파일 6개)를 만든다. 인덱스가 이미 있으면 그대로 쓴다. (B) 짝을 이룬 두 read(R1, R2)를 참조 유전체에 서로 마주 보는 방향으로 정렬하며, 두 read 바깥 끝 사이가 fragment 길이다. bowtie2 기본 설정에서는 500 bp까지의 짝만 정상 짝(concordant)으로 본다. (C) 샘플마다 SAM 파일이 만들어지고, post_process_bam=yes이면 정렬 전 BAM을 거쳐 좌표 순 BAM과 인덱스가 만들어진다. 샘플마다 read group(@RG; ID, SM, LB = 샘플 이름, PL = ILLUMINA)이 붙는다. 정렬 요약은 샘플별 로그에 남는다(숫자는 예시).</w:t>
+        <w:t xml:space="preserve"> (A) 참조 유전체 FASTA로 bowtie2 인덱스(.bt2 파일 6개)를 만든다. 인덱스가 이미 있으면 그대로 쓴다. (B) 짝을 이룬 두 read(R1, R2)를 참조 유전체에 서로 마주 보는 방향으로 정렬하며, 두 read 바깥 끝 사이가 fragment 길이다. bowtie2 기본 설정에서는 500 bp까지의 짝만 정상 짝(concordant)으로 본다. (C) 샘플마다 SAM 파일이 만들어지고, samtools로 정렬 전 BAM을 거쳐 좌표 순 BAM과 인덱스가 만들어진다. 샘플마다 read group(@RG; ID, SM, LB = 샘플 이름, PL = ILLUMINA)이 붙는다. 정렬 요약은 샘플별 로그에 남는다(숫자는 예시).</w:t>
       </w:r>
     </w:p>
     <w:p>
@@ -3030,7 +2911,7 @@
         <w:t xml:space="preserve">Figure. Alignment with bowtie2.</w:t>
       </w:r>
       <w:r>
-        <w:t xml:space="preserve"> (A) A bowtie2 index (six .bt2 files) is built from the reference FASTA; an existing index is used as is. (B) The two reads of a pair (R1, R2) align to the reference facing each other, and the span between their outer ends is the fragment length. With the bowtie2 defaults only pairs up to 500 bp are concordant. (C) Each sample gives a SAM file, and with post_process_bam=yes an unsorted BAM and then a coordinate-sorted BAM with its index. Each sample gets a read group (@RG; ID, SM, and LB = the sample name, PL = ILLUMINA). The alignment summary is written to a per-sample log (numbers are illustrative).</w:t>
+        <w:t xml:space="preserve"> (A) A bowtie2 index (six .bt2 files) is built from the reference FASTA; an existing index is used as is. (B) The two reads of a pair (R1, R2) align to the reference facing each other, and the span between their outer ends is the fragment length. With the bowtie2 defaults only pairs up to 500 bp are concordant. (C) Each sample gives a SAM file, then with samtools an unsorted BAM and a coordinate-sorted BAM with its index. Each sample gets a read group (@RG; ID, SM, and LB = the sample name, PL = ILLUMINA). The alignment summary is written to a per-sample log (numbers are illustrative).</w:t>
       </w:r>
     </w:p>
     <w:p>
@@ -3072,7 +2953,7 @@
           <w:sz w:val="19"/>
           <w:szCs w:val="19"/>
         </w:rPr>
-        <w:t xml:space="preserve">bash bowtie2.1.3.sh \</w:t>
+        <w:t xml:space="preserve">bash bowtie2.1.4.sh \</w:t>
       </w:r>
     </w:p>
     <w:p>
@@ -3114,21 +2995,7 @@
           <w:sz w:val="19"/>
           <w:szCs w:val="19"/>
         </w:rPr>
-        <w:t xml:space="preserve">  ref_genome=/ref/genome.fa \</w:t>
-      </w:r>
-    </w:p>
-    <w:p>
-      <w:pPr>
-        <w:shd w:fill="F3F4F6" w:color="auto" w:val="clear"/>
-        <w:spacing w:after="0"/>
-      </w:pPr>
-      <w:r>
-        <w:rPr>
-          <w:color w:val="3A3A3A"/>
-          <w:sz w:val="19"/>
-          <w:szCs w:val="19"/>
-        </w:rPr>
-        <w:t xml:space="preserve">  post_process_bam=yes</w:t>
+        <w:t xml:space="preserve">  ref_genome=/ref/genome.fa</w:t>
       </w:r>
     </w:p>
     <w:p/>

</xml_diff>

<commit_message>
Write the whole portal content in the formal polite style
Every sentence in the module content, including legends, registration
notes, and the common notes, now ends in -합니다/-습니다/-입니다. The
portal guide states the rule; short table descriptions may stay in
note form.

Co-Authored-By: Claude Opus 5.5 <noreply@anthropic.com>
</commit_message>
<xml_diff>
--- a/docs/ATAC-seq/modules/Portal_Content.docx
+++ b/docs/ATAC-seq/modules/Portal_Content.docx
@@ -38,7 +38,7 @@
           <w:sz w:val="18"/>
           <w:szCs w:val="18"/>
         </w:rPr>
-        <w:t xml:space="preserve">KOBIC 포탈의 "파이프라인 모듈" 등록 화면에 들어갈 모듈별 원고다. 항목 순서는 등록 화면을 따른다. 인자 정의는 </w:t>
+        <w:t xml:space="preserve">KOBIC 포탈의 "파이프라인 모듈" 등록 화면에 들어갈 모듈별 원고입니다. 항목 순서는 등록 화면을 따릅니다. 인자 정의는 </w:t>
       </w:r>
       <w:r>
         <w:rPr>
@@ -54,7 +54,7 @@
           <w:sz w:val="18"/>
           <w:szCs w:val="18"/>
         </w:rPr>
-        <w:t xml:space="preserve">와 같다. 작성 방법은 </w:t>
+        <w:t xml:space="preserve">와 같습니다. 작성 방법은 </w:t>
       </w:r>
       <w:r>
         <w:rPr>
@@ -70,7 +70,7 @@
           <w:sz w:val="18"/>
           <w:szCs w:val="18"/>
         </w:rPr>
-        <w:t xml:space="preserve">를 따른다.</w:t>
+        <w:t xml:space="preserve">를 따릅니다.</w:t>
       </w:r>
     </w:p>
     <w:p>
@@ -112,7 +112,7 @@
         <w:t xml:space="preserve">key=value</w:t>
       </w:r>
       <w:r>
-        <w:t xml:space="preserve"> 형식 인자를 받는다. 등록 화면의 Name은 인자 이름, Value는 기본값이다.</w:t>
+        <w:t xml:space="preserve"> 형식 인자를 받습니다. 등록 화면의 Name은 인자 이름, Value는 기본값입니다.</w:t>
       </w:r>
     </w:p>
     <w:p>
@@ -137,7 +137,7 @@
         <w:t xml:space="preserve">/ref/…</w:t>
       </w:r>
       <w:r>
-        <w:t xml:space="preserve">)를 넣었다. 기본값이 아니며, 실행할 때 캔버스에서 실제 경로로 바꾼다. 예시 경로가 그대로 넘어가면 스크립트가 "not found"로 멈춘다.</w:t>
+        <w:t xml:space="preserve">)를 넣었습니다. 기본값이 아니며, 실행할 때 캔버스에서 실제 경로로 바꿉니다. 예시 경로가 그대로 넘어가면 스크립트가 "not found"로 멈춥니다.</w:t>
       </w:r>
     </w:p>
     <w:p>
@@ -162,13 +162,13 @@
         <w:t xml:space="preserve">cores</w:t>
       </w:r>
       <w:r>
-        <w:t xml:space="preserve">)은 포탈에 등록하지 않는다. 실행 환경의 Processor Core 선택이 곧 스레드 수이며(스크립트가 </w:t>
+        <w:t xml:space="preserve">)은 포탈에 등록하지 않습니다. 실행 환경의 Processor Core 선택이 곧 스레드 수이며(스크립트가 </w:t>
       </w:r>
       <w:r>
         <w:t xml:space="preserve">auto</w:t>
       </w:r>
       <w:r>
-        <w:t xml:space="preserve">로 할당된 코어 수를 읽는다), 같은 값을 두 번 고르다 엇갈리는 일을 막는다.</w:t>
+        <w:t xml:space="preserve">로 할당된 코어 수를 읽습니다), 같은 값을 두 번 고르다 엇갈리는 일을 막습니다.</w:t>
       </w:r>
     </w:p>
     <w:p>
@@ -181,7 +181,7 @@
         <w:spacing w:after="80"/>
       </w:pPr>
       <w:r>
-        <w:t xml:space="preserve">선택(Optional) 입력은 빈 값이 "사용 안 함"이다. 경로를 넣어 두면 그 경로를 실제로 찾으므로 Value를 비워 둔다.</w:t>
+        <w:t xml:space="preserve">선택(Optional) 입력은 빈 값이 "사용 안 함"입니다. 경로를 넣어 두면 그 경로를 실제로 찾으므로 Value를 비워 둡니다.</w:t>
       </w:r>
     </w:p>
     <w:p>
@@ -194,7 +194,7 @@
         <w:spacing w:after="80"/>
       </w:pPr>
       <w:r>
-        <w:t xml:space="preserve">스크립트 사용 예제는 모든 옵션을 기본값으로 적었다(기본값이 없는 옵션은 제외). 예시 값은 애기장대(TAIR10, 유전체 약 1.2e8 bp) 기준이다.</w:t>
+        <w:t xml:space="preserve">스크립트 사용 예제는 모든 옵션을 기본값으로 적었습니다(기본값이 없는 옵션은 제외). 예시 값은 애기장대(TAIR10, 유전체 약 1.2e8 bp) 기준입니다.</w:t>
       </w:r>
     </w:p>
     <w:p>
@@ -207,7 +207,7 @@
         <w:spacing w:after="80"/>
       </w:pPr>
       <w:r>
-        <w:t xml:space="preserve">형식(Type)은 포탈 목록에 맞춰 고른다. 원고에는 Directory, File, String, Integer, Float, List로 적었다.</w:t>
+        <w:t xml:space="preserve">형식(Type)은 포탈 목록에 맞춰 고릅니다. 원고에는 Directory, File, String, Integer, Float, List로 적었습니다.</w:t>
       </w:r>
     </w:p>
     <w:p>
@@ -232,7 +232,7 @@
         <w:t xml:space="preserve">docker</w:t>
       </w:r>
       <w:r>
-        <w:t xml:space="preserve">)은 이미지를 만들 때 쓴 DEF 파일의 값이라 다르다. 기반 이미지(From)는 DEF의 </w:t>
+        <w:t xml:space="preserve">)은 이미지를 만들 때 쓴 DEF 파일의 값이라 다릅니다. 기반 이미지(From)는 DEF의 </w:t>
       </w:r>
       <w:r>
         <w:t xml:space="preserve">rockylinux/rockylinux:9.8</w:t>
@@ -244,13 +244,13 @@
         <w:t xml:space="preserve">sha256:8101994123cf3d0a8fee517bee7f39e555c7d92bd2d9eb3303cc988a0eeed00f</w:t>
       </w:r>
       <w:r>
-        <w:t xml:space="preserve">)이며 bowtie2와 GATK_MarkDuplicates를 뺀 모든 모듈이 같다. 이 두 모듈은 WGS 파이프라인과 같이 쓰는 이미지라 </w:t>
+        <w:t xml:space="preserve">)이며 bowtie2와 GATK_MarkDuplicates를 뺀 모든 모듈이 같습니다. 이 두 모듈은 WGS 파이프라인과 같이 쓰는 이미지라 </w:t>
       </w:r>
       <w:r>
         <w:t xml:space="preserve">rockylinux/rockylinux:9</w:t>
       </w:r>
       <w:r>
-        <w:t xml:space="preserve">(digest 고정 없음)와 Miniforge3 26.5.3-0을 쓴다.</w:t>
+        <w:t xml:space="preserve">(digest 고정 없음)와 Miniforge3 26.5.3-0을 씁니다.</w:t>
       </w:r>
     </w:p>
     <w:p>
@@ -263,7 +263,7 @@
         <w:spacing w:after="80"/>
       </w:pPr>
       <w:r>
-        <w:t xml:space="preserve">버전은 각 실행 스크립트 파일 이름에 적힌 버전을 쓴다(예: organellar_filter.1.1.sh → 1.1).</w:t>
+        <w:t xml:space="preserve">버전은 각 실행 스크립트 파일 이름에 적힌 버전을 씁니다(예: organellar_filter.1.1.sh → 1.1).</w:t>
       </w:r>
     </w:p>
     <w:p>
@@ -306,7 +306,7 @@
         <w:t xml:space="preserve">logs/</w:t>
       </w:r>
       <w:r>
-        <w:t xml:space="preserve">를 뺀 나머지를 지운다.</w:t>
+        <w:t xml:space="preserve">를 뺀 나머지를 지웁니다.</w:t>
       </w:r>
     </w:p>
     <w:p>
@@ -319,13 +319,13 @@
         <w:spacing w:after="80"/>
       </w:pPr>
       <w:r>
-        <w:t xml:space="preserve">카테고리는 기능(분석 단계) 기준의 대분류·중분류로 정했다(</w:t>
+        <w:t xml:space="preserve">카테고리는 기능(분석 단계) 기준의 대분류·중분류로 정했습니다(</w:t>
       </w:r>
       <w:r>
         <w:t xml:space="preserve">docs/CLOSHA_Portal_Guide_v1.md</w:t>
       </w:r>
       <w:r>
-        <w:t xml:space="preserve"> 5.2). 아이콘은 대분류마다 하나다.</w:t>
+        <w:t xml:space="preserve"> 5.2). 아이콘은 대분류마다 하나입니다.</w:t>
       </w:r>
     </w:p>
     <w:p>
@@ -338,13 +338,13 @@
         <w:spacing w:after="80"/>
       </w:pPr>
       <w:r>
-        <w:t xml:space="preserve">주요 결과 이미지는 모듈 결과 중 등록할 파일 이름만 적는다(</w:t>
+        <w:t xml:space="preserve">주요 결과 이미지는 모듈 결과 중 등록할 파일 이름만 적습니다(</w:t>
       </w:r>
       <w:r>
         <w:t xml:space="preserve">output_dir</w:t>
       </w:r>
       <w:r>
-        <w:t xml:space="preserve"> 기준). 그림은 등록할 때 실제 결과를 캡처해 올린다.</w:t>
+        <w:t xml:space="preserve"> 기준). 그림은 등록할 때 실제 결과를 캡처해 올립니다.</w:t>
       </w:r>
     </w:p>
     <w:p>
@@ -2396,7 +2396,7 @@
           <w:sz w:val="18"/>
           <w:szCs w:val="18"/>
         </w:rPr>
-        <w:t xml:space="preserve">등록 메모: post_process_bam은 포탈에 등록하지 않는다. 스크립트 기본값이 yes(1.4부터)라 항상 좌표 순 BAM과 .bai를 만든다(1.3 이하는 기본값 no라 인자 없이 실행하면 SAM만 남았다).</w:t>
+        <w:t xml:space="preserve">등록 메모: post_process_bam은 포탈에 등록하지 않습니다. 스크립트 기본값이 yes(1.4부터)라 항상 좌표 순 BAM과 .bai를 만듭니다(1.3 이하는 기본값 no라 인자 없이 실행하면 SAM만 남았습니다).</w:t>
       </w:r>
     </w:p>
     <w:p>
@@ -2888,7 +2888,7 @@
         <w:t xml:space="preserve">그림. bowtie2 정렬.</w:t>
       </w:r>
       <w:r>
-        <w:t xml:space="preserve"> (A) 참조 유전체 FASTA로 bowtie2 인덱스(.bt2 파일 6개)를 만든다. 인덱스가 이미 있으면 그대로 쓴다. (B) 짝을 이룬 두 read(R1, R2)를 참조 유전체에 서로 마주 보는 방향으로 정렬하며, 두 read 바깥 끝 사이가 fragment 길이다. bowtie2 기본 설정에서는 500 bp까지의 짝만 정상 짝(concordant)으로 본다. (C) 샘플마다 SAM 파일이 만들어지고, samtools로 정렬 전 BAM을 거쳐 좌표 순 BAM과 인덱스가 만들어진다. 샘플마다 read group(@RG; ID, SM, LB = 샘플 이름, PL = ILLUMINA)이 붙는다. 정렬 요약은 샘플별 로그에 남는다(숫자는 예시).</w:t>
+        <w:t xml:space="preserve"> (A) 참조 유전체 FASTA로 bowtie2 인덱스(.bt2 파일 6개)를 만듭니다. 인덱스가 이미 있으면 그대로 씁니다. (B) 짝을 이룬 두 read(R1, R2)를 참조 유전체에 서로 마주 보는 방향으로 정렬하며, 두 read 바깥 끝 사이가 fragment 길이입니다. bowtie2 기본 설정에서는 500 bp까지의 짝만 정상 짝(concordant)으로 봅니다. (C) 샘플마다 SAM 파일이 만들어지고, samtools로 정렬 전 BAM을 거쳐 좌표 순 BAM과 인덱스가 만들어집니다. 샘플마다 read group(@RG; ID, SM, LB = 샘플 이름, PL = ILLUMINA)이 붙습니다. 정렬 요약은 샘플별 로그에 남습니다(숫자는 예시).</w:t>
       </w:r>
     </w:p>
     <w:p>
@@ -3042,7 +3042,7 @@
         <w:t xml:space="preserve">&lt;sample&gt;_bowtie.log</w:t>
       </w:r>
       <w:r>
-        <w:t xml:space="preserve">의 정렬 요약 부분 (이 모듈은 그림을 만들지 않는다)</w:t>
+        <w:t xml:space="preserve">의 정렬 요약 부분 (이 모듈은 그림을 만들지 않습니다)</w:t>
       </w:r>
     </w:p>
     <w:p>
@@ -3065,7 +3065,7 @@
         <w:t xml:space="preserve">샘플별 bowtie2 정렬 요약.</w:t>
       </w:r>
       <w:r>
-        <w:t xml:space="preserve"> 전체 read 쌍 중 정상 짝으로 한 곳에 정렬된 비율(aligned concordantly exactly 1 time), 여러 곳에 정렬된 비율(&gt;1 times), 정렬되지 않은 비율(0 times)과 전체 정렬률(overall alignment rate)을 보여 준다. ENCODE ATAC-seq 기준은 전체 정렬률 95% 이상이 바람직하고 80% 이상이면 허용하며, 여러 곳에 정렬된 비율이 높으면 반복 서열이나 오염을 의심할 수 있다.</w:t>
+        <w:t xml:space="preserve"> 전체 read 쌍 중 정상 짝으로 한 곳에 정렬된 비율(aligned concordantly exactly 1 time), 여러 곳에 정렬된 비율(&gt;1 times), 정렬되지 않은 비율(0 times)과 전체 정렬률(overall alignment rate)을 보여 줍니다. ENCODE ATAC-seq 기준은 전체 정렬률 95% 이상이 바람직하고 80% 이상이면 허용하며, 여러 곳에 정렬된 비율이 높으면 반복 서열이나 오염을 의심할 수 있습니다.</w:t>
       </w:r>
     </w:p>
     <w:p>
@@ -3872,7 +3872,7 @@
           <w:sz w:val="18"/>
           <w:szCs w:val="18"/>
         </w:rPr>
-        <w:t xml:space="preserve">등록 메모: 스크립트 파일 이름은 1.0이지만 내용은 v1.1이다(도구 경로 /opt/bio/bin, 실패 시 종료 코드 1). Java 힙이 20GB로 고정(-Xmx20g)되어 있으므로 실행 메모리는 24GB 이상을 고른다. 스크립트가 받는 threads 인자는 쓰이지 않으므로 포탈에 등록하지 않는다.</w:t>
+        <w:t xml:space="preserve">등록 메모: 스크립트 파일 이름은 1.0이지만 내용은 v1.1입니다(도구 경로 /opt/bio/bin, 실패 시 종료 코드 1). Java 힙이 20GB로 고정(-Xmx20g)되어 있으므로 실행 메모리는 24GB 이상을 고릅니다. 스크립트가 받는 threads 인자는 쓰이지 않으므로 포탈에 등록하지 않습니다.</w:t>
       </w:r>
     </w:p>
     <w:p>
@@ -5658,7 +5658,7 @@
         <w:t xml:space="preserve">그림. 중복 read 표시(MarkDuplicates).</w:t>
       </w:r>
       <w:r>
-        <w:t xml:space="preserve"> (A) 같은 위치에서 같은 방향으로 시작하는 read 쌍(점선)은 PCR·광학 중복으로 본다. 그중 염기 품질 합이 가장 높은 쌍만 남기고 나머지는 중복으로 표시하며, 시작 위치가 다른 쌍은 중복이 아니다. (B) 중복 read는 지우지 않고 정렬 정보를 그대로 둔 채 FLAG에 중복 표시(0x400, 1024)만 더한다(예: 99 → 1123). 이후 단계는 이 표시로 중복을 뺄 수 있다. 입력 BAM에는 read group(@RG)이 있어야 한다. (C) 샘플마다 중복 표시 BAM과 인덱스, 중복 통계(duplicate_metrics.txt), GATK 실행 로그가 만들어진다(숫자는 예시).</w:t>
+        <w:t xml:space="preserve"> (A) 같은 위치에서 같은 방향으로 시작하는 read 쌍(점선)은 PCR·광학 중복으로 봅니다. 그중 염기 품질 합이 가장 높은 쌍만 남기고 나머지는 중복으로 표시하며, 시작 위치가 다른 쌍은 중복이 아니다. (B) 중복 read는 지우지 않고 정렬 정보를 그대로 둔 채 FLAG에 중복 표시(0x400, 1024)만 더합니다(예: 99 → 1123). 이후 단계는 이 표시로 중복을 뺄 수 있습니다. 입력 BAM에는 read group(@RG)이 있어야 합니다. (C) 샘플마다 중복 표시 BAM과 인덱스, 중복 통계(duplicate_metrics.txt), GATK 실행 로그가 만들어집니다(숫자는 예시).</w:t>
       </w:r>
     </w:p>
     <w:p>
@@ -5812,7 +5812,7 @@
         <w:t xml:space="preserve">&lt;sample&gt;_duplicate_metrics.txt</w:t>
       </w:r>
       <w:r>
-        <w:t xml:space="preserve">의 METRICS CLASS 부분 (이 모듈은 그림을 만들지 않는다)</w:t>
+        <w:t xml:space="preserve">의 METRICS CLASS 부분 (이 모듈은 그림을 만들지 않습니다)</w:t>
       </w:r>
     </w:p>
     <w:p>
@@ -5835,7 +5835,7 @@
         <w:t xml:space="preserve">샘플별 중복 read 통계.</w:t>
       </w:r>
       <w:r>
-        <w:t xml:space="preserve"> 검사한 read 쌍 수(READ_PAIRS_EXAMINED), 중복으로 표시된 read 쌍 수(READ_PAIR_DUPLICATES), 그중 광학 중복 수(READ_PAIR_OPTICAL_DUPLICATES), 중복 비율(PERCENT_DUPLICATION, 0~1)과 추정 라이브러리 크기(ESTIMATED_LIBRARY_SIZE)를 보여 준다. 중복 비율은 시퀀싱 깊이와 시료 양에 따라 달라지므로, 같은 실험의 샘플끼리 비교해 다른 샘플보다 크게 높은 샘플을 찾는 데 쓴다.</w:t>
+        <w:t xml:space="preserve"> 검사한 read 쌍 수(READ_PAIRS_EXAMINED), 중복으로 표시된 read 쌍 수(READ_PAIR_DUPLICATES), 그중 광학 중복 수(READ_PAIR_OPTICAL_DUPLICATES), 중복 비율(PERCENT_DUPLICATION, 0~1)과 추정 라이브러리 크기(ESTIMATED_LIBRARY_SIZE)를 보여 줍니다. 중복 비율은 시퀀싱 깊이와 시료 양에 따라 달라지므로, 같은 실험의 샘플끼리 비교해 다른 샘플보다 크게 높은 샘플을 찾는 데 씁니다.</w:t>
       </w:r>
     </w:p>
     <w:p>
@@ -7888,7 +7888,7 @@
           <w:sz w:val="18"/>
           <w:szCs w:val="18"/>
         </w:rPr>
-        <w:t xml:space="preserve">)는 포탈에 등록하지 않는다. 실행 환경의 Processor Core 선택(싱글 코어 또는 최대 4코어)으로 정해지며, 스크립트 기본값 </w:t>
+        <w:t xml:space="preserve">)는 포탈에 등록하지 않습니다. 실행 환경의 Processor Core 선택(싱글 코어 또는 최대 4코어)으로 정해지며, 스크립트 기본값 </w:t>
       </w:r>
       <w:r>
         <w:rPr>
@@ -7904,7 +7904,7 @@
           <w:sz w:val="18"/>
           <w:szCs w:val="18"/>
         </w:rPr>
-        <w:t xml:space="preserve">가 그 코어 수를 쓴다.</w:t>
+        <w:t xml:space="preserve">가 그 코어 수를 씁니다.</w:t>
       </w:r>
     </w:p>
     <w:p>
@@ -8186,7 +8186,7 @@
         <w:t xml:space="preserve">그림. 세포소기관 read 제거.</w:t>
       </w:r>
       <w:r>
-        <w:t xml:space="preserve"> (A) 핵 DNA는 뉴클레오솜에 감겨 Tn5 절단이 열린 영역에 한정되지만, 미토콘드리아·엽록체 DNA는 뉴클레오솜이 없어 Tn5가 많이 자른다. (B) 그 결과 정렬된 read의 상당 부분이 세포소기관 contig(Mt, Pt)에 몰린다. 모듈은 contig별 read 수(idxstats)와 제거 전후 flagstat을 표로 남기며, 필터 후에는 핵 염색체 read만 남는다. (C) 세포소기관 contig는 이름 정규식(organellar_pattern)으로 찾아 제외한다.</w:t>
+        <w:t xml:space="preserve"> (A) 핵 DNA는 뉴클레오솜에 감겨 Tn5 절단이 열린 영역에 한정되지만, 미토콘드리아·엽록체 DNA는 뉴클레오솜이 없어 Tn5가 많이 자릅니다. (B) 그 결과 정렬된 read의 상당 부분이 세포소기관 contig(Mt, Pt)에 몰립니다. 모듈은 contig별 read 수(idxstats)와 제거 전후 flagstat을 표로 남기며, 필터 후에는 핵 염색체 read만 남습니다. (C) 세포소기관 contig는 이름 정규식(organellar_pattern)으로 찾아 제외합니다.</w:t>
       </w:r>
     </w:p>
     <w:p>
@@ -8340,7 +8340,7 @@
         <w:t xml:space="preserve">04_summary/organellar_filter_summary.tsv</w:t>
       </w:r>
       <w:r>
-        <w:t xml:space="preserve"> (이 모듈은 그림을 만들지 않는다)</w:t>
+        <w:t xml:space="preserve"> (이 모듈은 그림을 만들지 않습니다)</w:t>
       </w:r>
     </w:p>
     <w:p>
@@ -8363,7 +8363,7 @@
         <w:t xml:space="preserve">샘플별 소기관 contig 제거 요약.</w:t>
       </w:r>
       <w:r>
-        <w:t xml:space="preserve"> 샘플마다 입력 BAM의 전체 contig 수, 제거한 소기관 contig(미토콘드리아·엽록체) 수, 남긴 contig 수, 필터링된 BAM 경로와 처리 상태를 보여 준다. status가 모든 샘플에서 정상이면 다음 단계(ATAC_QC)에 쓸 BAM이 준비된 것이다.</w:t>
+        <w:t xml:space="preserve"> 샘플마다 입력 BAM의 전체 contig 수, 제거한 소기관 contig(미토콘드리아·엽록체) 수, 남긴 contig 수, 필터링된 BAM 경로와 처리 상태를 보여 줍니다. status가 모든 샘플에서 정상이면 다음 단계(ATAC_QC)에 쓸 BAM이 준비된 것입니다.</w:t>
       </w:r>
     </w:p>
     <w:p>
@@ -11947,7 +11947,7 @@
         <w:t xml:space="preserve">그림. ATAC-seq 품질 평가와 Tn5 보정.</w:t>
       </w:r>
       <w:r>
-        <w:t xml:space="preserve"> (A) Tn5 절단 위치에 따라 뉴클레오솜 사이 열린 DNA에서는 짧은 NFR fragment가, 뉴클레오솜 하나 또는 둘을 사이에 두면 mononucleosome·dinucleosome fragment가 생긴다. (B) 좋은 라이브러리의 fragment 길이 분포는 NFR 봉우리와 약 200 bp 간격의 뉴클레오솜 주기를 보이며, 약 10.5 bp의 DNA 나선 주기도 나타난다(작은 그림: 로그 척도). (C) Tn5는 두 가닥에 9 bp 간격으로 삽입되므로 + 가닥 read는 +4 bp, − 가닥 read는 −5 bp 옮겨 실제 삽입 중심을 표시한다. (B)는 Ou J. et al., BMC Genomics 19, 169 (2018), Fig. 1을 수정(CC BY 4.0).</w:t>
+        <w:t xml:space="preserve"> (A) Tn5 절단 위치에 따라 뉴클레오솜 사이 열린 DNA에서는 짧은 NFR fragment가, 뉴클레오솜 하나 또는 둘을 사이에 두면 mononucleosome·dinucleosome fragment가 생깁니다. (B) 좋은 라이브러리의 fragment 길이 분포는 NFR 봉우리와 약 200 bp 간격의 뉴클레오솜 주기를 보이며, 약 10.5 bp의 DNA 나선 주기도 나타납니다(작은 그림: 로그 척도). (C) Tn5는 두 가닥에 9 bp 간격으로 삽입되므로 + 가닥 read는 +4 bp, − 가닥 read는 −5 bp 옮겨 실제 삽입 중심을 표시합니다. (B)는 Ou J. et al., BMC Genomics 19, 169 (2018), Fig. 1을 수정(CC BY 4.0).</w:t>
       </w:r>
     </w:p>
     <w:p>
@@ -12158,7 +12158,7 @@
         <w:spacing w:after="140"/>
       </w:pPr>
       <w:r>
-        <w:t xml:space="preserve">결과 그림 3개를 아래 순서대로 등록한다. 결과 1이 대표 그림이다.</w:t>
+        <w:t xml:space="preserve">결과 그림 3개를 아래 순서대로 등록합니다. 결과 1이 대표 그림입니다.</w:t>
       </w:r>
     </w:p>
     <w:p>
@@ -12212,7 +12212,7 @@
         <w:t xml:space="preserve">Fragment 크기 분포.</w:t>
       </w:r>
       <w:r>
-        <w:t xml:space="preserve"> paired-end fragment의 길이(가로축, bp)별 read 수(세로축)다. 100 bp 이하의 nucleosome-free 봉우리와 약 200 bp(mononucleosome), 약 400 bp(dinucleosome) 간격의 주기적인 봉우리가 보이면 Tn5 절단이 정상적으로 일어난 것이다. 작은 그림은 같은 분포를 로그 축으로 보여 주며, 짧은 구간의 약 10.5 bp 물결(DNA 나선 주기)도 여기서 보인다. 봉우리 없이 매끄럽게 줄어들면 Tn5 반응이 과하거나 세포 상태가 나쁜 경우다.</w:t>
+        <w:t xml:space="preserve"> paired-end fragment의 길이(가로축, bp)별 read 수(세로축)다. 100 bp 이하의 nucleosome-free 봉우리와 약 200 bp(mononucleosome), 약 400 bp(dinucleosome) 간격의 주기적인 봉우리가 보이면 Tn5 절단이 정상적으로 일어난 것입니다. 작은 그림은 같은 분포를 로그 축으로 보여 주며, 짧은 구간의 약 10.5 bp 물결(DNA 나선 주기)도 여기서 보입니다. 봉우리 없이 매끄럽게 줄어들면 Tn5 반응이 과하거나 세포 상태가 나쁜 경우입니다.</w:t>
       </w:r>
     </w:p>
     <w:p>
@@ -12289,7 +12289,7 @@
         <w:t xml:space="preserve">TSS enrichment.</w:t>
       </w:r>
       <w:r>
-        <w:t xml:space="preserve"> 가로축은 TSS로부터의 거리(기본 ±1,000 bp), 세로축은 양 끝 구간 대비 신호 비율(aggregate TSS score)이다. TSS(0 bp, 점선)에서 신호가 뚜렷하게 솟을수록 열린 염색질이 잘 포착된 것이며, 제목에 TSS enrichment score가 표시된다. ENCODE는 사람(GRCh38, RefSeq TSS) 기준 7 이상을 이상적, 5~7을 허용으로 둔다. 값은 유전체와 TSS 주석에 따라 달라지므로 같은 실험의 샘플끼리 비교하는 데 주로 쓴다.</w:t>
+        <w:t xml:space="preserve"> 가로축은 TSS로부터의 거리(기본 ±1,000 bp), 세로축은 양 끝 구간 대비 신호 비율(aggregate TSS score)입니다. TSS(0 bp, 점선)에서 신호가 뚜렷하게 솟을수록 열린 염색질이 잘 포착된 것이며, 제목에 TSS enrichment score가 표시됩니다. ENCODE는 사람(GRCh38, RefSeq TSS) 기준 7 이상을 이상적, 5~7을 허용으로 둡니다. 값은 유전체와 TSS 주석에 따라 달라지므로 같은 실험의 샘플끼리 비교하는 데 주로 씁니다.</w:t>
       </w:r>
     </w:p>
     <w:p>
@@ -12363,13 +12363,13 @@
         <w:t xml:space="preserve">샘플별 QC 지표.</w:t>
       </w:r>
       <w:r>
-        <w:t xml:space="preserve"> 샘플마다 입력 read 수(InputMappedReads), 정제 후 read 수(CleanMappedReads)와 그 비율(CleanFraction), Tn5 보정 후 read 수(ShiftedReads), TSS enrichment score(TSSEnrichment), fragment 분리 상태(SplitStatus)를 한 줄로 보여 준다. CleanFraction이 다른 샘플보다 크게 낮으면 중복·저품질 read가 많은 샘플이다. SplitStatus가 </w:t>
+        <w:t xml:space="preserve"> 샘플마다 입력 read 수(InputMappedReads), 정제 후 read 수(CleanMappedReads)와 그 비율(CleanFraction), Tn5 보정 후 read 수(ShiftedReads), TSS enrichment score(TSSEnrichment), fragment 분리 상태(SplitStatus)를 한 줄로 보여 줍니다. CleanFraction이 다른 샘플보다 크게 낮으면 중복·저품질 read가 많은 샘플입니다. SplitStatus가 </w:t>
       </w:r>
       <w:r>
         <w:t xml:space="preserve">empty_split:&lt;분류&gt;</w:t>
       </w:r>
       <w:r>
-        <w:t xml:space="preserve">이면 그 길이 분류에 fragment가 없다는 뜻이다(예: 긴 fragment가 적은 데이터의 trinucleosome).</w:t>
+        <w:t xml:space="preserve">이면 그 길이 분류에 fragment가 없다는 뜻입니다(예: 긴 fragment가 적은 데이터의 trinucleosome).</w:t>
       </w:r>
     </w:p>
     <w:p>
@@ -15565,7 +15565,7 @@
         <w:t xml:space="preserve">그림. TSS 주변 신호.</w:t>
       </w:r>
       <w:r>
-        <w:t xml:space="preserve"> (A) 모든 TSS를 기준으로 정렬한 NucleosomeFree(왼쪽)와 nucleosome(오른쪽) 신호 heatmap. 오른쪽은 결과 그림에 mononucleosome으로 표시되지만 mono, di, trinucleosome fragment를 합친 신호다. 각 행은 하나의 TSS다. (B) 평균 신호. 좋은 데이터에서는 NFR 신호가 TSS에 모이고, 뉴클레오솜 신호는 그 양옆(−1, +1 뉴클레오솜)에 나타난다. Ou J. et al., BMC Genomics 19, 169 (2018), Fig. 1을 수정(CC BY 4.0).</w:t>
+        <w:t xml:space="preserve"> (A) 모든 TSS를 기준으로 정렬한 NucleosomeFree(왼쪽)와 nucleosome(오른쪽) 신호 heatmap. 오른쪽은 결과 그림에 mononucleosome으로 표시되지만 mono, di, trinucleosome fragment를 합친 신호입니다. 각 행은 하나의 TSS다. (B) 평균 신호. 좋은 데이터에서는 NFR 신호가 TSS에 모이고, 뉴클레오솜 신호는 그 양옆(−1, +1 뉴클레오솜)에 나타납니다. Ou J. et al., BMC Genomics 19, 169 (2018), Fig. 1을 수정(CC BY 4.0).</w:t>
       </w:r>
     </w:p>
     <w:p>
@@ -15776,7 +15776,7 @@
         <w:spacing w:after="140"/>
       </w:pPr>
       <w:r>
-        <w:t xml:space="preserve">결과 그림 2개를 아래 순서대로 등록한다. 결과 1이 대표 그림이다.</w:t>
+        <w:t xml:space="preserve">결과 그림 2개를 아래 순서대로 등록합니다. 결과 1이 대표 그림입니다.</w:t>
       </w:r>
     </w:p>
     <w:p>
@@ -15830,7 +15830,7 @@
         <w:t xml:space="preserve">TSS 주변의 nucleosome-free 신호와 nucleosome 신호.</w:t>
       </w:r>
       <w:r>
-        <w:t xml:space="preserve"> 각 행은 TSS 하나이고, 가로축은 TSS 중심 ±1,010 bp 구간이다. 왼쪽 패널(NucleosomeFree)은 nucleosome-free fragment, 오른쪽 패널(그림에는 mononucleosome으로 표시)은 mono, di, trinucleosome fragment를 합친 nucleosome 신호이며, 신호(log2)를 노랑(낮음)에서 빨강(높음)으로 나타낸다. 정상적인 ATAC-seq에서는 nucleosome-free 신호가 TSS 바로 위에 모이고, nucleosome 신호는 TSS 양옆(nucleosome 자리)에 나타난다.</w:t>
+        <w:t xml:space="preserve"> 각 행은 TSS 하나이고, 가로축은 TSS 중심 ±1,010 bp 구간입니다. 왼쪽 패널(NucleosomeFree)은 nucleosome-free fragment, 오른쪽 패널(그림에는 mononucleosome으로 표시)은 mono, di, trinucleosome fragment를 합친 nucleosome 신호이며, 신호(log2)를 노랑(낮음)에서 빨강(높음)으로 나타냅니다. 정상적인 ATAC-seq에서는 nucleosome-free 신호가 TSS 바로 위에 모이고, nucleosome 신호는 TSS 양옆(nucleosome 자리)에 나타납니다.</w:t>
       </w:r>
     </w:p>
     <w:p>
@@ -15907,7 +15907,7 @@
         <w:t xml:space="preserve">TSS 주변 평균 신호.</w:t>
       </w:r>
       <w:r>
-        <w:t xml:space="preserve"> 결과 1의 heatmap을 모든 TSS에 대해 평균한 선 그래프다. 가로축은 TSS 기준 위치(−1 kb~+1 kb), 세로축은 각 신호를 0~1로 맞춘 값(Fraction of signal)이다. 검은 선은 NucleosomeFree, 빨간 선은 nucleosome 신호(그림에는 mononucleosome으로 표시, mono, di, trinucleosome fragment를 합친 신호)다. 정상적인 ATAC-seq에서는 검은 선이 TSS(가운데)에서 가장 높고, 빨간 선은 TSS에서 낮아졌다가 양옆(−1, +1 nucleosome 자리)에서 높아진다.</w:t>
+        <w:t xml:space="preserve"> 결과 1의 heatmap을 모든 TSS에 대해 평균한 선 그래프입니다. 가로축은 TSS 기준 위치(−1 kb~+1 kb), 세로축은 각 신호를 0~1로 맞춘 값(Fraction of signal)입니다. 검은 선은 NucleosomeFree, 빨간 선은 nucleosome 신호(그림에는 mononucleosome으로 표시, mono, di, trinucleosome fragment를 합친 신호)다. 정상적인 ATAC-seq에서는 검은 선이 TSS(가운데)에서 가장 높고, 빨간 선은 TSS에서 낮아졌다가 양옆(−1, +1 nucleosome 자리)에서 높아집니다.</w:t>
       </w:r>
     </w:p>
     <w:p>
@@ -18915,7 +18915,7 @@
         <w:t xml:space="preserve">그림. Peak 검출.</w:t>
       </w:r>
       <w:r>
-        <w:t xml:space="preserve"> (A) Tn5 보정 BAM의 paired-end fragment를 유전체에 쌓으면, 열린 영역에서 주변 배경(local λ)보다 높은 더미가 생긴다. (B) 각 위치에서 관찰된 fragment 수를 λ로부터 기대되는 값과 Poisson 분포로 비교해 p-value와 q-value를 구하고, 기준을 넘는 구간을 peak(summit 포함)로 기록한다. (C) 전체 read 중 peak 안에 들어간 비율(FRiP)로 신호 대 잡음을 평가하며, 샘플별 peak 수와 함께 frip_summary.tsv 표로 남긴다.</w:t>
+        <w:t xml:space="preserve"> (A) Tn5 보정 BAM의 paired-end fragment를 유전체에 쌓으면, 열린 영역에서 주변 배경(local λ)보다 높은 더미가 생깁니다. (B) 각 위치에서 관찰된 fragment 수를 λ로부터 기대되는 값과 Poisson 분포로 비교해 p-value와 q-value를 구하고, 기준을 넘는 구간을 peak(summit 포함)로 기록합니다. (C) 전체 read 중 peak 안에 들어간 비율(FRiP)로 신호 대 잡음을 평가하며, 샘플별 peak 수와 함께 frip_summary.tsv 표로 남깁니다.</w:t>
       </w:r>
     </w:p>
     <w:p>
@@ -19125,7 +19125,7 @@
         <w:t xml:space="preserve">frip_summary.tsv</w:t>
       </w:r>
       <w:r>
-        <w:t xml:space="preserve"> (이 모듈은 그림을 만들지 않는다)</w:t>
+        <w:t xml:space="preserve"> (이 모듈은 그림을 만들지 않습니다)</w:t>
       </w:r>
     </w:p>
     <w:p>
@@ -19148,7 +19148,7 @@
         <w:t xml:space="preserve">샘플별 peak 수와 FRiP.</w:t>
       </w:r>
       <w:r>
-        <w:t xml:space="preserve"> 샘플마다 MACS3로 찾은 peak 수(peaks), 전체 read 수(total_reads), peak 안에 들어간 read 수(reads_in_peaks), 그 비율(FRiP)을 보여 준다. FRiP는 신호 대 잡음의 지표로, ENCODE ATAC-seq 기준에서는 0.3 이상이 바람직하고 0.2 이상이면 허용한다.</w:t>
+        <w:t xml:space="preserve"> 샘플마다 MACS3로 찾은 peak 수(peaks), 전체 read 수(total_reads), peak 안에 들어간 read 수(reads_in_peaks), 그 비율(FRiP)을 보여 줍니다. FRiP는 신호 대 잡음의 지표로, ENCODE ATAC-seq 기준에서는 0.3 이상이 바람직하고 0.2 이상이면 허용합니다.</w:t>
       </w:r>
     </w:p>
     <w:p>
@@ -22490,7 +22490,7 @@
         <w:t xml:space="preserve">그림. Peak 주석.</w:t>
       </w:r>
       <w:r>
-        <w:t xml:space="preserve"> (A) 각 peak를 유전자 구조(promoter, exon, intron, downstream, distal intergenic)에 따라 분류하고, 가장 가까운 유전자와 그 TSS까지의 거리(distanceToTSS)를 붙인다. 주석은 해당 종의 GFF3/GTF로 만든 TxDb를 사용한다. (B) 샘플별 기능 영역 peak 비율(막대 하나가 샘플 하나). ATAC-seq peak는 보통 promoter에 많이 모인다.</w:t>
+        <w:t xml:space="preserve"> (A) 각 peak를 유전자 구조(promoter, exon, intron, downstream, distal intergenic)에 따라 분류하고, 가장 가까운 유전자와 그 TSS까지의 거리(distanceToTSS)를 붙입니다. 주석은 해당 종의 GFF3/GTF로 만든 TxDb를 사용합니다. (B) 샘플별 기능 영역 peak 비율(막대 하나가 샘플 하나). ATAC-seq peak는 보통 promoter에 많이 모입니다.</w:t>
       </w:r>
     </w:p>
     <w:p>
@@ -22691,7 +22691,7 @@
         <w:spacing w:after="140"/>
       </w:pPr>
       <w:r>
-        <w:t xml:space="preserve">결과 그림 4개를 아래 순서대로 등록한다. 결과 1이 대표 그림이다.</w:t>
+        <w:t xml:space="preserve">결과 그림 4개를 아래 순서대로 등록합니다. 결과 1이 대표 그림입니다.</w:t>
       </w:r>
     </w:p>
     <w:p>
@@ -22742,7 +22742,7 @@
         <w:t xml:space="preserve">샘플별 peak의 유전체 영역 분포.</w:t>
       </w:r>
       <w:r>
-        <w:t xml:space="preserve"> 막대 하나가 샘플 하나이며, peak가 promoter, UTR, exon, intron, distal intergenic 등 각 유전체 영역에 놓인 비율(%)을 색으로 나누어 보여 준다. ATAC-seq peak는 보통 promoter와 intron, distal intergenic에 많이 놓이며, 샘플 간 분포가 비슷한지로 데이터의 일관성을 확인할 수 있다.</w:t>
+        <w:t xml:space="preserve"> 막대 하나가 샘플 하나이며, peak가 promoter, UTR, exon, intron, distal intergenic 등 각 유전체 영역에 놓인 비율(%)을 색으로 나누어 보여 줍니다. ATAC-seq peak는 보통 promoter와 intron, distal intergenic에 많이 놓이며, 샘플 간 분포가 비슷한지로 데이터의 일관성을 확인할 수 있습니다.</w:t>
       </w:r>
     </w:p>
     <w:p>
@@ -22819,7 +22819,7 @@
         <w:t xml:space="preserve">peak가 동시에 걸치는 유전체 영역(UpSet plot).</w:t>
       </w:r>
       <w:r>
-        <w:t xml:space="preserve"> peak 하나가 여러 영역(예: promoter이면서 exon)에 함께 걸칠 수 있으므로, 영역 조합별 peak 수를 보여 준다. 아래 점과 선은 영역 조합, 위 막대는 그 조합에 속한 peak 수다. 결과 1의 막대는 우선순위에 따라 영역 하나만 고른 것이고, 이 그림은 겹침까지 보여 준다.</w:t>
+        <w:t xml:space="preserve"> peak 하나가 여러 영역(예: promoter이면서 exon)에 함께 걸칠 수 있으므로, 영역 조합별 peak 수를 보여 줍니다. 아래 점과 선은 영역 조합, 위 막대는 그 조합에 속한 peak 수입니다. 결과 1의 막대는 우선순위에 따라 영역 하나만 고른 것이고, 이 그림은 겹침까지 보여 줍니다.</w:t>
       </w:r>
     </w:p>
     <w:p>
@@ -22896,7 +22896,7 @@
         <w:t xml:space="preserve">peak에서 가장 가까운 TSS까지의 거리 분포.</w:t>
       </w:r>
       <w:r>
-        <w:t xml:space="preserve"> 가로 막대는 peak의 비율(%)이며, 거리 구간(0~1 kb, 1~3 kb, 3~5 kb, 5~10 kb, 10~100 kb, 100 kb 이상)별로 색을 나누었다. 왼쪽(음수)은 유전자 상류, 오른쪽(양수)은 하류에 놓인 peak다. ATAC-seq peak는 TSS 가까이(0~3 kb)에 많이 모이며, 원거리 peak는 enhancer 같은 조절 부위의 후보다.</w:t>
+        <w:t xml:space="preserve"> 가로 막대는 peak의 비율(%)이며, 거리 구간(0~1 kb, 1~3 kb, 3~5 kb, 5~10 kb, 10~100 kb, 100 kb 이상)별로 색을 나누었습니다. 왼쪽(음수)은 유전자 상류, 오른쪽(양수)은 하류에 놓인 peak다. ATAC-seq peak는 TSS 가까이(0~3 kb)에 많이 모이며, 원거리 peak는 enhancer 같은 조절 부위의 후보입니다.</w:t>
       </w:r>
     </w:p>
     <w:p>
@@ -22973,7 +22973,7 @@
         <w:t xml:space="preserve">TSS 주변 peak 분포.</w:t>
       </w:r>
       <w:r>
-        <w:t xml:space="preserve"> 가로축은 TSS 기준 위치(기본 −3,000~+3,000 bp, 옵션 tss_upstream·tss_downstream), 세로축은 그 위치를 덮는 peak의 빈도(Peak Count Frequency)다. ATAC-seq에서는 TSS(0 bp) 바로 위에서 가장 높은 봉우리가 나타나며, 이는 promoter가 열려 있다는 뜻이다.</w:t>
+        <w:t xml:space="preserve"> 가로축은 TSS 기준 위치(기본 −3,000~+3,000 bp, 옵션 tss_upstream·tss_downstream), 세로축은 그 위치를 덮는 peak의 빈도(Peak Count Frequency)다. ATAC-seq에서는 TSS(0 bp) 바로 위에서 가장 높은 봉우리가 나타나며, 이는 promoter가 열려 있다는 뜻입니다.</w:t>
       </w:r>
     </w:p>
     <w:p>
@@ -27133,7 +27133,7 @@
         <w:t xml:space="preserve">그림. 차등 접근성 분석.</w:t>
       </w:r>
       <w:r>
-        <w:t xml:space="preserve"> (A) 샘플별 peak를 합쳐 공통 peak 집합을 만든다. (B) 공통 peak마다 조건별 read 수를 세어, 접근성이 증가·유지·감소한 peak를 구분한다. (C) TMM 정규화와 edgeR quasi-likelihood 검정 결과를 MD plot(가로축 평균 log CPM, 세로축 log-fold-change)으로 보면, 유의하게 증가(up, 빨강)·감소(down, 파랑)한 peak가 드러난다.</w:t>
+        <w:t xml:space="preserve"> (A) 샘플별 peak를 합쳐 공통 peak 집합을 만듭니다. (B) 공통 peak마다 조건별 read 수를 세어, 접근성이 증가·유지·감소한 peak를 구분합니다. (C) TMM 정규화와 edgeR quasi-likelihood 검정 결과를 MD plot(가로축 평균 log CPM, 세로축 log-fold-change)으로 보면, 유의하게 증가(up, 빨강)·감소(down, 파랑)한 peak가 드러납니다.</w:t>
       </w:r>
     </w:p>
     <w:p>
@@ -27367,7 +27367,7 @@
         <w:t xml:space="preserve">gc_bin_chr</w:t>
       </w:r>
       <w:r>
-        <w:t xml:space="preserve">)은 필요할 때만 넣는다.</w:t>
+        <w:t xml:space="preserve">)은 필요할 때만 넣습니다.</w:t>
       </w:r>
     </w:p>
     <w:p>
@@ -27390,7 +27390,7 @@
         <w:spacing w:after="140"/>
       </w:pPr>
       <w:r>
-        <w:t xml:space="preserve">결과 그림 4개를 아래 순서대로 등록한다. 결과 1이 대표 그림이다.</w:t>
+        <w:t xml:space="preserve">결과 그림 4개를 아래 순서대로 등록합니다. 결과 1이 대표 그림입니다.</w:t>
       </w:r>
     </w:p>
     <w:p>
@@ -27441,7 +27441,7 @@
         <w:t xml:space="preserve">샘플 PCA.</w:t>
       </w:r>
       <w:r>
-        <w:t xml:space="preserve"> 변동이 큰 peak(최대 5,000개)의 log2 CPM으로 샘플을 2차원에 놓은 그림이다. 점 하나가 샘플 하나이고 색은 조건이며, 축 이름에 각 주성분이 설명하는 변동(%)이 붙는다. 같은 조건의 반복 샘플이 모이고 조건끼리 떨어져 있으면 조건 간 차이가 반복 간 차이보다 크다는 뜻이다. 샘플이 3개 이상일 때 만든다.</w:t>
+        <w:t xml:space="preserve"> 변동이 큰 peak(최대 5,000개)의 log2 CPM으로 샘플을 2차원에 놓은 그림입니다. 점 하나가 샘플 하나이고 색은 조건이며, 축 이름에 각 주성분이 설명하는 변동(%)이 붙습니다. 같은 조건의 반복 샘플이 모이고 조건끼리 떨어져 있으면 조건 간 차이가 반복 간 차이보다 크다는 뜻입니다. 샘플이 3개 이상일 때 만듭니다.</w:t>
       </w:r>
     </w:p>
     <w:p>
@@ -27515,7 +27515,7 @@
         <w:t xml:space="preserve">샘플 간 상관 heatmap.</w:t>
       </w:r>
       <w:r>
-        <w:t xml:space="preserve"> 모든 샘플 쌍의 Pearson 상관계수(log2 CPM 기준)를 칸마다 숫자와 색(연한 파랑 낮음, 진한 남색 높음)으로 보여 준다. 비슷한 샘플끼리 가깝게 놓이도록 계층 군집 순서로 정렬했다. 같은 조건의 반복끼리 상관이 가장 높아야 하며, 한 샘플만 다른 샘플과 상관이 낮으면 이상 샘플을 의심한다.</w:t>
+        <w:t xml:space="preserve"> 모든 샘플 쌍의 Pearson 상관계수(log2 CPM 기준)를 칸마다 숫자와 색(연한 파랑 낮음, 진한 남색 높음)으로 보여 줍니다. 비슷한 샘플끼리 가깝게 놓이도록 계층 군집 순서로 정렬했습니다. 같은 조건의 반복끼리 상관이 가장 높아야 하며, 한 샘플만 다른 샘플과 상관이 낮으면 이상 샘플을 의심합니다.</w:t>
       </w:r>
     </w:p>
     <w:p>
@@ -27589,7 +27589,7 @@
         <w:t xml:space="preserve">조건 간 접근성 변화(MD plot).</w:t>
       </w:r>
       <w:r>
-        <w:t xml:space="preserve"> 점 하나가 peak 하나다. 가로축은 평균 접근성(average log CPM), 세로축은 조건 간 변화(log2 fold change)이며 빨간 점선이 0이다. 유의하게 열린 peak(Up)와 닫힌 peak(Down)가 색으로 구분된다. 대부분의 peak가 0 근처에 모이고 유의한 peak가 위아래로 갈라지면 정규화가 잘 된 것이다. 반복 샘플이 없으면 유의성 없이 fold change만 그린다.</w:t>
+        <w:t xml:space="preserve"> 점 하나가 peak 하나입니다. 가로축은 평균 접근성(average log CPM), 세로축은 조건 간 변화(log2 fold change)이며 빨간 점선이 0입니다. 유의하게 열린 peak(Up)와 닫힌 peak(Down)가 색으로 구분됩니다. 대부분의 peak가 0 근처에 모이고 유의한 peak가 위아래로 갈라지면 정규화가 잘 된 것입니다. 반복 샘플이 없으면 유의성 없이 fold change만 그립니다.</w:t>
       </w:r>
     </w:p>
     <w:p>
@@ -27678,7 +27678,7 @@
         <w:t xml:space="preserve">GC 함량 구간별 log2 fold change.</w:t>
       </w:r>
       <w:r>
-        <w:t xml:space="preserve"> peak를 GC 함량에 따라 20개 구간으로 나누고(가로축), 구간마다 logFC 분포를 바이올린과 상자 그림으로 보여 준다. 점선은 logFC 0이다. 구간별 분포가 모두 0 근처에 있으면 GC 편향이 없는 것이고, GC가 높거나 낮은 쪽으로 갈수록 분포가 한쪽으로 기울면 GC 편향이 있다는 뜻이다. 이때 EDASeq이나 CQN으로 보정한 결과를 쓴다.</w:t>
+        <w:t xml:space="preserve"> peak를 GC 함량에 따라 20개 구간으로 나누고(가로축), 구간마다 logFC 분포를 바이올린과 상자 그림으로 보여 줍니다. 점선은 logFC 0입니다. 구간별 분포가 모두 0 근처에 있으면 GC 편향이 없는 것이고, GC가 높거나 낮은 쪽으로 갈수록 분포가 한쪽으로 기울면 GC 편향이 있다는 뜻입니다. 이때 EDASeq이나 CQN으로 보정한 결과를 씁니다.</w:t>
       </w:r>
     </w:p>
     <w:p>
@@ -30615,7 +30615,7 @@
                 <w:sz w:val="18"/>
                 <w:szCs w:val="18"/>
               </w:rPr>
-              <w:t xml:space="preserve">이 FDR 이하 peak만 사용. 비우면 필터 없음(권장). monaLisa는 전체 peak를 logFC 순으로 구간에 나눠 비교하므로 보통 비워 둔다. 값을 넣어 남은 peak가 n_per_bin의 약 2배보다 적으면 구간을 만들 수 없어 이유를 알리고 멈춤</w:t>
+              <w:t xml:space="preserve">이 FDR 이하 peak만 사용. 비우면 필터 없음(권장). monaLisa는 전체 peak를 logFC 순으로 구간에 나눠 비교하므로 보통 비워 둡니다. 값을 넣어 남은 peak가 n_per_bin의 약 2배보다 적으면 구간을 만들 수 없어 이유를 알리고 멈춤</w:t>
             </w:r>
           </w:p>
         </w:tc>
@@ -31956,7 +31956,7 @@
           <w:sz w:val="18"/>
           <w:szCs w:val="18"/>
         </w:rPr>
-        <w:t xml:space="preserve">)는 포탈에 등록하지 않는다. 실행 환경의 Processor Core 선택(싱글 코어 또는 최대 4코어)으로 정해지며, 스크립트 기본값 </w:t>
+        <w:t xml:space="preserve">)는 포탈에 등록하지 않습니다. 실행 환경의 Processor Core 선택(싱글 코어 또는 최대 4코어)으로 정해지며, 스크립트 기본값 </w:t>
       </w:r>
       <w:r>
         <w:rPr>
@@ -31972,7 +31972,7 @@
           <w:sz w:val="18"/>
           <w:szCs w:val="18"/>
         </w:rPr>
-        <w:t xml:space="preserve">가 그 코어 수를 쓴다.</w:t>
+        <w:t xml:space="preserve">가 그 코어 수를 씁니다.</w:t>
       </w:r>
     </w:p>
     <w:p>
@@ -32296,7 +32296,7 @@
         <w:t xml:space="preserve">그림. 모티프 농축 분석.</w:t>
       </w:r>
       <w:r>
-        <w:t xml:space="preserve"> (A) peak를 접근성 변화량(logFC) 순서로 정렬해 여러 구간(bin)으로 나눈다. (B) 구간마다 전사인자 모티프의 출현을 센다. (C) 모티프×구간 heatmap. 왼쪽부터 모티프 이름과 서열 로고, 농축도(log2 enrichment; 빨강은 농축, 파랑은 결핍), 보정 p-value(−log10; 진할수록 유의)다. 접근성이 증가하거나 감소한 구간에만 농축된 모티프가 변화와 함께 움직이는 전사인자 후보다.</w:t>
+        <w:t xml:space="preserve"> (A) peak를 접근성 변화량(logFC) 순서로 정렬해 여러 구간(bin)으로 나눕니다. (B) 구간마다 전사인자 모티프의 출현을 셉니다. (C) 모티프×구간 heatmap. 왼쪽부터 모티프 이름과 서열 로고, 농축도(log2 enrichment; 빨강은 농축, 파랑은 결핍), 보정 p-value(−log10; 진할수록 유의)다. 접근성이 증가하거나 감소한 구간에만 농축된 모티프가 변화와 함께 움직이는 전사인자 후보입니다.</w:t>
       </w:r>
     </w:p>
     <w:p>
@@ -32578,7 +32578,7 @@
         <w:t xml:space="preserve">fdr_filter</w:t>
       </w:r>
       <w:r>
-        <w:t xml:space="preserve">)은 필요할 때만 넣는다.</w:t>
+        <w:t xml:space="preserve">)은 필요할 때만 넣습니다.</w:t>
       </w:r>
     </w:p>
     <w:p>
@@ -32601,7 +32601,7 @@
         <w:spacing w:after="140"/>
       </w:pPr>
       <w:r>
-        <w:t xml:space="preserve">결과 그림 4개를 아래 순서대로 등록한다. 결과 1이 대표 그림이다.</w:t>
+        <w:t xml:space="preserve">결과 그림 4개를 아래 순서대로 등록합니다. 결과 1이 대표 그림입니다.</w:t>
       </w:r>
     </w:p>
     <w:p>
@@ -32652,7 +32652,7 @@
         <w:t xml:space="preserve">접근성 변화 구간별 모티프 농축.</w:t>
       </w:r>
       <w:r>
-        <w:t xml:space="preserve"> peak를 접근성 변화(log2 fold change) 크기에 따라 여러 구간(bin)으로 나누고, 구간마다 각 전사인자 모티프가 배경보다 얼마나 많은지를 색으로 보여 준다. 행은 유의하게 농축된 모티프이며, 서로 비슷한 모티프끼리 묶어 정렬했고 왼쪽에 서열 로고와 GC 비율을 붙였다. 첫 heatmap은 농축도(log2 enrichment; 빨강 농축, 파랑 결핍), 둘째는 보정 p-value(−log10; 진할수록 유의)다. 열린 쪽 구간에서만 진하게 나타나는 모티프는 조건 변화로 활성이 커진 전사인자의 후보다.</w:t>
+        <w:t xml:space="preserve"> peak를 접근성 변화(log2 fold change) 크기에 따라 여러 구간(bin)으로 나누고, 구간마다 각 전사인자 모티프가 배경보다 얼마나 많은지를 색으로 보여 줍니다. 행은 유의하게 농축된 모티프이며, 서로 비슷한 모티프끼리 묶어 정렬했고 왼쪽에 서열 로고와 GC 비율을 붙였습니다. 첫 heatmap은 농축도(log2 enrichment; 빨강 농축, 파랑 결핍), 둘째는 보정 p-value(−log10; 진할수록 유의)다. 열린 쪽 구간에서만 진하게 나타나는 모티프는 조건 변화로 활성이 커진 전사인자의 후보입니다.</w:t>
       </w:r>
     </w:p>
     <w:p>
@@ -32726,7 +32726,7 @@
         <w:t xml:space="preserve">logFC 분포와 구간(bin).</w:t>
       </w:r>
       <w:r>
-        <w:t xml:space="preserve"> 모든 peak의 log2 fold change 분포(가로축 logFC, 세로축 밀도) 위에 구간 경계를 색으로 나누어 보여 준다. 구간마다 peak 수가 같도록 나누며, 변화가 작은 peak(|logFC| &lt; min_abs_logfc)는 가운데 하나의 구간으로 묶는다. 결과 1의 heatmap 열이 이 구간이다.</w:t>
+        <w:t xml:space="preserve"> 모든 peak의 log2 fold change 분포(가로축 logFC, 세로축 밀도) 위에 구간 경계를 색으로 나누어 보여 줍니다. 구간마다 peak 수가 같도록 나누며, 변화가 작은 peak(|logFC| &lt; min_abs_logfc)는 가운데 하나의 구간으로 묶습니다. 결과 1의 heatmap 열이 이 구간입니다.</w:t>
       </w:r>
     </w:p>
     <w:p>
@@ -32803,7 +32803,7 @@
         <w:t xml:space="preserve">안정성 선택 회귀로 고른 전사인자.</w:t>
       </w:r>
       <w:r>
-        <w:t xml:space="preserve"> 모든 모티프를 함께 넣어 peak의 logFC를 설명하는 회귀(randomized lasso stability selection)에서, 각 모티프가 선택된 확률을 막대로 보여 준다. 막대 방향은 그 모티프가 접근성 증가(위)와 감소(아래) 중 어느 쪽과 관련되는지이며, 점선은 선택 기준(stabsel_cutoff, 기본 0.8)이다. 기준을 넘은 모티프는 비슷한 모티프끼리 겹치는 효과를 걸러낸 뒤에도 남은 핵심 전사인자 후보다.</w:t>
+        <w:t xml:space="preserve"> 모든 모티프를 함께 넣어 peak의 logFC를 설명하는 회귀(randomized lasso stability selection)에서, 각 모티프가 선택된 확률을 막대로 보여 줍니다. 막대 방향은 그 모티프가 접근성 증가(위)와 감소(아래) 중 어느 쪽과 관련되는지이며, 점선은 선택 기준(stabsel_cutoff, 기본 0.8)입니다. 기준을 넘은 모티프는 비슷한 모티프끼리 겹치는 효과를 걸러낸 뒤에도 남은 핵심 전사인자 후보입니다.</w:t>
       </w:r>
     </w:p>
     <w:p>
@@ -32880,7 +32880,7 @@
         <w:t xml:space="preserve">농축된 k-mer와 선택된 모티프의 유사도.</w:t>
       </w:r>
       <w:r>
-        <w:t xml:space="preserve"> 모티프 데이터베이스와 상관없이 접근성 변화 구간에서 농축된 짧은 서열(k-mer, 기본 6 bp)을 찾고, 결과 1의 유의한 모티프와 얼마나 닮았는지를 색(연회색 0, 주황 0.5, 진한 빨강 1)으로 보여 준다. 행은 모티프(왼쪽에 서열 로고), 열은 k-mer다. 데이터베이스 모티프와 닮은 k-mer가 많으면 모티프 결과가 서열 자체에서도 지지된다는 뜻이고, 어느 모티프와도 닮지 않은 k-mer는 데이터베이스에 없는 새 서열 후보다.</w:t>
+        <w:t xml:space="preserve"> 모티프 데이터베이스와 상관없이 접근성 변화 구간에서 농축된 짧은 서열(k-mer, 기본 6 bp)을 찾고, 결과 1의 유의한 모티프와 얼마나 닮았는지를 색(연회색 0, 주황 0.5, 진한 빨강 1)으로 보여 줍니다. 행은 모티프(왼쪽에 서열 로고), 열은 k-mer다. 데이터베이스 모티프와 닮은 k-mer가 많으면 모티프 결과가 서열 자체에서도 지지된다는 뜻이고, 어느 모티프와도 닮지 않은 k-mer는 데이터베이스에 없는 새 서열 후보입니다.</w:t>
       </w:r>
     </w:p>
     <w:p>
@@ -35612,7 +35612,7 @@
           <w:sz w:val="18"/>
           <w:szCs w:val="18"/>
         </w:rPr>
-        <w:t xml:space="preserve">)는 포탈에 등록하지 않는다. 실행 환경의 Processor Core 선택(싱글 코어 또는 최대 4코어)으로 정해지며, 스크립트 기본값 </w:t>
+        <w:t xml:space="preserve">)는 포탈에 등록하지 않습니다. 실행 환경의 Processor Core 선택(싱글 코어 또는 최대 4코어)으로 정해지며, 스크립트 기본값 </w:t>
       </w:r>
       <w:r>
         <w:rPr>
@@ -35628,7 +35628,7 @@
           <w:sz w:val="18"/>
           <w:szCs w:val="18"/>
         </w:rPr>
-        <w:t xml:space="preserve">가 그 코어 수를 쓴다.</w:t>
+        <w:t xml:space="preserve">가 그 코어 수를 씁니다.</w:t>
       </w:r>
     </w:p>
     <w:p>
@@ -36074,7 +36074,7 @@
         <w:t xml:space="preserve">그림. 전사인자 footprint 분석.</w:t>
       </w:r>
       <w:r>
-        <w:t xml:space="preserve"> (A) 단백질이 결합한 DNA는 Tn5가 자르지 못해, 절단 신호에 움푹 패인 footprint가 생긴다. (B) 관찰된 절단 신호에서 Tn5 서열 선호도로 예측한 기대 신호를 빼서 편향을 보정한다(ATACorrect). (C) 조건 간 footprint 점수를 비교해(BINDetect), 결합이 늘거나 준 전사인자를 volcano plot(가로축 differential binding score, 세로축 −log10 p-value)으로 보여 준다. 조건 이름을 알파벳순으로 놓았을 때 첫 번째 조건에서 결합이 강하면 양수(빨강), 두 번째 조건에서 강하면 음수(파랑)다. Bentsen M. et al., Nat Commun 11, 4267 (2020), Fig. 1을 수정(CC BY 4.0).</w:t>
+        <w:t xml:space="preserve"> (A) 단백질이 결합한 DNA는 Tn5가 자르지 못해, 절단 신호에 움푹 패인 footprint가 생깁니다. (B) 관찰된 절단 신호에서 Tn5 서열 선호도로 예측한 기대 신호를 빼서 편향을 보정합니다(ATACorrect). (C) 조건 간 footprint 점수를 비교해(BINDetect), 결합이 늘거나 준 전사인자를 volcano plot(가로축 differential binding score, 세로축 −log10 p-value)으로 보여 줍니다. 조건 이름을 알파벳순으로 놓았을 때 첫 번째 조건에서 결합이 강하면 양수(빨강), 두 번째 조건에서 강하면 음수(파랑)다. Bentsen M. et al., Nat Commun 11, 4267 (2020), Fig. 1을 수정(CC BY 4.0).</w:t>
       </w:r>
     </w:p>
     <w:p>
@@ -36257,7 +36257,7 @@
         <w:spacing w:after="140"/>
       </w:pPr>
       <w:r>
-        <w:t xml:space="preserve">결과 그림 2개를 아래 순서대로 등록한다. 결과 1이 대표 그림이다.</w:t>
+        <w:t xml:space="preserve">결과 그림 2개를 아래 순서대로 등록합니다. 결과 1이 대표 그림입니다.</w:t>
       </w:r>
     </w:p>
     <w:p>
@@ -36311,7 +36311,7 @@
         <w:t xml:space="preserve">조건 간 전사인자 결합 변화(BINDetect volcano plot).</w:t>
       </w:r>
       <w:r>
-        <w:t xml:space="preserve"> 점 하나가 전사인자(모티프) 하나다. 가로축은 두 조건 사이의 결합 점수 차이(differential binding score)다. 조건 이름을 알파벳순으로 놓았을 때 양수(오른쪽, 빨강)는 첫 번째 조건에서, 음수(왼쪽, 파랑)는 두 번째 조건에서 결합이 더 강하다는 뜻이다. 세로축은 그 차이의 유의성(−log10 p-value)이며, 변화가 크거나 유의한 전사인자는 색과 이름으로 표시된다.</w:t>
+        <w:t xml:space="preserve"> 점 하나가 전사인자(모티프) 하나입니다. 가로축은 두 조건 사이의 결합 점수 차이(differential binding score)다. 조건 이름을 알파벳순으로 놓았을 때 양수(오른쪽, 빨강)는 첫 번째 조건에서, 음수(왼쪽, 파랑)는 두 번째 조건에서 결합이 더 강하다는 뜻입니다. 세로축은 그 차이의 유의성(−log10 p-value)이며, 변화가 크거나 유의한 전사인자는 색과 이름으로 표시됩니다.</w:t>
       </w:r>
     </w:p>
     <w:p>
@@ -36388,7 +36388,7 @@
         <w:t xml:space="preserve">조건별 footprint 점수 분포.</w:t>
       </w:r>
       <w:r>
-        <w:t xml:space="preserve"> 모든 모티프 결합 후보 자리의 footprint 점수(가로축) 분포를 조건마다 다른 색의 선으로 겹쳐 보여 준다. 같은 PDF에 정규화 전(Raw)과 후(Normalized) 분포가 따로 있으며, BINDetect는 조건 간 점수 분포를 맞춘(정규화한) 뒤 결과 1의 차이를 계산한다. 정규화 뒤 두 조건의 분포가 거의 겹치면 결과 1의 차이가 전체 신호 세기 차이가 아니라 전사인자별 결합 변화를 반영한다는 뜻이다.</w:t>
+        <w:t xml:space="preserve"> 모든 모티프 결합 후보 자리의 footprint 점수(가로축) 분포를 조건마다 다른 색의 선으로 겹쳐 보여 줍니다. 같은 PDF에 정규화 전(Raw)과 후(Normalized) 분포가 따로 있으며, BINDetect는 조건 간 점수 분포를 맞춘(정규화한) 뒤 결과 1의 차이를 계산합니다. 정규화 뒤 두 조건의 분포가 거의 겹치면 결과 1의 차이가 전체 신호 세기 차이가 아니라 전사인자별 결합 변화를 반영한다는 뜻입니다.</w:t>
       </w:r>
     </w:p>
     <w:p>
@@ -40649,7 +40649,7 @@
           <w:sz w:val="18"/>
           <w:szCs w:val="18"/>
         </w:rPr>
-        <w:t xml:space="preserve">)는 포탈에 등록하지 않는다. 스크립트가 입력 유전자 ID와 가장 많이 맞는 종류(TAIR, ENTREZID, SYMBOL 등)를 자동으로 고른다.</w:t>
+        <w:t xml:space="preserve">)는 포탈에 등록하지 않습니다. 스크립트가 입력 유전자 ID와 가장 많이 맞는 종류(TAIR, ENTREZID, SYMBOL 등)를 자동으로 고릅니다.</w:t>
       </w:r>
     </w:p>
     <w:p>
@@ -41015,7 +41015,7 @@
         <w:t xml:space="preserve">그림. GO 기능 농축 분석.</w:t>
       </w:r>
       <w:r>
-        <w:t xml:space="preserve"> (A) 각 peak를 가장 가까운 TSS의 유전자에 연결한다(max_distance_to_tss보다 먼 peak는 제외). 차등 접근성 결과에서는 증가·감소 목록을 따로 만든다. (B) 배경 유전자(N) 중 GO 항목(M)에 속하는 유전자가 입력 목록(n)에 k개 이상 나올 확률을 초기하분포로 구하고 다중검정을 보정한다. (C) 유의한 GO 항목의 dot plot(크기: 유전자 수, 색: 유의성).</w:t>
+        <w:t xml:space="preserve"> (A) 각 peak를 가장 가까운 TSS의 유전자에 연결합니다(max_distance_to_tss보다 먼 peak는 제외). 차등 접근성 결과에서는 증가·감소 목록을 따로 만듭니다. (B) 배경 유전자(N) 중 GO 항목(M)에 속하는 유전자가 입력 목록(n)에 k개 이상 나올 확률을 초기하분포로 구하고 다중검정을 보정합니다. (C) 유의한 GO 항목의 dot plot(크기: 유전자 수, 색: 유의성).</w:t>
       </w:r>
     </w:p>
     <w:p>
@@ -41342,7 +41342,7 @@
         <w:spacing w:after="140"/>
       </w:pPr>
       <w:r>
-        <w:t xml:space="preserve">결과 그림 3개를 아래 순서대로 등록한다. 결과 1이 대표 그림이다.</w:t>
+        <w:t xml:space="preserve">결과 그림 3개를 아래 순서대로 등록합니다. 결과 1이 대표 그림입니다.</w:t>
       </w:r>
     </w:p>
     <w:p>
@@ -41402,7 +41402,7 @@
         <w:t xml:space="preserve">유전자 목록의 GO 생물학적 과정 농축(dot plot).</w:t>
       </w:r>
       <w:r>
-        <w:t xml:space="preserve"> 행은 유의하게 농축된 GO term이다. 가로축은 목록 유전자 중 그 term에 속한 비율(GeneRatio), 점의 크기는 해당 유전자 수(Count), 색은 보정된 p-value(p.adjust; 빨강일수록 유의)다. peak 근처 유전자들이 어떤 생물학적 과정에 모여 있는지를 보여 준다.</w:t>
+        <w:t xml:space="preserve"> 행은 유의하게 농축된 GO term입니다. 가로축은 목록 유전자 중 그 term에 속한 비율(GeneRatio), 점의 크기는 해당 유전자 수(Count), 색은 보정된 p-value(p.adjust; 빨강일수록 유의)다. peak 근처 유전자들이 어떤 생물학적 과정에 모여 있는지를 보여 줍니다.</w:t>
       </w:r>
     </w:p>
     <w:p>
@@ -41479,7 +41479,7 @@
         <w:t xml:space="preserve">유전자 목록의 GO 생물학적 과정 농축(bar plot).</w:t>
       </w:r>
       <w:r>
-        <w:t xml:space="preserve"> 결과 1과 같은 GO term을 막대로 보여 준다. 막대 길이는 그 term에 속한 목록 유전자 수(Count), 색은 보정된 p-value(p.adjust)다. 유전자 수가 많은 term과 유의성이 높은 term을 한눈에 비교할 수 있다.</w:t>
+        <w:t xml:space="preserve"> 결과 1과 같은 GO term을 막대로 보여 줍니다. 막대 길이는 그 term에 속한 목록 유전자 수(Count), 색은 보정된 p-value(p.adjust)다. 유전자 수가 많은 term과 유의성이 높은 term을 한눈에 비교할 수 있습니다.</w:t>
       </w:r>
     </w:p>
     <w:p>
@@ -41553,7 +41553,7 @@
         <w:t xml:space="preserve">유전자 목록별 농축 요약.</w:t>
       </w:r>
       <w:r>
-        <w:t xml:space="preserve"> 목록마다 유전자 수(genes), 주석에서 찾은 유전자 수(genes_annotated), 검정한 GO term 수(terms_tested), 유의한 term 수(significant_terms), GO 영역(ont), 사용한 주석 파일(annotation)과 ID 형식(keytype), 처리 상태(status)를 보여 준다. genes_annotated가 genes보다 크게 적으면 유전자 ID 형식이 주석과 맞지 않는 것이다.</w:t>
+        <w:t xml:space="preserve"> 목록마다 유전자 수(genes), 주석에서 찾은 유전자 수(genes_annotated), 검정한 GO term 수(terms_tested), 유의한 term 수(significant_terms), GO 영역(ont), 사용한 주석 파일(annotation)과 ID 형식(keytype), 처리 상태(status)를 보여 줍니다. genes_annotated가 genes보다 크게 적으면 유전자 ID 형식이 주석과 맞지 않는 것입니다.</w:t>
       </w:r>
     </w:p>
     <w:p>
@@ -44883,7 +44883,7 @@
         <w:t xml:space="preserve">그림. 반복 실험 재현성(IDR).</w:t>
       </w:r>
       <w:r>
-        <w:t xml:space="preserve"> (A) 실제 peak는 두 반복 실험에서 신호 순위가 비슷하지만, 잡음 peak는 순위가 어긋난다. (B) 두 반복의 peak 순위를 비교해 IDR(Irreproducible Discovery Rate)을 계산한다. idr 결과 그림의 순위 산점도처럼, 기준(IDR ≤ 0.05)을 통과한 peak(검정)는 신호가 강한 쪽(오른쪽 위)에서 두 반복의 순위가 맞고, 통과하지 못한 peak(빨강)는 흩어진다. (C) 조건과 반복 쌍별로 느슨한 기준의 peak 수와 IDR 통과 peak 수를 idr_summary.tsv로 남기며, 통과 peak가 가장 많은 쌍을 조건의 대표 peak 세트로 정한다.</w:t>
+        <w:t xml:space="preserve"> (A) 실제 peak는 두 반복 실험에서 신호 순위가 비슷하지만, 잡음 peak는 순위가 어긋납니다. (B) 두 반복의 peak 순위를 비교해 IDR(Irreproducible Discovery Rate)을 계산합니다. idr 결과 그림의 순위 산점도처럼, 기준(IDR ≤ 0.05)을 통과한 peak(검정)는 신호가 강한 쪽(오른쪽 위)에서 두 반복의 순위가 맞고, 통과하지 못한 peak(빨강)는 흩어집니다. (C) 조건과 반복 쌍별로 느슨한 기준의 peak 수와 IDR 통과 peak 수를 idr_summary.tsv로 남기며, 통과 peak가 가장 많은 쌍을 조건의 대표 peak 세트로 정합니다.</w:t>
       </w:r>
     </w:p>
     <w:p>
@@ -45084,7 +45084,7 @@
         <w:spacing w:after="140"/>
       </w:pPr>
       <w:r>
-        <w:t xml:space="preserve">결과 그림 2개를 아래 순서대로 등록한다. 결과 1이 대표 그림이다.</w:t>
+        <w:t xml:space="preserve">결과 그림 2개를 아래 순서대로 등록합니다. 결과 1이 대표 그림입니다.</w:t>
       </w:r>
     </w:p>
     <w:p>
@@ -45138,7 +45138,7 @@
         <w:t xml:space="preserve">반복 샘플 간 peak 재현성(IDR).</w:t>
       </w:r>
       <w:r>
-        <w:t xml:space="preserve"> 두 반복 샘플에서 찾은 peak를 짝지어 비교한 그림이다. 위쪽 패널은 두 반복의 peak 순위와 신호 세기를 서로 대응시킨 산점도로, 검은 점은 IDR 기준을 통과한 재현성 있는 peak, 빨간 점은 통과하지 못한 peak다. 아래쪽 패널은 peak 순위에 따른 IDR 값을 보여 준다. 강한 peak일수록 두 반복에서 함께 나타나고, 약한 peak로 갈수록 재현성이 떨어진다.</w:t>
+        <w:t xml:space="preserve"> 두 반복 샘플에서 찾은 peak를 짝지어 비교한 그림입니다. 위쪽 패널은 두 반복의 peak 순위와 신호 세기를 서로 대응시킨 산점도로, 검은 점은 IDR 기준을 통과한 재현성 있는 peak, 빨간 점은 통과하지 못한 peak다. 아래쪽 패널은 peak 순위에 따른 IDR 값을 보여 줍니다. 강한 peak일수록 두 반복에서 함께 나타나고, 약한 peak로 갈수록 재현성이 떨어집니다.</w:t>
       </w:r>
     </w:p>
     <w:p>
@@ -45212,13 +45212,13 @@
         <w:t xml:space="preserve">조건별 IDR 요약.</w:t>
       </w:r>
       <w:r>
-        <w:t xml:space="preserve"> 조건과 반복 쌍마다 각 반복의 peak 수(peaks_a, peaks_b), 두 반복을 합쳐 찾은 peak 수(pooled_peaks), IDR 기준을 통과한 peak 수(idr_passed), 처리 상태(status)를 보여 준다. 두 반복의 peak 수가 크게 다르거나, idr_passed가 각 반복의 peak 수보다 크게 적으면 반복 간 재현성이 낮은 것이다. 반복이 하나뿐인 조건은 </w:t>
+        <w:t xml:space="preserve"> 조건과 반복 쌍마다 각 반복의 peak 수(peaks_a, peaks_b), 두 반복을 합쳐 찾은 peak 수(pooled_peaks), IDR 기준을 통과한 peak 수(idr_passed), 처리 상태(status)를 보여 줍니다. 두 반복의 peak 수가 크게 다르거나, idr_passed가 각 반복의 peak 수보다 크게 적으면 반복 간 재현성이 낮은 것입니다. 반복이 하나뿐인 조건은 </w:t>
       </w:r>
       <w:r>
         <w:t xml:space="preserve">skipped_single_replicate</w:t>
       </w:r>
       <w:r>
-        <w:t xml:space="preserve">로 표시된다.</w:t>
+        <w:t xml:space="preserve">로 표시됩니다.</w:t>
       </w:r>
     </w:p>
     <w:p>

</xml_diff>

<commit_message>
MACS3_callpeak_ATAC 1.4: send whole error messages to stderr
When no BAM matched alignment_suffix, 1.3 wrote only the first line to
stderr and the expected layout, found BAM list, and tip to stdout; an
invalid argument was reported on stdout. Both now go to stderr.

Co-Authored-By: Claude Opus 5.5 <noreply@anthropic.com>
</commit_message>
<xml_diff>
--- a/docs/ATAC-seq/modules/Portal_Content.docx
+++ b/docs/ATAC-seq/modules/Portal_Content.docx
@@ -16219,7 +16219,7 @@
                 <w:sz w:val="18"/>
                 <w:szCs w:val="18"/>
               </w:rPr>
-              <w:t xml:space="preserve">1.3</w:t>
+              <w:t xml:space="preserve">1.4</w:t>
             </w:r>
           </w:p>
         </w:tc>
@@ -16613,7 +16613,7 @@
                 <w:sz w:val="18"/>
                 <w:szCs w:val="18"/>
               </w:rPr>
-              <w:t xml:space="preserve">MACS3_callpeak_ATAC.1.3.sh</w:t>
+              <w:t xml:space="preserve">MACS3_callpeak_ATAC.1.4.sh</w:t>
             </w:r>
           </w:p>
         </w:tc>
@@ -18980,7 +18980,7 @@
           <w:sz w:val="19"/>
           <w:szCs w:val="19"/>
         </w:rPr>
-        <w:t xml:space="preserve">bash MACS3_callpeak_ATAC.1.3.sh \</w:t>
+        <w:t xml:space="preserve">bash MACS3_callpeak_ATAC.1.4.sh \</w:t>
       </w:r>
     </w:p>
     <w:p>

</xml_diff>

<commit_message>
bowtie2 1.5 and tf_footprinting 1.4: errors go to stderr
bowtie2 wrote stderr into the run .log; it now has its own
logs/<stamp>.error.log, and an invalid argument is reported on stderr
in both scripts. Analysis and outputs are unchanged.

Co-Authored-By: Claude Opus 5.5 <noreply@anthropic.com>
</commit_message>
<xml_diff>
--- a/docs/ATAC-seq/modules/Portal_Content.docx
+++ b/docs/ATAC-seq/modules/Portal_Content.docx
@@ -633,7 +633,7 @@
                 <w:sz w:val="18"/>
                 <w:szCs w:val="18"/>
               </w:rPr>
-              <w:t xml:space="preserve">1.4</w:t>
+              <w:t xml:space="preserve">1.5</w:t>
             </w:r>
           </w:p>
         </w:tc>
@@ -1027,7 +1027,7 @@
                 <w:sz w:val="18"/>
                 <w:szCs w:val="18"/>
               </w:rPr>
-              <w:t xml:space="preserve">bowtie2.1.4.sh</w:t>
+              <w:t xml:space="preserve">bowtie2.1.5.sh</w:t>
             </w:r>
           </w:p>
         </w:tc>
@@ -2953,7 +2953,7 @@
           <w:sz w:val="19"/>
           <w:szCs w:val="19"/>
         </w:rPr>
-        <w:t xml:space="preserve">bash bowtie2.1.4.sh \</w:t>
+        <w:t xml:space="preserve">bash bowtie2.1.5.sh \</w:t>
       </w:r>
     </w:p>
     <w:p>
@@ -33192,7 +33192,7 @@
                 <w:sz w:val="18"/>
                 <w:szCs w:val="18"/>
               </w:rPr>
-              <w:t xml:space="preserve">1.3</w:t>
+              <w:t xml:space="preserve">1.4</w:t>
             </w:r>
           </w:p>
         </w:tc>
@@ -33586,7 +33586,7 @@
                 <w:sz w:val="18"/>
                 <w:szCs w:val="18"/>
               </w:rPr>
-              <w:t xml:space="preserve">tf_footprinting.1.3.sh</w:t>
+              <w:t xml:space="preserve">tf_footprinting.1.4.sh</w:t>
             </w:r>
           </w:p>
         </w:tc>
@@ -36149,7 +36149,7 @@
           <w:sz w:val="19"/>
           <w:szCs w:val="19"/>
         </w:rPr>
-        <w:t xml:space="preserve">bash tf_footprinting.1.3.sh \</w:t>
+        <w:t xml:space="preserve">bash tf_footprinting.1.4.sh \</w:t>
       </w:r>
     </w:p>
     <w:p>

</xml_diff>

<commit_message>
Number differential_accessibility and atac_motif after the CLOSHA 2.0 versions
In CLOSHA 2.0 production differential_accessibility was 1.2 and
atac_motif 1.1, but the received originals were stored as 1.0, so our
later files reused production numbers. Files are renamed one step on
(DA 1.0-1.2 -> 1.2-1.4, atac_motif 1.0-1.4 -> 1.1-1.5) with their
headers, the content, registration, manual, rules, and DEF comments.
Script contents are unchanged apart from version labels. The script
rules now say numbering continues the CLOSHA 2.0 versions.

Co-Authored-By: Claude Opus 5.5 <noreply@anthropic.com>
</commit_message>
<xml_diff>
--- a/docs/ATAC-seq/modules/Portal_Content.docx
+++ b/docs/ATAC-seq/modules/Portal_Content.docx
@@ -23285,7 +23285,7 @@
                 <w:sz w:val="18"/>
                 <w:szCs w:val="18"/>
               </w:rPr>
-              <w:t xml:space="preserve">1.2</w:t>
+              <w:t xml:space="preserve">1.4</w:t>
             </w:r>
           </w:p>
         </w:tc>
@@ -23679,7 +23679,7 @@
                 <w:sz w:val="18"/>
                 <w:szCs w:val="18"/>
               </w:rPr>
-              <w:t xml:space="preserve">differential_accessibility.1.2.R</w:t>
+              <w:t xml:space="preserve">differential_accessibility.1.4.R</w:t>
             </w:r>
           </w:p>
         </w:tc>
@@ -27198,7 +27198,7 @@
           <w:sz w:val="19"/>
           <w:szCs w:val="19"/>
         </w:rPr>
-        <w:t xml:space="preserve">Rscript differential_accessibility.1.2.R \</w:t>
+        <w:t xml:space="preserve">Rscript differential_accessibility.1.4.R \</w:t>
       </w:r>
     </w:p>
     <w:p>
@@ -27990,7 +27990,7 @@
                 <w:sz w:val="18"/>
                 <w:szCs w:val="18"/>
               </w:rPr>
-              <w:t xml:space="preserve">1.4</w:t>
+              <w:t xml:space="preserve">1.5</w:t>
             </w:r>
           </w:p>
         </w:tc>
@@ -28384,7 +28384,7 @@
                 <w:sz w:val="18"/>
                 <w:szCs w:val="18"/>
               </w:rPr>
-              <w:t xml:space="preserve">atac_motif.1.4.R</w:t>
+              <w:t xml:space="preserve">atac_motif.1.5.R</w:t>
             </w:r>
           </w:p>
         </w:tc>
@@ -32361,7 +32361,7 @@
           <w:sz w:val="19"/>
           <w:szCs w:val="19"/>
         </w:rPr>
-        <w:t xml:space="preserve">Rscript atac_motif.1.4.R \</w:t>
+        <w:t xml:space="preserve">Rscript atac_motif.1.5.R \</w:t>
       </w:r>
     </w:p>
     <w:p>

</xml_diff>

<commit_message>
Add the CLOSHA 3.0 ATAC-seq release of 2026-10-16
release/CLOSHA3/ATAC-seq/2026-10-16 holds the release scripts (CLOSHA 2.0
version + 1; new modules 1.0), each with one header describing the
changes from CLOSHA 2.0, RELEASE.md and release.tsv mapping release to
work files, the build script, a snapshot of the portal content and
registration docs, and a results/ folder for the release-time outputs.
tools/check_release.py confirms the release files equal their work files
apart from the header and file name. The portal content, registration
and container manual now use the release file names and versions.

Co-Authored-By: Claude Opus 5.5 <noreply@anthropic.com>
</commit_message>
<xml_diff>
--- a/docs/ATAC-seq/modules/Portal_Content.docx
+++ b/docs/ATAC-seq/modules/Portal_Content.docx
@@ -633,7 +633,7 @@
                 <w:sz w:val="18"/>
                 <w:szCs w:val="18"/>
               </w:rPr>
-              <w:t xml:space="preserve">1.5</w:t>
+              <w:t xml:space="preserve">1.1</w:t>
             </w:r>
           </w:p>
         </w:tc>
@@ -1027,7 +1027,7 @@
                 <w:sz w:val="18"/>
                 <w:szCs w:val="18"/>
               </w:rPr>
-              <w:t xml:space="preserve">bowtie2.1.5.sh</w:t>
+              <w:t xml:space="preserve">bowtie2.1.1.sh</w:t>
             </w:r>
           </w:p>
         </w:tc>
@@ -2396,7 +2396,7 @@
           <w:sz w:val="18"/>
           <w:szCs w:val="18"/>
         </w:rPr>
-        <w:t xml:space="preserve">등록 메모: post_process_bam은 포탈에 등록하지 않습니다. 스크립트 기본값이 yes(1.4부터)라 항상 좌표 순 BAM과 .bai를 만듭니다(1.3 이하는 기본값 no라 인자 없이 실행하면 SAM만 남았습니다).</w:t>
+        <w:t xml:space="preserve">등록 메모: post_process_bam은 포탈에 등록하지 않습니다. 스크립트 기본값이 yes라 항상 좌표 순 BAM과 .bai를 만듭니다(CLOSHA 2.0의 bowtie2 1.0은 기본값이 no라 인자 없이 실행하면 SAM만 남았습니다).</w:t>
       </w:r>
     </w:p>
     <w:p>
@@ -2749,7 +2749,7 @@
                 <w:sz w:val="18"/>
                 <w:szCs w:val="18"/>
               </w:rPr>
-              <w:t xml:space="preserve">1.3부터 샘플마다 read group(@RG; ID, SM, LB = 샘플 이름, PL = ILLUMINA)을 붙입니다. GATK_MarkDuplicates(GATK 4.6)는 read group이 없는 BAM에서 멈추므로, 1.2 이하로 만든 BAM은 1.3으로 다시 정렬해 주세요.</w:t>
+              <w:t xml:space="preserve">샘플마다 read group(@RG; ID, SM, LB = 샘플 이름, PL = ILLUMINA)을 붙입니다. GATK_MarkDuplicates(GATK 4.6)는 read group이 없는 BAM에서 멈추므로, CLOSHA 2.0의 bowtie2 1.0으로 만든 BAM은 이 버전으로 다시 정렬해 주세요.</w:t>
             </w:r>
           </w:p>
         </w:tc>
@@ -2769,7 +2769,7 @@
                 <w:sz w:val="18"/>
                 <w:szCs w:val="18"/>
               </w:rPr>
-              <w:t xml:space="preserve">From 1.3 each sample gets a read group (@RG; ID, SM, and LB = the sample name, PL = ILLUMINA). GATK_MarkDuplicates (GATK 4.6) stops on BAM files without read groups, so realign BAM files made with 1.2 or earlier using 1.3.</w:t>
+              <w:t xml:space="preserve">Each sample gets a read group (@RG; ID, SM, and LB = the sample name, PL = ILLUMINA). GATK_MarkDuplicates (GATK 4.6) stops on BAM files without read groups, so realign BAM files made with bowtie2 1.0 of CLOSHA 2.0 using this version.</w:t>
             </w:r>
           </w:p>
         </w:tc>
@@ -2953,7 +2953,7 @@
           <w:sz w:val="19"/>
           <w:szCs w:val="19"/>
         </w:rPr>
-        <w:t xml:space="preserve">bash bowtie2.1.5.sh \</w:t>
+        <w:t xml:space="preserve">bash bowtie2.1.1.sh \</w:t>
       </w:r>
     </w:p>
     <w:p>
@@ -5351,7 +5351,7 @@
                 <w:sz w:val="18"/>
                 <w:szCs w:val="18"/>
               </w:rPr>
-              <w:t xml:space="preserve">입력 BAM에 read group(@RG)이 있어야 합니다. GATK 4.6은 read group이 없는 BAM에서 NullPointerException으로 멈춥니다. bowtie2 1.3 이상의 결과에는 read group이 들어 있으며, 이전 bowtie2 결과는 다시 정렬해 주세요.</w:t>
+              <w:t xml:space="preserve">입력 BAM에 read group(@RG)이 있어야 합니다. GATK 4.6은 read group이 없는 BAM에서 NullPointerException으로 멈춥니다. bowtie2 1.1 이상(CLOSHA 3.0)의 결과에는 read group이 들어 있으며, CLOSHA 2.0의 bowtie2 1.0 결과는 다시 정렬해 주세요.</w:t>
             </w:r>
           </w:p>
         </w:tc>
@@ -5371,7 +5371,7 @@
                 <w:sz w:val="18"/>
                 <w:szCs w:val="18"/>
               </w:rPr>
-              <w:t xml:space="preserve">The input BAM files need read groups (@RG). GATK 4.6 stops with a NullPointerException on BAM files without them. bowtie2 1.3 or later writes read groups; realign BAM files from earlier bowtie2 versions.</w:t>
+              <w:t xml:space="preserve">The input BAM files need read groups (@RG). GATK 4.6 stops with a NullPointerException on BAM files without them. bowtie2 1.1 or later (CLOSHA 3.0) writes read groups; realign BAM files from bowtie2 1.0 of CLOSHA 2.0.</w:t>
             </w:r>
           </w:p>
         </w:tc>
@@ -6147,7 +6147,7 @@
                 <w:sz w:val="18"/>
                 <w:szCs w:val="18"/>
               </w:rPr>
-              <w:t xml:space="preserve">1.2</w:t>
+              <w:t xml:space="preserve">1.1</w:t>
             </w:r>
           </w:p>
         </w:tc>
@@ -6541,7 +6541,7 @@
                 <w:sz w:val="18"/>
                 <w:szCs w:val="18"/>
               </w:rPr>
-              <w:t xml:space="preserve">organellar_filter.1.2.sh</w:t>
+              <w:t xml:space="preserve">organellar_filter.1.1.sh</w:t>
             </w:r>
           </w:p>
         </w:tc>
@@ -8251,7 +8251,7 @@
           <w:sz w:val="19"/>
           <w:szCs w:val="19"/>
         </w:rPr>
-        <w:t xml:space="preserve">bash organellar_filter.1.2.sh \</w:t>
+        <w:t xml:space="preserve">bash organellar_filter.1.1.sh \</w:t>
       </w:r>
     </w:p>
     <w:p>
@@ -8675,7 +8675,7 @@
                 <w:sz w:val="18"/>
                 <w:szCs w:val="18"/>
               </w:rPr>
-              <w:t xml:space="preserve">1.2</w:t>
+              <w:t xml:space="preserve">1.1</w:t>
             </w:r>
           </w:p>
         </w:tc>
@@ -9069,7 +9069,7 @@
                 <w:sz w:val="18"/>
                 <w:szCs w:val="18"/>
               </w:rPr>
-              <w:t xml:space="preserve">ATAC_QC.1.2.R</w:t>
+              <w:t xml:space="preserve">ATAC_QC.1.1.R</w:t>
             </w:r>
           </w:p>
         </w:tc>
@@ -12022,7 +12022,7 @@
           <w:sz w:val="19"/>
           <w:szCs w:val="19"/>
         </w:rPr>
-        <w:t xml:space="preserve">Rscript ATAC_QC.1.2.R \</w:t>
+        <w:t xml:space="preserve">Rscript ATAC_QC.1.1.R \</w:t>
       </w:r>
     </w:p>
     <w:p>
@@ -12687,7 +12687,7 @@
                 <w:sz w:val="18"/>
                 <w:szCs w:val="18"/>
               </w:rPr>
-              <w:t xml:space="preserve">1.2</w:t>
+              <w:t xml:space="preserve">1.1</w:t>
             </w:r>
           </w:p>
         </w:tc>
@@ -13081,7 +13081,7 @@
                 <w:sz w:val="18"/>
                 <w:szCs w:val="18"/>
               </w:rPr>
-              <w:t xml:space="preserve">ATAC_QC_plot.1.2.R</w:t>
+              <w:t xml:space="preserve">ATAC_QC_plot.1.1.R</w:t>
             </w:r>
           </w:p>
         </w:tc>
@@ -15640,7 +15640,7 @@
           <w:sz w:val="19"/>
           <w:szCs w:val="19"/>
         </w:rPr>
-        <w:t xml:space="preserve">Rscript ATAC_QC_plot.1.2.R \</w:t>
+        <w:t xml:space="preserve">Rscript ATAC_QC_plot.1.1.R \</w:t>
       </w:r>
     </w:p>
     <w:p>
@@ -16219,7 +16219,7 @@
                 <w:sz w:val="18"/>
                 <w:szCs w:val="18"/>
               </w:rPr>
-              <w:t xml:space="preserve">1.4</w:t>
+              <w:t xml:space="preserve">1.1</w:t>
             </w:r>
           </w:p>
         </w:tc>
@@ -16613,7 +16613,7 @@
                 <w:sz w:val="18"/>
                 <w:szCs w:val="18"/>
               </w:rPr>
-              <w:t xml:space="preserve">MACS3_callpeak_ATAC.1.4.sh</w:t>
+              <w:t xml:space="preserve">MACS3_callpeak_ATAC.1.1.sh</w:t>
             </w:r>
           </w:p>
         </w:tc>
@@ -18980,7 +18980,7 @@
           <w:sz w:val="19"/>
           <w:szCs w:val="19"/>
         </w:rPr>
-        <w:t xml:space="preserve">bash MACS3_callpeak_ATAC.1.4.sh \</w:t>
+        <w:t xml:space="preserve">bash MACS3_callpeak_ATAC.1.1.sh \</w:t>
       </w:r>
     </w:p>
     <w:p>
@@ -19460,7 +19460,7 @@
                 <w:sz w:val="18"/>
                 <w:szCs w:val="18"/>
               </w:rPr>
-              <w:t xml:space="preserve">1.2</w:t>
+              <w:t xml:space="preserve">1.1</w:t>
             </w:r>
           </w:p>
         </w:tc>
@@ -19854,7 +19854,7 @@
                 <w:sz w:val="18"/>
                 <w:szCs w:val="18"/>
               </w:rPr>
-              <w:t xml:space="preserve">peak_annotation.1.2.R</w:t>
+              <w:t xml:space="preserve">peak_annotation.1.1.R</w:t>
             </w:r>
           </w:p>
         </w:tc>
@@ -22555,7 +22555,7 @@
           <w:sz w:val="19"/>
           <w:szCs w:val="19"/>
         </w:rPr>
-        <w:t xml:space="preserve">Rscript peak_annotation.1.2.R \</w:t>
+        <w:t xml:space="preserve">Rscript peak_annotation.1.1.R \</w:t>
       </w:r>
     </w:p>
     <w:p>
@@ -23285,7 +23285,7 @@
                 <w:sz w:val="18"/>
                 <w:szCs w:val="18"/>
               </w:rPr>
-              <w:t xml:space="preserve">1.4</w:t>
+              <w:t xml:space="preserve">1.3</w:t>
             </w:r>
           </w:p>
         </w:tc>
@@ -23679,7 +23679,7 @@
                 <w:sz w:val="18"/>
                 <w:szCs w:val="18"/>
               </w:rPr>
-              <w:t xml:space="preserve">differential_accessibility.1.4.R</w:t>
+              <w:t xml:space="preserve">differential_accessibility.1.3.R</w:t>
             </w:r>
           </w:p>
         </w:tc>
@@ -27198,7 +27198,7 @@
           <w:sz w:val="19"/>
           <w:szCs w:val="19"/>
         </w:rPr>
-        <w:t xml:space="preserve">Rscript differential_accessibility.1.4.R \</w:t>
+        <w:t xml:space="preserve">Rscript differential_accessibility.1.3.R \</w:t>
       </w:r>
     </w:p>
     <w:p>
@@ -27990,7 +27990,7 @@
                 <w:sz w:val="18"/>
                 <w:szCs w:val="18"/>
               </w:rPr>
-              <w:t xml:space="preserve">1.5</w:t>
+              <w:t xml:space="preserve">1.2</w:t>
             </w:r>
           </w:p>
         </w:tc>
@@ -28384,7 +28384,7 @@
                 <w:sz w:val="18"/>
                 <w:szCs w:val="18"/>
               </w:rPr>
-              <w:t xml:space="preserve">atac_motif.1.5.R</w:t>
+              <w:t xml:space="preserve">atac_motif.1.2.R</w:t>
             </w:r>
           </w:p>
         </w:tc>
@@ -32361,7 +32361,7 @@
           <w:sz w:val="19"/>
           <w:szCs w:val="19"/>
         </w:rPr>
-        <w:t xml:space="preserve">Rscript atac_motif.1.5.R \</w:t>
+        <w:t xml:space="preserve">Rscript atac_motif.1.2.R \</w:t>
       </w:r>
     </w:p>
     <w:p>
@@ -33192,7 +33192,7 @@
                 <w:sz w:val="18"/>
                 <w:szCs w:val="18"/>
               </w:rPr>
-              <w:t xml:space="preserve">1.4</w:t>
+              <w:t xml:space="preserve">1.1</w:t>
             </w:r>
           </w:p>
         </w:tc>
@@ -33586,7 +33586,7 @@
                 <w:sz w:val="18"/>
                 <w:szCs w:val="18"/>
               </w:rPr>
-              <w:t xml:space="preserve">tf_footprinting.1.4.sh</w:t>
+              <w:t xml:space="preserve">tf_footprinting.1.1.sh</w:t>
             </w:r>
           </w:p>
         </w:tc>
@@ -36149,7 +36149,7 @@
           <w:sz w:val="19"/>
           <w:szCs w:val="19"/>
         </w:rPr>
-        <w:t xml:space="preserve">bash tf_footprinting.1.4.sh \</w:t>
+        <w:t xml:space="preserve">bash tf_footprinting.1.1.sh \</w:t>
       </w:r>
     </w:p>
     <w:p>
@@ -36700,7 +36700,7 @@
                 <w:sz w:val="18"/>
                 <w:szCs w:val="18"/>
               </w:rPr>
-              <w:t xml:space="preserve">1.1</w:t>
+              <w:t xml:space="preserve">1.0</w:t>
             </w:r>
           </w:p>
         </w:tc>
@@ -37094,7 +37094,7 @@
                 <w:sz w:val="18"/>
                 <w:szCs w:val="18"/>
               </w:rPr>
-              <w:t xml:space="preserve">functional_enrichment.1.1.R</w:t>
+              <w:t xml:space="preserve">functional_enrichment.1.0.R</w:t>
             </w:r>
           </w:p>
         </w:tc>
@@ -41080,7 +41080,7 @@
           <w:sz w:val="19"/>
           <w:szCs w:val="19"/>
         </w:rPr>
-        <w:t xml:space="preserve">Rscript functional_enrichment.1.1.R \</w:t>
+        <w:t xml:space="preserve">Rscript functional_enrichment.1.0.R \</w:t>
       </w:r>
     </w:p>
     <w:p>
@@ -41865,7 +41865,7 @@
                 <w:sz w:val="18"/>
                 <w:szCs w:val="18"/>
               </w:rPr>
-              <w:t xml:space="preserve">1.1</w:t>
+              <w:t xml:space="preserve">1.0</w:t>
             </w:r>
           </w:p>
         </w:tc>
@@ -42259,7 +42259,7 @@
                 <w:sz w:val="18"/>
                 <w:szCs w:val="18"/>
               </w:rPr>
-              <w:t xml:space="preserve">replicate_consistency.1.1.sh</w:t>
+              <w:t xml:space="preserve">replicate_consistency.1.0.sh</w:t>
             </w:r>
           </w:p>
         </w:tc>
@@ -44948,7 +44948,7 @@
           <w:sz w:val="19"/>
           <w:szCs w:val="19"/>
         </w:rPr>
-        <w:t xml:space="preserve">bash replicate_consistency.1.1.sh \</w:t>
+        <w:t xml:space="preserve">bash replicate_consistency.1.0.sh \</w:t>
       </w:r>
     </w:p>
     <w:p>

</xml_diff>

<commit_message>
Release 2026-10-16: functional_enrichment 1.0 now from work 1.2; content notes on the two inputs
Co-Authored-By: Claude Opus 5.5 <noreply@anthropic.com>
</commit_message>
<xml_diff>
--- a/docs/ATAC-seq/modules/Portal_Content.docx
+++ b/docs/ATAC-seq/modules/Portal_Content.docx
@@ -40897,6 +40897,90 @@
                 <w:szCs w:val="18"/>
               </w:rPr>
               <w:t xml:space="preserve">In the pipeline the same module follows peak_annotation and differential_accessibility; connect the previous module's output_dir to input_dir.</w:t>
+            </w:r>
+          </w:p>
+        </w:tc>
+      </w:tr>
+      <w:tr>
+        <w:tc>
+          <w:tcPr>
+            <w:tcW w:type="dxa" w:w="4753"/>
+            <w:tcMar>
+              <w:top w:type="dxa" w:w="60"/>
+              <w:left w:type="dxa" w:w="90"/>
+              <w:bottom w:type="dxa" w:w="60"/>
+              <w:right w:type="dxa" w:w="90"/>
+            </w:tcMar>
+          </w:tcPr>
+          <w:p>
+            <w:r>
+              <w:rPr>
+                <w:sz w:val="18"/>
+                <w:szCs w:val="18"/>
+              </w:rPr>
+              <w:t xml:space="preserve">두 입력은 서로 다른 질문에 답합니다. peak_annotation 결과는 샘플마다 열린 peak 근처 유전자 전체(수천~수만 개)가 어떤 기능에 모여 있는지, differential_accessibility 결과는 조건 간에 유의하게 열리거나 닫힌 peak 근처 유전자가 어떤 기능과 관련 있는지를 봅니다.</w:t>
+            </w:r>
+          </w:p>
+        </w:tc>
+        <w:tc>
+          <w:tcPr>
+            <w:tcW w:type="dxa" w:w="4753"/>
+            <w:tcMar>
+              <w:top w:type="dxa" w:w="60"/>
+              <w:left w:type="dxa" w:w="90"/>
+              <w:bottom w:type="dxa" w:w="60"/>
+              <w:right w:type="dxa" w:w="90"/>
+            </w:tcMar>
+          </w:tcPr>
+          <w:p>
+            <w:r>
+              <w:rPr>
+                <w:sz w:val="18"/>
+                <w:szCs w:val="18"/>
+              </w:rPr>
+              <w:t xml:space="preserve">The two inputs answer different questions: a peak_annotation output asks which functions the genes near each sample's open peaks (thousands of genes) share, and a differential_accessibility output asks which functions the genes near peaks that significantly gained or lost accessibility between conditions relate to.</w:t>
+            </w:r>
+          </w:p>
+        </w:tc>
+      </w:tr>
+      <w:tr>
+        <w:tc>
+          <w:tcPr>
+            <w:tcW w:type="dxa" w:w="4753"/>
+            <w:tcMar>
+              <w:top w:type="dxa" w:w="60"/>
+              <w:left w:type="dxa" w:w="90"/>
+              <w:bottom w:type="dxa" w:w="60"/>
+              <w:right w:type="dxa" w:w="90"/>
+            </w:tcMar>
+          </w:tcPr>
+          <w:p>
+            <w:r>
+              <w:rPr>
+                <w:sz w:val="18"/>
+                <w:szCs w:val="18"/>
+              </w:rPr>
+              <w:t xml:space="preserve">differential_accessibility 결과를 넣었는데 유의한 peak가 적으면(예: 수십 개 이하) 검정할 GO term이 없어 결과가 나오지 않습니다. 이때는 오류가 아니라 경고와 함께 정상 종료하며, 요약표 상태가 no_testable_terms(또는 empty)로 남습니다. peak_annotation 결과를 입력으로 쓰거나 da_fdr을 높여 주세요.</w:t>
+            </w:r>
+          </w:p>
+        </w:tc>
+        <w:tc>
+          <w:tcPr>
+            <w:tcW w:type="dxa" w:w="4753"/>
+            <w:tcMar>
+              <w:top w:type="dxa" w:w="60"/>
+              <w:left w:type="dxa" w:w="90"/>
+              <w:bottom w:type="dxa" w:w="60"/>
+              <w:right w:type="dxa" w:w="90"/>
+            </w:tcMar>
+          </w:tcPr>
+          <w:p>
+            <w:r>
+              <w:rPr>
+                <w:sz w:val="18"/>
+                <w:szCs w:val="18"/>
+              </w:rPr>
+              <w:t xml:space="preserve">With a differential_accessibility input and few significant peaks (for example a few dozen or fewer), no GO term can be tested and no result is produced. The run then ends normally with a warning, and the summary table shows the status no_testable_terms (or empty). Use a peak_annotation output as input, or raise da_fdr.</w:t>
             </w:r>
           </w:p>
         </w:tc>

</xml_diff>

<commit_message>
ATAC_QC_plot: release-time results and legends checked against the real figures
results/ATAC_QC_plot holds the representative sample (SRR24197771) PDFs,
the profile TSV, the plot summary, the run logs, and the portal PNGs.
Viewing the figures showed that the TSS profile PDF has two pages (the
portal uses page 2, Fraction of signal), that the nucleosome line is red
dashed, and that the heatmap colour runs from 0 to 2 on log2(coverage+1)
with rows ordered by NucleosomeFree signal; the legends now say so and
add what the example data show.

Co-Authored-By: Claude Opus 5.5 <noreply@anthropic.com>
</commit_message>
<xml_diff>
--- a/docs/ATAC-seq/modules/Portal_Content.docx
+++ b/docs/ATAC-seq/modules/Portal_Content.docx
@@ -15830,7 +15830,7 @@
         <w:t xml:space="preserve">TSS 주변의 nucleosome-free 신호와 nucleosome 신호.</w:t>
       </w:r>
       <w:r>
-        <w:t xml:space="preserve"> 각 행은 TSS 하나이고, 가로축은 TSS 중심 ±1,010 bp 구간입니다. 왼쪽 패널(NucleosomeFree)은 nucleosome-free fragment, 오른쪽 패널(그림에는 mononucleosome으로 표시)은 mono, di, trinucleosome fragment를 합친 nucleosome 신호이며, 신호(log2)를 노랑(낮음)에서 빨강(높음)으로 나타냅니다. 정상적인 ATAC-seq에서는 nucleosome-free 신호가 TSS 바로 위에 모이고, nucleosome 신호는 TSS 양옆(nucleosome 자리)에 나타납니다.</w:t>
+        <w:t xml:space="preserve"> 각 행은 TSS 하나이고, 가로축은 TSS 중심 −1,000~+1,000 bp 구간입니다. 왼쪽 패널(NucleosomeFree)은 nucleosome-free fragment, 오른쪽 패널(그림에는 mononucleosome으로 표시)은 mono, di, trinucleosome fragment를 합친 nucleosome 신호입니다. 색은 log2(coverage + 1)을 노랑(0)에서 빨강(2 이상)으로 나타내며, 행은 NucleosomeFree 신호가 강한 TSS가 위로 오도록 정렬됩니다. 정상적인 ATAC-seq에서는 왼쪽 패널의 빨간 띠가 TSS(가운데)에 모이고, 오른쪽 패널은 TSS 바로 위가 옅고 양옆(nucleosome 자리)이 진합니다. 예시 데이터(애기장대, SRR24197771)에서도 이 형태가 뚜렷합니다.</w:t>
       </w:r>
     </w:p>
     <w:p>
@@ -15853,7 +15853,7 @@
         <w:t xml:space="preserve">Nucleosome-free and nucleosome signal around TSSs.</w:t>
       </w:r>
       <w:r>
-        <w:t xml:space="preserve"> Each row is one TSS and the x-axis spans ±1,010 bp around its centre. The left panel (NucleosomeFree) shows nucleosome-free fragments and the right panel (labelled mononucleosome in the plot) the nucleosome signal of mono-, di-, and trinucleosome fragments combined, with signal (log2) from yellow (low) to red (high). In good ATAC-seq data the nucleosome-free signal concentrates at the TSS, while the nucleosome signal flanks it where nucleosomes sit.</w:t>
+        <w:t xml:space="preserve"> Each row is one TSS and the x-axis spans −1,000 to +1,000 bp around its centre. The left panel (NucleosomeFree) shows nucleosome-free fragments and the right panel (labelled mononucleosome in the plot) the nucleosome signal of mono-, di-, and trinucleosome fragments combined. Colour shows log2(coverage + 1) from yellow (0) to red (2 or more), and rows are ordered with the strongest NucleosomeFree signal on top. In good ATAC-seq data the red band of the left panel sits on the TSS (centre), while the right panel is pale right at the TSS and darker on both sides where nucleosomes sit. The example data (Arabidopsis, SRR24197771) show this pattern clearly.</w:t>
       </w:r>
     </w:p>
     <w:p>
@@ -15884,7 +15884,7 @@
         <w:t xml:space="preserve">01_tss_signal/&lt;sample&gt;.TSSprofile_splitbam.pdf</w:t>
       </w:r>
       <w:r>
-        <w:t xml:space="preserve"> (결과 1과 같은 샘플)</w:t>
+        <w:t xml:space="preserve">의 2쪽(제목 "&lt;sample&gt; TSS signal", 세로축 Fraction of signal) (결과 1과 같은 샘플). 1쪽은 같은 신호를 정규화 전 평균 coverage로 그린 그림입니다.</w:t>
       </w:r>
     </w:p>
     <w:p>
@@ -15907,7 +15907,7 @@
         <w:t xml:space="preserve">TSS 주변 평균 신호.</w:t>
       </w:r>
       <w:r>
-        <w:t xml:space="preserve"> 결과 1의 heatmap을 모든 TSS에 대해 평균한 선 그래프입니다. 가로축은 TSS 기준 위치(−1 kb~+1 kb), 세로축은 각 신호를 0~1로 맞춘 값(Fraction of signal)입니다. 검은 선은 NucleosomeFree, 빨간 선은 nucleosome 신호(그림에는 mononucleosome으로 표시, mono, di, trinucleosome fragment를 합친 신호)다. 정상적인 ATAC-seq에서는 검은 선이 TSS(가운데)에서 가장 높고, 빨간 선은 TSS에서 낮아졌다가 양옆(−1, +1 nucleosome 자리)에서 높아집니다.</w:t>
+        <w:t xml:space="preserve"> 결과 1의 heatmap을 모든 TSS에 대해 평균한 선 그래프입니다. 가로축은 TSS 기준 위치(−1 kb~+1 kb, bp), 세로축은 두 신호를 각각 최댓값 1로 맞춘 값(Fraction of signal)입니다. 검은 실선은 NucleosomeFree, 빨간 점선은 nucleosome 신호(그림에는 mononucleosome으로 표시, mono, di, trinucleosome fragment를 합친 신호)입니다. 정상적인 ATAC-seq에서는 검은 선이 TSS 근처에서 가장 높고, 빨간 점선은 TSS에서 낮아졌다가 양옆(−1, +1 nucleosome 자리)에서 높아집니다. 예시 데이터에서는 검은 선이 TSS 바로 위쪽(약 −50 bp)에서 가장 높고, 빨간 점선은 약 −250 bp(−1 nucleosome)와 +120 bp(+1 nucleosome)에서 높아집니다.</w:t>
       </w:r>
     </w:p>
     <w:p>
@@ -15930,7 +15930,7 @@
         <w:t xml:space="preserve">Average signal around TSSs.</w:t>
       </w:r>
       <w:r>
-        <w:t xml:space="preserve"> The heatmap of result 1 averaged over all TSSs. The x-axis is the position relative to the TSS (−1 kb to +1 kb) and the y-axis each signal scaled to 0-1 (fraction of signal). The black line is NucleosomeFree and the red line the nucleosome signal (labelled mononucleosome in the plot; mono-, di-, and trinucleosome fragments combined). In good ATAC-seq data the black line peaks at the TSS (centre), while the red line dips at the TSS and rises on both sides at the −1 and +1 nucleosome positions.</w:t>
+        <w:t xml:space="preserve"> The heatmap of result 1 averaged over all TSSs. The x-axis is the position relative to the TSS (−1 kb to +1 kb, bp) and the y-axis each signal scaled to a maximum of 1 (fraction of signal). The solid black line is NucleosomeFree and the dashed red line the nucleosome signal (labelled mononucleosome in the plot; mono-, di-, and trinucleosome fragments combined). In good ATAC-seq data the black line peaks near the TSS, while the red line dips at the TSS and rises on both sides at the −1 and +1 nucleosome positions. In the example data the black line peaks just upstream of the TSS (about −50 bp), and the red line rises at about −250 bp (−1 nucleosome) and +120 bp (+1 nucleosome).</w:t>
       </w:r>
     </w:p>
     <w:p>

</xml_diff>

<commit_message>
Content: show the base OS as Rocky Linux 9.8 / 9, without the image digest
The digest stays in the DEF files and Container_Manual; the portal guide
says so.

Co-Authored-By: Claude Opus 5.5 <noreply@anthropic.com>
</commit_message>
<xml_diff>
--- a/docs/ATAC-seq/modules/Portal_Content.docx
+++ b/docs/ATAC-seq/modules/Portal_Content.docx
@@ -226,31 +226,25 @@
         <w:t xml:space="preserve">Apptainer</w:t>
       </w:r>
       <w:r>
-        <w:t xml:space="preserve">다(작업이 SIF로 실행되므로). 모듈별 "실행 이미지" 절의 DEF Bootstrap(</w:t>
+        <w:t xml:space="preserve">입니다(작업이 SIF로 실행되므로). 모듈별 "실행 이미지" 절의 DEF Bootstrap(</w:t>
       </w:r>
       <w:r>
         <w:t xml:space="preserve">docker</w:t>
       </w:r>
       <w:r>
-        <w:t xml:space="preserve">)은 이미지를 만들 때 쓴 DEF 파일의 값이라 다릅니다. 기반 이미지(From)는 DEF의 </w:t>
-      </w:r>
-      <w:r>
-        <w:t xml:space="preserve">rockylinux/rockylinux:9.8</w:t>
-      </w:r>
-      <w:r>
-        <w:t xml:space="preserve"> (digest </w:t>
-      </w:r>
-      <w:r>
-        <w:t xml:space="preserve">sha256:8101994123cf3d0a8fee517bee7f39e555c7d92bd2d9eb3303cc988a0eeed00f</w:t>
-      </w:r>
-      <w:r>
-        <w:t xml:space="preserve">)이며 bowtie2와 GATK_MarkDuplicates를 뺀 모든 모듈이 같습니다. 이 두 모듈은 WGS 파이프라인과 같이 쓰는 이미지라 </w:t>
+        <w:t xml:space="preserve">)은 이미지를 만들 때 쓴 DEF 파일의 값이라 다릅니다. 기반 이미지(From)는 Rocky Linux 9.8(</w:t>
+      </w:r>
+      <w:r>
+        <w:t xml:space="preserve">rockylinux/rockylinux:9.8.20260525.0</w:t>
+      </w:r>
+      <w:r>
+        <w:t xml:space="preserve">)이며 bowtie2와 GATK_MarkDuplicates를 뺀 모든 모듈이 같습니다. 이 두 모듈은 WGS 파이프라인과 같이 쓰는 이미지라 Rocky Linux 9(</w:t>
       </w:r>
       <w:r>
         <w:t xml:space="preserve">rockylinux/rockylinux:9</w:t>
       </w:r>
       <w:r>
-        <w:t xml:space="preserve">(digest 고정 없음)와 Miniforge3 26.5.3-0을 씁니다.</w:t>
+        <w:t xml:space="preserve">)와 Miniforge3 26.5.3-0을 씁니다.</w:t>
       </w:r>
     </w:p>
     <w:p>
@@ -1318,6 +1312,13 @@
                 <w:sz w:val="18"/>
                 <w:szCs w:val="18"/>
               </w:rPr>
+              <w:t xml:space="preserve">Rocky Linux 9 (</w:t>
+            </w:r>
+            <w:r>
+              <w:rPr>
+                <w:sz w:val="18"/>
+                <w:szCs w:val="18"/>
+              </w:rPr>
               <w:t xml:space="preserve">rockylinux/rockylinux:9</w:t>
             </w:r>
             <w:r>
@@ -1325,7 +1326,7 @@
                 <w:sz w:val="18"/>
                 <w:szCs w:val="18"/>
               </w:rPr>
-              <w:t xml:space="preserve"> (Rocky Linux 9, digest 고정 없음)</w:t>
+              <w:t xml:space="preserve">)</w:t>
             </w:r>
           </w:p>
         </w:tc>
@@ -4170,6 +4171,13 @@
                 <w:sz w:val="18"/>
                 <w:szCs w:val="18"/>
               </w:rPr>
+              <w:t xml:space="preserve">Rocky Linux 9 (</w:t>
+            </w:r>
+            <w:r>
+              <w:rPr>
+                <w:sz w:val="18"/>
+                <w:szCs w:val="18"/>
+              </w:rPr>
               <w:t xml:space="preserve">rockylinux/rockylinux:9</w:t>
             </w:r>
             <w:r>
@@ -4177,7 +4185,7 @@
                 <w:sz w:val="18"/>
                 <w:szCs w:val="18"/>
               </w:rPr>
-              <w:t xml:space="preserve"> (Rocky Linux 9, digest 고정 없음)</w:t>
+              <w:t xml:space="preserve">)</w:t>
             </w:r>
           </w:p>
         </w:tc>
@@ -7042,21 +7050,14 @@
                 <w:sz w:val="18"/>
                 <w:szCs w:val="18"/>
               </w:rPr>
-              <w:t xml:space="preserve">rockylinux/rockylinux@sha256:8101994123cf3d0a8fee517bee7f39e555c7d92bd2d9eb3303cc988a0eeed00f</w:t>
-            </w:r>
-            <w:r>
-              <w:rPr>
-                <w:sz w:val="18"/>
-                <w:szCs w:val="18"/>
-              </w:rPr>
-              <w:t xml:space="preserve"> (Rocky Linux 9.8, </w:t>
-            </w:r>
-            <w:r>
-              <w:rPr>
-                <w:sz w:val="18"/>
-                <w:szCs w:val="18"/>
-              </w:rPr>
-              <w:t xml:space="preserve">9.8.20260525.0</w:t>
+              <w:t xml:space="preserve">Rocky Linux 9.8 (</w:t>
+            </w:r>
+            <w:r>
+              <w:rPr>
+                <w:sz w:val="18"/>
+                <w:szCs w:val="18"/>
+              </w:rPr>
+              <w:t xml:space="preserve">rockylinux/rockylinux:9.8.20260525.0</w:t>
             </w:r>
             <w:r>
               <w:rPr>
@@ -9655,21 +9656,14 @@
                 <w:sz w:val="18"/>
                 <w:szCs w:val="18"/>
               </w:rPr>
-              <w:t xml:space="preserve">rockylinux/rockylinux@sha256:8101994123cf3d0a8fee517bee7f39e555c7d92bd2d9eb3303cc988a0eeed00f</w:t>
-            </w:r>
-            <w:r>
-              <w:rPr>
-                <w:sz w:val="18"/>
-                <w:szCs w:val="18"/>
-              </w:rPr>
-              <w:t xml:space="preserve"> (Rocky Linux 9.8, </w:t>
-            </w:r>
-            <w:r>
-              <w:rPr>
-                <w:sz w:val="18"/>
-                <w:szCs w:val="18"/>
-              </w:rPr>
-              <w:t xml:space="preserve">9.8.20260525.0</w:t>
+              <w:t xml:space="preserve">Rocky Linux 9.8 (</w:t>
+            </w:r>
+            <w:r>
+              <w:rPr>
+                <w:sz w:val="18"/>
+                <w:szCs w:val="18"/>
+              </w:rPr>
+              <w:t xml:space="preserve">rockylinux/rockylinux:9.8.20260525.0</w:t>
             </w:r>
             <w:r>
               <w:rPr>
@@ -13872,21 +13866,14 @@
                 <w:sz w:val="18"/>
                 <w:szCs w:val="18"/>
               </w:rPr>
-              <w:t xml:space="preserve">rockylinux/rockylinux@sha256:8101994123cf3d0a8fee517bee7f39e555c7d92bd2d9eb3303cc988a0eeed00f</w:t>
-            </w:r>
-            <w:r>
-              <w:rPr>
-                <w:sz w:val="18"/>
-                <w:szCs w:val="18"/>
-              </w:rPr>
-              <w:t xml:space="preserve"> (Rocky Linux 9.8, </w:t>
-            </w:r>
-            <w:r>
-              <w:rPr>
-                <w:sz w:val="18"/>
-                <w:szCs w:val="18"/>
-              </w:rPr>
-              <w:t xml:space="preserve">9.8.20260525.0</w:t>
+              <w:t xml:space="preserve">Rocky Linux 9.8 (</w:t>
+            </w:r>
+            <w:r>
+              <w:rPr>
+                <w:sz w:val="18"/>
+                <w:szCs w:val="18"/>
+              </w:rPr>
+              <w:t xml:space="preserve">rockylinux/rockylinux:9.8.20260525.0</w:t>
             </w:r>
             <w:r>
               <w:rPr>
@@ -17763,21 +17750,14 @@
                 <w:sz w:val="18"/>
                 <w:szCs w:val="18"/>
               </w:rPr>
-              <w:t xml:space="preserve">rockylinux/rockylinux@sha256:8101994123cf3d0a8fee517bee7f39e555c7d92bd2d9eb3303cc988a0eeed00f</w:t>
-            </w:r>
-            <w:r>
-              <w:rPr>
-                <w:sz w:val="18"/>
-                <w:szCs w:val="18"/>
-              </w:rPr>
-              <w:t xml:space="preserve"> (Rocky Linux 9.8, </w:t>
-            </w:r>
-            <w:r>
-              <w:rPr>
-                <w:sz w:val="18"/>
-                <w:szCs w:val="18"/>
-              </w:rPr>
-              <w:t xml:space="preserve">9.8.20260525.0</w:t>
+              <w:t xml:space="preserve">Rocky Linux 9.8 (</w:t>
+            </w:r>
+            <w:r>
+              <w:rPr>
+                <w:sz w:val="18"/>
+                <w:szCs w:val="18"/>
+              </w:rPr>
+              <w:t xml:space="preserve">rockylinux/rockylinux:9.8.20260525.0</w:t>
             </w:r>
             <w:r>
               <w:rPr>
@@ -21129,21 +21109,14 @@
                 <w:sz w:val="18"/>
                 <w:szCs w:val="18"/>
               </w:rPr>
-              <w:t xml:space="preserve">rockylinux/rockylinux@sha256:8101994123cf3d0a8fee517bee7f39e555c7d92bd2d9eb3303cc988a0eeed00f</w:t>
-            </w:r>
-            <w:r>
-              <w:rPr>
-                <w:sz w:val="18"/>
-                <w:szCs w:val="18"/>
-              </w:rPr>
-              <w:t xml:space="preserve"> (Rocky Linux 9.8, </w:t>
-            </w:r>
-            <w:r>
-              <w:rPr>
-                <w:sz w:val="18"/>
-                <w:szCs w:val="18"/>
-              </w:rPr>
-              <w:t xml:space="preserve">9.8.20260525.0</w:t>
+              <w:t xml:space="preserve">Rocky Linux 9.8 (</w:t>
+            </w:r>
+            <w:r>
+              <w:rPr>
+                <w:sz w:val="18"/>
+                <w:szCs w:val="18"/>
+              </w:rPr>
+              <w:t xml:space="preserve">rockylinux/rockylinux:9.8.20260525.0</w:t>
             </w:r>
             <w:r>
               <w:rPr>
@@ -25199,21 +25172,14 @@
                 <w:sz w:val="18"/>
                 <w:szCs w:val="18"/>
               </w:rPr>
-              <w:t xml:space="preserve">rockylinux/rockylinux@sha256:8101994123cf3d0a8fee517bee7f39e555c7d92bd2d9eb3303cc988a0eeed00f</w:t>
-            </w:r>
-            <w:r>
-              <w:rPr>
-                <w:sz w:val="18"/>
-                <w:szCs w:val="18"/>
-              </w:rPr>
-              <w:t xml:space="preserve"> (Rocky Linux 9.8, </w:t>
-            </w:r>
-            <w:r>
-              <w:rPr>
-                <w:sz w:val="18"/>
-                <w:szCs w:val="18"/>
-              </w:rPr>
-              <w:t xml:space="preserve">9.8.20260525.0</w:t>
+              <w:t xml:space="preserve">Rocky Linux 9.8 (</w:t>
+            </w:r>
+            <w:r>
+              <w:rPr>
+                <w:sz w:val="18"/>
+                <w:szCs w:val="18"/>
+              </w:rPr>
+              <w:t xml:space="preserve">rockylinux/rockylinux:9.8.20260525.0</w:t>
             </w:r>
             <w:r>
               <w:rPr>
@@ -30234,21 +30200,14 @@
                 <w:sz w:val="18"/>
                 <w:szCs w:val="18"/>
               </w:rPr>
-              <w:t xml:space="preserve">rockylinux/rockylinux@sha256:8101994123cf3d0a8fee517bee7f39e555c7d92bd2d9eb3303cc988a0eeed00f</w:t>
-            </w:r>
-            <w:r>
-              <w:rPr>
-                <w:sz w:val="18"/>
-                <w:szCs w:val="18"/>
-              </w:rPr>
-              <w:t xml:space="preserve"> (Rocky Linux 9.8, </w:t>
-            </w:r>
-            <w:r>
-              <w:rPr>
-                <w:sz w:val="18"/>
-                <w:szCs w:val="18"/>
-              </w:rPr>
-              <w:t xml:space="preserve">9.8.20260525.0</w:t>
+              <w:t xml:space="preserve">Rocky Linux 9.8 (</w:t>
+            </w:r>
+            <w:r>
+              <w:rPr>
+                <w:sz w:val="18"/>
+                <w:szCs w:val="18"/>
+              </w:rPr>
+              <w:t xml:space="preserve">rockylinux/rockylinux:9.8.20260525.0</w:t>
             </w:r>
             <w:r>
               <w:rPr>
@@ -35681,21 +35640,14 @@
                 <w:sz w:val="18"/>
                 <w:szCs w:val="18"/>
               </w:rPr>
-              <w:t xml:space="preserve">rockylinux/rockylinux@sha256:8101994123cf3d0a8fee517bee7f39e555c7d92bd2d9eb3303cc988a0eeed00f</w:t>
-            </w:r>
-            <w:r>
-              <w:rPr>
-                <w:sz w:val="18"/>
-                <w:szCs w:val="18"/>
-              </w:rPr>
-              <w:t xml:space="preserve"> (Rocky Linux 9.8, </w:t>
-            </w:r>
-            <w:r>
-              <w:rPr>
-                <w:sz w:val="18"/>
-                <w:szCs w:val="18"/>
-              </w:rPr>
-              <w:t xml:space="preserve">9.8.20260525.0</w:t>
+              <w:t xml:space="preserve">Rocky Linux 9.8 (</w:t>
+            </w:r>
+            <w:r>
+              <w:rPr>
+                <w:sz w:val="18"/>
+                <w:szCs w:val="18"/>
+              </w:rPr>
+              <w:t xml:space="preserve">rockylinux/rockylinux:9.8.20260525.0</w:t>
             </w:r>
             <w:r>
               <w:rPr>
@@ -39269,21 +39221,14 @@
                 <w:sz w:val="18"/>
                 <w:szCs w:val="18"/>
               </w:rPr>
-              <w:t xml:space="preserve">rockylinux/rockylinux@sha256:8101994123cf3d0a8fee517bee7f39e555c7d92bd2d9eb3303cc988a0eeed00f</w:t>
-            </w:r>
-            <w:r>
-              <w:rPr>
-                <w:sz w:val="18"/>
-                <w:szCs w:val="18"/>
-              </w:rPr>
-              <w:t xml:space="preserve"> (Rocky Linux 9.8, </w:t>
-            </w:r>
-            <w:r>
-              <w:rPr>
-                <w:sz w:val="18"/>
-                <w:szCs w:val="18"/>
-              </w:rPr>
-              <w:t xml:space="preserve">9.8.20260525.0</w:t>
+              <w:t xml:space="preserve">Rocky Linux 9.8 (</w:t>
+            </w:r>
+            <w:r>
+              <w:rPr>
+                <w:sz w:val="18"/>
+                <w:szCs w:val="18"/>
+              </w:rPr>
+              <w:t xml:space="preserve">rockylinux/rockylinux:9.8.20260525.0</w:t>
             </w:r>
             <w:r>
               <w:rPr>
@@ -44683,21 +44628,14 @@
                 <w:sz w:val="18"/>
                 <w:szCs w:val="18"/>
               </w:rPr>
-              <w:t xml:space="preserve">rockylinux/rockylinux@sha256:8101994123cf3d0a8fee517bee7f39e555c7d92bd2d9eb3303cc988a0eeed00f</w:t>
-            </w:r>
-            <w:r>
-              <w:rPr>
-                <w:sz w:val="18"/>
-                <w:szCs w:val="18"/>
-              </w:rPr>
-              <w:t xml:space="preserve"> (Rocky Linux 9.8, </w:t>
-            </w:r>
-            <w:r>
-              <w:rPr>
-                <w:sz w:val="18"/>
-                <w:szCs w:val="18"/>
-              </w:rPr>
-              <w:t xml:space="preserve">9.8.20260525.0</w:t>
+              <w:t xml:space="preserve">Rocky Linux 9.8 (</w:t>
+            </w:r>
+            <w:r>
+              <w:rPr>
+                <w:sz w:val="18"/>
+                <w:szCs w:val="18"/>
+              </w:rPr>
+              <w:t xml:space="preserve">rockylinux/rockylinux:9.8.20260525.0</w:t>
             </w:r>
             <w:r>
               <w:rPr>

</xml_diff>

<commit_message>
Module content: describe inputs and outputs by their contents, not by other modules
Each module can run on its own, so parameter descriptions now say what a
folder must contain (files, layout, naming) instead of which module's
output_dir to use.

Co-Authored-By: Claude Opus 5.5 <noreply@anthropic.com>
</commit_message>
<xml_diff>
--- a/docs/ATAC-seq/modules/Portal_Content.docx
+++ b/docs/ATAC-seq/modules/Portal_Content.docx
@@ -2293,7 +2293,7 @@
                 <w:sz w:val="18"/>
                 <w:szCs w:val="18"/>
               </w:rPr>
-              <w:t xml:space="preserve">결과 폴더. GATK_MarkDuplicates의 input_dir</w:t>
+              <w:t xml:space="preserve">결과 폴더. 샘플마다 좌표 순 BAM(&lt;sample&gt;_bowtie_paired.sorted.bam)과 .bai, SAM, 정렬 로그</w:t>
             </w:r>
           </w:p>
         </w:tc>
@@ -2313,7 +2313,7 @@
                 <w:sz w:val="18"/>
                 <w:szCs w:val="18"/>
               </w:rPr>
-              <w:t xml:space="preserve">Output folder; input_dir of GATK_MarkDuplicates</w:t>
+              <w:t xml:space="preserve">Output folder: a coordinate-sorted BAM (&lt;sample&gt;_bowtie_paired.sorted.bam) with .bai, the SAM file, and the alignment log per sample</w:t>
             </w:r>
           </w:p>
         </w:tc>
@@ -5144,7 +5144,7 @@
                 <w:sz w:val="18"/>
                 <w:szCs w:val="18"/>
               </w:rPr>
-              <w:t xml:space="preserve">unsorted.bam 제외). bowtie2의 output_dir. 임시 폴더를 이 안에 만들므로 쓰기 권한이 필요</w:t>
+              <w:t xml:space="preserve">unsorted.bam 제외). BAM에 read group(@RG)이 있어야 함. 임시 폴더를 이 안에 만들므로 쓰기 권한이 필요</w:t>
             </w:r>
           </w:p>
         </w:tc>
@@ -5180,7 +5180,7 @@
                 <w:sz w:val="18"/>
                 <w:szCs w:val="18"/>
               </w:rPr>
-              <w:t xml:space="preserve">unsorted.bam excluded); output_dir of bowtie2. Temporary folders are made inside it, so it must be writable</w:t>
+              <w:t xml:space="preserve">unsorted.bam excluded). The BAM files need read groups (@RG). Temporary folders are made inside it, so it must be writable</w:t>
             </w:r>
           </w:p>
         </w:tc>
@@ -5302,7 +5302,7 @@
                 <w:sz w:val="18"/>
                 <w:szCs w:val="18"/>
               </w:rPr>
-              <w:t xml:space="preserve">결과 폴더(중복 표시 BAM, .bai, 중복 통계, 샘플별 로그). organellar_filter의 input_dir</w:t>
+              <w:t xml:space="preserve">결과 폴더(샘플별 중복 표시 BAM &lt;sample&gt;_marked.bam과 .bai, 중복 통계, 로그)</w:t>
             </w:r>
           </w:p>
         </w:tc>
@@ -5322,7 +5322,7 @@
                 <w:sz w:val="18"/>
                 <w:szCs w:val="18"/>
               </w:rPr>
-              <w:t xml:space="preserve">Output folder (duplicate-marked BAM, .bai, duplicate metrics, per-sample logs); input_dir of organellar_filter</w:t>
+              <w:t xml:space="preserve">Output folder (per sample: duplicate-marked BAM &lt;sample&gt;_marked.bam with .bai, duplicate metrics, and logs)</w:t>
             </w:r>
           </w:p>
         </w:tc>
@@ -7837,7 +7837,7 @@
                 <w:sz w:val="18"/>
                 <w:szCs w:val="18"/>
               </w:rPr>
-              <w:t xml:space="preserve">좌표 정렬된 BAM 폴더(*.unsorted.bam 제외). GATK_MarkDuplicates의 output_dir. BAM 인덱스(.bai)가 없으면 BAM 옆에 만들므로 그 폴더에 쓰기 권한이 필요(앞 모듈 결과에는 인덱스가 있음)</w:t>
+              <w:t xml:space="preserve">좌표 정렬된 BAM 폴더(*.unsorted.bam 제외). BAM 인덱스(.bai)가 없으면 BAM 옆에 만들므로, 인덱스가 없을 때는 그 폴더에 쓰기 권한이 필요</w:t>
             </w:r>
           </w:p>
         </w:tc>
@@ -7857,7 +7857,7 @@
                 <w:sz w:val="18"/>
                 <w:szCs w:val="18"/>
               </w:rPr>
-              <w:t xml:space="preserve">Folder of coordinate-sorted BAM files (*.unsorted.bam excluded). A missing BAM index (.bai) is created beside the BAM, so the folder must be writable (outputs of the previous module already have one)</w:t>
+              <w:t xml:space="preserve">Folder of coordinate-sorted BAM files (*.unsorted.bam excluded). A missing BAM index (.bai) is built beside the BAM, so the folder must then be writable</w:t>
             </w:r>
           </w:p>
         </w:tc>
@@ -7979,7 +7979,7 @@
                 <w:sz w:val="18"/>
                 <w:szCs w:val="18"/>
               </w:rPr>
-              <w:t xml:space="preserve">결과 폴더. ATAC_QC의 input_dir</w:t>
+              <w:t xml:space="preserve">결과 폴더. 세포소기관 read를 뺀 BAM(03_filtered_bam/&lt;sample&gt;.organellar_removed.bam)과 .bai, 통계, 요약표</w:t>
             </w:r>
           </w:p>
         </w:tc>
@@ -7999,7 +7999,7 @@
                 <w:sz w:val="18"/>
                 <w:szCs w:val="18"/>
               </w:rPr>
-              <w:t xml:space="preserve">Output folder; input_dir of ATAC_QC</w:t>
+              <w:t xml:space="preserve">Output folder: BAM files without organellar reads (03_filtered_bam/&lt;sample&gt;.organellar_removed.bam) with .bai, statistics, and a summary table</w:t>
             </w:r>
           </w:p>
         </w:tc>
@@ -10982,7 +10982,7 @@
                 <w:sz w:val="18"/>
                 <w:szCs w:val="18"/>
               </w:rPr>
-              <w:t xml:space="preserve">shift 전 BAM 폴더. organellar_filter의 output_dir 권장. BAM 인덱스(.bai)가 없으면 BAM 옆에 만들므로 그 폴더에 쓰기 권한이 필요(앞 모듈 결과에는 인덱스가 있음)</w:t>
+              <w:t xml:space="preserve">Tn5 보정 전, 좌표 정렬된 paired-end BAM 폴더(세포소기관 read는 미리 빼 두기를 권장). BAM 인덱스(.bai)가 없으면 BAM 옆에 만들므로, 인덱스가 없을 때는 그 폴더에 쓰기 권한이 필요</w:t>
             </w:r>
           </w:p>
         </w:tc>
@@ -11002,7 +11002,7 @@
                 <w:sz w:val="18"/>
                 <w:szCs w:val="18"/>
               </w:rPr>
-              <w:t xml:space="preserve">Folder of pre-shift BAM files; the organellar_filter output_dir is recommended. A missing BAM index (.bai) is created beside the BAM, so the folder must be writable (outputs of the previous module already have one)</w:t>
+              <w:t xml:space="preserve">Folder of coordinate-sorted paired-end BAM files before the Tn5 shift (organellar reads removed beforehand is recommended). A missing BAM index (.bai) is built beside the BAM, so the folder must then be writable</w:t>
             </w:r>
           </w:p>
         </w:tc>
@@ -15088,7 +15088,7 @@
                 <w:sz w:val="18"/>
                 <w:szCs w:val="18"/>
               </w:rPr>
-              <w:t xml:space="preserve">ATAC_QC의 output_dir</w:t>
+              <w:t xml:space="preserve">ATAC-seq QC 결과 폴더. 안에 05_metadata/atac_qc_manifest.tsv와 그 표가 가리키는 nucleosome 분할 BAM(04_split_bam/&lt;sample&gt;/)이 있어야 함</w:t>
             </w:r>
           </w:p>
         </w:tc>
@@ -15108,7 +15108,7 @@
                 <w:sz w:val="18"/>
                 <w:szCs w:val="18"/>
               </w:rPr>
-              <w:t xml:space="preserve">ATAC_QC output_dir</w:t>
+              <w:t xml:space="preserve">ATAC-seq QC result folder containing 05_metadata/atac_qc_manifest.tsv and the nucleosome-split BAM files it lists (04_split_bam/&lt;sample&gt;/)</w:t>
             </w:r>
           </w:p>
         </w:tc>
@@ -18776,7 +18776,23 @@
                 <w:sz w:val="18"/>
                 <w:szCs w:val="18"/>
               </w:rPr>
-              <w:t xml:space="preserve">Tn5 보정 BAM 폴더. ATAC_QC의 output_dir이면 03_shifted_bam만 검색. BAM 인덱스(.bai)가 없으면 BAM 옆에 만들므로 그 폴더에 쓰기 권한이 필요(앞 모듈 결과에는 인덱스가 있음)</w:t>
+              <w:t xml:space="preserve">Tn5 보정 BAM 폴더(</w:t>
+            </w:r>
+            <w:r>
+              <w:rPr>
+                <w:i/>
+                <w:iCs/>
+                <w:sz w:val="18"/>
+                <w:szCs w:val="18"/>
+              </w:rPr>
+              <w:t xml:space="preserve">&lt;alignment_suffix&gt;, 기본 </w:t>
+            </w:r>
+            <w:r>
+              <w:rPr>
+                <w:sz w:val="18"/>
+                <w:szCs w:val="18"/>
+              </w:rPr>
+              <w:t xml:space="preserve">.shifted.bam). 폴더 안에 03_shifted_bam/이 있으면 그 안에서만 찾음. BAM 인덱스(.bai)가 없으면 BAM 옆에 만들므로, 인덱스가 없을 때는 그 폴더에 쓰기 권한이 필요</w:t>
             </w:r>
           </w:p>
         </w:tc>
@@ -18796,7 +18812,23 @@
                 <w:sz w:val="18"/>
                 <w:szCs w:val="18"/>
               </w:rPr>
-              <w:t xml:space="preserve">Folder of Tn5-shifted BAM files; for an ATAC_QC output_dir only 03_shifted_bam is searched. A missing BAM index (.bai) is created beside the BAM, so the folder must be writable (outputs of the previous module already have one)</w:t>
+              <w:t xml:space="preserve">Folder of Tn5-shifted BAM files (</w:t>
+            </w:r>
+            <w:r>
+              <w:rPr>
+                <w:i/>
+                <w:iCs/>
+                <w:sz w:val="18"/>
+                <w:szCs w:val="18"/>
+              </w:rPr>
+              <w:t xml:space="preserve">&lt;alignment_suffix&gt;, default </w:t>
+            </w:r>
+            <w:r>
+              <w:rPr>
+                <w:sz w:val="18"/>
+                <w:szCs w:val="18"/>
+              </w:rPr>
+              <w:t xml:space="preserve">.shifted.bam); if it contains 03_shifted_bam/, only that subfolder is searched. A missing BAM index (.bai) is built beside the BAM, so the folder must then be writable</w:t>
             </w:r>
           </w:p>
         </w:tc>
@@ -19194,7 +19226,7 @@
                 <w:sz w:val="18"/>
                 <w:szCs w:val="18"/>
               </w:rPr>
-              <w:t xml:space="preserve">MACS3 peak 모드. narrow(기본): 좁은 peak(.narrowPeak), ATAC-seq은 narrow 사용. broad: 넓은 peak(.broadPeak), broad_cutoff를 함께 사용하며 peak_annotation의 peak_suffix를 .broadPeak로 바꿔야 함</w:t>
+              <w:t xml:space="preserve">MACS3 peak 모드. narrow(기본): 좁은 peak(.narrowPeak), ATAC-seq은 narrow 사용. broad: 넓은 peak(.broadPeak)를 만들며 broad_cutoff를 함께 사용</w:t>
             </w:r>
           </w:p>
         </w:tc>
@@ -19214,7 +19246,7 @@
                 <w:sz w:val="18"/>
                 <w:szCs w:val="18"/>
               </w:rPr>
-              <w:t xml:space="preserve">MACS3 peak mode. narrow (default): narrow peaks (.narrowPeak), used for ATAC-seq. broad: broad peaks (.broadPeak); uses broad_cutoff, and peak_annotation needs peak_suffix=.broadPeak</w:t>
+              <w:t xml:space="preserve">MACS3 peak mode. narrow (default): narrow peaks (.narrowPeak), used for ATAC-seq. broad: broad peaks (.broadPeak), used together with broad_cutoff</w:t>
             </w:r>
           </w:p>
         </w:tc>
@@ -22481,7 +22513,7 @@
                 <w:sz w:val="18"/>
                 <w:szCs w:val="18"/>
               </w:rPr>
-              <w:t xml:space="preserve">peak 파일 폴더(하위 폴더 포함). MACS3의 output_dir</w:t>
+              <w:t xml:space="preserve">peak 파일 폴더(하위 폴더 포함). peak_suffix로 끝나는 파일(기본 .narrowPeak)을 샘플마다 하나씩 읽음</w:t>
             </w:r>
           </w:p>
         </w:tc>
@@ -22501,7 +22533,7 @@
                 <w:sz w:val="18"/>
                 <w:szCs w:val="18"/>
               </w:rPr>
-              <w:t xml:space="preserve">Folder of peak files (searched recursively); MACS3 output_dir</w:t>
+              <w:t xml:space="preserve">Folder of peak files (searched recursively); one file per sample ending in peak_suffix (default .narrowPeak) is read</w:t>
             </w:r>
           </w:p>
         </w:tc>
@@ -23049,7 +23081,7 @@
                 <w:sz w:val="18"/>
                 <w:szCs w:val="18"/>
               </w:rPr>
-              <w:t xml:space="preserve">peak 파일 이름 끝부분. MACS3를 peak_type=broad로 돌렸으면 .broadPeak</w:t>
+              <w:t xml:space="preserve">peak 파일 이름 끝부분. broad 모드로 찾은 peak면 .broadPeak</w:t>
             </w:r>
           </w:p>
         </w:tc>
@@ -23069,7 +23101,7 @@
                 <w:sz w:val="18"/>
                 <w:szCs w:val="18"/>
               </w:rPr>
-              <w:t xml:space="preserve">Peak file name ending; use .broadPeak when MACS3 ran with peak_type=broad</w:t>
+              <w:t xml:space="preserve">Peak file name ending; .broadPeak for peaks called in broad mode</w:t>
             </w:r>
           </w:p>
         </w:tc>
@@ -26880,7 +26912,7 @@
                 <w:sz w:val="18"/>
                 <w:szCs w:val="18"/>
               </w:rPr>
-              <w:t xml:space="preserve">Tn5 보정 BAM 폴더. ATAC_QC의 output_dir(03_shifted_bam 사용)</w:t>
+              <w:t xml:space="preserve">Tn5 보정 BAM 폴더. 파일 이름에 SampleID가 들어 있어야 함. 폴더 안에 03_shifted_bam/이 있으면 그 안에서 찾음</w:t>
             </w:r>
           </w:p>
         </w:tc>
@@ -26900,7 +26932,7 @@
                 <w:sz w:val="18"/>
                 <w:szCs w:val="18"/>
               </w:rPr>
-              <w:t xml:space="preserve">Tn5-shifted BAM folder: the ATAC_QC output_dir (03_shifted_bam is used)</w:t>
+              <w:t xml:space="preserve">Folder of Tn5-shifted BAM files whose names contain the SampleID; if it contains 03_shifted_bam/, that subfolder is searched</w:t>
             </w:r>
           </w:p>
         </w:tc>
@@ -27022,7 +27054,7 @@
                 <w:sz w:val="18"/>
                 <w:szCs w:val="18"/>
               </w:rPr>
-              <w:t xml:space="preserve">peak 폴더. MACS3_callpeak_ATAC의 output_dir</w:t>
+              <w:t xml:space="preserve">샘플별 peak 파일(.narrowPeak 또는 .broadPeak, .gz 가능) 폴더. 파일 이름에 SampleID가 들어 있어야 함</w:t>
             </w:r>
           </w:p>
         </w:tc>
@@ -27042,7 +27074,7 @@
                 <w:sz w:val="18"/>
                 <w:szCs w:val="18"/>
               </w:rPr>
-              <w:t xml:space="preserve">Peak folder: the MACS3_callpeak_ATAC output_dir</w:t>
+              <w:t xml:space="preserve">Folder of per-sample peak files (.narrowPeak or .broadPeak, .gz allowed) whose names contain the SampleID</w:t>
             </w:r>
           </w:p>
         </w:tc>
@@ -31866,7 +31898,7 @@
                 <w:sz w:val="18"/>
                 <w:szCs w:val="18"/>
               </w:rPr>
-              <w:t xml:space="preserve">differential_accessibility의 output_dir. 그 안의 03_results/diff_accessibility_&lt;norm&gt;.csv를 읽음</w:t>
+              <w:t xml:space="preserve">차등 접근성 결과 폴더. 안에 03_results/diff_accessibility_&lt;norm&gt;.csv(열: seqnames, start, end, peakID, logFC, FDR)가 있어야 함</w:t>
             </w:r>
           </w:p>
         </w:tc>
@@ -31886,7 +31918,7 @@
                 <w:sz w:val="18"/>
                 <w:szCs w:val="18"/>
               </w:rPr>
-              <w:t xml:space="preserve">differential_accessibility output_dir; 03_results/diff_accessibility_&lt;norm&gt;.csv inside it is read</w:t>
+              <w:t xml:space="preserve">Differential accessibility result folder containing 03_results/diff_accessibility_&lt;norm&gt;.csv (columns: seqnames, start, end, peakID, logFC, FDR)</w:t>
             </w:r>
           </w:p>
         </w:tc>
@@ -37084,7 +37116,7 @@
                 <w:sz w:val="18"/>
                 <w:szCs w:val="18"/>
               </w:rPr>
-              <w:t xml:space="preserve">BAM 폴더. ATAC_QC의 output_dir이면 03_shifted_bam 사용</w:t>
+              <w:t xml:space="preserve">Tn5 보정 BAM 폴더. 파일 이름에 SampleID가 들어 있어야 함. 폴더 안에 03_shifted_bam/이 있으면 그 안에서 찾음</w:t>
             </w:r>
           </w:p>
         </w:tc>
@@ -37104,7 +37136,7 @@
                 <w:sz w:val="18"/>
                 <w:szCs w:val="18"/>
               </w:rPr>
-              <w:t xml:space="preserve">BAM folder; 03_shifted_bam of an ATAC_QC output_dir</w:t>
+              <w:t xml:space="preserve">Folder of Tn5-shifted BAM files whose names contain the SampleID; if it contains 03_shifted_bam/, that subfolder is searched</w:t>
             </w:r>
           </w:p>
         </w:tc>
@@ -37652,7 +37684,23 @@
                 <w:sz w:val="18"/>
                 <w:szCs w:val="18"/>
               </w:rPr>
-              <w:t xml:space="preserve">MACS3_callpeak_ATAC의 output_dir. 그 안의 샘플별 peak를 합쳐 공통 peak를 만듦</w:t>
+              <w:t xml:space="preserve">샘플별 peak 파일(</w:t>
+            </w:r>
+            <w:r>
+              <w:rPr>
+                <w:i/>
+                <w:iCs/>
+                <w:sz w:val="18"/>
+                <w:szCs w:val="18"/>
+              </w:rPr>
+              <w:t xml:space="preserve">_peaks.narrowPeak, 없으면 </w:t>
+            </w:r>
+            <w:r>
+              <w:rPr>
+                <w:sz w:val="18"/>
+                <w:szCs w:val="18"/>
+              </w:rPr>
+              <w:t xml:space="preserve">_peaks.broadPeak) 폴더(하위 폴더 포함). 모든 peak를 합쳐 공통 peak를 만듦</w:t>
             </w:r>
           </w:p>
         </w:tc>
@@ -37672,7 +37720,23 @@
                 <w:sz w:val="18"/>
                 <w:szCs w:val="18"/>
               </w:rPr>
-              <w:t xml:space="preserve">MACS3_callpeak_ATAC output_dir; the sample peaks in it are merged into common peaks</w:t>
+              <w:t xml:space="preserve">Folder of per-sample peak files (</w:t>
+            </w:r>
+            <w:r>
+              <w:rPr>
+                <w:i/>
+                <w:iCs/>
+                <w:sz w:val="18"/>
+                <w:szCs w:val="18"/>
+              </w:rPr>
+              <w:t xml:space="preserve">_peaks.narrowPeak, or </w:t>
+            </w:r>
+            <w:r>
+              <w:rPr>
+                <w:sz w:val="18"/>
+                <w:szCs w:val="18"/>
+              </w:rPr>
+              <w:t xml:space="preserve">_peaks.broadPeak if none; searched recursively); all peaks are merged into a common peak set</w:t>
             </w:r>
           </w:p>
         </w:tc>
@@ -40717,7 +40781,7 @@
                 <w:sz w:val="18"/>
                 <w:szCs w:val="18"/>
               </w:rPr>
-              <w:t xml:space="preserve">앞 모듈의 output_dir. peak_annotation(gene_lists/*.annotated_gene_list.tsv) 또는 differential_accessibility(03_results/diff_accessibility_&lt;da_norm&gt;.csv) 결과를 안의 파일로 구분</w:t>
+              <w:t xml:space="preserve">유전자 목록이 들어 있는 결과 폴더. 안의 파일로 종류를 구분: gene_lists/*.annotated_gene_list.tsv가 있으면 파일마다 유전자 목록 하나, 03_results/diff_accessibility_&lt;da_norm&gt;.csv가 있으면 유의하게 열린(up)·닫힌(down) peak의 가장 가까운 유전자</w:t>
             </w:r>
           </w:p>
         </w:tc>
@@ -40737,7 +40801,7 @@
                 <w:sz w:val="18"/>
                 <w:szCs w:val="18"/>
               </w:rPr>
-              <w:t xml:space="preserve">Output_dir of the previous module: a peak_annotation (gene_lists/*.annotated_gene_list.tsv) or differential_accessibility (03_results/diff_accessibility_&lt;da_norm&gt;.csv) output, told apart by its files</w:t>
+              <w:t xml:space="preserve">Result folder holding gene lists, told apart by its files: with gene_lists/*.annotated_gene_list.tsv each file is one gene list; with 03_results/diff_accessibility_&lt;da_norm&gt;.csv the genes nearest to significantly gained (up) and lost (down) peaks are used</w:t>
             </w:r>
           </w:p>
         </w:tc>
@@ -40859,7 +40923,7 @@
                 <w:sz w:val="18"/>
                 <w:szCs w:val="18"/>
               </w:rPr>
-              <w:t xml:space="preserve">유전자 주석 GFF3/GTF. differential_accessibility 결과일 때 peak를 가장 가까운 유전자에 연결하는 데 사용(peak_annotation 결과면 쓰지 않음)</w:t>
+              <w:t xml:space="preserve">유전자 주석 GFF3/GTF. input_dir가 차등 접근성 결과(03_results/…)일 때 peak를 가장 가까운 유전자에 연결하는 데 사용</w:t>
             </w:r>
           </w:p>
         </w:tc>
@@ -40879,7 +40943,7 @@
                 <w:sz w:val="18"/>
                 <w:szCs w:val="18"/>
               </w:rPr>
-              <w:t xml:space="preserve">Gene annotation GFF3/GTF, used to link differential peaks to their nearest genes (not used for a peak_annotation output)</w:t>
+              <w:t xml:space="preserve">Gene annotation GFF3/GTF, used to link peaks to their nearest genes when input_dir holds a differential accessibility result (03_results/…)</w:t>
             </w:r>
           </w:p>
         </w:tc>
@@ -42705,7 +42769,7 @@
                 <w:sz w:val="18"/>
                 <w:szCs w:val="18"/>
               </w:rPr>
-              <w:t xml:space="preserve">differential_accessibility 결과에서 읽을 정규화 결과(TMM, EDASeq, CQN). 그 결과일 때만 사용</w:t>
+              <w:t xml:space="preserve">차등 접근성 결과에서 읽을 정규화 결과(TMM, EDASeq, CQN). input_dir가 차등 접근성 결과일 때만 사용</w:t>
             </w:r>
           </w:p>
         </w:tc>
@@ -42725,7 +42789,7 @@
                 <w:sz w:val="18"/>
                 <w:szCs w:val="18"/>
               </w:rPr>
-              <w:t xml:space="preserve">Normalization result read from a differential_accessibility output (TMM, EDASeq, CQN); used only for that input</w:t>
+              <w:t xml:space="preserve">Normalization result read from a differential accessibility result (TMM, EDASeq, CQN); used only when input_dir holds one</w:t>
             </w:r>
           </w:p>
         </w:tc>
@@ -42847,7 +42911,7 @@
                 <w:sz w:val="18"/>
                 <w:szCs w:val="18"/>
               </w:rPr>
-              <w:t xml:space="preserve">up/down peak FDR 기준. differential_accessibility 결과일 때만 사용</w:t>
+              <w:t xml:space="preserve">up/down peak FDR 기준. input_dir가 차등 접근성 결과일 때만 사용</w:t>
             </w:r>
           </w:p>
         </w:tc>
@@ -42867,7 +42931,7 @@
                 <w:sz w:val="18"/>
                 <w:szCs w:val="18"/>
               </w:rPr>
-              <w:t xml:space="preserve">FDR cutoff for up/down peaks; used only for a differential_accessibility output</w:t>
+              <w:t xml:space="preserve">FDR cutoff for up/down peaks; used only when input_dir holds a differential accessibility result</w:t>
             </w:r>
           </w:p>
         </w:tc>
@@ -42989,7 +43053,7 @@
                 <w:sz w:val="18"/>
                 <w:szCs w:val="18"/>
               </w:rPr>
-              <w:t xml:space="preserve">up/down peak 최소 abs(logFC). differential_accessibility 결과일 때만 사용</w:t>
+              <w:t xml:space="preserve">up/down peak 최소 abs(logFC). input_dir가 차등 접근성 결과일 때만 사용</w:t>
             </w:r>
           </w:p>
         </w:tc>
@@ -43009,7 +43073,7 @@
                 <w:sz w:val="18"/>
                 <w:szCs w:val="18"/>
               </w:rPr>
-              <w:t xml:space="preserve">Minimum abs(logFC) for up/down peaks; used only for a differential_accessibility output</w:t>
+              <w:t xml:space="preserve">Minimum abs(logFC) for up/down peaks; used only when input_dir holds a differential accessibility result</w:t>
             </w:r>
           </w:p>
         </w:tc>
@@ -46010,7 +46074,7 @@
                 <w:sz w:val="18"/>
                 <w:szCs w:val="18"/>
               </w:rPr>
-              <w:t xml:space="preserve">Tn5 보정 BAM 폴더. ATAC_QC의 output_dir이면 03_shifted_bam에서 찾음. BAM 인덱스(.bai)가 없으면 BAM 옆에 만들므로 그 폴더에 쓰기 권한이 필요(앞 모듈 결과에는 인덱스가 있음)</w:t>
+              <w:t xml:space="preserve">Tn5 보정 BAM 폴더(&lt;SampleID&gt;&lt;alignment_suffix&gt;). 폴더 안에 03_shifted_bam/이 있으면 그 안에서 찾음. BAM 인덱스(.bai)가 없으면 BAM 옆에 만들므로, 인덱스가 없을 때는 그 폴더에 쓰기 권한이 필요</w:t>
             </w:r>
           </w:p>
         </w:tc>
@@ -46030,7 +46094,7 @@
                 <w:sz w:val="18"/>
                 <w:szCs w:val="18"/>
               </w:rPr>
-              <w:t xml:space="preserve">Folder of Tn5-shifted BAM files; 03_shifted_bam of an ATAC_QC output_dir. A missing BAM index (.bai) is created beside the BAM, so the folder must be writable (outputs of the previous module already have one)</w:t>
+              <w:t xml:space="preserve">Folder of Tn5-shifted BAM files (&lt;SampleID&gt;&lt;alignment_suffix&gt;); if it contains 03_shifted_bam/, that subfolder is searched. A missing BAM index (.bai) is built beside the BAM, so the folder must then be writable</w:t>
             </w:r>
           </w:p>
         </w:tc>

</xml_diff>